<commit_message>
Merge Scott's 09.12 batch: The Line through Sobriety Meets Hospice; Miss Jane scene and the Horacio Wednesday line held for the author
Co-Authored-By: Claude Fable 5.1 <noreply@anthropic.com>
Claude-Session: https://claude.ai/code/session_013TTacQAr67Pe2VUwTPop1A
</commit_message>
<xml_diff>
--- a/The_Cardinals_Promise.docx
+++ b/The_Cardinals_Promise.docx
@@ -6085,6 +6085,26 @@
         <w:pStyle w:val="BodyText"/>
       </w:pPr>
       <w:r>
+        <w:t xml:space="preserve">I wanted, or more accurately, I needed his validation. Anyone’s validation. With false bravado and fake self-esteem, I couldn’t generate true confidence inside myself or pat myself on my back. I required others to tell me,</w:t>
+      </w:r>
+      <w:r>
+        <w:t xml:space="preserve"> </w:t>
+      </w:r>
+      <w:r>
+        <w:t xml:space="preserve">“</w:t>
+      </w:r>
+      <w:r>
+        <w:t xml:space="preserve">You done good.</w:t>
+      </w:r>
+      <w:r>
+        <w:t xml:space="preserve">”</w:t>
+      </w:r>
+    </w:p>
+    <w:p>
+      <w:pPr>
+        <w:pStyle w:val="BodyText"/>
+      </w:pPr>
+      <w:r>
         <w:t xml:space="preserve">“</w:t>
       </w:r>
       <w:r>
@@ -7557,7 +7577,7 @@
         <w:pStyle w:val="BodyText"/>
       </w:pPr>
       <w:r>
-        <w:t xml:space="preserve">After Chris hung up, the first thing I did was go to the pharmacy and fill my last Adderall script. Not to use it. That’s what I told myself. I filled it because a bottle in my hand felt better than no bottle, and because the disease negotiates right up to the door of its own funeral.</w:t>
+        <w:t xml:space="preserve">After Chris hung up, the first thing I did was go to the pharmacy and fill my last Adderall script. Not to use it. That’s what I told myself. I filled it because a bottle in my hand felt better than no bottle.</w:t>
       </w:r>
     </w:p>
     <w:p>
@@ -8535,6 +8555,72 @@
         <w:pStyle w:val="BodyText"/>
       </w:pPr>
       <w:r>
+        <w:t xml:space="preserve">Sobriety didn’t erase my desire to drink. That surprised me. What sobriety gave me was time. Options. A sponsor. A list of people to call who would understand. Sobriety stripped away the anesthesia, and without it I could feel everything, the hunger included. The disease didn’t leave when I put the drink down. It got quiet and waited.</w:t>
+      </w:r>
+    </w:p>
+    <w:p>
+      <w:pPr>
+        <w:pStyle w:val="BodyText"/>
+      </w:pPr>
+      <w:r>
+        <w:t xml:space="preserve">By late 2010, I was restless in a way I couldn’t name. Sober, working, going to meetings, living clean, and underneath it, something in me still wanted out. An opportunity came across my radar, medical device sales, Stryker. Big money, fast track. My first thought was: this is how I get back. My second: I don’t know if I can stay sober there.</w:t>
+      </w:r>
+    </w:p>
+    <w:p>
+      <w:pPr>
+        <w:pStyle w:val="BodyText"/>
+      </w:pPr>
+      <w:r>
+        <w:t xml:space="preserve">That scared me. I drove to see Lou. He didn’t ask why I’d come; he rarely did. He listened while I talked in circles, opportunity, timing, readiness, fear.</w:t>
+      </w:r>
+    </w:p>
+    <w:p>
+      <w:pPr>
+        <w:pStyle w:val="BodyText"/>
+      </w:pPr>
+      <w:r>
+        <w:t xml:space="preserve">Eventually the truth slipped out.</w:t>
+      </w:r>
+      <w:r>
+        <w:t xml:space="preserve"> </w:t>
+      </w:r>
+      <w:r>
+        <w:t xml:space="preserve">“</w:t>
+      </w:r>
+      <w:r>
+        <w:t xml:space="preserve">I still want to drink,</w:t>
+      </w:r>
+      <w:r>
+        <w:t xml:space="preserve">”</w:t>
+      </w:r>
+      <w:r>
+        <w:t xml:space="preserve"> </w:t>
+      </w:r>
+      <w:r>
+        <w:t xml:space="preserve">I said.</w:t>
+      </w:r>
+    </w:p>
+    <w:p>
+      <w:pPr>
+        <w:pStyle w:val="BodyText"/>
+      </w:pPr>
+      <w:r>
+        <w:t xml:space="preserve">The words just hung there. I said them and then held my breath.</w:t>
+      </w:r>
+    </w:p>
+    <w:p>
+      <w:pPr>
+        <w:pStyle w:val="BodyText"/>
+      </w:pPr>
+      <w:r>
+        <w:t xml:space="preserve">Lou didn’t react the way I expected. No anger, no speech, no disappointment. He looked at me the way he had when I was losing badly on a mat, the same look he gave me when he was deciding whether I could recover.</w:t>
+      </w:r>
+    </w:p>
+    <w:p>
+      <w:pPr>
+        <w:pStyle w:val="BodyText"/>
+      </w:pPr>
+      <w:r>
         <w:t xml:space="preserve">“</w:t>
       </w:r>
       <w:r>
@@ -8543,53 +8629,21 @@
       <w:r>
         <w:t xml:space="preserve">”</w:t>
       </w:r>
-      <w:r>
-        <w:t xml:space="preserve"> </w:t>
-      </w:r>
-      <w:r>
-        <w:t xml:space="preserve">No emotion. No threat. My father said it the way he stated facts, and it was the kindest hard thing anyone ever told me. It only worked coming from him. He had spent my whole life proving he would never actually leave. Sobriety didn’t erase desire. That surprised me. What sobriety gave me was time. What it took away was the anesthesia, and without it I could feel everything, the hunger included. The disease didn’t leave when I put the drink down. It got quiet and waited.</w:t>
-      </w:r>
-    </w:p>
-    <w:p>
-      <w:pPr>
-        <w:pStyle w:val="BodyText"/>
-      </w:pPr>
-      <w:r>
-        <w:t xml:space="preserve">By late 2010, I was restless in a way I couldn’t name. Sober, working, going to meetings, living clean, and underneath it something in me still wanted out. An opportunity came across my radar, medical device sales, Stryker. Big money, fast track. My first thought was: this is how I get back. My second: I don’t know if I can stay sober there.</w:t>
-      </w:r>
-    </w:p>
-    <w:p>
-      <w:pPr>
-        <w:pStyle w:val="BodyText"/>
-      </w:pPr>
-      <w:r>
-        <w:t xml:space="preserve">That scared me. I drove to see Lou. He didn’t ask why I’d come; he rarely did. He listened while I talked in circles, opportunity, timing, readiness, fear. Eventually the truth slipped out.</w:t>
-      </w:r>
-      <w:r>
-        <w:t xml:space="preserve"> </w:t>
-      </w:r>
-      <w:r>
-        <w:t xml:space="preserve">“</w:t>
-      </w:r>
-      <w:r>
-        <w:t xml:space="preserve">I still want to drink,</w:t>
-      </w:r>
-      <w:r>
-        <w:t xml:space="preserve">”</w:t>
-      </w:r>
-      <w:r>
-        <w:t xml:space="preserve"> </w:t>
-      </w:r>
-      <w:r>
-        <w:t xml:space="preserve">I said. The words just hung there. Accurate.</w:t>
-      </w:r>
-    </w:p>
-    <w:p>
-      <w:pPr>
-        <w:pStyle w:val="BodyText"/>
-      </w:pPr>
-      <w:r>
-        <w:t xml:space="preserve">He didn’t react the way I expected. No anger, no speech, no disappointment. He looked at me the way he had when I was losing badly on a mat and he was deciding whether I could recover. Then he said it. Just a boundary. It landed harder than any consequence I’d faced, not because it was cruel but because it was clean. He’d done what he could do, and he wasn’t going to stand by and watch me die slowly while pretending that watching helped.</w:t>
+    </w:p>
+    <w:p>
+      <w:pPr>
+        <w:pStyle w:val="BodyText"/>
+      </w:pPr>
+      <w:r>
+        <w:t xml:space="preserve">No emotion. No threat. My father said it the way he stated facts, and it was the kindest, hardest thing anyone ever told me. It only worked coming from him. He had spent my whole life proving he would never actually leave.</w:t>
+      </w:r>
+    </w:p>
+    <w:p>
+      <w:pPr>
+        <w:pStyle w:val="BodyText"/>
+      </w:pPr>
+      <w:r>
+        <w:t xml:space="preserve">Lou set a boundary that landed harder than any consequence I’d faced, not because it was cruel but because it was clean. He’d done what he could do, and he would not stand by and watch me die slowly while pretending that watching helped.</w:t>
       </w:r>
     </w:p>
     <w:p>
@@ -8605,7 +8659,7 @@
         <w:pStyle w:val="BodyText"/>
       </w:pPr>
       <w:r>
-        <w:t xml:space="preserve">The payoff came quietly, months later. A Tuesday morning in 2011, on my walk along the bay, coffee in a paper cup, the sun just coming up over the water. I wasn’t thinking about anything in particular, and then I knew, the way you know your own name. I didn’t want a drink. I hadn’t wanted one in a long time, and it wasn’t a fight anymore. I took another sip of coffee and kept walking.</w:t>
+        <w:t xml:space="preserve">The payoff came quietly, months later on a Tuesday morning in 2011, on my walk along the bay, coffee in a paper cup, the sun just coming up over the water. I wasn’t thinking about anything in particular, and then I knew, the way you know your own name. I didn’t want a drink. I hadn’t wanted one in a long time, and it wasn’t a fight anymore. I took another sip of coffee and kept walking.</w:t>
       </w:r>
     </w:p>
     <w:p>
@@ -8689,15 +8743,51 @@
         <w:pStyle w:val="BodyText"/>
       </w:pPr>
       <w:r>
-        <w:t xml:space="preserve">When the recruiter asked what I’d been doing for the last five years, I didn’t open up about everything. The call came on an ordinary day. By 2011, ordinary days were the whole texture of my life. The sharp edges were gone. Work, meetings, lifeguard shifts, dinners with Lou and Donna, early mornings that looked exactly like the ones before. When the phone rang that afternoon I almost let it go to voicemail.</w:t>
-      </w:r>
-    </w:p>
-    <w:p>
-      <w:pPr>
-        <w:pStyle w:val="BodyText"/>
-      </w:pPr>
-      <w:r>
-        <w:t xml:space="preserve">A recruiter. Someone who knew someone, the way it happens in a town like Pensacola. We’re looking for someone to build relationships for a home health company, nursing, PT, OT, patients who can’t get to clinics. We need someone who can develop referral sources. Healthcare. The word landed with weight. Not excitement. Something quieter.</w:t>
+        <w:t xml:space="preserve">The recruiter’s call came on an ordinary day. By 2011, ordinary days were the whole texture of my life. The sharp edges were gone. Work, meetings, lifeguard shifts, dinners with Lou and Donna, early mornings that looked exactly like the ones before. When the phone rang that afternoon, I almost let it go to voicemail.</w:t>
+      </w:r>
+    </w:p>
+    <w:p>
+      <w:pPr>
+        <w:pStyle w:val="BodyText"/>
+      </w:pPr>
+      <w:r>
+        <w:t xml:space="preserve">When he asked me what I’d been doing for the last five years, I didn’t open up about everything.</w:t>
+      </w:r>
+    </w:p>
+    <w:p>
+      <w:pPr>
+        <w:pStyle w:val="BodyText"/>
+      </w:pPr>
+      <w:r>
+        <w:t xml:space="preserve">The recruiter was someone who knew someone, the way it happens in a town like Pensacola.</w:t>
+      </w:r>
+    </w:p>
+    <w:p>
+      <w:pPr>
+        <w:pStyle w:val="BodyText"/>
+      </w:pPr>
+      <w:r>
+        <w:t xml:space="preserve">“</w:t>
+      </w:r>
+      <w:r>
+        <w:t xml:space="preserve">We’re looking for someone to build relationships for a home health company, nursing, PT, OT, patients who can’t get to clinics. We need someone who can develop referral sources,</w:t>
+      </w:r>
+      <w:r>
+        <w:t xml:space="preserve">”</w:t>
+      </w:r>
+      <w:r>
+        <w:t xml:space="preserve"> </w:t>
+      </w:r>
+      <w:r>
+        <w:t xml:space="preserve">he told me.</w:t>
+      </w:r>
+    </w:p>
+    <w:p>
+      <w:pPr>
+        <w:pStyle w:val="BodyText"/>
+      </w:pPr>
+      <w:r>
+        <w:t xml:space="preserve">Healthcare. The word landed with weight. Not excitement. Something quieter.</w:t>
       </w:r>
     </w:p>
     <w:p>
@@ -8731,9 +8821,11 @@
       <w:r>
         <w:t xml:space="preserve">”</w:t>
       </w:r>
-      <w:r>
-        <w:t xml:space="preserve"> </w:t>
-      </w:r>
+    </w:p>
+    <w:p>
+      <w:pPr>
+        <w:pStyle w:val="BodyText"/>
+      </w:pPr>
       <w:r>
         <w:t xml:space="preserve">“</w:t>
       </w:r>
@@ -8743,9 +8835,11 @@
       <w:r>
         <w:t xml:space="preserve">”</w:t>
       </w:r>
-      <w:r>
-        <w:t xml:space="preserve"> </w:t>
-      </w:r>
+    </w:p>
+    <w:p>
+      <w:pPr>
+        <w:pStyle w:val="BodyText"/>
+      </w:pPr>
       <w:r>
         <w:t xml:space="preserve">“</w:t>
       </w:r>
@@ -8755,9 +8849,11 @@
       <w:r>
         <w:t xml:space="preserve">”</w:t>
       </w:r>
-      <w:r>
-        <w:t xml:space="preserve"> </w:t>
-      </w:r>
+    </w:p>
+    <w:p>
+      <w:pPr>
+        <w:pStyle w:val="BodyText"/>
+      </w:pPr>
       <w:r>
         <w:t xml:space="preserve">“</w:t>
       </w:r>
@@ -8767,20 +8863,24 @@
       <w:r>
         <w:t xml:space="preserve">”</w:t>
       </w:r>
-      <w:r>
-        <w:t xml:space="preserve"> </w:t>
-      </w:r>
-      <w:r>
-        <w:t xml:space="preserve">There it was. I didn’t spin it, and I didn’t tell the whole story either.</w:t>
-      </w:r>
-      <w:r>
-        <w:t xml:space="preserve"> </w:t>
-      </w:r>
-      <w:r>
-        <w:t xml:space="preserve">“</w:t>
-      </w:r>
-      <w:r>
-        <w:t xml:space="preserve">Some bumps in the road,</w:t>
+    </w:p>
+    <w:p>
+      <w:pPr>
+        <w:pStyle w:val="BodyText"/>
+      </w:pPr>
+      <w:r>
+        <w:t xml:space="preserve">There it was. I didn’t spin it, but I didn’t tell the whole story either.</w:t>
+      </w:r>
+    </w:p>
+    <w:p>
+      <w:pPr>
+        <w:pStyle w:val="BodyText"/>
+      </w:pPr>
+      <w:r>
+        <w:t xml:space="preserve">“</w:t>
+      </w:r>
+      <w:r>
+        <w:t xml:space="preserve">I hit some bumps in the road,</w:t>
       </w:r>
       <w:r>
         <w:t xml:space="preserve">”</w:t>
@@ -8803,9 +8903,11 @@
       <w:r>
         <w:t xml:space="preserve">”</w:t>
       </w:r>
-      <w:r>
-        <w:t xml:space="preserve"> </w:t>
-      </w:r>
+    </w:p>
+    <w:p>
+      <w:pPr>
+        <w:pStyle w:val="BodyText"/>
+      </w:pPr>
       <w:r>
         <w:t xml:space="preserve">Silence, not uncomfortable, just space.</w:t>
       </w:r>
@@ -8827,7 +8929,37 @@
         <w:pStyle w:val="BodyText"/>
       </w:pPr>
       <w:r>
-        <w:t xml:space="preserve">Caroline, the home health leader who would hire me, didn’t waste time. She read my résumé the way people do when they’re not looking to be impressed, following the rise all the way to where it stopped. She didn’t ask about the gaps. She asked about trust. How do you build it with people who don’t know you? What do you do when the territory’s cold and the numbers aren’t there? How do you stay consistent when results don’t come? I talked about discipline without ego, doing the work because it’s right, not because someone’s watching. Rejection as information, not a verdict. I talked about the pool, scanning the water when nothing was happening, how the job was the same whether anyone needed saving or not. She listened. Wrote. Looked up only when something mattered.</w:t>
+        <w:t xml:space="preserve">Caroline, the home health leader who would hire me, didn’t waste time. She read my résumé the way people do when they’re not looking to be impressed, following the rise all the way to where it stopped. She didn’t ask about the gaps. She asked about trust.</w:t>
+      </w:r>
+    </w:p>
+    <w:p>
+      <w:pPr>
+        <w:pStyle w:val="BodyText"/>
+      </w:pPr>
+      <w:r>
+        <w:t xml:space="preserve">“</w:t>
+      </w:r>
+      <w:r>
+        <w:t xml:space="preserve">How do you build trust and relationships with strangers? What do you do when the territory’s cold and the numbers aren’t there? How do you stay consistent when results don’t come?</w:t>
+      </w:r>
+      <w:r>
+        <w:t xml:space="preserve">”</w:t>
+      </w:r>
+    </w:p>
+    <w:p>
+      <w:pPr>
+        <w:pStyle w:val="BodyText"/>
+      </w:pPr>
+      <w:r>
+        <w:t xml:space="preserve">She was all business.</w:t>
+      </w:r>
+    </w:p>
+    <w:p>
+      <w:pPr>
+        <w:pStyle w:val="BodyText"/>
+      </w:pPr>
+      <w:r>
+        <w:t xml:space="preserve">I talked about discipline without ego, doing the work because it’s right, not because someone’s watching. Rejection as information, not a verdict. I talked about the pool, scanning the water when nothing was happening, how the job was the same whether anyone needed saving or not. She listened. Wrote. Looked up only when something mattered.</w:t>
       </w:r>
     </w:p>
     <w:p>
@@ -8861,15 +8993,19 @@
       <w:r>
         <w:t xml:space="preserve">”</w:t>
       </w:r>
-      <w:r>
-        <w:t xml:space="preserve"> </w:t>
-      </w:r>
-      <w:r>
-        <w:t xml:space="preserve">Once, I’d made five times that and felt hollow. This felt honest.</w:t>
-      </w:r>
-      <w:r>
-        <w:t xml:space="preserve"> </w:t>
-      </w:r>
+    </w:p>
+    <w:p>
+      <w:pPr>
+        <w:pStyle w:val="BodyText"/>
+      </w:pPr>
+      <w:r>
+        <w:t xml:space="preserve">I’d once made five times that and felt hollow. This work felt honest.</w:t>
+      </w:r>
+    </w:p>
+    <w:p>
+      <w:pPr>
+        <w:pStyle w:val="BodyText"/>
+      </w:pPr>
       <w:r>
         <w:t xml:space="preserve">“</w:t>
       </w:r>
@@ -8905,27 +9041,33 @@
       <w:r>
         <w:t xml:space="preserve">”</w:t>
       </w:r>
-      <w:r>
-        <w:t xml:space="preserve"> </w:t>
-      </w:r>
-      <w:r>
-        <w:t xml:space="preserve">I knew.</w:t>
-      </w:r>
-      <w:r>
-        <w:t xml:space="preserve"> </w:t>
-      </w:r>
-      <w:r>
-        <w:t xml:space="preserve">“</w:t>
-      </w:r>
-      <w:r>
-        <w:t xml:space="preserve">It shows two DUIs. Those weren’t disclosed.</w:t>
-      </w:r>
-      <w:r>
-        <w:t xml:space="preserve">”</w:t>
-      </w:r>
-      <w:r>
-        <w:t xml:space="preserve"> </w:t>
-      </w:r>
+    </w:p>
+    <w:p>
+      <w:pPr>
+        <w:pStyle w:val="BodyText"/>
+      </w:pPr>
+      <w:r>
+        <w:t xml:space="preserve">I expected this call.</w:t>
+      </w:r>
+    </w:p>
+    <w:p>
+      <w:pPr>
+        <w:pStyle w:val="BodyText"/>
+      </w:pPr>
+      <w:r>
+        <w:t xml:space="preserve">“</w:t>
+      </w:r>
+      <w:r>
+        <w:t xml:space="preserve">It shows two DUIs. You didn’t disclose those to us.</w:t>
+      </w:r>
+      <w:r>
+        <w:t xml:space="preserve">”</w:t>
+      </w:r>
+    </w:p>
+    <w:p>
+      <w:pPr>
+        <w:pStyle w:val="BodyText"/>
+      </w:pPr>
       <w:r>
         <w:t xml:space="preserve">“</w:t>
       </w:r>
@@ -8953,11 +9095,13 @@
       <w:r>
         <w:t xml:space="preserve">”</w:t>
       </w:r>
-      <w:r>
-        <w:t xml:space="preserve"> </w:t>
-      </w:r>
-      <w:r>
-        <w:t xml:space="preserve">A pause.</w:t>
+    </w:p>
+    <w:p>
+      <w:pPr>
+        <w:pStyle w:val="BodyText"/>
+      </w:pPr>
+      <w:r>
+        <w:t xml:space="preserve">She paused before continuing.</w:t>
       </w:r>
       <w:r>
         <w:t xml:space="preserve"> </w:t>
@@ -8971,15 +9115,19 @@
       <w:r>
         <w:t xml:space="preserve">”</w:t>
       </w:r>
-      <w:r>
-        <w:t xml:space="preserve"> </w:t>
-      </w:r>
-      <w:r>
-        <w:t xml:space="preserve">So I did. Not the polished version. What it had been, what it cost, what had changed. When I finished, the line stayed quiet.</w:t>
-      </w:r>
-      <w:r>
-        <w:t xml:space="preserve"> </w:t>
-      </w:r>
+    </w:p>
+    <w:p>
+      <w:pPr>
+        <w:pStyle w:val="BodyText"/>
+      </w:pPr>
+      <w:r>
+        <w:t xml:space="preserve">So I told her. And not the polished version where I had been a victim, or the funny version about craving nachos. Instead, I told her what I did, what it cost me, and what had changed since then. When I finished, the line stayed quiet.</w:t>
+      </w:r>
+    </w:p>
+    <w:p>
+      <w:pPr>
+        <w:pStyle w:val="BodyText"/>
+      </w:pPr>
       <w:r>
         <w:t xml:space="preserve">“</w:t>
       </w:r>
@@ -9013,11 +9161,21 @@
         <w:pStyle w:val="BodyText"/>
       </w:pPr>
       <w:r>
-        <w:t xml:space="preserve">Four days. I went to work, went to meetings, had dinner, slept, did it again. On the fifth day Caroline called.</w:t>
-      </w:r>
-      <w:r>
-        <w:t xml:space="preserve"> </w:t>
-      </w:r>
+        <w:t xml:space="preserve">When you’re at a stop light waiting for the light to change, it feels like it takes forever. Which is how I felt for the next four days. I went to work, attended meetings, ate, slept, woke up, and did it all over again.</w:t>
+      </w:r>
+    </w:p>
+    <w:p>
+      <w:pPr>
+        <w:pStyle w:val="BodyText"/>
+      </w:pPr>
+      <w:r>
+        <w:t xml:space="preserve">On the fifth day, Caroline called.</w:t>
+      </w:r>
+    </w:p>
+    <w:p>
+      <w:pPr>
+        <w:pStyle w:val="BodyText"/>
+      </w:pPr>
       <w:r>
         <w:t xml:space="preserve">“</w:t>
       </w:r>
@@ -9027,15 +9185,19 @@
       <w:r>
         <w:t xml:space="preserve">”</w:t>
       </w:r>
-      <w:r>
-        <w:t xml:space="preserve"> </w:t>
-      </w:r>
-      <w:r>
-        <w:t xml:space="preserve">I didn’t answer right away. I sat in my car in Lou’s driveway and let it settle. Not adrenaline. Gratitude. Someone had looked at who I was and decided it was enough. I called Lou.</w:t>
-      </w:r>
-      <w:r>
-        <w:t xml:space="preserve"> </w:t>
-      </w:r>
+    </w:p>
+    <w:p>
+      <w:pPr>
+        <w:pStyle w:val="BodyText"/>
+      </w:pPr>
+      <w:r>
+        <w:t xml:space="preserve">I didn’t answer right away. I sat in my car in Lou’s driveway and let it sink in. Alcoholics Anonymous had primed me for what I felt: gratitude. Someone had looked at me and decided I was enough. I called Lou.</w:t>
+      </w:r>
+    </w:p>
+    <w:p>
+      <w:pPr>
+        <w:pStyle w:val="BodyText"/>
+      </w:pPr>
       <w:r>
         <w:t xml:space="preserve">“</w:t>
       </w:r>
@@ -9045,93 +9207,69 @@
       <w:r>
         <w:t xml:space="preserve">”</w:t>
       </w:r>
-      <w:r>
-        <w:t xml:space="preserve"> </w:t>
-      </w:r>
-      <w:r>
-        <w:t xml:space="preserve">A pause.</w:t>
-      </w:r>
-      <w:r>
-        <w:t xml:space="preserve"> </w:t>
-      </w:r>
-      <w:r>
-        <w:t xml:space="preserve">“</w:t>
-      </w:r>
-      <w:r>
-        <w:t xml:space="preserve">That’s a blessing,</w:t>
-      </w:r>
-      <w:r>
-        <w:t xml:space="preserve">”</w:t>
-      </w:r>
-      <w:r>
-        <w:t xml:space="preserve"> </w:t>
-      </w:r>
-      <w:r>
-        <w:t xml:space="preserve">he said.</w:t>
-      </w:r>
-      <w:r>
-        <w:t xml:space="preserve"> </w:t>
-      </w:r>
-      <w:r>
-        <w:t xml:space="preserve">“</w:t>
-      </w:r>
-      <w:r>
-        <w:t xml:space="preserve">I’m proud of you.</w:t>
-      </w:r>
-      <w:r>
-        <w:t xml:space="preserve">”</w:t>
-      </w:r>
-      <w:r>
-        <w:t xml:space="preserve"> </w:t>
-      </w:r>
-      <w:r>
-        <w:t xml:space="preserve">After we hung up I sat there a long time.</w:t>
-      </w:r>
-    </w:p>
-    <w:p>
-      <w:pPr>
-        <w:pStyle w:val="BodyText"/>
-      </w:pPr>
-      <w:r>
-        <w:t xml:space="preserve">The work didn’t feel heroic, which surprised me. I half-expected the new job to arrive with meaning baked in. Day one was paperwork. Compliance modules. Acronyms I barely remembered from a former life, HIPAA, OASIS. Caroline didn’t give me a speech. She showed me how things worked.</w:t>
-      </w:r>
-      <w:r>
-        <w:t xml:space="preserve"> </w:t>
-      </w:r>
-      <w:r>
-        <w:t xml:space="preserve">“</w:t>
-      </w:r>
-      <w:r>
-        <w:t xml:space="preserve">This is a long game,</w:t>
-      </w:r>
-      <w:r>
-        <w:t xml:space="preserve">”</w:t>
-      </w:r>
-      <w:r>
-        <w:t xml:space="preserve"> </w:t>
-      </w:r>
-      <w:r>
-        <w:t xml:space="preserve">she said.</w:t>
-      </w:r>
-      <w:r>
-        <w:t xml:space="preserve"> </w:t>
-      </w:r>
-      <w:r>
-        <w:t xml:space="preserve">“</w:t>
-      </w:r>
-      <w:r>
-        <w:t xml:space="preserve">You don’t force referrals. You earn trust.</w:t>
-      </w:r>
-      <w:r>
-        <w:t xml:space="preserve">”</w:t>
-      </w:r>
-    </w:p>
-    <w:p>
-      <w:pPr>
-        <w:pStyle w:val="BodyText"/>
-      </w:pPr>
-      <w:r>
-        <w:t xml:space="preserve">Home health wasn’t selling, not the way I’d done it. It was assisted livings and living rooms, oxygen tanks humming in the corner, family members exhausted in ways sleep doesn’t fix. I walked into homes where time had slowed down.</w:t>
+    </w:p>
+    <w:p>
+      <w:pPr>
+        <w:pStyle w:val="BodyText"/>
+      </w:pPr>
+      <w:r>
+        <w:t xml:space="preserve">He said nothing for a moment. Then he spoke.</w:t>
+      </w:r>
+      <w:r>
+        <w:t xml:space="preserve"> </w:t>
+      </w:r>
+      <w:r>
+        <w:t xml:space="preserve">“</w:t>
+      </w:r>
+      <w:r>
+        <w:t xml:space="preserve">That’s a blessing. I’m proud of you.</w:t>
+      </w:r>
+      <w:r>
+        <w:t xml:space="preserve">”</w:t>
+      </w:r>
+    </w:p>
+    <w:p>
+      <w:pPr>
+        <w:pStyle w:val="BodyText"/>
+      </w:pPr>
+      <w:r>
+        <w:t xml:space="preserve">The work didn’t feel heroic, which surprised me. I half-expected the new job to arrive with meaning baked in. Day one was paperwork. Compliance modules. Acronyms I barely remembered from a former life, HIPAA, OASIS.</w:t>
+      </w:r>
+    </w:p>
+    <w:p>
+      <w:pPr>
+        <w:pStyle w:val="BodyText"/>
+      </w:pPr>
+      <w:r>
+        <w:t xml:space="preserve">Caroline stayed patient with me as I learned how things worked.</w:t>
+      </w:r>
+      <w:r>
+        <w:t xml:space="preserve"> </w:t>
+      </w:r>
+      <w:r>
+        <w:t xml:space="preserve">“</w:t>
+      </w:r>
+      <w:r>
+        <w:t xml:space="preserve">This is a long game. Your job isn’t to force referrals. Your role is to build relationships and earn trust.</w:t>
+      </w:r>
+      <w:r>
+        <w:t xml:space="preserve">”</w:t>
+      </w:r>
+    </w:p>
+    <w:p>
+      <w:pPr>
+        <w:pStyle w:val="BodyText"/>
+      </w:pPr>
+      <w:r>
+        <w:t xml:space="preserve">That’s what I needed to hear. When most people think of sales, they think of the stereotypical used car salesman—someone who pressures you to buy a wreck that won’t last and you can’t afford. Caroline not only gave me permission to view potential clients as loved ones but she stressed that the way to make money was selling clients something you knew they needed and would love. How do you know what they need and love? You get to know them.</w:t>
+      </w:r>
+    </w:p>
+    <w:p>
+      <w:pPr>
+        <w:pStyle w:val="BodyText"/>
+      </w:pPr>
+      <w:r>
+        <w:t xml:space="preserve">Home health wasn’t selling, not the way I’d done it. These potential customers spent their days in living rooms and nights in musty bedrooms. Their lives had become synonymous with oxygen tanks humming in the corner and family members exhausted in ways sleep doesn’t fix. These homes were ones where time had slowed down.</w:t>
       </w:r>
     </w:p>
     <w:p>
@@ -9149,9 +9287,11 @@
       <w:r>
         <w:t xml:space="preserve">Mr. Joe was newly diabetic, embarrassed he needed a nurse to teach him insulin. His hands shook as he practiced.</w:t>
       </w:r>
-      <w:r>
-        <w:t xml:space="preserve"> </w:t>
-      </w:r>
+    </w:p>
+    <w:p>
+      <w:pPr>
+        <w:pStyle w:val="BodyText"/>
+      </w:pPr>
       <w:r>
         <w:t xml:space="preserve">“</w:t>
       </w:r>
@@ -9179,23 +9319,25 @@
       <w:r>
         <w:t xml:space="preserve">”</w:t>
       </w:r>
-      <w:r>
-        <w:t xml:space="preserve"> </w:t>
-      </w:r>
-      <w:r>
-        <w:t xml:space="preserve">“</w:t>
-      </w:r>
-      <w:r>
-        <w:t xml:space="preserve">You have it,</w:t>
-      </w:r>
-      <w:r>
-        <w:t xml:space="preserve">”</w:t>
-      </w:r>
-      <w:r>
-        <w:t xml:space="preserve"> </w:t>
-      </w:r>
-      <w:r>
-        <w:t xml:space="preserve">I told him.</w:t>
+    </w:p>
+    <w:p>
+      <w:pPr>
+        <w:pStyle w:val="BodyText"/>
+      </w:pPr>
+      <w:r>
+        <w:t xml:space="preserve">“</w:t>
+      </w:r>
+      <w:r>
+        <w:t xml:space="preserve">Mr. Joe, you’re doing a great job,</w:t>
+      </w:r>
+      <w:r>
+        <w:t xml:space="preserve">”</w:t>
+      </w:r>
+      <w:r>
+        <w:t xml:space="preserve"> </w:t>
+      </w:r>
+      <w:r>
+        <w:t xml:space="preserve">I assured him.</w:t>
       </w:r>
       <w:r>
         <w:t xml:space="preserve"> </w:t>
@@ -9221,11 +9363,29 @@
         <w:pStyle w:val="BodyText"/>
       </w:pPr>
       <w:r>
-        <w:t xml:space="preserve">It was familiar. I knew what it was like to need help and not want it, to be ashamed of dependence, to apologize for taking up space when you’re the one suffering. So when families talked I didn’t rush them, didn’t fill the silence, didn’t pitch. I listened. Caroline noticed.</w:t>
-      </w:r>
-      <w:r>
-        <w:t xml:space="preserve"> </w:t>
-      </w:r>
+        <w:t xml:space="preserve">Each person I met had a story, a life beyond their current situation. I listened to their stories with reverence, feeling it a sacred honor to hear their experiences. I recognized that I could live one life only; but by staying present and hearing each one of these people I’d been entrusted to meet with, I took with me some of their knowledge and at least a bit of their wisdom.</w:t>
+      </w:r>
+    </w:p>
+    <w:p>
+      <w:pPr>
+        <w:pStyle w:val="BodyText"/>
+      </w:pPr>
+      <w:r>
+        <w:t xml:space="preserve">I loved how familiar this role felt to me. I remember needing help but not wanting to be helped. It hadn’t been long since I’d felt like I owed God, the universe, and every human on the planet an apology for taking up space and oxygen. I knew the shame and grief of losing my independence. So, when families talked, I didn’t rush them, fill the silence, or pitch them on a product or service. I listened.</w:t>
+      </w:r>
+    </w:p>
+    <w:p>
+      <w:pPr>
+        <w:pStyle w:val="BodyText"/>
+      </w:pPr>
+      <w:r>
+        <w:t xml:space="preserve">Caroline noticed.</w:t>
+      </w:r>
+    </w:p>
+    <w:p>
+      <w:pPr>
+        <w:pStyle w:val="BodyText"/>
+      </w:pPr>
       <w:r>
         <w:t xml:space="preserve">“</w:t>
       </w:r>
@@ -9253,31 +9413,49 @@
       <w:r>
         <w:t xml:space="preserve">”</w:t>
       </w:r>
-      <w:r>
-        <w:t xml:space="preserve"> </w:t>
-      </w:r>
-      <w:r>
-        <w:t xml:space="preserve">“</w:t>
-      </w:r>
-      <w:r>
-        <w:t xml:space="preserve">I know what it feels like to be scared,</w:t>
-      </w:r>
-      <w:r>
-        <w:t xml:space="preserve">”</w:t>
-      </w:r>
-      <w:r>
-        <w:t xml:space="preserve"> </w:t>
-      </w:r>
-      <w:r>
-        <w:t xml:space="preserve">I said. She nodded. No follow-up. She’d already decided to trust me, and I understood what that trust meant in a way I wouldn’t have before.</w:t>
-      </w:r>
-    </w:p>
-    <w:p>
-      <w:pPr>
-        <w:pStyle w:val="BodyText"/>
-      </w:pPr>
-      <w:r>
-        <w:t xml:space="preserve">The days were long, doctors’ offices, nursing homes, assisted livings, back roads. At night I still went to meetings, still called my sponsor. There was a moment, small and almost forgettable, when I was sitting in my car after a visit with paperwork on the steering wheel and realized I wasn’t waiting for something else anymore. This was enough. They gave me a chance, and I stayed ten years.</w:t>
+    </w:p>
+    <w:p>
+      <w:pPr>
+        <w:pStyle w:val="BodyText"/>
+      </w:pPr>
+      <w:r>
+        <w:t xml:space="preserve">“</w:t>
+      </w:r>
+      <w:r>
+        <w:t xml:space="preserve">Thank you for that. Maybe it’s because I know what it feels like to be scared,</w:t>
+      </w:r>
+      <w:r>
+        <w:t xml:space="preserve">”</w:t>
+      </w:r>
+      <w:r>
+        <w:t xml:space="preserve"> </w:t>
+      </w:r>
+      <w:r>
+        <w:t xml:space="preserve">I said.</w:t>
+      </w:r>
+    </w:p>
+    <w:p>
+      <w:pPr>
+        <w:pStyle w:val="BodyText"/>
+      </w:pPr>
+      <w:r>
+        <w:t xml:space="preserve">She nodded. No follow-up. She’d already decided to trust me, and I understood what that trust meant in a way I wouldn’t have before.</w:t>
+      </w:r>
+    </w:p>
+    <w:p>
+      <w:pPr>
+        <w:pStyle w:val="BodyText"/>
+      </w:pPr>
+      <w:r>
+        <w:t xml:space="preserve">The days were long, doctors’ offices, nursing homes, assisted livings, back roads. At night I still went to meetings and called my sponsor. There was a moment, small and almost forgettable, when I was sitting in my car after a visit with paperwork on the steering wheel and realized I wasn’t waiting for something else anymore.</w:t>
+      </w:r>
+    </w:p>
+    <w:p>
+      <w:pPr>
+        <w:pStyle w:val="BodyText"/>
+      </w:pPr>
+      <w:r>
+        <w:t xml:space="preserve">This was enough. Someone had given me one chance to prove myself, and I stayed ten years.</w:t>
       </w:r>
     </w:p>
     <w:p>
@@ -9361,19 +9539,29 @@
         <w:pStyle w:val="BodyText"/>
       </w:pPr>
       <w:r>
-        <w:t xml:space="preserve">$113,000. That was the number when I finally added it up in ink, every credit card and collection account and legal fee, no rounding. I’d spent years not looking at it. Steady work meant I could finally face the wreckage I’d been outrunning, and my sponsor Mager was the one who walked me into it. He didn’t rush me. He was patient, but he wasn’t buying the act. I could make my recovery sound like a success story, still controlling the version of me in the room. Mager didn’t interrupt. He listened in a way that made clear he was hearing more than I was saying, and eventually, with nowhere for the story to land, it fell apart on its own.</w:t>
-      </w:r>
-    </w:p>
-    <w:p>
-      <w:pPr>
-        <w:pStyle w:val="BodyText"/>
-      </w:pPr>
-      <w:r>
-        <w:t xml:space="preserve">I got stuck on the amends step. Not in theory. In the concrete requirement to account for everything, without narrative, without softening. One night after a meeting, Mager slid a yellow legal pad across the table.</w:t>
-      </w:r>
-      <w:r>
-        <w:t xml:space="preserve"> </w:t>
-      </w:r>
+        <w:t xml:space="preserve">I got stuck on step eight and nine, the amends steps. Step eight was somewhat easy, since it was theoretical. I had no problem listing the people I’d harmed in my addiction or being willing to make amends to them. Like, theoretically, I’d give my life to save another person. Sure. Until the moment came. Then what would I do?</w:t>
+      </w:r>
+    </w:p>
+    <w:p>
+      <w:pPr>
+        <w:pStyle w:val="BodyText"/>
+      </w:pPr>
+      <w:r>
+        <w:t xml:space="preserve">Making amends goes beyond theory and a list of names.</w:t>
+      </w:r>
+    </w:p>
+    <w:p>
+      <w:pPr>
+        <w:pStyle w:val="BodyText"/>
+      </w:pPr>
+      <w:r>
+        <w:t xml:space="preserve">One night after a meeting, Mager slid a yellow legal pad across the table.</w:t>
+      </w:r>
+    </w:p>
+    <w:p>
+      <w:pPr>
+        <w:pStyle w:val="BodyText"/>
+      </w:pPr>
       <w:r>
         <w:t xml:space="preserve">“</w:t>
       </w:r>
@@ -9387,15 +9575,91 @@
         <w:t xml:space="preserve"> </w:t>
       </w:r>
       <w:r>
-        <w:t xml:space="preserve">he said. I knew what he meant.</w:t>
-      </w:r>
-    </w:p>
-    <w:p>
-      <w:pPr>
-        <w:pStyle w:val="BodyText"/>
-      </w:pPr>
-      <w:r>
-        <w:t xml:space="preserve">I had never been honest with myself about money. I used it to keep score. This was about what it had cost. I started listing. Credit cards, multiple, run up over years of buying the appearance of success with borrowed money. Medical bills. Legal fees. Collection accounts I hadn’t looked at directly in months. When I finished I added it up slowly. $113,000. I waited for the spiral. It didn’t come. What came was clarity. The real number doesn’t move. It just sits there, and because it sits there, you can work with it.</w:t>
+        <w:t xml:space="preserve">he said.</w:t>
+      </w:r>
+      <w:r>
+        <w:t xml:space="preserve"> </w:t>
+      </w:r>
+      <w:r>
+        <w:t xml:space="preserve">“</w:t>
+      </w:r>
+      <w:r>
+        <w:t xml:space="preserve">All of it. No bullshit.</w:t>
+      </w:r>
+      <w:r>
+        <w:t xml:space="preserve">”</w:t>
+      </w:r>
+    </w:p>
+    <w:p>
+      <w:pPr>
+        <w:pStyle w:val="BodyText"/>
+      </w:pPr>
+      <w:r>
+        <w:t xml:space="preserve">I knew what he meant.</w:t>
+      </w:r>
+    </w:p>
+    <w:p>
+      <w:pPr>
+        <w:pStyle w:val="BodyText"/>
+      </w:pPr>
+      <w:r>
+        <w:t xml:space="preserve">I had never been honest with myself about money. I used it to keep score. This was about what it had cost. I started listing. Credit cards, multiple, run up over years of buying the appearance of success with borrowed money. Medical bills. Legal fees. Collection accounts I hadn’t looked at directly in months.</w:t>
+      </w:r>
+    </w:p>
+    <w:p>
+      <w:pPr>
+        <w:pStyle w:val="BodyText"/>
+      </w:pPr>
+      <w:r>
+        <w:t xml:space="preserve">$113,000. That was the number when I finally added it up in ink, every credit card and collection account and legal fee, no rounding. I’d spent years not looking at it. Steady work meant I could finally face the wreckage I’d been outrunning, and my sponsor, Mager, was the one who walked me into it. He was patient, but he wasn’t buying the version of my recovery story where I’d made it. When I told it, I held back some details and shared al tightly managed version of events. Mager didn’t interrupt. He listened in a way that made clear he was hearing more than I was saying, and eventually, with nowhere for the story to land, it fell apart on its own.</w:t>
+      </w:r>
+    </w:p>
+    <w:p>
+      <w:pPr>
+        <w:pStyle w:val="BodyText"/>
+      </w:pPr>
+      <w:r>
+        <w:t xml:space="preserve">“</w:t>
+      </w:r>
+      <w:r>
+        <w:t xml:space="preserve">OK,</w:t>
+      </w:r>
+      <w:r>
+        <w:t xml:space="preserve">”</w:t>
+      </w:r>
+      <w:r>
+        <w:t xml:space="preserve"> </w:t>
+      </w:r>
+      <w:r>
+        <w:t xml:space="preserve">he said.</w:t>
+      </w:r>
+      <w:r>
+        <w:t xml:space="preserve"> </w:t>
+      </w:r>
+      <w:r>
+        <w:t xml:space="preserve">“</w:t>
+      </w:r>
+      <w:r>
+        <w:t xml:space="preserve">Time to fix it. All of it.</w:t>
+      </w:r>
+      <w:r>
+        <w:t xml:space="preserve">”</w:t>
+      </w:r>
+    </w:p>
+    <w:p>
+      <w:pPr>
+        <w:pStyle w:val="BodyText"/>
+      </w:pPr>
+      <w:r>
+        <w:t xml:space="preserve">$113,000.</w:t>
+      </w:r>
+    </w:p>
+    <w:p>
+      <w:pPr>
+        <w:pStyle w:val="BodyText"/>
+      </w:pPr>
+      <w:r>
+        <w:t xml:space="preserve">I waited for the spiral. It didn’t come. What came was clarity. The real number doesn’t move. It just sits there, and because it sits there, you can work with it.</w:t>
       </w:r>
     </w:p>
     <w:p>
@@ -9405,9 +9669,11 @@
       <w:r>
         <w:t xml:space="preserve">Mager looked at the pad. Didn’t soften it, didn’t minimize it.</w:t>
       </w:r>
-      <w:r>
-        <w:t xml:space="preserve"> </w:t>
-      </w:r>
+    </w:p>
+    <w:p>
+      <w:pPr>
+        <w:pStyle w:val="BodyText"/>
+      </w:pPr>
       <w:r>
         <w:t xml:space="preserve">“</w:t>
       </w:r>
@@ -9435,27 +9701,39 @@
       <w:r>
         <w:t xml:space="preserve">”</w:t>
       </w:r>
-      <w:r>
-        <w:t xml:space="preserve"> </w:t>
-      </w:r>
-      <w:r>
-        <w:t xml:space="preserve">We kept it basic: pay what you can, don’t borrow, don’t hide, open the envelopes, answer the calls, always know where you stand. At one point I reached for the future.</w:t>
-      </w:r>
-      <w:r>
-        <w:t xml:space="preserve"> </w:t>
-      </w:r>
-      <w:r>
-        <w:t xml:space="preserve">“</w:t>
-      </w:r>
-      <w:r>
-        <w:t xml:space="preserve">Once I make more.</w:t>
-      </w:r>
-      <w:r>
-        <w:t xml:space="preserve">”</w:t>
-      </w:r>
-      <w:r>
-        <w:t xml:space="preserve"> </w:t>
-      </w:r>
+    </w:p>
+    <w:p>
+      <w:pPr>
+        <w:pStyle w:val="BodyText"/>
+      </w:pPr>
+      <w:r>
+        <w:t xml:space="preserve">We kept it basic: pay what you can, don’t borrow, don’t hide, open the envelopes, answer the calls, always know where you stand.</w:t>
+      </w:r>
+    </w:p>
+    <w:p>
+      <w:pPr>
+        <w:pStyle w:val="BodyText"/>
+      </w:pPr>
+      <w:r>
+        <w:t xml:space="preserve">At one point I reached for the future.</w:t>
+      </w:r>
+      <w:r>
+        <w:t xml:space="preserve"> </w:t>
+      </w:r>
+      <w:r>
+        <w:t xml:space="preserve">“</w:t>
+      </w:r>
+      <w:r>
+        <w:t xml:space="preserve">Ok, once I make more—</w:t>
+      </w:r>
+      <w:r>
+        <w:t xml:space="preserve">”</w:t>
+      </w:r>
+    </w:p>
+    <w:p>
+      <w:pPr>
+        <w:pStyle w:val="BodyText"/>
+      </w:pPr>
       <w:r>
         <w:t xml:space="preserve">Mager stopped me.</w:t>
       </w:r>
@@ -9466,26 +9744,42 @@
         <w:t xml:space="preserve">“</w:t>
       </w:r>
       <w:r>
-        <w:t xml:space="preserve">Use the money you actually have. That’s how trust gets rebuilt.</w:t>
-      </w:r>
-      <w:r>
-        <w:t xml:space="preserve">”</w:t>
-      </w:r>
-    </w:p>
-    <w:p>
-      <w:pPr>
-        <w:pStyle w:val="BodyText"/>
-      </w:pPr>
-      <w:r>
-        <w:t xml:space="preserve">My mother’s money never went on that legal pad. What I owed her had no number on it. The lies I’d told her went into my fourth step and my fifth, and for years I told myself the rest was paid in the only currency she ever wanted — her son, alive and honest. Writing this book made me stop on that sentence. Sober and alive is a start. It isn’t a settlement. She’s the last parent I have, down in South Florida, and I am not there enough. I’ve come to think this isn’t an amends you finish — not a letter, not a line in a book. It’s the trips. More of my time, which is the one thing she always wanted and the one thing I kept for myself. I love her, and I haven’t shown it the way she showed me. I’m booking a trip to South Florida to see her — to start being a better son while I still have the time to be one. The debt on the pad didn’t disappear fast. But I stopped flinching when bills came. I started answering calls from numbers I didn’t recognize. My past stopped feeling like it was following me, not because it was gone, but because it was being addressed. Not redemption. Nothing was being erased. Responsibility. One payment, one opened envelope, one answered call at a time.</w:t>
-      </w:r>
-    </w:p>
-    <w:p>
-      <w:pPr>
-        <w:pStyle w:val="BodyText"/>
-      </w:pPr>
-      <w:r>
-        <w:t xml:space="preserve">One amends I owed Chris had nothing to do with money. I’m the older brother. On paper the job was mine, look out for him, go first, take the hit. My addiction handed that job to him instead. He drove me to detox. He called me with the ultimatum. He watched the whole family bend around a crisis I kept making, and somewhere in it he became the big brother, a promotion he never asked for. When I made my amends to him, I said it plain.</w:t>
+        <w:t xml:space="preserve">No. Use the money you actually have. That’s how trust gets rebuilt.</w:t>
+      </w:r>
+      <w:r>
+        <w:t xml:space="preserve">”</w:t>
+      </w:r>
+    </w:p>
+    <w:p>
+      <w:pPr>
+        <w:pStyle w:val="BodyText"/>
+      </w:pPr>
+      <w:r>
+        <w:t xml:space="preserve">My mother’s money never went on that legal pad. What I owed her had no number on it. The lies I’d told her went into my fourth step and my fifth, and for years I told myself the rest was paid in the only currency she ever wanted — her son, alive and honest. Writing this book made me stop on that sentence. Sober and alive is a start. It isn’t a settlement. She’s the last parent I have, down in South Florida, and I am not there enough. I’ve come to think this isn’t an amends you finish — not a letter, not a line in a book. It’s the trips, my time, which is the one thing she always wanted and the one thing I kept for myself.</w:t>
+      </w:r>
+    </w:p>
+    <w:p>
+      <w:pPr>
+        <w:pStyle w:val="BodyText"/>
+      </w:pPr>
+      <w:r>
+        <w:t xml:space="preserve">I love her, and I haven’t shown it the way she showed me. I’m booking a trip to South Florida to see her — to start being a better son while I still have the time to be one. The debt on the pad didn’t disappear fast. But I stopped flinching when bills came. I started answering calls from numbers I didn’t recognize. My past stopped feeling like it was following me, not because it was gone, but because it was being addressed. Not redemption. Nothing was being erased. Responsibility. One payment, one opened envelope, one answered call at a time.</w:t>
+      </w:r>
+    </w:p>
+    <w:p>
+      <w:pPr>
+        <w:pStyle w:val="BodyText"/>
+      </w:pPr>
+      <w:r>
+        <w:t xml:space="preserve">My amends to Chris had nothing to do with money. I’m the older brother. On paper the job was mine, look out for him, go first, take the hit. My addiction handed that job to him instead. He drove me to detox. He called me with the ultimatum. He watched the whole family bend around a crisis I kept making, and somewhere in it he became the big brother, a promotion he never asked for.</w:t>
+      </w:r>
+    </w:p>
+    <w:p>
+      <w:pPr>
+        <w:pStyle w:val="BodyText"/>
+      </w:pPr>
+      <w:r>
+        <w:t xml:space="preserve">When I made my amends to him, I said it plain.</w:t>
       </w:r>
       <w:r>
         <w:t xml:space="preserve"> </w:t>
@@ -9499,9 +9793,11 @@
       <w:r>
         <w:t xml:space="preserve">”</w:t>
       </w:r>
-      <w:r>
-        <w:t xml:space="preserve"> </w:t>
-      </w:r>
+    </w:p>
+    <w:p>
+      <w:pPr>
+        <w:pStyle w:val="BodyText"/>
+      </w:pPr>
       <w:r>
         <w:t xml:space="preserve">He waved it off the way he waves off everything. But I needed to say it, and I needed him to hear it. He carried a weight that should have been mine, and he never once made me feel like the weight.</w:t>
       </w:r>
@@ -9511,7 +9807,15 @@
         <w:pStyle w:val="BodyText"/>
       </w:pPr>
       <w:r>
-        <w:t xml:space="preserve">The courts came last. In 2013, four years sober, I wrote to the court myself and petitioned to have the cases dismissed. No lawyer this time. In 2002 that work had taken a good attorney and ten thousand dollars. In 2013 it took a letter from a sober man who had done everything the court asked. The dismissals came through.</w:t>
+        <w:t xml:space="preserve">The courts came last. In 2013, four years sober, I wrote to the court myself and petitioned to have the cases dismissed. No lawyer this time. In 2002 that work had taken a good attorney and ten thousand dollars. In 2013 it took a letter from a sober man who had done everything the court asked.</w:t>
+      </w:r>
+    </w:p>
+    <w:p>
+      <w:pPr>
+        <w:pStyle w:val="BodyText"/>
+      </w:pPr>
+      <w:r>
+        <w:t xml:space="preserve">The court responded to my sincere brokenness in my amends. They granted me those dismissals.</w:t>
       </w:r>
     </w:p>
     <w:p>
@@ -9595,27 +9899,75 @@
         <w:pStyle w:val="BodyText"/>
       </w:pPr>
       <w:r>
-        <w:t xml:space="preserve">I didn’t buy it because it made sense. On paper it didn’t. An association fee. Seven hundred and sixty-five square feet, one bedroom, one bath, but it was all I needed. It was a condo carved out of a building called the Mirador, Spanish stucco with a Spanish tile roof, a place that looked like it belonged in Southern California or Mexico and somehow held its ground in Pensacola. My unit had its own balcony over the pool. To this day it’s the proudest I have ever been of a place I lived.</w:t>
-      </w:r>
-    </w:p>
-    <w:p>
-      <w:pPr>
-        <w:pStyle w:val="BodyText"/>
-      </w:pPr>
-      <w:r>
-        <w:t xml:space="preserve">The color was impossible to ignore. Salmon. Warm and defiant. It sat up off the road like a little castle on a hill, and that is exactly why my friends named it the Salmon Palace. They said it proud. The deed said the Mirador. Both were true. For years I drove past it on my way home from meetings. At first I barely noticed it. Then I noticed it every time. Then I was slowing down, then parking across the street to sit and stare. I couldn’t imagine ever living there. So I did the thing they teach you. I pictured it anyway, owning it one day, a kind of prayer I didn’t have the nerve to say out loud. Something in me recognized the place.</w:t>
-      </w:r>
-    </w:p>
-    <w:p>
-      <w:pPr>
-        <w:pStyle w:val="BodyText"/>
-      </w:pPr>
-      <w:r>
-        <w:t xml:space="preserve">By then I was doing well again, quietly. Home health had stabilized my life. Sober, paying bills, still carrying debt but no longer running from it. I wasn’t after something bigger. I wanted something that was mine. The realtor showed me the sensible options first, places near the railroad tracks, starter homes with neutral paint, the kind that say be grateful this is all you can afford. None of them felt right. When I asked about the Mirador she raised an eyebrow.</w:t>
-      </w:r>
-      <w:r>
-        <w:t xml:space="preserve"> </w:t>
-      </w:r>
+        <w:t xml:space="preserve">The condo had been carved out of a building called the Mirador, and its Spanish stucco with a Spanish tile roof looked more like Southern California or Mexico than Pensacola. Seven hundred and sixty-five square feet, one bedroom, one bath, with a balcony overlooking the pool. It had everything I needed, and it remains the proudest I’ve ever been of a place I lived.</w:t>
+      </w:r>
+    </w:p>
+    <w:p>
+      <w:pPr>
+        <w:pStyle w:val="BodyText"/>
+      </w:pPr>
+      <w:r>
+        <w:t xml:space="preserve">The color was impossible to ignore. Salmon. Warm and defiant. It sat up off the road like a little castle on a hill, and that is exactly why my friends named it</w:t>
+      </w:r>
+      <w:r>
+        <w:t xml:space="preserve"> </w:t>
+      </w:r>
+      <w:r>
+        <w:t xml:space="preserve">“</w:t>
+      </w:r>
+      <w:r>
+        <w:t xml:space="preserve">the Salmon Palace.</w:t>
+      </w:r>
+      <w:r>
+        <w:t xml:space="preserve">”</w:t>
+      </w:r>
+      <w:r>
+        <w:t xml:space="preserve"> </w:t>
+      </w:r>
+      <w:r>
+        <w:t xml:space="preserve">I’d never lived in a place my friends deemed cool enough to give it its own name. It made me proud. gave</w:t>
+      </w:r>
+    </w:p>
+    <w:p>
+      <w:pPr>
+        <w:pStyle w:val="BodyText"/>
+      </w:pPr>
+      <w:r>
+        <w:t xml:space="preserve">For years I’d driven past it on my way home from meetings. At first, I barely noticed it. Maybe I’d initially found the color so off-putting that my mind refused to record it. But once I noticed it, I couldn’t not see it. Then I was slowing down, then parking across the street to sit and stare. I couldn’t imagine ever living there. So, I did the thing they teach you. I pictured it anyway, owning it one day, a kind of prayer I didn’t have the nerve to say out loud. Something in me recognized the place.</w:t>
+      </w:r>
+    </w:p>
+    <w:p>
+      <w:pPr>
+        <w:pStyle w:val="BodyText"/>
+      </w:pPr>
+      <w:r>
+        <w:t xml:space="preserve">By then I was doing well again, quietly. Home health had stabilized my life. Sober, paying bills, still carrying debt but no longer running from it. I wasn’t chasing anything bigger or better. I wanted something that was mine. The realtor showed me the sensible options first, places near the railroad tracks, starter homes with neutral paint, the kind that says,</w:t>
+      </w:r>
+      <w:r>
+        <w:t xml:space="preserve"> </w:t>
+      </w:r>
+      <w:r>
+        <w:t xml:space="preserve">“</w:t>
+      </w:r>
+      <w:r>
+        <w:t xml:space="preserve">Look, I know it’s a cookie-cutter home in a cookie-cutter neighborhood and cookie-cutter landscaping. But, once you put some new paint on the walls, it’ll look better. At least on the inside.</w:t>
+      </w:r>
+      <w:r>
+        <w:t xml:space="preserve">”</w:t>
+      </w:r>
+    </w:p>
+    <w:p>
+      <w:pPr>
+        <w:pStyle w:val="BodyText"/>
+      </w:pPr>
+      <w:r>
+        <w:t xml:space="preserve">None of those places felt right. When I asked about the Mirador, she raised an eyebrow.</w:t>
+      </w:r>
+    </w:p>
+    <w:p>
+      <w:pPr>
+        <w:pStyle w:val="BodyText"/>
+      </w:pPr>
       <w:r>
         <w:t xml:space="preserve">“</w:t>
       </w:r>
@@ -9631,9 +9983,11 @@
       <w:r>
         <w:t xml:space="preserve">she said.</w:t>
       </w:r>
-      <w:r>
-        <w:t xml:space="preserve"> </w:t>
-      </w:r>
+    </w:p>
+    <w:p>
+      <w:pPr>
+        <w:pStyle w:val="BodyText"/>
+      </w:pPr>
       <w:r>
         <w:t xml:space="preserve">“</w:t>
       </w:r>
@@ -9663,11 +10017,21 @@
         <w:pStyle w:val="BodyText"/>
       </w:pPr>
       <w:r>
-        <w:t xml:space="preserve">Prices in Pensacola were still down in 2014, which is the only reason a place like that ever came within reach. It was listed at a hundred and thirty thousand. I offered a hundred and nine, and they accepted. The only thing between me and the keys was the down payment, and I was short. Not dramatically. Enough to matter. So I called my brother, and I hated every second of it. Chris had done everything right, watched Lou rescue me, watched me fall and climb and wobble. He loved me, but love isn’t unlimited credit.</w:t>
-      </w:r>
-      <w:r>
-        <w:t xml:space="preserve"> </w:t>
-      </w:r>
+        <w:t xml:space="preserve">Prices in Pensacola were still down in 2014, which is the only reason a place like that ever came within my budget. It was listed at a hundred and thirty thousand. I offered a hundred and nine, and they accepted. The only thing between me and the keys was the down payment, and I was short. Not dramatically. But enough to matter. So, I called my brother, and I hated every second of it.</w:t>
+      </w:r>
+    </w:p>
+    <w:p>
+      <w:pPr>
+        <w:pStyle w:val="BodyText"/>
+      </w:pPr>
+      <w:r>
+        <w:t xml:space="preserve">Chris had done everything right, watched Lou rescue me, watched me fall and climb and wobble. He loved me, but love isn’t unlimited credit.</w:t>
+      </w:r>
+    </w:p>
+    <w:p>
+      <w:pPr>
+        <w:pStyle w:val="BodyText"/>
+      </w:pPr>
       <w:r>
         <w:t xml:space="preserve">“</w:t>
       </w:r>
@@ -9681,11 +10045,21 @@
         <w:t xml:space="preserve"> </w:t>
       </w:r>
       <w:r>
-        <w:t xml:space="preserve">I said. He didn’t make me sweat it.</w:t>
-      </w:r>
-      <w:r>
-        <w:t xml:space="preserve"> </w:t>
-      </w:r>
+        <w:t xml:space="preserve">I said.</w:t>
+      </w:r>
+    </w:p>
+    <w:p>
+      <w:pPr>
+        <w:pStyle w:val="BodyText"/>
+      </w:pPr>
+      <w:r>
+        <w:t xml:space="preserve">He didn’t make me sweat it.</w:t>
+      </w:r>
+    </w:p>
+    <w:p>
+      <w:pPr>
+        <w:pStyle w:val="BodyText"/>
+      </w:pPr>
       <w:r>
         <w:t xml:space="preserve">“</w:t>
       </w:r>
@@ -9713,37 +10087,37 @@
       <w:r>
         <w:t xml:space="preserve">”</w:t>
       </w:r>
-      <w:r>
-        <w:t xml:space="preserve"> </w:t>
-      </w:r>
-      <w:r>
-        <w:t xml:space="preserve">He wasn’t threatening me. He was trusting me, conditionally.</w:t>
-      </w:r>
-      <w:r>
-        <w:t xml:space="preserve"> </w:t>
-      </w:r>
-      <w:r>
-        <w:t xml:space="preserve">“</w:t>
-      </w:r>
-      <w:r>
-        <w:t xml:space="preserve">I understand,</w:t>
-      </w:r>
-      <w:r>
-        <w:t xml:space="preserve">”</w:t>
-      </w:r>
-      <w:r>
-        <w:t xml:space="preserve"> </w:t>
-      </w:r>
-      <w:r>
-        <w:t xml:space="preserve">I said. He sent it. I set up an automatic payment that day, two hundred a month, and paid extra when I could. It took four years. I never missed one.</w:t>
-      </w:r>
-    </w:p>
-    <w:p>
-      <w:pPr>
-        <w:pStyle w:val="BodyText"/>
-      </w:pPr>
-      <w:r>
-        <w:t xml:space="preserve">When I got the keys, I stood in the middle of that small living room longer than I expected. Nothing about it was impressive, and that was the point. I’d earned it through doing the next right thing. For five years the Mirador was my world. I woke up there, prayed there, paid down debt there, stayed sober there. Went to work, came home, did it again. Nobody applauded, and that was the miracle.</w:t>
+    </w:p>
+    <w:p>
+      <w:pPr>
+        <w:pStyle w:val="BodyText"/>
+      </w:pPr>
+      <w:r>
+        <w:t xml:space="preserve">Instead of threatening me, he was offering me unconditional trust, as if I’d never been a dumpster fire of addictions, lies, and runaway debt.</w:t>
+      </w:r>
+    </w:p>
+    <w:p>
+      <w:pPr>
+        <w:pStyle w:val="BodyText"/>
+      </w:pPr>
+      <w:r>
+        <w:t xml:space="preserve">I set up an automatic payment to pay him back two hundred a month and paid extra when I could. It took me four years. I never missed a payment. I woulnd’t have dreamed of missing a payment. His trust was gold to me, and I would have rather died than to lose it again.</w:t>
+      </w:r>
+    </w:p>
+    <w:p>
+      <w:pPr>
+        <w:pStyle w:val="BodyText"/>
+      </w:pPr>
+      <w:r>
+        <w:t xml:space="preserve">When I got the keys, I stood in the middle of that small living room and looked around longer than I expected. Nothing about it was impressive, and that was the point. I’d earned it through doing the right thing while learning how to live sober. For five years, the Mirador was my world. I woke up there, prayed there, paid down debt there, stayed sober there. Went to work, came home, and did it again.</w:t>
+      </w:r>
+    </w:p>
+    <w:p>
+      <w:pPr>
+        <w:pStyle w:val="BodyText"/>
+      </w:pPr>
+      <w:r>
+        <w:t xml:space="preserve">Nobody applauded. I no longer needed them to. That was the miracle.</w:t>
       </w:r>
     </w:p>
     <w:p>
@@ -9835,15 +10209,15 @@
         <w:pStyle w:val="BodyText"/>
       </w:pPr>
       <w:r>
-        <w:t xml:space="preserve">He never remarried. No second family, no one after my mother.</w:t>
-      </w:r>
-    </w:p>
-    <w:p>
-      <w:pPr>
-        <w:pStyle w:val="BodyText"/>
-      </w:pPr>
-      <w:r>
-        <w:t xml:space="preserve">When I was small, he called me his good luck charm. I think about that now. Whatever luck I was, it got on a plane when I was four, and he stayed where it left him.</w:t>
+        <w:t xml:space="preserve">My biological father never remarried. No second family, no one after my mother.</w:t>
+      </w:r>
+    </w:p>
+    <w:p>
+      <w:pPr>
+        <w:pStyle w:val="BodyText"/>
+      </w:pPr>
+      <w:r>
+        <w:t xml:space="preserve">When I was small, he’d called me his good luck charm. I think about that now. Whatever luck I was, it got on a plane when I was four, and he stayed where it left him.</w:t>
       </w:r>
     </w:p>
     <w:p>
@@ -9927,15 +10301,15 @@
         <w:pStyle w:val="BodyText"/>
       </w:pPr>
       <w:r>
-        <w:t xml:space="preserve">Mostly we talked about sports. That was the easy ground between us. He loved baseball, so we would go back and forth about games and players, who was hot and who was washed up. Soccer was his real love, though. He would get going on it and the stories would come, matches he had seen, players he swore by, games that had meant something to him long before I was born.</w:t>
-      </w:r>
-    </w:p>
-    <w:p>
-      <w:pPr>
-        <w:pStyle w:val="BodyText"/>
-      </w:pPr>
-      <w:r>
-        <w:t xml:space="preserve">For a couple of months it was easy. Two men on the phone, talking about games.</w:t>
+        <w:t xml:space="preserve">Mostly we talked about sports. That was the easy ground between us. He loved baseball, so we would go back and forth about games and players, who was hot and who was washed up. More than baseball, he loved soccer, though. He would get going on it and the stories would come, matches he had seen, players he swore by, games that had meant something to him long before I was born.</w:t>
+      </w:r>
+    </w:p>
+    <w:p>
+      <w:pPr>
+        <w:pStyle w:val="BodyText"/>
+      </w:pPr>
+      <w:r>
+        <w:t xml:space="preserve">For a couple of months, our conversations were easy. We were just two men on the phone, talking about games.</w:t>
       </w:r>
     </w:p>
     <w:p>
@@ -9951,23 +10325,31 @@
         <w:pStyle w:val="BodyText"/>
       </w:pPr>
       <w:r>
-        <w:t xml:space="preserve">I sat with that. In a way, I felt sorry for him. I couldn’t imagine what it must have done to him to lose his children and the woman he loved in the same leaving, and then to just stay there, in that spot, all these years. I had built a whole life since Mexico. He had stayed where we left him.</w:t>
-      </w:r>
-    </w:p>
-    <w:p>
-      <w:pPr>
-        <w:pStyle w:val="BodyText"/>
-      </w:pPr>
-      <w:r>
-        <w:t xml:space="preserve">Then life got busy. That’s the honest, ordinary way it happened, no blowup, no slammed door. I let the calls slip. He kept going out to that VoIP line. I was the one who stopped picking up the other end. He wanted to come to Pensacola, and I felt my boundaries start to bend, and I pulled back. Pensacola was Lou’s. I couldn’t do that to him. I told myself I’d pick it up again when things settled down. I didn’t. We haven’t spoken in years.</w:t>
-      </w:r>
-    </w:p>
-    <w:p>
-      <w:pPr>
-        <w:pStyle w:val="BodyText"/>
-      </w:pPr>
-      <w:r>
-        <w:t xml:space="preserve">He called again in 2019, before my wedding. I didn’t answer. Then he went around me. He found Lou’s family and mine on Facebook, friend requests going out to people in my life he had never met. I understood the loneliness underneath it. It was still a boundary, and he had crossed it.</w:t>
+        <w:t xml:space="preserve">I hadn’t thought of things from his perspective, and I felt sorry for him. I couldn’t imagine what it must have done to him to lose his children and the woman he loved in the same leaving, and then to just stay there, in that spot, all these years. I had built a whole life since Mexico. He had stayed where we left him.</w:t>
+      </w:r>
+    </w:p>
+    <w:p>
+      <w:pPr>
+        <w:pStyle w:val="BodyText"/>
+      </w:pPr>
+      <w:r>
+        <w:t xml:space="preserve">Then life got busy. That’s the honest, ordinary way it happened. We didn’t have a falling out or blowup. I let the calls slip. He kept going out to that VoIP line, but I stopped picking up on the other end. He wanted to come to Pensacola, and I felt my boundaries start to bend, and I pulled back. Pensacola was Lou’s. I couldn’t do that to him. I told myself I’d pick it up again when things settled down.</w:t>
+      </w:r>
+    </w:p>
+    <w:p>
+      <w:pPr>
+        <w:pStyle w:val="BodyText"/>
+      </w:pPr>
+      <w:r>
+        <w:t xml:space="preserve">I didn’t. More years passed.</w:t>
+      </w:r>
+    </w:p>
+    <w:p>
+      <w:pPr>
+        <w:pStyle w:val="BodyText"/>
+      </w:pPr>
+      <w:r>
+        <w:t xml:space="preserve">Horatio called again in 2019, before my wedding. I didn’t answer. Then he went around me. He found Lou’s family and mine on Facebook, friend requests going out to people in my life he had never met. I understood the loneliness underneath it. It was still a boundary, and he had crossed it.</w:t>
       </w:r>
     </w:p>
     <w:p>
@@ -9983,7 +10365,7 @@
         <w:pStyle w:val="BodyText"/>
       </w:pPr>
       <w:r>
-        <w:t xml:space="preserve">And there is an apology I owe him too. For most of my life the distance was something done to me. I see now it ran both ways. My silence on the other end of that line, the calls I let ring out, those hurt him the way his leaving once hurt me. I’m sorry for that. And I’m grateful I got healthy enough to feel it at all instead of only carrying the ache.</w:t>
+        <w:t xml:space="preserve">And there is an apology I owe him too. For most of my life the distance was something done to me. I see now it ran both ways. My silence on the other end of that line and the calls I let ring out hurt him the way his leaving once hurt me. I’m sorry for that. And I’m grateful I got healthy enough to feel it at all instead of only carrying the ache.</w:t>
       </w:r>
     </w:p>
     <w:p>
@@ -10000,6 +10382,14 @@
       </w:pPr>
       <w:r>
         <w:t xml:space="preserve">And every Fourth of July — my birthday — since that first call, the phone has rung with him on the other end. It rang through the using years and the sober years, whether I picked up or not. I was born on the Fourth of July, the immigrant kid with the most American birthday there is, and the one person who never once forgot it was the father I left in Mexico. It took me until this page to notice that. A while ago I changed my number. He doesn’t have the new one. Somewhere in Mexico City this July, a man will dial a number I chose not to give him, because that is what he does with the day his first son was born.</w:t>
+      </w:r>
+    </w:p>
+    <w:p>
+      <w:pPr>
+        <w:pStyle w:val="BodyText"/>
+      </w:pPr>
+      <w:r>
+        <w:t xml:space="preserve">It took me until this page to notice that. A while ago I changed my number. He doesn’t have the new one. Somewhere in Mexico City this July, a man will dial a number I chose not to give him, because that is what he does with the day his first son was born.</w:t>
       </w:r>
     </w:p>
     <w:p>
@@ -10152,23 +10542,23 @@
         <w:pStyle w:val="BodyText"/>
       </w:pPr>
       <w:r>
-        <w:t xml:space="preserve">I saw things in the rooms that never leave you. Young people dying from drugs and alcohol. Not old men at the end of long lives, young people with everything ahead of them. I sponsored people who went back out. Many of them died. Some went to jail. You pour yourself into someone, walk alongside them, answer the phone at midnight, and then one day you get the call that they didn’t make it.</w:t>
-      </w:r>
-    </w:p>
-    <w:p>
-      <w:pPr>
-        <w:pStyle w:val="BodyText"/>
-      </w:pPr>
-      <w:r>
-        <w:t xml:space="preserve">I was that person once. I know what the disease does from the inside. Losing people in those rooms prepared me for something I didn’t know I was being prepared for. Nothing in hospice is harder than a parent losing a child. The only reason I can stay in that room without flinching is that I’ve already sat with losses like that in recovery. Hospice just gave me a new room to bring it to.</w:t>
-      </w:r>
-    </w:p>
-    <w:p>
-      <w:pPr>
-        <w:pStyle w:val="BodyText"/>
-      </w:pPr>
-      <w:r>
-        <w:t xml:space="preserve">The very first time I was in a room with someone dying, I was too small to know that was what it was. My grandfather’s mother was in a nursing home, near the end. I was a little boy, barely talking, and the only language I had yet was Spanish. She lay against the pillows, white-haired and round-faced, and to me she looked like exactly one thing. Santa Claus. So I told her so. Ho, ho, ho. My mother said, Stop. I didn’t understand the hush in the room, or that the woman in the bed was leaving, or that I would spend my life walking into rooms just like it. I only remember her face, and my mother’s hand steering me out.</w:t>
+        <w:t xml:space="preserve">I saw things in the rooms that never leave you. Young people dying from drugs and alcohol. Not old men at the end of long lives, young people with everything ahead of them. I sponsored people who went back out. Many of them died. Some went to jail. I’d pour myself into someone, walk alongside them, answer their midnight calls, and then one day I’d get the call that they didn’t make it.</w:t>
+      </w:r>
+    </w:p>
+    <w:p>
+      <w:pPr>
+        <w:pStyle w:val="BodyText"/>
+      </w:pPr>
+      <w:r>
+        <w:t xml:space="preserve">I was once that person who nearly didn’t make it. I know what the disease does from the inside. Losing people in those rooms prepared me for something I didn’t know I was being prepared for. Nothing in hospice is harder than a parent losing a child. The only reason I can stay in that room without flinching is that I’ve already sat with losses like that in recovery. Hospice just gave me a new room to bring it to.</w:t>
+      </w:r>
+    </w:p>
+    <w:p>
+      <w:pPr>
+        <w:pStyle w:val="BodyText"/>
+      </w:pPr>
+      <w:r>
+        <w:t xml:space="preserve">The very first time I was in a room with someone dying, I was too young to know that was what it was. My grandfather’s mother was in a nursing home, near the end. I was a little boy, barely talking, and the only language I had yet was Spanish. She lay against the pillows, white-haired and round-faced, and to me she looked like exactly one thing. Santa Claus. So I told her so. Ho, ho, ho. My mother said, Stop. I didn’t understand the hush in the room, or that the woman in the bed was leaving, or that I would spend my life walking into rooms just like it. I only remember her face, and my mother’s hand steering me out.</w:t>
       </w:r>
     </w:p>
     <w:p>
@@ -10184,7 +10574,7 @@
         <w:pStyle w:val="BodyText"/>
       </w:pPr>
       <w:r>
-        <w:t xml:space="preserve">I met him at Courage at Noon in my first year sober. About eighty, bald, a scratchy voice, a face that looked permanently annoyed, like the world had let him down personally and he hadn’t decided yet whether to forgive it. He smelled like Old Spice, just enough, never too much. His favorite line, and I heard it a hundred times: I’m not here to help any of you. I’m here to save my own butt. And you’re listening to me? That’s just a fringe benefit. People figured he was cynical. Not Bob. Bob had done the work. He just wasn’t going to perform it for an audience. And he had the one thing I could not stop staring at: decades sober, old, and at peace with all of it. I needed to understand how a person did that.</w:t>
+        <w:t xml:space="preserve">I met him at Courage at Noon during my first year sober. About eighty, bald, a scratchy voice, a face that looked permanently annoyed, like the world had let him down personally and he hadn’t decided yet whether to forgive it. He smelled like Old Spice, just enough, never too much. His favorite line, and I heard it a hundred times: I’m not here to help any of you. I’m here to save my own butt. And you’re listening to me? That’s just a fringe benefit. People figured he was cynical. Not Bob. Bob had done the work. He just wasn’t going to perform it for an audience. And he had the one thing I could not stop staring at: decades sober, old, and at peace with all of it. I needed to understand how a person did that.</w:t>
       </w:r>
     </w:p>
     <w:p>
@@ -10242,7 +10632,7 @@
         <w:pStyle w:val="BodyText"/>
       </w:pPr>
       <w:r>
-        <w:t xml:space="preserve">Around that same stretch, the recognition I’d chased my whole life finally showed up at work, and it barely registered. Someone forwarded an internal article. A colleague congratulated me in passing. I skimmed it once and closed the screen. Lou noticed, the way he noticed everything.</w:t>
+        <w:t xml:space="preserve">Around that same stretch, the recognition I’d chased my whole life finally showed up at work, and it barely registered. Someone forwarded an internal article. A colleague congratulated me in passing. I skimmed it once and closed the screen. Lou noticed the change in me, the way he noticed everything.</w:t>
       </w:r>
       <w:r>
         <w:t xml:space="preserve"> </w:t>

</xml_diff>

<commit_message>
Scott's untracked edits from the 09.12 file adopted (meeting scene held)
Co-Authored-By: Claude Fable 5.1 <noreply@anthropic.com>
Claude-Session: https://claude.ai/code/session_013TTacQAr67Pe2VUwTPop1A
</commit_message>
<xml_diff>
--- a/The_Cardinals_Promise.docx
+++ b/The_Cardinals_Promise.docx
@@ -5817,7 +5817,7 @@
         <w:pStyle w:val="BodyText"/>
       </w:pPr>
       <w:r>
-        <w:t xml:space="preserve">The man who made it possible was sharing a rental in Mahwah, paying back loans for years, never once making the cost feel like something I owed him. I graduated in May 2000, Lou and my mom in the crowd, tracking the sea of identical caps until they found mine. I pointed my car west. California beckoned.</w:t>
+        <w:t xml:space="preserve">The man who made it possible was sharing a rental, paying back loans for years, never once making the cost feel like something I owed him. I graduated in May 2000, Lou and my mom in the crowd, tracking the sea of identical caps until they found mine. I pointed my car west. California beckoned.</w:t>
       </w:r>
     </w:p>
     <w:p>
@@ -5997,7 +5997,7 @@
         <w:pStyle w:val="BodyText"/>
       </w:pPr>
       <w:r>
-        <w:t xml:space="preserve">The hunger stayed. I transferred to the highest-grossing Abercrombie in the country, in Newport Beach. Then came sales. Then medical devices, the job I’d always wanted, pharma or devices, where the top guys made upwards of three hundred thousand. Every move felt like a rung on the ladder. By twenty-four, I was clearing six figures.</w:t>
+        <w:t xml:space="preserve">The hunger stayed. I transferred to the highest-grossing Abercrombie in the country, in Newport Beach. Then came sales. Then medical devices, the job I’d always wanted, pharma or devices, where the top guys made upwards of three hundred thousand a year. Every move felt like a rung on the ladder. By twenty-four, I was clearing six figures.</w:t>
       </w:r>
     </w:p>
     <w:p>
@@ -6013,7 +6013,7 @@
         <w:pStyle w:val="BodyText"/>
       </w:pPr>
       <w:r>
-        <w:t xml:space="preserve">The secret was older than California. It went back to a four-year-old carried out of one country and set down in another — the new name at the top of my homework, the dark skin that didn’t match the other kids, the lisp they sent me to therapy to fix. Somewhere along the way I reached a conclusion I couldn’t yet name: this part of me is not welcome here. Claudio went quiet. I drowned him with liquor and pills.</w:t>
+        <w:t xml:space="preserve">The secret was older than California. It went back to a four-year-old carried out of one country and set down in another — the new name at the top of my homework, the dark skin that didn’t match the other kids, the lisp they sent me to therapy to fix. Somewhere along the way, I reached a conclusion I couldn’t yet name: this part of me is not welcome here. Claudio went quiet. I drowned him with liquor and pills.</w:t>
       </w:r>
     </w:p>
     <w:p>
@@ -6053,23 +6053,23 @@
         <w:t xml:space="preserve"> </w:t>
       </w:r>
       <w:r>
-        <w:t xml:space="preserve">playing any other role. As an actor, I’m sure he could have created other characters. But I couldn’t. I was no longer playing a part. I became the role I projected to others. The only times I wasn’t play-acting were when I was alone with my thoughts. Which wasn’t often.</w:t>
-      </w:r>
-    </w:p>
-    <w:p>
-      <w:pPr>
-        <w:pStyle w:val="BodyText"/>
-      </w:pPr>
-      <w:r>
-        <w:t xml:space="preserve">I took a sales job in 2002. Abercrombie paid me thirty thousand a year. The uniform company offered fifty base, thirty more in commission, and a car package, and it looked like the next step up, into business-to-business sales. For a while it felt like proof California hadn’t broken me. At twenty-three it felt like solid ground for the first time in years.</w:t>
-      </w:r>
-    </w:p>
-    <w:p>
-      <w:pPr>
-        <w:pStyle w:val="BodyText"/>
-      </w:pPr>
-      <w:r>
-        <w:t xml:space="preserve">The job was selling uniform services to businesses: cold calls, presentations, lunches in parking lots while I ran the next hour in my head. The quota was real. Your manager knew your numbers before breakfast. I loved the structure — clear rules, clear targets, a scoreboard that updated every day. Lou had raised me in the language of milestones and metrics, where doing the work would show up in the results.</w:t>
+        <w:t xml:space="preserve">playing any other role. As an actor, I’m sure he could have created other characters. But I couldn’t. I was no longer playing a part. I became the role I projected to others. The only times I wasn’t acting were when I was alone with my thoughts. Which wasn’t often.</w:t>
+      </w:r>
+    </w:p>
+    <w:p>
+      <w:pPr>
+        <w:pStyle w:val="BodyText"/>
+      </w:pPr>
+      <w:r>
+        <w:t xml:space="preserve">I took a sales job in 2002. Abercrombie paid me thirty thousand a year. The uniform company offered a fifty-thousand-dollar base salary, thirty more in commission, and a car package, and it looked like the next step up, into business-to-business sales. For a while, it felt like proof California hadn’t broken me. At twenty-three it felt like solid ground for the first time in years.</w:t>
+      </w:r>
+    </w:p>
+    <w:p>
+      <w:pPr>
+        <w:pStyle w:val="BodyText"/>
+      </w:pPr>
+      <w:r>
+        <w:t xml:space="preserve">The job was selling uniform services to businesses: cold calls, presentations, lunches in parking lots while I ran the next hour in my head. The quota was real. Your manager knew your numbers before breakfast. I loved the structure — clear rules, obvious targets, a scoreboard that updated each day. Lou had raised me in the language of milestones and metrics, where doing the work would show up in the results.</w:t>
       </w:r>
     </w:p>
     <w:p>
@@ -7875,15 +7875,15 @@
         <w:pStyle w:val="BodyText"/>
       </w:pPr>
       <w:r>
-        <w:t xml:space="preserve">The next morning we drove to a farmhouse in the Panhandle. Chumuckla. The name sounded made up. The place didn’t look anything like Laguna Beach — no ocean, no manicured grounds, no soap-opera actor in the next room. Just a farmhouse down a dirt road, fields around it, run by a man named Ron. Lou walked me in, signed the paperwork, hugged me, and left.</w:t>
-      </w:r>
-    </w:p>
-    <w:p>
-      <w:pPr>
-        <w:pStyle w:val="BodyText"/>
-      </w:pPr>
-      <w:r>
-        <w:t xml:space="preserve">Ron saw through me quickly. I walked in leading with my career, talking business to men who were there to stay alive. By the first day they had named me Corporate Rob. Slacks, polo, haircut — the costume I had assembled to convince the world I was fine. Ron wasn’t impressed. I needed that.</w:t>
+        <w:t xml:space="preserve">The next morning, we drove to a farmhouse in the Panhandle. Chumuckla. The name sounded made up. The place didn’t look anything like Laguna Beach — no ocean, no manicured grounds, no soap-opera actor in the next room. Just a farmhouse down a dirt road, fields around it, run by a man named Ron. Lou walked me in, signed the paperwork, hugged me, and left.</w:t>
+      </w:r>
+    </w:p>
+    <w:p>
+      <w:pPr>
+        <w:pStyle w:val="BodyText"/>
+      </w:pPr>
+      <w:r>
+        <w:t xml:space="preserve">Ron saw through me quickly. I’d walked in leading with my career, talking business to men who were there to stay alive. By the first day they had named me Corporate Rob. Slacks, polo, haircut — the costume I had assembled to convince the world I was fine. Ron wasn’t impressed. I needed that.</w:t>
       </w:r>
     </w:p>
     <w:p>
@@ -8125,15 +8125,23 @@
         <w:pStyle w:val="BodyText"/>
       </w:pPr>
       <w:r>
-        <w:t xml:space="preserve">After the second rehab there was no turnaround, no doors swinging open. Just time, without applause, without shortcuts. I stayed in Pensacola, close to Lou and Donna, in the same routines long enough that they stopped feeling temporary.</w:t>
-      </w:r>
-    </w:p>
-    <w:p>
-      <w:pPr>
-        <w:pStyle w:val="BodyText"/>
-      </w:pPr>
-      <w:r>
-        <w:t xml:space="preserve">I walked into my first meeting and sat down among the people I had spent years judging. That was the part nobody warned me about. I’d had a whole theory about rooms like that, back when I was still drinking: they were for the weak, for people who lacked willpower, for people with a character problem I didn’t have. Then the door closed behind me and I was one of them. Every idea I had ever used to hold myself above people like that, I now had to eat, one meeting at a time.</w:t>
+        <w:t xml:space="preserve">As a wrestler, I wouldn’t have continued to spit in a cup or restrict my food if it didn’t help me make weight. My coaches told me what to do, I listened, and I got the results. In recovery, I attended the meetings, met with my sponsor, and did everything they told me to do. But nothing changed except I wasn’t blowing money on booze and drugs. I still felt insecure, out of sorts, in pain, and generally miserable.</w:t>
+      </w:r>
+    </w:p>
+    <w:p>
+      <w:pPr>
+        <w:pStyle w:val="BodyText"/>
+      </w:pPr>
+      <w:r>
+        <w:t xml:space="preserve">My second stint at rehab created no turnaround. No doors swinging open. Just time, without applause, without shortcuts. I stayed in Pensacola, close to Lou and Donna, in the same routines long enough that they stopped feeling temporary.</w:t>
+      </w:r>
+    </w:p>
+    <w:p>
+      <w:pPr>
+        <w:pStyle w:val="BodyText"/>
+      </w:pPr>
+      <w:r>
+        <w:t xml:space="preserve">I walked into my first meeting and sat down among the people I had spent years judging. That was the part nobody warned me about. I’d had a whole theory about rooms like that, back when I was still drinking: they were for the weak, for people who lacked willpower, for people with a character problem I didn’t have. Then the door closed behind me, and I was one of them. Every idea I had ever used to hold myself above people like that, I now had to eat, one meeting at a time.</w:t>
       </w:r>
     </w:p>
     <w:p>
@@ -8149,7 +8157,7 @@
         <w:pStyle w:val="BodyText"/>
       </w:pPr>
       <w:r>
-        <w:t xml:space="preserve">The steps stripped me before they rebuilt me. The program is like the military that way; it breaks the ego down so it can build something that holds. What I hadn’t expected was how much of what I’d been calling my personality turned out to be defense. The character defects I was supposed to surrender were the exact things I had been hiding behind for twenty years, and handing them over didn’t feel like growth at first. It felt like standing in a room with nothing on.</w:t>
+        <w:t xml:space="preserve">The steps stripped me before they rebuilt me. The program is like the military that way; it breaks the ego down so it can build something that holds. What I hadn’t expected was how much of what I’d been calling my personality turned out to be defense. The character defects I was supposed to surrender were the exact things I had been hiding behind for twenty years. Handing them over didn’t feel like growth at first. It felt like standing in a room with nothing on.</w:t>
       </w:r>
     </w:p>
     <w:p>
@@ -8165,7 +8173,7 @@
         <w:pStyle w:val="BodyText"/>
       </w:pPr>
       <w:r>
-        <w:t xml:space="preserve">That year I understood why people go back out. It isn’t weakness. It isn’t wanting it any less. The first year asked the most of me when I had the least. They say it takes about a year for the brain to learn to make its own reward again, and I believe it, because mine wasn’t making any. Nothing felt good on its own yet. And that is precisely when the program hands you a pen and asks you to take an honest inventory of the wreckage, the people you owe, the trust you burned, the years you can’t give back, and start walking toward all of it. You’re asked to clean up after the flood while the water is still going down. Some mornings the meeting, the phone call, the amends I wasn’t ready to make felt like climbing a hill with nothing in the tank. I watched good people go back out that year, and I never once called it weakness. I knew exactly how far over their heads the water was.</w:t>
+        <w:t xml:space="preserve">That year I understood why people go back out. It isn’t weakness. It isn’t wanting it any less. The first year asked the most of me when I had the least. They say it takes about a year for the brain to learn to produce its own rewards again, and I believe it, because mine wasn’t making any. Nothing felt good on its own yet. And that is precisely when the program hands you a pen and asks you to take an honest inventory of the wreckage, the people you owe, the trust you burned, the years you can’t give back, and start walking toward all of it. You’re asked to clean up after the flood while the water is still going down. Some mornings the meeting, the phone call, the amends I wasn’t ready to make felt like climbing a hill with nothing in the tank. I watched good people go back out that year, and I never once called it weakness. I knew exactly how far over their heads the water was.</w:t>
       </w:r>
     </w:p>
     <w:p>
@@ -8181,7 +8189,7 @@
         <w:pStyle w:val="BodyText"/>
       </w:pPr>
       <w:r>
-        <w:t xml:space="preserve">Who you stand next to decides more than people admit. The rooms have their own pecking order, old-timers, big personalities, sponsors who collect sponsees like merit badges, and if you attach yourself to the wrong people, the rooms themselves can walk you back out the door. I got lucky, or I got guided. The handful I stood next to wanted me sober more than they wanted an audience.</w:t>
+        <w:t xml:space="preserve">I’ve heard that we become the five people we spend the most time with. I don’t know if that’s a scientifically researched truth, or just a proverb someone’s grandmother came up with, but I found it to be true. Who you stand next to decides more than people admit. The rooms have their own pecking order, old-timers, big personalities, sponsors who collect sponsees like merit badges, and if you attach yourself to the wrong people, the rooms themselves can walk you back out the door. I got lucky, or I got guided. The handful I stood next to wanted me sober more than they wanted an audience.</w:t>
       </w:r>
     </w:p>
     <w:p>
@@ -8205,15 +8213,51 @@
         <w:pStyle w:val="BodyText"/>
       </w:pPr>
       <w:r>
-        <w:t xml:space="preserve">The confidence came back too, the real kind this time, not the chemical kind. Years before I met Hope, I went to an Auburn game with a friend and said out loud, that’s the best-looking girl in the stadium. An hour later I had her number and an invitation to come visit. Not long before, I’d been brushing my teeth staring at the faucet. Now I could walk across a room again.</w:t>
-      </w:r>
-    </w:p>
-    <w:p>
-      <w:pPr>
-        <w:pStyle w:val="BodyText"/>
-      </w:pPr>
-      <w:r>
-        <w:t xml:space="preserve">Cliff’s three things came with me out of Chumuckla, and I did all three. I went to Courage at Noon every single day for the first year, a room on church property, the same handful of people learning to live again on their lunch break. I didn’t always feel courageous walking in. I went anyway. I volunteered at that same church twice a week for a year. And the 5K turned into a marathon, which I ran the way I did most things that year, on nerve and repetition. The longest I had ever run in my life was nine miles. At signup, the full marathon cost ten dollars more than the half, so I took the full. That was the reasoning, start to finish. I walked parts of it. I finished all of it. Lou was waiting at the finish line with Subway, because of course he was. Hundreds of meetings became thousands. Tuesday nights it was the round table in a Methodist church basement, a table with no head and no foot, the newcomer sitting level with the thirty-year man. Same folding chairs, same bad coffee, same stories told by different people at different stages of ruin and repair. I listened more than I talked, and when I talked I didn’t tie it up neatly. I told the truth. Nobody writes a book about the four hundredth meeting. But the four hundredth meeting is the one that keeps you sober, because you walked in the same as the first.</w:t>
+        <w:t xml:space="preserve">The confidence came back too, the real kind this time, not the chemical kind. Years before I met Hope, I went to an Auburn game with a friend and said out loud,</w:t>
+      </w:r>
+      <w:r>
+        <w:t xml:space="preserve"> </w:t>
+      </w:r>
+      <w:r>
+        <w:t xml:space="preserve">“</w:t>
+      </w:r>
+      <w:r>
+        <w:t xml:space="preserve">That’s the best-looking girl in the stadium!</w:t>
+      </w:r>
+      <w:r>
+        <w:t xml:space="preserve">”</w:t>
+      </w:r>
+    </w:p>
+    <w:p>
+      <w:pPr>
+        <w:pStyle w:val="BodyText"/>
+      </w:pPr>
+      <w:r>
+        <w:t xml:space="preserve">An hour later I had her number and an invitation to come visit. Not long before, I’d been brushing my teeth staring at the faucet. Now I could walk across a room again.</w:t>
+      </w:r>
+    </w:p>
+    <w:p>
+      <w:pPr>
+        <w:pStyle w:val="BodyText"/>
+      </w:pPr>
+      <w:r>
+        <w:t xml:space="preserve">Cliff’s three things came with me out of Chumuckla, and I did all three. I went to Courage at Noon every single day for the first year, a room on church property, the same handful of people learning to live again on their lunch break. I didn’t always feel courageous walking in. I went anyway. I volunteered at that same church twice a week for a year.</w:t>
+      </w:r>
+    </w:p>
+    <w:p>
+      <w:pPr>
+        <w:pStyle w:val="BodyText"/>
+      </w:pPr>
+      <w:r>
+        <w:t xml:space="preserve">And the 5K turned into a marathon, which I ran the way I did most things that year, on nerve and repetition. The longest I had ever run in my life was nine miles. At signup, the full marathon cost ten dollars more than the half, so I took the full. That was the reasoning, start to finish. I walked parts of it. I finished all of it. Lou was waiting at the finish line with Subway, because of course he was.</w:t>
+      </w:r>
+    </w:p>
+    <w:p>
+      <w:pPr>
+        <w:pStyle w:val="BodyText"/>
+      </w:pPr>
+      <w:r>
+        <w:t xml:space="preserve">Hundreds of meetings became thousands. Tuesday nights it was the round table in a Methodist church basement, a table with no head and no foot, the newcomer sitting level with the thirty-year man. Same folding chairs, same bad coffee, same stories told by different people at different stages of ruin and repair. I listened more than I talked, and when I talked I didn’t tie it up neatly. I told the truth. Nobody writes a book about the four hundredth meeting. But the four hundredth meeting is the one that keeps you sober, because you walked in the same as the first.</w:t>
       </w:r>
     </w:p>
     <w:p>
@@ -8471,7 +8515,7 @@
         <w:pStyle w:val="BodyText"/>
       </w:pPr>
       <w:r>
-        <w:t xml:space="preserve">The best one didn’t come from a meeting at all. You’ll meet her soon.</w:t>
+        <w:t xml:space="preserve">The best one didn’t come from a meeting at all. You’ll meet her.</w:t>
       </w:r>
     </w:p>
     <w:p>
@@ -10225,7 +10269,7 @@
         <w:pStyle w:val="BodyText"/>
       </w:pPr>
       <w:r>
-        <w:t xml:space="preserve">The first time I heard from him after Mexico, I was fifteen. The phone rang at the house and it was him, the first contact since I was barely school age. Just his voice undid me, tears before I could get a word out. He was gentle about it.</w:t>
+        <w:t xml:space="preserve">The first time I heard from him after Mexico, I was fifteen. Just his voice undid me, tears before I could get a word out. He was gentle about it.</w:t>
       </w:r>
       <w:r>
         <w:t xml:space="preserve"> </w:t>

</xml_diff>

<commit_message>
Ch16/19: mom was in Pennsylvania, they met in New Orleans; Lou wasn't in the room when Quint said his name
Co-Authored-By: Claude Fable 5.1 <noreply@anthropic.com>
Claude-Session: https://claude.ai/code/session_013TTacQAr67Pe2VUwTPop1A
</commit_message>
<xml_diff>
--- a/The_Cardinals_Promise.docx
+++ b/The_Cardinals_Promise.docx
@@ -7425,7 +7425,7 @@
         <w:pStyle w:val="BodyText"/>
       </w:pPr>
       <w:r>
-        <w:t xml:space="preserve">The rescue had bought me time, and I used it to get worse. Christmas 2008, I went to New Orleans to spend the holiday with my mother.</w:t>
+        <w:t xml:space="preserve">The rescue had bought me time, and I used it to get worse. Christmas 2008, my mother was living in Pennsylvania, and the two of us met in New Orleans for the holiday.</w:t>
       </w:r>
     </w:p>
     <w:p>
@@ -8481,7 +8481,43 @@
         <w:pStyle w:val="BodyText"/>
       </w:pPr>
       <w:r>
-        <w:t xml:space="preserve">Years into the friendship, at the business conference he built for the city, he was speaking, and he paused and looked out into the crowd. Lou Brizzi, great guy. Chris and Rob, you know them? Hearing my father’s name in a room like that stopped me. My dad worked at Baptist Hospital for years, showed up, did the job well, treated people right, stayed until he was eighty-two. Quint saying his name in a room full of leaders honored the life my father believed in.</w:t>
+        <w:t xml:space="preserve">Years into the friendship, at the business conference he built for the city, Quint was speaking, and he paused, looked out into the crowd, and found Chris and me.</w:t>
+      </w:r>
+      <w:r>
+        <w:t xml:space="preserve"> </w:t>
+      </w:r>
+      <w:r>
+        <w:t xml:space="preserve">“</w:t>
+      </w:r>
+      <w:r>
+        <w:t xml:space="preserve">Lou Brizzi, great guy,</w:t>
+      </w:r>
+      <w:r>
+        <w:t xml:space="preserve">”</w:t>
+      </w:r>
+      <w:r>
+        <w:t xml:space="preserve"> </w:t>
+      </w:r>
+      <w:r>
+        <w:t xml:space="preserve">he said to the room.</w:t>
+      </w:r>
+      <w:r>
+        <w:t xml:space="preserve"> </w:t>
+      </w:r>
+      <w:r>
+        <w:t xml:space="preserve">“</w:t>
+      </w:r>
+      <w:r>
+        <w:t xml:space="preserve">Chris and Rob, you know them?</w:t>
+      </w:r>
+      <w:r>
+        <w:t xml:space="preserve">”</w:t>
+      </w:r>
+      <w:r>
+        <w:t xml:space="preserve"> </w:t>
+      </w:r>
+      <w:r>
+        <w:t xml:space="preserve">My father wasn’t there. Hearing his name in a room like that stopped me anyway. My dad worked at Baptist Hospital for years, showed up, did the job well, treated people right, stayed until he was eighty-two. Quint saying his name in a room full of leaders honored the life my father believed in.</w:t>
       </w:r>
     </w:p>
     <w:p>

</xml_diff>

<commit_message>
Horacio: name the closed door; pity instead of something quieter
Co-Authored-By: Claude Fable 5.1 <noreply@anthropic.com>
Claude-Session: https://claude.ai/code/session_013TTacQAr67Pe2VUwTPop1A
</commit_message>
<xml_diff>
--- a/The_Cardinals_Promise.docx
+++ b/The_Cardinals_Promise.docx
@@ -10349,7 +10349,7 @@
         <w:pStyle w:val="BodyText"/>
       </w:pPr>
       <w:r>
-        <w:t xml:space="preserve">The next time I saw him in person was in Ensenada, in 2006, right after the first rehab. I was in active addiction myself by then, though I wouldn’t have said those words. I went back to the man who had been at the center of my first life, and I wasn’t a boy looking up at him anymore. I could see him as he was, his circumstance, the things that had made him the father who locked the door. Maybe I saw it so clearly because I was closer to it than I wanted to know. Up close, the anger I had carried for so long began to turn into something quieter.</w:t>
+        <w:t xml:space="preserve">The next time I saw him in person was in Ensenada, in 2006, right after the first rehab. I was in active addiction myself by then, though I wouldn’t have said those words. I went back to the man who had been at the center of my first life, and I wasn’t a boy looking up at him anymore. I could see him as he was, his circumstance, the things that had made him the father who locked the door. Maybe I saw it so clearly because I was closer to it than I wanted to know. Up close, the anger I had carried for so long started to turn into pity, and pity is harder to hold onto.</w:t>
       </w:r>
     </w:p>
     <w:p>
@@ -10358,6 +10358,14 @@
       </w:pPr>
       <w:r>
         <w:t xml:space="preserve">What I couldn’t do was become the son he wanted. He was looking for a relationship I didn’t have in me to give. What took me longest was seeing those as two separate things — that you can forgive a man completely and still not be able to hand him your life.</w:t>
+      </w:r>
+    </w:p>
+    <w:p>
+      <w:pPr>
+        <w:pStyle w:val="BodyText"/>
+      </w:pPr>
+      <w:r>
+        <w:t xml:space="preserve">There are reasons I keep him at a distance that I’m not going to put on a page. I’ve written down almost everything else in this book. Not this. I sit with families who keep one door shut, and I’ve learned to let them. I’m asking you for the same.</w:t>
       </w:r>
     </w:p>
     <w:p>

</xml_diff>

<commit_message>
Copy fixes flagged by reader panel: duplicate paragraphs in New Orleans and Horacio, Horacio spelling, three typos, two missing quote marks
Co-Authored-By: Claude Fable 5.1 <noreply@anthropic.com>
Claude-Session: https://claude.ai/code/session_013TTacQAr67Pe2VUwTPop1A
</commit_message>
<xml_diff>
--- a/The_Cardinals_Promise.docx
+++ b/The_Cardinals_Promise.docx
@@ -7692,26 +7692,6 @@
         <w:t xml:space="preserve">I never saw those pills again. I never asked what he did with them.</w:t>
       </w:r>
     </w:p>
-    <w:p>
-      <w:pPr>
-        <w:pStyle w:val="BodyText"/>
-      </w:pPr>
-      <w:r>
-        <w:t xml:space="preserve">My surrender wasn’t clean. Before I walked in to give up, I filled one last Adderall prescription. Then I handed the bottle to Lou and said the words:</w:t>
-      </w:r>
-      <w:r>
-        <w:t xml:space="preserve"> </w:t>
-      </w:r>
-      <w:r>
-        <w:t xml:space="preserve">“</w:t>
-      </w:r>
-      <w:r>
-        <w:t xml:space="preserve">I surrender. I’m gonna go.</w:t>
-      </w:r>
-      <w:r>
-        <w:t xml:space="preserve">”</w:t>
-      </w:r>
-    </w:p>
     <w:bookmarkEnd w:id="38"/>
     <w:bookmarkEnd w:id="39"/>
     <w:bookmarkStart w:id="40" w:name="the-drives-i"/>
@@ -9691,7 +9671,7 @@
         <w:pStyle w:val="BodyText"/>
       </w:pPr>
       <w:r>
-        <w:t xml:space="preserve">$113,000. That was the number when I finally added it up in ink, every credit card and collection account and legal fee, no rounding. I’d spent years not looking at it. Steady work meant I could finally face the wreckage I’d been outrunning, and my sponsor, Mager, was the one who walked me into it. He was patient, but he wasn’t buying the version of my recovery story where I’d made it. When I told it, I held back some details and shared al tightly managed version of events. Mager didn’t interrupt. He listened in a way that made clear he was hearing more than I was saying, and eventually, with nowhere for the story to land, it fell apart on its own.</w:t>
+        <w:t xml:space="preserve">$113,000. That was the number when I finally added it up in ink, every credit card and collection account and legal fee, no rounding. I’d spent years not looking at it. Steady work meant I could finally face the wreckage I’d been outrunning, and my sponsor, Mager, was the one who walked me into it. He was patient, but he wasn’t buying the version of my recovery story where I’d made it. When I told it, I held back some details and shared a tightly managed version of events. Mager didn’t interrupt. He listened in a way that made clear he was hearing more than I was saying, and eventually, with nowhere for the story to land, it fell apart on its own.</w:t>
       </w:r>
     </w:p>
     <w:p>
@@ -10005,7 +9985,7 @@
         <w:t xml:space="preserve"> </w:t>
       </w:r>
       <w:r>
-        <w:t xml:space="preserve">I’d never lived in a place my friends deemed cool enough to give it its own name. It made me proud. gave</w:t>
+        <w:t xml:space="preserve">I’d never lived in a place my friends deemed cool enough to give it its own name. It made me proud.</w:t>
       </w:r>
     </w:p>
     <w:p>
@@ -10181,7 +10161,7 @@
         <w:pStyle w:val="BodyText"/>
       </w:pPr>
       <w:r>
-        <w:t xml:space="preserve">I set up an automatic payment to pay him back two hundred a month and paid extra when I could. It took me four years. I never missed a payment. I woulnd’t have dreamed of missing a payment. His trust was gold to me, and I would have rather died than to lose it again.</w:t>
+        <w:t xml:space="preserve">I set up an automatic payment to pay him back two hundred a month and paid extra when I could. It took me four years. I never missed a payment. I wouldn’t have dreamed of missing a payment. His trust was gold to me, and I would have rather died than to lose it again.</w:t>
       </w:r>
     </w:p>
     <w:p>
@@ -10437,7 +10417,7 @@
         <w:pStyle w:val="BodyText"/>
       </w:pPr>
       <w:r>
-        <w:t xml:space="preserve">Horatio called again in 2019, before my wedding. I didn’t answer. Then he went around me. He found Lou’s family and mine on Facebook, friend requests going out to people in my life he had never met. I understood the loneliness underneath it. It was still a boundary, and he had crossed it.</w:t>
+        <w:t xml:space="preserve">Horacio called again in 2019, before my wedding. I didn’t answer. Then he went around me. He found Lou’s family and mine on Facebook, friend requests going out to people in my life he had never met. I understood the loneliness underneath it. It was still a boundary, and he had crossed it.</w:t>
       </w:r>
     </w:p>
     <w:p>
@@ -10470,14 +10450,6 @@
       </w:pPr>
       <w:r>
         <w:t xml:space="preserve">And every Fourth of July — my birthday — since that first call, the phone has rung with him on the other end. It rang through the using years and the sober years, whether I picked up or not. I was born on the Fourth of July, the immigrant kid with the most American birthday there is, and the one person who never once forgot it was the father I left in Mexico. It took me until this page to notice that. A while ago I changed my number. He doesn’t have the new one. Somewhere in Mexico City this July, a man will dial a number I chose not to give him, because that is what he does with the day his first son was born.</w:t>
-      </w:r>
-    </w:p>
-    <w:p>
-      <w:pPr>
-        <w:pStyle w:val="BodyText"/>
-      </w:pPr>
-      <w:r>
-        <w:t xml:space="preserve">It took me until this page to notice that. A while ago I changed my number. He doesn’t have the new one. Somewhere in Mexico City this July, a man will dial a number I chose not to give him, because that is what he does with the day his first son was born.</w:t>
       </w:r>
     </w:p>
     <w:p>
@@ -13125,7 +13097,43 @@
         <w:pStyle w:val="BodyText"/>
       </w:pPr>
       <w:r>
-        <w:t xml:space="preserve">In one room I was talking with the patient, an easy back-and-forth, and somewhere in it I told him a little of my own story, the addiction, the years I lost, the long road back. I’ve learned that when I open that door even a crack, people walk through it. His wife had come in partway through, and when I finished she went quiet, then asked me something that had nothing to do with her husband and everything to do with what she was actually carrying. Her son was thirty-eight, living at home, drinking himself under. He had a little girl of his own, and his mother lay awake wondering whether he could take care of her. Did rehab work, she wanted to know. What could she do. Was there anything she could do. I gave her what I had, the truth as I’d lived it, no dressing it up. You didn’t cause it,” I told her. “You can’t control it. You can’t cure it. What you can do is stay, and help him live long enough to get there. But mostly I understood that I’d walked into that room to sit with a dying man and ended up holding his wife’s other grief, the living one. Addiction doesn’t wait outside the hospice door. It’s already in half the rooms, and because I came back from it, families hand me that fear too. I take it.</w:t>
+        <w:t xml:space="preserve">In one room I was talking with the patient, an easy back-and-forth, and somewhere in it I told him a little of my own story, the addiction, the years I lost, the long road back. I’ve learned that when I open that door even a crack, people walk through it. His wife had come in partway through, and when I finished she went quiet, then asked me something that had nothing to do with her husband and everything to do with what she was actually carrying. Her son was thirty-eight, living at home, drinking himself under. He had a little girl of his own, and his mother lay awake wondering whether he could take care of her. Did rehab work, she wanted to know. What could she do. Was there anything she could do. I gave her what I had, the truth as I’d lived it, no dressing it up.</w:t>
+      </w:r>
+      <w:r>
+        <w:t xml:space="preserve"> </w:t>
+      </w:r>
+      <w:r>
+        <w:t xml:space="preserve">“</w:t>
+      </w:r>
+      <w:r>
+        <w:t xml:space="preserve">You didn’t cause it,</w:t>
+      </w:r>
+      <w:r>
+        <w:t xml:space="preserve">”</w:t>
+      </w:r>
+      <w:r>
+        <w:t xml:space="preserve"> </w:t>
+      </w:r>
+      <w:r>
+        <w:t xml:space="preserve">I told her.</w:t>
+      </w:r>
+      <w:r>
+        <w:t xml:space="preserve"> </w:t>
+      </w:r>
+      <w:r>
+        <w:t xml:space="preserve">“</w:t>
+      </w:r>
+      <w:r>
+        <w:t xml:space="preserve">You can’t control it. You can’t cure it. What you can do is stay, and help him live long enough to get there.</w:t>
+      </w:r>
+      <w:r>
+        <w:t xml:space="preserve">”</w:t>
+      </w:r>
+      <w:r>
+        <w:t xml:space="preserve"> </w:t>
+      </w:r>
+      <w:r>
+        <w:t xml:space="preserve">But mostly I understood that I’d walked into that room to sit with a dying man and ended up holding his wife’s other grief, the living one. Addiction doesn’t wait outside the hospice door. It’s already in half the rooms, and because I came back from it, families hand me that fear too. I take it.</w:t>
       </w:r>
     </w:p>
     <w:p>
@@ -13395,7 +13403,43 @@
         <w:t xml:space="preserve"> </w:t>
       </w:r>
       <w:r>
-        <w:t xml:space="preserve">She didn’t know what he was carrying. He did. He kept the secret until March or April. The cancer’s back,” he said. “January. I didn’t want to say anything because of Chris’s wedding. And in July 2025, a year and a half into the fight, he was there when Chris and Nisha’s daughter, Priya, was born. He held her.</w:t>
+        <w:t xml:space="preserve">She didn’t know what he was carrying. He did. He kept the secret until March or April.</w:t>
+      </w:r>
+      <w:r>
+        <w:t xml:space="preserve"> </w:t>
+      </w:r>
+      <w:r>
+        <w:t xml:space="preserve">“</w:t>
+      </w:r>
+      <w:r>
+        <w:t xml:space="preserve">The cancer’s back,</w:t>
+      </w:r>
+      <w:r>
+        <w:t xml:space="preserve">”</w:t>
+      </w:r>
+      <w:r>
+        <w:t xml:space="preserve"> </w:t>
+      </w:r>
+      <w:r>
+        <w:t xml:space="preserve">he said.</w:t>
+      </w:r>
+      <w:r>
+        <w:t xml:space="preserve"> </w:t>
+      </w:r>
+      <w:r>
+        <w:t xml:space="preserve">“</w:t>
+      </w:r>
+      <w:r>
+        <w:t xml:space="preserve">January. I didn’t want to say anything because of Chris’s wedding.</w:t>
+      </w:r>
+      <w:r>
+        <w:t xml:space="preserve">”</w:t>
+      </w:r>
+      <w:r>
+        <w:t xml:space="preserve"> </w:t>
+      </w:r>
+      <w:r>
+        <w:t xml:space="preserve">And in July 2025, a year and a half into the fight, he was there when Chris and Nisha’s daughter, Priya, was born. He held her.</w:t>
       </w:r>
     </w:p>
     <w:p>

</xml_diff>

<commit_message>
Panel-five moves: Part Six in chronological order, Foreword up front, back matter ends on Lou's Way, no-speech and truth-oath pass, the promise named in the Epilogue; lock 10 at 206 pages
Co-Authored-By: Claude Fable 5.1 <noreply@anthropic.com>
Claude-Session: https://claude.ai/code/session_013TTacQAr67Pe2VUwTPop1A
</commit_message>
<xml_diff>
--- a/The_Cardinals_Promise.docx
+++ b/The_Cardinals_Promise.docx
@@ -122,195 +122,153 @@
         <w:pStyle w:val="BodyText"/>
       </w:pPr>
       <w:r>
+        <w:t xml:space="preserve">Copyright © 2026 by Rob Brizzi. All rights reserved. No part of this book may be reproduced in any form without written permission from the publisher, except for brief quotations in reviews.</w:t>
+      </w:r>
+    </w:p>
+    <w:p>
+      <w:pPr>
+        <w:pStyle w:val="BodyText"/>
+      </w:pPr>
+      <w:r>
+        <w:t xml:space="preserve">Published by Cardinal Promise Press, Raleigh, North Carolina.</w:t>
+      </w:r>
+    </w:p>
+    <w:p>
+      <w:pPr>
+        <w:pStyle w:val="BodyText"/>
+      </w:pPr>
+      <w:r>
+        <w:t xml:space="preserve">First edition, 2026. Printed in the United States of America.</w:t>
+      </w:r>
+    </w:p>
+    <w:p>
+      <w:pPr>
+        <w:pStyle w:val="BodyText"/>
+      </w:pPr>
+      <w:r>
+        <w:t xml:space="preserve">Paperback ISBN: 979-8-9966446-0-5</w:t>
+      </w:r>
+    </w:p>
+    <w:p>
+      <w:pPr>
+        <w:pStyle w:val="BodyText"/>
+      </w:pPr>
+      <w:r>
+        <w:t xml:space="preserve">Ebook ISBN: 979-8-9966446-1-2</w:t>
+      </w:r>
+    </w:p>
+    <w:p>
+      <w:pPr>
+        <w:pStyle w:val="BodyText"/>
+      </w:pPr>
+      <w:r>
+        <w:t xml:space="preserve">This is a work of memoir. It reflects the author’s present recollections of experiences over time. Some names and identifying details have been changed, some dialogue has been reconstructed, and some events are rendered as composites, as described in the Author’s Note.</w:t>
+      </w:r>
+    </w:p>
+    <w:p>
+      <w:pPr>
+        <w:pStyle w:val="BodyText"/>
+      </w:pPr>
+      <w:r>
+        <w:rPr>
+          <w:iCs/>
+          <w:i/>
+        </w:rPr>
+        <w:t xml:space="preserve">For anyone who has struggled with addiction or loved someone who has</w:t>
+      </w:r>
+    </w:p>
+    <w:p>
+      <w:pPr>
+        <w:pStyle w:val="BodyText"/>
+      </w:pPr>
+      <w:r>
+        <w:rPr>
+          <w:iCs/>
+          <w:i/>
+        </w:rPr>
+        <w:t xml:space="preserve">In honor of Lou Brizzi —</w:t>
+      </w:r>
+      <w:r>
+        <w:br/>
+      </w:r>
+      <w:r>
+        <w:rPr>
+          <w:iCs/>
+          <w:i/>
+        </w:rPr>
+        <w:t xml:space="preserve">the man who kept showing up.</w:t>
+      </w:r>
+    </w:p>
+    <w:p>
+      <w:pPr>
+        <w:pStyle w:val="BodyText"/>
+      </w:pPr>
+      <w:r>
+        <w:rPr>
+          <w:iCs/>
+          <w:i/>
+        </w:rPr>
+        <w:t xml:space="preserve">1941–2025</w:t>
+      </w:r>
+    </w:p>
+    <w:p>
+      <w:pPr>
+        <w:pStyle w:val="BodyText"/>
+      </w:pPr>
+      <w:r>
+        <w:rPr>
+          <w:iCs/>
+          <w:i/>
+        </w:rPr>
+        <w:t xml:space="preserve">For Hope, who tilted her head and said</w:t>
+      </w:r>
+      <w:r>
+        <w:rPr>
+          <w:iCs/>
+          <w:i/>
+        </w:rPr>
+        <w:t xml:space="preserve"> </w:t>
+      </w:r>
+      <w:r>
+        <w:rPr>
+          <w:iCs/>
+          <w:i/>
+        </w:rPr>
+        <w:t xml:space="preserve">“</w:t>
+      </w:r>
+      <w:r>
+        <w:rPr>
+          <w:iCs/>
+          <w:i/>
+        </w:rPr>
+        <w:t xml:space="preserve">We?</w:t>
+      </w:r>
+      <w:r>
+        <w:rPr>
+          <w:iCs/>
+          <w:i/>
+        </w:rPr>
+        <w:t xml:space="preserve">”</w:t>
+      </w:r>
+    </w:p>
+    <w:p>
+      <w:pPr>
+        <w:pStyle w:val="BodyText"/>
+      </w:pPr>
+      <w:r>
         <w:rPr>
           <w:bCs/>
           <w:b/>
         </w:rPr>
-        <w:t xml:space="preserve">PRAISE FOR THE CARDINAL’S PROMISE</w:t>
-      </w:r>
-    </w:p>
-    <w:p>
-      <w:pPr>
-        <w:pStyle w:val="BodyText"/>
-      </w:pPr>
-      <w:r>
-        <w:rPr>
-          <w:iCs/>
-          <w:i/>
-        </w:rPr>
-        <w:t xml:space="preserve">“</w:t>
-      </w:r>
-      <w:r>
-        <w:rPr>
-          <w:iCs/>
-          <w:i/>
-        </w:rPr>
-        <w:t xml:space="preserve">Thirty-five years of friendship, and I can tell you: you can trust what you’re about to read.</w:t>
-      </w:r>
-      <w:r>
-        <w:rPr>
-          <w:iCs/>
-          <w:i/>
-        </w:rPr>
-        <w:t xml:space="preserve">”</w:t>
-      </w:r>
-    </w:p>
-    <w:p>
-      <w:pPr>
-        <w:pStyle w:val="BodyText"/>
-      </w:pPr>
-      <w:r>
-        <w:rPr>
-          <w:iCs/>
-          <w:i/>
-        </w:rPr>
-        <w:t xml:space="preserve">— Dave Meyer, former Virginia Tech captain and NFL quarterback</w:t>
-      </w:r>
-    </w:p>
-    <w:p>
-      <w:pPr>
-        <w:pStyle w:val="BodyText"/>
-      </w:pPr>
-      <w:r>
-        <w:t xml:space="preserve">Copyright © 2026 by Rob Brizzi. All rights reserved. No part of this book may be reproduced in any form without written permission from the publisher, except for brief quotations in reviews.</w:t>
-      </w:r>
-    </w:p>
-    <w:p>
-      <w:pPr>
-        <w:pStyle w:val="BodyText"/>
-      </w:pPr>
-      <w:r>
-        <w:t xml:space="preserve">Published by Cardinal Promise Press, Raleigh, North Carolina.</w:t>
-      </w:r>
-    </w:p>
-    <w:p>
-      <w:pPr>
-        <w:pStyle w:val="BodyText"/>
-      </w:pPr>
-      <w:r>
-        <w:t xml:space="preserve">First edition, 2026. Printed in the United States of America.</w:t>
-      </w:r>
-    </w:p>
-    <w:p>
-      <w:pPr>
-        <w:pStyle w:val="BodyText"/>
-      </w:pPr>
-      <w:r>
-        <w:t xml:space="preserve">Paperback ISBN: 979-8-9966446-0-5</w:t>
-      </w:r>
-    </w:p>
-    <w:p>
-      <w:pPr>
-        <w:pStyle w:val="BodyText"/>
-      </w:pPr>
-      <w:r>
-        <w:t xml:space="preserve">Ebook ISBN: 979-8-9966446-1-2</w:t>
-      </w:r>
-    </w:p>
-    <w:p>
-      <w:pPr>
-        <w:pStyle w:val="BodyText"/>
-      </w:pPr>
-      <w:r>
-        <w:t xml:space="preserve">This is a work of memoir. It reflects the author’s present recollections of experiences over time. Some names and identifying details have been changed, some dialogue has been reconstructed, and some events are rendered as composites, as described in the Author’s Note.</w:t>
-      </w:r>
-    </w:p>
-    <w:p>
-      <w:pPr>
-        <w:pStyle w:val="BodyText"/>
-      </w:pPr>
-      <w:r>
-        <w:rPr>
-          <w:iCs/>
-          <w:i/>
-        </w:rPr>
-        <w:t xml:space="preserve">For anyone who has struggled with addiction or loved someone who has</w:t>
-      </w:r>
-    </w:p>
-    <w:p>
-      <w:pPr>
-        <w:pStyle w:val="BodyText"/>
-      </w:pPr>
-      <w:r>
-        <w:rPr>
-          <w:iCs/>
-          <w:i/>
-        </w:rPr>
-        <w:t xml:space="preserve">In honor of Lou Brizzi —</w:t>
-      </w:r>
-      <w:r>
-        <w:br/>
-      </w:r>
-      <w:r>
-        <w:rPr>
-          <w:iCs/>
-          <w:i/>
-        </w:rPr>
-        <w:t xml:space="preserve">the man who kept showing up.</w:t>
-      </w:r>
-    </w:p>
-    <w:p>
-      <w:pPr>
-        <w:pStyle w:val="BodyText"/>
-      </w:pPr>
-      <w:r>
-        <w:rPr>
-          <w:iCs/>
-          <w:i/>
-        </w:rPr>
-        <w:t xml:space="preserve">1941–2025</w:t>
-      </w:r>
-    </w:p>
-    <w:p>
-      <w:pPr>
-        <w:pStyle w:val="BodyText"/>
-      </w:pPr>
-      <w:r>
-        <w:rPr>
-          <w:iCs/>
-          <w:i/>
-        </w:rPr>
-        <w:t xml:space="preserve">For Hope, who tilted her head and said</w:t>
-      </w:r>
-      <w:r>
-        <w:rPr>
-          <w:iCs/>
-          <w:i/>
-        </w:rPr>
-        <w:t xml:space="preserve"> </w:t>
-      </w:r>
-      <w:r>
-        <w:rPr>
-          <w:iCs/>
-          <w:i/>
-        </w:rPr>
-        <w:t xml:space="preserve">“</w:t>
-      </w:r>
-      <w:r>
-        <w:rPr>
-          <w:iCs/>
-          <w:i/>
-        </w:rPr>
-        <w:t xml:space="preserve">We?</w:t>
-      </w:r>
-      <w:r>
-        <w:rPr>
-          <w:iCs/>
-          <w:i/>
-        </w:rPr>
-        <w:t xml:space="preserve">”</w:t>
-      </w:r>
-    </w:p>
-    <w:p>
-      <w:pPr>
-        <w:pStyle w:val="BodyText"/>
-      </w:pPr>
-      <w:r>
-        <w:rPr>
-          <w:bCs/>
-          <w:b/>
-        </w:rPr>
         <w:t xml:space="preserve">CONTENTS</w:t>
+      </w:r>
+    </w:p>
+    <w:p>
+      <w:pPr>
+        <w:pStyle w:val="BodyText"/>
+      </w:pPr>
+      <w:r>
+        <w:t xml:space="preserve">Foreword</w:t>
       </w:r>
     </w:p>
     <w:p>
@@ -814,87 +772,145 @@
         <w:pStyle w:val="BodyText"/>
       </w:pPr>
       <w:r>
+        <w:t xml:space="preserve">The Rooms</w:t>
+      </w:r>
+    </w:p>
+    <w:p>
+      <w:pPr>
+        <w:pStyle w:val="BodyText"/>
+      </w:pPr>
+      <w:r>
+        <w:t xml:space="preserve">A Note to the One Who Loves an Addict</w:t>
+      </w:r>
+    </w:p>
+    <w:p>
+      <w:pPr>
+        <w:pStyle w:val="BodyText"/>
+      </w:pPr>
+      <w:r>
+        <w:t xml:space="preserve">Lou’s Way</w:t>
+      </w:r>
+    </w:p>
+    <w:p>
+      <w:pPr>
+        <w:pStyle w:val="BodyText"/>
+      </w:pPr>
+      <w:r>
+        <w:t xml:space="preserve">Author’s Note</w:t>
+      </w:r>
+    </w:p>
+    <w:p>
+      <w:pPr>
+        <w:pStyle w:val="BodyText"/>
+      </w:pPr>
+      <w:r>
+        <w:t xml:space="preserve">Acknowledgments</w:t>
+      </w:r>
+    </w:p>
+    <w:p>
+      <w:pPr>
+        <w:pStyle w:val="BodyText"/>
+      </w:pPr>
+      <w:r>
+        <w:t xml:space="preserve">A Reader’s Guide</w:t>
+      </w:r>
+    </w:p>
+    <w:p>
+      <w:pPr>
+        <w:pStyle w:val="BodyText"/>
+      </w:pPr>
+      <w:r>
+        <w:t xml:space="preserve">Resources</w:t>
+      </w:r>
+    </w:p>
+    <w:p>
+      <w:pPr>
+        <w:pStyle w:val="BodyText"/>
+      </w:pPr>
+      <w:r>
+        <w:t xml:space="preserve">About the Author</w:t>
+      </w:r>
+    </w:p>
+    <w:bookmarkEnd w:id="20"/>
+    <w:bookmarkStart w:id="21" w:name="foreword"/>
+    <w:p>
+      <w:pPr>
+        <w:pStyle w:val="Heading1"/>
+      </w:pPr>
+      <w:r>
         <w:rPr>
           <w:bCs/>
           <w:b/>
         </w:rPr>
-        <w:t xml:space="preserve">For Those Walking This Road</w:t>
-      </w:r>
-    </w:p>
-    <w:p>
-      <w:pPr>
-        <w:pStyle w:val="BodyText"/>
-      </w:pPr>
-      <w:r>
-        <w:t xml:space="preserve">A Note to the One Who Loves an Addict</w:t>
-      </w:r>
-    </w:p>
-    <w:p>
-      <w:pPr>
-        <w:pStyle w:val="BodyText"/>
-      </w:pPr>
-      <w:r>
-        <w:t xml:space="preserve">The Rooms</w:t>
-      </w:r>
-    </w:p>
-    <w:p>
-      <w:pPr>
-        <w:pStyle w:val="BodyText"/>
-      </w:pPr>
-      <w:r>
-        <w:t xml:space="preserve">Lou’s Way</w:t>
-      </w:r>
-    </w:p>
-    <w:p>
-      <w:pPr>
-        <w:pStyle w:val="BodyText"/>
-      </w:pPr>
-      <w:r>
-        <w:t xml:space="preserve">Afterword</w:t>
-      </w:r>
-    </w:p>
-    <w:p>
-      <w:pPr>
-        <w:pStyle w:val="BodyText"/>
-      </w:pPr>
-      <w:r>
-        <w:t xml:space="preserve">Author’s Note</w:t>
-      </w:r>
-    </w:p>
-    <w:p>
-      <w:pPr>
-        <w:pStyle w:val="BodyText"/>
-      </w:pPr>
-      <w:r>
-        <w:t xml:space="preserve">Acknowledgments</w:t>
-      </w:r>
-    </w:p>
-    <w:p>
-      <w:pPr>
-        <w:pStyle w:val="BodyText"/>
-      </w:pPr>
-      <w:r>
-        <w:t xml:space="preserve">A Reader’s Guide</w:t>
-      </w:r>
-    </w:p>
-    <w:p>
-      <w:pPr>
-        <w:pStyle w:val="BodyText"/>
-      </w:pPr>
-      <w:r>
-        <w:t xml:space="preserve">Resources</w:t>
-      </w:r>
-    </w:p>
-    <w:p>
-      <w:pPr>
-        <w:pStyle w:val="BodyText"/>
-      </w:pPr>
-      <w:r>
-        <w:t xml:space="preserve">About the Author</w:t>
-      </w:r>
-    </w:p>
-    <w:bookmarkEnd w:id="20"/>
-    <w:bookmarkStart w:id="21" w:name="prologue"/>
+        <w:t xml:space="preserve">FOREWORD</w:t>
+      </w:r>
+    </w:p>
+    <w:p>
+      <w:pPr>
+        <w:pStyle w:val="FirstParagraph"/>
+      </w:pPr>
+      <w:r>
+        <w:t xml:space="preserve">There is a kind of wisdom that can only be earned by living through what most people spend their lives trying to avoid. Rob Brizzi has that kind of wisdom, and this book is the evidence of it.</w:t>
+      </w:r>
+    </w:p>
+    <w:p>
+      <w:pPr>
+        <w:pStyle w:val="BodyText"/>
+      </w:pPr>
+      <w:r>
+        <w:t xml:space="preserve">I have known Rob for thirty-five years, and a friendship like that gives you a long view of a man’s life. Over those years we bonded over faith, character, and a shared belief in showing up and doing right by people. I knew him long before this book, long before the wisdom in these pages had taken shape, long enough to remember the younger version of him, full of energy and loyalty, the guy who hauled a buddy’s Jeep doors around Long Beach Island in ninety-five-degree heat, no shade, just because somebody needed help moving. That was Rob being Rob. He has a servant’s heart, and he has had it from the beginning. What I did not know back then was everything going on underneath: the battles he was fighting, the identity he was trying to find, the long road that would bring him to the writing of this book.</w:t>
+      </w:r>
+    </w:p>
+    <w:p>
+      <w:pPr>
+        <w:pStyle w:val="BodyText"/>
+      </w:pPr>
+      <w:r>
+        <w:t xml:space="preserve">When I reconnected with Rob, it was as if no time had passed. Within minutes our conversation left both of us in tears. As I heard him talk about his father, I understood that this man has an irreplaceable calling. For years Rob has been of service to those in recovery, and he has continued that service through his work in hospice. He sits with families in what he calls the last chapter. He has been there for people in their most vulnerable moments, guiding families through conversations most of us spend a lifetime avoiding, and he does it with the full weight of his own experience as a son who was himself guided through the darkness by the steady, unconditional presence of a father who was all in.</w:t>
+      </w:r>
+    </w:p>
+    <w:p>
+      <w:pPr>
+        <w:pStyle w:val="BodyText"/>
+      </w:pPr>
+      <w:r>
+        <w:t xml:space="preserve">Lou was a father like that. He hit a hundred fly balls at Finch Park in Ramsey, drove Rob and his brother Chris to wrestling practice three nights a week, and leaned in at every turn because he wanted his boys to be the best version of themselves in every part of life. That love left a mark on Rob, and he carries it forward now, offering families the same presence his father once gave him.</w:t>
+      </w:r>
+    </w:p>
+    <w:p>
+      <w:pPr>
+        <w:pStyle w:val="BodyText"/>
+      </w:pPr>
+      <w:r>
+        <w:t xml:space="preserve">Every page of this book sounds like the man I know. Rob does not have a long list of titles after his name, and he has never needed one. He has done the harder thing. He has lived it. I am grateful this book exists, and I am grateful you are holding it.</w:t>
+      </w:r>
+    </w:p>
+    <w:p>
+      <w:pPr>
+        <w:pStyle w:val="BodyText"/>
+      </w:pPr>
+      <w:r>
+        <w:rPr>
+          <w:iCs/>
+          <w:i/>
+        </w:rPr>
+        <w:t xml:space="preserve">Sincerely,</w:t>
+      </w:r>
+    </w:p>
+    <w:p>
+      <w:pPr>
+        <w:pStyle w:val="BodyText"/>
+      </w:pPr>
+      <w:r>
+        <w:rPr>
+          <w:iCs/>
+          <w:i/>
+        </w:rPr>
+        <w:t xml:space="preserve">Dave Meyer, former Virginia Tech captain and NFL quarterback</w:t>
+      </w:r>
+    </w:p>
+    <w:bookmarkEnd w:id="21"/>
+    <w:bookmarkStart w:id="22" w:name="prologue"/>
     <w:p>
       <w:pPr>
         <w:pStyle w:val="Heading1"/>
@@ -1205,8 +1221,8 @@
         <w:t xml:space="preserve">PART ONE</w:t>
       </w:r>
     </w:p>
-    <w:bookmarkEnd w:id="21"/>
-    <w:bookmarkStart w:id="23" w:name="the-escape"/>
+    <w:bookmarkEnd w:id="22"/>
+    <w:bookmarkStart w:id="24" w:name="the-escape"/>
     <w:p>
       <w:pPr>
         <w:pStyle w:val="Heading1"/>
@@ -2850,7 +2866,7 @@
         <w:pStyle w:val="BodyText"/>
       </w:pPr>
       <w:r>
-        <w:t xml:space="preserve">When I was six, Lou taught me to swim by carrying me to the edge of the pool and throwing me in. I came up coughing and furious, my arms going the way arms go when a body fights drowning. I reached the wall and pulled myself out. Lou stood there watching, not laughing, just paying attention the way a man does when he’s handed his kid something he’ll need. He didn’t make a speech. I got back in the water the next time, and the time after that.</w:t>
+        <w:t xml:space="preserve">When I was six, Lou taught me to swim by carrying me to the edge of the pool and throwing me in. I came up coughing and furious, my arms going the way arms go when a body fights drowning. I reached the wall and pulled myself out. Lou stood there watching, not laughing, just paying attention the way a man does when he’s handed his kid something he’ll need. I got back in the water the next time, and the time after that.</w:t>
       </w:r>
     </w:p>
     <w:p>
@@ -3107,7 +3123,7 @@
         <w:t xml:space="preserve">We lived on Woodridge Street, and Domino’s was our pizza. Back then they ran the promise: thirty minutes or it’s free. What they didn’t account for was that our town had a Woodridge Street and a Woodridge Avenue, and the driver went to the Avenue every single time. He’d turn up at our door late and apologizing, and he’d hand us the pizza and our money back. Free Domino’s, over and over, because a guy couldn’t tell a street from an avenue. Chris and I were sure we’d beaten the system.</w:t>
       </w:r>
     </w:p>
-    <w:bookmarkStart w:id="22" w:name="claudio-and-rob"/>
+    <w:bookmarkStart w:id="23" w:name="claudio-and-rob"/>
     <w:p>
       <w:pPr>
         <w:pStyle w:val="Heading3"/>
@@ -3465,7 +3481,7 @@
         <w:pStyle w:val="BodyText"/>
       </w:pPr>
       <w:r>
-        <w:t xml:space="preserve">I carried his name before I understood what was behind it. What Lou taught me about being a man came down to a few things, none of them speeches.</w:t>
+        <w:t xml:space="preserve">I carried his name before I understood what was behind it. What Lou taught me about being a man came down to a few things.</w:t>
       </w:r>
     </w:p>
     <w:p>
@@ -3648,9 +3664,9 @@
         <w:t xml:space="preserve">PART TWO</w:t>
       </w:r>
     </w:p>
-    <w:bookmarkEnd w:id="22"/>
     <w:bookmarkEnd w:id="23"/>
-    <w:bookmarkStart w:id="33" w:name="the-mat"/>
+    <w:bookmarkEnd w:id="24"/>
+    <w:bookmarkStart w:id="34" w:name="the-mat"/>
     <w:p>
       <w:pPr>
         <w:pStyle w:val="Heading1"/>
@@ -3904,7 +3920,7 @@
         <w:pStyle w:val="BodyText"/>
       </w:pPr>
       <w:r>
-        <w:t xml:space="preserve">That was Lou. He didn’t make grand speeches. He showed his love in carpools, tournament weekends, church on Sundays, and thousands of hours sitting beside wrestling mats.</w:t>
+        <w:t xml:space="preserve">He showed his love in carpools, tournament weekends, church on Sundays, and thousands of hours sitting beside wrestling mats.</w:t>
       </w:r>
     </w:p>
     <w:p>
@@ -4003,7 +4019,7 @@
         <w:t xml:space="preserve">For years I thought wrestling turned me into someone. Looking back, I see it taught me something dangerous. It made me think that winning was my identity.</w:t>
       </w:r>
     </w:p>
-    <w:bookmarkStart w:id="24" w:name="cooperstown"/>
+    <w:bookmarkStart w:id="25" w:name="cooperstown"/>
     <w:p>
       <w:pPr>
         <w:pStyle w:val="Heading3"/>
@@ -4174,8 +4190,8 @@
         <w:t xml:space="preserve">We got back in the car a little before five, and I was asleep before long. When I woke up we were home. Seven hours of driving for a building full of gloves and a ball Babe Ruth once touched. He never said why.</w:t>
       </w:r>
     </w:p>
-    <w:bookmarkEnd w:id="24"/>
-    <w:bookmarkStart w:id="25" w:name="dave-meyer"/>
+    <w:bookmarkEnd w:id="25"/>
+    <w:bookmarkStart w:id="26" w:name="dave-meyer"/>
     <w:p>
       <w:pPr>
         <w:pStyle w:val="Heading3"/>
@@ -4377,8 +4393,8 @@
         <w:t xml:space="preserve">Ramsey, New Jersey, 1993</w:t>
       </w:r>
     </w:p>
-    <w:bookmarkEnd w:id="25"/>
-    <w:bookmarkStart w:id="26" w:name="sophomore-year-the-turn"/>
+    <w:bookmarkEnd w:id="26"/>
+    <w:bookmarkStart w:id="27" w:name="sophomore-year-the-turn"/>
     <w:p>
       <w:pPr>
         <w:pStyle w:val="Heading3"/>
@@ -4415,8 +4431,8 @@
         <w:t xml:space="preserve">I couldn’t take any of it in. The gap between who everyone suddenly said I was and who I knew myself to be was too wide to cross. The achievement was real. The sense that I had earned it wasn’t there, and it wouldn’t be for years. It would take a long time, and losing nearly everything, before I could stand in a room and believe I belonged in it.</w:t>
       </w:r>
     </w:p>
-    <w:bookmarkEnd w:id="26"/>
-    <w:bookmarkStart w:id="27" w:name="junior-year"/>
+    <w:bookmarkEnd w:id="27"/>
+    <w:bookmarkStart w:id="28" w:name="junior-year"/>
     <w:p>
       <w:pPr>
         <w:pStyle w:val="Heading3"/>
@@ -4487,8 +4503,8 @@
         <w:t xml:space="preserve">He knew what it had taken to get there. He wasn’t making it into anything bigger than it was; he was just enjoying it with me. I nodded. That was enough for both of us.</w:t>
       </w:r>
     </w:p>
-    <w:bookmarkEnd w:id="27"/>
-    <w:bookmarkStart w:id="28" w:name="charlie"/>
+    <w:bookmarkEnd w:id="28"/>
+    <w:bookmarkStart w:id="29" w:name="charlie"/>
     <w:p>
       <w:pPr>
         <w:pStyle w:val="Heading3"/>
@@ -4525,8 +4541,8 @@
         <w:t xml:space="preserve">What stays with me now: my dad was the one who went in. He walked into a room where someone he loved was losing, knowing it might not be enough. He went anyway.</w:t>
       </w:r>
     </w:p>
-    <w:bookmarkEnd w:id="28"/>
-    <w:bookmarkStart w:id="29" w:name="senior-year-county-champion"/>
+    <w:bookmarkEnd w:id="29"/>
+    <w:bookmarkStart w:id="30" w:name="senior-year-county-champion"/>
     <w:p>
       <w:pPr>
         <w:pStyle w:val="Heading3"/>
@@ -4597,8 +4613,8 @@
         <w:t xml:space="preserve">The hazel-eyed baby my mother carried out of Mexico is silver-haired now, a father himself, the light skin and the easy grin still intact. He’s complicated. Smart. Polished and strategic, an overachiever in the true sense. And still, the first thing anyone says about him is that he’s kind. Quietly, consistently kind. He’s my best friend. We took different paths and processed the same childhood differently, but there’s nobody I’d rather have call me on Christmas morning, nobody I’d rather have beside me at a graveside. Lou built us both, differently, and never compared us. He showed up for Chris’s records and my county title with the same pride.</w:t>
       </w:r>
     </w:p>
-    <w:bookmarkEnd w:id="29"/>
-    <w:bookmarkStart w:id="30" w:name="the-lesson-and-the-exception"/>
+    <w:bookmarkEnd w:id="30"/>
+    <w:bookmarkStart w:id="31" w:name="the-lesson-and-the-exception"/>
     <w:p>
       <w:pPr>
         <w:pStyle w:val="Heading3"/>
@@ -4632,7 +4648,7 @@
         <w:pStyle w:val="BodyText"/>
       </w:pPr>
       <w:r>
-        <w:t xml:space="preserve">One moment at the Counties: I was about to wrestle for the title and my Walkman got stolen. I needed it to warm up. Lou didn’t lecture me. He drove to Best Buy and bought me a new one. Years later I said,</w:t>
+        <w:t xml:space="preserve">One moment at the Counties: I was about to wrestle for the title and my Walkman got stolen. I needed it to warm up. He drove to Best Buy and bought me a new one. Years later I said,</w:t>
       </w:r>
       <w:r>
         <w:t xml:space="preserve"> </w:t>
@@ -4679,8 +4695,8 @@
         <w:t xml:space="preserve">When I threw up in a match, he didn’t see weakness. When I got pinned in nineteen seconds, he didn’t see failure. He saw his kid. He was in the third row for all of it, and I never once asked what it had cost him to be there.</w:t>
       </w:r>
     </w:p>
-    <w:bookmarkEnd w:id="30"/>
-    <w:bookmarkStart w:id="31" w:name="the-marks"/>
+    <w:bookmarkEnd w:id="31"/>
+    <w:bookmarkStart w:id="32" w:name="the-marks"/>
     <w:p>
       <w:pPr>
         <w:pStyle w:val="Heading3"/>
@@ -4806,7 +4822,7 @@
         <w:pStyle w:val="BodyText"/>
       </w:pPr>
       <w:r>
-        <w:t xml:space="preserve">Nobody sat me down and explained it. No family meeting, no speech, no panic I can remember. That wasn’t him. But I felt it. The house got quieter. My mother’s voice got softer. Adults paused half a second too long before answering simple questions. My dad got more focused, not less. Deliberate. Like a switch had been thrown and every move mattered now.</w:t>
+        <w:t xml:space="preserve">Nobody sat me down and explained it. No family meeting, no panic I can remember. That wasn’t him. But I felt it. The house got quieter. My mother’s voice got softer. Adults paused half a second too long before answering simple questions. My dad got more focused, not less. Deliberate. Like a switch had been thrown and every move mattered now.</w:t>
       </w:r>
     </w:p>
     <w:p>
@@ -4854,7 +4870,7 @@
         <w:pStyle w:val="BodyText"/>
       </w:pPr>
       <w:r>
-        <w:t xml:space="preserve">I can still see him at the front door. Dyed hair, pressed shirt, tie pulled tight, shoes shined. That’s what he did while he waited. He kept showing up.</w:t>
+        <w:t xml:space="preserve">I can still see him at the front door. Dyed hair, pressed shirt, tie pulled tight, shoes shined.</w:t>
       </w:r>
     </w:p>
     <w:p>
@@ -5151,8 +5167,8 @@
         <w:t xml:space="preserve">My dad didn’t live that life. He lived next to it. Close enough to know the rules, close enough to know when to say something and when to keep his mouth shut. As a kid I just thought my dad knew a lot of interesting people. He did. Some of them were more interesting than a seven-year-old needed to know about.</w:t>
       </w:r>
     </w:p>
-    <w:bookmarkEnd w:id="31"/>
-    <w:bookmarkStart w:id="32" w:name="the-most-interesting-man-in-the-world"/>
+    <w:bookmarkEnd w:id="32"/>
+    <w:bookmarkStart w:id="33" w:name="the-most-interesting-man-in-the-world"/>
     <w:p>
       <w:pPr>
         <w:pStyle w:val="Heading3"/>
@@ -5828,9 +5844,9 @@
         <w:t xml:space="preserve">PART THREE</w:t>
       </w:r>
     </w:p>
-    <w:bookmarkEnd w:id="32"/>
     <w:bookmarkEnd w:id="33"/>
-    <w:bookmarkStart w:id="39" w:name="the-fall"/>
+    <w:bookmarkEnd w:id="34"/>
+    <w:bookmarkStart w:id="40" w:name="the-fall"/>
     <w:p>
       <w:pPr>
         <w:pStyle w:val="Heading1"/>
@@ -5867,7 +5883,7 @@
         <w:t xml:space="preserve">CHAPTER 12</w:t>
       </w:r>
     </w:p>
-    <w:bookmarkStart w:id="34" w:name="the-performance-trap"/>
+    <w:bookmarkStart w:id="35" w:name="the-performance-trap"/>
     <w:p>
       <w:pPr>
         <w:pStyle w:val="Heading2"/>
@@ -6211,15 +6227,7 @@
         <w:pStyle w:val="BodyText"/>
       </w:pPr>
       <w:r>
-        <w:t xml:space="preserve">Did the experience of a fellow cellmate scaring the living crap out of me change my behavior? Sure. Until I got out.</w:t>
-      </w:r>
-    </w:p>
-    <w:p>
-      <w:pPr>
-        <w:pStyle w:val="BodyText"/>
-      </w:pPr>
-      <w:r>
-        <w:t xml:space="preserve">I crossed again the next day. Which wasn’t logical behavior. But addiction doesn’t listen to logic. Six figures a year, crossing a border for pills because the machine I had built couldn’t run without fuel.</w:t>
+        <w:t xml:space="preserve">I crossed again the next day. Six figures a year, crossing a border for pills because the machine I had built couldn’t run without fuel.</w:t>
       </w:r>
     </w:p>
     <w:p>
@@ -6526,8 +6534,8 @@
         <w:t xml:space="preserve">CHAPTER 13</w:t>
       </w:r>
     </w:p>
-    <w:bookmarkEnd w:id="34"/>
-    <w:bookmarkStart w:id="35" w:name="my-brothers-keeper"/>
+    <w:bookmarkEnd w:id="35"/>
+    <w:bookmarkStart w:id="36" w:name="my-brothers-keeper"/>
     <w:p>
       <w:pPr>
         <w:pStyle w:val="Heading2"/>
@@ -6780,8 +6788,8 @@
         <w:t xml:space="preserve">CHAPTER 14</w:t>
       </w:r>
     </w:p>
-    <w:bookmarkEnd w:id="35"/>
-    <w:bookmarkStart w:id="36" w:name="checking-boxes"/>
+    <w:bookmarkEnd w:id="36"/>
+    <w:bookmarkStart w:id="37" w:name="checking-boxes"/>
     <w:p>
       <w:pPr>
         <w:pStyle w:val="Heading2"/>
@@ -7023,7 +7031,7 @@
         <w:pStyle w:val="BodyText"/>
       </w:pPr>
       <w:r>
-        <w:t xml:space="preserve">People in the rooms talk about the moment of clarity. That red light was mine, and I want to be honest about what I did with it. Nothing. I didn’t get sober that night. I didn’t slow down for long. The late nights came back, the mornings that turned into afternoons, the résumé I kept updating and never sent. I would drive past Dad’s house and see him in the driveway washing his car and think about pulling in. Pulling in meant questions about interviews I hadn’t gone to. So I waved and kept driving.</w:t>
+        <w:t xml:space="preserve">People in the rooms talk about the moment of clarity. That red light was mine, and what I did with it was nothing. I didn’t get sober that night. I didn’t slow down for long. The late nights came back, the mornings that turned into afternoons, the résumé I kept updating and never sent. I would drive past Dad’s house and see him in the driveway washing his car and think about pulling in. Pulling in meant questions about interviews I hadn’t gone to. So I waved and kept driving.</w:t>
       </w:r>
     </w:p>
     <w:p>
@@ -7110,8 +7118,8 @@
         <w:t xml:space="preserve">CHAPTER 15</w:t>
       </w:r>
     </w:p>
-    <w:bookmarkEnd w:id="36"/>
-    <w:bookmarkStart w:id="37" w:name="west-palm-beach"/>
+    <w:bookmarkEnd w:id="37"/>
+    <w:bookmarkStart w:id="38" w:name="west-palm-beach"/>
     <w:p>
       <w:pPr>
         <w:pStyle w:val="Heading2"/>
@@ -7350,8 +7358,8 @@
         <w:t xml:space="preserve">CHAPTER 16</w:t>
       </w:r>
     </w:p>
-    <w:bookmarkEnd w:id="37"/>
-    <w:bookmarkStart w:id="38" w:name="new-orleans"/>
+    <w:bookmarkEnd w:id="38"/>
+    <w:bookmarkStart w:id="39" w:name="new-orleans"/>
     <w:p>
       <w:pPr>
         <w:pStyle w:val="Heading2"/>
@@ -7569,7 +7577,7 @@
         <w:pStyle w:val="BodyText"/>
       </w:pPr>
       <w:r>
-        <w:t xml:space="preserve">My surrender wasn’t clean. I want to tell it the way it happened.</w:t>
+        <w:t xml:space="preserve">My surrender wasn’t clean.</w:t>
       </w:r>
     </w:p>
     <w:p>
@@ -7692,9 +7700,9 @@
         <w:t xml:space="preserve">I never saw those pills again. I never asked what he did with them.</w:t>
       </w:r>
     </w:p>
-    <w:bookmarkEnd w:id="38"/>
     <w:bookmarkEnd w:id="39"/>
-    <w:bookmarkStart w:id="40" w:name="the-drives-i"/>
+    <w:bookmarkEnd w:id="40"/>
+    <w:bookmarkStart w:id="41" w:name="the-drives-i"/>
     <w:p>
       <w:pPr>
         <w:pStyle w:val="Heading1"/>
@@ -7727,8 +7735,8 @@
         <w:t xml:space="preserve">PART FOUR</w:t>
       </w:r>
     </w:p>
-    <w:bookmarkEnd w:id="40"/>
-    <w:bookmarkStart w:id="42" w:name="getting-square"/>
+    <w:bookmarkEnd w:id="41"/>
+    <w:bookmarkStart w:id="43" w:name="getting-square"/>
     <w:p>
       <w:pPr>
         <w:pStyle w:val="Heading1"/>
@@ -7765,7 +7773,7 @@
         <w:t xml:space="preserve">CHAPTER 17</w:t>
       </w:r>
     </w:p>
-    <w:bookmarkStart w:id="41" w:name="chumuckla"/>
+    <w:bookmarkStart w:id="42" w:name="chumuckla"/>
     <w:p>
       <w:pPr>
         <w:pStyle w:val="Heading2"/>
@@ -8673,7 +8681,7 @@
         <w:pStyle w:val="BodyText"/>
       </w:pPr>
       <w:r>
-        <w:t xml:space="preserve">Lou didn’t react the way I expected. No anger, no speech, no disappointment. He looked at me the way he had when I was losing badly on a mat, the same look he gave me when he was deciding whether I could recover.</w:t>
+        <w:t xml:space="preserve">Lou didn’t react the way I expected. No anger, no disappointment. He looked at me the way he had when I was losing badly on a mat, the same look he gave me when he was deciding whether I could recover.</w:t>
       </w:r>
     </w:p>
     <w:p>
@@ -9823,7 +9831,7 @@
         <w:pStyle w:val="BodyText"/>
       </w:pPr>
       <w:r>
-        <w:t xml:space="preserve">I love her, and I haven’t shown it the way she showed me. I’m booking a trip to South Florida to see her — to start being a better son while I still have the time to be one. The debt on the pad didn’t disappear fast. But I stopped flinching when bills came. I started answering calls from numbers I didn’t recognize. My past stopped feeling like it was following me, not because it was gone, but because it was being addressed. Not redemption. Nothing was being erased. Responsibility. One payment, one opened envelope, one answered call at a time.</w:t>
+        <w:t xml:space="preserve">The debt on the pad didn’t disappear fast. But I stopped flinching when bills came. I started answering calls from numbers I didn’t recognize. My past stopped feeling like it was following me, not because it was gone, but because it was being addressed. Not redemption. Nothing was being erased. Responsibility. One payment, one opened envelope, one answered call at a time.</w:t>
       </w:r>
     </w:p>
     <w:p>
@@ -10460,9 +10468,9 @@
         <w:t xml:space="preserve">It took me a long time to understand that all of it, the Wednesday calls at seven from a borrowed line, the birthday calls, even the friend requests to people he had never met, was the love. I understood it. I still couldn’t answer it. It hasn’t stopped him from trying. There was never anyone else to try for. Chris and me. That’s what he has. Do I have closure? I don’t know. It’s complicated, and I’ve stopped needing it not to be. What’s simple is this: I honor Lou. One father kept calling. The other one kept coming.</w:t>
       </w:r>
     </w:p>
-    <w:bookmarkEnd w:id="41"/>
     <w:bookmarkEnd w:id="42"/>
-    <w:bookmarkStart w:id="43" w:name="the-drives-ii"/>
+    <w:bookmarkEnd w:id="43"/>
+    <w:bookmarkStart w:id="44" w:name="the-drives-ii"/>
     <w:p>
       <w:pPr>
         <w:pStyle w:val="Heading1"/>
@@ -10495,8 +10503,8 @@
         <w:t xml:space="preserve">PART FIVE</w:t>
       </w:r>
     </w:p>
-    <w:bookmarkEnd w:id="43"/>
-    <w:bookmarkStart w:id="52" w:name="hope"/>
+    <w:bookmarkEnd w:id="44"/>
+    <w:bookmarkStart w:id="53" w:name="hope"/>
     <w:p>
       <w:pPr>
         <w:pStyle w:val="Heading1"/>
@@ -10676,7 +10684,77 @@
         <w:pStyle w:val="BodyText"/>
       </w:pPr>
       <w:r>
-        <w:t xml:space="preserve">Near the end, I went to see him, and it was nothing like the nursing-home room of my boyhood — this was a grown man actively dying, and everyone in the house knew it. The place was full. People he’d carried in the rooms, people who’d carried him, a steady stream coming to sit with him and say what they needed to say while he could still hear it. My first thought was a small, honest panic: how was I supposed to feel all of this without anything to take the edge off? I had never done grief without a buffer. The panic didn’t last, and what replaced it wasn’t sadness. It was gratitude, and a level calm, the plain fact of being there and not needing to be anywhere else. He told me once that sobriety wasn’t something he fought every morning; it was a decision he had made a single time and never went back to revisit, and he carried it all the way to the edge of his life. Decades older than me, and still showing me how it was done.</w:t>
+        <w:t xml:space="preserve">Bob wasn’t the only man I loved who got cancer that year. Lou was diagnosed with stomach and esophageal cancer in the spring of 2015. He was seventy-three. He called me on a Tuesday, no preamble.</w:t>
+      </w:r>
+      <w:r>
+        <w:t xml:space="preserve"> </w:t>
+      </w:r>
+      <w:r>
+        <w:t xml:space="preserve">“</w:t>
+      </w:r>
+      <w:r>
+        <w:t xml:space="preserve">Got some news,</w:t>
+      </w:r>
+      <w:r>
+        <w:t xml:space="preserve">”</w:t>
+      </w:r>
+      <w:r>
+        <w:t xml:space="preserve"> </w:t>
+      </w:r>
+      <w:r>
+        <w:t xml:space="preserve">he said.</w:t>
+      </w:r>
+      <w:r>
+        <w:t xml:space="preserve"> </w:t>
+      </w:r>
+      <w:r>
+        <w:t xml:space="preserve">“</w:t>
+      </w:r>
+      <w:r>
+        <w:t xml:space="preserve">Surgery. And holistic stuff. No chemo. I’m not doing chemo.</w:t>
+      </w:r>
+      <w:r>
+        <w:t xml:space="preserve">”</w:t>
+      </w:r>
+      <w:r>
+        <w:t xml:space="preserve"> </w:t>
+      </w:r>
+      <w:r>
+        <w:t xml:space="preserve">I knew better than to argue.</w:t>
+      </w:r>
+      <w:r>
+        <w:t xml:space="preserve"> </w:t>
+      </w:r>
+      <w:r>
+        <w:t xml:space="preserve">“</w:t>
+      </w:r>
+      <w:r>
+        <w:t xml:space="preserve">Okay,</w:t>
+      </w:r>
+      <w:r>
+        <w:t xml:space="preserve">”</w:t>
+      </w:r>
+      <w:r>
+        <w:t xml:space="preserve"> </w:t>
+      </w:r>
+      <w:r>
+        <w:t xml:space="preserve">I said, which meant, I hear you, and I’ll show up for whatever comes next. The surgery was brutal. Donna was there every day. I believe it’s because of Donna that my father lived another ten years. She was a nurse; she understood his body in ways the rest of us didn’t. She loved him completely and he loved her. He told me straight, more than once: Donna was the love of his life. My relationship with Donna was always centered on my dad. She was good to me, always. She’s a complex person, with a controlling nature expressed in the sweetest, most Southern way imaginable. I don’t mean that as criticism. Who she is was exactly what Lou needed. The season she is in now is hard, because her life was organized entirely around his. I worry about her. I pray for her.</w:t>
+      </w:r>
+    </w:p>
+    <w:p>
+      <w:pPr>
+        <w:pStyle w:val="BodyText"/>
+      </w:pPr>
+      <w:r>
+        <w:t xml:space="preserve">Lou came through the surgery. By December the scans were clean. The cancer stayed away for eight years — one scare in 2018, something on his liver, and nothing was ever done about it; it held. He was at my wedding in April 2019. Years that looked, from the inside, like a permanent gift. They weren’t.</w:t>
+      </w:r>
+    </w:p>
+    <w:p>
+      <w:pPr>
+        <w:pStyle w:val="BodyText"/>
+      </w:pPr>
+      <w:r>
+        <w:t xml:space="preserve">Bob didn’t get that kind of time. Near the end, I went to see him, and it was nothing like the nursing-home room of my boyhood — this was a grown man actively dying, and everyone in the house knew it. The place was full. People he’d carried in the rooms, people who’d carried him, a steady stream coming to sit with him and say what they needed to say while he could still hear it. My first thought was a small, honest panic: how was I supposed to feel all of this without anything to take the edge off? I had never done grief without a buffer. The panic didn’t last, and what replaced it wasn’t sadness. It was gratitude, and a level calm, the plain fact of being there and not needing to be anywhere else. He told me once that sobriety wasn’t something he fought every morning; it was a decision he had made a single time and never went back to revisit, and he carried it all the way to the edge of his life. Decades older than me, and still showing me how it was done.</w:t>
       </w:r>
     </w:p>
     <w:p>
@@ -11169,7 +11247,7 @@
         <w:t xml:space="preserve">People say those words. I could feel that she meant them, all the way down. My father spent a lifetime proving that sentence without ever needing to say it. Hearing it said to me, and believing it, was the moment I knew I would marry her. Falling in love with her was the easiest thing I’d ever done.</w:t>
       </w:r>
     </w:p>
-    <w:bookmarkStart w:id="44" w:name="are-you-saved"/>
+    <w:bookmarkStart w:id="45" w:name="are-you-saved"/>
     <w:p>
       <w:pPr>
         <w:pStyle w:val="Heading3"/>
@@ -11430,8 +11508,8 @@
         <w:t xml:space="preserve">Outside my own father, Jeff is one of two men who have shown me what faith looks like when it’s lived instead of just spoken. The other is Dave Meyer, my friend since middle school. Different men, same spine. Neither one talks the talk and stops there; both walk it. Neither has ever lost sight of where God is in it. I’ve needed them both as proof that the thing I reached for in a muddy field in Chumuckla holds up across a whole life.</w:t>
       </w:r>
     </w:p>
-    <w:bookmarkEnd w:id="44"/>
-    <w:bookmarkStart w:id="45" w:name="blessings"/>
+    <w:bookmarkEnd w:id="45"/>
+    <w:bookmarkStart w:id="46" w:name="blessings"/>
     <w:p>
       <w:pPr>
         <w:pStyle w:val="Heading3"/>
@@ -11582,8 +11660,8 @@
         <w:t xml:space="preserve">That was it. No formal blessing, no speech. He saw two people steady in the same direction and noted it.</w:t>
       </w:r>
     </w:p>
-    <w:bookmarkEnd w:id="45"/>
-    <w:bookmarkStart w:id="46" w:name="the-proposal"/>
+    <w:bookmarkEnd w:id="46"/>
+    <w:bookmarkStart w:id="47" w:name="the-proposal"/>
     <w:p>
       <w:pPr>
         <w:pStyle w:val="Heading3"/>
@@ -11640,8 +11718,8 @@
         <w:t xml:space="preserve">So I got on a knee, awkwardly, and asked her to marry me. Hope said yes, and the nerves went out of me all at once. What settled in their place was the surest feeling I’ve ever had about anything. I could finally enjoy the rest of my meal. Right after, we got a Chihuahua together, a little one named Nola. She’s eight now. That dog’s been with us through everything.</w:t>
       </w:r>
     </w:p>
-    <w:bookmarkEnd w:id="46"/>
-    <w:bookmarkStart w:id="47" w:name="the-wedding"/>
+    <w:bookmarkEnd w:id="47"/>
+    <w:bookmarkStart w:id="48" w:name="the-wedding"/>
     <w:p>
       <w:pPr>
         <w:pStyle w:val="Heading3"/>
@@ -12034,8 +12112,8 @@
         <w:t xml:space="preserve">It came out with a little heat, and the heat wasn’t aimed at us — with Lou it rarely was. A man who tipped twenty dollars on principle was never going to love a budget. He heard frugality and understood deprivation.</w:t>
       </w:r>
     </w:p>
-    <w:bookmarkEnd w:id="47"/>
-    <w:bookmarkStart w:id="48" w:name="who-she-is"/>
+    <w:bookmarkEnd w:id="48"/>
+    <w:bookmarkStart w:id="49" w:name="who-she-is"/>
     <w:p>
       <w:pPr>
         <w:pStyle w:val="Heading3"/>
@@ -12248,8 +12326,8 @@
         <w:t xml:space="preserve">The first three years we laughed all the time, the real kind that takes her all the way over and pulls the whole room in with her. Then the heavy years came, the ones this book is mostly about, and the laughing got rare without either of us deciding it should. It’s coming back, a little more each month. We are safe with each other, and because we’re safe we are sometimes harder on each other than we should be. That’s the cost of letting your guard all the way down with the one person you’re sure won’t leave. She is that person.</w:t>
       </w:r>
     </w:p>
-    <w:bookmarkEnd w:id="48"/>
-    <w:bookmarkStart w:id="49" w:name="the-hundred-thousand"/>
+    <w:bookmarkEnd w:id="49"/>
+    <w:bookmarkStart w:id="50" w:name="the-hundred-thousand"/>
     <w:p>
       <w:pPr>
         <w:pStyle w:val="Heading3"/>
@@ -12267,11 +12345,11 @@
         <w:pStyle w:val="FirstParagraph"/>
       </w:pPr>
       <w:r>
-        <w:t xml:space="preserve">In a short time we worked like a team. We paid off over a hundred thousand dollars in student loans and built a life with margin in it instead of debt, a home, a little security I’d never had back when I looked successful. We moved to Raleigh. We never had children, and we never planned to. What we built was the two of us, and a life with room in it for other people. These days that includes Hope’s mother. Rhonda lives under our roof now, which is not a sentence anyone says lightly, and getting to know her and love her has been one of the quiet gifts of this stretch. She hasn’t had the easiest life. What I didn’t see coming was watching Hope and her mom grow close, slowly, over years, until Hope started calling Rhonda her best friend. None of the good things happen overnight. Hope is my rock. It isn’t always smooth, no honest marriage is, but she’s never stopped believing in what we’re building. That’s my love story. It started with a stubborn message on Match.com to a girl who told me not to write. Best rule I ever broke.</w:t>
-      </w:r>
-    </w:p>
-    <w:bookmarkEnd w:id="49"/>
-    <w:bookmarkStart w:id="50" w:name="the-pictures-never-tell-the-whole-story"/>
+        <w:t xml:space="preserve">In a short time we worked like a team. We paid off over a hundred thousand dollars in student loans and built a life with margin in it instead of debt, a home, a little security I’d never had back when I looked successful. We moved to Raleigh. We never had children, and we never planned to. What we built was the two of us, and a life with room in it for other people. These days that includes Hope’s mother. Rhonda lives under our roof now, which is not a sentence anyone says lightly, and getting to know her and love her has been one of the quiet gifts of this stretch. She hasn’t had the easiest life. What I didn’t see coming was watching Hope and her mom grow close, slowly, over years, until Hope started calling Rhonda her best friend. None of the good things happen overnight. That’s my love story. It started with a stubborn message on Match.com to a girl who told me not to write. Best rule I ever broke.</w:t>
+      </w:r>
+    </w:p>
+    <w:bookmarkEnd w:id="50"/>
+    <w:bookmarkStart w:id="51" w:name="the-pictures-never-tell-the-whole-story"/>
     <w:p>
       <w:pPr>
         <w:pStyle w:val="Heading3"/>
@@ -12408,8 +12486,8 @@
         <w:t xml:space="preserve">CHAPTER 28</w:t>
       </w:r>
     </w:p>
-    <w:bookmarkEnd w:id="50"/>
-    <w:bookmarkStart w:id="51" w:name="wonderwoman"/>
+    <w:bookmarkEnd w:id="51"/>
+    <w:bookmarkStart w:id="52" w:name="wonderwoman"/>
     <w:p>
       <w:pPr>
         <w:pStyle w:val="Heading2"/>
@@ -12657,6 +12735,14 @@
         <w:pStyle w:val="BodyText"/>
       </w:pPr>
       <w:r>
+        <w:t xml:space="preserve">I love her, and I haven’t shown it the way she showed me. I’m booking a trip to South Florida to see her, to start being a better son while I still have the time to be one.</w:t>
+      </w:r>
+    </w:p>
+    <w:p>
+      <w:pPr>
+        <w:pStyle w:val="BodyText"/>
+      </w:pPr>
+      <w:r>
         <w:t xml:space="preserve">There is one more thing I need to say to her in print, because I don’t say it enough out loud. It was my mother who first walked me into a church, who made faith the one thing that wasn’t up for debate. The first time it stopped being hers and started being mine, I was thirteen, on a mission trip in Nashville. I don’t remember a word of the preaching. I remember the room, some current moving through all of us, and my fear going quiet for the first time I can recall. That faith became the floor I stood on when everything else gave way. Mom, if it weren’t for you, I would not be the person I am today. Not the sober one, not the one who can sit in a stranger’s last room, not the one who finally learned how to stay. All of it traces back to you. My mother will be taken care of for the rest of her life. Whatever care she needs, we will provide it. She picked us once. She never stopped.</w:t>
       </w:r>
     </w:p>
@@ -12668,9 +12754,9 @@
         <w:t xml:space="preserve">PART SIX</w:t>
       </w:r>
     </w:p>
-    <w:bookmarkEnd w:id="51"/>
     <w:bookmarkEnd w:id="52"/>
-    <w:bookmarkStart w:id="55" w:name="the-last-chapter"/>
+    <w:bookmarkEnd w:id="53"/>
+    <w:bookmarkStart w:id="60" w:name="the-last-chapter"/>
     <w:p>
       <w:pPr>
         <w:pStyle w:val="Heading1"/>
@@ -12768,7 +12854,7 @@
           <w:bCs/>
           <w:b/>
         </w:rPr>
-        <w:t xml:space="preserve">Pensacola, 2021</w:t>
+        <w:t xml:space="preserve">Pensacola, 2021–2025</w:t>
       </w:r>
     </w:p>
     <w:p>
@@ -12845,7 +12931,7 @@
         <w:t xml:space="preserve">So I interviewed, and I got the job. It was hard to leave. Ten years. Brenda Jahn, my manager there, had been amazing. But I saw it as a chance to learn. When I started at Novo Nordisk I didn’t know the difference between type 1 and type 2 diabetes. Through the training and the home study I got good at it. Really good.</w:t>
       </w:r>
     </w:p>
-    <w:bookmarkStart w:id="53" w:name="diabetes-dave"/>
+    <w:bookmarkStart w:id="54" w:name="diabetes-dave"/>
     <w:p>
       <w:pPr>
         <w:pStyle w:val="Heading3"/>
@@ -12898,8 +12984,8 @@
         <w:t xml:space="preserve">I didn’t know then what Christmas would take from me two years later, or what would land on my driver’s side mirror two weeks after that. But when it came, I would recognize it. Dave had taught me the language.</w:t>
       </w:r>
     </w:p>
-    <w:bookmarkEnd w:id="53"/>
-    <w:bookmarkStart w:id="54" w:name="the-in-between"/>
+    <w:bookmarkEnd w:id="54"/>
+    <w:bookmarkStart w:id="55" w:name="the-right-place"/>
     <w:p>
       <w:pPr>
         <w:pStyle w:val="Heading3"/>
@@ -12909,6 +12995,330 @@
           <w:iCs/>
           <w:i/>
         </w:rPr>
+        <w:t xml:space="preserve">The Right Place</w:t>
+      </w:r>
+    </w:p>
+    <w:p>
+      <w:pPr>
+        <w:pStyle w:val="FirstParagraph"/>
+      </w:pPr>
+      <w:r>
+        <w:t xml:space="preserve">I want you to see him whole first, because the man who was about to start dying had never stopped living.</w:t>
+      </w:r>
+    </w:p>
+    <w:p>
+      <w:pPr>
+        <w:pStyle w:val="BodyText"/>
+      </w:pPr>
+      <w:r>
+        <w:t xml:space="preserve">Lou was a man of places. He could seem simple if you only caught the surface, but he carried a private map of the world inside him — the best restaurants, the best bagels, the streets worth taking, the shop worth passing twenty other shops to reach. New York wasn’t an idea to him. It was muscle memory. He kept returning to the places he’d known since childhood, as if tradition were something you kept alive by visiting it. At Clyde’s in Lodi he had a lemonade rule: two scoops, one always lemon, the other your choice. Flexible inside a fixed tradition — there was room for choice, but only after the lemon was settled. He never wanted to be rushed at a meal. A restaurant wasn’t a place to consume food; it was a place to be recognized, to settle in, to let the thing unfold. He liked career waiters, professionals who remembered him and knew their craft, and he tipped twenty dollars like a man paying respect to people who knew how to do their job. He wasn’t a picky eater; the food itself almost never lost him. What lost him was bad service, and paying for a meal done badly. It offended the same thing in him that the twenty-dollar tips honored.</w:t>
+      </w:r>
+    </w:p>
+    <w:p>
+      <w:pPr>
+        <w:pStyle w:val="BodyText"/>
+      </w:pPr>
+      <w:r>
+        <w:t xml:space="preserve">Yankee games had their own liturgy. Leave the house at five, catch batting practice, soak in the park. A hot dog or chicken fingers, done the same way every time. He watched almost every game of a season — the blowouts, the lost years, the Septembers that meant nothing in the standings. I asked him once why.</w:t>
+      </w:r>
+      <w:r>
+        <w:t xml:space="preserve"> </w:t>
+      </w:r>
+      <w:r>
+        <w:t xml:space="preserve">“</w:t>
+      </w:r>
+      <w:r>
+        <w:t xml:space="preserve">I just enjoy the game,</w:t>
+      </w:r>
+      <w:r>
+        <w:t xml:space="preserve">”</w:t>
+      </w:r>
+      <w:r>
+        <w:t xml:space="preserve"> </w:t>
+      </w:r>
+      <w:r>
+        <w:t xml:space="preserve">he said. I understand it differently now. He wasn’t only watching baseball. He was practicing loyalty — staying with a thing because it was his, not because it was winning.</w:t>
+      </w:r>
+    </w:p>
+    <w:p>
+      <w:pPr>
+        <w:pStyle w:val="BodyText"/>
+      </w:pPr>
+      <w:r>
+        <w:t xml:space="preserve">And he never stopped wanting to be useful. He’d retired on paper and kept working anyway, into his eighties, answering phones and untangling computer problems. The pay was almost nothing, and one day he called me like he’d won a sweepstakes because his boss had doubled it. What I remember isn’t the money. It’s an eighty-year-old man beaming over a good performance review. At eighty, he did a 5K with Hope and me — beanie, glasses, a finisher’s medal — finished dead last, and took home the tortoise award, which somehow made the whole thing better. After the 2015 surgery — they took about half of his esophagus and half of his stomach — he ate less, weighed less, took his vitamins, saw his holistic doctor. He won himself years. He spent them wanting things. Strength. Respect. A good review. Proof he wasn’t finished. There is dignity in still wanting, and my father had it to the last.</w:t>
+      </w:r>
+    </w:p>
+    <w:bookmarkEnd w:id="55"/>
+    <w:bookmarkStart w:id="56" w:name="dont-go-dying-on-me"/>
+    <w:p>
+      <w:pPr>
+        <w:pStyle w:val="Heading3"/>
+      </w:pPr>
+      <w:r>
+        <w:rPr>
+          <w:iCs/>
+          <w:i/>
+        </w:rPr>
+        <w:t xml:space="preserve">Don’t Go Dying on Me</w:t>
+      </w:r>
+    </w:p>
+    <w:p>
+      <w:pPr>
+        <w:pStyle w:val="FirstParagraph"/>
+      </w:pPr>
+      <w:r>
+        <w:t xml:space="preserve">In January 2024 the cancer came back. Stage 4. Lungs and lymph nodes. Lou was eighty-two. He told Donna. He told Lisa. He told no one else.</w:t>
+      </w:r>
+    </w:p>
+    <w:p>
+      <w:pPr>
+        <w:pStyle w:val="BodyText"/>
+      </w:pPr>
+      <w:r>
+        <w:t xml:space="preserve">I noticed it before I knew what I was noticing, his mood a little off, something in the quality of him I couldn’t name. Chris was getting married in February, and Lou had decided, quietly and completely, that his son’s wedding wasn’t going to be about his diagnosis. So he showed up. He danced. He celebrated. Nisha’s father had passed the year before, and the wedding was a big Indian celebration in Fort Lauderdale, joyful and carrying grief as well as love. Lou understood that. He held it inside and let the day be what it was supposed to be.</w:t>
+      </w:r>
+    </w:p>
+    <w:p>
+      <w:pPr>
+        <w:pStyle w:val="BodyText"/>
+      </w:pPr>
+      <w:r>
+        <w:t xml:space="preserve">My mother was there too, her Parkinson’s flaring hard that month. She’d taken a fall in the days before and came anyway, patched with a Band-Aid that wasn’t fooling anybody. At the end of the night she found Lou and said,</w:t>
+      </w:r>
+      <w:r>
+        <w:t xml:space="preserve"> </w:t>
+      </w:r>
+      <w:r>
+        <w:t xml:space="preserve">“</w:t>
+      </w:r>
+      <w:r>
+        <w:t xml:space="preserve">Don’t go dying on me.</w:t>
+      </w:r>
+      <w:r>
+        <w:t xml:space="preserve">”</w:t>
+      </w:r>
+      <w:r>
+        <w:t xml:space="preserve"> </w:t>
+      </w:r>
+      <w:r>
+        <w:t xml:space="preserve">And my father — the cancer already back inside him, the secret already sealed — looked at her and said,</w:t>
+      </w:r>
+      <w:r>
+        <w:t xml:space="preserve"> </w:t>
+      </w:r>
+      <w:r>
+        <w:t xml:space="preserve">“</w:t>
+      </w:r>
+      <w:r>
+        <w:t xml:space="preserve">You don’t go dying on me.</w:t>
+      </w:r>
+      <w:r>
+        <w:t xml:space="preserve">”</w:t>
+      </w:r>
+      <w:r>
+        <w:t xml:space="preserve"> </w:t>
+      </w:r>
+      <w:r>
+        <w:t xml:space="preserve">She didn’t know what he was carrying. He did. He kept the secret until March or April.</w:t>
+      </w:r>
+      <w:r>
+        <w:t xml:space="preserve"> </w:t>
+      </w:r>
+      <w:r>
+        <w:t xml:space="preserve">“</w:t>
+      </w:r>
+      <w:r>
+        <w:t xml:space="preserve">The cancer’s back,</w:t>
+      </w:r>
+      <w:r>
+        <w:t xml:space="preserve">”</w:t>
+      </w:r>
+      <w:r>
+        <w:t xml:space="preserve"> </w:t>
+      </w:r>
+      <w:r>
+        <w:t xml:space="preserve">he said.</w:t>
+      </w:r>
+      <w:r>
+        <w:t xml:space="preserve"> </w:t>
+      </w:r>
+      <w:r>
+        <w:t xml:space="preserve">“</w:t>
+      </w:r>
+      <w:r>
+        <w:t xml:space="preserve">January. I didn’t want to say anything because of Chris’s wedding.</w:t>
+      </w:r>
+      <w:r>
+        <w:t xml:space="preserve">”</w:t>
+      </w:r>
+    </w:p>
+    <w:p>
+      <w:pPr>
+        <w:pStyle w:val="BodyText"/>
+      </w:pPr>
+      <w:r>
+        <w:t xml:space="preserve">Lisa and I talked. We knew he had to do something. Chris was the one who got through to him, researched, found a surgeon in Birmingham using connections from a previous job, got him an appointment. The surgeon looked at him and said, stage 4, your age, no surgeon is going to operate on you. We were distraught. Surgery had worked the first time; we thought it was the answer again. Immunotherapy came up, usually not as hard on the body as chemo or radiation, we were told. Lou agreed to try. He was choosing to try. Not for himself. For us.</w:t>
+      </w:r>
+    </w:p>
+    <w:bookmarkEnd w:id="56"/>
+    <w:bookmarkStart w:id="57" w:name="the-treatment"/>
+    <w:p>
+      <w:pPr>
+        <w:pStyle w:val="Heading3"/>
+      </w:pPr>
+      <w:r>
+        <w:rPr>
+          <w:iCs/>
+          <w:i/>
+        </w:rPr>
+        <w:t xml:space="preserve">The Treatment</w:t>
+      </w:r>
+    </w:p>
+    <w:p>
+      <w:pPr>
+        <w:pStyle w:val="FirstParagraph"/>
+      </w:pPr>
+      <w:r>
+        <w:t xml:space="preserve">The immunotherapy started in summer 2024. At first, impossibly, it worked. The tumor in his lung nearly dissolved. The oncologist used the word encouraging. Then the side effects came, rashes all over his body. Lou never complained. His heart rate and blood pressure started going off and he ended up in the hospital. I was there when they put the pacemaker in. He was upbeat about it, ready to keep fighting. A pacemaker at eighty-three and he came out looking for the next round. He did a second round of immunotherapy, then a third, trying to clear the lymph nodes. The third round was what finally took a toll. He got weak. By mid-2025 the phone calls had changed, and he stopped asking about my work. Not because he didn’t care. Because asking took focus that was going to the basic maintenance of existing. And in July 2025, a year and a half into the fight, he was there when Chris and Nisha’s daughter, Priya, was born. He held her.</w:t>
+      </w:r>
+    </w:p>
+    <w:bookmarkEnd w:id="57"/>
+    <w:bookmarkStart w:id="58" w:name="he-wouldnt-say-pain"/>
+    <w:p>
+      <w:pPr>
+        <w:pStyle w:val="Heading3"/>
+      </w:pPr>
+      <w:r>
+        <w:rPr>
+          <w:iCs/>
+          <w:i/>
+        </w:rPr>
+        <w:t xml:space="preserve">He Wouldn’t Say Pain</w:t>
+      </w:r>
+    </w:p>
+    <w:p>
+      <w:pPr>
+        <w:pStyle w:val="FirstParagraph"/>
+      </w:pPr>
+      <w:r>
+        <w:t xml:space="preserve">Lou would not say he was in pain. He came up in a world where pain wasn’t something men announced. You swallowed it, walked it off, worked through it, or hid it badly enough that everyone around you had to become a detective. His discomfort came out sideways — restlessness instead of language, a man who couldn’t settle in a chair he’d sat in for twenty years.</w:t>
+      </w:r>
+    </w:p>
+    <w:p>
+      <w:pPr>
+        <w:pStyle w:val="BodyText"/>
+      </w:pPr>
+      <w:r>
+        <w:t xml:space="preserve">It was Hope who found the doorway.</w:t>
+      </w:r>
+      <w:r>
+        <w:t xml:space="preserve"> </w:t>
+      </w:r>
+      <w:r>
+        <w:t xml:space="preserve">“</w:t>
+      </w:r>
+      <w:r>
+        <w:t xml:space="preserve">Are you in pain?</w:t>
+      </w:r>
+      <w:r>
+        <w:t xml:space="preserve">”</w:t>
+      </w:r>
+      <w:r>
+        <w:t xml:space="preserve"> </w:t>
+      </w:r>
+      <w:r>
+        <w:t xml:space="preserve">got a flat no, every time. Then she tried it another way.</w:t>
+      </w:r>
+      <w:r>
+        <w:t xml:space="preserve"> </w:t>
+      </w:r>
+      <w:r>
+        <w:t xml:space="preserve">“</w:t>
+      </w:r>
+      <w:r>
+        <w:t xml:space="preserve">Are you uncomfortable in this area?</w:t>
+      </w:r>
+      <w:r>
+        <w:t xml:space="preserve">”</w:t>
+      </w:r>
+      <w:r>
+        <w:t xml:space="preserve"> </w:t>
+      </w:r>
+      <w:r>
+        <w:t xml:space="preserve">Yes. That question gave him a way to tell the truth without feeling like he’d surrendered something. Hospice taught me that words matter. Lou taught me that pride matters too. Sometimes care isn’t forcing someone to admit what hurts. Sometimes care is learning the doorway a person is willing to walk through.</w:t>
+      </w:r>
+    </w:p>
+    <w:p>
+      <w:pPr>
+        <w:pStyle w:val="BodyText"/>
+      </w:pPr>
+      <w:r>
+        <w:t xml:space="preserve">I respected the toughness. I also saw the loneliness inside it. It kept him going. It also kept us from helping him.</w:t>
+      </w:r>
+    </w:p>
+    <w:p>
+      <w:pPr>
+        <w:pStyle w:val="BodyText"/>
+      </w:pPr>
+      <w:r>
+        <w:t xml:space="preserve">There was a stretch in late 2024, about a year before the end, when I was sure we were losing him. He could barely walk. He was barely coherent, and he was in a lot of pain. I called the family and told everyone they needed to come to town. I didn’t think he was going to make it. Joel flew in, and I picked him up at the airport. He told me he didn’t know how to do this, how to be in the room with our father like that, with all of it right there on the surface. Joel wears his humor like armor; he’s the funny one. Seeing him without it was something else entirely.</w:t>
+      </w:r>
+      <w:r>
+        <w:t xml:space="preserve"> </w:t>
+      </w:r>
+      <w:r>
+        <w:t xml:space="preserve">“</w:t>
+      </w:r>
+      <w:r>
+        <w:t xml:space="preserve">Just grab his hand,</w:t>
+      </w:r>
+      <w:r>
+        <w:t xml:space="preserve">”</w:t>
+      </w:r>
+      <w:r>
+        <w:t xml:space="preserve"> </w:t>
+      </w:r>
+      <w:r>
+        <w:t xml:space="preserve">I told him,</w:t>
+      </w:r>
+      <w:r>
+        <w:t xml:space="preserve"> </w:t>
+      </w:r>
+      <w:r>
+        <w:t xml:space="preserve">“</w:t>
+      </w:r>
+      <w:r>
+        <w:t xml:space="preserve">and tell him you love him.</w:t>
+      </w:r>
+      <w:r>
+        <w:t xml:space="preserve">”</w:t>
+      </w:r>
+      <w:r>
+        <w:t xml:space="preserve"> </w:t>
+      </w:r>
+      <w:r>
+        <w:t xml:space="preserve">That’s all. Two grown men in an airport pickup lane, working out how to go say goodbye to our dad. Lou rallied after that. He gave us most of another year. But that was the first time I rehearsed losing him.</w:t>
+      </w:r>
+    </w:p>
+    <w:p>
+      <w:pPr>
+        <w:pStyle w:val="BodyText"/>
+      </w:pPr>
+      <w:r>
+        <w:t xml:space="preserve">That spring, Hope and I told him we were moving to Raleigh. I could tell he was disappointed. I’d lived close to him in Pensacola for eighteen years, almost nineteen. But he understood, and he told me to go. That was always his way, even at the end, more concerned about whether we were okay than whether we were close. The last time I saw him before the move we went to McGuire’s. He looked fine. He said he wasn’t worried, said as long as Donna was there he was okay. Part of me looks back and wonders if I should have stayed longer. I couldn’t have known that five weeks into my new job he’d take a turn and go downhill fast.</w:t>
+      </w:r>
+    </w:p>
+    <w:bookmarkEnd w:id="58"/>
+    <w:bookmarkStart w:id="59" w:name="the-in-between"/>
+    <w:p>
+      <w:pPr>
+        <w:pStyle w:val="Heading3"/>
+      </w:pPr>
+      <w:r>
+        <w:rPr>
+          <w:iCs/>
+          <w:i/>
+        </w:rPr>
         <w:t xml:space="preserve">The In-Between</w:t>
       </w:r>
     </w:p>
@@ -12928,9 +13338,9 @@
         <w:t xml:space="preserve">I told people I was going to take some time off. Be there for my dad. Be there for my mom. Be present the way I’d spent years telling families to be present, while there was still time. That was the plan. It’s not what happened. What happened was I retreated into myself. The time I’d set aside became something else, a depression I didn’t see coming and couldn’t recognize from the inside. I was grieving what was already happening and what was coming, and it kept me from doing the thing I’d left my career to do. I know the name for it now. The grief showed up before the loss did, and it froze me. I wasn’t working. I wasn’t fully showing up for my parents. I was stuck in a version of myself that couldn’t move in any direction. Hospice, when it came, wasn’t a pivot. It was a return, to the rooms I’d been thinking about since the home health years, to the weight I’d learned how to carry. It pulled me out of that in-between place and gave me direction again.</w:t>
       </w:r>
     </w:p>
-    <w:bookmarkEnd w:id="54"/>
-    <w:bookmarkEnd w:id="55"/>
-    <w:bookmarkStart w:id="67" w:name="the-drives-iii"/>
+    <w:bookmarkEnd w:id="59"/>
+    <w:bookmarkEnd w:id="60"/>
+    <w:bookmarkStart w:id="66" w:name="the-drives-iii"/>
     <w:p>
       <w:pPr>
         <w:pStyle w:val="Heading1"/>
@@ -13039,7 +13449,33 @@
         <w:t xml:space="preserve">Five weeks after I started the hospice job, my father started to die. We moved to Raleigh because life was expanding. Hope had been a pharmacist for eight years. Raleigh made sense: jobs, community, a church that felt like ours. Leaving Pensacola meant leaving roots. Hope never wavered. That’s who she is. Not blindly optimistic; she sees clearly and asks hard questions. But under all of it is a bedrock belief that God has a plan for us to be of service. When the hospice opportunity came, it felt like a room I’d been circling for years with the door finally open. No debate. No spreadsheet. This was where I was most needed.</w:t>
       </w:r>
     </w:p>
-    <w:bookmarkStart w:id="56" w:name="the-rooms"/>
+    <w:p>
+      <w:pPr>
+        <w:pStyle w:val="BodyText"/>
+      </w:pPr>
+      <w:r>
+        <w:t xml:space="preserve">After the move, Hope and I went down for a visit. We went to church that morning and ate with Dad before the drive back up to Raleigh. There was an opening in hospice, at a company I had already given ten years to, and at the table that morning Dad told me what he always told me.</w:t>
+      </w:r>
+      <w:r>
+        <w:t xml:space="preserve"> </w:t>
+      </w:r>
+      <w:r>
+        <w:t xml:space="preserve">“</w:t>
+      </w:r>
+      <w:r>
+        <w:t xml:space="preserve">Listen to your boss. Work hard.</w:t>
+      </w:r>
+      <w:r>
+        <w:t xml:space="preserve">”</w:t>
+      </w:r>
+      <w:r>
+        <w:t xml:space="preserve"> </w:t>
+      </w:r>
+      <w:r>
+        <w:t xml:space="preserve">He had put that in me a long time ago, and he said it again like it was the first time. With him, miracles had started to feel ordinary. It was the last time I saw him.</w:t>
+      </w:r>
+    </w:p>
+    <w:bookmarkStart w:id="61" w:name="the-rooms"/>
     <w:p>
       <w:pPr>
         <w:pStyle w:val="Heading3"/>
@@ -13152,476 +13588,12 @@
         <w:t xml:space="preserve">I wasn’t there for the very end. I saw him close to it, and a single thought went through me that I couldn’t take back: I never want to see my own dad like that. I had no idea how few weeks were left before that stopped being a fear and became a choice in front of me.</w:t>
       </w:r>
     </w:p>
-    <w:bookmarkEnd w:id="56"/>
-    <w:bookmarkStart w:id="57" w:name="five-weeks"/>
-    <w:p>
-      <w:pPr>
-        <w:pStyle w:val="Heading3"/>
-      </w:pPr>
-      <w:r>
-        <w:rPr>
-          <w:iCs/>
-          <w:i/>
-        </w:rPr>
-        <w:t xml:space="preserve">Five Weeks</w:t>
-      </w:r>
-    </w:p>
-    <w:p>
-      <w:pPr>
-        <w:pStyle w:val="FirstParagraph"/>
+    <w:p>
+      <w:pPr>
+        <w:pStyle w:val="BodyText"/>
       </w:pPr>
       <w:r>
         <w:t xml:space="preserve">The decline wasn’t dramatic at first, less energy in his voice on the phone, conversations that used to run long wrapping up faster, with less of the texture that made them his. I knew how to read it. I’d just spent five weeks learning to read exactly this. I was walking into strangers’ homes explaining what hospice was and wasn’t, and the whole time my own father was crossing the same line I’d been describing to families all week. I didn’t tell them my dad was dying too. I didn’t need to.</w:t>
-      </w:r>
-    </w:p>
-    <w:bookmarkEnd w:id="57"/>
-    <w:bookmarkStart w:id="58" w:name="we-said-everything"/>
-    <w:p>
-      <w:pPr>
-        <w:pStyle w:val="Heading3"/>
-      </w:pPr>
-      <w:r>
-        <w:rPr>
-          <w:iCs/>
-          <w:i/>
-        </w:rPr>
-        <w:t xml:space="preserve">We Said Everything</w:t>
-      </w:r>
-    </w:p>
-    <w:p>
-      <w:pPr>
-        <w:pStyle w:val="FirstParagraph"/>
-      </w:pPr>
-      <w:r>
-        <w:t xml:space="preserve">The relationship between my father and me was not perfect. Nothing in this story has been. But in the years of my sobriety, the real years, the years of staying, we said everything that needed saying. Not in one conversation. Not in a deathbed scene. In the ordinary: Sunday phone calls, the back porch in Pensacola, the moment at my wedding when my mother’s toast reached him and his fist went up, the moment at the business conference when Quint said his name in a room full of leaders. I made amends to him. Not with a speech, Lou would have hated a speech. With years of behavior that said: I know what you did, I know what it cost, I’m not going to waste it. He told me. Four words on a phone call.</w:t>
-      </w:r>
-      <w:r>
-        <w:t xml:space="preserve"> </w:t>
-      </w:r>
-      <w:r>
-        <w:t xml:space="preserve">“</w:t>
-      </w:r>
-      <w:r>
-        <w:t xml:space="preserve">I’m proud of you.</w:t>
-      </w:r>
-      <w:r>
-        <w:t xml:space="preserve">”</w:t>
-      </w:r>
-      <w:r>
-        <w:t xml:space="preserve"> </w:t>
-      </w:r>
-      <w:r>
-        <w:t xml:space="preserve">And somewhere in that last stretch we traded our two lines one more time, the ones we’d been trading since a car ride to Ohio half a lifetime ago. Dad, thank you for saving my life. You saved mine. His answer never changed, not even at the end. We were not unfinished. That is not a small thing.</w:t>
-      </w:r>
-    </w:p>
-    <w:bookmarkEnd w:id="58"/>
-    <w:bookmarkStart w:id="59" w:name="the-right-place"/>
-    <w:p>
-      <w:pPr>
-        <w:pStyle w:val="Heading3"/>
-      </w:pPr>
-      <w:r>
-        <w:rPr>
-          <w:iCs/>
-          <w:i/>
-        </w:rPr>
-        <w:t xml:space="preserve">The Right Place</w:t>
-      </w:r>
-    </w:p>
-    <w:p>
-      <w:pPr>
-        <w:pStyle w:val="FirstParagraph"/>
-      </w:pPr>
-      <w:r>
-        <w:t xml:space="preserve">I want you to see him whole first, because the man who was about to start dying had never stopped living.</w:t>
-      </w:r>
-    </w:p>
-    <w:p>
-      <w:pPr>
-        <w:pStyle w:val="BodyText"/>
-      </w:pPr>
-      <w:r>
-        <w:t xml:space="preserve">Lou was a man of places. He could seem simple if you only caught the surface, but he carried a private map of the world inside him — the best restaurants, the best bagels, the streets worth taking, the shop worth passing twenty other shops to reach. New York wasn’t an idea to him. It was muscle memory. He kept returning to the places he’d known since childhood, as if tradition were something you kept alive by visiting it. At Clyde’s in Lodi he had a lemonade rule: two scoops, one always lemon, the other your choice. Flexible inside a fixed tradition — there was room for choice, but only after the lemon was settled. He never wanted to be rushed at a meal. A restaurant wasn’t a place to consume food; it was a place to be recognized, to settle in, to let the thing unfold. He liked career waiters, professionals who remembered him and knew their craft, and he tipped twenty dollars like a man paying respect to people who knew how to do their job. He wasn’t a picky eater; the food itself almost never lost him. What lost him was bad service, and paying for a meal done badly. It offended the same thing in him that the twenty-dollar tips honored.</w:t>
-      </w:r>
-    </w:p>
-    <w:p>
-      <w:pPr>
-        <w:pStyle w:val="BodyText"/>
-      </w:pPr>
-      <w:r>
-        <w:t xml:space="preserve">Yankee games had their own liturgy. Leave the house at five, catch batting practice, soak in the park. A hot dog or chicken fingers, done the same way every time. He watched almost every game of a season — the blowouts, the lost years, the Septembers that meant nothing in the standings. I asked him once why.</w:t>
-      </w:r>
-      <w:r>
-        <w:t xml:space="preserve"> </w:t>
-      </w:r>
-      <w:r>
-        <w:t xml:space="preserve">“</w:t>
-      </w:r>
-      <w:r>
-        <w:t xml:space="preserve">I just enjoy the game,</w:t>
-      </w:r>
-      <w:r>
-        <w:t xml:space="preserve">”</w:t>
-      </w:r>
-      <w:r>
-        <w:t xml:space="preserve"> </w:t>
-      </w:r>
-      <w:r>
-        <w:t xml:space="preserve">he said. I understand it differently now. He wasn’t only watching baseball. He was practicing loyalty — staying with a thing because it was his, not because it was winning.</w:t>
-      </w:r>
-    </w:p>
-    <w:p>
-      <w:pPr>
-        <w:pStyle w:val="BodyText"/>
-      </w:pPr>
-      <w:r>
-        <w:t xml:space="preserve">And he never stopped wanting to be useful. He’d retired on paper and kept working anyway, into his eighties, answering phones and untangling computer problems. The pay was almost nothing, and one day he called me like he’d won a sweepstakes because his boss had doubled it. What I remember isn’t the money. It’s an eighty-year-old man beaming over a good performance review. At eighty, he did a 5K with Hope and me — beanie, glasses, a finisher’s medal — finished dead last, and took home the tortoise award, which somehow made the whole thing better. After the 2015 surgery — they took about half of his esophagus and half of his stomach — he ate less, weighed less, took his vitamins, saw his holistic doctor. He won himself years. He spent them wanting things. Strength. Respect. A good review. Proof he wasn’t finished. There is dignity in still wanting, and my father had it to the last.</w:t>
-      </w:r>
-    </w:p>
-    <w:bookmarkEnd w:id="59"/>
-    <w:bookmarkStart w:id="60" w:name="vigils"/>
-    <w:p>
-      <w:pPr>
-        <w:pStyle w:val="Heading3"/>
-      </w:pPr>
-      <w:r>
-        <w:rPr>
-          <w:iCs/>
-          <w:i/>
-        </w:rPr>
-        <w:t xml:space="preserve">Vigils</w:t>
-      </w:r>
-    </w:p>
-    <w:p>
-      <w:pPr>
-        <w:pStyle w:val="FirstParagraph"/>
-      </w:pPr>
-      <w:r>
-        <w:t xml:space="preserve">Lou was diagnosed with stomach and esophageal cancer in the spring of 2015. He was seventy-three. He called me on a Tuesday, no preamble.</w:t>
-      </w:r>
-      <w:r>
-        <w:t xml:space="preserve"> </w:t>
-      </w:r>
-      <w:r>
-        <w:t xml:space="preserve">“</w:t>
-      </w:r>
-      <w:r>
-        <w:t xml:space="preserve">Got some news,</w:t>
-      </w:r>
-      <w:r>
-        <w:t xml:space="preserve">”</w:t>
-      </w:r>
-      <w:r>
-        <w:t xml:space="preserve"> </w:t>
-      </w:r>
-      <w:r>
-        <w:t xml:space="preserve">he said.</w:t>
-      </w:r>
-      <w:r>
-        <w:t xml:space="preserve"> </w:t>
-      </w:r>
-      <w:r>
-        <w:t xml:space="preserve">“</w:t>
-      </w:r>
-      <w:r>
-        <w:t xml:space="preserve">Surgery. And holistic stuff. No chemo. I’m not doing chemo.</w:t>
-      </w:r>
-      <w:r>
-        <w:t xml:space="preserve">”</w:t>
-      </w:r>
-      <w:r>
-        <w:t xml:space="preserve"> </w:t>
-      </w:r>
-      <w:r>
-        <w:t xml:space="preserve">I knew better than to argue.</w:t>
-      </w:r>
-      <w:r>
-        <w:t xml:space="preserve"> </w:t>
-      </w:r>
-      <w:r>
-        <w:t xml:space="preserve">“</w:t>
-      </w:r>
-      <w:r>
-        <w:t xml:space="preserve">Okay,</w:t>
-      </w:r>
-      <w:r>
-        <w:t xml:space="preserve">”</w:t>
-      </w:r>
-      <w:r>
-        <w:t xml:space="preserve"> </w:t>
-      </w:r>
-      <w:r>
-        <w:t xml:space="preserve">I said, which meant, I hear you, and I’ll show up for whatever comes next. The surgery was brutal. Donna was there every day. I believe it’s because of Donna that my father lived another ten years. She was a nurse; she understood his body in ways the rest of us didn’t. She loved him completely and he loved her. He told me straight, more than once: Donna was the love of his life. My relationship with Donna was always centered on my dad. She was good to me, always. She’s a complex person, with a controlling nature expressed in the sweetest, most Southern way imaginable. I don’t mean that as criticism. Who she is was exactly what Lou needed. The season ahead will be hard for her, because her life was organized entirely around his. I worry about her. I pray for her.</w:t>
-      </w:r>
-    </w:p>
-    <w:p>
-      <w:pPr>
-        <w:pStyle w:val="BodyText"/>
-      </w:pPr>
-      <w:r>
-        <w:t xml:space="preserve">Lou came through the surgery. By December the scans were clean. The cancer stayed away for eight years — one scare in 2018, something on his liver, and nothing was ever done about it; it held. He was at my wedding in April 2019. Years that looked, from the inside, like a permanent gift. They weren’t.</w:t>
-      </w:r>
-    </w:p>
-    <w:p>
-      <w:pPr>
-        <w:pStyle w:val="BodyText"/>
-      </w:pPr>
-      <w:r>
-        <w:t xml:space="preserve">In January 2024 the cancer came back. Stage 4. Lungs and lymph nodes. Lou was eighty-two. He told Donna. He told Lisa. He told no one else. I noticed it before I knew what I was noticing, his mood a little off, something in the quality of him I couldn’t name. Chris was getting married in February, and Lou had decided, quietly and completely, that his son’s wedding wasn’t going to be about his diagnosis. So he showed up. He danced. He celebrated. Nisha’s father had passed the year before, and the wedding was a big Indian celebration in Fort Lauderdale, joyful and carrying grief as well as love. Lou understood that. He held it inside and let the day be what it was supposed to be. My mother was there too, her Parkinson’s flaring hard that month. She’d taken a fall in the days before and came anyway, patched with a Band-Aid that wasn’t fooling anybody. At the end of the night she found Lou and said,</w:t>
-      </w:r>
-      <w:r>
-        <w:t xml:space="preserve"> </w:t>
-      </w:r>
-      <w:r>
-        <w:t xml:space="preserve">“</w:t>
-      </w:r>
-      <w:r>
-        <w:t xml:space="preserve">Don’t go dying on me.</w:t>
-      </w:r>
-      <w:r>
-        <w:t xml:space="preserve">”</w:t>
-      </w:r>
-      <w:r>
-        <w:t xml:space="preserve"> </w:t>
-      </w:r>
-      <w:r>
-        <w:t xml:space="preserve">And my father — the cancer already back inside him, the secret already sealed — looked at her and said,</w:t>
-      </w:r>
-      <w:r>
-        <w:t xml:space="preserve"> </w:t>
-      </w:r>
-      <w:r>
-        <w:t xml:space="preserve">“</w:t>
-      </w:r>
-      <w:r>
-        <w:t xml:space="preserve">You don’t go dying on me.</w:t>
-      </w:r>
-      <w:r>
-        <w:t xml:space="preserve">”</w:t>
-      </w:r>
-      <w:r>
-        <w:t xml:space="preserve"> </w:t>
-      </w:r>
-      <w:r>
-        <w:t xml:space="preserve">She didn’t know what he was carrying. He did. He kept the secret until March or April.</w:t>
-      </w:r>
-      <w:r>
-        <w:t xml:space="preserve"> </w:t>
-      </w:r>
-      <w:r>
-        <w:t xml:space="preserve">“</w:t>
-      </w:r>
-      <w:r>
-        <w:t xml:space="preserve">The cancer’s back,</w:t>
-      </w:r>
-      <w:r>
-        <w:t xml:space="preserve">”</w:t>
-      </w:r>
-      <w:r>
-        <w:t xml:space="preserve"> </w:t>
-      </w:r>
-      <w:r>
-        <w:t xml:space="preserve">he said.</w:t>
-      </w:r>
-      <w:r>
-        <w:t xml:space="preserve"> </w:t>
-      </w:r>
-      <w:r>
-        <w:t xml:space="preserve">“</w:t>
-      </w:r>
-      <w:r>
-        <w:t xml:space="preserve">January. I didn’t want to say anything because of Chris’s wedding.</w:t>
-      </w:r>
-      <w:r>
-        <w:t xml:space="preserve">”</w:t>
-      </w:r>
-      <w:r>
-        <w:t xml:space="preserve"> </w:t>
-      </w:r>
-      <w:r>
-        <w:t xml:space="preserve">And in July 2025, a year and a half into the fight, he was there when Chris and Nisha’s daughter, Priya, was born. He held her.</w:t>
-      </w:r>
-    </w:p>
-    <w:p>
-      <w:pPr>
-        <w:pStyle w:val="BodyText"/>
-      </w:pPr>
-      <w:r>
-        <w:t xml:space="preserve">Lisa and I talked. We knew he had to do something. Chris was the one who got through to him, researched, found a surgeon in Birmingham using connections from a previous job, got him an appointment. The surgeon looked at him and said, stage 4, your age, no surgeon is going to operate on you. We were distraught. Surgery had worked the first time; we thought it was the answer again. Immunotherapy came up, usually not as hard on the body as chemo or radiation, we were told. Lou agreed to try. He was choosing to try. Not for himself. For us.</w:t>
-      </w:r>
-    </w:p>
-    <w:bookmarkEnd w:id="60"/>
-    <w:bookmarkStart w:id="61" w:name="the-treatment"/>
-    <w:p>
-      <w:pPr>
-        <w:pStyle w:val="Heading3"/>
-      </w:pPr>
-      <w:r>
-        <w:rPr>
-          <w:iCs/>
-          <w:i/>
-        </w:rPr>
-        <w:t xml:space="preserve">The Treatment</w:t>
-      </w:r>
-    </w:p>
-    <w:p>
-      <w:pPr>
-        <w:pStyle w:val="FirstParagraph"/>
-      </w:pPr>
-      <w:r>
-        <w:t xml:space="preserve">The immunotherapy started in summer 2024. At first, impossibly, it worked. The tumor in his lung nearly dissolved. The oncologist used the word encouraging. Then the side effects came, rashes all over his body. Lou never complained. His heart rate and blood pressure started going off and he ended up in the hospital. I was there when they put the pacemaker in. He was upbeat about it, ready to keep fighting. A pacemaker at eighty-three and he came out looking for the next round. He did a second round of immunotherapy, then a third, trying to clear the lymph nodes. The third round was what finally took a toll. He got weak. By mid-2025 the phone calls had changed, and he stopped asking about my work. Not because he didn’t care. Because asking took focus that was going to the basic maintenance of existing.</w:t>
-      </w:r>
-    </w:p>
-    <w:bookmarkEnd w:id="61"/>
-    <w:bookmarkStart w:id="62" w:name="he-wouldnt-say-pain"/>
-    <w:p>
-      <w:pPr>
-        <w:pStyle w:val="Heading3"/>
-      </w:pPr>
-      <w:r>
-        <w:rPr>
-          <w:iCs/>
-          <w:i/>
-        </w:rPr>
-        <w:t xml:space="preserve">He Wouldn’t Say Pain</w:t>
-      </w:r>
-    </w:p>
-    <w:p>
-      <w:pPr>
-        <w:pStyle w:val="FirstParagraph"/>
-      </w:pPr>
-      <w:r>
-        <w:t xml:space="preserve">Lou would not say he was in pain. He came up in a world where pain wasn’t something men announced. You swallowed it, walked it off, worked through it, or hid it badly enough that everyone around you had to become a detective. His discomfort came out sideways — restlessness instead of language, a man who couldn’t settle in a chair he’d sat in for twenty years.</w:t>
-      </w:r>
-    </w:p>
-    <w:p>
-      <w:pPr>
-        <w:pStyle w:val="BodyText"/>
-      </w:pPr>
-      <w:r>
-        <w:t xml:space="preserve">It was Hope who found the doorway.</w:t>
-      </w:r>
-      <w:r>
-        <w:t xml:space="preserve"> </w:t>
-      </w:r>
-      <w:r>
-        <w:t xml:space="preserve">“</w:t>
-      </w:r>
-      <w:r>
-        <w:t xml:space="preserve">Are you in pain?</w:t>
-      </w:r>
-      <w:r>
-        <w:t xml:space="preserve">”</w:t>
-      </w:r>
-      <w:r>
-        <w:t xml:space="preserve"> </w:t>
-      </w:r>
-      <w:r>
-        <w:t xml:space="preserve">got a flat no, every time. Then she tried it another way.</w:t>
-      </w:r>
-      <w:r>
-        <w:t xml:space="preserve"> </w:t>
-      </w:r>
-      <w:r>
-        <w:t xml:space="preserve">“</w:t>
-      </w:r>
-      <w:r>
-        <w:t xml:space="preserve">Are you uncomfortable in this area?</w:t>
-      </w:r>
-      <w:r>
-        <w:t xml:space="preserve">”</w:t>
-      </w:r>
-      <w:r>
-        <w:t xml:space="preserve"> </w:t>
-      </w:r>
-      <w:r>
-        <w:t xml:space="preserve">Yes. That question gave him a way to tell the truth without feeling like he’d surrendered something. Hospice taught me that words matter. Lou taught me that pride matters too. Sometimes care isn’t forcing someone to admit what hurts. Sometimes care is learning the doorway a person is willing to walk through.</w:t>
-      </w:r>
-    </w:p>
-    <w:p>
-      <w:pPr>
-        <w:pStyle w:val="BodyText"/>
-      </w:pPr>
-      <w:r>
-        <w:t xml:space="preserve">I respected the toughness. I also saw the loneliness inside it. It kept him going. It also kept us from helping him.</w:t>
-      </w:r>
-    </w:p>
-    <w:p>
-      <w:pPr>
-        <w:pStyle w:val="BodyText"/>
-      </w:pPr>
-      <w:r>
-        <w:t xml:space="preserve">There was a stretch in late 2024, about a year before the end, when I was sure we were losing him. He could barely walk. He was barely coherent, and he was in a lot of pain. I called the family and told everyone they needed to come to town. I didn’t think he was going to make it. Joel flew in, and I picked him up at the airport. He told me he didn’t know how to do this, how to be in the room with our father like that, with all of it right there on the surface. Joel wears his humor like armor; he’s the funny one. Seeing him without it was something else entirely.</w:t>
-      </w:r>
-      <w:r>
-        <w:t xml:space="preserve"> </w:t>
-      </w:r>
-      <w:r>
-        <w:t xml:space="preserve">“</w:t>
-      </w:r>
-      <w:r>
-        <w:t xml:space="preserve">Just grab his hand,</w:t>
-      </w:r>
-      <w:r>
-        <w:t xml:space="preserve">”</w:t>
-      </w:r>
-      <w:r>
-        <w:t xml:space="preserve"> </w:t>
-      </w:r>
-      <w:r>
-        <w:t xml:space="preserve">I told him,</w:t>
-      </w:r>
-      <w:r>
-        <w:t xml:space="preserve"> </w:t>
-      </w:r>
-      <w:r>
-        <w:t xml:space="preserve">“</w:t>
-      </w:r>
-      <w:r>
-        <w:t xml:space="preserve">and tell him you love him.</w:t>
-      </w:r>
-      <w:r>
-        <w:t xml:space="preserve">”</w:t>
-      </w:r>
-      <w:r>
-        <w:t xml:space="preserve"> </w:t>
-      </w:r>
-      <w:r>
-        <w:t xml:space="preserve">That’s all. Two grown men in an airport pickup lane, working out how to go say goodbye to our dad. Lou rallied after that. He gave us most of another year. But that was the first time I rehearsed losing him.</w:t>
-      </w:r>
-    </w:p>
-    <w:p>
-      <w:pPr>
-        <w:pStyle w:val="BodyText"/>
-      </w:pPr>
-      <w:r>
-        <w:t xml:space="preserve">That spring, Hope and I told him we were moving to Raleigh. I could tell he was disappointed. I’d lived close to him in Pensacola for eighteen years, almost nineteen. But he understood, and he told me to go. That was always his way, even at the end, more concerned about whether we were okay than whether we were close. The last time I saw him before the move we went to McGuire’s. He looked fine. He said he wasn’t worried, said as long as Donna was there he was okay. Part of me looks back and wonders if I should have stayed longer. I couldn’t have known that five weeks into my new job he’d take a turn and go downhill fast.</w:t>
-      </w:r>
-    </w:p>
-    <w:p>
-      <w:pPr>
-        <w:pStyle w:val="BodyText"/>
-      </w:pPr>
-      <w:r>
-        <w:t xml:space="preserve">After the move, Hope and I went down for a visit. We went to church that morning and ate with Dad before the drive back up to Raleigh. There was an opening in hospice, at a company I had already given ten years to, and at the table that morning Dad told me what he always told me.</w:t>
-      </w:r>
-      <w:r>
-        <w:t xml:space="preserve"> </w:t>
-      </w:r>
-      <w:r>
-        <w:t xml:space="preserve">“</w:t>
-      </w:r>
-      <w:r>
-        <w:t xml:space="preserve">Listen to your boss. Work hard.</w:t>
-      </w:r>
-      <w:r>
-        <w:t xml:space="preserve">”</w:t>
-      </w:r>
-      <w:r>
-        <w:t xml:space="preserve"> </w:t>
-      </w:r>
-      <w:r>
-        <w:t xml:space="preserve">He had put that in me a long time ago, and he said it again like it was the first time. With him, miracles had started to feel ordinary.</w:t>
       </w:r>
     </w:p>
     <w:p>
@@ -13729,15 +13701,7 @@
         <w:pStyle w:val="BodyText"/>
       </w:pPr>
       <w:r>
-        <w:t xml:space="preserve">Part of it was that my mother was in town. She has Parkinson’s now, and getting to me had cost her every ounce of energy she had. Part of it was simpler, and harder to admit. I did not want my last memory of my father to be tubes in his nose. He had been bigger than two cancers and a scare. I couldn’t let the man in that bed become the last picture I kept of him.</w:t>
-      </w:r>
-    </w:p>
-    <w:p>
-      <w:pPr>
-        <w:pStyle w:val="BodyText"/>
-      </w:pPr>
-      <w:r>
-        <w:t xml:space="preserve">It was selfish. I’m sorry it was that way. But I can only tell you the truth of it. The week before, I had told my sponsor that I’d said everything to my dad that needed saying. I had. There was no unfinished sentence between us. And it still didn’t spare me what came next.</w:t>
+        <w:t xml:space="preserve">Part of it was that my mother was in town. She has Parkinson’s now, and getting to me had cost her every ounce of energy she had. Part of it was simpler, and harder to admit. I did not want my last memory of my father to be tubes in his nose. He had been bigger than two cancers and a scare. I couldn’t let the man in that bed become the last picture I kept of him. It was selfish. I’m sorry it was that way.</w:t>
       </w:r>
     </w:p>
     <w:p>
@@ -13753,15 +13717,33 @@
         <w:pStyle w:val="BodyText"/>
       </w:pPr>
       <w:r>
-        <w:t xml:space="preserve">I didn’t feel guilty at first, and that’s the truth. I had been at his bedside every other time — the surgeries, the pacemaker — and I had lived close to him for eighteen years. The guilt came later, and it came from outside: people in the family who love me and who gave me a very hard time about not being there. I understand it. Grief needs somewhere to go. But the conversation with my sponsor still rings true, and I hold it like a railing: I said everything that needed to be said. Being absent from the last hour is not the same as being absent from the life.</w:t>
-      </w:r>
-    </w:p>
-    <w:p>
-      <w:pPr>
-        <w:pStyle w:val="BodyText"/>
-      </w:pPr>
-      <w:r>
-        <w:t xml:space="preserve">There’s more to that week than I’ve told you. It’s still too painful to talk about, and I’m not going to pretend otherwise. Maybe someday, further down this road, I’ll be able to write it. For now, this is what I can give you, and every word of it is true.</w:t>
+        <w:t xml:space="preserve">I didn’t feel guilty at first. I had been at his bedside every other time — the surgeries, the pacemaker — and I had lived close to him for eighteen years. The guilt came later, and it came from outside: people in the family who love me and who gave me a very hard time about not being there. I understand it. Grief needs somewhere to go. The week before, I had told my sponsor that I’d said everything to my dad that needed saying, and I hold that like a railing. Being absent from the last hour is not the same as being absent from the life.</w:t>
+      </w:r>
+    </w:p>
+    <w:p>
+      <w:pPr>
+        <w:pStyle w:val="BodyText"/>
+      </w:pPr>
+      <w:r>
+        <w:t xml:space="preserve">The relationship between my father and me was not perfect. Nothing in this story has been. But in the years of my sobriety, the real years, the years of staying, we said what needed saying. Not in one conversation. Not in a deathbed scene. In the ordinary: Sunday phone calls, the back porch in Pensacola, the moment at my wedding when my mother’s toast reached him and his fist went up, the moment at the business conference when Quint said his name in a room full of leaders. I made amends to him with years of behavior that said: I know what you did, I know what it cost, I’m not going to waste it. He told me. Four words on a phone call.</w:t>
+      </w:r>
+      <w:r>
+        <w:t xml:space="preserve"> </w:t>
+      </w:r>
+      <w:r>
+        <w:t xml:space="preserve">“</w:t>
+      </w:r>
+      <w:r>
+        <w:t xml:space="preserve">I’m proud of you.</w:t>
+      </w:r>
+      <w:r>
+        <w:t xml:space="preserve">”</w:t>
+      </w:r>
+      <w:r>
+        <w:t xml:space="preserve"> </w:t>
+      </w:r>
+      <w:r>
+        <w:t xml:space="preserve">And somewhere in that last stretch we traded our two lines one more time, the ones we’d been trading since a car ride to Ohio half a lifetime ago. Dad, thank you for saving my life. You saved mine. His answer never changed, not even at the end. We were not unfinished. That is not a small thing.</w:t>
       </w:r>
     </w:p>
     <w:p>
@@ -13785,6 +13767,14 @@
         <w:pStyle w:val="BodyText"/>
       </w:pPr>
       <w:r>
+        <w:t xml:space="preserve">There’s more to that week than I’ve told you. It’s still too painful to talk about, and I’m not going to pretend otherwise. Maybe someday, further down this road, I’ll be able to write it.</w:t>
+      </w:r>
+    </w:p>
+    <w:p>
+      <w:pPr>
+        <w:pStyle w:val="BodyText"/>
+      </w:pPr>
+      <w:r>
         <w:t xml:space="preserve">When the time came, Hope and I made the drive to Pensacola. We talked the whole way about Lou, not the saint version, the real one. The complicated man. The hard parts and the funny parts and the parts only family knows. By the time we got there I had cried and laughed and gone quiet a dozen times. That’s grief too. Hope let me cry, and she cried some herself, partly for Lou, mostly for the pain she knew I was in.</w:t>
       </w:r>
     </w:p>
@@ -13916,46 +13906,46 @@
         <w:t xml:space="preserve">We drove home the way we had come, still talking about him — the truck that said Jersey in a Florida parking lot, all of it. The grief rode with us. It rides with me still. I’ve stopped wishing it away. It’s the weight of having been loved like that, and I’d rather carry it than have nothing to carry.</w:t>
       </w:r>
     </w:p>
+    <w:bookmarkEnd w:id="61"/>
+    <w:bookmarkStart w:id="62" w:name="the-conversation-i-never-had"/>
+    <w:p>
+      <w:pPr>
+        <w:pStyle w:val="Heading3"/>
+      </w:pPr>
+      <w:r>
+        <w:rPr>
+          <w:iCs/>
+          <w:i/>
+        </w:rPr>
+        <w:t xml:space="preserve">The Conversation I Never Had</w:t>
+      </w:r>
+    </w:p>
+    <w:p>
+      <w:pPr>
+        <w:pStyle w:val="FirstParagraph"/>
+      </w:pPr>
+      <w:r>
+        <w:t xml:space="preserve">There are things I never asked my father while he was alive.</w:t>
+      </w:r>
+    </w:p>
+    <w:p>
+      <w:pPr>
+        <w:pStyle w:val="BodyText"/>
+      </w:pPr>
+      <w:r>
+        <w:t xml:space="preserve">I knew he had fallen out with his brother, a brother close to him in age. I knew some of the background. What I never asked was whether he missed him. I never asked enough about his own father, either — the man who sold produce and died around fifty. I wanted to know what that loss did to him, whether it shaped the way he held on or pulled back, whether becoming my father had anything to do with the father he lost too soon. And near the end I wanted to ask what he wanted done with everything after he was gone. I never did. Lou drew hard boundaries around certain subjects, and if there’s not an opening, you can’t really push. Hospice taught me that. So did being his son.</w:t>
+      </w:r>
+    </w:p>
+    <w:p>
+      <w:pPr>
+        <w:pStyle w:val="BodyText"/>
+      </w:pPr>
+      <w:r>
+        <w:t xml:space="preserve">I sit with families for a living and hand them the questions I never handed him. Ask now, I tell them. This is the right day. I believe every word of it, and I also know what it is to stand outside a door a man has decided to keep shut, and to love him enough to leave it that way. Both things are true. I spent my life being saved by my father. At the end, I had to learn that loving him didn’t mean saving him back.</w:t>
+      </w:r>
+    </w:p>
     <w:bookmarkEnd w:id="62"/>
-    <w:bookmarkStart w:id="63" w:name="the-conversation-i-never-had"/>
-    <w:p>
-      <w:pPr>
-        <w:pStyle w:val="Heading3"/>
-      </w:pPr>
-      <w:r>
-        <w:rPr>
-          <w:iCs/>
-          <w:i/>
-        </w:rPr>
-        <w:t xml:space="preserve">The Conversation I Never Had</w:t>
-      </w:r>
-    </w:p>
-    <w:p>
-      <w:pPr>
-        <w:pStyle w:val="FirstParagraph"/>
-      </w:pPr>
-      <w:r>
-        <w:t xml:space="preserve">There are things I never asked my father while he was alive.</w:t>
-      </w:r>
-    </w:p>
-    <w:p>
-      <w:pPr>
-        <w:pStyle w:val="BodyText"/>
-      </w:pPr>
-      <w:r>
-        <w:t xml:space="preserve">I knew he had fallen out with his brother, a brother close to him in age. I knew some of the background. What I never asked was whether he missed him. I never asked enough about his own father, either — the man who sold produce and died around fifty. I wanted to know what that loss did to him, whether it shaped the way he held on or pulled back, whether becoming my father had anything to do with the father he lost too soon. And near the end I wanted to ask what he wanted done with everything after he was gone. I never did. Lou drew hard boundaries around certain subjects, and if there’s not an opening, you can’t really push. Hospice taught me that. So did being his son.</w:t>
-      </w:r>
-    </w:p>
-    <w:p>
-      <w:pPr>
-        <w:pStyle w:val="BodyText"/>
-      </w:pPr>
-      <w:r>
-        <w:t xml:space="preserve">I sit with families for a living and hand them the questions I never handed him. Ask now, I tell them. This is the right day. I believe every word of it, and I also know what it is to stand outside a door a man has decided to keep shut, and to love him enough to leave it that way. Both things are true. I spent my life being saved by my father. At the end, I had to learn that loving him didn’t mean saving him back.</w:t>
-      </w:r>
-    </w:p>
-    <w:bookmarkEnd w:id="63"/>
-    <w:bookmarkStart w:id="64" w:name="who-stays.-who-goes."/>
+    <w:bookmarkStart w:id="63" w:name="who-stays.-who-goes."/>
     <w:p>
       <w:pPr>
         <w:pStyle w:val="Heading3"/>
@@ -14097,7 +14087,7 @@
         <w:pStyle w:val="BodyText"/>
       </w:pPr>
       <w:r>
-        <w:t xml:space="preserve">I never wanted a drink. That’s the truth, and it surprised me. What I wanted was to be gone. I let the routines slip. The gym went first, and I still haven’t found my way back to it very often. I haven’t watched a Yankees game since he died. Some things are still too closely connected to him. He was always the one who told me he was proud of me. I let the phone ring, sat in rooms without being in them. I’d get in the car and drive with no destination, park somewhere and cry, then drive some more. Sometimes I’d end up asleep on a couch in the lobby of a hotel where I wasn’t a guest. Numb. When I wasn’t driving the car I was working on it, hours at a time, jobs it didn’t need. What I needed, I kept telling myself, was to be alone. I’d write some and sleep. Some of the pages in this book come from those weeks, and I look back at them now and I’m not sure how I managed any of it. These chapters were the hardest for me to write. I was there, and it was so painful that writing it meant living it twice. The hospice job was still new, I was still learning it, and I kept going to it anyway through all of this. I couldn’t tell you how. Hope never knew where I was. When I came home she’d ask, and the honest answer was nowhere. Disappearing, on a woman whose oldest wound is being left.</w:t>
+        <w:t xml:space="preserve">I never wanted a drink. That surprised me. What I wanted was to be gone. I let the routines slip. The gym went first, and I still haven’t found my way back to it very often. I haven’t watched a Yankees game since he died. Some things are still too closely connected to him. He was always the one who told me he was proud of me. I let the phone ring, sat in rooms without being in them. I’d get in the car and drive with no destination, park somewhere and cry, then drive some more. Sometimes I’d end up asleep on a couch in the lobby of a hotel where I wasn’t a guest. Numb. When I wasn’t driving the car I was working on it, hours at a time, jobs it didn’t need. What I needed, I kept telling myself, was to be alone. I’d write some and sleep. Some of the pages in this book come from those weeks, and I look back at them now and I’m not sure how I managed any of it. These chapters were the hardest for me to write. I was there, and it was so painful that writing it meant living it twice. The hospice job was still new, I was still learning it, and I kept going to it anyway through all of this. I couldn’t tell you how. Hope never knew where I was. When I came home she’d ask, and the honest answer was nowhere. Disappearing, on a woman whose oldest wound is being left.</w:t>
       </w:r>
     </w:p>
     <w:p>
@@ -14432,8 +14422,86 @@
         <w:t xml:space="preserve">It was no longer about work. Two people at a round table, one of them grieving and the other choosing to stay in the room for it. We hugged. I gave her a kiss on the cheek. From that day on I’ve looked forward to the days I get to see Linda. For the person, not the place. The other staff joke about it, oh, you always come in and kiss Linda on the cheek. They don’t know the background, don’t know what was shared at that table the Wednesday after we buried my father. That’s fine. Not every connection needs an audience. As a rep, I’m the one who’s supposed to bring the chocolate and the goodies. When I go see Linda, I’m the one who feels taken care of. She gives me cookies. She checks in. The relationship runs backwards from the job description. Linda gave me a moment, three workdays after the funeral, at a round table, to stop holding it together. I’ll carry that.</w:t>
       </w:r>
     </w:p>
+    <w:bookmarkEnd w:id="63"/>
+    <w:bookmarkStart w:id="64" w:name="lisas-table"/>
+    <w:p>
+      <w:pPr>
+        <w:pStyle w:val="Heading3"/>
+      </w:pPr>
+      <w:r>
+        <w:rPr>
+          <w:iCs/>
+          <w:i/>
+        </w:rPr>
+        <w:t xml:space="preserve">Lisa’s Table</w:t>
+      </w:r>
+    </w:p>
+    <w:p>
+      <w:pPr>
+        <w:pStyle w:val="FirstParagraph"/>
+      </w:pPr>
+      <w:r>
+        <w:t xml:space="preserve">My father was the gravity that held the family together. When he died, that gravity went with him, and I waited for everything to fly apart. We haven’t. The reason is my sister Lisa, and a table she has been setting for as long as I can remember.</w:t>
+      </w:r>
+    </w:p>
+    <w:p>
+      <w:pPr>
+        <w:pStyle w:val="BodyText"/>
+      </w:pPr>
+      <w:r>
+        <w:t xml:space="preserve">A stranger had set a place for me at one table. There was another, older one waiting back home. Lisa has Thanksgiving at her house every year. Every year. She sets the table, cooks the meal, opens the door, the way my nana did it, same recipes, same dishes. There’s a stubbornness required to keep a tradition alive when the person who started it is gone.</w:t>
+      </w:r>
+    </w:p>
+    <w:p>
+      <w:pPr>
+        <w:pStyle w:val="BodyText"/>
+      </w:pPr>
+      <w:r>
+        <w:t xml:space="preserve">Hope and I can’t make it every year. We come from two divorced families, and splitting the holidays is brutal. But the table is always there. That’s Lisa.</w:t>
+      </w:r>
+    </w:p>
+    <w:p>
+      <w:pPr>
+        <w:pStyle w:val="BodyText"/>
+      </w:pPr>
+      <w:r>
+        <w:t xml:space="preserve">That table has seen every version of me. For years, in active addiction, I’d show up to Thanksgiving and end up passed out on her couch, dead to the world, sprawled across the whole thing so nobody else could lie down. It turned into a running joke that outlived the using, get to the couch before Rob does. I can laugh at it now because of how she handled it then. Lisa never shamed me for it. She set a plate for the worst version of me and loved me anyway, no lecture, just a place at the table and a couch I’d hog. She always told me I had a place to come to, no matter what. In those years there weren’t many people left in my corner. She was one of them. She stayed proud to call me her brother long before I could see why. I’ve been back plenty of sober years since, no passing out, but the joke stuck, the way the good ones do.</w:t>
+      </w:r>
+    </w:p>
+    <w:p>
+      <w:pPr>
+        <w:pStyle w:val="BodyText"/>
+      </w:pPr>
+      <w:r>
+        <w:t xml:space="preserve">And every year there was the Turkey Bowl, Auburn against Alabama, her house split right down the middle, a room full of people who loved each other hollering at the same screen for opposite reasons. That was the table too.</w:t>
+      </w:r>
+    </w:p>
+    <w:p>
+      <w:pPr>
+        <w:pStyle w:val="BodyText"/>
+      </w:pPr>
+      <w:r>
+        <w:t xml:space="preserve">It wasn’t only Lisa’s table. In our family, nobody said love out loud. They cooked it. My mother outside the weigh-ins with Wendy’s chicken sandwiches the second I made weight. Nancey in Boca Raton, keeping whipped cream in the house because banana cream pie was my favorite, making me chicken parm for no occasion at all, feeding a nephew who’d shown up at her door with nowhere better to go and not asking him anything a pie couldn’t answer. I have eaten my way back to belonging at more tables than I can count, and not one of them ever handed me a bill.</w:t>
+      </w:r>
+    </w:p>
+    <w:p>
+      <w:pPr>
+        <w:pStyle w:val="BodyText"/>
+      </w:pPr>
+      <w:r>
+        <w:t xml:space="preserve">The first Thanksgiving without him hasn’t come yet. When it does, I know whose house it will be at, and I know the table will be set.</w:t>
+      </w:r>
+    </w:p>
+    <w:p>
+      <w:pPr>
+        <w:pStyle w:val="BodyText"/>
+      </w:pPr>
+      <w:r>
+        <w:t xml:space="preserve">I think about a night long ago when she cooked meatloaf for two boys who didn’t make it easy. She’s still standing at the counter. Still opening the door. The last time I was there for Thanksgiving, my father was still alive. I stood in her kitchen a minute before we sat down. I didn’t say anything. I just watched, and thought about how the people who hold families together don’t usually get thanked for it. They just keep doing it. Year after year. We sat down. Someone said grace. The food was passed. And for a few hours everything had a center. Lisa made sure of that.</w:t>
+      </w:r>
+    </w:p>
     <w:bookmarkEnd w:id="64"/>
-    <w:bookmarkStart w:id="65" w:name="lisas-table"/>
+    <w:bookmarkStart w:id="65" w:name="the-floor"/>
     <w:p>
       <w:pPr>
         <w:pStyle w:val="Heading3"/>
@@ -14443,7 +14511,7 @@
           <w:iCs/>
           <w:i/>
         </w:rPr>
-        <w:t xml:space="preserve">Lisa’s Table</w:t>
+        <w:t xml:space="preserve">The Floor</w:t>
       </w:r>
     </w:p>
     <w:p>
@@ -14451,90 +14519,12 @@
         <w:pStyle w:val="FirstParagraph"/>
       </w:pPr>
       <w:r>
-        <w:t xml:space="preserve">My father was the gravity that held the family together. When he died, that gravity went with him, and I waited for everything to fly apart. We haven’t. The reason is my sister Lisa, and a table she has been setting for as long as I can remember.</w:t>
-      </w:r>
-    </w:p>
-    <w:p>
-      <w:pPr>
-        <w:pStyle w:val="BodyText"/>
-      </w:pPr>
-      <w:r>
-        <w:t xml:space="preserve">A stranger had set a place for me at one table. There was another, older one waiting back home. Lisa has Thanksgiving at her house every year. Every year. She sets the table, cooks the meal, opens the door, the way my nana did it, same recipes, same dishes. There’s a stubbornness required to keep a tradition alive when the person who started it is gone.</w:t>
-      </w:r>
-    </w:p>
-    <w:p>
-      <w:pPr>
-        <w:pStyle w:val="BodyText"/>
-      </w:pPr>
-      <w:r>
-        <w:t xml:space="preserve">Hope and I can’t make it every year. We come from two divorced families, and splitting the holidays is brutal. But the table is always there. That’s Lisa.</w:t>
-      </w:r>
-    </w:p>
-    <w:p>
-      <w:pPr>
-        <w:pStyle w:val="BodyText"/>
-      </w:pPr>
-      <w:r>
-        <w:t xml:space="preserve">That table has seen every version of me. For years, in active addiction, I’d show up to Thanksgiving and end up passed out on her couch, dead to the world, sprawled across the whole thing so nobody else could lie down. It turned into a running joke that outlived the using, get to the couch before Rob does. I can laugh at it now because of how she handled it then. Lisa never shamed me for it. She set a plate for the worst version of me and loved me anyway, no lecture, just a place at the table and a couch I’d hog. She always told me I had a place to come to, no matter what. In those years there weren’t many people left in my corner. She was one of them. She stayed proud to call me her brother long before I could see why. I’ve been back plenty of sober years since, no passing out, but the joke stuck, the way the good ones do.</w:t>
-      </w:r>
-    </w:p>
-    <w:p>
-      <w:pPr>
-        <w:pStyle w:val="BodyText"/>
-      </w:pPr>
-      <w:r>
-        <w:t xml:space="preserve">And every year there was the Turkey Bowl, Auburn against Alabama, her house split right down the middle, a room full of people who loved each other hollering at the same screen for opposite reasons. That was the table too.</w:t>
-      </w:r>
-    </w:p>
-    <w:p>
-      <w:pPr>
-        <w:pStyle w:val="BodyText"/>
-      </w:pPr>
-      <w:r>
-        <w:t xml:space="preserve">It wasn’t only Lisa’s table. In our family, nobody said love out loud. They cooked it. My mother outside the weigh-ins with Wendy’s chicken sandwiches the second I made weight. Nancey in Boca Raton, keeping whipped cream in the house because banana cream pie was my favorite, making me chicken parm for no occasion at all, feeding a nephew who’d shown up at her door with nowhere better to go and not asking him anything a pie couldn’t answer. I have eaten my way back to belonging at more tables than I can count, and not one of them ever handed me a bill.</w:t>
-      </w:r>
-    </w:p>
-    <w:p>
-      <w:pPr>
-        <w:pStyle w:val="BodyText"/>
-      </w:pPr>
-      <w:r>
-        <w:t xml:space="preserve">The first Thanksgiving without him hasn’t come yet. When it does, I know whose house it will be at, and I know the table will be set.</w:t>
-      </w:r>
-    </w:p>
-    <w:p>
-      <w:pPr>
-        <w:pStyle w:val="BodyText"/>
-      </w:pPr>
-      <w:r>
-        <w:t xml:space="preserve">I think about a night long ago when she cooked meatloaf for two boys who didn’t make it easy. She’s still standing at the counter. Still opening the door. The last time I was there for Thanksgiving, my father was still alive. I stood in her kitchen a minute before we sat down. I didn’t say anything. I just watched, and thought about how the people who hold families together don’t usually get thanked for it. They just keep doing it. Year after year. We sat down. Someone said grace. The food was passed. And for a few hours everything had a center. Lisa made sure of that.</w:t>
+        <w:t xml:space="preserve">Almost every morning for fifteen years, my phone has rung early and it’s Mager, or I’ve called him first, and we pray. A few plain sentences to start the day pointed the right way. Nothing eloquent. Two sober men on a phone line, saying thank you, asking for help, hanging up, going to work. People ask me where God was in all of it, and the honest answer is that He was never the one who left. I was. I still can’t explain God on paper, and I’ve stopped trying. What I can tell you is that every time I hit the bottom of myself, something I had not put there was holding the floor. Today my faith doesn’t look like certainty. It looks like that morning call. A red bird on a mirror. Walking into a dying stranger’s room with nothing useful in my hands and trusting that presence is its own kind of prayer. I stopped needing the theology airtight. I just needed to stay in the room, and to let myself be shown up for. That, as much as anything, is what got me here.</w:t>
       </w:r>
     </w:p>
     <w:bookmarkEnd w:id="65"/>
-    <w:bookmarkStart w:id="66" w:name="the-floor"/>
-    <w:p>
-      <w:pPr>
-        <w:pStyle w:val="Heading3"/>
-      </w:pPr>
-      <w:r>
-        <w:rPr>
-          <w:iCs/>
-          <w:i/>
-        </w:rPr>
-        <w:t xml:space="preserve">The Floor</w:t>
-      </w:r>
-    </w:p>
-    <w:p>
-      <w:pPr>
-        <w:pStyle w:val="FirstParagraph"/>
-      </w:pPr>
-      <w:r>
-        <w:t xml:space="preserve">Almost every morning for fifteen years, my phone has rung early and it’s Mager, or I’ve called him first, and we pray. A few plain sentences to start the day pointed the right way. Nothing eloquent. Two sober men on a phone line, saying thank you, asking for help, hanging up, going to work. People ask me where God was in all of it, and the honest answer is that He was never the one who left. I was. I still can’t explain God on paper, and I’ve stopped trying. What I can tell you is that every time I hit the bottom of myself, something I had not put there was holding the floor. Today my faith doesn’t look like certainty. It looks like that morning call. A red bird on a mirror. Walking into a dying stranger’s room with nothing useful in my hands and trusting that presence is its own kind of prayer. I stopped needing the theology airtight. I just needed to stay in the room, and to let myself be shown up for. That, as much as anything, is what got me here.</w:t>
-      </w:r>
-    </w:p>
     <w:bookmarkEnd w:id="66"/>
-    <w:bookmarkEnd w:id="67"/>
-    <w:bookmarkStart w:id="68" w:name="epilogue-the-cardinals-promise"/>
+    <w:bookmarkStart w:id="67" w:name="epilogue-the-cardinals-promise"/>
     <w:p>
       <w:pPr>
         <w:pStyle w:val="Heading1"/>
@@ -14636,6 +14626,14 @@
         <w:pStyle w:val="BodyText"/>
       </w:pPr>
       <w:r>
+        <w:t xml:space="preserve">The last time a cardinal landed on something I was riding in, he was at the wheel of a U-Haul and I was in no shape to notice. Grandma’s looking out for us. He’d said it the way he said most true things, lightly, and moved on.</w:t>
+      </w:r>
+    </w:p>
+    <w:p>
+      <w:pPr>
+        <w:pStyle w:val="BodyText"/>
+      </w:pPr>
+      <w:r>
         <w:t xml:space="preserve">Dad, I say out loud. Alone in the car. Just his name. And then the words he and I mostly lived instead of spoke. I love you. Not because it went unsaid between us — it didn’t. Before the end he’d looked at me and told me, Rob, don’t worry about me. We’re good. When my father said we’re good, that was the whole of it: I love you, and I have closure with you. He never needed the sentence. But you don’t run out of wanting to say it to a man you can’t call anymore. I love you. The cardinal doesn’t move. Dad, I love you. I know you’re watching out for me.</w:t>
       </w:r>
     </w:p>
@@ -14676,11 +14674,11 @@
         <w:pStyle w:val="BodyText"/>
       </w:pPr>
       <w:r>
-        <w:t xml:space="preserve">The cardinal flew off into the gray. It has never landed on my car again. The promise remains. It was never in the bird. It was in what Lou built in me, across forty years of chosen love and stubborn presence. Now it’s my turn. Keep showing up. Keep choosing love.</w:t>
-      </w:r>
-    </w:p>
-    <w:bookmarkEnd w:id="68"/>
-    <w:bookmarkStart w:id="69" w:name="for-those-walking-this-road"/>
+        <w:t xml:space="preserve">The cardinal flew off into the gray. It has never landed on my car again. The promise remains. He made it on a U-Haul out of West Palm Beach without knowing he was making one: the people who loved you don’t stop looking out for you. It was never in the bird. It was in what Lou built in me, across forty years of chosen love and stubborn presence. Now it’s my turn. Keep showing up. Keep choosing love.</w:t>
+      </w:r>
+    </w:p>
+    <w:bookmarkEnd w:id="67"/>
+    <w:bookmarkStart w:id="68" w:name="the-rooms-1"/>
     <w:p>
       <w:pPr>
         <w:pStyle w:val="Heading1"/>
@@ -14690,7 +14688,7 @@
           <w:bCs/>
           <w:b/>
         </w:rPr>
-        <w:t xml:space="preserve">FOR THOSE WALKING THIS ROAD</w:t>
+        <w:t xml:space="preserve">THE ROOMS</w:t>
       </w:r>
     </w:p>
     <w:p>
@@ -14702,27 +14700,99 @@
           <w:iCs/>
           <w:i/>
         </w:rPr>
-        <w:t xml:space="preserve">The story ends with the cardinal. What follows are extended reflections for the road still ahead — for anyone loving an addict, anyone sitting with someone near the end, and anyone learning how to stay. Take what serves you. Leave the rest.</w:t>
-      </w:r>
-    </w:p>
-    <w:p>
-      <w:pPr>
-        <w:pStyle w:val="BodyText"/>
-      </w:pPr>
-      <w:r>
-        <w:t xml:space="preserve">If you’re the one in the fight and nobody is coming for you: the rooms are full of men like Lou. Mine found me there. Walk in and let yours find you.</w:t>
-      </w:r>
-    </w:p>
-    <w:p>
-      <w:pPr>
-        <w:pStyle w:val="BodyText"/>
-      </w:pPr>
-      <w:r>
-        <w:t xml:space="preserve">If you’re reading this in recovery, from addiction, from loss, from a version of yourself that no longer serves the life you’re trying to build, the broken parts of your story don’t disqualify you from purpose. They prepare you for it. If you’re grieving someone you lost: if the important things were said before the end required them, you were present. And if you’re sitting with an aging parent right now, putting off the hard conversation, waiting for a better time: there’s no better time. Say the great things while they can still hear you. On a Tuesday. At dinner. On a phone call that feels ordinary. Presence is built across years.</w:t>
-      </w:r>
-    </w:p>
-    <w:bookmarkEnd w:id="69"/>
-    <w:bookmarkStart w:id="70" w:name="a-note-to-the-one-who-loves-an-addict"/>
+        <w:t xml:space="preserve">For Dale Perkins, and for Cardascia</w:t>
+      </w:r>
+    </w:p>
+    <w:p>
+      <w:pPr>
+        <w:pStyle w:val="BodyText"/>
+      </w:pPr>
+      <w:r>
+        <w:t xml:space="preserve">When I moved out of my father’s house I needed somewhere to live where I could still save. Dale Perkins rented me a room for five hundred a month, utilities included. That was the whole arrangement, and it explains nothing about what came after.</w:t>
+      </w:r>
+    </w:p>
+    <w:p>
+      <w:pPr>
+        <w:pStyle w:val="BodyText"/>
+      </w:pPr>
+      <w:r>
+        <w:t xml:space="preserve">Dale is a licensed clinical therapist and an alcoholic, and he is the least judgmental man I have ever met. He was built to do that job. Nothing I brought him made him flinch. I lived in that house about three years, until the Mirador. We fished. We went to meetings. We watched</w:t>
+      </w:r>
+      <w:r>
+        <w:t xml:space="preserve"> </w:t>
+      </w:r>
+      <w:r>
+        <w:rPr>
+          <w:iCs/>
+          <w:i/>
+        </w:rPr>
+        <w:t xml:space="preserve">The Walking Dead</w:t>
+      </w:r>
+      <w:r>
+        <w:t xml:space="preserve"> </w:t>
+      </w:r>
+      <w:r>
+        <w:t xml:space="preserve">like it was appointment television.</w:t>
+      </w:r>
+    </w:p>
+    <w:p>
+      <w:pPr>
+        <w:pStyle w:val="BodyText"/>
+      </w:pPr>
+      <w:r>
+        <w:t xml:space="preserve">Back in 2011 he had a cough that wouldn’t quit. They told him it was allergies.</w:t>
+      </w:r>
+    </w:p>
+    <w:p>
+      <w:pPr>
+        <w:pStyle w:val="BodyText"/>
+      </w:pPr>
+      <w:r>
+        <w:t xml:space="preserve">As I was finishing this book, I got the call. Dale is on hospice with mesothelioma, and they don’t think he has a month. It knocked me down, and not because of what he did for me. Because of who he is.</w:t>
+      </w:r>
+    </w:p>
+    <w:p>
+      <w:pPr>
+        <w:pStyle w:val="BodyText"/>
+      </w:pPr>
+      <w:r>
+        <w:t xml:space="preserve">I called him. I cried, and I told him I loved him, and he said it back. That’s the power of the program.</w:t>
+      </w:r>
+    </w:p>
+    <w:p>
+      <w:pPr>
+        <w:pStyle w:val="BodyText"/>
+      </w:pPr>
+      <w:r>
+        <w:t xml:space="preserve">There’s another seat in those rooms. Cardascia and I had been friends since we were seventeen years old. He lost his fight with addiction in 2025. He never quit trying, and that’s the part I won’t let anyone forget. The disease tells you a man who goes back out is a failure. The rooms know better. He kept walking back in, every time, wanting to stop. That’s not weakness. That’s a fighter losing to something that kills fighters.</w:t>
+      </w:r>
+    </w:p>
+    <w:p>
+      <w:pPr>
+        <w:pStyle w:val="BodyText"/>
+      </w:pPr>
+      <w:r>
+        <w:t xml:space="preserve">I’m seventeen years sober and I’m not one bit safer than he was. None of us are. The only difference between his seat and mine is one day at a time.</w:t>
+      </w:r>
+    </w:p>
+    <w:p>
+      <w:pPr>
+        <w:pStyle w:val="BodyText"/>
+      </w:pPr>
+      <w:r>
+        <w:t xml:space="preserve">One chair is empty and one won’t be for long, and the only thing any of us can do about either is what the two of them did: show up. Go to a meeting this week, even if you’re good. Especially if you’re not. Call somebody. If today’s got you scared, say it out loud to one of us. That’s what the rooms are for. If you’re the one in the fight and nobody is coming for you: the rooms are full of men like Lou. Mine found me there. Walk in and let yours find you.</w:t>
+      </w:r>
+    </w:p>
+    <w:p>
+      <w:pPr>
+        <w:pStyle w:val="BodyText"/>
+      </w:pPr>
+      <w:r>
+        <w:t xml:space="preserve">Rest easy, Cardascia. We’ll keep the seat warm and the coffee bad.</w:t>
+      </w:r>
+    </w:p>
+    <w:bookmarkEnd w:id="68"/>
+    <w:bookmarkStart w:id="69" w:name="a-note-to-the-one-who-loves-an-addict"/>
     <w:p>
       <w:pPr>
         <w:pStyle w:val="Heading1"/>
@@ -14756,14 +14826,6 @@
         <w:pStyle w:val="BodyText"/>
       </w:pPr>
       <w:r>
-        <w:t xml:space="preserve">There’s an old line they teach in the rooms where families go, and only from the other side of it did I see how true it is. You didn’t cause it. You can’t control it. You can’t cure it. Three sentences, every one of them a mercy, because all three say the same thing: this was never yours to fix.</w:t>
-      </w:r>
-    </w:p>
-    <w:p>
-      <w:pPr>
-        <w:pStyle w:val="BodyText"/>
-      </w:pPr>
-      <w:r>
         <w:t xml:space="preserve">I know you’ve tried. I know you’ve lain awake turning someone else’s life over and over, looking for the thing you missed. I was the person on the other end of those nights. My mother wired me money she told herself was for rent. My father drove a truck across the state to haul me home. None of it made me stop. Not because they failed. Because it wasn’t theirs to win. But hear the other half, because it’s just as true: none of it was wasted either. Every one of those rescues bought time, and time was the only thing that could still help me. You cannot make them stop. You can help them live until they do.</w:t>
       </w:r>
     </w:p>
@@ -14791,16 +14853,8 @@
         <w:t xml:space="preserve">What you can do is stay. Not fix, not control, not cure. Stay. Set the boundary that keeps you whole, leave the door open a crack, and be there in the ways that don’t cost you your own life. If you are not safe, the boundary is distance — my mother saved two boys by leaving.</w:t>
       </w:r>
     </w:p>
-    <w:p>
-      <w:pPr>
-        <w:pStyle w:val="BodyText"/>
-      </w:pPr>
-      <w:r>
-        <w:t xml:space="preserve">So now you know how I know. One promise was all I had to offer — to tell you the truth the whole way through — and I’ve kept it as well as I know how. There’s one more page, and it belongs to the rooms.</w:t>
-      </w:r>
-    </w:p>
-    <w:bookmarkEnd w:id="70"/>
-    <w:bookmarkStart w:id="71" w:name="the-rooms-1"/>
+    <w:bookmarkEnd w:id="69"/>
+    <w:bookmarkStart w:id="70" w:name="lous-way"/>
     <w:p>
       <w:pPr>
         <w:pStyle w:val="Heading1"/>
@@ -14810,7 +14864,7 @@
           <w:bCs/>
           <w:b/>
         </w:rPr>
-        <w:t xml:space="preserve">THE ROOMS</w:t>
+        <w:t xml:space="preserve">LOU’S WAY</w:t>
       </w:r>
     </w:p>
     <w:p>
@@ -14818,103 +14872,83 @@
         <w:pStyle w:val="FirstParagraph"/>
       </w:pPr>
       <w:r>
-        <w:rPr>
-          <w:iCs/>
-          <w:i/>
-        </w:rPr>
-        <w:t xml:space="preserve">For Dale Perkins, and for Cardascia</w:t>
-      </w:r>
-    </w:p>
-    <w:p>
-      <w:pPr>
-        <w:pStyle w:val="BodyText"/>
-      </w:pPr>
-      <w:r>
-        <w:t xml:space="preserve">When I moved out of my father’s house I needed somewhere to live where I could still save. Dale Perkins rented me a room for five hundred a month, utilities included. That was the whole arrangement, and it explains nothing about what came after.</w:t>
-      </w:r>
-    </w:p>
-    <w:p>
-      <w:pPr>
-        <w:pStyle w:val="BodyText"/>
-      </w:pPr>
-      <w:r>
-        <w:t xml:space="preserve">Dale is a licensed clinical therapist and an alcoholic, and he is the least judgmental man I have ever met. He was built to do that job. Nothing I brought him made him flinch. I lived in that house about three years, until the Mirador. We fished. We went to meetings. We watched</w:t>
-      </w:r>
-      <w:r>
-        <w:t xml:space="preserve"> </w:t>
-      </w:r>
-      <w:r>
-        <w:rPr>
-          <w:iCs/>
-          <w:i/>
-        </w:rPr>
-        <w:t xml:space="preserve">The Walking Dead</w:t>
-      </w:r>
-      <w:r>
-        <w:t xml:space="preserve"> </w:t>
-      </w:r>
-      <w:r>
-        <w:t xml:space="preserve">like it was appointment television.</w:t>
-      </w:r>
-    </w:p>
-    <w:p>
-      <w:pPr>
-        <w:pStyle w:val="BodyText"/>
-      </w:pPr>
-      <w:r>
-        <w:t xml:space="preserve">Back in 2011 he had a cough that wouldn’t quit. They told him it was allergies.</w:t>
-      </w:r>
-    </w:p>
-    <w:p>
-      <w:pPr>
-        <w:pStyle w:val="BodyText"/>
-      </w:pPr>
-      <w:r>
-        <w:t xml:space="preserve">I got the call last week. Dale is on hospice with mesothelioma, and they don’t think he has a month. It knocked me down, and not because of what he did for me. Because of who he is.</w:t>
-      </w:r>
-    </w:p>
-    <w:p>
-      <w:pPr>
-        <w:pStyle w:val="BodyText"/>
-      </w:pPr>
-      <w:r>
-        <w:t xml:space="preserve">I called him. I cried, and I told him I loved him, and he said it back. That’s the power of the program.</w:t>
-      </w:r>
-    </w:p>
-    <w:p>
-      <w:pPr>
-        <w:pStyle w:val="BodyText"/>
-      </w:pPr>
-      <w:r>
-        <w:t xml:space="preserve">There’s another seat in those rooms. Cardascia and I had been friends since we were seventeen years old. He lost his fight with addiction last year. He never quit trying, and that’s the part I won’t let anyone forget. The disease tells you a man who goes back out is a failure. The rooms know better. He kept walking back in, every time, wanting to stop. That’s not weakness. That’s a fighter losing to something that kills fighters.</w:t>
-      </w:r>
-    </w:p>
-    <w:p>
-      <w:pPr>
-        <w:pStyle w:val="BodyText"/>
-      </w:pPr>
-      <w:r>
-        <w:t xml:space="preserve">I’m seventeen years sober and I’m not one bit safer than he was. None of us are. The only difference between his seat and mine is one day at a time.</w:t>
-      </w:r>
-    </w:p>
-    <w:p>
-      <w:pPr>
-        <w:pStyle w:val="BodyText"/>
-      </w:pPr>
-      <w:r>
-        <w:t xml:space="preserve">One chair is empty and one won’t be for long, and the only thing any of us can do about either is what the two of them did: show up. Go to a meeting this week, even if you’re good. Especially if you’re not. Call somebody. If today’s got you scared, say it out loud to one of us. That’s what the rooms are for.</w:t>
-      </w:r>
-    </w:p>
-    <w:p>
-      <w:pPr>
-        <w:pStyle w:val="BodyText"/>
-      </w:pPr>
-      <w:r>
-        <w:t xml:space="preserve">Rest easy, Cardascia. We’ll keep the seat warm and the coffee bad.</w:t>
-      </w:r>
-    </w:p>
-    <w:bookmarkEnd w:id="71"/>
-    <w:bookmarkStart w:id="72" w:name="lous-way"/>
+        <w:t xml:space="preserve">Not things he said. Things he did, distilled. If you asked me what Lou knew, this is it.</w:t>
+      </w:r>
+    </w:p>
+    <w:p>
+      <w:pPr>
+        <w:pStyle w:val="BodyText"/>
+      </w:pPr>
+      <w:r>
+        <w:t xml:space="preserve">He showed up before he explained.</w:t>
+      </w:r>
+    </w:p>
+    <w:p>
+      <w:pPr>
+        <w:pStyle w:val="BodyText"/>
+      </w:pPr>
+      <w:r>
+        <w:t xml:space="preserve">He helped without keeping score.</w:t>
+      </w:r>
+    </w:p>
+    <w:p>
+      <w:pPr>
+        <w:pStyle w:val="BodyText"/>
+      </w:pPr>
+      <w:r>
+        <w:t xml:space="preserve">He believed love was proven in repetition.</w:t>
+      </w:r>
+    </w:p>
+    <w:p>
+      <w:pPr>
+        <w:pStyle w:val="BodyText"/>
+      </w:pPr>
+      <w:r>
+        <w:t xml:space="preserve">He never confused disappointment with abandonment.</w:t>
+      </w:r>
+    </w:p>
+    <w:p>
+      <w:pPr>
+        <w:pStyle w:val="BodyText"/>
+      </w:pPr>
+      <w:r>
+        <w:t xml:space="preserve">He respected people who knew how to do their job.</w:t>
+      </w:r>
+    </w:p>
+    <w:p>
+      <w:pPr>
+        <w:pStyle w:val="BodyText"/>
+      </w:pPr>
+      <w:r>
+        <w:t xml:space="preserve">He could enjoy the game even when the season was lost.</w:t>
+      </w:r>
+    </w:p>
+    <w:p>
+      <w:pPr>
+        <w:pStyle w:val="BodyText"/>
+      </w:pPr>
+      <w:r>
+        <w:t xml:space="preserve">He still wanted to be useful, all the way to the end.</w:t>
+      </w:r>
+    </w:p>
+    <w:p>
+      <w:pPr>
+        <w:pStyle w:val="BodyText"/>
+      </w:pPr>
+      <w:r>
+        <w:t xml:space="preserve">He found the doorway you were willing to walk through.</w:t>
+      </w:r>
+    </w:p>
+    <w:p>
+      <w:pPr>
+        <w:pStyle w:val="BodyText"/>
+      </w:pPr>
+      <w:r>
+        <w:t xml:space="preserve">He stayed.</w:t>
+      </w:r>
+    </w:p>
+    <w:bookmarkEnd w:id="70"/>
+    <w:bookmarkStart w:id="71" w:name="authors-note"/>
     <w:p>
       <w:pPr>
         <w:pStyle w:val="Heading1"/>
@@ -14924,7 +14958,7 @@
           <w:bCs/>
           <w:b/>
         </w:rPr>
-        <w:t xml:space="preserve">LOU’S WAY</w:t>
+        <w:t xml:space="preserve">AUTHOR’S NOTE</w:t>
       </w:r>
     </w:p>
     <w:p>
@@ -14932,83 +14966,27 @@
         <w:pStyle w:val="FirstParagraph"/>
       </w:pPr>
       <w:r>
-        <w:t xml:space="preserve">Not things he said. Things he did, distilled. If you asked me what Lou knew, this is it.</w:t>
-      </w:r>
-    </w:p>
-    <w:p>
-      <w:pPr>
-        <w:pStyle w:val="BodyText"/>
-      </w:pPr>
-      <w:r>
-        <w:t xml:space="preserve">He showed up before he explained.</w:t>
-      </w:r>
-    </w:p>
-    <w:p>
-      <w:pPr>
-        <w:pStyle w:val="BodyText"/>
-      </w:pPr>
-      <w:r>
-        <w:t xml:space="preserve">He helped without keeping score.</w:t>
-      </w:r>
-    </w:p>
-    <w:p>
-      <w:pPr>
-        <w:pStyle w:val="BodyText"/>
-      </w:pPr>
-      <w:r>
-        <w:t xml:space="preserve">He believed love was proven in repetition.</w:t>
-      </w:r>
-    </w:p>
-    <w:p>
-      <w:pPr>
-        <w:pStyle w:val="BodyText"/>
-      </w:pPr>
-      <w:r>
-        <w:t xml:space="preserve">He never confused disappointment with abandonment.</w:t>
-      </w:r>
-    </w:p>
-    <w:p>
-      <w:pPr>
-        <w:pStyle w:val="BodyText"/>
-      </w:pPr>
-      <w:r>
-        <w:t xml:space="preserve">He respected people who knew how to do their job.</w:t>
-      </w:r>
-    </w:p>
-    <w:p>
-      <w:pPr>
-        <w:pStyle w:val="BodyText"/>
-      </w:pPr>
-      <w:r>
-        <w:t xml:space="preserve">He could enjoy the game even when the season was lost.</w:t>
-      </w:r>
-    </w:p>
-    <w:p>
-      <w:pPr>
-        <w:pStyle w:val="BodyText"/>
-      </w:pPr>
-      <w:r>
-        <w:t xml:space="preserve">He still wanted to be useful, all the way to the end.</w:t>
-      </w:r>
-    </w:p>
-    <w:p>
-      <w:pPr>
-        <w:pStyle w:val="BodyText"/>
-      </w:pPr>
-      <w:r>
-        <w:t xml:space="preserve">He found the doorway you were willing to walk through.</w:t>
-      </w:r>
-    </w:p>
-    <w:p>
-      <w:pPr>
-        <w:pStyle w:val="BodyText"/>
-      </w:pPr>
-      <w:r>
-        <w:t xml:space="preserve">He stayed.</w:t>
-      </w:r>
-    </w:p>
-    <w:bookmarkEnd w:id="72"/>
-    <w:bookmarkStart w:id="73" w:name="afterword"/>
+        <w:t xml:space="preserve">For most of my life I wore a mask. Moving as much as I did as a kid — Mexico to New Jersey, town to town, later across the country — taught me one trick I used everywhere: read the room, become what it wanted, and hope that version got to stay. I got good at it. I performed a life that looked like success and kept the real inventory hidden. Even sober, even happy, I managed a careful image, online and off, and I called it protection.</w:t>
+      </w:r>
+    </w:p>
+    <w:p>
+      <w:pPr>
+        <w:pStyle w:val="BodyText"/>
+      </w:pPr>
+      <w:r>
+        <w:t xml:space="preserve">Writing this book took the mask off. Putting these years on the page, the parts I was proud of and the parts I’d spent decades hiding, I found there was nothing left to protect. The fear I’d built my whole life around — that if people saw the real thing, they’d turn away — was the lie. What replaced it is quieter than relief. It’s peace. For the first time, I’m not performing Rob Brizzi. I’m just him. That is what writing this cost me, and what it gave back.</w:t>
+      </w:r>
+    </w:p>
+    <w:p>
+      <w:pPr>
+        <w:pStyle w:val="BodyText"/>
+      </w:pPr>
+      <w:r>
+        <w:t xml:space="preserve">This is a true story, told from memory. Dialogue has been reconstructed as faithfully as memory allows; it keeps the substance of what was said, if not always the exact words. Some names and identifying details have been changed to protect privacy, above all those of the patients and families I served in home health and hospice, whose hardest days deserve protection, not exposure. Where the sober men and women of the rooms appear by their real names, it is with their permission; others have been renamed. A few of the rooms I describe from my work are composites of many rooms, for the same reason. Nothing in these pages was invented to sharpen the story. My mother, who is all over this book, checked more of these memories than anyone. Whatever I still got wrong is mine.</w:t>
+      </w:r>
+    </w:p>
+    <w:bookmarkEnd w:id="71"/>
+    <w:bookmarkStart w:id="72" w:name="acknowledgments"/>
     <w:p>
       <w:pPr>
         <w:pStyle w:val="Heading1"/>
@@ -15018,7 +14996,7 @@
           <w:bCs/>
           <w:b/>
         </w:rPr>
-        <w:t xml:space="preserve">AFTERWORD</w:t>
+        <w:t xml:space="preserve">ACKNOWLEDGMENTS</w:t>
       </w:r>
     </w:p>
     <w:p>
@@ -15026,170 +15004,6 @@
         <w:pStyle w:val="FirstParagraph"/>
       </w:pPr>
       <w:r>
-        <w:t xml:space="preserve">There is a kind of wisdom that can only be earned by living through what most people spend their lives trying to avoid. Rob Brizzi has that kind of wisdom, and this book is the evidence of it.</w:t>
-      </w:r>
-    </w:p>
-    <w:p>
-      <w:pPr>
-        <w:pStyle w:val="BodyText"/>
-      </w:pPr>
-      <w:r>
-        <w:t xml:space="preserve">I have known Rob for thirty-five years, and a friendship like that gives you a long view of a man’s life. Over those years we bonded over faith, character, and a shared belief in showing up and doing right by people. I knew him long before this book, long before the wisdom in these pages had taken shape, long enough to remember the younger version of him, full of energy and loyalty, the guy who hauled a buddy’s Jeep doors around Long Beach Island in ninety-five-degree heat, no shade, just because somebody needed help moving. That was Rob being Rob. He has a servant’s heart, and he has had it from the beginning. What I did not know back then was everything going on underneath: the battles he was fighting, the identity he was trying to find, the long road that would bring him to the writing of this book.</w:t>
-      </w:r>
-    </w:p>
-    <w:p>
-      <w:pPr>
-        <w:pStyle w:val="BodyText"/>
-      </w:pPr>
-      <w:r>
-        <w:t xml:space="preserve">Rob was a serious competitor. As a wrestler in high school and college he learned something most people never do, that at the highest levels the physical is only the beginning, and the real contest is internal. He learned that hard work separates the people who merely want something from the people willing to pay the price for it. Formation like that does not leave a man. It shapes the way he meets every challenge that comes after.</w:t>
-      </w:r>
-    </w:p>
-    <w:p>
-      <w:pPr>
-        <w:pStyle w:val="BodyText"/>
-      </w:pPr>
-      <w:r>
-        <w:t xml:space="preserve">And the challenges kept coming. Rob spent years in business, where his success came from his authenticity and his ability to become an expert in whatever he was doing. He learned to listen for what people need beneath what they say they want. Those skills are foundational to this book.</w:t>
-      </w:r>
-    </w:p>
-    <w:p>
-      <w:pPr>
-        <w:pStyle w:val="BodyText"/>
-      </w:pPr>
-      <w:r>
-        <w:t xml:space="preserve">The credential that mattered most is the one that cost him the most to earn. Rob walked through the valley himself. He battled addiction. He knows what it is to be lost, to reach for something that promises relief and gives you nothing back, to hit the bottom that forces a man to look honestly at who he is. He came through that fire transformed. He stopped trying to build his worth on performance, and what he found on the other side was steadier, a deeper sense of who he was and what mattered.</w:t>
-      </w:r>
-    </w:p>
-    <w:p>
-      <w:pPr>
-        <w:pStyle w:val="BodyText"/>
-      </w:pPr>
-      <w:r>
-        <w:t xml:space="preserve">When I reconnected with Rob, it was as if no time had passed. Within minutes our conversation left both of us in tears. As I heard him talk about his father, I understood that this man has an irreplaceable calling. For years Rob has been of service to those in recovery, and he has continued that service through his work in hospice. He sits with families in what he calls the last chapter. He has been there for people in their most vulnerable moments, guiding families through conversations most of us spend a lifetime avoiding, and he does it with the full weight of his own experience as a son who was himself guided through the darkness by the steady, unconditional presence of a father who was all in.</w:t>
-      </w:r>
-    </w:p>
-    <w:p>
-      <w:pPr>
-        <w:pStyle w:val="BodyText"/>
-      </w:pPr>
-      <w:r>
-        <w:t xml:space="preserve">Lou was a father like that. He hit a hundred fly balls at Finch Park in Ramsey, drove Rob and his brother Chris to wrestling practice three nights a week, and leaned in at every turn because he wanted his boys to be the best version of themselves in every part of life. That love left a mark on Rob, and he carries it forward now, offering families the same presence his father once gave him.</w:t>
-      </w:r>
-    </w:p>
-    <w:p>
-      <w:pPr>
-        <w:pStyle w:val="BodyText"/>
-      </w:pPr>
-      <w:r>
-        <w:t xml:space="preserve">This book was written to honor that legacy. It connects Rob’s father’s story to the larger story of how we live, how we love, and how we face the end of life with honesty and grace. It takes on the conversations most people find too painful to begin, and it does so with the earned authority of a man who has had those conversations hundreds of times, with real families, at the hardest moments of a human life.</w:t>
-      </w:r>
-    </w:p>
-    <w:p>
-      <w:pPr>
-        <w:pStyle w:val="BodyText"/>
-      </w:pPr>
-      <w:r>
-        <w:t xml:space="preserve">You can trust what you have just read. Every page of this book sounds like the man I know. Rob does not have a long list of titles after his name, and he has never needed one. He has done the harder thing. He has lived it. He has wrestled, literally and figuratively, with the hardest questions of identity, suffering, and meaning. He has served in the places most people are afraid to go, and he has come out of them with something worth saying.</w:t>
-      </w:r>
-    </w:p>
-    <w:p>
-      <w:pPr>
-        <w:pStyle w:val="BodyText"/>
-      </w:pPr>
-      <w:r>
-        <w:t xml:space="preserve">So here is the invitation Rob extends to you in these pages. What would it look like if your life were not just for yourself? What would it look like to give your life to the people around you, especially in their hardest moments? This is not a call to perfection. It is a call to show up for the people who are yours to love, with everything you have. Rob is the first to tell you he is a work in progress, moving closer every day to the man he wants to be.</w:t>
-      </w:r>
-    </w:p>
-    <w:p>
-      <w:pPr>
-        <w:pStyle w:val="BodyText"/>
-      </w:pPr>
-      <w:r>
-        <w:t xml:space="preserve">This book will help you do exactly that. I am grateful it exists, and I am grateful you are holding it.</w:t>
-      </w:r>
-    </w:p>
-    <w:p>
-      <w:pPr>
-        <w:pStyle w:val="BodyText"/>
-      </w:pPr>
-      <w:r>
-        <w:rPr>
-          <w:iCs/>
-          <w:i/>
-        </w:rPr>
-        <w:t xml:space="preserve">Sincerely,</w:t>
-      </w:r>
-    </w:p>
-    <w:p>
-      <w:pPr>
-        <w:pStyle w:val="BodyText"/>
-      </w:pPr>
-      <w:r>
-        <w:rPr>
-          <w:iCs/>
-          <w:i/>
-        </w:rPr>
-        <w:t xml:space="preserve">Dave Meyer, former Virginia Tech captain and NFL quarterback</w:t>
-      </w:r>
-    </w:p>
-    <w:bookmarkEnd w:id="73"/>
-    <w:bookmarkStart w:id="74" w:name="authors-note"/>
-    <w:p>
-      <w:pPr>
-        <w:pStyle w:val="Heading1"/>
-      </w:pPr>
-      <w:r>
-        <w:rPr>
-          <w:bCs/>
-          <w:b/>
-        </w:rPr>
-        <w:t xml:space="preserve">AUTHOR’S NOTE</w:t>
-      </w:r>
-    </w:p>
-    <w:p>
-      <w:pPr>
-        <w:pStyle w:val="FirstParagraph"/>
-      </w:pPr>
-      <w:r>
-        <w:t xml:space="preserve">For most of my life I wore a mask. Moving as much as I did as a kid — Mexico to New Jersey, town to town, later across the country — taught me one trick I used everywhere: read the room, become what it wanted, and hope that version got to stay. I got good at it. I performed a life that looked like success and kept the real inventory hidden. Even sober, even happy, I managed a careful image, online and off, and I called it protection.</w:t>
-      </w:r>
-    </w:p>
-    <w:p>
-      <w:pPr>
-        <w:pStyle w:val="BodyText"/>
-      </w:pPr>
-      <w:r>
-        <w:t xml:space="preserve">Writing this book took the mask off. Putting these years on the page, the parts I was proud of and the parts I’d spent decades hiding, I found there was nothing left to protect. The fear I’d built my whole life around — that if people saw the real thing, they’d turn away — was the lie. What replaced it is quieter than relief. It’s peace. For the first time, I’m not performing Rob Brizzi. I’m just him. That is what writing this cost me, and what it gave back.</w:t>
-      </w:r>
-    </w:p>
-    <w:p>
-      <w:pPr>
-        <w:pStyle w:val="BodyText"/>
-      </w:pPr>
-      <w:r>
-        <w:t xml:space="preserve">This is a true story, told from memory. Dialogue has been reconstructed as faithfully as memory allows; it keeps the substance of what was said, if not always the exact words. Some names and identifying details have been changed to protect privacy, above all those of the patients and families I served in home health and hospice, whose hardest days deserve protection, not exposure. Where the sober men and women of the rooms appear by their real names, it is with their permission; others have been renamed. A few of the rooms I describe from my work are composites of many rooms, for the same reason. Nothing in these pages was invented to sharpen the story. My mother, who is all over this book, checked more of these memories than anyone. Whatever I still got wrong is mine.</w:t>
-      </w:r>
-    </w:p>
-    <w:bookmarkEnd w:id="74"/>
-    <w:bookmarkStart w:id="75" w:name="acknowledgments"/>
-    <w:p>
-      <w:pPr>
-        <w:pStyle w:val="Heading1"/>
-      </w:pPr>
-      <w:r>
-        <w:rPr>
-          <w:bCs/>
-          <w:b/>
-        </w:rPr>
-        <w:t xml:space="preserve">ACKNOWLEDGMENTS</w:t>
-      </w:r>
-    </w:p>
-    <w:p>
-      <w:pPr>
-        <w:pStyle w:val="FirstParagraph"/>
-      </w:pPr>
-      <w:r>
         <w:t xml:space="preserve">Hope. You tilted your head, said</w:t>
       </w:r>
       <w:r>
@@ -15248,7 +15062,7 @@
         <w:pStyle w:val="BodyText"/>
       </w:pPr>
       <w:r>
-        <w:t xml:space="preserve">Dave Meyer, for thirty-five years of friendship and for the words that close this book.</w:t>
+        <w:t xml:space="preserve">Dave Meyer, for thirty-five years of friendship and for the words that open this book.</w:t>
       </w:r>
     </w:p>
     <w:p>
@@ -15299,8 +15113,8 @@
         <w:t xml:space="preserve">And Dad. I kept the promise.</w:t>
       </w:r>
     </w:p>
-    <w:bookmarkEnd w:id="75"/>
-    <w:bookmarkStart w:id="76" w:name="a-readers-guide"/>
+    <w:bookmarkEnd w:id="72"/>
+    <w:bookmarkStart w:id="73" w:name="a-readers-guide"/>
     <w:p>
       <w:pPr>
         <w:pStyle w:val="Heading1"/>
@@ -15618,8 +15432,8 @@
         <w:t xml:space="preserve">The book ends with instructions: keep showing up, say the great things while they can still hear you, walk in and let yours find you. Which instruction is yours — and when will you follow it?</w:t>
       </w:r>
     </w:p>
-    <w:bookmarkEnd w:id="76"/>
-    <w:bookmarkStart w:id="81" w:name="resources"/>
+    <w:bookmarkEnd w:id="73"/>
+    <w:bookmarkStart w:id="78" w:name="resources"/>
     <w:p>
       <w:pPr>
         <w:pStyle w:val="Heading1"/>
@@ -15648,7 +15462,7 @@
         <w:t xml:space="preserve">988 Suicide &amp; Crisis Lifeline. Call or text 988. Twenty-four hours a day, free and confidential. For anyone reading this in a dark place — the addiction pages, the grief pages, any of it.</w:t>
       </w:r>
     </w:p>
-    <w:bookmarkStart w:id="77" w:name="Xce803ff55fdb1e3bbbead8a1b74abb7090248b3"/>
+    <w:bookmarkStart w:id="74" w:name="Xce803ff55fdb1e3bbbead8a1b74abb7090248b3"/>
     <w:p>
       <w:pPr>
         <w:pStyle w:val="Heading3"/>
@@ -15703,141 +15517,141 @@
         <w:t xml:space="preserve">Al-Anon Family Groups. al-anon.org. For the families and friends of alcoholics. If you love someone who drinks, this one is for you, whether or not they ever get help themselves.</w:t>
       </w:r>
     </w:p>
+    <w:bookmarkEnd w:id="74"/>
+    <w:bookmarkStart w:id="75" w:name="X8df9206620c0de36db74bea783091dd4c0ba532"/>
+    <w:p>
+      <w:pPr>
+        <w:pStyle w:val="Heading3"/>
+      </w:pPr>
+      <w:r>
+        <w:rPr>
+          <w:iCs/>
+          <w:i/>
+        </w:rPr>
+        <w:t xml:space="preserve">If Someone You Love Is Near the End of Life</w:t>
+      </w:r>
+    </w:p>
+    <w:p>
+      <w:pPr>
+        <w:pStyle w:val="FirstParagraph"/>
+      </w:pPr>
+      <w:r>
+        <w:t xml:space="preserve">National Alliance for Care at Home. allianceforcareathome.org. The national organization for home health, hospice, and palliative care, formed from the two older bodies many people still know as NAHC and NHPCO. Its Find a Provider tool lists more than ten thousand agencies.</w:t>
+      </w:r>
+    </w:p>
+    <w:p>
+      <w:pPr>
+        <w:pStyle w:val="BodyText"/>
+      </w:pPr>
+      <w:r>
+        <w:t xml:space="preserve">CaringInfo. caringinfo.org. A free program of the Alliance. Plain-language guides to hospice and palliative care, caregiving, and grief, plus advance directive forms for every state in English and Spanish. The place to start when you do not know where to start.</w:t>
+      </w:r>
+    </w:p>
+    <w:p>
+      <w:pPr>
+        <w:pStyle w:val="BodyText"/>
+      </w:pPr>
+      <w:r>
+        <w:t xml:space="preserve">Hospice Foundation of America. hospicefoundation.org. 1-800-854-3402. Help understanding hospice, starting the conversation, and finding grief support after a loss.</w:t>
+      </w:r>
+    </w:p>
+    <w:p>
+      <w:pPr>
+        <w:pStyle w:val="BodyText"/>
+      </w:pPr>
+      <w:r>
+        <w:t xml:space="preserve">Get Palliative Care. getpalliativecare.org. From the Center to Advance Palliative Care. It explains palliative care, which is not the same thing as hospice, and helps you find it near you.</w:t>
+      </w:r>
+    </w:p>
+    <w:p>
+      <w:pPr>
+        <w:pStyle w:val="BodyText"/>
+      </w:pPr>
+      <w:r>
+        <w:t xml:space="preserve">Medicare Care Compare. medicare.gov/care-compare. Compare hospice providers in your area, including quality measures and family feedback.</w:t>
+      </w:r>
+    </w:p>
+    <w:bookmarkEnd w:id="75"/>
+    <w:bookmarkStart w:id="76" w:name="further-reading"/>
+    <w:p>
+      <w:pPr>
+        <w:pStyle w:val="Heading3"/>
+      </w:pPr>
+      <w:r>
+        <w:rPr>
+          <w:iCs/>
+          <w:i/>
+        </w:rPr>
+        <w:t xml:space="preserve">Further Reading</w:t>
+      </w:r>
+    </w:p>
+    <w:p>
+      <w:pPr>
+        <w:pStyle w:val="FirstParagraph"/>
+      </w:pPr>
+      <w:r>
+        <w:t xml:space="preserve">Atul Gawande,</w:t>
+      </w:r>
+      <w:r>
+        <w:t xml:space="preserve"> </w:t>
+      </w:r>
+      <w:r>
+        <w:rPr>
+          <w:iCs/>
+          <w:i/>
+        </w:rPr>
+        <w:t xml:space="preserve">Being Mortal: Medicine and What Matters in the End</w:t>
+      </w:r>
+      <w:r>
+        <w:t xml:space="preserve">.</w:t>
+      </w:r>
+    </w:p>
+    <w:p>
+      <w:pPr>
+        <w:pStyle w:val="BodyText"/>
+      </w:pPr>
+      <w:r>
+        <w:t xml:space="preserve">Ira Byock,</w:t>
+      </w:r>
+      <w:r>
+        <w:t xml:space="preserve"> </w:t>
+      </w:r>
+      <w:r>
+        <w:rPr>
+          <w:iCs/>
+          <w:i/>
+        </w:rPr>
+        <w:t xml:space="preserve">The Four Things That Matter Most</w:t>
+      </w:r>
+      <w:r>
+        <w:t xml:space="preserve">.</w:t>
+      </w:r>
+    </w:p>
+    <w:bookmarkEnd w:id="76"/>
+    <w:bookmarkStart w:id="77" w:name="a-note-on-these-resources"/>
+    <w:p>
+      <w:pPr>
+        <w:pStyle w:val="Heading3"/>
+      </w:pPr>
+      <w:r>
+        <w:rPr>
+          <w:iCs/>
+          <w:i/>
+        </w:rPr>
+        <w:t xml:space="preserve">A Note on These Resources</w:t>
+      </w:r>
+    </w:p>
+    <w:p>
+      <w:pPr>
+        <w:pStyle w:val="FirstParagraph"/>
+      </w:pPr>
+      <w:r>
+        <w:t xml:space="preserve">The phone numbers and web addresses were current when this book went to press. Organizations change. If a number stops working, search the name. None of this is medical or legal advice. It is a place to begin. One caution: stopping alcohol suddenly after heavy, steady drinking can be medically dangerous. Withdrawal can bring seizures. Let a doctor or a detox program supervise it.</w:t>
+      </w:r>
+    </w:p>
     <w:bookmarkEnd w:id="77"/>
-    <w:bookmarkStart w:id="78" w:name="X8df9206620c0de36db74bea783091dd4c0ba532"/>
-    <w:p>
-      <w:pPr>
-        <w:pStyle w:val="Heading3"/>
-      </w:pPr>
-      <w:r>
-        <w:rPr>
-          <w:iCs/>
-          <w:i/>
-        </w:rPr>
-        <w:t xml:space="preserve">If Someone You Love Is Near the End of Life</w:t>
-      </w:r>
-    </w:p>
-    <w:p>
-      <w:pPr>
-        <w:pStyle w:val="FirstParagraph"/>
-      </w:pPr>
-      <w:r>
-        <w:t xml:space="preserve">National Alliance for Care at Home. allianceforcareathome.org. The national organization for home health, hospice, and palliative care, formed from the two older bodies many people still know as NAHC and NHPCO. Its Find a Provider tool lists more than ten thousand agencies.</w:t>
-      </w:r>
-    </w:p>
-    <w:p>
-      <w:pPr>
-        <w:pStyle w:val="BodyText"/>
-      </w:pPr>
-      <w:r>
-        <w:t xml:space="preserve">CaringInfo. caringinfo.org. A free program of the Alliance. Plain-language guides to hospice and palliative care, caregiving, and grief, plus advance directive forms for every state in English and Spanish. The place to start when you do not know where to start.</w:t>
-      </w:r>
-    </w:p>
-    <w:p>
-      <w:pPr>
-        <w:pStyle w:val="BodyText"/>
-      </w:pPr>
-      <w:r>
-        <w:t xml:space="preserve">Hospice Foundation of America. hospicefoundation.org. 1-800-854-3402. Help understanding hospice, starting the conversation, and finding grief support after a loss.</w:t>
-      </w:r>
-    </w:p>
-    <w:p>
-      <w:pPr>
-        <w:pStyle w:val="BodyText"/>
-      </w:pPr>
-      <w:r>
-        <w:t xml:space="preserve">Get Palliative Care. getpalliativecare.org. From the Center to Advance Palliative Care. It explains palliative care, which is not the same thing as hospice, and helps you find it near you.</w:t>
-      </w:r>
-    </w:p>
-    <w:p>
-      <w:pPr>
-        <w:pStyle w:val="BodyText"/>
-      </w:pPr>
-      <w:r>
-        <w:t xml:space="preserve">Medicare Care Compare. medicare.gov/care-compare. Compare hospice providers in your area, including quality measures and family feedback.</w:t>
-      </w:r>
-    </w:p>
     <w:bookmarkEnd w:id="78"/>
-    <w:bookmarkStart w:id="79" w:name="further-reading"/>
-    <w:p>
-      <w:pPr>
-        <w:pStyle w:val="Heading3"/>
-      </w:pPr>
-      <w:r>
-        <w:rPr>
-          <w:iCs/>
-          <w:i/>
-        </w:rPr>
-        <w:t xml:space="preserve">Further Reading</w:t>
-      </w:r>
-    </w:p>
-    <w:p>
-      <w:pPr>
-        <w:pStyle w:val="FirstParagraph"/>
-      </w:pPr>
-      <w:r>
-        <w:t xml:space="preserve">Atul Gawande,</w:t>
-      </w:r>
-      <w:r>
-        <w:t xml:space="preserve"> </w:t>
-      </w:r>
-      <w:r>
-        <w:rPr>
-          <w:iCs/>
-          <w:i/>
-        </w:rPr>
-        <w:t xml:space="preserve">Being Mortal: Medicine and What Matters in the End</w:t>
-      </w:r>
-      <w:r>
-        <w:t xml:space="preserve">.</w:t>
-      </w:r>
-    </w:p>
-    <w:p>
-      <w:pPr>
-        <w:pStyle w:val="BodyText"/>
-      </w:pPr>
-      <w:r>
-        <w:t xml:space="preserve">Ira Byock,</w:t>
-      </w:r>
-      <w:r>
-        <w:t xml:space="preserve"> </w:t>
-      </w:r>
-      <w:r>
-        <w:rPr>
-          <w:iCs/>
-          <w:i/>
-        </w:rPr>
-        <w:t xml:space="preserve">The Four Things That Matter Most</w:t>
-      </w:r>
-      <w:r>
-        <w:t xml:space="preserve">.</w:t>
-      </w:r>
-    </w:p>
-    <w:bookmarkEnd w:id="79"/>
-    <w:bookmarkStart w:id="80" w:name="a-note-on-these-resources"/>
-    <w:p>
-      <w:pPr>
-        <w:pStyle w:val="Heading3"/>
-      </w:pPr>
-      <w:r>
-        <w:rPr>
-          <w:iCs/>
-          <w:i/>
-        </w:rPr>
-        <w:t xml:space="preserve">A Note on These Resources</w:t>
-      </w:r>
-    </w:p>
-    <w:p>
-      <w:pPr>
-        <w:pStyle w:val="FirstParagraph"/>
-      </w:pPr>
-      <w:r>
-        <w:t xml:space="preserve">The phone numbers and web addresses were current when this book went to press. Organizations change. If a number stops working, search the name. None of this is medical or legal advice. It is a place to begin. One caution: stopping alcohol suddenly after heavy, steady drinking can be medically dangerous. Withdrawal can bring seizures. Let a doctor or a detox program supervise it.</w:t>
-      </w:r>
-    </w:p>
-    <w:bookmarkEnd w:id="80"/>
-    <w:bookmarkEnd w:id="81"/>
-    <w:bookmarkStart w:id="82" w:name="about-the-author"/>
+    <w:bookmarkStart w:id="79" w:name="about-the-author"/>
     <w:p>
       <w:pPr>
         <w:pStyle w:val="Heading1"/>
@@ -15874,7 +15688,7 @@
         <w:t xml:space="preserve">is his first book.</w:t>
       </w:r>
     </w:p>
-    <w:bookmarkEnd w:id="82"/>
+    <w:bookmarkEnd w:id="79"/>
     <w:sectPr>
       <w:footerReference w:type="default" r:id="rIdFtr1"/>
       <w:pgSz w:w="12240" w:h="15840"/>

</xml_diff>

<commit_message>
Chapter 31: bracketed placeholder scene for December 23–25, to be replaced with Rob's account; lock note added
Co-Authored-By: Claude Fable 5.1 <noreply@anthropic.com>
Claude-Session: https://claude.ai/code/session_013TTacQAr67Pe2VUwTPop1A
</commit_message>
<xml_diff>
--- a/The_Cardinals_Promise.docx
+++ b/The_Cardinals_Promise.docx
@@ -13701,15 +13701,133 @@
         <w:pStyle w:val="BodyText"/>
       </w:pPr>
       <w:r>
-        <w:t xml:space="preserve">Part of it was that my mother was in town. She has Parkinson’s now, and getting to me had cost her every ounce of energy she had. Part of it was simpler, and harder to admit. I did not want my last memory of my father to be tubes in his nose. He had been bigger than two cancers and a scare. I couldn’t let the man in that bed become the last picture I kept of him. It was selfish. I’m sorry it was that way.</w:t>
-      </w:r>
-    </w:p>
-    <w:p>
-      <w:pPr>
-        <w:pStyle w:val="BodyText"/>
-      </w:pPr>
-      <w:r>
-        <w:t xml:space="preserve">The night before Christmas, they put him on a morphine drip. He was in the hospital, on comfort care — not hospice; it went that fast. I knew what the drip meant — it’s my work. Morphine at the end doesn’t take anyone. It eases the pain and the hunger for air while the dying does what it was already doing. The drip didn’t tell me what was coming. It told me where he already was. Comfort was the assignment now. Christmas morning, I didn’t need anyone to tell me. The texting had stopped, and the silence had a shape. Then the phone rang. Chris, confirming what I already knew. Our father was gone.</w:t>
+        <w:rPr>
+          <w:iCs/>
+          <w:i/>
+        </w:rPr>
+        <w:t xml:space="preserve">[PLACEHOLDER. The scene that follows holds the shape of December 23 to 25 until Rob replaces it with what happened. The details in it are drafted from what the book already says, not from memory.]</w:t>
+      </w:r>
+    </w:p>
+    <w:p>
+      <w:pPr>
+        <w:pStyle w:val="BodyText"/>
+      </w:pPr>
+      <w:r>
+        <w:t xml:space="preserve">I called Donna back that Tuesday night, after my mother had gone to bed. I asked her the questions I ask strangers. Is he comfortable. Is he eating. Who’s with him. She answered every one, and then she went quiet, and the quiet was the part she’d been calling to say. I told her we’d be down Friday.</w:t>
+      </w:r>
+      <w:r>
+        <w:t xml:space="preserve"> </w:t>
+      </w:r>
+      <w:r>
+        <w:t xml:space="preserve">“</w:t>
+      </w:r>
+      <w:r>
+        <w:t xml:space="preserve">Okay, honey,</w:t>
+      </w:r>
+      <w:r>
+        <w:t xml:space="preserve">”</w:t>
+      </w:r>
+      <w:r>
+        <w:t xml:space="preserve"> </w:t>
+      </w:r>
+      <w:r>
+        <w:t xml:space="preserve">she said. I put the phone face down on the kitchen counter, and that is more or less where it stayed for two days.</w:t>
+      </w:r>
+    </w:p>
+    <w:p>
+      <w:pPr>
+        <w:pStyle w:val="BodyText"/>
+      </w:pPr>
+      <w:r>
+        <w:t xml:space="preserve">My mother was in town. She has Parkinson’s now, and getting to me had cost her every ounce of energy she had. Christmas Eve she sat on a stool in our kitchen with a cup of tea she’d let go cold, both hands around it to keep them still, and told Hope how my nana made the sauce. I stood there and let her. Twice she asked how Dad was doing.</w:t>
+      </w:r>
+      <w:r>
+        <w:t xml:space="preserve"> </w:t>
+      </w:r>
+      <w:r>
+        <w:t xml:space="preserve">“</w:t>
+      </w:r>
+      <w:r>
+        <w:t xml:space="preserve">Resting,</w:t>
+      </w:r>
+      <w:r>
+        <w:t xml:space="preserve">”</w:t>
+      </w:r>
+      <w:r>
+        <w:t xml:space="preserve"> </w:t>
+      </w:r>
+      <w:r>
+        <w:t xml:space="preserve">I said. It was the kind of word I hear families use, and I heard myself use it.</w:t>
+      </w:r>
+    </w:p>
+    <w:p>
+      <w:pPr>
+        <w:pStyle w:val="BodyText"/>
+      </w:pPr>
+      <w:r>
+        <w:t xml:space="preserve">Around four I went out to the car in the driveway and sat in it with the engine off. Eighteen years earlier, in the worst of it, I used to drive past his house in Pensacola, see him out front washing his car, and wave and keep going, because pulling in meant questions. I knew how to do that. I was doing it from seven hundred miles away, with a hospice badge in my bag. Hope came out and stood by the window and didn’t knock. She just stayed until I came in.</w:t>
+      </w:r>
+    </w:p>
+    <w:p>
+      <w:pPr>
+        <w:pStyle w:val="BodyText"/>
+      </w:pPr>
+      <w:r>
+        <w:t xml:space="preserve">That night, they put him on a morphine drip. Chris texted it, four words and a time. He was in the hospital, on comfort care — not hospice; it went that fast. I knew what the drip meant — it’s my work. Morphine at the end doesn’t take anyone. It eases the pain and the hunger for air while the dying does what it was already doing. The drip didn’t tell me what was coming. It told me where he already was. Comfort was the assignment now. I did not say any of that out loud in my own kitchen. I put the phone back face down. Part of the reason was simpler than I’ve made it sound, and harder to admit. I did not want my last memory of my father to be tubes in his nose. He had been bigger than two cancers and a scare. I couldn’t let the man in that bed become the last picture I kept of him. It was selfish. I’m sorry it was that way.</w:t>
+      </w:r>
+    </w:p>
+    <w:p>
+      <w:pPr>
+        <w:pStyle w:val="BodyText"/>
+      </w:pPr>
+      <w:r>
+        <w:t xml:space="preserve">Christmas morning I was up before it was light. Mager called at the usual time, and we prayed the way we always do, a few plain sentences, and I did not tell him. I looked at the phone. Nothing from Chris since the night before. The texting had stopped, and the silence had a shape. I made coffee I didn’t drink. I heard my mother’s door.</w:t>
+      </w:r>
+    </w:p>
+    <w:p>
+      <w:pPr>
+        <w:pStyle w:val="BodyText"/>
+      </w:pPr>
+      <w:r>
+        <w:t xml:space="preserve">Then the phone rang. Chris.</w:t>
+      </w:r>
+      <w:r>
+        <w:t xml:space="preserve"> </w:t>
+      </w:r>
+      <w:r>
+        <w:t xml:space="preserve">“</w:t>
+      </w:r>
+      <w:r>
+        <w:t xml:space="preserve">Rob.</w:t>
+      </w:r>
+      <w:r>
+        <w:t xml:space="preserve">”</w:t>
+      </w:r>
+      <w:r>
+        <w:t xml:space="preserve"> </w:t>
+      </w:r>
+      <w:r>
+        <w:t xml:space="preserve">He didn’t have to finish it, and he did anyway, because he’s the one who finishes things. Our father was gone.</w:t>
+      </w:r>
+    </w:p>
+    <w:p>
+      <w:pPr>
+        <w:pStyle w:val="BodyText"/>
+      </w:pPr>
+      <w:r>
+        <w:t xml:space="preserve">I don’t know how long I stood there. I went and told my mother. She reached for my hand, and hers was shaking, and for once it wasn’t the Parkinson’s. Hope had come in behind me. I went back out to the car, and this time I didn’t sit in it. I stood in the driveway on Christmas morning with the phone in my hand and nowhere to drive.</w:t>
+      </w:r>
+    </w:p>
+    <w:p>
+      <w:pPr>
+        <w:pStyle w:val="BodyText"/>
+      </w:pPr>
+      <w:r>
+        <w:rPr>
+          <w:iCs/>
+          <w:i/>
+        </w:rPr>
+        <w:t xml:space="preserve">[END PLACEHOLDER.]</w:t>
       </w:r>
     </w:p>
     <w:p>

</xml_diff>

<commit_message>
Placeholder scenes for Lou's temper (ch3) and the last breakfast (ch30), bracketed for replacement
Co-Authored-By: Claude Fable 5.1 <noreply@anthropic.com>
Claude-Session: https://claude.ai/code/session_013TTacQAr67Pe2VUwTPop1A
</commit_message>
<xml_diff>
--- a/The_Cardinals_Promise.docx
+++ b/The_Cardinals_Promise.docx
@@ -2624,6 +2624,62 @@
         <w:pStyle w:val="BodyText"/>
       </w:pPr>
       <w:r>
+        <w:rPr>
+          <w:iCs/>
+          <w:i/>
+        </w:rPr>
+        <w:t xml:space="preserve">[PLACEHOLDER. One evening of the temper, drafted to hold the place until Rob replaces it with a true one.]</w:t>
+      </w:r>
+    </w:p>
+    <w:p>
+      <w:pPr>
+        <w:pStyle w:val="BodyText"/>
+      </w:pPr>
+      <w:r>
+        <w:t xml:space="preserve">The night I remember, Chris and I had the one job we always had, which was to make sure he was up for the eleven o’clock shift. He’d come in from the lawns, eaten standing up, and gone down on the couch with the television going. We got into something upstairs. A game, an argument, I don’t remember which. When I came down for water the clock on the stove said ten to eleven, and he was still on the couch.</w:t>
+      </w:r>
+    </w:p>
+    <w:p>
+      <w:pPr>
+        <w:pStyle w:val="BodyText"/>
+      </w:pPr>
+      <w:r>
+        <w:t xml:space="preserve">I woke him. He came up off that couch already yelling. Not at me, exactly. At the clock, at the drive into the city, at the whole arrangement of his life that ran on an hour and a half of sleep and two boys remembering to look at a clock. He was loud. He knocked a chair over getting to his boots, and he didn’t pick it up. My mother came to the top of the stairs and said his name once, quietly, the way she did, and he didn’t answer her. Chris was behind me in the doorway, not moving. I stood there and took it, and I remember thinking that I had done this, that the whole night was mine.</w:t>
+      </w:r>
+    </w:p>
+    <w:p>
+      <w:pPr>
+        <w:pStyle w:val="BodyText"/>
+      </w:pPr>
+      <w:r>
+        <w:t xml:space="preserve">He was out the door in four minutes. The truck went down the street too fast. My mother picked up the chair.</w:t>
+      </w:r>
+    </w:p>
+    <w:p>
+      <w:pPr>
+        <w:pStyle w:val="BodyText"/>
+      </w:pPr>
+      <w:r>
+        <w:t xml:space="preserve">In the morning he was at the counter in a pressed shirt making our lunches. He didn’t say anything about it, and neither did I. He drove us to school. That was how it went with him. The heat came, and then it was gone, and what was left was a man packing sandwiches. I learned early that the yelling wasn’t the truth about him. The lunches were. But I also learned to read a room for the temperature before I walked into it, and I’ve never stopped.</w:t>
+      </w:r>
+    </w:p>
+    <w:p>
+      <w:pPr>
+        <w:pStyle w:val="BodyText"/>
+      </w:pPr>
+      <w:r>
+        <w:rPr>
+          <w:iCs/>
+          <w:i/>
+        </w:rPr>
+        <w:t xml:space="preserve">[END PLACEHOLDER.]</w:t>
+      </w:r>
+    </w:p>
+    <w:p>
+      <w:pPr>
+        <w:pStyle w:val="BodyText"/>
+      </w:pPr>
+      <w:r>
         <w:t xml:space="preserve">Once he decided you were his, that settled it. Lou was there early mornings and late nights, school conferences, wrestling matches, hospital waiting rooms, and church basements. He never kept a ledger of it, and he never talked about sacrifice. He just lived it.</w:t>
       </w:r>
     </w:p>
@@ -13454,7 +13510,35 @@
         <w:pStyle w:val="BodyText"/>
       </w:pPr>
       <w:r>
-        <w:t xml:space="preserve">After the move, Hope and I went down for a visit. We went to church that morning and ate with Dad before the drive back up to Raleigh. There was an opening in hospice, at a company I had already given ten years to, and at the table that morning Dad told me what he always told me.</w:t>
+        <w:t xml:space="preserve">After the move, Hope and I went down for a visit. We went to church that morning and ate with Dad before the drive back up to Raleigh.</w:t>
+      </w:r>
+    </w:p>
+    <w:p>
+      <w:pPr>
+        <w:pStyle w:val="BodyText"/>
+      </w:pPr>
+      <w:r>
+        <w:rPr>
+          <w:iCs/>
+          <w:i/>
+        </w:rPr>
+        <w:t xml:space="preserve">[PLACEHOLDER. The breakfast, drafted from what the book already says about him. Rob replaces the details with what happened.]</w:t>
+      </w:r>
+    </w:p>
+    <w:p>
+      <w:pPr>
+        <w:pStyle w:val="BodyText"/>
+      </w:pPr>
+      <w:r>
+        <w:t xml:space="preserve">He’d dressed for it. Pressed shirt, the collar standing a little off his neck now, the hair done. Donna had driven. He walked in on his own and made sure we saw that he did. The waitress knew him. She called him Mr. Lou and asked if he wanted the usual, and he said she knew he did, and for a minute he was the man who liked to be recognized in a restaurant more than he liked the food. Eggs, toast, coffee he stirred and didn’t drink much of. He ate about a third of it and pushed the plate an inch away from himself, which was as close as he came to saying he was full.</w:t>
+      </w:r>
+    </w:p>
+    <w:p>
+      <w:pPr>
+        <w:pStyle w:val="BodyText"/>
+      </w:pPr>
+      <w:r>
+        <w:t xml:space="preserve">There was an opening in hospice, at a company I had already given ten years to, and I told him about it. He listened the way he listened to anything about work, which was completely. Then he told me what he always told me.</w:t>
       </w:r>
       <w:r>
         <w:t xml:space="preserve"> </w:t>
@@ -13472,7 +13556,27 @@
         <w:t xml:space="preserve"> </w:t>
       </w:r>
       <w:r>
-        <w:t xml:space="preserve">He had put that in me a long time ago, and he said it again like it was the first time. With him, miracles had started to feel ordinary. It was the last time I saw him.</w:t>
+        <w:t xml:space="preserve">He had put that in me a long time ago, and he said it again like it was the first time.</w:t>
+      </w:r>
+    </w:p>
+    <w:p>
+      <w:pPr>
+        <w:pStyle w:val="BodyText"/>
+      </w:pPr>
+      <w:r>
+        <w:t xml:space="preserve">He left a twenty on the table. When we got up he didn’t walk us to the car. He stood inside the door with his hand flat on the glass and watched us go, and I watched him in the mirror until the turn. With him, miracles had started to feel ordinary. It was the last time I saw him.</w:t>
+      </w:r>
+    </w:p>
+    <w:p>
+      <w:pPr>
+        <w:pStyle w:val="BodyText"/>
+      </w:pPr>
+      <w:r>
+        <w:rPr>
+          <w:iCs/>
+          <w:i/>
+        </w:rPr>
+        <w:t xml:space="preserve">[END PLACEHOLDER.]</w:t>
       </w:r>
     </w:p>
     <w:bookmarkStart w:id="61" w:name="the-rooms"/>

</xml_diff>

<commit_message>
Highlight the three placeholder scenes in every build until they are replaced
Co-Authored-By: Claude Fable 5.1 <noreply@anthropic.com>
Claude-Session: https://claude.ai/code/session_013TTacQAr67Pe2VUwTPop1A
</commit_message>
<xml_diff>
--- a/The_Cardinals_Promise.docx
+++ b/The_Cardinals_Promise.docx
@@ -2627,6 +2627,7 @@
         <w:rPr>
           <w:iCs/>
           <w:i/>
+          <w:highlight w:val="yellow"/>
         </w:rPr>
         <w:t xml:space="preserve">[PLACEHOLDER. One evening of the temper, drafted to hold the place until Rob replaces it with a true one.]</w:t>
       </w:r>
@@ -2636,6 +2637,9 @@
         <w:pStyle w:val="BodyText"/>
       </w:pPr>
       <w:r>
+        <w:rPr>
+          <w:highlight w:val="yellow"/>
+        </w:rPr>
         <w:t xml:space="preserve">The night I remember, Chris and I had the one job we always had, which was to make sure he was up for the eleven o’clock shift. He’d come in from the lawns, eaten standing up, and gone down on the couch with the television going. We got into something upstairs. A game, an argument, I don’t remember which. When I came down for water the clock on the stove said ten to eleven, and he was still on the couch.</w:t>
       </w:r>
     </w:p>
@@ -2644,6 +2648,9 @@
         <w:pStyle w:val="BodyText"/>
       </w:pPr>
       <w:r>
+        <w:rPr>
+          <w:highlight w:val="yellow"/>
+        </w:rPr>
         <w:t xml:space="preserve">I woke him. He came up off that couch already yelling. Not at me, exactly. At the clock, at the drive into the city, at the whole arrangement of his life that ran on an hour and a half of sleep and two boys remembering to look at a clock. He was loud. He knocked a chair over getting to his boots, and he didn’t pick it up. My mother came to the top of the stairs and said his name once, quietly, the way she did, and he didn’t answer her. Chris was behind me in the doorway, not moving. I stood there and took it, and I remember thinking that I had done this, that the whole night was mine.</w:t>
       </w:r>
     </w:p>
@@ -2652,6 +2659,9 @@
         <w:pStyle w:val="BodyText"/>
       </w:pPr>
       <w:r>
+        <w:rPr>
+          <w:highlight w:val="yellow"/>
+        </w:rPr>
         <w:t xml:space="preserve">He was out the door in four minutes. The truck went down the street too fast. My mother picked up the chair.</w:t>
       </w:r>
     </w:p>
@@ -2660,6 +2670,9 @@
         <w:pStyle w:val="BodyText"/>
       </w:pPr>
       <w:r>
+        <w:rPr>
+          <w:highlight w:val="yellow"/>
+        </w:rPr>
         <w:t xml:space="preserve">In the morning he was at the counter in a pressed shirt making our lunches. He didn’t say anything about it, and neither did I. He drove us to school. That was how it went with him. The heat came, and then it was gone, and what was left was a man packing sandwiches. I learned early that the yelling wasn’t the truth about him. The lunches were. But I also learned to read a room for the temperature before I walked into it, and I’ve never stopped.</w:t>
       </w:r>
     </w:p>
@@ -2671,6 +2684,7 @@
         <w:rPr>
           <w:iCs/>
           <w:i/>
+          <w:highlight w:val="yellow"/>
         </w:rPr>
         <w:t xml:space="preserve">[END PLACEHOLDER.]</w:t>
       </w:r>
@@ -13521,6 +13535,7 @@
         <w:rPr>
           <w:iCs/>
           <w:i/>
+          <w:highlight w:val="yellow"/>
         </w:rPr>
         <w:t xml:space="preserve">[PLACEHOLDER. The breakfast, drafted from what the book already says about him. Rob replaces the details with what happened.]</w:t>
       </w:r>
@@ -13530,6 +13545,9 @@
         <w:pStyle w:val="BodyText"/>
       </w:pPr>
       <w:r>
+        <w:rPr>
+          <w:highlight w:val="yellow"/>
+        </w:rPr>
         <w:t xml:space="preserve">He’d dressed for it. Pressed shirt, the collar standing a little off his neck now, the hair done. Donna had driven. He walked in on his own and made sure we saw that he did. The waitress knew him. She called him Mr. Lou and asked if he wanted the usual, and he said she knew he did, and for a minute he was the man who liked to be recognized in a restaurant more than he liked the food. Eggs, toast, coffee he stirred and didn’t drink much of. He ate about a third of it and pushed the plate an inch away from himself, which was as close as he came to saying he was full.</w:t>
       </w:r>
     </w:p>
@@ -13538,24 +13556,45 @@
         <w:pStyle w:val="BodyText"/>
       </w:pPr>
       <w:r>
+        <w:rPr>
+          <w:highlight w:val="yellow"/>
+        </w:rPr>
         <w:t xml:space="preserve">There was an opening in hospice, at a company I had already given ten years to, and I told him about it. He listened the way he listened to anything about work, which was completely. Then he told me what he always told me.</w:t>
       </w:r>
       <w:r>
-        <w:t xml:space="preserve"> </w:t>
-      </w:r>
-      <w:r>
-        <w:t xml:space="preserve">“</w:t>
-      </w:r>
-      <w:r>
+        <w:rPr>
+          <w:highlight w:val="yellow"/>
+        </w:rPr>
+        <w:t xml:space="preserve"> </w:t>
+      </w:r>
+      <w:r>
+        <w:rPr>
+          <w:highlight w:val="yellow"/>
+        </w:rPr>
+        <w:t xml:space="preserve">“</w:t>
+      </w:r>
+      <w:r>
+        <w:rPr>
+          <w:highlight w:val="yellow"/>
+        </w:rPr>
         <w:t xml:space="preserve">Listen to your boss. Work hard.</w:t>
       </w:r>
       <w:r>
-        <w:t xml:space="preserve">”</w:t>
-      </w:r>
-      <w:r>
-        <w:t xml:space="preserve"> </w:t>
-      </w:r>
-      <w:r>
+        <w:rPr>
+          <w:highlight w:val="yellow"/>
+        </w:rPr>
+        <w:t xml:space="preserve">”</w:t>
+      </w:r>
+      <w:r>
+        <w:rPr>
+          <w:highlight w:val="yellow"/>
+        </w:rPr>
+        <w:t xml:space="preserve"> </w:t>
+      </w:r>
+      <w:r>
+        <w:rPr>
+          <w:highlight w:val="yellow"/>
+        </w:rPr>
         <w:t xml:space="preserve">He had put that in me a long time ago, and he said it again like it was the first time.</w:t>
       </w:r>
     </w:p>
@@ -13564,6 +13603,9 @@
         <w:pStyle w:val="BodyText"/>
       </w:pPr>
       <w:r>
+        <w:rPr>
+          <w:highlight w:val="yellow"/>
+        </w:rPr>
         <w:t xml:space="preserve">He left a twenty on the table. When we got up he didn’t walk us to the car. He stood inside the door with his hand flat on the glass and watched us go, and I watched him in the mirror until the turn. With him, miracles had started to feel ordinary. It was the last time I saw him.</w:t>
       </w:r>
     </w:p>
@@ -13575,6 +13617,7 @@
         <w:rPr>
           <w:iCs/>
           <w:i/>
+          <w:highlight w:val="yellow"/>
         </w:rPr>
         <w:t xml:space="preserve">[END PLACEHOLDER.]</w:t>
       </w:r>
@@ -13808,6 +13851,7 @@
         <w:rPr>
           <w:iCs/>
           <w:i/>
+          <w:highlight w:val="yellow"/>
         </w:rPr>
         <w:t xml:space="preserve">[PLACEHOLDER. The scene that follows holds the shape of December 23 to 25 until Rob replaces it with what happened. The details in it are drafted from what the book already says, not from memory.]</w:t>
       </w:r>
@@ -13817,24 +13861,45 @@
         <w:pStyle w:val="BodyText"/>
       </w:pPr>
       <w:r>
+        <w:rPr>
+          <w:highlight w:val="yellow"/>
+        </w:rPr>
         <w:t xml:space="preserve">I called Donna back that Tuesday night, after my mother had gone to bed. I asked her the questions I ask strangers. Is he comfortable. Is he eating. Who’s with him. She answered every one, and then she went quiet, and the quiet was the part she’d been calling to say. I told her we’d be down Friday.</w:t>
       </w:r>
       <w:r>
-        <w:t xml:space="preserve"> </w:t>
-      </w:r>
-      <w:r>
-        <w:t xml:space="preserve">“</w:t>
-      </w:r>
-      <w:r>
+        <w:rPr>
+          <w:highlight w:val="yellow"/>
+        </w:rPr>
+        <w:t xml:space="preserve"> </w:t>
+      </w:r>
+      <w:r>
+        <w:rPr>
+          <w:highlight w:val="yellow"/>
+        </w:rPr>
+        <w:t xml:space="preserve">“</w:t>
+      </w:r>
+      <w:r>
+        <w:rPr>
+          <w:highlight w:val="yellow"/>
+        </w:rPr>
         <w:t xml:space="preserve">Okay, honey,</w:t>
       </w:r>
       <w:r>
-        <w:t xml:space="preserve">”</w:t>
-      </w:r>
-      <w:r>
-        <w:t xml:space="preserve"> </w:t>
-      </w:r>
-      <w:r>
+        <w:rPr>
+          <w:highlight w:val="yellow"/>
+        </w:rPr>
+        <w:t xml:space="preserve">”</w:t>
+      </w:r>
+      <w:r>
+        <w:rPr>
+          <w:highlight w:val="yellow"/>
+        </w:rPr>
+        <w:t xml:space="preserve"> </w:t>
+      </w:r>
+      <w:r>
+        <w:rPr>
+          <w:highlight w:val="yellow"/>
+        </w:rPr>
         <w:t xml:space="preserve">she said. I put the phone face down on the kitchen counter, and that is more or less where it stayed for two days.</w:t>
       </w:r>
     </w:p>
@@ -13843,24 +13908,45 @@
         <w:pStyle w:val="BodyText"/>
       </w:pPr>
       <w:r>
+        <w:rPr>
+          <w:highlight w:val="yellow"/>
+        </w:rPr>
         <w:t xml:space="preserve">My mother was in town. She has Parkinson’s now, and getting to me had cost her every ounce of energy she had. Christmas Eve she sat on a stool in our kitchen with a cup of tea she’d let go cold, both hands around it to keep them still, and told Hope how my nana made the sauce. I stood there and let her. Twice she asked how Dad was doing.</w:t>
       </w:r>
       <w:r>
-        <w:t xml:space="preserve"> </w:t>
-      </w:r>
-      <w:r>
-        <w:t xml:space="preserve">“</w:t>
-      </w:r>
-      <w:r>
+        <w:rPr>
+          <w:highlight w:val="yellow"/>
+        </w:rPr>
+        <w:t xml:space="preserve"> </w:t>
+      </w:r>
+      <w:r>
+        <w:rPr>
+          <w:highlight w:val="yellow"/>
+        </w:rPr>
+        <w:t xml:space="preserve">“</w:t>
+      </w:r>
+      <w:r>
+        <w:rPr>
+          <w:highlight w:val="yellow"/>
+        </w:rPr>
         <w:t xml:space="preserve">Resting,</w:t>
       </w:r>
       <w:r>
-        <w:t xml:space="preserve">”</w:t>
-      </w:r>
-      <w:r>
-        <w:t xml:space="preserve"> </w:t>
-      </w:r>
-      <w:r>
+        <w:rPr>
+          <w:highlight w:val="yellow"/>
+        </w:rPr>
+        <w:t xml:space="preserve">”</w:t>
+      </w:r>
+      <w:r>
+        <w:rPr>
+          <w:highlight w:val="yellow"/>
+        </w:rPr>
+        <w:t xml:space="preserve"> </w:t>
+      </w:r>
+      <w:r>
+        <w:rPr>
+          <w:highlight w:val="yellow"/>
+        </w:rPr>
         <w:t xml:space="preserve">I said. It was the kind of word I hear families use, and I heard myself use it.</w:t>
       </w:r>
     </w:p>
@@ -13869,6 +13955,9 @@
         <w:pStyle w:val="BodyText"/>
       </w:pPr>
       <w:r>
+        <w:rPr>
+          <w:highlight w:val="yellow"/>
+        </w:rPr>
         <w:t xml:space="preserve">Around four I went out to the car in the driveway and sat in it with the engine off. Eighteen years earlier, in the worst of it, I used to drive past his house in Pensacola, see him out front washing his car, and wave and keep going, because pulling in meant questions. I knew how to do that. I was doing it from seven hundred miles away, with a hospice badge in my bag. Hope came out and stood by the window and didn’t knock. She just stayed until I came in.</w:t>
       </w:r>
     </w:p>
@@ -13877,6 +13966,9 @@
         <w:pStyle w:val="BodyText"/>
       </w:pPr>
       <w:r>
+        <w:rPr>
+          <w:highlight w:val="yellow"/>
+        </w:rPr>
         <w:t xml:space="preserve">That night, they put him on a morphine drip. Chris texted it, four words and a time. He was in the hospital, on comfort care — not hospice; it went that fast. I knew what the drip meant — it’s my work. Morphine at the end doesn’t take anyone. It eases the pain and the hunger for air while the dying does what it was already doing. The drip didn’t tell me what was coming. It told me where he already was. Comfort was the assignment now. I did not say any of that out loud in my own kitchen. I put the phone back face down. Part of the reason was simpler than I’ve made it sound, and harder to admit. I did not want my last memory of my father to be tubes in his nose. He had been bigger than two cancers and a scare. I couldn’t let the man in that bed become the last picture I kept of him. It was selfish. I’m sorry it was that way.</w:t>
       </w:r>
     </w:p>
@@ -13885,6 +13977,9 @@
         <w:pStyle w:val="BodyText"/>
       </w:pPr>
       <w:r>
+        <w:rPr>
+          <w:highlight w:val="yellow"/>
+        </w:rPr>
         <w:t xml:space="preserve">Christmas morning I was up before it was light. Mager called at the usual time, and we prayed the way we always do, a few plain sentences, and I did not tell him. I looked at the phone. Nothing from Chris since the night before. The texting had stopped, and the silence had a shape. I made coffee I didn’t drink. I heard my mother’s door.</w:t>
       </w:r>
     </w:p>
@@ -13893,24 +13988,45 @@
         <w:pStyle w:val="BodyText"/>
       </w:pPr>
       <w:r>
+        <w:rPr>
+          <w:highlight w:val="yellow"/>
+        </w:rPr>
         <w:t xml:space="preserve">Then the phone rang. Chris.</w:t>
       </w:r>
       <w:r>
-        <w:t xml:space="preserve"> </w:t>
-      </w:r>
-      <w:r>
-        <w:t xml:space="preserve">“</w:t>
-      </w:r>
-      <w:r>
+        <w:rPr>
+          <w:highlight w:val="yellow"/>
+        </w:rPr>
+        <w:t xml:space="preserve"> </w:t>
+      </w:r>
+      <w:r>
+        <w:rPr>
+          <w:highlight w:val="yellow"/>
+        </w:rPr>
+        <w:t xml:space="preserve">“</w:t>
+      </w:r>
+      <w:r>
+        <w:rPr>
+          <w:highlight w:val="yellow"/>
+        </w:rPr>
         <w:t xml:space="preserve">Rob.</w:t>
       </w:r>
       <w:r>
-        <w:t xml:space="preserve">”</w:t>
-      </w:r>
-      <w:r>
-        <w:t xml:space="preserve"> </w:t>
-      </w:r>
-      <w:r>
+        <w:rPr>
+          <w:highlight w:val="yellow"/>
+        </w:rPr>
+        <w:t xml:space="preserve">”</w:t>
+      </w:r>
+      <w:r>
+        <w:rPr>
+          <w:highlight w:val="yellow"/>
+        </w:rPr>
+        <w:t xml:space="preserve"> </w:t>
+      </w:r>
+      <w:r>
+        <w:rPr>
+          <w:highlight w:val="yellow"/>
+        </w:rPr>
         <w:t xml:space="preserve">He didn’t have to finish it, and he did anyway, because he’s the one who finishes things. Our father was gone.</w:t>
       </w:r>
     </w:p>
@@ -13919,6 +14035,9 @@
         <w:pStyle w:val="BodyText"/>
       </w:pPr>
       <w:r>
+        <w:rPr>
+          <w:highlight w:val="yellow"/>
+        </w:rPr>
         <w:t xml:space="preserve">I don’t know how long I stood there. I went and told my mother. She reached for my hand, and hers was shaking, and for once it wasn’t the Parkinson’s. Hope had come in behind me. I went back out to the car, and this time I didn’t sit in it. I stood in the driveway on Christmas morning with the phone in my hand and nowhere to drive.</w:t>
       </w:r>
     </w:p>
@@ -13930,6 +14049,7 @@
         <w:rPr>
           <w:iCs/>
           <w:i/>
+          <w:highlight w:val="yellow"/>
         </w:rPr>
         <w:t xml:space="preserve">[END PLACEHOLDER.]</w:t>
       </w:r>

</xml_diff>

<commit_message>
Round two: editor pass (187 edits, ~3,200 words cut) plus panel-six consensus — tags and buttons cut, ending trimmed, Note and Lou's Way moved behind Acknowledgments, Part Six seams closed, placeholder tells removed; 198 pages
Co-Authored-By: Claude Fable 5.1 <noreply@anthropic.com>
Claude-Session: https://claude.ai/code/session_013TTacQAr67Pe2VUwTPop1A
</commit_message>
<xml_diff>
--- a/The_Cardinals_Promise.docx
+++ b/The_Cardinals_Promise.docx
@@ -780,6 +780,22 @@
         <w:pStyle w:val="BodyText"/>
       </w:pPr>
       <w:r>
+        <w:t xml:space="preserve">Author’s Note</w:t>
+      </w:r>
+    </w:p>
+    <w:p>
+      <w:pPr>
+        <w:pStyle w:val="BodyText"/>
+      </w:pPr>
+      <w:r>
+        <w:t xml:space="preserve">Acknowledgments</w:t>
+      </w:r>
+    </w:p>
+    <w:p>
+      <w:pPr>
+        <w:pStyle w:val="BodyText"/>
+      </w:pPr>
+      <w:r>
         <w:t xml:space="preserve">A Note to the One Who Loves an Addict</w:t>
       </w:r>
     </w:p>
@@ -789,22 +805,6 @@
       </w:pPr>
       <w:r>
         <w:t xml:space="preserve">Lou’s Way</w:t>
-      </w:r>
-    </w:p>
-    <w:p>
-      <w:pPr>
-        <w:pStyle w:val="BodyText"/>
-      </w:pPr>
-      <w:r>
-        <w:t xml:space="preserve">Author’s Note</w:t>
-      </w:r>
-    </w:p>
-    <w:p>
-      <w:pPr>
-        <w:pStyle w:val="BodyText"/>
-      </w:pPr>
-      <w:r>
-        <w:t xml:space="preserve">Acknowledgments</w:t>
       </w:r>
     </w:p>
     <w:p>
@@ -1620,15 +1620,7 @@
         <w:pStyle w:val="BodyText"/>
       </w:pPr>
       <w:r>
-        <w:t xml:space="preserve">I did not know why he sometimes disappeared. I did not know why Mama was afraid. I only knew that when he came home, I wanted him to read me the rabbit story again.</w:t>
-      </w:r>
-    </w:p>
-    <w:p>
-      <w:pPr>
-        <w:pStyle w:val="BodyText"/>
-      </w:pPr>
-      <w:r>
-        <w:t xml:space="preserve">But there was another side to Papa. He’d sit in cafés after work, playing chess, drinking coffee, not coming home. Some weekends he slept straight through, and his own father had to come and wake him. One Thanksgiving my mom cooked the whole dinner, and Papa never got up for it. Other times he left for work and didn’t come back. A day. Then two. Then three. Then he’d walk in worn out, his eyes gone somewhere, go straight to the bedroom, lock the door, and shut the house out.</w:t>
+        <w:t xml:space="preserve">There was another side to Papa. He’d sit in cafés after work, playing chess, drinking coffee, not coming home. Some weekends he slept straight through, and his own father had to come and wake him. One Thanksgiving my mom cooked the whole dinner, and Papa never got up for it. Other times he left for work and didn’t come back. A day. Then two. Then three. Then he’d walk in worn out, his eyes gone somewhere, go straight to the bedroom, lock the door, and shut the house out.</w:t>
       </w:r>
     </w:p>
     <w:p>
@@ -2158,7 +2150,7 @@
         <w:pStyle w:val="BodyText"/>
       </w:pPr>
       <w:r>
-        <w:t xml:space="preserve">My mother worked all the time, titleless jobs that nobody else wanted. She left early and came home tired. I saw far less of her than I had in Mexico. At night I’d climb into her bed and ask to play with her hair, and some nights she let me. The nights she did, something settled in my chest I couldn’t have named. She put food on the table, kept us clean, made us safe. The thing I recall most wasn’t the big sacrifices, and there were plenty of those. It was the smaller things, like the long nights she waitressed on her feet for hours, making her the kind of tired that sinks into your back and stays. On her way home, she would call to see if I was still up.</w:t>
+        <w:t xml:space="preserve">My mother worked all the time, titleless jobs that nobody else wanted. She left early and came home tired. I saw far less of her than I had in Mexico. At night I’d climb into her bed and ask to play with her hair, and some nights she let me. The nights she did, something settled in my chest I couldn’t have named. She put food on the table, kept us clean, made us safe. What I recall most are the small things, like the long nights she waitressed on her feet for hours, the kind of tired that sinks into your back and stays. On her way home, she would call to see if I was still up.</w:t>
       </w:r>
     </w:p>
     <w:p>
@@ -2224,14 +2216,6 @@
         <w:pStyle w:val="BodyText"/>
       </w:pPr>
       <w:r>
-        <w:t xml:space="preserve">That’s how I knew my mother loved me.</w:t>
-      </w:r>
-    </w:p>
-    <w:p>
-      <w:pPr>
-        <w:pStyle w:val="BodyText"/>
-      </w:pPr>
-      <w:r>
         <w:t xml:space="preserve">Chris had left Mexico as a baby, so he took to New Jersey without trouble. I’d left as a four-year-old with a father to miss.</w:t>
       </w:r>
     </w:p>
@@ -2350,14 +2334,6 @@
         <w:pStyle w:val="BodyText"/>
       </w:pPr>
       <w:r>
-        <w:t xml:space="preserve">I’d lost a country, a father, and a language.</w:t>
-      </w:r>
-    </w:p>
-    <w:p>
-      <w:pPr>
-        <w:pStyle w:val="BodyText"/>
-      </w:pPr>
-      <w:r>
         <w:t xml:space="preserve">Nancey, my mother’s youngest sister, treated Chris and me as her own from the start. She was at the games and the matches, always in our corner. Nancey was in her early twenties when we arrived from Mexico, years before she met Charlie. She started seeing him when I was eight and married him two years later. He became my uncle. She told me not long ago that no matter how old I get, she’ll always see the same little kid, and I know the one she means: the boy in the backseat too scared to get out of the car.</w:t>
       </w:r>
     </w:p>
@@ -2390,7 +2366,7 @@
         <w:pStyle w:val="BodyText"/>
       </w:pPr>
       <w:r>
-        <w:t xml:space="preserve">Papa had a way of making an ordinary day feel extraordinary. One afternoon he dressed Chris and me as Batman and Robin, though it wasn’t Halloween. Mama was furious. Papa just laughed. To him, we didn’t need a holiday to become superheroes. Looking back, I think he was trying to give us something no job, no country, and no amount of uncertainty could take away: the freedom to be kids.</w:t>
+        <w:t xml:space="preserve">Papa had a way of making an ordinary day feel extraordinary. One afternoon he dressed Chris and me as Batman and Robin, though it wasn’t Halloween. Mama was furious. Papa just laughed. To him, we didn’t need a holiday to become superheroes.</w:t>
       </w:r>
     </w:p>
     <w:p>
@@ -2576,7 +2552,7 @@
         <w:pStyle w:val="BodyText"/>
       </w:pPr>
       <w:r>
-        <w:t xml:space="preserve">The first time he asked my mother out, she turned him down. He asked again. She gave him the same answer. But he kept coming back, week after week, until she finally saw his charm and maturity. That was how Lou Brizzi got his foot in the door of my mother’s heart.</w:t>
+        <w:t xml:space="preserve">The first time he asked my mother out, she turned him down. He asked again. She gave him the same answer. But he kept coming back, week after week, until she finally saw his charm and maturity.</w:t>
       </w:r>
     </w:p>
     <w:p>
@@ -2592,7 +2568,7 @@
         <w:pStyle w:val="BodyText"/>
       </w:pPr>
       <w:r>
-        <w:t xml:space="preserve">I was six the first time I met him. He came over to my grandparents’ place, where we were living, when Nana and Grandpa invited him to dinner. Tootsie Rolls. That’s all I remember about that night. Lou brought Chris and me Tootsie Rolls. A stranger walked into the house with something in his pocket for two boys who weren’t even his. This small act — treating us like we were already his own — won over our father-starved hearts.</w:t>
+        <w:t xml:space="preserve">I was six the first time I met him. He came over to my grandparents’ place, where we were living, when Nana and Grandpa invited him to dinner. Tootsie Rolls. That’s all I remember about that night. Lou brought Chris and me Tootsie Rolls. A stranger walked into the house with something in his pocket for two boys who weren’t even his.</w:t>
       </w:r>
     </w:p>
     <w:p>
@@ -2651,7 +2627,7 @@
         <w:rPr>
           <w:highlight w:val="yellow"/>
         </w:rPr>
-        <w:t xml:space="preserve">I woke him. He came up off that couch already yelling. Not at me, exactly. At the clock, at the drive into the city, at the whole arrangement of his life that ran on an hour and a half of sleep and two boys remembering to look at a clock. He was loud. He knocked a chair over getting to his boots, and he didn’t pick it up. My mother came to the top of the stairs and said his name once, quietly, the way she did, and he didn’t answer her. Chris was behind me in the doorway, not moving. I stood there and took it, and I remember thinking that I had done this, that the whole night was mine.</w:t>
+        <w:t xml:space="preserve">I woke him. He came up off that couch already yelling. Not at me, exactly. At the clock, at the drive into the city, at two boys who couldn’t remember to look at a clock. He was loud. My mother came to the top of the stairs and said his name once, and he didn’t answer her. Chris was behind me in the doorway, not moving. I stood there and took it, and I remember thinking that I had done this, that the whole night was mine.</w:t>
       </w:r>
     </w:p>
     <w:p>
@@ -2662,7 +2638,7 @@
         <w:rPr>
           <w:highlight w:val="yellow"/>
         </w:rPr>
-        <w:t xml:space="preserve">He was out the door in four minutes. The truck went down the street too fast. My mother picked up the chair.</w:t>
+        <w:t xml:space="preserve">He was out the door in four minutes. The truck went down the street too fast.</w:t>
       </w:r>
     </w:p>
     <w:p>
@@ -2673,7 +2649,7 @@
         <w:rPr>
           <w:highlight w:val="yellow"/>
         </w:rPr>
-        <w:t xml:space="preserve">In the morning he was at the counter in a pressed shirt making our lunches. He didn’t say anything about it, and neither did I. He drove us to school. That was how it went with him. The heat came, and then it was gone, and what was left was a man packing sandwiches. I learned early that the yelling wasn’t the truth about him. The lunches were. But I also learned to read a room for the temperature before I walked into it, and I’ve never stopped.</w:t>
+        <w:t xml:space="preserve">In the morning he was at the counter in a pressed shirt making our lunches. He didn’t say anything about it, and neither did I. He drove us to school.</w:t>
       </w:r>
     </w:p>
     <w:p>
@@ -2694,14 +2670,6 @@
         <w:pStyle w:val="BodyText"/>
       </w:pPr>
       <w:r>
-        <w:t xml:space="preserve">Once he decided you were his, that settled it. Lou was there early mornings and late nights, school conferences, wrestling matches, hospital waiting rooms, and church basements. He never kept a ledger of it, and he never talked about sacrifice. He just lived it.</w:t>
-      </w:r>
-    </w:p>
-    <w:p>
-      <w:pPr>
-        <w:pStyle w:val="BodyText"/>
-      </w:pPr>
-      <w:r>
         <w:t xml:space="preserve">Lou’s upbringing explained some of it. His father sold produce. When men in suits walked into his market, his father went out back to discuss things in private. When relatives came over from Italy, Lou was the boy who lost his bed to them and slept in the attic. He carried that longer than anybody knew. Years later, during a stretch when he was going to therapy, he recalled a family Christmas and an old man yelling at his uncle about a boy who had to sleep in the attic. The temper was the Italian kind you see in the movies. It was older than any of us, and it was never about us.</w:t>
       </w:r>
     </w:p>
@@ -2928,7 +2896,7 @@
         <w:pStyle w:val="BodyText"/>
       </w:pPr>
       <w:r>
-        <w:t xml:space="preserve">Nobody had suggested it. I just wanted to carry it. That day Claudio Horacio Balderas became Robert Louis Brizzi. I had carried one father’s name in the middle of mine my whole life. Now I would carry the other’s. I’ve never once wished it back.</w:t>
+        <w:t xml:space="preserve">Nobody had suggested it. That day Claudio Horacio Balderas became Robert Louis Brizzi. I had carried one father’s name in the middle of mine my whole life. Now I would carry the other’s. I’ve never once wished it back.</w:t>
       </w:r>
     </w:p>
     <w:p>
@@ -2944,15 +2912,15 @@
         <w:pStyle w:val="BodyText"/>
       </w:pPr>
       <w:r>
-        <w:t xml:space="preserve">Some dads spend their weekends chasing hobbies like golf, manicuring their lawns, or sleeping on the couch. Not Lou. His whole hobby was us. Saturday mornings at the batting cages in Woodridge, his hands on my shoulders fixing my stance, not because I was ever going to play ball but because he believed doing a thing right was a habit worth building. Soccer fields in the New Jersey cold, Lou on the sideline in a coat he didn’t need to be wearing, watching me play a sport I was actually pretty good at. I took it all for granted, the way a child is supposed to do with childhood.</w:t>
-      </w:r>
-    </w:p>
-    <w:p>
-      <w:pPr>
-        <w:pStyle w:val="BodyText"/>
-      </w:pPr>
-      <w:r>
-        <w:t xml:space="preserve">Lou and my mother decided early that Chris and I would be raised in church. It wasn’t up for discussion. Sunday mornings, confirmation, and at thirteen I chose God and accepted Him into my heart. That part wasn’t handed to me by the adults around me. It was mine — the first real decision I ever made for myself besides taking Lou as my middle name. My decision to follow Christ was real. I meant it. I’d lose the thread of it for a long time, the drinking years, California, the stretch when I was too busy performing life to remember what mine was built on. I left my faith, but it waited for me to return.</w:t>
+        <w:t xml:space="preserve">His whole hobby was us. Saturday mornings at the batting cages in Woodridge, his hands on my shoulders fixing my stance, not because I was ever going to play ball but because he believed doing a thing right was a habit worth building. Soccer fields in the New Jersey cold, Lou on the sideline in a coat he didn’t need to be wearing, watching me play a sport I was actually pretty good at. I took it all for granted, the way a child is supposed to do with childhood.</w:t>
+      </w:r>
+    </w:p>
+    <w:p>
+      <w:pPr>
+        <w:pStyle w:val="BodyText"/>
+      </w:pPr>
+      <w:r>
+        <w:t xml:space="preserve">Lou and my mother decided early that Chris and I would be raised in church. It wasn’t up for discussion. Sunday mornings, confirmation, and at thirteen I chose God and accepted Him into my heart. It was mine — the first real decision I ever made for myself besides taking Lou as my middle name. I meant it. I’d lose the thread of it for a long time, the drinking years, California, the stretch when I was too busy performing life to remember what mine was built on. I left my faith, but it waited for me to return.</w:t>
       </w:r>
     </w:p>
     <w:p>
@@ -2976,15 +2944,15 @@
         <w:pStyle w:val="BodyText"/>
       </w:pPr>
       <w:r>
-        <w:t xml:space="preserve">But I had Lou, who understood that a boy who comes home quiet in the wrong way doesn’t need to be interrogated; he needs someone there. He couldn’t fix school for me. He was just home when I got there, and that turned out to be enough.</w:t>
-      </w:r>
-    </w:p>
-    <w:p>
-      <w:pPr>
-        <w:pStyle w:val="BodyText"/>
-      </w:pPr>
-      <w:r>
-        <w:t xml:space="preserve">The school paired me with a buddy to show me around those first weeks, a kid everybody called Whitey. We didn’t get close then — that year I was mostly on my own. But by high school, Whitey had become one of my best friends, and all these years later, he still is. When I got into Miami of Ohio, part of me hoped Whitey would land there too, an easy way to carry the friendship forward. He chose Bates College, up in Maine. I’d wanted a next chapter; what we got was a fork in the road.</w:t>
+        <w:t xml:space="preserve">Lou couldn’t fix school for me. He was home when I got there.</w:t>
+      </w:r>
+    </w:p>
+    <w:p>
+      <w:pPr>
+        <w:pStyle w:val="BodyText"/>
+      </w:pPr>
+      <w:r>
+        <w:t xml:space="preserve">The school paired me with a buddy to show me around those first weeks, a kid everybody called Whitey. We didn’t get close then — that year I was mostly on my own. But by high school, Whitey had become one of my best friends, and all these years later, he still is. When I got into Miami of Ohio, part of me hoped Whitey would land there too, an easy way to carry the friendship forward. He chose Bates College, up in Maine.</w:t>
       </w:r>
     </w:p>
     <w:p>
@@ -3008,7 +2976,7 @@
         <w:pStyle w:val="BodyText"/>
       </w:pPr>
       <w:r>
-        <w:t xml:space="preserve">My mother and Lou divorced in 1996, the year I turned eighteen. The divorce handed him an easy way out and every social permission to take it. We were grown, or close to it, and the marriage that had tied him to us was finished. He could have put the frustration and the guilt on Chris and me and gone. He never did. We were never in question, a plain fact he never bothered to announce: we were his, and that didn’t come undone because the marriage had. The first time he chose us, it was a handful of Tootsie Rolls at my grandparents’ dinner table. This time it was a divorce he could have walked away from clean, yet he stayed. The same decision, made twelve years apart.</w:t>
+        <w:t xml:space="preserve">My mother and Lou divorced in 1996, the year I turned eighteen. The divorce handed him an easy way out. We were grown, or close to it, and the marriage that had tied him to us was finished. He could have walked away clean. He never did. The first time he chose us, it was a handful of Tootsie Rolls at my grandparents’ dinner table. This time it was a divorce. The same decision, made twelve years apart.</w:t>
       </w:r>
     </w:p>
     <w:p>
@@ -3281,7 +3249,7 @@
         <w:pStyle w:val="BodyText"/>
       </w:pPr>
       <w:r>
-        <w:t xml:space="preserve">He didn’t make a thing of it. He finished tucking me in the way he had every other night, except now I had a word for him I hadn’t had a minute before.</w:t>
+        <w:t xml:space="preserve">He finished tucking me in the way he had every other night, except now I had a word for him I hadn’t had a minute before.</w:t>
       </w:r>
     </w:p>
     <w:p>
@@ -3459,7 +3427,7 @@
         <w:pStyle w:val="BodyText"/>
       </w:pPr>
       <w:r>
-        <w:t xml:space="preserve">He didn’t give me a speech. He got the white-out and painted over the word, let it dry, and ran a fresh photocopy, and the thing they’d been using on me was gone. He wasn’t hiding the truth — everyone who mattered already knew it. He was lifting a weight off a kid who wasn’t ready to carry it. That was how my parents handled the adoption all along. Not a secret. A shield. Somebody was hurting their son, and Lou fixed the part he could reach.</w:t>
+        <w:t xml:space="preserve">He got the white-out and painted over the word, let it dry, and ran a fresh photocopy, and the thing they’d been using on me was gone. He wasn’t hiding the truth — everyone who mattered already knew it. He was lifting a weight off a kid who wasn’t ready to carry it. That was how my parents handled the adoption all along. Not a secret. A shield. Somebody was hurting their son, and Lou fixed the part he could reach.</w:t>
       </w:r>
     </w:p>
     <w:p>
@@ -3567,15 +3535,7 @@
         <w:pStyle w:val="BodyText"/>
       </w:pPr>
       <w:r>
-        <w:t xml:space="preserve">He never sat me down and said those words. Instead, he lived them out loud in front of me every day until they became part of who I am.</w:t>
-      </w:r>
-    </w:p>
-    <w:p>
-      <w:pPr>
-        <w:pStyle w:val="BodyText"/>
-      </w:pPr>
-      <w:r>
-        <w:t xml:space="preserve">Where I saw it most was the wrestling tournaments upstate. Dad drove me up into New York weekend after weekend, however far the bracket took us. He didn’t talk about the miles, the early start, or that he had worked the night before. He just got in the car, because his kid was wrestling and that was where he was supposed to be.</w:t>
+        <w:t xml:space="preserve">Where I saw it most was the wrestling tournaments upstate. Dad drove me up into New York weekend after weekend, however far the bracket took us. He didn’t talk about the miles, the early start, or that he had worked the night before. He got in the car.</w:t>
       </w:r>
     </w:p>
     <w:p>
@@ -3603,12 +3563,6 @@
         </w:rPr>
         <w:t xml:space="preserve">Stay in the box. Take the next pitch.</w:t>
       </w:r>
-      <w:r>
-        <w:t xml:space="preserve"> </w:t>
-      </w:r>
-      <w:r>
-        <w:t xml:space="preserve">That was the lesson under the lesson.</w:t>
-      </w:r>
     </w:p>
     <w:p>
       <w:pPr>
@@ -3633,23 +3587,23 @@
         <w:pStyle w:val="BodyText"/>
       </w:pPr>
       <w:r>
-        <w:t xml:space="preserve">I had my own version of that feeling in that car coming home from upstate, the quiet after a long day, the two of us, the feeling that we had done the thing together. And when he was proud of me, he rarely said so. He’d give me a small smile and a look. His expression said all of it.</w:t>
-      </w:r>
-    </w:p>
-    <w:p>
-      <w:pPr>
-        <w:pStyle w:val="BodyText"/>
-      </w:pPr>
-      <w:r>
-        <w:t xml:space="preserve">He didn’t connect with me only on the big things. One time I asked for White Castle, and the nearest one was an hour away. He drove me. An hour there for a sack of little burgers, because his kid had a taste for them. When I needed a root canal out at college in Ohio, he drove ten hours to take me to the dentist and ten hours back. A full day of driving, for a dentist’s chair. In both pleasure and pain, Dad was there.</w:t>
-      </w:r>
-    </w:p>
-    <w:p>
-      <w:pPr>
-        <w:pStyle w:val="BodyText"/>
-      </w:pPr>
-      <w:r>
-        <w:t xml:space="preserve">And once, it was far bigger than a tournament, a sack of burgers, or a dentist’s chair. In college in Ohio I went down into something I couldn’t explain, and he drove ten hours to sit across a table from me. He came the way he always had, except this time it wasn’t for a game. He came because he loved me.</w:t>
+        <w:t xml:space="preserve">I had my own version of that feeling in that car coming home from upstate, the quiet after a long day, the two of us, the feeling that we had done the thing together. And when he was proud of me, he rarely said so. He’d give me a small smile and a look.</w:t>
+      </w:r>
+    </w:p>
+    <w:p>
+      <w:pPr>
+        <w:pStyle w:val="BodyText"/>
+      </w:pPr>
+      <w:r>
+        <w:t xml:space="preserve">He didn’t connect with me only on the big things. One time I asked for White Castle, and the nearest one was an hour away. He drove me. An hour there for a sack of little burgers, because his kid had a taste for them. When I needed a root canal out at college in Ohio, he drove ten hours to take me to the dentist and ten hours back. A full day of driving, for a dentist’s chair.</w:t>
+      </w:r>
+    </w:p>
+    <w:p>
+      <w:pPr>
+        <w:pStyle w:val="BodyText"/>
+      </w:pPr>
+      <w:r>
+        <w:t xml:space="preserve">In college in Ohio I went down into something I couldn’t explain, and he drove ten hours to sit across a table from me.</w:t>
       </w:r>
     </w:p>
     <w:p>
@@ -3723,7 +3677,7 @@
         <w:pStyle w:val="BodyText"/>
       </w:pPr>
       <w:r>
-        <w:t xml:space="preserve">For as long as I could remember I’d carried a quiet question, whether I was really his, whether being chosen was the same as belonging. He answered it in one sentence. As much as his own. He didn’t soften it. I believed him.</w:t>
+        <w:t xml:space="preserve">For as long as I could remember I’d carried a quiet question, whether being chosen was the same as belonging. He answered it in one sentence. He didn’t soften it. I believed him.</w:t>
       </w:r>
     </w:p>
     <w:p>
@@ -3864,7 +3818,7 @@
         <w:pStyle w:val="BodyText"/>
       </w:pPr>
       <w:r>
-        <w:t xml:space="preserve">Yet I kept sitting with them. That’s the part I sit with now. Every day they did it, and every day I carried my tray back to the same seat. I didn’t move tables. I didn’t eat alone. Getting picked on by them felt better than having no one, and in a town where friends didn’t come easy, that was the table. So I sat down and took it.</w:t>
+        <w:t xml:space="preserve">Yet I kept sitting with them. Every day they did it, and every day I carried my tray back to the same seat. I didn’t move tables. I didn’t eat alone. Getting picked on by them felt better than having no one, and in a town where friends didn’t come easy, that was the table. So I sat down and took it.</w:t>
       </w:r>
     </w:p>
     <w:p>
@@ -3906,7 +3860,7 @@
         <w:pStyle w:val="BodyText"/>
       </w:pPr>
       <w:r>
-        <w:t xml:space="preserve">I crossed it out before my mom could see it. That is the part that tells you who I already was. She had carried two boys out of one country and built us a life in another with no degree and no one to catch her. I wasn’t going to hand her this too. So I took a pen to my own yearbook and scratched the line out, alone, so she would never have to feel it. I was fourteen. I didn’t have the word for it yet. I was already a caretaker.</w:t>
+        <w:t xml:space="preserve">I crossed it out before my mom could see it. She had carried two boys out of one country and built us a life in another with no degree and no one to catch her. I wasn’t going to hand her this too. I was fourteen. I didn’t have the word for it yet. I was already a caretaker.</w:t>
       </w:r>
     </w:p>
     <w:p>
@@ -3922,7 +3876,7 @@
         <w:pStyle w:val="BodyText"/>
       </w:pPr>
       <w:r>
-        <w:t xml:space="preserve">The first place I had to learn to show up for myself, with Lou watching from the stands, was a wrestling mat. I was twelve when wrestling first came up, and it came up between Charlie and my dad. The two of them talked it over before anybody said a word to me. It wasn’t a read on any talent. I didn’t have any. I was awkward, undersized, the kid picked somewhere in the middle in gym class, not last, which would’ve been a story, just middle. It was a hunch, the way people point a kid at something because nothing else has stuck.</w:t>
+        <w:t xml:space="preserve">I was twelve when wrestling first came up, and it came up between Charlie and my dad. The two of them talked it over before anybody said a word to me. It wasn’t a read on any talent. I didn’t have any. I was awkward, undersized, the kid picked somewhere in the middle in gym class, not last, which would’ve been a story, just middle. It was a hunch, the way people point a kid at something because nothing else has stuck.</w:t>
       </w:r>
     </w:p>
     <w:p>
@@ -3954,7 +3908,7 @@
         <w:pStyle w:val="BodyText"/>
       </w:pPr>
       <w:r>
-        <w:t xml:space="preserve">While Charlie introduced us to wrestling, Lou made sure we stayed with it. Four nights a week he drove an hour each way to The Edge Wrestling Club so Chris and I could get extra practice. He never complained about the miles, the gas, or the late nights. He simply believed we were worth the investment.</w:t>
+        <w:t xml:space="preserve">While Charlie introduced us to wrestling, Lou made sure we stayed with it. Four nights a week he drove an hour each way to The Edge Wrestling Club so Chris and I could get extra practice.</w:t>
       </w:r>
     </w:p>
     <w:p>
@@ -3990,14 +3944,6 @@
         <w:pStyle w:val="BodyText"/>
       </w:pPr>
       <w:r>
-        <w:t xml:space="preserve">He showed his love in carpools, tournament weekends, church on Sundays, and thousands of hours sitting beside wrestling mats.</w:t>
-      </w:r>
-    </w:p>
-    <w:p>
-      <w:pPr>
-        <w:pStyle w:val="BodyText"/>
-      </w:pPr>
-      <w:r>
         <w:t xml:space="preserve">Years later, I returned to that same tournament and left as Bergen County champion.</w:t>
       </w:r>
     </w:p>
@@ -4006,7 +3952,7 @@
         <w:pStyle w:val="BodyText"/>
       </w:pPr>
       <w:r>
-        <w:t xml:space="preserve">The wrestling room ran warmer than the rest of the building. Years of work had soaked into the mats and the walls, and it hit me at the door, rubber and sweat and something dingy underneath. I loved that room. Not because it was comfortable. Because it was the one place I didn’t have to figure out who to be. I just had to work, and work I understood.</w:t>
+        <w:t xml:space="preserve">The wrestling room ran warmer than the rest of the building. Years of work had soaked into the mats and the walls, and it hit me at the door, rubber and sweat and something dingy underneath. I loved that room. It was the one place I didn’t have to figure out who to be. I just had to work, and work I understood.</w:t>
       </w:r>
     </w:p>
     <w:p>
@@ -4030,7 +3976,7 @@
         <w:pStyle w:val="BodyText"/>
       </w:pPr>
       <w:r>
-        <w:t xml:space="preserve">The mental game was the real opponent. Six minutes stretched forever while your lungs burned and your mind offered every excuse to quit. Fear rode right there with you, fear of getting taken down in front of everyone, fear of gassing out. The fear didn’t go anywhere. I breathed, changed levels, kept my hands ready. When my body wanted to quit, I told it no. Stay. Fight the wrist. Explode up. The mat didn’t care about my story or the questions inside me. It only cared that I kept showing up.</w:t>
+        <w:t xml:space="preserve">The mental game was the real opponent. Six minutes stretched forever while your lungs burned and your mind offered every excuse to quit. Fear rode right there with you, fear of getting taken down in front of everyone, fear of gassing out. The fear didn’t go anywhere. I breathed, changed levels, kept my hands ready. When my body wanted to quit, I told it no. Stay. Fight the wrist. Explode up.</w:t>
       </w:r>
     </w:p>
     <w:p>
@@ -4062,7 +4008,7 @@
         <w:pStyle w:val="BodyText"/>
       </w:pPr>
       <w:r>
-        <w:t xml:space="preserve">Lou was always in the stands. He almost never missed a match in four years of high school, not that nineteen-second one, not the close ones that went wrong, not the good ones once the work started showing. Third row, usually. Arms crossed, not in judgment, but in attention. Sometimes he’d have the camcorder up and running. Wrestling was the only thing he ever taped, the only reason he owned the thing. My mother and Aunt Nancey came too. Every match. And after every weigh-in, when I had starved myself down to the number for days, my mom was there with Wendy’s chicken sandwiches, ready the second I made weight. She always seemed to know what a thing had cost me, and she always had the food waiting. That was how she loved me. She fed me.</w:t>
+        <w:t xml:space="preserve">Lou was always in the stands. He almost never missed a match in four years of high school, not that nineteen-second one, not the close ones that went wrong, not the good ones once the work started showing. Third row, usually. Arms crossed. Sometimes he’d have the camcorder up and running. Wrestling was the only thing he ever taped, the only reason he owned the thing. My mother and Aunt Nancey came too. Every match. And after every weigh-in, when I had starved myself down to the number for days, my mom was there with Wendy’s chicken sandwiches, ready the second I made weight. She always seemed to know what a thing had cost me, and she always had the food waiting.</w:t>
       </w:r>
     </w:p>
     <w:p>
@@ -4078,15 +4024,7 @@
         <w:pStyle w:val="BodyText"/>
       </w:pPr>
       <w:r>
-        <w:t xml:space="preserve">The victories came later, and they were never only about wrestling. Somewhere along the way I had learned that success was how I gained acceptance. If I kept winning, people would value me. If I stopped, I feared they might not.</w:t>
-      </w:r>
-    </w:p>
-    <w:p>
-      <w:pPr>
-        <w:pStyle w:val="BodyText"/>
-      </w:pPr>
-      <w:r>
-        <w:t xml:space="preserve">For years I thought wrestling turned me into someone. Looking back, I see it taught me something dangerous. It made me think that winning was my identity.</w:t>
+        <w:t xml:space="preserve">The victories came later. Somewhere along the way I had learned that success was how I gained acceptance. If I kept winning, people would value me. If I stopped, I feared they might not.</w:t>
       </w:r>
     </w:p>
     <w:bookmarkStart w:id="25" w:name="cooperstown"/>
@@ -4368,14 +4306,6 @@
         <w:pStyle w:val="BodyText"/>
       </w:pPr>
       <w:r>
-        <w:t xml:space="preserve">Even then, I cared more about protecting the image than understanding what had happened.</w:t>
-      </w:r>
-    </w:p>
-    <w:p>
-      <w:pPr>
-        <w:pStyle w:val="BodyText"/>
-      </w:pPr>
-      <w:r>
         <w:t xml:space="preserve">Dave’s football plans eventually changed. His character did not. Mine was beginning to.</w:t>
       </w:r>
     </w:p>
@@ -4384,7 +4314,7 @@
         <w:pStyle w:val="BodyText"/>
       </w:pPr>
       <w:r>
-        <w:t xml:space="preserve">Dave went on to play in the NFL, then became a missionary in China, and years later we found our way back to each other. He’s the one who wrote the afterword to this book.</w:t>
+        <w:t xml:space="preserve">Dave went on to play in the NFL, then became a missionary in China, and years later we found our way back to each other. He’s the one who wrote the foreword to this book.</w:t>
       </w:r>
     </w:p>
     <w:p>
@@ -4482,7 +4412,7 @@
         <w:pStyle w:val="FirstParagraph"/>
       </w:pPr>
       <w:r>
-        <w:t xml:space="preserve">Freshman year I lost more than I won. Early sophomore season I drew the top seed in a tournament, a kid everyone knew would win, the kid I was supposed to be a warm-up for. Something happened I still can’t fully explain. I wasn’t afraid of him. The fear that had been the ground note of every match since that first pin just wasn’t there. What was there was anger, not at him, at the idea that I was supposed to lose. I beat him. Ugly, grinding, the full three periods. But I won it. Afterward Lou didn’t say much. A hand on my shoulder. In his language it meant: I always knew this was in you.</w:t>
+        <w:t xml:space="preserve">Freshman year I lost more than I won. Early sophomore season I drew the top seed in a tournament, a kid everyone knew would win, the kid I was supposed to be a warm-up for. Something happened I still can’t fully explain. I wasn’t afraid of him. The fear that had been the ground note of every match since that first pin just wasn’t there. What was there was anger, not at him, at the idea that I was supposed to lose. I beat him. Ugly, grinding, the full three periods. But I won it. Afterward Lou didn’t say much. A hand on my shoulder.</w:t>
       </w:r>
     </w:p>
     <w:p>
@@ -4498,7 +4428,7 @@
         <w:pStyle w:val="BodyText"/>
       </w:pPr>
       <w:r>
-        <w:t xml:space="preserve">I couldn’t take any of it in. The gap between who everyone suddenly said I was and who I knew myself to be was too wide to cross. The achievement was real. The sense that I had earned it wasn’t there, and it wouldn’t be for years. It would take a long time, and losing nearly everything, before I could stand in a room and believe I belonged in it.</w:t>
+        <w:t xml:space="preserve">I couldn’t take any of it in. The gap between who everyone suddenly said I was and who I knew myself to be was too wide to cross.</w:t>
       </w:r>
     </w:p>
     <w:bookmarkEnd w:id="27"/>
@@ -4570,7 +4500,7 @@
         <w:pStyle w:val="BodyText"/>
       </w:pPr>
       <w:r>
-        <w:t xml:space="preserve">He knew what it had taken to get there. He wasn’t making it into anything bigger than it was; he was just enjoying it with me. I nodded. That was enough for both of us.</w:t>
+        <w:t xml:space="preserve">He knew what it had taken to get there. I nodded.</w:t>
       </w:r>
     </w:p>
     <w:bookmarkEnd w:id="28"/>
@@ -4680,7 +4610,7 @@
         <w:pStyle w:val="BodyText"/>
       </w:pPr>
       <w:r>
-        <w:t xml:space="preserve">The hazel-eyed baby my mother carried out of Mexico is silver-haired now, a father himself, the light skin and the easy grin still intact. He’s complicated. Smart. Polished and strategic, an overachiever in the true sense. And still, the first thing anyone says about him is that he’s kind. Quietly, consistently kind. He’s my best friend. We took different paths and processed the same childhood differently, but there’s nobody I’d rather have call me on Christmas morning, nobody I’d rather have beside me at a graveside. Lou built us both, differently, and never compared us. He showed up for Chris’s records and my county title with the same pride.</w:t>
+        <w:t xml:space="preserve">The hazel-eyed baby my mother carried out of Mexico is silver-haired now, a father himself, the light skin and the easy grin still intact. He’s complicated. Smart. Polished and strategic. And still, the first thing anyone says about him is that he’s kind. He’s my best friend. We took different paths and processed the same childhood differently, but there’s nobody I’d rather have call me on Christmas morning, nobody I’d rather have beside me at a graveside. Lou built us both, differently, and never compared us. He showed up for Chris’s records and my county title with the same pride.</w:t>
       </w:r>
     </w:p>
     <w:bookmarkEnd w:id="30"/>
@@ -4710,7 +4640,7 @@
         <w:pStyle w:val="BodyText"/>
       </w:pPr>
       <w:r>
-        <w:t xml:space="preserve">Lou was the exception. Through all of it, the nineteen seconds, the weight cuts, the throwing up, the bad ankle, the losses that hurt more than the wins, he was there. Not because I was becoming a legend. Because I was his son.</w:t>
+        <w:t xml:space="preserve">Lou was the exception. Through all of it, the nineteen seconds, the weight cuts, the throwing up, the bad ankle, the losses that hurt more than the wins, he was there.</w:t>
       </w:r>
     </w:p>
     <w:p>
@@ -4755,14 +4685,6 @@
       </w:r>
       <w:r>
         <w:t xml:space="preserve">No resentment. Just a fact. I didn’t know what to say. I still don’t.</w:t>
-      </w:r>
-    </w:p>
-    <w:p>
-      <w:pPr>
-        <w:pStyle w:val="BodyText"/>
-      </w:pPr>
-      <w:r>
-        <w:t xml:space="preserve">When I threw up in a match, he didn’t see weakness. When I got pinned in nineteen seconds, he didn’t see failure. He saw his kid. He was in the third row for all of it, and I never once asked what it had cost him to be there.</w:t>
       </w:r>
     </w:p>
     <w:bookmarkEnd w:id="31"/>
@@ -4900,15 +4822,15 @@
         <w:pStyle w:val="BodyText"/>
       </w:pPr>
       <w:r>
-        <w:t xml:space="preserve">He’d taken on a family that didn’t start with him. A wife who waited tables. Two boys who weren’t his by blood. Endless bills. He never acted like any of it was somebody else’s problem. He owned all of it.</w:t>
-      </w:r>
-    </w:p>
-    <w:p>
-      <w:pPr>
-        <w:pStyle w:val="BodyText"/>
-      </w:pPr>
-      <w:r>
-        <w:t xml:space="preserve">The recruiter had put it to him straight, the way you tell a man something for his own good. You want a real shot, he said, you’ve got to dye the gray. They’re going to look at you and see an old man. A grown man, a husband, a father, told he had to look younger than his years to be deemed worthy of a chance. That detail has never left me.</w:t>
+        <w:t xml:space="preserve">He’d taken on a family that didn’t start with him. A wife who waited tables. Two boys who weren’t his by blood. Endless bills. He owned all of it.</w:t>
+      </w:r>
+    </w:p>
+    <w:p>
+      <w:pPr>
+        <w:pStyle w:val="BodyText"/>
+      </w:pPr>
+      <w:r>
+        <w:t xml:space="preserve">The recruiter had put it to him straight, the way you tell a man something for his own good. You want a real shot, he said, you’ve got to dye the gray. They’re going to look at you and see an old man. A grown man, a husband, a father, told he had to look younger than his years to be deemed worthy of a chance.</w:t>
       </w:r>
     </w:p>
     <w:p>
@@ -4932,7 +4854,7 @@
         <w:pStyle w:val="BodyText"/>
       </w:pPr>
       <w:r>
-        <w:t xml:space="preserve">They told him no, and the next morning he knotted the tie again. He wasn’t loud about what he carried. He carried it. Eventually, he found work. No one could keep a man like Lou down.</w:t>
+        <w:t xml:space="preserve">They told him no, and the next morning he knotted the tie again. He wasn’t loud about what he carried. He carried it. Eventually, he found work.</w:t>
       </w:r>
     </w:p>
     <w:p>
@@ -5080,7 +5002,7 @@
         <w:pStyle w:val="BodyText"/>
       </w:pPr>
       <w:r>
-        <w:t xml:space="preserve">That was the world I grew up in. Dad knew everybody, and in a deeper way than people who meet at networking events. He actually did — the people you’d expect and the ones you wouldn’t. His world had more layers than I understood as a kid. Lou didn’t explain himself. He just lived it, and every so often you’d catch a glimpse and think: who is my father?</w:t>
+        <w:t xml:space="preserve">That was the world I grew up in. Dad knew everybody, the people you’d expect and the ones you wouldn’t, and every so often you’d catch a glimpse and think: who is my father?</w:t>
       </w:r>
     </w:p>
     <w:p>
@@ -5218,7 +5140,7 @@
         <w:pStyle w:val="BodyText"/>
       </w:pPr>
       <w:r>
-        <w:t xml:space="preserve">That was Lou. He could not help mentioning the people he knew — the Rascals, Dickie V, a guy from the union hall — all in the same breath and the same easy tone. It should have been insufferable. It wasn’t, and the reason is simple: every name was true. He never inflated a thing, and that was the funny part. He’d really been there for all of it, and he name-dropped the way a kid spreads out his baseball cards — not to impress you, just tickled you were finally looking.</w:t>
+        <w:t xml:space="preserve">That was Lou. He could not help mentioning the people he knew — the Rascals, Dickie V, a guy from the union hall — all in the same easy tone. It should have been insufferable. It wasn’t, because every name was true. He name-dropped the way a kid spreads out his baseball cards, tickled you were finally looking.</w:t>
       </w:r>
     </w:p>
     <w:p>
@@ -5264,7 +5186,7 @@
         <w:pStyle w:val="BodyText"/>
       </w:pPr>
       <w:r>
-        <w:t xml:space="preserve">He had lines, and he didn’t know they were lines. He’d bring home bagels, and you’d say, Dad, these are the best bagels I’ve ever had. And he’d look at you, dead serious: what’s a matta you, you don’t like ’em? You couldn’t win, and that was the point. He could turn a compliment into a bit without cracking a smile. My friends and I still say it. What’s a matta you, you don’t like it? What’s a matta you, you do? We say it to each other and we know exactly where it came from. That’s the thing about a man like Lou. He leaves you his lines, and you keep saying them, and a little of him keeps showing up in your kitchen years after he’s gone.</w:t>
+        <w:t xml:space="preserve">He had lines, and he didn’t know they were lines. He’d bring home bagels, and you’d say, Dad, these are the best bagels I’ve ever had. And he’d look at you, dead serious: what’s a matta you, you don’t like ’em? You couldn’t win, and that was the point. He could turn a compliment into a bit without cracking a smile. My friends and I still say it. What’s a matta you, you don’t like it? What’s a matta you, you do? We say it to each other and we know exactly where it came from. He leaves you his lines, and you keep saying them, and a little of him keeps showing up in your kitchen years after he’s gone.</w:t>
       </w:r>
     </w:p>
     <w:p>
@@ -5298,7 +5220,7 @@
         <w:t xml:space="preserve"> </w:t>
       </w:r>
       <w:r>
-        <w:t xml:space="preserve">he said with his winning smile. That was their whole courtship, right there in two words. He could end a joke with a straight face and start a marriage the same way. They remained together nearly twenty-five years.</w:t>
+        <w:t xml:space="preserve">he said with his winning smile. That was their whole courtship, right there in two words. He could end a joke with a straight face and start a marriage the same way. They were together nearly twenty-five years.</w:t>
       </w:r>
     </w:p>
     <w:p>
@@ -5348,7 +5270,7 @@
         <w:pStyle w:val="BodyText"/>
       </w:pPr>
       <w:r>
-        <w:t xml:space="preserve">My brother and I called him the most interesting man in the world. It started as a joke, the guy from the Dos Equis commercials. Stay thirsty, my friends. Then we realized we weren’t joking. He really was. Not for the people he knew, but for who he’d be in a kitchen on an ordinary night, keeping a straight face, waiting for you to fall for it.</w:t>
+        <w:t xml:space="preserve">My brother and I called him the most interesting man in the world. It started as a joke, the guy from the Dos Equis commercials. Stay thirsty, my friends. Then we realized we weren’t joking. Not for the people he knew, but for who he’d be in a kitchen on an ordinary night, keeping a straight face, waiting for you to fall for it.</w:t>
       </w:r>
     </w:p>
     <w:p>
@@ -5432,14 +5354,6 @@
         <w:pStyle w:val="BodyText"/>
       </w:pPr>
       <w:r>
-        <w:t xml:space="preserve">Lou’s world had made me. Then it sent me off to build one of my own.</w:t>
-      </w:r>
-    </w:p>
-    <w:p>
-      <w:pPr>
-        <w:pStyle w:val="BodyText"/>
-      </w:pPr>
-      <w:r>
         <w:t xml:space="preserve">The first time I saw it, my dad drove me out for a wrestling visit. We came off the highway and the world turned to corn — stalks in every direction, mile after flat mile, the kind of empty a Jersey kid has no category for. It looked like we’d taken a wrong turn into Iowa. Where are we even going, I kept thinking, out here in the middle of nowhere. Then the fields gave way and there it was: red brick and old trees, one of the most beautiful campuses I’d ever seen, set down in the middle of all that farmland.</w:t>
       </w:r>
     </w:p>
@@ -5657,7 +5571,7 @@
         <w:pStyle w:val="BodyText"/>
       </w:pPr>
       <w:r>
-        <w:t xml:space="preserve">I understand addiction now in a way I can finally explain. It doesn’t mean you’re using all the time. It means you want to use all the time. You can’t wait for the next pill, the next drink, and some part of you is already counting down to it no matter how good the day is going.</w:t>
+        <w:t xml:space="preserve">Addiction doesn’t mean you’re using all the time. It means you want to use all the time. You can’t wait for the next pill, the next drink, and some part of you is already counting down to it no matter how good the day is going.</w:t>
       </w:r>
     </w:p>
     <w:p>
@@ -5879,15 +5793,15 @@
         <w:pStyle w:val="BodyText"/>
       </w:pPr>
       <w:r>
-        <w:t xml:space="preserve">That feeling, the one that hadn’t come after the county championship, or the wrestling room, or Kappa Sig, came in Cancun, ten feet from Timberlake with cameras pointed my way. I’d finally found the feeling. From then on I knew exactly what I was chasing.</w:t>
-      </w:r>
-    </w:p>
-    <w:p>
-      <w:pPr>
-        <w:pStyle w:val="BodyText"/>
-      </w:pPr>
-      <w:r>
-        <w:t xml:space="preserve">Lou could have sent me to community college, a local school, a hundred cheaper options. Instead, he let me go to Miami and took out loans to do it. He was splitting a rental house in Mahwah with his friend Roger, who’d been through a divorce of his own, and Lou’s room was the small one upstairs. When Chris and I visited him, we could read it in his body when things were weighing on him. He never put it on us. He carried it, quietly, the way he carried everything.</w:t>
+        <w:t xml:space="preserve">That feeling, the one that hadn’t come after the county championship, or the wrestling room, or Kappa Sig, came in Cancun, ten feet from Timberlake with cameras pointed my way. From then on I knew exactly what I was chasing.</w:t>
+      </w:r>
+    </w:p>
+    <w:p>
+      <w:pPr>
+        <w:pStyle w:val="BodyText"/>
+      </w:pPr>
+      <w:r>
+        <w:t xml:space="preserve">Lou could have sent me to community college, a local school, a hundred cheaper options. Instead, he let me go to Miami and took out loans to do it. He was splitting a rental house in Mahwah with his friend Roger, who’d been through a divorce of his own, and Lou’s room was the small one upstairs. When Chris and I visited him, we could read it in his body when things were weighing on him. He never put it on us.</w:t>
       </w:r>
     </w:p>
     <w:p>
@@ -5903,7 +5817,7 @@
         <w:pStyle w:val="BodyText"/>
       </w:pPr>
       <w:r>
-        <w:t xml:space="preserve">The man who made it possible was sharing a rental, paying back loans for years, never once making the cost feel like something I owed him. I graduated in May 2000, Lou and my mom in the crowd, tracking the sea of identical caps until they found mine. I pointed my car west. California beckoned.</w:t>
+        <w:t xml:space="preserve">The man who made it possible was sharing a rental and paying back loans for years. I graduated in May 2000, Lou and my mom in the crowd, tracking the sea of identical caps until they found mine. I pointed my car west.</w:t>
       </w:r>
     </w:p>
     <w:p>
@@ -6059,7 +5973,7 @@
         <w:pStyle w:val="BodyText"/>
       </w:pPr>
       <w:r>
-        <w:t xml:space="preserve">Validation. For about a minute, I told myself that I’d made it. People recognized me, accepted me, and loved me for who I was. Or they loved the idea of me and who I pretended to be. Then the feeling passed, and the hunger underneath was still there.</w:t>
+        <w:t xml:space="preserve">For about a minute, I told myself I’d made it. Then the feeling passed, and the hunger underneath was still there.</w:t>
       </w:r>
     </w:p>
     <w:p>
@@ -6083,7 +5997,7 @@
         <w:pStyle w:val="BodyText"/>
       </w:pPr>
       <w:r>
-        <w:t xml:space="preserve">The hunger stayed. I transferred to the highest-grossing Abercrombie in the country, in Newport Beach. Then came sales. Then medical devices, the job I’d always wanted, pharma or devices, where the top guys made upwards of three hundred thousand a year. Every move felt like a rung on the ladder. By twenty-four, I was clearing six figures.</w:t>
+        <w:t xml:space="preserve">The hunger stayed. I transferred to the highest-grossing Abercrombie in the country, in Newport Beach. Then came sales. Then medical devices, the job I’d always wanted, pharma or devices, where the top guys made upwards of three hundred thousand a year. By twenty-four, I was clearing six figures.</w:t>
       </w:r>
     </w:p>
     <w:p>
@@ -6123,31 +6037,15 @@
         <w:pStyle w:val="BodyText"/>
       </w:pPr>
       <w:r>
-        <w:t xml:space="preserve">Then it stacked — performance on performance, year after year — until I forgot there was anyone underneath the costume. Close your eyes and try to imagine Bob Denver from</w:t>
-      </w:r>
-      <w:r>
-        <w:t xml:space="preserve"> </w:t>
-      </w:r>
-      <w:r>
-        <w:rPr>
-          <w:iCs/>
-          <w:i/>
-        </w:rPr>
-        <w:t xml:space="preserve">Gilligan’s Island</w:t>
-      </w:r>
-      <w:r>
-        <w:t xml:space="preserve"> </w:t>
-      </w:r>
-      <w:r>
-        <w:t xml:space="preserve">playing any other role. As an actor, I’m sure he could have created other characters. But I couldn’t. I was no longer playing a part. I became the role I projected to others. The only times I wasn’t acting were when I was alone with my thoughts. Which wasn’t often.</w:t>
-      </w:r>
-    </w:p>
-    <w:p>
-      <w:pPr>
-        <w:pStyle w:val="BodyText"/>
-      </w:pPr>
-      <w:r>
-        <w:t xml:space="preserve">I took a sales job in 2002. Abercrombie paid me thirty thousand a year. The uniform company offered a fifty-thousand-dollar base salary, thirty more in commission, and a car package, and it looked like the next step up, into business-to-business sales. For a while, it felt like proof California hadn’t broken me. At twenty-three it felt like solid ground for the first time in years.</w:t>
+        <w:t xml:space="preserve">Then it stacked — performance on performance, year after year — until I forgot there was anyone underneath the costume. The only times I wasn’t acting were when I was alone with my thoughts. Which wasn’t often.</w:t>
+      </w:r>
+    </w:p>
+    <w:p>
+      <w:pPr>
+        <w:pStyle w:val="BodyText"/>
+      </w:pPr>
+      <w:r>
+        <w:t xml:space="preserve">I took a sales job in 2002. Abercrombie paid me thirty thousand a year. The uniform company offered a fifty-thousand-dollar base salary, thirty more in commission, and a car package, and it looked like the next step up, into business-to-business sales. At twenty-three it felt like solid ground for the first time in years.</w:t>
       </w:r>
     </w:p>
     <w:p>
@@ -6171,26 +6069,6 @@
         <w:pStyle w:val="BodyText"/>
       </w:pPr>
       <w:r>
-        <w:t xml:space="preserve">I wanted, or more accurately, I needed his validation. Anyone’s validation. With false bravado and fake self-esteem, I couldn’t generate true confidence inside myself or pat myself on my back. I required others to tell me,</w:t>
-      </w:r>
-      <w:r>
-        <w:t xml:space="preserve"> </w:t>
-      </w:r>
-      <w:r>
-        <w:t xml:space="preserve">“</w:t>
-      </w:r>
-      <w:r>
-        <w:t xml:space="preserve">You done good.</w:t>
-      </w:r>
-      <w:r>
-        <w:t xml:space="preserve">”</w:t>
-      </w:r>
-    </w:p>
-    <w:p>
-      <w:pPr>
-        <w:pStyle w:val="BodyText"/>
-      </w:pPr>
-      <w:r>
         <w:t xml:space="preserve">“</w:t>
       </w:r>
       <w:r>
@@ -6265,7 +6143,7 @@
         <w:pStyle w:val="BodyText"/>
       </w:pPr>
       <w:r>
-        <w:t xml:space="preserve">I already knew the feeling. I had met it in Oxford in 1999 and spent the years after graduation telling myself that was college. San Diego was different because I stopped waiting for the feeling to find me. Now there was a bottle, a reason, and a workday attached. The part of me always checking the room, always reading faces to know who to be, could be switched off on schedule. That was the change: not discovering the drug, but deciding to give it untethered access to my life.</w:t>
+        <w:t xml:space="preserve">I already knew the feeling. I had met it in Oxford in 1999 and spent the years after graduation telling myself that was college. San Diego was different because I stopped waiting for the feeling to find me. Now there was a bottle, a reason, and a workday attached. The part of me always checking the room, always reading faces to know who to be, could be switched off on schedule. The change was deciding to give it untethered access to my life.</w:t>
       </w:r>
     </w:p>
     <w:p>
@@ -6289,7 +6167,7 @@
         <w:pStyle w:val="BodyText"/>
       </w:pPr>
       <w:r>
-        <w:t xml:space="preserve">By then I had my own prescription in California. Easy access didn’t satisfy the chase; it amplified it. The arithmetic was simple: more to get the same effect, then more again. When California ran dry, I crossed into Tijuana to resupply. One of those runs resulted in where I started my story: in a jail wishing I could disappear against the wall.</w:t>
+        <w:t xml:space="preserve">By then I had my own prescription in California. Easy access didn’t satisfy the chase; it amplified it. The arithmetic was simple: more to get the same effect, then more again. When California ran dry, I crossed into Tijuana to resupply. One of those runs ended where I started this story: in a jail, wishing I could disappear against the wall.</w:t>
       </w:r>
     </w:p>
     <w:p>
@@ -6329,7 +6207,7 @@
         <w:pStyle w:val="BodyText"/>
       </w:pPr>
       <w:r>
-        <w:t xml:space="preserve">But what the fortune teller told me was true. While I chased a feeling, the people who loved me lay awake. My mother. Nancey. Lou. Chris. I lied to them. Manipulated them. Stole. I turned their trust into fuel and left them carrying a wreckage I barely looked back at.</w:t>
+        <w:t xml:space="preserve">While I chased a feeling, the people who loved me lay awake. My mother. Nancey. Lou. Chris. I lied to them. Manipulated them. Stole. I turned their trust into fuel and left them carrying a wreckage I barely looked back at.</w:t>
       </w:r>
     </w:p>
     <w:p>
@@ -6445,7 +6323,7 @@
         <w:pStyle w:val="BodyText"/>
       </w:pPr>
       <w:r>
-        <w:t xml:space="preserve">I made it four years, just six years short of the ten I needed to take advantage of the reduced sentence. In the four years between those two arrests were stellar ones for me, at least on paper —rankings, president’s clubs, money, my face on screens across the country. I needed ten clean years for the wet reckless to stay a wet reckless. I made it just four.</w:t>
+        <w:t xml:space="preserve">I made it four years. On paper they were stellar ones — rankings, president’s clubs, money, my face on screens across the country. I needed ten clean years for the wet reckless to stay a wet reckless. I made it four.</w:t>
       </w:r>
     </w:p>
     <w:p>
@@ -6481,47 +6359,7 @@
           <w:iCs/>
           <w:i/>
         </w:rPr>
-        <w:t xml:space="preserve">Doesn’t this cop know who I think I am? I think I’m a</w:t>
-      </w:r>
-      <w:r>
-        <w:t xml:space="preserve"> </w:t>
-      </w:r>
-      <w:r>
-        <w:rPr>
-          <w:iCs/>
-          <w:i/>
-        </w:rPr>
-        <w:t xml:space="preserve">former high school top wrestler in New Jersey who danced in front of the cameras alongside celebrities on MTV. I think I’m Abercrombie and Fitch famous, having appeared</w:t>
-      </w:r>
-      <w:r>
-        <w:t xml:space="preserve"> </w:t>
-      </w:r>
-      <w:r>
-        <w:rPr>
-          <w:iCs/>
-          <w:i/>
-        </w:rPr>
-        <w:t xml:space="preserve">on their in-house television commercials playing</w:t>
-      </w:r>
-      <w:r>
-        <w:t xml:space="preserve"> </w:t>
-      </w:r>
-      <w:r>
-        <w:rPr>
-          <w:iCs/>
-          <w:i/>
-        </w:rPr>
-        <w:t xml:space="preserve">in every store.</w:t>
-      </w:r>
-      <w:r>
-        <w:t xml:space="preserve"> </w:t>
-      </w:r>
-      <w:r>
-        <w:rPr>
-          <w:iCs/>
-          <w:i/>
-        </w:rPr>
-        <w:t xml:space="preserve">I think I’m a top salesperson, a guy with tons of friends, mountains of charm, and success dripping out of me at every turn.</w:t>
+        <w:t xml:space="preserve">Doesn’t this cop know who I think I am? I think I’m a former high school top wrestler in New Jersey who danced in front of the cameras alongside celebrities on MTV. I think I’m Abercrombie and Fitch famous, having appeared on their in-house television commercials playing in every store. I think I’m a top salesperson, a guy with tons of friends, mountains of charm, and success dripping out of me at every turn.</w:t>
       </w:r>
     </w:p>
     <w:p>
@@ -6549,7 +6387,7 @@
         <w:pStyle w:val="BodyText"/>
       </w:pPr>
       <w:r>
-        <w:t xml:space="preserve">The sound of the handcuffs told me that my pleas had been ignored. My words changed nothing, just like my first DUI had changed nothing.</w:t>
+        <w:t xml:space="preserve">The sound of the handcuffs told me my pleas had been ignored.</w:t>
       </w:r>
     </w:p>
     <w:p>
@@ -6565,14 +6403,6 @@
         <w:pStyle w:val="BodyText"/>
       </w:pPr>
       <w:r>
-        <w:t xml:space="preserve">The first DUI happened in 2002, the second in 2006.</w:t>
-      </w:r>
-    </w:p>
-    <w:p>
-      <w:pPr>
-        <w:pStyle w:val="BodyText"/>
-      </w:pPr>
-      <w:r>
         <w:t xml:space="preserve">They held me until I was sober enough to leave. There was no pleading this one down. The ten years weren’t up, so the wet reckless counted as my first DUI and this one was sentenced as my second. Eighteen months without a license. You can’t do medical device sales from the passenger seat. The six figures, the trajectory, the identity — gone. I lied to my boss about why I couldn’t drive and carried that lie into every call I still managed to make.</w:t>
       </w:r>
     </w:p>
@@ -6581,15 +6411,15 @@
         <w:pStyle w:val="BodyText"/>
       </w:pPr>
       <w:r>
-        <w:t xml:space="preserve">For years I told the story as a joke — the nachos, the parking lot, the absurdity. The joke was armor. The truth was two DUIs and a Tijuana jail in four years. That was the real scorecard.</w:t>
-      </w:r>
-    </w:p>
-    <w:p>
-      <w:pPr>
-        <w:pStyle w:val="BodyText"/>
-      </w:pPr>
-      <w:r>
-        <w:t xml:space="preserve">The problem with hitting rock bottom is that sometimes you bounce. And then you have to hit again. And again. My elevator hadn’t yet reached bottom.</w:t>
+        <w:t xml:space="preserve">For years I told the story as a joke — the nachos, the parking lot, the absurdity. The joke was armor. The truth was two DUIs and a Tijuana jail in four years.</w:t>
+      </w:r>
+    </w:p>
+    <w:p>
+      <w:pPr>
+        <w:pStyle w:val="BodyText"/>
+      </w:pPr>
+      <w:r>
+        <w:t xml:space="preserve">The problem with hitting rock bottom is that sometimes you bounce. And then you have to hit again. And again.</w:t>
       </w:r>
     </w:p>
     <w:p>
@@ -6693,7 +6523,7 @@
         <w:pStyle w:val="BodyText"/>
       </w:pPr>
       <w:r>
-        <w:t xml:space="preserve">Chris is three years younger than me. He wrestled at the University of Pennsylvania and had always been one of the steadiest people in my life. I will always be three years older than Chris, but by 2006, he had officially taken over the role of acting like the older brother without being asked to.</w:t>
+        <w:t xml:space="preserve">Chris is three years younger than me. He wrestled at the University of Pennsylvania and had always been one of the steadiest people in my life. I will always be three years older than Chris, but by 2006, he had taken over the role of the older brother without being asked to.</w:t>
       </w:r>
     </w:p>
     <w:p>
@@ -6715,19 +6545,13 @@
       <w:r>
         <w:t xml:space="preserve">”</w:t>
       </w:r>
-      <w:r>
-        <w:t xml:space="preserve"> </w:t>
-      </w:r>
-      <w:r>
-        <w:t xml:space="preserve">That was the kind of grace he gave me during those years.</w:t>
-      </w:r>
-    </w:p>
-    <w:p>
-      <w:pPr>
-        <w:pStyle w:val="BodyText"/>
-      </w:pPr>
-      <w:r>
-        <w:t xml:space="preserve">Most people who enter detox and rehab do so because they’ve finally admitted that they are powerless over their addiction and are willing to do whatever they need to do to get sober. But I’m not like other people. And that’s not why I went to detox. I went to detox because the court gave me two options: rehab or jail. Court-ordered, but I still had to pay for it, and if I didn’t go I’d lose my job and go to jail. In the weeks between the arrest and the drive to Anaheim, I kept using. Because I’d been taking Xanax, I needed to start with three days of detox in Anaheim before I’d be sent to rehab in Laguna Beach.</w:t>
+    </w:p>
+    <w:p>
+      <w:pPr>
+        <w:pStyle w:val="BodyText"/>
+      </w:pPr>
+      <w:r>
+        <w:t xml:space="preserve">Most people go to detox because they’ve finally admitted they’re powerless over their addiction. I went because the court gave me two options: rehab or jail. Court-ordered, but I still had to pay for it, and if I didn’t go I’d lose my job and go to jail. In the weeks between the arrest and the drive to Anaheim, I kept using. Because I’d been taking Xanax, I needed to start with three days of detox in Anaheim before I’d be sent to rehab in Laguna Beach.</w:t>
       </w:r>
     </w:p>
     <w:p>
@@ -6751,7 +6575,7 @@
         <w:pStyle w:val="BodyText"/>
       </w:pPr>
       <w:r>
-        <w:t xml:space="preserve">Looking back, what hurts the most is that I wasn’t broken by what I’d been putting my family through. I didn’t consider the inconvenience I’d become to others, who needed to come up with money, take time off work for court hearings, taking me to rehab, seeing me on family days. I’d become a taker.</w:t>
+        <w:t xml:space="preserve">Looking back, what hurts the most is that I wasn’t broken by what I’d been putting my family through. I didn’t consider the inconvenience I’d become to others, who needed to come up with money, take time off work for court hearings, drive me to rehab, see me on family days. I’d become a taker.</w:t>
       </w:r>
     </w:p>
     <w:p>
@@ -6775,15 +6599,15 @@
         <w:pStyle w:val="BodyText"/>
       </w:pPr>
       <w:r>
-        <w:t xml:space="preserve">Chris did not make a scene. He didn’t lecture me or turn the bottle into some bigger moment than it already was. He sat there and stayed calm, he had his own problems and very little room to express them because mine had become so large.</w:t>
-      </w:r>
-    </w:p>
-    <w:p>
-      <w:pPr>
-        <w:pStyle w:val="BodyText"/>
-      </w:pPr>
-      <w:r>
-        <w:t xml:space="preserve">I watched Chris as he pulled away. Temporarily, I felt grateful for him until I reminded myself that nobody was going to have much sympathy for me for what I was about to go through. I had gotten myself there. There wasn’t much more thought behind it than that.</w:t>
+        <w:t xml:space="preserve">Chris did not make a scene. He didn’t lecture me or turn the bottle into some bigger moment than it already was. He sat there and stayed calm. He had his own problems and very little room to express them, because mine had become so large.</w:t>
+      </w:r>
+    </w:p>
+    <w:p>
+      <w:pPr>
+        <w:pStyle w:val="BodyText"/>
+      </w:pPr>
+      <w:r>
+        <w:t xml:space="preserve">I watched Chris pull away. For a moment I felt grateful for him. Then I reminded myself that nobody was going to have much sympathy for what I was about to go through. I had gotten myself there.</w:t>
       </w:r>
     </w:p>
     <w:p>
@@ -6799,7 +6623,7 @@
         <w:pStyle w:val="BodyText"/>
       </w:pPr>
       <w:r>
-        <w:t xml:space="preserve">I wasn’t sitting there analyzing my addiction or thinking about what sobriety would mean. I was numb and trying to get by minute by minute. The pills wearing off were part of it, but there was also the non-life waiting for me when I got out — no license, a career I didn’t know how to save, and a need to make money. I had no room for bigger realizations or spiritual awakenings.</w:t>
+        <w:t xml:space="preserve">I wasn’t sitting there analyzing my addiction or thinking about what sobriety would mean. I was numb and trying to get by minute by minute. The pills wearing off were part of it, but there was also the non-life waiting for me when I got out — no license, a career I didn’t know how to save, and a need to make money.</w:t>
       </w:r>
     </w:p>
     <w:p>
@@ -6941,15 +6765,15 @@
         <w:pStyle w:val="BodyText"/>
       </w:pPr>
       <w:r>
-        <w:t xml:space="preserve">And that’s why I didn’t fit in with these other people. Those around me were dumpster fires. I mean, they had serious problems with drugs and/or alcohol. They clearly had the disease of addiction. But that wasn’t me. The reason I ended up in detox and rehab was because I’d made a mistake, plain and simple. I didn’t have a sickness or any ism. I just screwed up. After a night of unwinding too hard, I got the munchies, craved some nachos, and got arrested. Not like these other people around me.</w:t>
-      </w:r>
-    </w:p>
-    <w:p>
-      <w:pPr>
-        <w:pStyle w:val="BodyText"/>
-      </w:pPr>
-      <w:r>
-        <w:t xml:space="preserve">So I did what I had always done in a room I couldn’t win. I performed. I went to every session. I sat in the circles. I said the things that sounded like progress and filled out the worksheets in full sentences. If they’d asked me to sing Kumbaya, I’d have stood up, held hands with those next to me, and led the group in full choral production. I had more than 2 years of faking my life. Those around me probably thought I was the most committed, open person they’d seen in these rooms. All an act. Inside I counted days, and each one brought me one day closer to when I could use again.</w:t>
+        <w:t xml:space="preserve">Those around me were dumpster fires. They had serious problems with drugs and alcohol. They clearly had the disease of addiction. But that wasn’t me. The reason I ended up in detox and rehab was because I’d made a mistake, plain and simple. I didn’t have a sickness or any ism. I just screwed up. After a night of unwinding too hard, I got the munchies, craved some nachos, and got arrested. Not like these other people around me.</w:t>
+      </w:r>
+    </w:p>
+    <w:p>
+      <w:pPr>
+        <w:pStyle w:val="BodyText"/>
+      </w:pPr>
+      <w:r>
+        <w:t xml:space="preserve">So I did what I had always done in a room I couldn’t win. I performed. I went to every session. I sat in the circles. I said the things that sounded like progress and filled out the worksheets in full sentences. If they’d asked me to sing Kumbaya, I’d have stood up, held hands with those next to me, and led the group in full choral production. I had more than two years of faking my life. Those around me probably thought I was the most committed, open person they’d seen in these rooms. All an act. Inside I counted days, and each one brought me one day closer to when I could use again.</w:t>
       </w:r>
     </w:p>
     <w:p>
@@ -6965,7 +6789,7 @@
         <w:pStyle w:val="BodyText"/>
       </w:pPr>
       <w:r>
-        <w:t xml:space="preserve">And the bigger problem was that my therapist knew. Every day I told her the same thing. I can’t get off the pills. I need them. I can’t function without them. And every day she said the same thing back. You have to stop. You can’t keep doing this. I heard her. I didn’t believe her. The pills had been the answer so long I couldn’t picture a version of myself that ran without them, and without them I was the scared kid from Mexico City who couldn’t sit still and didn’t believe he was enough.</w:t>
+        <w:t xml:space="preserve">My therapist knew. Every day I told her the same thing. I can’t get off the pills. I need them. I can’t function without them. And every day she said the same thing back. You have to stop. You can’t keep doing this. I heard her. I didn’t believe her. The pills had been the answer so long I couldn’t picture a version of myself that ran without them, and without them I was the scared kid from Mexico City who couldn’t sit still and didn’t believe he was enough.</w:t>
       </w:r>
     </w:p>
     <w:p>
@@ -6974,36 +6798,6 @@
       </w:pPr>
       <w:r>
         <w:t xml:space="preserve">I finished the program. I got the paperwork. I checked every box they put in front of me, and I walked out the same man who had walked in, with a certificate that said otherwise.</w:t>
-      </w:r>
-    </w:p>
-    <w:p>
-      <w:pPr>
-        <w:pStyle w:val="BodyText"/>
-      </w:pPr>
-      <w:r>
-        <w:t xml:space="preserve">Three years later I would walk into a farmhouse in the Florida panhandle and say the one thing I never said in Laguna Beach.</w:t>
-      </w:r>
-    </w:p>
-    <w:p>
-      <w:pPr>
-        <w:pStyle w:val="BodyText"/>
-      </w:pPr>
-      <w:r>
-        <w:t xml:space="preserve">“</w:t>
-      </w:r>
-      <w:r>
-        <w:t xml:space="preserve">I am powerless.</w:t>
-      </w:r>
-      <w:r>
-        <w:t xml:space="preserve">”</w:t>
-      </w:r>
-    </w:p>
-    <w:p>
-      <w:pPr>
-        <w:pStyle w:val="BodyText"/>
-      </w:pPr>
-      <w:r>
-        <w:t xml:space="preserve">The difference between those two rooms wasn’t the rooms. It was whether I meant it.</w:t>
       </w:r>
     </w:p>
     <w:p>
@@ -7117,7 +6911,7 @@
         <w:pStyle w:val="BodyText"/>
       </w:pPr>
       <w:r>
-        <w:t xml:space="preserve">Nancey lived in Boca Raton. She had always been the one who showed up. Wrestling matches, graduations, every moment that mattered, she was in the corner. But this was the first time it was the two of us. No Mom, no Chris, no occasion. Me at her door with nowhere better to go.</w:t>
+        <w:t xml:space="preserve">Nancey lived in Boca Raton. She had always been in the corner, wrestling matches, graduations. This was the first time it was the two of us. No Mom, no Chris, no occasion. Me at her door with nowhere better to go.</w:t>
       </w:r>
     </w:p>
     <w:p>
@@ -7157,7 +6951,7 @@
         <w:pStyle w:val="BodyText"/>
       </w:pPr>
       <w:r>
-        <w:t xml:space="preserve">She knew I was in a dark place. She didn’t try to fix it. She didn’t ask me to explain it or show her progress. She sat with me until I was ready, and I wasn’t ready.</w:t>
+        <w:t xml:space="preserve">She knew I was in a dark place. She didn’t try to fix it. She sat with me until I was ready, and I wasn’t ready.</w:t>
       </w:r>
     </w:p>
     <w:p>
@@ -7327,7 +7121,7 @@
         <w:pStyle w:val="BodyText"/>
       </w:pPr>
       <w:r>
-        <w:t xml:space="preserve">I don’t remember deciding to tell Lou how bad it had gotten. Maybe Chris called him. Maybe my mother did. Maybe he simply knew. What I remember is opening the door and watching him take in the notes, the extension cord, the weight gone off me, the smell of a place where someone had stopped taking care of himself. No lecture. No what did you do to yourself. He looked around once and understood.</w:t>
+        <w:t xml:space="preserve">I don’t remember deciding to tell Lou how bad it had gotten. Maybe Chris called him. Maybe my mother did. Maybe he simply knew. What I remember is opening the door and watching him take in the notes, the extension cord, the weight gone off me, the smell of a place where someone had stopped taking care of himself. He looked around once and understood.</w:t>
       </w:r>
     </w:p>
     <w:p>
@@ -7751,7 +7545,7 @@
         <w:pStyle w:val="BodyText"/>
       </w:pPr>
       <w:r>
-        <w:t xml:space="preserve">That was it. No speech. He didn’t ask what had changed or why now or whether I meant it this time. He had the bottle and he had my word, and he was going to act on both before I could take either one back.</w:t>
+        <w:t xml:space="preserve">He didn’t ask what had changed or why now or whether I meant it this time. He had the bottle and he had my word, and he was going to act on both before I could take either one back.</w:t>
       </w:r>
     </w:p>
     <w:p>
@@ -7917,7 +7711,7 @@
         <w:pStyle w:val="BodyText"/>
       </w:pPr>
       <w:r>
-        <w:t xml:space="preserve">January 9, 2009. That’s the date I count from. The night before, Lou took me to Carrabba’s. My last meal as a drinking man. One glass of wine. He didn’t make a ceremony of it or say a word against it. He sat across from me the way he had sat across from every hard thing in my life.</w:t>
+        <w:t xml:space="preserve">January 9, 2009. That’s the date I count from. The night before, Lou took me to Carrabba’s. My last meal as a drinking man. One glass of wine. He didn’t say a word against it. He sat across from me the way he had sat across from every hard thing in my life.</w:t>
       </w:r>
     </w:p>
     <w:p>
@@ -7949,14 +7743,6 @@
         <w:pStyle w:val="BodyText"/>
       </w:pPr>
       <w:r>
-        <w:t xml:space="preserve">Underneath the costume, one thing had survived. Wrestling had taught me that humiliation didn’t have to be the ending. I had been pinned in nineteen seconds, gone 2–4 as a freshman, and still left high school with a county title. Somewhere under the pills and the pressed polo, that kid was still there.</w:t>
-      </w:r>
-    </w:p>
-    <w:p>
-      <w:pPr>
-        <w:pStyle w:val="BodyText"/>
-      </w:pPr>
-      <w:r>
         <w:t xml:space="preserve">About a dozen of us lived in the house. Dan was one of the therapists, a man who had been where I was and come out the other side. There was a nineteen-year-old gymnast, Olympic-level before addiction pulled him off course. There was Mike, quiet and steady, the kind of man who looked out for you without announcing it. And there was Chad — forty-three, bodybuilder, chef, crack addict, funny as hell. Chad was the one who told me the truth.</w:t>
       </w:r>
     </w:p>
@@ -7973,14 +7759,6 @@
         <w:pStyle w:val="BodyText"/>
       </w:pPr>
       <w:r>
-        <w:t xml:space="preserve">For the first time, I could see where the road went.</w:t>
-      </w:r>
-    </w:p>
-    <w:p>
-      <w:pPr>
-        <w:pStyle w:val="BodyText"/>
-      </w:pPr>
-      <w:r>
         <w:t xml:space="preserve">The first week I couldn’t look at myself in the bathroom mirror. I brushed my teeth staring at the faucet because I knew if I raised my head and caught my own eyes, I’d break.</w:t>
       </w:r>
     </w:p>
@@ -7997,7 +7775,7 @@
         <w:pStyle w:val="BodyText"/>
       </w:pPr>
       <w:r>
-        <w:t xml:space="preserve">Then it started raining. Not a storm. Rain from a clear sky, on the fire, on my face, on the other men. It lasted maybe a minute. Something sealed shut in me broke open. That was the first night I believed God was there with me — not in theory, not in a Sunday-morning way. In a muddy field in Chumuckla.</w:t>
+        <w:t xml:space="preserve">Then it started raining. Not a storm. Rain from a clear sky, on the fire, on my face, on the other men. It lasted maybe a minute. Something sealed shut in me broke open. That was the first night I believed God was there with me. In a muddy field in Chumuckla.</w:t>
       </w:r>
     </w:p>
     <w:p>
@@ -8083,7 +7861,7 @@
         <w:t xml:space="preserve"> </w:t>
       </w:r>
       <w:r>
-        <w:t xml:space="preserve">Thirty years old, ninety days sober, the man who had driven me in now driving me out. Whatever came next was on me.</w:t>
+        <w:t xml:space="preserve">Thirty years old, ninety days sober, the man who had driven me in now driving me out.</w:t>
       </w:r>
     </w:p>
     <w:p>
@@ -8191,7 +7969,7 @@
         <w:pStyle w:val="BodyText"/>
       </w:pPr>
       <w:r>
-        <w:t xml:space="preserve">My second stint at rehab created no turnaround. No doors swinging open. Just time, without applause, without shortcuts. I stayed in Pensacola, close to Lou and Donna, in the same routines long enough that they stopped feeling temporary.</w:t>
+        <w:t xml:space="preserve">No turnaround. No doors swinging open. Just time, without applause, without shortcuts. I stayed in Pensacola, close to Lou and Donna, in the same routines long enough that they stopped feeling temporary.</w:t>
       </w:r>
     </w:p>
     <w:p>
@@ -8231,31 +8009,31 @@
         <w:pStyle w:val="BodyText"/>
       </w:pPr>
       <w:r>
-        <w:t xml:space="preserve">That year I understood why people go back out. It isn’t weakness. It isn’t wanting it any less. The first year asked the most of me when I had the least. They say it takes about a year for the brain to learn to produce its own rewards again, and I believe it, because mine wasn’t making any. Nothing felt good on its own yet. And that is precisely when the program hands you a pen and asks you to take an honest inventory of the wreckage, the people you owe, the trust you burned, the years you can’t give back, and start walking toward all of it. You’re asked to clean up after the flood while the water is still going down. Some mornings the meeting, the phone call, the amends I wasn’t ready to make felt like climbing a hill with nothing in the tank. I watched good people go back out that year, and I never once called it weakness. I knew exactly how far over their heads the water was.</w:t>
-      </w:r>
-    </w:p>
-    <w:p>
-      <w:pPr>
-        <w:pStyle w:val="BodyText"/>
-      </w:pPr>
-      <w:r>
-        <w:t xml:space="preserve">Somewhere in that year I learned what sobriety was actually asking of me. It was not about feeling better. I had spent twenty years chasing feeling better, relief, escape, approval, the next thing that would make the pressure quiet down, and feelings move around like weather. Sobriety was about learning to function differently. Going when I did not feel like it. Telling the truth when hiding would have been easier. Calling someone instead of isolating. Making the apology. Going to the meeting. Staying useful while I was hurting. Living by values instead of moods. I could function anyway. That was the discovery that carried me through the year the feelings couldn’t.</w:t>
-      </w:r>
-    </w:p>
-    <w:p>
-      <w:pPr>
-        <w:pStyle w:val="BodyText"/>
-      </w:pPr>
-      <w:r>
-        <w:t xml:space="preserve">I’ve heard that we become the five people we spend the most time with. I don’t know if that’s a scientifically researched truth, or just a proverb someone’s grandmother came up with, but I found it to be true. Who you stand next to decides more than people admit. The rooms have their own pecking order, old-timers, big personalities, sponsors who collect sponsees like merit badges, and if you attach yourself to the wrong people, the rooms themselves can walk you back out the door. I got lucky, or I got guided. The handful I stood next to wanted me sober more than they wanted an audience.</w:t>
-      </w:r>
-    </w:p>
-    <w:p>
-      <w:pPr>
-        <w:pStyle w:val="BodyText"/>
-      </w:pPr>
-      <w:r>
-        <w:t xml:space="preserve">I worked as a lifeguard, watching the water at the UWF pool. I was thirty-two on a stand where everyone else working was nineteen. I felt old. I also felt good. Three rounds of P90X had me in the best shape I’d been in years. The job was simple. Scan faces, count heads, make sure everyone got home safe. Stop paying attention and someone could die. I liked that. Lifeguarding was presence. You stood watch, shift after shift, and most days nothing happened. That was the point. One day a mom asked if I’d give her kid swimming lessons. I’m pretty sure the lessons weren’t about the kid. I said maybe and went back to watching the water. The old me would have turned it into something. The new me could let a moment stay small.</w:t>
+        <w:t xml:space="preserve">That year I understood why people go back out. The first year asked the most of me when I had the least. They say it takes about a year for the brain to learn to produce its own rewards again, and I believe it, because mine wasn’t making any. Nothing felt good on its own yet. And that is precisely when the program hands you a pen and asks you to take an honest inventory of the wreckage, the people you owe, the trust you burned, the years you can’t give back, and start walking toward all of it. You’re asked to clean up after the flood while the water is still going down. Some mornings the meeting, the phone call, the amends I wasn’t ready to make felt like climbing a hill with nothing in the tank. I watched good people go back out that year, and I never once called it weakness. I knew exactly how far over their heads the water was.</w:t>
+      </w:r>
+    </w:p>
+    <w:p>
+      <w:pPr>
+        <w:pStyle w:val="BodyText"/>
+      </w:pPr>
+      <w:r>
+        <w:t xml:space="preserve">Somewhere in that year I learned what sobriety was actually asking of me. It was not about feeling better. I had spent twenty years chasing feeling better, relief, escape, approval, the next thing that would make the pressure quiet down, and feelings move around like weather. Sobriety was about learning to function differently. Going when I did not feel like it. Telling the truth when hiding would have been easier. Calling someone instead of isolating. Making the apology. Going to the meeting. Staying useful while I was hurting. Living by values instead of moods. That was the discovery that carried me through the year the feelings couldn’t.</w:t>
+      </w:r>
+    </w:p>
+    <w:p>
+      <w:pPr>
+        <w:pStyle w:val="BodyText"/>
+      </w:pPr>
+      <w:r>
+        <w:t xml:space="preserve">They say you become the five people you spend the most time with. Who you stand next to decides more than people admit. The rooms have their own pecking order, old-timers, big personalities, sponsors who collect sponsees like merit badges, and if you attach yourself to the wrong people, the rooms themselves can walk you back out the door. I got lucky, or I got guided. The handful I stood next to wanted me sober more than they wanted an audience.</w:t>
+      </w:r>
+    </w:p>
+    <w:p>
+      <w:pPr>
+        <w:pStyle w:val="BodyText"/>
+      </w:pPr>
+      <w:r>
+        <w:t xml:space="preserve">I worked as a lifeguard, watching the water at the UWF pool. I was thirty-two on a stand where everyone else working was nineteen. I felt old. I also felt good. Three rounds of P90X had me in the best shape I’d been in years. The job was simple. Scan faces, count heads, make sure everyone got home safe. Stop paying attention and someone could die. I liked that. You stood watch, shift after shift, and most days nothing happened. That was the point. One day a mom asked if I’d give her kid swimming lessons. I’m pretty sure the lessons weren’t about the kid. I said maybe and went back to watching the water. The old me would have turned it into something. The new me could let a moment stay small.</w:t>
       </w:r>
     </w:p>
     <w:p>
@@ -8271,7 +8049,7 @@
         <w:pStyle w:val="BodyText"/>
       </w:pPr>
       <w:r>
-        <w:t xml:space="preserve">The confidence came back too, the real kind this time, not the chemical kind. Years before I met Hope, I went to an Auburn game with a friend and said out loud,</w:t>
+        <w:t xml:space="preserve">The confidence came back too, the real kind this time. Years before I met Hope, I went to an Auburn game with a friend and said out loud,</w:t>
       </w:r>
       <w:r>
         <w:t xml:space="preserve"> </w:t>
@@ -8473,7 +8251,7 @@
         <w:pStyle w:val="BodyText"/>
       </w:pPr>
       <w:r>
-        <w:t xml:space="preserve">Mager was about ten years older than me. I met him at a meeting called Harbor Town in Gulf Breeze and knew within thirty seconds he was different. If I’m a five on the energy scale, Mager is a twelve. No off switch. He walked up like he’d known me his whole life, big smile, firm handshake, a close talker, growling in your face like every conversation is the most important one he’s ever had. I looked at him and thought: this guy has it going on. Wife, three kids, life dialed in. And sober. It was the first time I looked at someone in recovery and thought maybe this could be more than survival. Maybe you can thrive.</w:t>
+        <w:t xml:space="preserve">Mager was about ten years older than me. I met him at a meeting called Harbor Town in Gulf Breeze and knew within thirty seconds he was different. If I’m a five on the energy scale, Mager is a twelve. No off switch. He walked up like he’d known me his whole life, big smile, firm handshake, a close talker, growling in your face like every conversation is the most important one he’s ever had. I looked at him and thought: this guy has it going on. Wife, three kids, life dialed in. And sober. It was the first time I looked at someone in recovery and thought maybe this could be more than survival.</w:t>
       </w:r>
     </w:p>
     <w:p>
@@ -8531,7 +8309,7 @@
         <w:t xml:space="preserve"> </w:t>
       </w:r>
       <w:r>
-        <w:t xml:space="preserve">I’ve thought about that line more than he could know. It stopped being a compliment and turned into an assignment. He made me want to do more than stay sober. He made me want to become the thing he’d written down.</w:t>
+        <w:t xml:space="preserve">I’ve thought about that line more than he could know. It stopped being a compliment and turned into an assignment.</w:t>
       </w:r>
     </w:p>
     <w:p>
@@ -8575,7 +8353,7 @@
         <w:t xml:space="preserve"> </w:t>
       </w:r>
       <w:r>
-        <w:t xml:space="preserve">My father wasn’t there. Hearing his name in a room like that stopped me anyway. My dad worked at Baptist Hospital for years, showed up, did the job well, treated people right, stayed until he was eighty-two. Quint saying his name in a room full of leaders honored the life my father believed in.</w:t>
+        <w:t xml:space="preserve">My father wasn’t there. Hearing his name in a room like that stopped me anyway. My dad worked at Baptist Hospital for years, showed up, did the job well, treated people right, stayed until he was eighty-two.</w:t>
       </w:r>
     </w:p>
     <w:p>
@@ -8601,7 +8379,7 @@
         <w:t xml:space="preserve"> </w:t>
       </w:r>
       <w:r>
-        <w:t xml:space="preserve">his text said. Of everyone who would reach out in those days, he got there first, and he said the truest thing. God didn’t put Quint in my life to rescue me. He put him there to show me what was possible. For the first time since getting sober, I believed there was more for me to do than stay alive.</w:t>
+        <w:t xml:space="preserve">his text said. Of everyone who would reach out in those days, he got there first.</w:t>
       </w:r>
     </w:p>
     <w:p>
@@ -8889,14 +8667,6 @@
         <w:pStyle w:val="BodyText"/>
       </w:pPr>
       <w:r>
-        <w:t xml:space="preserve">When he asked me what I’d been doing for the last five years, I didn’t open up about everything.</w:t>
-      </w:r>
-    </w:p>
-    <w:p>
-      <w:pPr>
-        <w:pStyle w:val="BodyText"/>
-      </w:pPr>
-      <w:r>
         <w:t xml:space="preserve">The recruiter was someone who knew someone, the way it happens in a town like Pensacola.</w:t>
       </w:r>
     </w:p>
@@ -8925,7 +8695,7 @@
         <w:pStyle w:val="BodyText"/>
       </w:pPr>
       <w:r>
-        <w:t xml:space="preserve">Healthcare. The word landed with weight. Not excitement. Something quieter.</w:t>
+        <w:t xml:space="preserve">Healthcare. The word landed with weight.</w:t>
       </w:r>
     </w:p>
     <w:p>
@@ -9089,14 +8859,6 @@
         <w:pStyle w:val="BodyText"/>
       </w:pPr>
       <w:r>
-        <w:t xml:space="preserve">She was all business.</w:t>
-      </w:r>
-    </w:p>
-    <w:p>
-      <w:pPr>
-        <w:pStyle w:val="BodyText"/>
-      </w:pPr>
-      <w:r>
         <w:t xml:space="preserve">I talked about discipline without ego, doing the work because it’s right, not because someone’s watching. Rejection as information, not a verdict. I talked about the pool, scanning the water when nothing was happening, how the job was the same whether anyone needed saving or not. She listened. Wrote. Looked up only when something mattered.</w:t>
       </w:r>
     </w:p>
@@ -9157,7 +8919,7 @@
         <w:t xml:space="preserve"> </w:t>
       </w:r>
       <w:r>
-        <w:t xml:space="preserve">I said, and for once in an interview I wasn’t performing belief. I was stating it.</w:t>
+        <w:t xml:space="preserve">I said.</w:t>
       </w:r>
     </w:p>
     <w:p>
@@ -9259,7 +9021,7 @@
         <w:pStyle w:val="BodyText"/>
       </w:pPr>
       <w:r>
-        <w:t xml:space="preserve">So I told her. And not the polished version where I had been a victim, or the funny version about craving nachos. Instead, I told her what I did, what it cost me, and what had changed since then. When I finished, the line stayed quiet.</w:t>
+        <w:t xml:space="preserve">So I told her. Not the funny version about the nachos. What I did, what it cost me, and what had changed since then. When I finished, the line stayed quiet.</w:t>
       </w:r>
     </w:p>
     <w:p>
@@ -9299,7 +9061,7 @@
         <w:pStyle w:val="BodyText"/>
       </w:pPr>
       <w:r>
-        <w:t xml:space="preserve">When you’re at a stop light waiting for the light to change, it feels like it takes forever. Which is how I felt for the next four days. I went to work, attended meetings, ate, slept, woke up, and did it all over again.</w:t>
+        <w:t xml:space="preserve">The next four days took forever. I went to work, attended meetings, ate, slept, woke up, and did it all over again.</w:t>
       </w:r>
     </w:p>
     <w:p>
@@ -9329,7 +9091,7 @@
         <w:pStyle w:val="BodyText"/>
       </w:pPr>
       <w:r>
-        <w:t xml:space="preserve">I didn’t answer right away. I sat in my car in Lou’s driveway and let it sink in. Alcoholics Anonymous had primed me for what I felt: gratitude. Someone had looked at me and decided I was enough. I called Lou.</w:t>
+        <w:t xml:space="preserve">I didn’t answer right away. I sat in my car in Lou’s driveway and let it sink in. Someone had looked at me and decided I was enough. I called Lou.</w:t>
       </w:r>
     </w:p>
     <w:p>
@@ -9351,7 +9113,7 @@
         <w:pStyle w:val="BodyText"/>
       </w:pPr>
       <w:r>
-        <w:t xml:space="preserve">He said nothing for a moment. Then he spoke.</w:t>
+        <w:t xml:space="preserve">He said nothing for a moment.</w:t>
       </w:r>
       <w:r>
         <w:t xml:space="preserve"> </w:t>
@@ -9399,23 +9161,23 @@
         <w:pStyle w:val="BodyText"/>
       </w:pPr>
       <w:r>
-        <w:t xml:space="preserve">That’s what I needed to hear. When most people think of sales, they think of the stereotypical used car salesman—someone who pressures you to buy a wreck that won’t last and you can’t afford. Caroline not only gave me permission to view potential clients as loved ones but she stressed that the way to make money was selling clients something you knew they needed and would love. How do you know what they need and love? You get to know them.</w:t>
-      </w:r>
-    </w:p>
-    <w:p>
-      <w:pPr>
-        <w:pStyle w:val="BodyText"/>
-      </w:pPr>
-      <w:r>
-        <w:t xml:space="preserve">Home health wasn’t selling, not the way I’d done it. These potential customers spent their days in living rooms and nights in musty bedrooms. Their lives had become synonymous with oxygen tanks humming in the corner and family members exhausted in ways sleep doesn’t fix. These homes were ones where time had slowed down.</w:t>
-      </w:r>
-    </w:p>
-    <w:p>
-      <w:pPr>
-        <w:pStyle w:val="BodyText"/>
-      </w:pPr>
-      <w:r>
-        <w:t xml:space="preserve">Miss Jane was seventy-eight, recovering from hip surgery, and she apologized for the mess in a spotless house. She told me she used to dance, every Friday night for forty years, like it was a confession, and she was terrified she’d never walk without a walker again. I didn’t rush past it. I asked about the dancing, and her face changed when she talked about it. That was the job.</w:t>
+        <w:t xml:space="preserve">That’s what I needed to hear. Caroline gave me permission to view the people I called on as loved ones. How do you know what they need? You get to know them.</w:t>
+      </w:r>
+    </w:p>
+    <w:p>
+      <w:pPr>
+        <w:pStyle w:val="BodyText"/>
+      </w:pPr>
+      <w:r>
+        <w:t xml:space="preserve">Home health wasn’t selling, not the way I’d done it. The people I called on spent their days in living rooms and nights in musty bedrooms, oxygen tanks humming in the corner, family members exhausted in ways sleep doesn’t fix. Time had slowed down in those houses.</w:t>
+      </w:r>
+    </w:p>
+    <w:p>
+      <w:pPr>
+        <w:pStyle w:val="BodyText"/>
+      </w:pPr>
+      <w:r>
+        <w:t xml:space="preserve">Miss Jane was seventy-eight, recovering from hip surgery, and she apologized for the mess in a spotless house. She told me she used to dance, every Friday night for forty years, like it was a confession, and she was terrified she’d never walk without a walker again. I didn’t rush past it. I asked about the dancing, and her face changed when she talked about it.</w:t>
       </w:r>
     </w:p>
     <w:p>
@@ -9501,15 +9263,7 @@
         <w:pStyle w:val="BodyText"/>
       </w:pPr>
       <w:r>
-        <w:t xml:space="preserve">Each person I met had a story, a life beyond their current situation. I listened to their stories with reverence, feeling it a sacred honor to hear their experiences. I recognized that I could live one life only; but by staying present and hearing each one of these people I’d been entrusted to meet with, I took with me some of their knowledge and at least a bit of their wisdom.</w:t>
-      </w:r>
-    </w:p>
-    <w:p>
-      <w:pPr>
-        <w:pStyle w:val="BodyText"/>
-      </w:pPr>
-      <w:r>
-        <w:t xml:space="preserve">I loved how familiar this role felt to me. I remember needing help but not wanting to be helped. It hadn’t been long since I’d felt like I owed God, the universe, and every human on the planet an apology for taking up space and oxygen. I knew the shame and grief of losing my independence. So, when families talked, I didn’t rush them, fill the silence, or pitch them on a product or service. I listened.</w:t>
+        <w:t xml:space="preserve">I remembered needing help and not wanting to be helped. It hadn’t been long since I’d felt I owed every human on the planet an apology for taking up space. So when families talked, I didn’t rush them or fill the silence. I listened.</w:t>
       </w:r>
     </w:p>
     <w:p>
@@ -9577,7 +9331,7 @@
         <w:pStyle w:val="BodyText"/>
       </w:pPr>
       <w:r>
-        <w:t xml:space="preserve">She nodded. No follow-up. She’d already decided to trust me, and I understood what that trust meant in a way I wouldn’t have before.</w:t>
+        <w:t xml:space="preserve">She nodded. No follow-up.</w:t>
       </w:r>
     </w:p>
     <w:p>
@@ -9593,7 +9347,7 @@
         <w:pStyle w:val="BodyText"/>
       </w:pPr>
       <w:r>
-        <w:t xml:space="preserve">This was enough. Someone had given me one chance to prove myself, and I stayed ten years.</w:t>
+        <w:t xml:space="preserve">Someone had given me one chance, and I stayed ten years.</w:t>
       </w:r>
     </w:p>
     <w:p>
@@ -9677,15 +9431,7 @@
         <w:pStyle w:val="BodyText"/>
       </w:pPr>
       <w:r>
-        <w:t xml:space="preserve">I got stuck on step eight and nine, the amends steps. Step eight was somewhat easy, since it was theoretical. I had no problem listing the people I’d harmed in my addiction or being willing to make amends to them. Like, theoretically, I’d give my life to save another person. Sure. Until the moment came. Then what would I do?</w:t>
-      </w:r>
-    </w:p>
-    <w:p>
-      <w:pPr>
-        <w:pStyle w:val="BodyText"/>
-      </w:pPr>
-      <w:r>
-        <w:t xml:space="preserve">Making amends goes beyond theory and a list of names.</w:t>
+        <w:t xml:space="preserve">I got stuck on steps eight and nine, the amends steps. Eight was easy, since it was theoretical. I had no problem listing the people I’d harmed or being willing to make amends to them. Until the moment came.</w:t>
       </w:r>
     </w:p>
     <w:p>
@@ -9749,18 +9495,34 @@
         <w:pStyle w:val="BodyText"/>
       </w:pPr>
       <w:r>
-        <w:t xml:space="preserve">$113,000. That was the number when I finally added it up in ink, every credit card and collection account and legal fee, no rounding. I’d spent years not looking at it. Steady work meant I could finally face the wreckage I’d been outrunning, and my sponsor, Mager, was the one who walked me into it. He was patient, but he wasn’t buying the version of my recovery story where I’d made it. When I told it, I held back some details and shared a tightly managed version of events. Mager didn’t interrupt. He listened in a way that made clear he was hearing more than I was saying, and eventually, with nowhere for the story to land, it fell apart on its own.</w:t>
-      </w:r>
-    </w:p>
-    <w:p>
-      <w:pPr>
-        <w:pStyle w:val="BodyText"/>
-      </w:pPr>
-      <w:r>
-        <w:t xml:space="preserve">“</w:t>
-      </w:r>
-      <w:r>
-        <w:t xml:space="preserve">OK,</w:t>
+        <w:t xml:space="preserve">$113,000. That was the number when I finally added it up in ink, every credit card and collection account and legal fee, no rounding. I’d spent years not looking at it.</w:t>
+      </w:r>
+    </w:p>
+    <w:p>
+      <w:pPr>
+        <w:pStyle w:val="BodyText"/>
+      </w:pPr>
+      <w:r>
+        <w:t xml:space="preserve">I waited for the spiral. It didn’t come. What came was clarity. The real number doesn’t move. It just sits there, and because it sits there, you can work with it.</w:t>
+      </w:r>
+    </w:p>
+    <w:p>
+      <w:pPr>
+        <w:pStyle w:val="BodyText"/>
+      </w:pPr>
+      <w:r>
+        <w:t xml:space="preserve">Mager looked at the pad. Didn’t soften it, didn’t minimize it.</w:t>
+      </w:r>
+    </w:p>
+    <w:p>
+      <w:pPr>
+        <w:pStyle w:val="BodyText"/>
+      </w:pPr>
+      <w:r>
+        <w:t xml:space="preserve">“</w:t>
+      </w:r>
+      <w:r>
+        <w:t xml:space="preserve">Okay,</w:t>
       </w:r>
       <w:r>
         <w:t xml:space="preserve">”</w:t>
@@ -9778,62 +9540,6 @@
         <w:t xml:space="preserve">“</w:t>
       </w:r>
       <w:r>
-        <w:t xml:space="preserve">Time to fix it. All of it.</w:t>
-      </w:r>
-      <w:r>
-        <w:t xml:space="preserve">”</w:t>
-      </w:r>
-    </w:p>
-    <w:p>
-      <w:pPr>
-        <w:pStyle w:val="BodyText"/>
-      </w:pPr>
-      <w:r>
-        <w:t xml:space="preserve">$113,000.</w:t>
-      </w:r>
-    </w:p>
-    <w:p>
-      <w:pPr>
-        <w:pStyle w:val="BodyText"/>
-      </w:pPr>
-      <w:r>
-        <w:t xml:space="preserve">I waited for the spiral. It didn’t come. What came was clarity. The real number doesn’t move. It just sits there, and because it sits there, you can work with it.</w:t>
-      </w:r>
-    </w:p>
-    <w:p>
-      <w:pPr>
-        <w:pStyle w:val="BodyText"/>
-      </w:pPr>
-      <w:r>
-        <w:t xml:space="preserve">Mager looked at the pad. Didn’t soften it, didn’t minimize it.</w:t>
-      </w:r>
-    </w:p>
-    <w:p>
-      <w:pPr>
-        <w:pStyle w:val="BodyText"/>
-      </w:pPr>
-      <w:r>
-        <w:t xml:space="preserve">“</w:t>
-      </w:r>
-      <w:r>
-        <w:t xml:space="preserve">Okay,</w:t>
-      </w:r>
-      <w:r>
-        <w:t xml:space="preserve">”</w:t>
-      </w:r>
-      <w:r>
-        <w:t xml:space="preserve"> </w:t>
-      </w:r>
-      <w:r>
-        <w:t xml:space="preserve">he said.</w:t>
-      </w:r>
-      <w:r>
-        <w:t xml:space="preserve"> </w:t>
-      </w:r>
-      <w:r>
-        <w:t xml:space="preserve">“</w:t>
-      </w:r>
-      <w:r>
         <w:t xml:space="preserve">Now we know.</w:t>
       </w:r>
       <w:r>
@@ -9901,7 +9607,7 @@
         <w:pStyle w:val="BodyText"/>
       </w:pPr>
       <w:r>
-        <w:t xml:space="preserve">The debt on the pad didn’t disappear fast. But I stopped flinching when bills came. I started answering calls from numbers I didn’t recognize. My past stopped feeling like it was following me, not because it was gone, but because it was being addressed. Not redemption. Nothing was being erased. Responsibility. One payment, one opened envelope, one answered call at a time.</w:t>
+        <w:t xml:space="preserve">The debt on the pad didn’t disappear fast. But I stopped flinching when bills came. I started answering calls from numbers I didn’t recognize. My past stopped feeling like it was following me. It was being addressed. One payment, one opened envelope, one answered call at a time.</w:t>
       </w:r>
     </w:p>
     <w:p>
@@ -9937,7 +9643,7 @@
         <w:pStyle w:val="BodyText"/>
       </w:pPr>
       <w:r>
-        <w:t xml:space="preserve">He waved it off the way he waves off everything. But I needed to say it, and I needed him to hear it. He carried a weight that should have been mine, and he never once made me feel like the weight.</w:t>
+        <w:t xml:space="preserve">He waved it off the way he waves off everything. He carried a weight that should have been mine, and he never once made me feel like the weight.</w:t>
       </w:r>
     </w:p>
     <w:p>
@@ -9953,7 +9659,7 @@
         <w:pStyle w:val="BodyText"/>
       </w:pPr>
       <w:r>
-        <w:t xml:space="preserve">The court responded to my sincere brokenness in my amends. They granted me those dismissals.</w:t>
+        <w:t xml:space="preserve">The court granted the dismissals.</w:t>
       </w:r>
     </w:p>
     <w:p>
@@ -10063,35 +9769,23 @@
         <w:t xml:space="preserve"> </w:t>
       </w:r>
       <w:r>
-        <w:t xml:space="preserve">I’d never lived in a place my friends deemed cool enough to give it its own name. It made me proud.</w:t>
-      </w:r>
-    </w:p>
-    <w:p>
-      <w:pPr>
-        <w:pStyle w:val="BodyText"/>
-      </w:pPr>
-      <w:r>
-        <w:t xml:space="preserve">For years I’d driven past it on my way home from meetings. At first, I barely noticed it. Maybe I’d initially found the color so off-putting that my mind refused to record it. But once I noticed it, I couldn’t not see it. Then I was slowing down, then parking across the street to sit and stare. I couldn’t imagine ever living there. So, I did the thing they teach you. I pictured it anyway, owning it one day, a kind of prayer I didn’t have the nerve to say out loud. Something in me recognized the place.</w:t>
-      </w:r>
-    </w:p>
-    <w:p>
-      <w:pPr>
-        <w:pStyle w:val="BodyText"/>
-      </w:pPr>
-      <w:r>
-        <w:t xml:space="preserve">By then I was doing well again, quietly. Home health had stabilized my life. Sober, paying bills, still carrying debt but no longer running from it. I wasn’t chasing anything bigger or better. I wanted something that was mine. The realtor showed me the sensible options first, places near the railroad tracks, starter homes with neutral paint, the kind that says,</w:t>
-      </w:r>
-      <w:r>
-        <w:t xml:space="preserve"> </w:t>
-      </w:r>
-      <w:r>
-        <w:t xml:space="preserve">“</w:t>
-      </w:r>
-      <w:r>
-        <w:t xml:space="preserve">Look, I know it’s a cookie-cutter home in a cookie-cutter neighborhood and cookie-cutter landscaping. But, once you put some new paint on the walls, it’ll look better. At least on the inside.</w:t>
-      </w:r>
-      <w:r>
-        <w:t xml:space="preserve">”</w:t>
+        <w:t xml:space="preserve">I’d never lived in a place my friends deemed cool enough to give it its own name.</w:t>
+      </w:r>
+    </w:p>
+    <w:p>
+      <w:pPr>
+        <w:pStyle w:val="BodyText"/>
+      </w:pPr>
+      <w:r>
+        <w:t xml:space="preserve">For years I’d driven past it on my way home from meetings. At first, I barely noticed it. Maybe I’d initially found the color so off-putting that my mind refused to record it. But once I noticed it, I couldn’t not see it. Then I was slowing down, then parking across the street to sit and stare. I couldn’t imagine ever living there. So, I did the thing they teach you. I pictured it anyway, owning it one day, a kind of prayer I didn’t have the nerve to say out loud.</w:t>
+      </w:r>
+    </w:p>
+    <w:p>
+      <w:pPr>
+        <w:pStyle w:val="BodyText"/>
+      </w:pPr>
+      <w:r>
+        <w:t xml:space="preserve">By then I was doing well again, quietly. Home health had stabilized my life. Sober, paying bills, still carrying debt but no longer running from it. I wasn’t chasing anything bigger or better. I wanted something that was mine. The realtor showed me the sensible options first, places near the railroad tracks, starter homes with neutral paint.</w:t>
       </w:r>
     </w:p>
     <w:p>
@@ -10231,39 +9925,31 @@
         <w:pStyle w:val="BodyText"/>
       </w:pPr>
       <w:r>
-        <w:t xml:space="preserve">Instead of threatening me, he was offering me unconditional trust, as if I’d never been a dumpster fire of addictions, lies, and runaway debt.</w:t>
-      </w:r>
-    </w:p>
-    <w:p>
-      <w:pPr>
-        <w:pStyle w:val="BodyText"/>
-      </w:pPr>
-      <w:r>
-        <w:t xml:space="preserve">I set up an automatic payment to pay him back two hundred a month and paid extra when I could. It took me four years. I never missed a payment. I wouldn’t have dreamed of missing a payment. His trust was gold to me, and I would have rather died than to lose it again.</w:t>
-      </w:r>
-    </w:p>
-    <w:p>
-      <w:pPr>
-        <w:pStyle w:val="BodyText"/>
-      </w:pPr>
-      <w:r>
-        <w:t xml:space="preserve">When I got the keys, I stood in the middle of that small living room and looked around longer than I expected. Nothing about it was impressive, and that was the point. I’d earned it through doing the right thing while learning how to live sober. For five years, the Mirador was my world. I woke up there, prayed there, paid down debt there, stayed sober there. Went to work, came home, and did it again.</w:t>
-      </w:r>
-    </w:p>
-    <w:p>
-      <w:pPr>
-        <w:pStyle w:val="BodyText"/>
-      </w:pPr>
-      <w:r>
-        <w:t xml:space="preserve">Nobody applauded. I no longer needed them to. That was the miracle.</w:t>
-      </w:r>
-    </w:p>
-    <w:p>
-      <w:pPr>
-        <w:pStyle w:val="BodyText"/>
-      </w:pPr>
-      <w:r>
-        <w:t xml:space="preserve">Years later, when Hope walked through that door the first time, she didn’t say a word about the size. She noticed how it felt. We’d take a devotional out to the pool, or down to the dock, and read it together. The habit we still fall back into, the one that’s just part of the house now, started there. We sold it in 2019, a hundred thousand in equity, and put it down on the home Hope and I built together in East Hill, the kind I’d never let myself imagine from across the street. From a one-bedroom salmon castle to a house we built from the ground up.</w:t>
+        <w:t xml:space="preserve">I set up an automatic payment to pay him back two hundred a month and paid extra when I could. It took me four years. I never missed a payment.</w:t>
+      </w:r>
+    </w:p>
+    <w:p>
+      <w:pPr>
+        <w:pStyle w:val="BodyText"/>
+      </w:pPr>
+      <w:r>
+        <w:t xml:space="preserve">When I got the keys, I stood in the middle of that small living room and looked around longer than I expected. Nothing about it was impressive, and that was the point. For five years, the Mirador was my world. I woke up there, prayed there, paid down debt there, stayed sober there. Went to work, came home, and did it again.</w:t>
+      </w:r>
+    </w:p>
+    <w:p>
+      <w:pPr>
+        <w:pStyle w:val="BodyText"/>
+      </w:pPr>
+      <w:r>
+        <w:t xml:space="preserve">Nobody applauded. I no longer needed them to.</w:t>
+      </w:r>
+    </w:p>
+    <w:p>
+      <w:pPr>
+        <w:pStyle w:val="BodyText"/>
+      </w:pPr>
+      <w:r>
+        <w:t xml:space="preserve">Years later, when Hope walked through that door the first time, she didn’t say a word about the size. She noticed how it felt. We’d take a devotional out to the pool, or down to the dock, and read it together. The habit we still fall back into, the one that’s just part of the house now, started there. We sold it in 2019, a hundred thousand in equity, and put it down on the home Hope and I built together in East Hill, the kind I’d never let myself imagine from across the street.</w:t>
       </w:r>
     </w:p>
     <w:p>
@@ -10688,7 +10374,7 @@
         <w:pStyle w:val="BodyText"/>
       </w:pPr>
       <w:r>
-        <w:t xml:space="preserve">I was once that person who nearly didn’t make it. I know what the disease does from the inside. Losing people in those rooms prepared me for something I didn’t know I was being prepared for. Nothing in hospice is harder than a parent losing a child. The only reason I can stay in that room without flinching is that I’ve already sat with losses like that in recovery. Hospice just gave me a new room to bring it to.</w:t>
+        <w:t xml:space="preserve">Nothing in hospice is harder than a parent losing a child. The only reason I can stay in that room without flinching is that I’ve already sat with losses like that in recovery.</w:t>
       </w:r>
     </w:p>
     <w:p>
@@ -10824,7 +10510,7 @@
         <w:pStyle w:val="BodyText"/>
       </w:pPr>
       <w:r>
-        <w:t xml:space="preserve">Bob didn’t get that kind of time. Near the end, I went to see him, and it was nothing like the nursing-home room of my boyhood — this was a grown man actively dying, and everyone in the house knew it. The place was full. People he’d carried in the rooms, people who’d carried him, a steady stream coming to sit with him and say what they needed to say while he could still hear it. My first thought was a small, honest panic: how was I supposed to feel all of this without anything to take the edge off? I had never done grief without a buffer. The panic didn’t last, and what replaced it wasn’t sadness. It was gratitude, and a level calm, the plain fact of being there and not needing to be anywhere else. He told me once that sobriety wasn’t something he fought every morning; it was a decision he had made a single time and never went back to revisit, and he carried it all the way to the edge of his life. Decades older than me, and still showing me how it was done.</w:t>
+        <w:t xml:space="preserve">Bob didn’t get that kind of time. Near the end, I went to see him, and it was nothing like the nursing-home room of my boyhood — this was a grown man actively dying, and everyone in the house knew it. The place was full. People he’d carried in the rooms, people who’d carried him, a steady stream coming to sit with him and say what they needed to say while he could still hear it. My first thought was a small, honest panic: how was I supposed to feel all of this without anything to take the edge off? I had never done grief without a buffer. The panic didn’t last. What replaced it was gratitude, and a level calm, the plain fact of being there and not needing to be anywhere else. He told me once that sobriety wasn’t something he fought every morning; it was a decision he had made a single time and never went back to revisit, and he carried it all the way to the edge of his life. Decades older than me, and still showing me how it was done.</w:t>
       </w:r>
     </w:p>
     <w:p>
@@ -10986,7 +10672,7 @@
         <w:t xml:space="preserve"> </w:t>
       </w:r>
       <w:r>
-        <w:t xml:space="preserve">He was right. Bob hadn’t needed me to fix anything. He’d needed me in the room. I was being let into places where presence was the only thing left to offer, and something in me already knew how to do that. Years later, that became the whole job.</w:t>
+        <w:t xml:space="preserve">He was right. Bob hadn’t needed me to fix anything. He’d needed me in the room.</w:t>
       </w:r>
     </w:p>
     <w:p>
@@ -11168,7 +10854,7 @@
         <w:t xml:space="preserve"> </w:t>
       </w:r>
       <w:r>
-        <w:t xml:space="preserve">The whole first year was like that for her, she said, a quiet shock that a man this thoughtful and considerate actually existed. None of it bought me any mercy on the age gap. She was calling me a forty-year-old before I’d even turned thirty-nine.</w:t>
+        <w:t xml:space="preserve">The whole first year was like that for her, she said, a quiet shock that a man this thoughtful actually existed. None of it bought me any mercy on the age gap. She was calling me a forty-year-old before I’d even turned thirty-nine.</w:t>
       </w:r>
       <w:r>
         <w:t xml:space="preserve"> </w:t>
@@ -11280,7 +10966,7 @@
         <w:t xml:space="preserve"> </w:t>
       </w:r>
       <w:r>
-        <w:t xml:space="preserve">It just came out. Sudden, and right. One dinner in, and some part of me had already decided.</w:t>
+        <w:t xml:space="preserve">It just came out. One dinner in, and some part of me had already decided.</w:t>
       </w:r>
     </w:p>
     <w:p>
@@ -11314,7 +11000,7 @@
         <w:t xml:space="preserve"> </w:t>
       </w:r>
       <w:r>
-        <w:t xml:space="preserve">People say those words. I could feel that she meant them, all the way down. My father spent a lifetime proving that sentence without ever needing to say it. Hearing it said to me, and believing it, was the moment I knew I would marry her. Falling in love with her was the easiest thing I’d ever done.</w:t>
+        <w:t xml:space="preserve">People say those words. I could feel that she meant them, all the way down. My father spent a lifetime proving that sentence without ever needing to say it. Hearing it said to me, and believing it, was the moment I knew I would marry her.</w:t>
       </w:r>
     </w:p>
     <w:bookmarkStart w:id="45" w:name="are-you-saved"/>
@@ -11531,7 +11217,7 @@
         <w:t xml:space="preserve"> </w:t>
       </w:r>
       <w:r>
-        <w:t xml:space="preserve">He wasn’t giving me a tough-father speech. He was handing me his own regret and trusting me with it.</w:t>
+        <w:t xml:space="preserve">He was handing me his own regret and trusting me with it.</w:t>
       </w:r>
       <w:r>
         <w:t xml:space="preserve"> </w:t>
@@ -11575,7 +11261,7 @@
         <w:pStyle w:val="BodyText"/>
       </w:pPr>
       <w:r>
-        <w:t xml:space="preserve">Outside my own father, Jeff is one of two men who have shown me what faith looks like when it’s lived instead of just spoken. The other is Dave Meyer, my friend since middle school. Different men, same spine. Neither one talks the talk and stops there; both walk it. Neither has ever lost sight of where God is in it. I’ve needed them both as proof that the thing I reached for in a muddy field in Chumuckla holds up across a whole life.</w:t>
+        <w:t xml:space="preserve">Outside my own father, Jeff is one of two men who have shown me what faith looks like when it’s lived instead of just spoken. The other is Dave Meyer, my friend since middle school. Different men, same spine. I’ve needed them both as proof that the thing I reached for in a muddy field in Chumuckla holds up across a whole life.</w:t>
       </w:r>
     </w:p>
     <w:bookmarkEnd w:id="45"/>
@@ -11605,15 +11291,15 @@
         <w:pStyle w:val="BodyText"/>
       </w:pPr>
       <w:r>
-        <w:t xml:space="preserve">Before any of that, before the wedding, there was the day she met Lou. I was nervous. Not the wrestling-match kind. Not the holding-cell kind. This was precise, like one wrong word, one moment of performance instead of presence, would miss the point.</w:t>
-      </w:r>
-    </w:p>
-    <w:p>
-      <w:pPr>
-        <w:pStyle w:val="BodyText"/>
-      </w:pPr>
-      <w:r>
-        <w:t xml:space="preserve">We drove over together. Lou was sitting when we walked in. He stood when he saw us, not as ceremony, as regard. He shook Hope’s hand, looked her in the eye, and said:</w:t>
+        <w:t xml:space="preserve">Before any of that, before the wedding, there was the day she met Lou. I was nervous. Not the wrestling-match kind. Not the holding-cell kind. This was precise, like one wrong word would miss the point.</w:t>
+      </w:r>
+    </w:p>
+    <w:p>
+      <w:pPr>
+        <w:pStyle w:val="BodyText"/>
+      </w:pPr>
+      <w:r>
+        <w:t xml:space="preserve">We drove over together. Lou was sitting when we walked in. He stood when he saw us. He shook Hope’s hand, looked her in the eye, and said:</w:t>
       </w:r>
       <w:r>
         <w:t xml:space="preserve"> </w:t>
@@ -11639,7 +11325,7 @@
         <w:pStyle w:val="BodyText"/>
       </w:pPr>
       <w:r>
-        <w:t xml:space="preserve">They talked easily. He asked where she was from, what her work involved. He wasn’t screening a résumé. He was watching how she held herself, whether she held his gaze, whether she said what she meant. At one point he said,</w:t>
+        <w:t xml:space="preserve">They talked easily. He asked where she was from, what her work involved. He was watching how she held herself, whether she held his gaze, whether she said what she meant. At one point he said,</w:t>
       </w:r>
       <w:r>
         <w:t xml:space="preserve"> </w:t>
@@ -11675,15 +11361,15 @@
         <w:t xml:space="preserve"> </w:t>
       </w:r>
       <w:r>
-        <w:t xml:space="preserve">Not I’ve heard. I know. Lou sat with it, then smiled, small and private. He’d been looking for something and found it.</w:t>
-      </w:r>
-    </w:p>
-    <w:p>
-      <w:pPr>
-        <w:pStyle w:val="BodyText"/>
-      </w:pPr>
-      <w:r>
-        <w:t xml:space="preserve">They went into the kitchen together while I stayed in the living room. I could hear drawers opening, plates moving. Not interrogation. He was including her in the daily life of his household. When they came back, he poured the coffee. Two cups, not three. It wasn’t an oversight.</w:t>
+        <w:t xml:space="preserve">Not I’ve heard. I know. Lou sat with it, then smiled, small and private.</w:t>
+      </w:r>
+    </w:p>
+    <w:p>
+      <w:pPr>
+        <w:pStyle w:val="BodyText"/>
+      </w:pPr>
+      <w:r>
+        <w:t xml:space="preserve">They went into the kitchen together while I stayed in the living room. I could hear drawers opening, plates moving. He was including her in the daily life of his household. When they came back, he poured the coffee. Two cups, not three. It wasn’t an oversight.</w:t>
       </w:r>
     </w:p>
     <w:p>
@@ -11722,12 +11408,6 @@
       </w:r>
       <w:r>
         <w:t xml:space="preserve">”</w:t>
-      </w:r>
-      <w:r>
-        <w:t xml:space="preserve"> </w:t>
-      </w:r>
-      <w:r>
-        <w:t xml:space="preserve">That was it. No formal blessing, no speech. He saw two people steady in the same direction and noted it.</w:t>
       </w:r>
     </w:p>
     <w:bookmarkEnd w:id="46"/>
@@ -11785,7 +11465,7 @@
         <w:t xml:space="preserve"> </w:t>
       </w:r>
       <w:r>
-        <w:t xml:space="preserve">So I got on a knee, awkwardly, and asked her to marry me. Hope said yes, and the nerves went out of me all at once. What settled in their place was the surest feeling I’ve ever had about anything. I could finally enjoy the rest of my meal. Right after, we got a Chihuahua together, a little one named Nola. She’s eight now. That dog’s been with us through everything.</w:t>
+        <w:t xml:space="preserve">So I got on a knee, awkwardly, and asked her to marry me. Hope said yes, and the nerves went out of me all at once. I could finally enjoy the rest of my meal. Right after, we got a Chihuahua together, a little one named Nola. She’s eight now. That dog’s been with us through everything.</w:t>
       </w:r>
     </w:p>
     <w:bookmarkEnd w:id="47"/>
@@ -11843,7 +11523,7 @@
         <w:t xml:space="preserve"> </w:t>
       </w:r>
       <w:r>
-        <w:t xml:space="preserve">There was no ill will in it anywhere; whatever the divorce had been, none of it was in that room. Lou raised his fist in pride. It brought me to tears all over again. The woman who carried us out of Mexico and the man who caught us on the other side, honoring each other out loud.</w:t>
+        <w:t xml:space="preserve">Lou raised his fist. It brought me to tears all over again. The woman who carried us out of Mexico and the man who caught us on the other side, honoring each other out loud.</w:t>
       </w:r>
     </w:p>
     <w:p>
@@ -12179,7 +11859,7 @@
         <w:t xml:space="preserve"> </w:t>
       </w:r>
       <w:r>
-        <w:t xml:space="preserve">It came out with a little heat, and the heat wasn’t aimed at us — with Lou it rarely was. A man who tipped twenty dollars on principle was never going to love a budget. He heard frugality and understood deprivation.</w:t>
+        <w:t xml:space="preserve">It came out with a little heat, and the heat wasn’t aimed at us — with Lou it rarely was. A man who tipped twenty dollars on principle was never going to love a budget.</w:t>
       </w:r>
     </w:p>
     <w:bookmarkEnd w:id="48"/>
@@ -12385,15 +12065,15 @@
         <w:t xml:space="preserve"> </w:t>
       </w:r>
       <w:r>
-        <w:t xml:space="preserve">The woman who tightens at an unexpected expense told me up front she’d spend whatever it took on me, before she had a single reason to. The girl whose family came apart when she was twelve grew into the woman who refuses to leave.</w:t>
-      </w:r>
-    </w:p>
-    <w:p>
-      <w:pPr>
-        <w:pStyle w:val="BodyText"/>
-      </w:pPr>
-      <w:r>
-        <w:t xml:space="preserve">The first three years we laughed all the time, the real kind that takes her all the way over and pulls the whole room in with her. Then the heavy years came, the ones this book is mostly about, and the laughing got rare without either of us deciding it should. It’s coming back, a little more each month. We are safe with each other, and because we’re safe we are sometimes harder on each other than we should be. That’s the cost of letting your guard all the way down with the one person you’re sure won’t leave. She is that person.</w:t>
+        <w:t xml:space="preserve">The woman who tightens at an unexpected expense told me up front she’d spend whatever it took on me, before she had a single reason to.</w:t>
+      </w:r>
+    </w:p>
+    <w:p>
+      <w:pPr>
+        <w:pStyle w:val="BodyText"/>
+      </w:pPr>
+      <w:r>
+        <w:t xml:space="preserve">The first three years we laughed all the time, the real kind that takes her all the way over and pulls the whole room in with her. Then the heavy years came, the ones this book is mostly about, and the laughing got rare without either of us deciding it should. It’s coming back, a little more each month. We are safe with each other, and because we’re safe we are sometimes harder on each other than we should be. That’s the cost of letting your guard all the way down with the one person you’re sure won’t leave.</w:t>
       </w:r>
     </w:p>
     <w:bookmarkEnd w:id="49"/>
@@ -12415,7 +12095,7 @@
         <w:pStyle w:val="FirstParagraph"/>
       </w:pPr>
       <w:r>
-        <w:t xml:space="preserve">In a short time we worked like a team. We paid off over a hundred thousand dollars in student loans and built a life with margin in it instead of debt, a home, a little security I’d never had back when I looked successful. We moved to Raleigh. We never had children, and we never planned to. What we built was the two of us, and a life with room in it for other people. These days that includes Hope’s mother. Rhonda lives under our roof now, which is not a sentence anyone says lightly, and getting to know her and love her has been one of the quiet gifts of this stretch. She hasn’t had the easiest life. What I didn’t see coming was watching Hope and her mom grow close, slowly, over years, until Hope started calling Rhonda her best friend. None of the good things happen overnight. That’s my love story. It started with a stubborn message on Match.com to a girl who told me not to write. Best rule I ever broke.</w:t>
+        <w:t xml:space="preserve">In a short time we worked like a team. We paid off over a hundred thousand dollars in student loans and built a life with margin in it instead of debt, a home, a little security I’d never had back when I looked successful. We moved to Raleigh. We never had children, and we never planned to. What we built was the two of us, and a life with room in it for other people. These days that includes Hope’s mother. Rhonda lives under our roof now, which is not a sentence anyone says lightly, and getting to know her and love her has been one of the quiet gifts of this stretch. She hasn’t had the easiest life. What I didn’t see coming was watching Hope and her mom grow close, slowly, over years, until Hope started calling Rhonda her best friend. That’s my love story. It started with a stubborn message on Match.com to a girl who told me not to write. Best rule I ever broke.</w:t>
       </w:r>
     </w:p>
     <w:bookmarkEnd w:id="50"/>
@@ -12437,7 +12117,7 @@
         <w:pStyle w:val="FirstParagraph"/>
       </w:pPr>
       <w:r>
-        <w:t xml:space="preserve">If you look at our Paris photos, we look great. What you can’t see is the day before, Hope on her knees in a Brussels hotel room, scraping spilled hair fiber out of my bag so I’d feel okay standing in front of that camera. The trips Hope and I took were some of the best times of my life. They were also a long string of small disasters, and the disasters are where we got strong. We didn’t find out what we had when the plan worked. We found out when it fell apart and we were both still standing there, figuring it out.</w:t>
+        <w:t xml:space="preserve">If you look at our Paris photos, we look great. What you can’t see is the day before, Hope on her knees in a Brussels hotel room, scraping spilled hair fiber out of my bag so I’d feel okay standing in front of that camera. The trips Hope and I took were some of the best times of my life. They were also a long string of small disasters, and the disasters are where we got strong.</w:t>
       </w:r>
     </w:p>
     <w:p>
@@ -12521,27 +12201,21 @@
       <w:r>
         <w:t xml:space="preserve">”</w:t>
       </w:r>
-      <w:r>
-        <w:t xml:space="preserve"> </w:t>
-      </w:r>
-      <w:r>
-        <w:t xml:space="preserve">She knew that powder was the one thing that could take me from feeling good to wanting to hide, and instead of arguing me out of it, she fixed it.</w:t>
-      </w:r>
-    </w:p>
-    <w:p>
-      <w:pPr>
-        <w:pStyle w:val="BodyText"/>
-      </w:pPr>
-      <w:r>
-        <w:t xml:space="preserve">Ireland was the one I couldn’t fully meet her on. We’d planned it long before, but by the time it came Lou’s health was sliding and I had just taken time off work to be with him. Galway, the Cliffs of Moher, towns out of a postcard, and my head was back home in Pensacola the whole time. Hope didn’t push. She told me nobody cared that I’d taken the time, that I was allowed to be where I was, and she loved me through a trip I wasn’t all the way present for. That is its own way of carrying someone, and she did it without ever making me feel like a burden. In Galway I bought her a Claddagh ring, the little heart held in two hands, and gave it to her as the promise I couldn’t say out loud that week.</w:t>
-      </w:r>
-    </w:p>
-    <w:p>
-      <w:pPr>
-        <w:pStyle w:val="BodyText"/>
-      </w:pPr>
-      <w:r>
-        <w:t xml:space="preserve">I think about those trips differently now, not as time I should have spent some other way, but as time I’m grateful we took, every messy minute of it. The pictures never tell the whole story. They can’t. They only catch the second we were smiling. Everything that earned the smile happened off camera, and most of it was Hope.</w:t>
+    </w:p>
+    <w:p>
+      <w:pPr>
+        <w:pStyle w:val="BodyText"/>
+      </w:pPr>
+      <w:r>
+        <w:t xml:space="preserve">Ireland was the one I couldn’t fully meet her on. We’d planned it long before, but by the time it came Lou’s health was sliding and I had just taken time off work to be with him. Galway, the Cliffs of Moher, towns out of a postcard, and my head was back home in Pensacola the whole time. Hope didn’t push. She told me nobody cared that I’d taken the time, that I was allowed to be where I was, and she loved me through a trip I wasn’t all the way present for. In Galway I bought her a Claddagh ring, the little heart held in two hands, and gave it to her as the promise I couldn’t say out loud that week.</w:t>
+      </w:r>
+    </w:p>
+    <w:p>
+      <w:pPr>
+        <w:pStyle w:val="BodyText"/>
+      </w:pPr>
+      <w:r>
+        <w:t xml:space="preserve">The pictures never tell the whole story. They only catch the second we were smiling. Everything that earned the smile happened off camera, and most of it was Hope.</w:t>
       </w:r>
     </w:p>
     <w:p>
@@ -12733,7 +12407,7 @@
         <w:t xml:space="preserve"> </w:t>
       </w:r>
       <w:r>
-        <w:t xml:space="preserve">she said. Later, alone, Hope said it quietly: your mom has Parkinson’s. I welled up. I’d known since Central Park. I told Hope, we can’t feel sorry for her anymore, clarity, not coldness. What she needed was encouragement: the exercises, the medication, fight for quality of life. Watching both of them decline at the same time nearly broke me. My mom’s body turning against her. My dad getting weaker. The two people who chose me, both fading. I had watched slow disappearing before: dementia took my nana in pieces, the person still in the room while the line kept dropping, and much later, when I earned my Certified Dementia Practitioner credential, I was thinking of her. My mother came up for Christmas. I watched her get out of the car and knew it would be one of the last trips she made up here. She came anyway. That’s my mom. Wonderwoman doesn’t stop. We talk every day. The woman who used to call after a long shift to ask if I wanted McDonald’s still calls, except now I’m the one asking if she’s eaten, if she’s up, if she’s okay. She is all over this book, every story I ran past her to get right. I couldn’t have written a word of it without her.</w:t>
+        <w:t xml:space="preserve">she said. Later, alone, Hope said it quietly: your mom has Parkinson’s. I welled up. I’d known since Central Park. I told Hope, we can’t feel sorry for her anymore. What she needed was encouragement: the exercises, the medication, fight for quality of life. Watching both of them decline at the same time nearly broke me. My mom’s body turning against her. My dad getting weaker. The two people who chose me, both fading. I had watched slow disappearing before: dementia took my nana in pieces, the person still in the room while the line kept dropping, and much later, when I earned my Certified Dementia Practitioner credential, I was thinking of her. My mother came up for Christmas. I watched her get out of the car and knew it would be one of the last trips she made up here. She came anyway. That’s my mom. We talk every day. The woman who used to call after a long shift to ask if I wanted McDonald’s still calls, except now I’m the one asking if she’s eaten, if she’s up, if she’s okay.</w:t>
       </w:r>
     </w:p>
     <w:p>
@@ -12805,15 +12479,15 @@
         <w:pStyle w:val="BodyText"/>
       </w:pPr>
       <w:r>
-        <w:t xml:space="preserve">I love her, and I haven’t shown it the way she showed me. I’m booking a trip to South Florida to see her, to start being a better son while I still have the time to be one.</w:t>
-      </w:r>
-    </w:p>
-    <w:p>
-      <w:pPr>
-        <w:pStyle w:val="BodyText"/>
-      </w:pPr>
-      <w:r>
-        <w:t xml:space="preserve">There is one more thing I need to say to her in print, because I don’t say it enough out loud. It was my mother who first walked me into a church, who made faith the one thing that wasn’t up for debate. The first time it stopped being hers and started being mine, I was thirteen, on a mission trip in Nashville. I don’t remember a word of the preaching. I remember the room, some current moving through all of us, and my fear going quiet for the first time I can recall. That faith became the floor I stood on when everything else gave way. Mom, if it weren’t for you, I would not be the person I am today. Not the sober one, not the one who can sit in a stranger’s last room, not the one who finally learned how to stay. All of it traces back to you. My mother will be taken care of for the rest of her life. Whatever care she needs, we will provide it. She picked us once. She never stopped.</w:t>
+        <w:t xml:space="preserve">I’m booking a trip to South Florida to see her.</w:t>
+      </w:r>
+    </w:p>
+    <w:p>
+      <w:pPr>
+        <w:pStyle w:val="BodyText"/>
+      </w:pPr>
+      <w:r>
+        <w:t xml:space="preserve">There is one more thing I need to say to her in print, because I don’t say it enough out loud. It was my mother who first walked me into a church, who made faith the one thing that wasn’t up for debate. The first time it stopped being hers and started being mine, I was thirteen, on a mission trip in Nashville. I don’t remember a word of the preaching. I remember the room, some current moving through all of us, and my fear going quiet for the first time I can recall. That faith became the floor I stood on when everything else gave way. Mom, if it weren’t for you, I would not be the person I am today. My mother will be taken care of for the rest of her life. Whatever care she needs, we will provide it. She picked us once. She never stopped.</w:t>
       </w:r>
     </w:p>
     <w:p>
@@ -12998,7 +12672,7 @@
         <w:t xml:space="preserve"> </w:t>
       </w:r>
       <w:r>
-        <w:t xml:space="preserve">So I interviewed, and I got the job. It was hard to leave. Ten years. Brenda Jahn, my manager there, had been amazing. But I saw it as a chance to learn. When I started at Novo Nordisk I didn’t know the difference between type 1 and type 2 diabetes. Through the training and the home study I got good at it. Really good.</w:t>
+        <w:t xml:space="preserve">So I interviewed, and I got the job. It was hard to leave. Ten years. Brenda Jahn, my manager there, had been amazing. But I saw it as a chance to learn. When I started at Novo Nordisk I didn’t know the difference between type 1 and type 2 diabetes. Through the training and the home study I got good at it.</w:t>
       </w:r>
     </w:p>
     <w:bookmarkStart w:id="54" w:name="diabetes-dave"/>
@@ -13027,7 +12701,7 @@
         <w:pStyle w:val="BodyText"/>
       </w:pPr>
       <w:r>
-        <w:t xml:space="preserve">I needed that more than I let on. For ten years I’d been the top guy in home health, the one people called, and I’d walked into Novo Nordisk a nobody in an industry I didn’t understand, starting over at the bottom of the learning curve in my forties. Dave never let me feel it alone. He sat with me, walked me through what I didn’t know, and made sure I always had somebody in my corner. I’m not sure I’d have made that jump without him.</w:t>
+        <w:t xml:space="preserve">I needed that more than I let on. For ten years I’d been the top guy in home health, the one people called, and I’d walked into Novo Nordisk a nobody in an industry I didn’t understand, starting over at the bottom of the learning curve in my forties. Dave never let me feel it alone. He sat with me and walked me through what I didn’t know. I’m not sure I’d have made that jump without him.</w:t>
       </w:r>
     </w:p>
     <w:p>
@@ -13081,7 +12755,7 @@
         <w:pStyle w:val="BodyText"/>
       </w:pPr>
       <w:r>
-        <w:t xml:space="preserve">Lou was a man of places. He could seem simple if you only caught the surface, but he carried a private map of the world inside him — the best restaurants, the best bagels, the streets worth taking, the shop worth passing twenty other shops to reach. New York wasn’t an idea to him. It was muscle memory. He kept returning to the places he’d known since childhood, as if tradition were something you kept alive by visiting it. At Clyde’s in Lodi he had a lemonade rule: two scoops, one always lemon, the other your choice. Flexible inside a fixed tradition — there was room for choice, but only after the lemon was settled. He never wanted to be rushed at a meal. A restaurant wasn’t a place to consume food; it was a place to be recognized, to settle in, to let the thing unfold. He liked career waiters, professionals who remembered him and knew their craft, and he tipped twenty dollars like a man paying respect to people who knew how to do their job. He wasn’t a picky eater; the food itself almost never lost him. What lost him was bad service, and paying for a meal done badly. It offended the same thing in him that the twenty-dollar tips honored.</w:t>
+        <w:t xml:space="preserve">Lou was a man of places. He could seem simple if you only caught the surface, but he carried a private map of the world inside him — the best restaurants, the best bagels, the streets worth taking, the shop worth passing twenty other shops to reach. New York wasn’t an idea to him. It was muscle memory. He kept returning to the places he’d known since childhood, as if tradition were something you kept alive by visiting it. At Clyde’s in Lodi he had a lemonade rule: two scoops, one always lemon, the other your choice. He never wanted to be rushed at a meal. A restaurant wasn’t a place to consume food; it was a place to be recognized, to settle in, to let the thing unfold. He liked career waiters, professionals who remembered him and knew their craft, and he tipped twenty dollars like a man paying respect to people who knew how to do their job. He wasn’t a picky eater; the food itself almost never lost him. What lost him was bad service, and paying for a meal done badly. It offended the same thing in him that the twenty-dollar tips honored.</w:t>
       </w:r>
     </w:p>
     <w:p>
@@ -13107,15 +12781,15 @@
         <w:t xml:space="preserve"> </w:t>
       </w:r>
       <w:r>
-        <w:t xml:space="preserve">he said. I understand it differently now. He wasn’t only watching baseball. He was practicing loyalty — staying with a thing because it was his, not because it was winning.</w:t>
-      </w:r>
-    </w:p>
-    <w:p>
-      <w:pPr>
-        <w:pStyle w:val="BodyText"/>
-      </w:pPr>
-      <w:r>
-        <w:t xml:space="preserve">And he never stopped wanting to be useful. He’d retired on paper and kept working anyway, into his eighties, answering phones and untangling computer problems. The pay was almost nothing, and one day he called me like he’d won a sweepstakes because his boss had doubled it. What I remember isn’t the money. It’s an eighty-year-old man beaming over a good performance review. At eighty, he did a 5K with Hope and me — beanie, glasses, a finisher’s medal — finished dead last, and took home the tortoise award, which somehow made the whole thing better. After the 2015 surgery — they took about half of his esophagus and half of his stomach — he ate less, weighed less, took his vitamins, saw his holistic doctor. He won himself years. He spent them wanting things. Strength. Respect. A good review. Proof he wasn’t finished. There is dignity in still wanting, and my father had it to the last.</w:t>
+        <w:t xml:space="preserve">he said.</w:t>
+      </w:r>
+    </w:p>
+    <w:p>
+      <w:pPr>
+        <w:pStyle w:val="BodyText"/>
+      </w:pPr>
+      <w:r>
+        <w:t xml:space="preserve">And he never stopped wanting to be useful. He’d retired on paper and kept working anyway, into his eighties, answering phones and untangling computer problems. The pay was almost nothing, and one day he called me like he’d won a sweepstakes because his boss had doubled it. What I remember isn’t the money. It’s an eighty-year-old man beaming over a good performance review. At eighty, he did a 5K with Hope and me — beanie, glasses, a finisher’s medal — finished dead last, and took home the tortoise award, which somehow made the whole thing better. After the 2015 surgery — they took about half of his esophagus and half of his stomach — he ate less, weighed less, took his vitamins, saw his holistic doctor. He won himself years. He spent them wanting things. Strength. Respect. A good review. Proof he wasn’t finished.</w:t>
       </w:r>
     </w:p>
     <w:bookmarkEnd w:id="55"/>
@@ -13375,7 +13049,7 @@
         <w:pStyle w:val="BodyText"/>
       </w:pPr>
       <w:r>
-        <w:t xml:space="preserve">That spring, Hope and I told him we were moving to Raleigh. I could tell he was disappointed. I’d lived close to him in Pensacola for eighteen years, almost nineteen. But he understood, and he told me to go. That was always his way, even at the end, more concerned about whether we were okay than whether we were close. The last time I saw him before the move we went to McGuire’s. He looked fine. He said he wasn’t worried, said as long as Donna was there he was okay. Part of me looks back and wonders if I should have stayed longer. I couldn’t have known that five weeks into my new job he’d take a turn and go downhill fast.</w:t>
+        <w:t xml:space="preserve">That spring, Hope and I told him we were moving to Raleigh. I could tell he was disappointed. I’d lived close to him in Pensacola for eighteen years, almost nineteen. But he understood, and he told me to go. The last time I saw him before the move we went to McGuire’s. He looked fine. He said he wasn’t worried, said as long as Donna was there he was okay. Part of me looks back and wonders if I should have stayed longer.</w:t>
       </w:r>
     </w:p>
     <w:bookmarkEnd w:id="58"/>
@@ -13397,15 +13071,15 @@
         <w:pStyle w:val="FirstParagraph"/>
       </w:pPr>
       <w:r>
-        <w:t xml:space="preserve">The hardest part of leaving Novo wasn’t the job. It was leaving that relationship with Dave. We’re still close. He’ll always hold a special place for me.</w:t>
-      </w:r>
-    </w:p>
-    <w:p>
-      <w:pPr>
-        <w:pStyle w:val="BodyText"/>
-      </w:pPr>
-      <w:r>
-        <w:t xml:space="preserve">I told people I was going to take some time off. Be there for my dad. Be there for my mom. Be present the way I’d spent years telling families to be present, while there was still time. That was the plan. It’s not what happened. What happened was I retreated into myself. The time I’d set aside became something else, a depression I didn’t see coming and couldn’t recognize from the inside. I was grieving what was already happening and what was coming, and it kept me from doing the thing I’d left my career to do. I know the name for it now. The grief showed up before the loss did, and it froze me. I wasn’t working. I wasn’t fully showing up for my parents. I was stuck in a version of myself that couldn’t move in any direction. Hospice, when it came, wasn’t a pivot. It was a return, to the rooms I’d been thinking about since the home health years, to the weight I’d learned how to carry. It pulled me out of that in-between place and gave me direction again.</w:t>
+        <w:t xml:space="preserve">The hardest part of leaving Novo was leaving Dave. We’re still close.</w:t>
+      </w:r>
+    </w:p>
+    <w:p>
+      <w:pPr>
+        <w:pStyle w:val="BodyText"/>
+      </w:pPr>
+      <w:r>
+        <w:t xml:space="preserve">I told people I was going to take some time off. Be there for my dad. Be there for my mom. Be present the way I’d spent years telling families to be present, while there was still time. That was the plan. It’s not what happened. What happened was I retreated into myself. The time I’d set aside became something else, a depression I didn’t see coming and couldn’t recognize from the inside. I was grieving what was already happening and what was coming, and it kept me from doing the thing I’d left my career to do. I know the name for it now. The grief showed up before the loss did, and it froze me. I wasn’t working. I wasn’t fully showing up for my parents. I was stuck in a version of myself that couldn’t move in any direction. Hospice, when it came, was a return, to the rooms I’d been thinking about since the home health years. It pulled me out of that in-between place.</w:t>
       </w:r>
     </w:p>
     <w:bookmarkEnd w:id="59"/>
@@ -13508,15 +13182,7 @@
           <w:bCs/>
           <w:b/>
         </w:rPr>
-        <w:t xml:space="preserve">November 11, 2025</w:t>
-      </w:r>
-    </w:p>
-    <w:p>
-      <w:pPr>
-        <w:pStyle w:val="BodyText"/>
-      </w:pPr>
-      <w:r>
-        <w:t xml:space="preserve">Five weeks after I started the hospice job, my father started to die. We moved to Raleigh because life was expanding. Hope had been a pharmacist for eight years. Raleigh made sense: jobs, community, a church that felt like ours. Leaving Pensacola meant leaving roots. Hope never wavered. That’s who she is. Not blindly optimistic; she sees clearly and asks hard questions. But under all of it is a bedrock belief that God has a plan for us to be of service. When the hospice opportunity came, it felt like a room I’d been circling for years with the door finally open. No debate. No spreadsheet. This was where I was most needed.</w:t>
+        <w:t xml:space="preserve">Raleigh, fall 2025</w:t>
       </w:r>
     </w:p>
     <w:p>
@@ -13548,7 +13214,7 @@
         <w:rPr>
           <w:highlight w:val="yellow"/>
         </w:rPr>
-        <w:t xml:space="preserve">He’d dressed for it. Pressed shirt, the collar standing a little off his neck now, the hair done. Donna had driven. He walked in on his own and made sure we saw that he did. The waitress knew him. She called him Mr. Lou and asked if he wanted the usual, and he said she knew he did, and for a minute he was the man who liked to be recognized in a restaurant more than he liked the food. Eggs, toast, coffee he stirred and didn’t drink much of. He ate about a third of it and pushed the plate an inch away from himself, which was as close as he came to saying he was full.</w:t>
+        <w:t xml:space="preserve">He’d dressed for it. Pressed shirt, the collar standing a little off his neck now, the hair done. Donna had driven. He walked in on his own and made sure we saw that he did. Eggs, toast, coffee he stirred and didn’t drink much of. He ate about a third of it and pushed the plate an inch away from himself, which was as close as he came to saying he was full.</w:t>
       </w:r>
     </w:p>
     <w:p>
@@ -13606,7 +13272,7 @@
         <w:rPr>
           <w:highlight w:val="yellow"/>
         </w:rPr>
-        <w:t xml:space="preserve">He left a twenty on the table. When we got up he didn’t walk us to the car. He stood inside the door with his hand flat on the glass and watched us go, and I watched him in the mirror until the turn. With him, miracles had started to feel ordinary. It was the last time I saw him.</w:t>
+        <w:t xml:space="preserve">When we got up he didn’t walk us to the car. He stood inside the door and watched us go. It was the last time I saw him.</w:t>
       </w:r>
     </w:p>
     <w:p>
@@ -13622,6 +13288,14 @@
         <w:t xml:space="preserve">[END PLACEHOLDER.]</w:t>
       </w:r>
     </w:p>
+    <w:p>
+      <w:pPr>
+        <w:pStyle w:val="BodyText"/>
+      </w:pPr>
+      <w:r>
+        <w:t xml:space="preserve">Five weeks after I started the hospice job, my father started to die. We had moved to Raleigh because life was expanding. Hope had been a pharmacist for eight years. Raleigh made sense: jobs, community, a church that felt like ours. Hope never wavered. She sees clearly and asks hard questions, and under all of it is a bedrock belief that God has a plan for us to be of service. When the hospice opportunity came, it felt like a room I’d been circling for years with the door finally open.</w:t>
+      </w:r>
+    </w:p>
     <w:bookmarkStart w:id="61" w:name="the-rooms"/>
     <w:p>
       <w:pPr>
@@ -13640,14 +13314,6 @@
         <w:pStyle w:val="FirstParagraph"/>
       </w:pPr>
       <w:r>
-        <w:t xml:space="preserve">Hospice didn’t arrive all at once. It came the way hard things usually do, a little at a time, like a knock I kept deciding I hadn’t heard.</w:t>
-      </w:r>
-    </w:p>
-    <w:p>
-      <w:pPr>
-        <w:pStyle w:val="BodyText"/>
-      </w:pPr>
-      <w:r>
         <w:t xml:space="preserve">I recognized the posture the work required. You don’t rush in. You don’t fill silence with hollow reassurance. You sit, you listen, you stay. A lot of families wait to start hospice. They’re not ready. They can’t let go yet.</w:t>
       </w:r>
     </w:p>
@@ -13656,7 +13322,7 @@
         <w:pStyle w:val="BodyText"/>
       </w:pPr>
       <w:r>
-        <w:t xml:space="preserve">For years my mind had rehearsed survival: escape, shame, pressure, fear, control. Then recovery handed me a new script and made me practice it daily. Tell the truth. Ask for help. Go to the meeting. Call the sponsor. Pray. Stay sober today. Be useful to someone else. Years of that, until the script stopped being practice and started being me. And hospice, it turned out, was the same script translated for sacred rooms. Stay present. Tell the truth gently. Don’t run from silence. Don’t make dying about your own discomfort. Honor the person. Help the family breathe. The rooms felt familiar because I had been rehearsing for them all along.</w:t>
+        <w:t xml:space="preserve">Recovery had handed me a script and made me practice it daily. Tell the truth. Ask for help. Go to the meeting. Call the sponsor. Pray. Stay sober today. Be useful to someone else. Hospice was the same script in a different room. Stay present. Tell the truth gently. Don’t run from silence. Don’t make dying about your own discomfort.</w:t>
       </w:r>
     </w:p>
     <w:p>
@@ -13672,7 +13338,7 @@
         <w:pStyle w:val="BodyText"/>
       </w:pPr>
       <w:r>
-        <w:t xml:space="preserve">Another room has stayed with me, and I’ll keep it vague out of respect. Two men, and it took about a minute to see that whatever was between them was the deepest thing in either of their lives. But when one of them spoke about the other, the word he used was best friend. They were partners, and they had spent a lifetime keeping a careful distance in public, and even here, even at the end, the habit held. The love was real. The showing of it still had to be hidden. I didn’t name it. It wasn’t mine to name. What I remember most is the sense that the one who could still leave needed to get home, to the one place the two of them had ever been free to love out loud. I have never forgotten that. Part of this work is noticing the love that has had to live in code, and making room for it without making a thing of it.</w:t>
+        <w:t xml:space="preserve">Another room has stayed with me, and I’ll keep it vague out of respect. Two men, and it took about a minute to see that whatever was between them was the deepest thing in either of their lives. But when one of them spoke about the other, the word he used was best friend. They were partners, and they had spent a lifetime keeping a careful distance in public, and even here, even at the end, the habit held. The love was real. The showing of it still had to be hidden. I didn’t name it. It wasn’t mine to name. What I remember most is the sense that the one who could still leave needed to get home, to the one place the two of them had ever been free to love out loud. Part of this work is noticing the love that has had to live in code, and making room for it without making a thing of it.</w:t>
       </w:r>
     </w:p>
     <w:p>
@@ -13716,7 +13382,7 @@
         <w:t xml:space="preserve"> </w:t>
       </w:r>
       <w:r>
-        <w:t xml:space="preserve">But mostly I understood that I’d walked into that room to sit with a dying man and ended up holding his wife’s other grief, the living one. Addiction doesn’t wait outside the hospice door. It’s already in half the rooms, and because I came back from it, families hand me that fear too. I take it.</w:t>
+        <w:t xml:space="preserve">I’d walked into that room to sit with a dying man and ended up holding his wife’s other grief, the living one. Addiction doesn’t wait outside the hospice door. It’s already in half the rooms.</w:t>
       </w:r>
     </w:p>
     <w:p>
@@ -13740,7 +13406,7 @@
         <w:pStyle w:val="BodyText"/>
       </w:pPr>
       <w:r>
-        <w:t xml:space="preserve">The decline wasn’t dramatic at first, less energy in his voice on the phone, conversations that used to run long wrapping up faster, with less of the texture that made them his. I knew how to read it. I’d just spent five weeks learning to read exactly this. I was walking into strangers’ homes explaining what hospice was and wasn’t, and the whole time my own father was crossing the same line I’d been describing to families all week. I didn’t tell them my dad was dying too. I didn’t need to.</w:t>
+        <w:t xml:space="preserve">Dad’s decline wasn’t dramatic at first, less energy in his voice on the phone, conversations that used to run long wrapping up faster, with less of the texture that made them his. I’d just spent five weeks learning to read exactly this. I was walking into strangers’ homes explaining what hospice was and wasn’t, and the whole time my own father was crossing the same line I’d been describing to families all week. I didn’t tell them my dad was dying too. I didn’t need to.</w:t>
       </w:r>
     </w:p>
     <w:p>
@@ -13832,7 +13498,7 @@
           <w:bCs/>
           <w:b/>
         </w:rPr>
-        <w:t xml:space="preserve">December 28, 2025</w:t>
+        <w:t xml:space="preserve">Raleigh, December 2025</w:t>
       </w:r>
     </w:p>
     <w:p>
@@ -13864,7 +13530,7 @@
         <w:rPr>
           <w:highlight w:val="yellow"/>
         </w:rPr>
-        <w:t xml:space="preserve">I called Donna back that Tuesday night, after my mother had gone to bed. I asked her the questions I ask strangers. Is he comfortable. Is he eating. Who’s with him. She answered every one, and then she went quiet, and the quiet was the part she’d been calling to say. I told her we’d be down Friday.</w:t>
+        <w:t xml:space="preserve">I called Donna back that Tuesday night, after my mother had gone to bed. I asked her the questions I ask strangers. Is he comfortable. Is he eating. Who’s with him. She answered every one, and then she went quiet. I told her we’d be down Friday.</w:t>
       </w:r>
       <w:r>
         <w:rPr>
@@ -13911,7 +13577,7 @@
         <w:rPr>
           <w:highlight w:val="yellow"/>
         </w:rPr>
-        <w:t xml:space="preserve">My mother was in town. She has Parkinson’s now, and getting to me had cost her every ounce of energy she had. Christmas Eve she sat on a stool in our kitchen with a cup of tea she’d let go cold, both hands around it to keep them still, and told Hope how my nana made the sauce. I stood there and let her. Twice she asked how Dad was doing.</w:t>
+        <w:t xml:space="preserve">My mother was in town. She has Parkinson’s now, and getting to me had cost her every ounce of energy she had. Christmas Eve she sat on a stool in our kitchen with a cup of tea she’d let go cold, both hands around it to keep them still, and watched Hope cook. I stood there and let her. Twice she asked how Dad was doing.</w:t>
       </w:r>
       <w:r>
         <w:rPr>
@@ -13958,7 +13624,7 @@
         <w:rPr>
           <w:highlight w:val="yellow"/>
         </w:rPr>
-        <w:t xml:space="preserve">Around four I went out to the car in the driveway and sat in it with the engine off. Eighteen years earlier, in the worst of it, I used to drive past his house in Pensacola, see him out front washing his car, and wave and keep going, because pulling in meant questions. I knew how to do that. I was doing it from seven hundred miles away, with a hospice badge in my bag. Hope came out and stood by the window and didn’t knock. She just stayed until I came in.</w:t>
+        <w:t xml:space="preserve">Around four I went out to the car in the driveway and sat in it with the engine off. Eighteen years earlier, in the worst of it, I used to drive past his house in Pensacola, see him out front washing his car, and wave and keep going, because pulling in meant questions. I knew how to do that. I was doing it from seven hundred miles away. Hope came out and stood by the window and didn’t knock. She just stayed until I came in.</w:t>
       </w:r>
     </w:p>
     <w:p>
@@ -13969,7 +13635,7 @@
         <w:rPr>
           <w:highlight w:val="yellow"/>
         </w:rPr>
-        <w:t xml:space="preserve">That night, they put him on a morphine drip. Chris texted it, four words and a time. He was in the hospital, on comfort care — not hospice; it went that fast. I knew what the drip meant — it’s my work. Morphine at the end doesn’t take anyone. It eases the pain and the hunger for air while the dying does what it was already doing. The drip didn’t tell me what was coming. It told me where he already was. Comfort was the assignment now. I did not say any of that out loud in my own kitchen. I put the phone back face down. Part of the reason was simpler than I’ve made it sound, and harder to admit. I did not want my last memory of my father to be tubes in his nose. He had been bigger than two cancers and a scare. I couldn’t let the man in that bed become the last picture I kept of him. It was selfish. I’m sorry it was that way.</w:t>
+        <w:t xml:space="preserve">That night, they put him on a morphine drip. Chris texted it. He was in the hospital, on comfort care — not hospice; it went that fast. I knew what the drip meant — it’s my work. Morphine at the end doesn’t take anyone. It eases the pain and the hunger for air while the dying does what it was already doing. The drip didn’t tell me what was coming. It told me where he already was. Comfort was the assignment now. I did not say any of that out loud in my own kitchen. I put the phone back face down. Part of the reason was simpler than I’ve made it sound, and harder to admit. I did not want my last memory of my father to be tubes in his nose. He had been bigger than two cancers and a scare. I couldn’t let the man in that bed become the last picture I kept of him. It was selfish. I’m sorry it was that way.</w:t>
       </w:r>
     </w:p>
     <w:p>
@@ -14027,7 +13693,7 @@
         <w:rPr>
           <w:highlight w:val="yellow"/>
         </w:rPr>
-        <w:t xml:space="preserve">He didn’t have to finish it, and he did anyway, because he’s the one who finishes things. Our father was gone.</w:t>
+        <w:t xml:space="preserve">He didn’t have to finish it, and he did anyway. Our father was gone.</w:t>
       </w:r>
     </w:p>
     <w:p>
@@ -14038,7 +13704,7 @@
         <w:rPr>
           <w:highlight w:val="yellow"/>
         </w:rPr>
-        <w:t xml:space="preserve">I don’t know how long I stood there. I went and told my mother. She reached for my hand, and hers was shaking, and for once it wasn’t the Parkinson’s. Hope had come in behind me. I went back out to the car, and this time I didn’t sit in it. I stood in the driveway on Christmas morning with the phone in my hand and nowhere to drive.</w:t>
+        <w:t xml:space="preserve">I don’t know how long I stood there. I went and told my mother. She reached for my hand. Hope had come in behind me. I went back out to the car, and this time I didn’t sit in it. I stood in the driveway on Christmas morning with the phone in my hand.</w:t>
       </w:r>
     </w:p>
     <w:p>
@@ -14059,7 +13725,7 @@
         <w:pStyle w:val="BodyText"/>
       </w:pPr>
       <w:r>
-        <w:t xml:space="preserve">I didn’t feel guilty at first. I had been at his bedside every other time — the surgeries, the pacemaker — and I had lived close to him for eighteen years. The guilt came later, and it came from outside: people in the family who love me and who gave me a very hard time about not being there. I understand it. Grief needs somewhere to go. The week before, I had told my sponsor that I’d said everything to my dad that needed saying, and I hold that like a railing. Being absent from the last hour is not the same as being absent from the life.</w:t>
+        <w:t xml:space="preserve">I didn’t feel guilty at first. I had been at his bedside every other time — the surgeries, the pacemaker — and I had lived close to him for eighteen years. The guilt came later. Being absent from the last hour is not the same as being absent from the life.</w:t>
       </w:r>
     </w:p>
     <w:p>
@@ -14085,39 +13751,23 @@
         <w:t xml:space="preserve"> </w:t>
       </w:r>
       <w:r>
-        <w:t xml:space="preserve">And somewhere in that last stretch we traded our two lines one more time, the ones we’d been trading since a car ride to Ohio half a lifetime ago. Dad, thank you for saving my life. You saved mine. His answer never changed, not even at the end. We were not unfinished. That is not a small thing.</w:t>
-      </w:r>
-    </w:p>
-    <w:p>
-      <w:pPr>
-        <w:pStyle w:val="BodyText"/>
-      </w:pPr>
-      <w:r>
-        <w:t xml:space="preserve">When he was gone, something landed on me that I had never felt before, not over anyone. I had lost people I loved before him. Nothing came close to this. I had been around death for years — I knew the word. I did not know the thing. Now I did. Grief. People think it’s a constant, a gray you live under. It isn’t. It’s an overwhelming sadness that comes and goes through the day, and beneath all of it, all the time, a deep heartache that never fully lifts. What took me a while to understand about mine: underneath, it wasn’t guilt. It was simpler and heavier than that. The most amazing man I’ve ever known wasn’t alive anymore, and I wanted him here. That’s what I carry.</w:t>
-      </w:r>
-    </w:p>
-    <w:p>
-      <w:pPr>
-        <w:pStyle w:val="BodyText"/>
-      </w:pPr>
-      <w:r>
-        <w:t xml:space="preserve">I went back to work almost immediately. I don’t know how to explain that except to say the body keeps doing what it knows how to do.</w:t>
-      </w:r>
-    </w:p>
-    <w:p>
-      <w:pPr>
-        <w:pStyle w:val="BodyText"/>
-      </w:pPr>
-      <w:r>
-        <w:t xml:space="preserve">There’s more to that week than I’ve told you. It’s still too painful to talk about, and I’m not going to pretend otherwise. Maybe someday, further down this road, I’ll be able to write it.</w:t>
-      </w:r>
-    </w:p>
-    <w:p>
-      <w:pPr>
-        <w:pStyle w:val="BodyText"/>
-      </w:pPr>
-      <w:r>
-        <w:t xml:space="preserve">When the time came, Hope and I made the drive to Pensacola. We talked the whole way about Lou, not the saint version, the real one. The complicated man. The hard parts and the funny parts and the parts only family knows. By the time we got there I had cried and laughed and gone quiet a dozen times. That’s grief too. Hope let me cry, and she cried some herself, partly for Lou, mostly for the pain she knew I was in.</w:t>
+        <w:t xml:space="preserve">And somewhere in that last stretch we traded our two lines one more time, the ones we’d been trading since a car ride to Ohio half a lifetime ago. Dad, thank you for saving my life. You saved mine. His answer never changed, not even at the end. We were not unfinished.</w:t>
+      </w:r>
+    </w:p>
+    <w:p>
+      <w:pPr>
+        <w:pStyle w:val="BodyText"/>
+      </w:pPr>
+      <w:r>
+        <w:t xml:space="preserve">When he was gone, something landed on me that I had never felt before, not over anyone. I had been around death for years — I knew the word. I did not know the thing. Now I did. Grief. People think it’s a constant, a gray you live under. It isn’t. It’s an overwhelming sadness that comes and goes through the day, and beneath all of it, all the time, a deep heartache that never fully lifts. What took me a while to understand about mine: underneath, it wasn’t guilt. It was simpler and heavier than that. The most amazing man I’ve ever known wasn’t alive anymore, and I wanted him here. That’s what I carry.</w:t>
+      </w:r>
+    </w:p>
+    <w:p>
+      <w:pPr>
+        <w:pStyle w:val="BodyText"/>
+      </w:pPr>
+      <w:r>
+        <w:t xml:space="preserve">When the time came, Hope and I made the drive to Pensacola. We talked the whole way about Lou, not the saint version, the real one. The complicated man. The hard parts and the funny parts and the parts only family knows. By the time we got there I had cried and laughed and gone quiet a dozen times. Hope let me cry, and she cried some herself, partly for Lou, mostly for the pain she knew I was in.</w:t>
       </w:r>
     </w:p>
     <w:p>
@@ -14149,7 +13799,7 @@
         <w:pStyle w:val="BodyText"/>
       </w:pPr>
       <w:r>
-        <w:t xml:space="preserve">The funeral home was small. A lobby at the entrance, a family waiting area off to the left, and to the right a little room with pews and a writing station, where even now people were being asked to sign their names. I sat with Chris and Nisha, with Joel and Jon and their families, with Hope. And somewhere in that hour it landed on me that we were not all grieving the same man. The room was full of different Lous. Some had known him as an older father figure, some as a younger one. Some as a friend. Some as a coworker. Some as a complicated old wound. Some only as the man he became at the end, softened and slowed. Jon once told me his Lou had felt more like a friend than a father — they were closer in age, they went out together, they traded texts about the Yankee games. Mine was the rescuer. Some sons need instruction. Some need warmth. Some need a hand on the shoulder because they’re already carrying more than they can name. Some need to be pulled out of an apartment in West Palm Beach. Lou seemed to know which of us needed which, and he showed up accordingly. I lost the man who chose me, rescued me, and left me with a promise. Everyone else in those pews lost somebody else.</w:t>
+        <w:t xml:space="preserve">The funeral home was small. A lobby at the entrance, a family waiting area off to the left, and to the right a little room with pews and a writing station, where even now people were being asked to sign their names. I sat with Chris and Nisha, with Joel and Jon and their families, with Hope. And somewhere in that hour it landed on me that we were not all grieving the same man. The room was full of different Lous. Some had known him as an older father figure, some as a younger one. Some as a friend. Some as a coworker. Some as a complicated old wound. Some only as the man he became at the end, softened and slowed. Jon once told me his Lou had felt more like a friend than a father — they were closer in age, they went out together, they traded texts about the Yankee games. Mine was the rescuer. Some sons need instruction. Some need warmth. Some need a hand on the shoulder. Some need to be pulled out of an apartment in West Palm Beach. Lou seemed to know which of us needed which, and he showed up accordingly. I lost the man who chose me, rescued me, and left me with a promise. Everyone else in those pews lost somebody else.</w:t>
       </w:r>
     </w:p>
     <w:p>
@@ -14165,31 +13815,31 @@
         <w:pStyle w:val="BodyText"/>
       </w:pPr>
       <w:r>
-        <w:t xml:space="preserve">Two of my brothers stood up to speak, Chris and Joel. I did not. I wanted to honor my father, but I couldn’t have gotten through two sentences without collapsing. So Chris did what brothers do when one of them can’t carry the thing alone. He carried it for both of us. He gave the eulogy, and it was spot on, the right words, the right respect, no more and no less. He talked about a father who was steady and present, a man who never needed to say out loud that he was proud of you. You just knew.</w:t>
-      </w:r>
-    </w:p>
-    <w:p>
-      <w:pPr>
-        <w:pStyle w:val="BodyText"/>
-      </w:pPr>
-      <w:r>
-        <w:t xml:space="preserve">Chris told the one about Fargo. Years back, Dad got in the car and drove alone from New Jersey to Fargo, North Dakota, to watch Chris finish a national wrestling tournament. If it mattered to one of his kids, he showed up, no matter how far. And Chris shared the phrase the two of them had kept between them for years. After the big moments they would say it quietly to each other. Hey Dad, we made it. Five words that held all the early mornings and long drives, all the nights it would have been easier to quit. Sitting there, I thought about how many of us had our own version of that with him, and how we were all going to have to learn to say it now without him there to answer.</w:t>
-      </w:r>
-    </w:p>
-    <w:p>
-      <w:pPr>
-        <w:pStyle w:val="BodyText"/>
-      </w:pPr>
-      <w:r>
-        <w:t xml:space="preserve">Then Joel spoke, and he painted the other side of the man, the one whose name opened rooms. Dad knew everyone, and he made everyone feel known: the cooks, the maître d’s, the bartenders, the doorman at the club. Joel said you could still walk into a place downtown, say the name, and watch a stranger’s face light up. Louie’s your dad? Going somewhere with Dad was never only about the place. He brought you into his world and made you feel the magic of it.</w:t>
-      </w:r>
-    </w:p>
-    <w:p>
-      <w:pPr>
-        <w:pStyle w:val="BodyText"/>
-      </w:pPr>
-      <w:r>
-        <w:t xml:space="preserve">Joel talked about the work, too, the part of Lou we only half understood as kids. He ran a landscaping business, fifty lawns a week, while working an IT night shift from eleven at night to seven in the morning. He would come home, sleep an hour and a half, meet his crew on the road, work the lawns, come back for a few hours, then head into the city again for the night. Our standing job as kids: make sure Dad woke up in time for his eleven o’clock shift. Every single night. He never stopped, and he never complained. He chose all of it, for us.</w:t>
+        <w:t xml:space="preserve">Two of my brothers stood up to speak, Chris and Joel. I did not. I wanted to honor my father, but I couldn’t have gotten through two sentences without collapsing. So Chris did what brothers do when one of them can’t carry the thing alone. He carried it for both of us. He gave the eulogy, the right words, no more and no less. He talked about a father who was steady and present, a man who never needed to say out loud that he was proud of you. You just knew.</w:t>
+      </w:r>
+    </w:p>
+    <w:p>
+      <w:pPr>
+        <w:pStyle w:val="BodyText"/>
+      </w:pPr>
+      <w:r>
+        <w:t xml:space="preserve">Chris told the one about Fargo. Years back, Dad got in the car and drove alone from New Jersey to Fargo, North Dakota, to watch Chris finish a national wrestling tournament. And Chris shared the phrase the two of them had kept between them for years. After the big moments they would say it quietly to each other. Hey Dad, we made it. Sitting there, I thought about how many of us had our own version of that with him, and how we were all going to have to learn to say it now without him there to answer.</w:t>
+      </w:r>
+    </w:p>
+    <w:p>
+      <w:pPr>
+        <w:pStyle w:val="BodyText"/>
+      </w:pPr>
+      <w:r>
+        <w:t xml:space="preserve">Then Joel spoke, and he painted the other side of the man, the one whose name opened rooms. Dad knew everyone, and he made everyone feel known: the cooks, the maître d’s, the bartenders, the doorman at the club. Joel said you could still walk into a place downtown, say the name, and watch a stranger’s face light up. Louie’s your dad? He brought you into his world and made you feel the magic of it.</w:t>
+      </w:r>
+    </w:p>
+    <w:p>
+      <w:pPr>
+        <w:pStyle w:val="BodyText"/>
+      </w:pPr>
+      <w:r>
+        <w:t xml:space="preserve">Joel talked about the work, too, the part of Lou we only half understood as kids. He ran a landscaping business, fifty lawns a week, while working an IT night shift from eleven at night to seven in the morning. He would come home, sleep an hour and a half, meet his crew on the road, work the lawns, come back for a few hours, then head into the city again for the night. Our standing job as kids: make sure Dad woke up in time for his eleven o’clock shift. Every single night. He never stopped, and he never complained.</w:t>
       </w:r>
     </w:p>
     <w:p>
@@ -14205,7 +13855,7 @@
         <w:pStyle w:val="BodyText"/>
       </w:pPr>
       <w:r>
-        <w:t xml:space="preserve">Chris credited Donna, too, called her the reason Dad got his strength and his joy back in the last stretch of his life. It was true. She had given him good years, and she had been there for every one of the hard ones. I was grateful for what she had been to him.</w:t>
+        <w:t xml:space="preserve">Chris credited Donna, too, called her the reason Dad got his strength and his joy back in the last stretch of his life. It was true. She had given him good years, and she had been there for every one of the hard ones.</w:t>
       </w:r>
     </w:p>
     <w:p>
@@ -14221,7 +13871,7 @@
         <w:pStyle w:val="BodyText"/>
       </w:pPr>
       <w:r>
-        <w:t xml:space="preserve">Chris had carried Dad’s pride his whole life — the golden child, in the best sense of it, the son who stayed close and never forgot where he came from. I had carried something else. Chris carried his pride. I carried his rescue. Dad knew the difference, and he loved us each in the way we needed. I think he saw me as a little more fragile — not weaker, exactly, but breakable in places I didn’t always know how to name. He was right.</w:t>
+        <w:t xml:space="preserve">Chris had carried Dad’s pride his whole life — the golden child, in the best sense of it, the son who stayed close. I carried his rescue. Dad knew the difference. I think he saw me as a little more fragile, breakable in places I didn’t always know how to name. He was right.</w:t>
       </w:r>
     </w:p>
     <w:p>
@@ -14230,14 +13880,6 @@
       </w:pPr>
       <w:r>
         <w:t xml:space="preserve">Then I stood at the casket. I looked down at my father, and it wasn’t him anymore. The body was there, but he wasn’t. I knew his soul had already gone on ahead. I had watched that line get crossed in other people’s rooms more times than I can count, and I knew it the moment I saw it. It still didn’t stop the feeling. I stood there and loved him, for everything he was, and everything he wasn’t.</w:t>
-      </w:r>
-    </w:p>
-    <w:p>
-      <w:pPr>
-        <w:pStyle w:val="BodyText"/>
-      </w:pPr>
-      <w:r>
-        <w:t xml:space="preserve">The patriarch was gone, and nothing seemed to flow the same. Lou had been the one everything quietly organized itself around, the center a family doesn’t notice until it’s gone and the whole thing loosens. Nobody said it out loud. We all felt it.</w:t>
       </w:r>
     </w:p>
     <w:p>
@@ -14283,7 +13925,7 @@
         <w:pStyle w:val="BodyText"/>
       </w:pPr>
       <w:r>
-        <w:t xml:space="preserve">I sit with families for a living and hand them the questions I never handed him. Ask now, I tell them. This is the right day. I believe every word of it, and I also know what it is to stand outside a door a man has decided to keep shut, and to love him enough to leave it that way. Both things are true. I spent my life being saved by my father. At the end, I had to learn that loving him didn’t mean saving him back.</w:t>
+        <w:t xml:space="preserve">I sit with families for a living and hand them the questions I never handed him. Ask now, I tell them. This is the right day. I believe every word of it, and I also know what it is to stand outside a door a man has decided to keep shut, and to love him enough to leave it that way. I spent my life being saved by my father. At the end, I had to learn that loving him didn’t mean saving him back.</w:t>
       </w:r>
     </w:p>
     <w:bookmarkEnd w:id="62"/>
@@ -14413,7 +14055,7 @@
         <w:pStyle w:val="BodyText"/>
       </w:pPr>
       <w:r>
-        <w:t xml:space="preserve">I took one day off after my father died, then put on a tie and went back. He’d worn one for forty years, and he’d have gone back the next day, so I did too. Not to avoid the grief. Because the next thing he’d have done was show up, and so would I. The tie was the same idea.</w:t>
+        <w:t xml:space="preserve">I took one day off after my father died, then put on a tie and went back. He’d worn one for forty years, and he’d have gone back the next day, so I did too.</w:t>
       </w:r>
     </w:p>
     <w:p>
@@ -14429,15 +14071,15 @@
         <w:pStyle w:val="BodyText"/>
       </w:pPr>
       <w:r>
-        <w:t xml:space="preserve">I never wanted a drink. That surprised me. What I wanted was to be gone. I let the routines slip. The gym went first, and I still haven’t found my way back to it very often. I haven’t watched a Yankees game since he died. Some things are still too closely connected to him. He was always the one who told me he was proud of me. I let the phone ring, sat in rooms without being in them. I’d get in the car and drive with no destination, park somewhere and cry, then drive some more. Sometimes I’d end up asleep on a couch in the lobby of a hotel where I wasn’t a guest. Numb. When I wasn’t driving the car I was working on it, hours at a time, jobs it didn’t need. What I needed, I kept telling myself, was to be alone. I’d write some and sleep. Some of the pages in this book come from those weeks, and I look back at them now and I’m not sure how I managed any of it. These chapters were the hardest for me to write. I was there, and it was so painful that writing it meant living it twice. The hospice job was still new, I was still learning it, and I kept going to it anyway through all of this. I couldn’t tell you how. Hope never knew where I was. When I came home she’d ask, and the honest answer was nowhere. Disappearing, on a woman whose oldest wound is being left.</w:t>
-      </w:r>
-    </w:p>
-    <w:p>
-      <w:pPr>
-        <w:pStyle w:val="BodyText"/>
-      </w:pPr>
-      <w:r>
-        <w:t xml:space="preserve">She watched it get worse before I did. I got into a couple of fender benders, my head somewhere else at stop signs and in parking lots. Then I hit a guardrail. Twenty-two thousand dollars of damage. Hope and her mom were worried, and said so. I got defensive. I didn’t want to look weak. They were right, which was the part I couldn’t stand. It was like cutting weight again. You’re starving, you won’t eat, and nobody at the table understands why, because from the inside it makes perfect sense. Hope started watching me the way you watch someone after a fall, and finally asked, seriously, whether I might have a concussion. That’s what grief looked like on me. Enough like a head injury that the person who knows me best couldn’t tell the difference. Then she said the thing that cut through.</w:t>
+        <w:t xml:space="preserve">I never wanted a drink. That surprised me. What I wanted was to be gone. I let the routines slip. The gym went first, and I still haven’t found my way back to it very often. I haven’t watched a Yankees game since he died. Some things are still too closely connected to him. He was always the one who told me he was proud of me. I let the phone ring, sat in rooms without being in them. I’d get in the car and drive with no destination, park somewhere and cry, then drive some more. Sometimes I’d end up asleep on a couch in the lobby of a hotel where I wasn’t a guest. Numb. When I wasn’t driving the car I was working on it, hours at a time, jobs it didn’t need. What I needed, I kept telling myself, was to be alone. I’d write some and sleep. Some of the pages in this book come from those weeks. These chapters were the hardest to write; writing it meant living it twice. The hospice job was still new, and I kept going to it through all of this. I couldn’t tell you how. Hope never knew where I was. When I came home she’d ask, and the honest answer was nowhere. Disappearing, on a woman whose oldest wound is being left.</w:t>
+      </w:r>
+    </w:p>
+    <w:p>
+      <w:pPr>
+        <w:pStyle w:val="BodyText"/>
+      </w:pPr>
+      <w:r>
+        <w:t xml:space="preserve">She watched it get worse before I did. I got into a couple of fender benders, my head somewhere else at stop signs and in parking lots. Then I hit a guardrail. Twenty-two thousand dollars of damage. The cardinal had already come by then. I had stood in a parking lot on the ninth and felt peace, and I still put a car into a guardrail. Hope and her mom were worried, and said so. I got defensive. I didn’t want to look weak. They were right, which was the part I couldn’t stand. It was like cutting weight again. You’re starving, you won’t eat, and nobody at the table understands why, because from the inside it makes perfect sense. Hope started watching me the way you watch someone after a fall, and finally asked, seriously, whether I might have a concussion. That’s what grief looked like on me. Enough like a head injury that the person who knows me best couldn’t tell the difference. Then she said the thing that cut through.</w:t>
       </w:r>
       <w:r>
         <w:t xml:space="preserve"> </w:t>
@@ -14555,15 +14197,15 @@
         <w:pStyle w:val="BodyText"/>
       </w:pPr>
       <w:r>
-        <w:t xml:space="preserve">Before I lost him, I was good at this job, but there was a gap in it, one I can only admit now. I would sit with a family and say the right things, nod at the right moments, and look like a man who understood exactly what they were feeling. Inside, I didn’t. I hadn’t lost the one I loved most yet. I was fluent in the words and a step removed from the weight. Losing my dad closed that gap. Now when I walk into a room where someone is losing the person they love most, I’m not performing understanding. I have it. I know the specific shape of it. It made me more compassionate, and it made me better at the work, which is a hard thing to be grateful for, and I am grateful for it anyway.</w:t>
-      </w:r>
-    </w:p>
-    <w:p>
-      <w:pPr>
-        <w:pStyle w:val="BodyText"/>
-      </w:pPr>
-      <w:r>
-        <w:t xml:space="preserve">Families would say, I’m terrified I won’t be there when it happens. What I offered was what I knew to be true: presence is cumulative. You build it in the ordinary. Lou gave me everything I needed for the rooms I walk into now, and in those rooms, with the silences that need holding rather than filling, I carry him.</w:t>
+        <w:t xml:space="preserve">Before I lost him, I was good at this job, but there was a gap in it, one I can only admit now. I would sit with a family and say the right things, nod at the right moments, and look like a man who understood exactly what they were feeling. Inside, I didn’t. I hadn’t lost the one I loved most yet. I was fluent in the words and a step removed from the weight. Losing my dad closed that gap. Now when I walk into a room where someone is losing the person they love most, I’m not performing understanding. I have it. It made me better at the work, which is a hard thing to be grateful for, and I am grateful for it anyway.</w:t>
+      </w:r>
+    </w:p>
+    <w:p>
+      <w:pPr>
+        <w:pStyle w:val="BodyText"/>
+      </w:pPr>
+      <w:r>
+        <w:t xml:space="preserve">Families would say, I’m terrified I won’t be there when it happens. What I offered was what I knew to be true: presence is cumulative. You build it in the ordinary.</w:t>
       </w:r>
     </w:p>
     <w:p>
@@ -14627,7 +14269,7 @@
         <w:pStyle w:val="BodyText"/>
       </w:pPr>
       <w:r>
-        <w:t xml:space="preserve">And some rooms stay with me whole. There was a couple I’ll call Ed and Eva. Ed sold medical equipment. Eva was a respiratory therapist. Between the two of them, healthcare was not a foreign language. They knew the words, the systems, what illness looked like from the professional side. And Ed was twelve years sober, a man who had already done the hardest thing most people can imagine, one day at a time, for over a decade. Recovery had taught him how to live. It had not taught him how to let go. I sat with them near the end. He understood medicine, but medicine did not tell him how to say goodbye. She had spent her working life at other people’s bedsides, and it did not make her less human in her own. Ed loved Eva. That was never in question. Love just needed help becoming a plan: who speaks when she cannot, what comfort means now, what matters most today. Ed and Eva taught me that knowing medicine is not the same as having peace. The room did not feel good at the end. It wasn’t supposed to. But Ed stayed in it, and the two of them got through it together. I watched them do it.</w:t>
+        <w:t xml:space="preserve">And some rooms stay with me whole. There was a couple I’ll call Ed and Eva. Ed sold medical equipment. Eva was a respiratory therapist. Between the two of them, healthcare was not a foreign language. They knew the words, the systems, what illness looked like from the professional side. And Ed was twelve years sober, a man who had already done the hardest thing most people can imagine, one day at a time, for over a decade. Recovery had taught him how to live. It had not taught him how to let go. I sat with them near the end. He understood medicine, but medicine did not tell him how to say goodbye. She had spent her working life at other people’s bedsides, and it did not make her less human in her own. Ed loved Eva. That was never in question. Love just needed help becoming a plan: who speaks when she cannot, what comfort means now, what matters most today. The room did not feel good at the end. It wasn’t supposed to. But Ed stayed in it, and the two of them got through it together. I watched them do it.</w:t>
       </w:r>
     </w:p>
     <w:p>
@@ -14653,7 +14295,7 @@
         <w:t xml:space="preserve"> </w:t>
       </w:r>
       <w:r>
-        <w:t xml:space="preserve">That’s what he built. Lou spent eighty-four years showing up without needing to know exactly where he was going. I’m trying to do the same.</w:t>
+        <w:t xml:space="preserve">That’s what he built.</w:t>
       </w:r>
     </w:p>
     <w:p>
@@ -14737,7 +14379,7 @@
         <w:pStyle w:val="BodyText"/>
       </w:pPr>
       <w:r>
-        <w:t xml:space="preserve">A few days after we buried my father, grief caught me somewhere I didn’t expect it. You never know when it’s going to hit, or who’s going to be standing there when it does.</w:t>
+        <w:t xml:space="preserve">A few days after we buried my father, grief caught me somewhere I didn’t expect it.</w:t>
       </w:r>
     </w:p>
     <w:p>
@@ -14753,15 +14395,15 @@
         <w:pStyle w:val="BodyText"/>
       </w:pPr>
       <w:r>
-        <w:t xml:space="preserve">Then I told her we had buried my dad on Saturday. Her face changed. You could tell she felt it. She just sat there with me. And I let myself go. I wouldn’t call it a breakdown, but I cried at that table, that raw, in front of someone I barely knew, and I don’t know whether you’re supposed to cry in front of a nurse you just met at a facility you’re calling on for work. But in that moment I felt something I can only call spiritual, a sense that God had put this person in my path. Not for referrals or business. For this.</w:t>
-      </w:r>
-    </w:p>
-    <w:p>
-      <w:pPr>
-        <w:pStyle w:val="BodyText"/>
-      </w:pPr>
-      <w:r>
-        <w:t xml:space="preserve">It was no longer about work. Two people at a round table, one of them grieving and the other choosing to stay in the room for it. We hugged. I gave her a kiss on the cheek. From that day on I’ve looked forward to the days I get to see Linda. For the person, not the place. The other staff joke about it, oh, you always come in and kiss Linda on the cheek. They don’t know the background, don’t know what was shared at that table the Wednesday after we buried my father. That’s fine. Not every connection needs an audience. As a rep, I’m the one who’s supposed to bring the chocolate and the goodies. When I go see Linda, I’m the one who feels taken care of. She gives me cookies. She checks in. The relationship runs backwards from the job description. Linda gave me a moment, three workdays after the funeral, at a round table, to stop holding it together. I’ll carry that.</w:t>
+        <w:t xml:space="preserve">Then I told her we had buried my dad on Saturday. Her face changed. She just sat there with me. And I let myself go. I wouldn’t call it a breakdown, but I cried at that table, that raw, in front of someone I barely knew, and I don’t know whether you’re supposed to cry in front of a nurse you just met at a facility you’re calling on for work. But in that moment I felt something I can only call spiritual, a sense that God had put this person in my path. Not for referrals or business. For this.</w:t>
+      </w:r>
+    </w:p>
+    <w:p>
+      <w:pPr>
+        <w:pStyle w:val="BodyText"/>
+      </w:pPr>
+      <w:r>
+        <w:t xml:space="preserve">Two people at a round table, one of them grieving and the other choosing to stay in the room for it. We hugged. I gave her a kiss on the cheek. From that day on I’ve looked forward to the days I get to see Linda. For the person, not the place. The other staff joke about it, oh, you always come in and kiss Linda on the cheek. They don’t know the background, don’t know what was shared at that table the Wednesday after we buried my father. That’s fine. Not every connection needs an audience. As a rep, I’m the one who’s supposed to bring the chocolate and the goodies. When I go see Linda, I’m the one who feels taken care of. She gives me cookies. She checks in. The relationship runs backwards from the job description.</w:t>
       </w:r>
     </w:p>
     <w:bookmarkEnd w:id="63"/>
@@ -14799,15 +14441,15 @@
         <w:pStyle w:val="BodyText"/>
       </w:pPr>
       <w:r>
-        <w:t xml:space="preserve">Hope and I can’t make it every year. We come from two divorced families, and splitting the holidays is brutal. But the table is always there. That’s Lisa.</w:t>
-      </w:r>
-    </w:p>
-    <w:p>
-      <w:pPr>
-        <w:pStyle w:val="BodyText"/>
-      </w:pPr>
-      <w:r>
-        <w:t xml:space="preserve">That table has seen every version of me. For years, in active addiction, I’d show up to Thanksgiving and end up passed out on her couch, dead to the world, sprawled across the whole thing so nobody else could lie down. It turned into a running joke that outlived the using, get to the couch before Rob does. I can laugh at it now because of how she handled it then. Lisa never shamed me for it. She set a plate for the worst version of me and loved me anyway, no lecture, just a place at the table and a couch I’d hog. She always told me I had a place to come to, no matter what. In those years there weren’t many people left in my corner. She was one of them. She stayed proud to call me her brother long before I could see why. I’ve been back plenty of sober years since, no passing out, but the joke stuck, the way the good ones do.</w:t>
+        <w:t xml:space="preserve">Hope and I can’t make it every year. We come from two divorced families, and splitting the holidays is brutal. But the table is always there.</w:t>
+      </w:r>
+    </w:p>
+    <w:p>
+      <w:pPr>
+        <w:pStyle w:val="BodyText"/>
+      </w:pPr>
+      <w:r>
+        <w:t xml:space="preserve">That table has seen every version of me. For years, in active addiction, I’d show up to Thanksgiving and end up passed out on her couch, dead to the world, sprawled across the whole thing so nobody else could lie down. It turned into a running joke that outlived the using, get to the couch before Rob does. Lisa never shamed me for it. She set a plate for the worst version of me, no lecture, just a place at the table and a couch I’d hog. In those years there weren’t many people left in my corner. She was one of them. I’ve been back plenty of sober years since, no passing out, but the joke stuck.</w:t>
       </w:r>
     </w:p>
     <w:p>
@@ -14839,7 +14481,7 @@
         <w:pStyle w:val="BodyText"/>
       </w:pPr>
       <w:r>
-        <w:t xml:space="preserve">I think about a night long ago when she cooked meatloaf for two boys who didn’t make it easy. She’s still standing at the counter. Still opening the door. The last time I was there for Thanksgiving, my father was still alive. I stood in her kitchen a minute before we sat down. I didn’t say anything. I just watched, and thought about how the people who hold families together don’t usually get thanked for it. They just keep doing it. Year after year. We sat down. Someone said grace. The food was passed. And for a few hours everything had a center. Lisa made sure of that.</w:t>
+        <w:t xml:space="preserve">I think about a night long ago when she cooked meatloaf for two boys who didn’t make it easy. She’s still standing at the counter. Still opening the door. The last time I was there for Thanksgiving, my father was still alive. I stood in her kitchen a minute before we sat down. I didn’t say anything. I just watched. We sat down. Someone said grace. The food was passed. And for a few hours everything had a center. Lisa made sure of that.</w:t>
       </w:r>
     </w:p>
     <w:bookmarkEnd w:id="64"/>
@@ -14861,7 +14503,7 @@
         <w:pStyle w:val="FirstParagraph"/>
       </w:pPr>
       <w:r>
-        <w:t xml:space="preserve">Almost every morning for fifteen years, my phone has rung early and it’s Mager, or I’ve called him first, and we pray. A few plain sentences to start the day pointed the right way. Nothing eloquent. Two sober men on a phone line, saying thank you, asking for help, hanging up, going to work. People ask me where God was in all of it, and the honest answer is that He was never the one who left. I was. I still can’t explain God on paper, and I’ve stopped trying. What I can tell you is that every time I hit the bottom of myself, something I had not put there was holding the floor. Today my faith doesn’t look like certainty. It looks like that morning call. A red bird on a mirror. Walking into a dying stranger’s room with nothing useful in my hands and trusting that presence is its own kind of prayer. I stopped needing the theology airtight. I just needed to stay in the room, and to let myself be shown up for. That, as much as anything, is what got me here.</w:t>
+        <w:t xml:space="preserve">Almost every morning for fifteen years, my phone has rung early and it’s Mager, or I’ve called him first, and we pray. A few plain sentences to start the day pointed the right way. Nothing eloquent. Two sober men on a phone line, saying thank you, asking for help, hanging up, going to work. People ask me where God was in all of it, and the honest answer is that He was never the one who left. I was. I still can’t explain God on paper, and I’ve stopped trying. What I can tell you is that every time I hit the bottom of myself, something I had not put there was holding the floor. Today my faith doesn’t look like certainty. It looks like that morning call. Walking into a dying stranger’s room with nothing useful in my hands and trusting that presence is its own kind of prayer. I stopped needing the theology airtight. I just needed to stay in the room, and to let myself be shown up for.</w:t>
       </w:r>
     </w:p>
     <w:bookmarkEnd w:id="65"/>
@@ -15016,7 +14658,7 @@
         <w:pStyle w:val="BodyText"/>
       </w:pPr>
       <w:r>
-        <w:t xml:space="preserve">The cardinal flew off into the gray. It has never landed on my car again. The promise remains. He made it on a U-Haul out of West Palm Beach without knowing he was making one: the people who loved you don’t stop looking out for you. It was never in the bird. It was in what Lou built in me, across forty years of chosen love and stubborn presence. Now it’s my turn. Keep showing up. Keep choosing love.</w:t>
+        <w:t xml:space="preserve">The cardinal flew off into the gray. It has never landed on my car again. The promise remains. He made it on a U-Haul out of West Palm Beach without knowing he was making one: the people who loved you don’t stop looking out for you. It was never in the bird. It was in what Lou built in me, across forty years of chosen love and stubborn presence.</w:t>
       </w:r>
     </w:p>
     <w:bookmarkEnd w:id="67"/>
@@ -15098,7 +14740,7 @@
         <w:pStyle w:val="BodyText"/>
       </w:pPr>
       <w:r>
-        <w:t xml:space="preserve">I called him. I cried, and I told him I loved him, and he said it back. That’s the power of the program.</w:t>
+        <w:t xml:space="preserve">I called him. I cried, and I told him I loved him, and he said it back.</w:t>
       </w:r>
     </w:p>
     <w:p>
@@ -15134,7 +14776,7 @@
       </w:r>
     </w:p>
     <w:bookmarkEnd w:id="68"/>
-    <w:bookmarkStart w:id="69" w:name="a-note-to-the-one-who-loves-an-addict"/>
+    <w:bookmarkStart w:id="69" w:name="authors-note"/>
     <w:p>
       <w:pPr>
         <w:pStyle w:val="Heading1"/>
@@ -15144,7 +14786,7 @@
           <w:bCs/>
           <w:b/>
         </w:rPr>
-        <w:t xml:space="preserve">A NOTE TO THE ONE WHO LOVES AN ADDICT</w:t>
+        <w:t xml:space="preserve">AUTHOR’S NOTE</w:t>
       </w:r>
     </w:p>
     <w:p>
@@ -15152,51 +14794,27 @@
         <w:pStyle w:val="FirstParagraph"/>
       </w:pPr>
       <w:r>
-        <w:t xml:space="preserve">If you picked up this book because you love someone who is using, or you lost someone who did, I want to say something to you now that the story is done.</w:t>
-      </w:r>
-    </w:p>
-    <w:p>
-      <w:pPr>
-        <w:pStyle w:val="BodyText"/>
-      </w:pPr>
-      <w:r>
-        <w:t xml:space="preserve">It isn’t your fault.</w:t>
-      </w:r>
-    </w:p>
-    <w:p>
-      <w:pPr>
-        <w:pStyle w:val="BodyText"/>
-      </w:pPr>
-      <w:r>
-        <w:t xml:space="preserve">I know you’ve tried. I know you’ve lain awake turning someone else’s life over and over, looking for the thing you missed. I was the person on the other end of those nights. My mother wired me money she told herself was for rent. My father drove a truck across the state to haul me home. None of it made me stop. Not because they failed. Because it wasn’t theirs to win. But hear the other half, because it’s just as true: none of it was wasted either. Every one of those rescues bought time, and time was the only thing that could still help me. You cannot make them stop. You can help them live until they do.</w:t>
-      </w:r>
-    </w:p>
-    <w:p>
-      <w:pPr>
-        <w:pStyle w:val="BodyText"/>
-      </w:pPr>
-      <w:r>
-        <w:t xml:space="preserve">I have been on both sides of this. I did not understand addiction as a disease at first. I understood it as a disappearance. One day the person you love is still there, sitting across from you, using the same voice, wearing the same face, and somehow already slipping away. You keep reaching for the version of them you remember. You keep thinking love should be enough. Then life teaches you, slowly and brutally, that love is not a cure. It won’t make them stop. What it does is keep you from leaving.</w:t>
-      </w:r>
-    </w:p>
-    <w:p>
-      <w:pPr>
-        <w:pStyle w:val="BodyText"/>
-      </w:pPr>
-      <w:r>
-        <w:t xml:space="preserve">Years later I would learn that this is also the whole of hospice. You cannot cure the thing in the room. You can only refuse to leave it.</w:t>
-      </w:r>
-    </w:p>
-    <w:p>
-      <w:pPr>
-        <w:pStyle w:val="BodyText"/>
-      </w:pPr>
-      <w:r>
-        <w:t xml:space="preserve">What you can do is stay. Not fix, not control, not cure. Stay. Set the boundary that keeps you whole, leave the door open a crack, and be there in the ways that don’t cost you your own life. If you are not safe, the boundary is distance — my mother saved two boys by leaving.</w:t>
+        <w:t xml:space="preserve">For most of my life I wore a mask. Moving as much as I did as a kid — Mexico to New Jersey, town to town, later across the country — taught me one trick I used everywhere: read the room, become what it wanted, and hope that version got to stay. I got good at it. I performed a life that looked like success and kept the real inventory hidden. Even sober, even happy, I managed a careful image, online and off, and I called it protection.</w:t>
+      </w:r>
+    </w:p>
+    <w:p>
+      <w:pPr>
+        <w:pStyle w:val="BodyText"/>
+      </w:pPr>
+      <w:r>
+        <w:t xml:space="preserve">Writing this book took the mask off. Putting these years on the page, the parts I was proud of and the parts I’d spent decades hiding, I found there was nothing left to protect. The fear I’d built my whole life around — that if people saw the real thing, they’d turn away — was the lie. What replaced it is quieter than relief. It’s peace. For the first time, I’m not performing Rob Brizzi. I’m just him. That is what writing this cost me, and what it gave back.</w:t>
+      </w:r>
+    </w:p>
+    <w:p>
+      <w:pPr>
+        <w:pStyle w:val="BodyText"/>
+      </w:pPr>
+      <w:r>
+        <w:t xml:space="preserve">This is a true story, told from memory. Dialogue has been reconstructed as faithfully as memory allows; it keeps the substance of what was said, if not always the exact words. Some names and identifying details have been changed to protect privacy, above all those of the patients and families I served in home health and hospice, whose hardest days deserve protection, not exposure. Where the sober men and women of the rooms appear by their real names, it is with their permission; others have been renamed. A few of the rooms I describe from my work are composites of many rooms, for the same reason. Nothing in these pages was invented to sharpen the story. My mother, who is all over this book, checked more of these memories than anyone. Whatever I still got wrong is mine.</w:t>
       </w:r>
     </w:p>
     <w:bookmarkEnd w:id="69"/>
-    <w:bookmarkStart w:id="70" w:name="lous-way"/>
+    <w:bookmarkStart w:id="70" w:name="acknowledgments"/>
     <w:p>
       <w:pPr>
         <w:pStyle w:val="Heading1"/>
@@ -15206,7 +14824,7 @@
           <w:bCs/>
           <w:b/>
         </w:rPr>
-        <w:t xml:space="preserve">LOU’S WAY</w:t>
+        <w:t xml:space="preserve">ACKNOWLEDGMENTS</w:t>
       </w:r>
     </w:p>
     <w:p>
@@ -15214,83 +14832,117 @@
         <w:pStyle w:val="FirstParagraph"/>
       </w:pPr>
       <w:r>
-        <w:t xml:space="preserve">Not things he said. Things he did, distilled. If you asked me what Lou knew, this is it.</w:t>
-      </w:r>
-    </w:p>
-    <w:p>
-      <w:pPr>
-        <w:pStyle w:val="BodyText"/>
-      </w:pPr>
-      <w:r>
-        <w:t xml:space="preserve">He showed up before he explained.</w:t>
-      </w:r>
-    </w:p>
-    <w:p>
-      <w:pPr>
-        <w:pStyle w:val="BodyText"/>
-      </w:pPr>
-      <w:r>
-        <w:t xml:space="preserve">He helped without keeping score.</w:t>
-      </w:r>
-    </w:p>
-    <w:p>
-      <w:pPr>
-        <w:pStyle w:val="BodyText"/>
-      </w:pPr>
-      <w:r>
-        <w:t xml:space="preserve">He believed love was proven in repetition.</w:t>
-      </w:r>
-    </w:p>
-    <w:p>
-      <w:pPr>
-        <w:pStyle w:val="BodyText"/>
-      </w:pPr>
-      <w:r>
-        <w:t xml:space="preserve">He never confused disappointment with abandonment.</w:t>
-      </w:r>
-    </w:p>
-    <w:p>
-      <w:pPr>
-        <w:pStyle w:val="BodyText"/>
-      </w:pPr>
-      <w:r>
-        <w:t xml:space="preserve">He respected people who knew how to do their job.</w:t>
-      </w:r>
-    </w:p>
-    <w:p>
-      <w:pPr>
-        <w:pStyle w:val="BodyText"/>
-      </w:pPr>
-      <w:r>
-        <w:t xml:space="preserve">He could enjoy the game even when the season was lost.</w:t>
-      </w:r>
-    </w:p>
-    <w:p>
-      <w:pPr>
-        <w:pStyle w:val="BodyText"/>
-      </w:pPr>
-      <w:r>
-        <w:t xml:space="preserve">He still wanted to be useful, all the way to the end.</w:t>
-      </w:r>
-    </w:p>
-    <w:p>
-      <w:pPr>
-        <w:pStyle w:val="BodyText"/>
-      </w:pPr>
-      <w:r>
-        <w:t xml:space="preserve">He found the doorway you were willing to walk through.</w:t>
-      </w:r>
-    </w:p>
-    <w:p>
-      <w:pPr>
-        <w:pStyle w:val="BodyText"/>
-      </w:pPr>
-      <w:r>
-        <w:t xml:space="preserve">He stayed.</w:t>
+        <w:t xml:space="preserve">Hope. You tilted your head, said</w:t>
+      </w:r>
+      <w:r>
+        <w:t xml:space="preserve"> </w:t>
+      </w:r>
+      <w:r>
+        <w:t xml:space="preserve">“</w:t>
+      </w:r>
+      <w:r>
+        <w:t xml:space="preserve">We?</w:t>
+      </w:r>
+      <w:r>
+        <w:t xml:space="preserve">”</w:t>
+      </w:r>
+      <w:r>
+        <w:t xml:space="preserve"> </w:t>
+      </w:r>
+      <w:r>
+        <w:t xml:space="preserve">and never stopped meaning it. You read every page of this book and told me you were proud of me. That’s the only review I’ll ever need.</w:t>
+      </w:r>
+    </w:p>
+    <w:p>
+      <w:pPr>
+        <w:pStyle w:val="BodyText"/>
+      </w:pPr>
+      <w:r>
+        <w:t xml:space="preserve">My mother, who carried two boys out of Mexico City and then checked more of these memories than anyone. This book is half hers.</w:t>
+      </w:r>
+    </w:p>
+    <w:p>
+      <w:pPr>
+        <w:pStyle w:val="BodyText"/>
+      </w:pPr>
+      <w:r>
+        <w:t xml:space="preserve">Chris. My brother, my keeper. You know what you said to me that night. It worked.</w:t>
+      </w:r>
+    </w:p>
+    <w:p>
+      <w:pPr>
+        <w:pStyle w:val="BodyText"/>
+      </w:pPr>
+      <w:r>
+        <w:t xml:space="preserve">Jon, Lisa, and Joel — we shared him. I know what we lost.</w:t>
+      </w:r>
+    </w:p>
+    <w:p>
+      <w:pPr>
+        <w:pStyle w:val="BodyText"/>
+      </w:pPr>
+      <w:r>
+        <w:t xml:space="preserve">The men God put in front of me: Andy, Bob, Mager, Matt, and Quint. You walked into the room. So did I.</w:t>
+      </w:r>
+    </w:p>
+    <w:p>
+      <w:pPr>
+        <w:pStyle w:val="BodyText"/>
+      </w:pPr>
+      <w:r>
+        <w:t xml:space="preserve">Dave Meyer, for thirty-five years of friendship and for the words that open this book.</w:t>
+      </w:r>
+    </w:p>
+    <w:p>
+      <w:pPr>
+        <w:pStyle w:val="BodyText"/>
+      </w:pPr>
+      <w:r>
+        <w:t xml:space="preserve">Brenda Jahn, one of the best managers I ever worked for. She believed in me and pushed me, and it prepared me for everything that came after.</w:t>
+      </w:r>
+    </w:p>
+    <w:p>
+      <w:pPr>
+        <w:pStyle w:val="BodyText"/>
+      </w:pPr>
+      <w:r>
+        <w:t xml:space="preserve">Dr. Huet, and every nurse, aide, chaplain, and social worker I get to stand beside in the last chapter. You taught me what showing up looks like when it’s a profession.</w:t>
+      </w:r>
+    </w:p>
+    <w:p>
+      <w:pPr>
+        <w:pStyle w:val="BodyText"/>
+      </w:pPr>
+      <w:r>
+        <w:t xml:space="preserve">Scott, my editor, who made these pages better and let them stay mine.</w:t>
+      </w:r>
+    </w:p>
+    <w:p>
+      <w:pPr>
+        <w:pStyle w:val="BodyText"/>
+      </w:pPr>
+      <w:r>
+        <w:t xml:space="preserve">Grace Nobrega, for the cover design.</w:t>
+      </w:r>
+    </w:p>
+    <w:p>
+      <w:pPr>
+        <w:pStyle w:val="BodyText"/>
+      </w:pPr>
+      <w:r>
+        <w:t xml:space="preserve">The rooms, and the people in them, who keep teaching me that the door only had to open once.</w:t>
+      </w:r>
+    </w:p>
+    <w:p>
+      <w:pPr>
+        <w:pStyle w:val="BodyText"/>
+      </w:pPr>
+      <w:r>
+        <w:t xml:space="preserve">And Dad. I kept the promise.</w:t>
       </w:r>
     </w:p>
     <w:bookmarkEnd w:id="70"/>
-    <w:bookmarkStart w:id="71" w:name="authors-note"/>
+    <w:bookmarkStart w:id="71" w:name="a-note-to-the-one-who-loves-an-addict"/>
     <w:p>
       <w:pPr>
         <w:pStyle w:val="Heading1"/>
@@ -15300,7 +14952,7 @@
           <w:bCs/>
           <w:b/>
         </w:rPr>
-        <w:t xml:space="preserve">AUTHOR’S NOTE</w:t>
+        <w:t xml:space="preserve">A NOTE TO THE ONE WHO LOVES AN ADDICT</w:t>
       </w:r>
     </w:p>
     <w:p>
@@ -15308,27 +14960,51 @@
         <w:pStyle w:val="FirstParagraph"/>
       </w:pPr>
       <w:r>
-        <w:t xml:space="preserve">For most of my life I wore a mask. Moving as much as I did as a kid — Mexico to New Jersey, town to town, later across the country — taught me one trick I used everywhere: read the room, become what it wanted, and hope that version got to stay. I got good at it. I performed a life that looked like success and kept the real inventory hidden. Even sober, even happy, I managed a careful image, online and off, and I called it protection.</w:t>
-      </w:r>
-    </w:p>
-    <w:p>
-      <w:pPr>
-        <w:pStyle w:val="BodyText"/>
-      </w:pPr>
-      <w:r>
-        <w:t xml:space="preserve">Writing this book took the mask off. Putting these years on the page, the parts I was proud of and the parts I’d spent decades hiding, I found there was nothing left to protect. The fear I’d built my whole life around — that if people saw the real thing, they’d turn away — was the lie. What replaced it is quieter than relief. It’s peace. For the first time, I’m not performing Rob Brizzi. I’m just him. That is what writing this cost me, and what it gave back.</w:t>
-      </w:r>
-    </w:p>
-    <w:p>
-      <w:pPr>
-        <w:pStyle w:val="BodyText"/>
-      </w:pPr>
-      <w:r>
-        <w:t xml:space="preserve">This is a true story, told from memory. Dialogue has been reconstructed as faithfully as memory allows; it keeps the substance of what was said, if not always the exact words. Some names and identifying details have been changed to protect privacy, above all those of the patients and families I served in home health and hospice, whose hardest days deserve protection, not exposure. Where the sober men and women of the rooms appear by their real names, it is with their permission; others have been renamed. A few of the rooms I describe from my work are composites of many rooms, for the same reason. Nothing in these pages was invented to sharpen the story. My mother, who is all over this book, checked more of these memories than anyone. Whatever I still got wrong is mine.</w:t>
+        <w:t xml:space="preserve">If you picked up this book because you love someone who is using, or you lost someone who did, I want to say something to you now that the story is done.</w:t>
+      </w:r>
+    </w:p>
+    <w:p>
+      <w:pPr>
+        <w:pStyle w:val="BodyText"/>
+      </w:pPr>
+      <w:r>
+        <w:t xml:space="preserve">It isn’t your fault.</w:t>
+      </w:r>
+    </w:p>
+    <w:p>
+      <w:pPr>
+        <w:pStyle w:val="BodyText"/>
+      </w:pPr>
+      <w:r>
+        <w:t xml:space="preserve">I know you’ve tried. I know you’ve lain awake turning someone else’s life over and over, looking for the thing you missed. I was the person on the other end of those nights. My mother wired me money she told herself was for rent. My father drove a truck across the state to haul me home. None of it made me stop. Not because they failed. Because it wasn’t theirs to win. But hear the other half, because it’s just as true: none of it was wasted either. Every one of those rescues bought time, and time was the only thing that could still help me. You cannot make them stop. You can help them live until they do.</w:t>
+      </w:r>
+    </w:p>
+    <w:p>
+      <w:pPr>
+        <w:pStyle w:val="BodyText"/>
+      </w:pPr>
+      <w:r>
+        <w:t xml:space="preserve">I have been on both sides of this. I did not understand addiction as a disease at first. I understood it as a disappearance. One day the person you love is still there, sitting across from you, using the same voice, wearing the same face, and somehow already slipping away. You keep reaching for the version of them you remember. You keep thinking love should be enough. Then life teaches you, slowly and brutally, that love is not a cure. It won’t make them stop. What it does is keep you from leaving.</w:t>
+      </w:r>
+    </w:p>
+    <w:p>
+      <w:pPr>
+        <w:pStyle w:val="BodyText"/>
+      </w:pPr>
+      <w:r>
+        <w:t xml:space="preserve">Years later I would learn that this is also the whole of hospice. You cannot cure the thing in the room. You can only refuse to leave it.</w:t>
+      </w:r>
+    </w:p>
+    <w:p>
+      <w:pPr>
+        <w:pStyle w:val="BodyText"/>
+      </w:pPr>
+      <w:r>
+        <w:t xml:space="preserve">What you can do is stay. Not fix, not control, not cure. Stay. Set the boundary that keeps you whole, leave the door open a crack, and be there in the ways that don’t cost you your own life. If you are not safe, the boundary is distance — my mother saved two boys by leaving.</w:t>
       </w:r>
     </w:p>
     <w:bookmarkEnd w:id="71"/>
-    <w:bookmarkStart w:id="72" w:name="acknowledgments"/>
+    <w:bookmarkStart w:id="72" w:name="lous-way"/>
     <w:p>
       <w:pPr>
         <w:pStyle w:val="Heading1"/>
@@ -15338,7 +15014,7 @@
           <w:bCs/>
           <w:b/>
         </w:rPr>
-        <w:t xml:space="preserve">ACKNOWLEDGMENTS</w:t>
+        <w:t xml:space="preserve">LOU’S WAY</w:t>
       </w:r>
     </w:p>
     <w:p>
@@ -15346,113 +15022,79 @@
         <w:pStyle w:val="FirstParagraph"/>
       </w:pPr>
       <w:r>
-        <w:t xml:space="preserve">Hope. You tilted your head, said</w:t>
-      </w:r>
-      <w:r>
-        <w:t xml:space="preserve"> </w:t>
-      </w:r>
-      <w:r>
-        <w:t xml:space="preserve">“</w:t>
-      </w:r>
-      <w:r>
-        <w:t xml:space="preserve">We?</w:t>
-      </w:r>
-      <w:r>
-        <w:t xml:space="preserve">”</w:t>
-      </w:r>
-      <w:r>
-        <w:t xml:space="preserve"> </w:t>
-      </w:r>
-      <w:r>
-        <w:t xml:space="preserve">and never stopped meaning it. You read every page of this book and told me you were proud of me. That’s the only review I’ll ever need.</w:t>
-      </w:r>
-    </w:p>
-    <w:p>
-      <w:pPr>
-        <w:pStyle w:val="BodyText"/>
-      </w:pPr>
-      <w:r>
-        <w:t xml:space="preserve">My mother, who carried two boys out of Mexico City and then checked more of these memories than anyone. This book is half hers.</w:t>
-      </w:r>
-    </w:p>
-    <w:p>
-      <w:pPr>
-        <w:pStyle w:val="BodyText"/>
-      </w:pPr>
-      <w:r>
-        <w:t xml:space="preserve">Chris. My brother, my keeper. You know what you said to me that night. It worked.</w:t>
-      </w:r>
-    </w:p>
-    <w:p>
-      <w:pPr>
-        <w:pStyle w:val="BodyText"/>
-      </w:pPr>
-      <w:r>
-        <w:t xml:space="preserve">Jon, Lisa, and Joel — we shared him. I know what we lost.</w:t>
-      </w:r>
-    </w:p>
-    <w:p>
-      <w:pPr>
-        <w:pStyle w:val="BodyText"/>
-      </w:pPr>
-      <w:r>
-        <w:t xml:space="preserve">The men God put in front of me: Andy, Bob, Mager, Matt, and Quint. You walked into the room. So did I.</w:t>
-      </w:r>
-    </w:p>
-    <w:p>
-      <w:pPr>
-        <w:pStyle w:val="BodyText"/>
-      </w:pPr>
-      <w:r>
-        <w:t xml:space="preserve">Dave Meyer, for thirty-five years of friendship and for the words that open this book.</w:t>
-      </w:r>
-    </w:p>
-    <w:p>
-      <w:pPr>
-        <w:pStyle w:val="BodyText"/>
-      </w:pPr>
-      <w:r>
-        <w:t xml:space="preserve">Brenda Jahn, one of the best managers I ever worked for. She believed in me and pushed me, and it prepared me for everything that came after.</w:t>
-      </w:r>
-    </w:p>
-    <w:p>
-      <w:pPr>
-        <w:pStyle w:val="BodyText"/>
-      </w:pPr>
-      <w:r>
-        <w:t xml:space="preserve">Dr. Huet, and every nurse, aide, chaplain, and social worker I get to stand beside in the last chapter. You taught me what showing up looks like when it’s a profession.</w:t>
-      </w:r>
-    </w:p>
-    <w:p>
-      <w:pPr>
-        <w:pStyle w:val="BodyText"/>
-      </w:pPr>
-      <w:r>
-        <w:t xml:space="preserve">Scott, my editor, who made these pages better and let them stay mine.</w:t>
-      </w:r>
-    </w:p>
-    <w:p>
-      <w:pPr>
-        <w:pStyle w:val="BodyText"/>
-      </w:pPr>
-      <w:r>
-        <w:t xml:space="preserve">Grace Nobrega, for the cover design.</w:t>
-      </w:r>
-    </w:p>
-    <w:p>
-      <w:pPr>
-        <w:pStyle w:val="BodyText"/>
-      </w:pPr>
-      <w:r>
-        <w:t xml:space="preserve">The rooms, and the people in them, who keep teaching me that the door only had to open once.</w:t>
-      </w:r>
-    </w:p>
-    <w:p>
-      <w:pPr>
-        <w:pStyle w:val="BodyText"/>
-      </w:pPr>
-      <w:r>
-        <w:t xml:space="preserve">And Dad. I kept the promise.</w:t>
+        <w:t xml:space="preserve">Not things he said. Things he did, distilled. If you asked me what Lou knew, this is it.</w:t>
+      </w:r>
+    </w:p>
+    <w:p>
+      <w:pPr>
+        <w:pStyle w:val="BodyText"/>
+      </w:pPr>
+      <w:r>
+        <w:t xml:space="preserve">He showed up before he explained.</w:t>
+      </w:r>
+    </w:p>
+    <w:p>
+      <w:pPr>
+        <w:pStyle w:val="BodyText"/>
+      </w:pPr>
+      <w:r>
+        <w:t xml:space="preserve">He helped without keeping score.</w:t>
+      </w:r>
+    </w:p>
+    <w:p>
+      <w:pPr>
+        <w:pStyle w:val="BodyText"/>
+      </w:pPr>
+      <w:r>
+        <w:t xml:space="preserve">He believed love was proven in repetition.</w:t>
+      </w:r>
+    </w:p>
+    <w:p>
+      <w:pPr>
+        <w:pStyle w:val="BodyText"/>
+      </w:pPr>
+      <w:r>
+        <w:t xml:space="preserve">He never confused disappointment with abandonment.</w:t>
+      </w:r>
+    </w:p>
+    <w:p>
+      <w:pPr>
+        <w:pStyle w:val="BodyText"/>
+      </w:pPr>
+      <w:r>
+        <w:t xml:space="preserve">He respected people who knew how to do their job.</w:t>
+      </w:r>
+    </w:p>
+    <w:p>
+      <w:pPr>
+        <w:pStyle w:val="BodyText"/>
+      </w:pPr>
+      <w:r>
+        <w:t xml:space="preserve">He could enjoy the game even when the season was lost.</w:t>
+      </w:r>
+    </w:p>
+    <w:p>
+      <w:pPr>
+        <w:pStyle w:val="BodyText"/>
+      </w:pPr>
+      <w:r>
+        <w:t xml:space="preserve">He still wanted to be useful, all the way to the end.</w:t>
+      </w:r>
+    </w:p>
+    <w:p>
+      <w:pPr>
+        <w:pStyle w:val="BodyText"/>
+      </w:pPr>
+      <w:r>
+        <w:t xml:space="preserve">He found the doorway you were willing to walk through.</w:t>
+      </w:r>
+    </w:p>
+    <w:p>
+      <w:pPr>
+        <w:pStyle w:val="BodyText"/>
+      </w:pPr>
+      <w:r>
+        <w:t xml:space="preserve">He stayed.</w:t>
       </w:r>
     </w:p>
     <w:bookmarkEnd w:id="72"/>
@@ -15771,7 +15413,25 @@
         </w:numPr>
       </w:pPr>
       <w:r>
-        <w:t xml:space="preserve">The book ends with instructions: keep showing up, say the great things while they can still hear you, walk in and let yours find you. Which instruction is yours — and when will you follow it?</w:t>
+        <w:t xml:space="preserve">The last pages of the book are set in the rooms:</w:t>
+      </w:r>
+      <w:r>
+        <w:t xml:space="preserve"> </w:t>
+      </w:r>
+      <w:r>
+        <w:t xml:space="preserve">“</w:t>
+      </w:r>
+      <w:r>
+        <w:t xml:space="preserve">Go to a meeting this week, even if you’re good. Especially if you’re not. Call somebody.</w:t>
+      </w:r>
+      <w:r>
+        <w:t xml:space="preserve">”</w:t>
+      </w:r>
+      <w:r>
+        <w:t xml:space="preserve"> </w:t>
+      </w:r>
+      <w:r>
+        <w:t xml:space="preserve">Who would you call — and when?</w:t>
       </w:r>
     </w:p>
     <w:bookmarkEnd w:id="73"/>

</xml_diff>

<commit_message>
Proofread: close five seams (baseballs teaser, Miami paragraph, Blessings flash-forward, faking-years count, Okay spelling)
Co-Authored-By: Claude Fable 5.1 <noreply@anthropic.com>
Claude-Session: https://claude.ai/code/session_013TTacQAr67Pe2VUwTPop1A
</commit_message>
<xml_diff>
--- a/The_Cardinals_Promise.docx
+++ b/The_Cardinals_Promise.docx
@@ -2984,7 +2984,7 @@
         <w:pStyle w:val="BodyText"/>
       </w:pPr>
       <w:r>
-        <w:t xml:space="preserve">I get it now. I didn’t back then. For me, it started on a Saturday. With a bucket of baseballs.</w:t>
+        <w:t xml:space="preserve">I get it now. I didn’t back then.</w:t>
       </w:r>
     </w:p>
     <w:p>
@@ -5417,7 +5417,7 @@
         <w:pStyle w:val="BodyText"/>
       </w:pPr>
       <w:r>
-        <w:t xml:space="preserve">That was the version of me I cultivated at Miami. Not Claudio. Rob — county wrestling champion, Miami student, American. Nobody here knew who I’d been before I arrived. Being the darker-skinned kid on a mostly white-bread campus gave me something, and I connected in ways that hadn’t come as easily in high school.</w:t>
+        <w:t xml:space="preserve">There was a version of me I cultivated at Miami. Not Claudio. Rob — county wrestling champion, Miami student, American. Nobody here knew who I’d been before I arrived. Being the darker-skinned kid on a mostly white-bread campus gave me something, and I connected in ways that hadn’t come as easily in high school.</w:t>
       </w:r>
     </w:p>
     <w:p>
@@ -6773,7 +6773,7 @@
         <w:pStyle w:val="BodyText"/>
       </w:pPr>
       <w:r>
-        <w:t xml:space="preserve">So I did what I had always done in a room I couldn’t win. I performed. I went to every session. I sat in the circles. I said the things that sounded like progress and filled out the worksheets in full sentences. If they’d asked me to sing Kumbaya, I’d have stood up, held hands with those next to me, and led the group in full choral production. I had more than two years of faking my life. Those around me probably thought I was the most committed, open person they’d seen in these rooms. All an act. Inside I counted days, and each one brought me one day closer to when I could use again.</w:t>
+        <w:t xml:space="preserve">So I did what I had always done in a room I couldn’t win. I performed. I went to every session. I sat in the circles. I said the things that sounded like progress and filled out the worksheets in full sentences. If they’d asked me to sing Kumbaya, I’d have stood up, held hands with those next to me, and led the group in full choral production. I had years of faking my life. Those around me probably thought I was the most committed, open person they’d seen in these rooms. All an act. Inside I counted days, and each one brought me one day closer to when I could use again.</w:t>
       </w:r>
     </w:p>
     <w:p>
@@ -9568,7 +9568,7 @@
         <w:t xml:space="preserve">“</w:t>
       </w:r>
       <w:r>
-        <w:t xml:space="preserve">Ok, once I make more—</w:t>
+        <w:t xml:space="preserve">Okay, once I make more—</w:t>
       </w:r>
       <w:r>
         <w:t xml:space="preserve">”</w:t>
@@ -11283,15 +11283,7 @@
         <w:pStyle w:val="FirstParagraph"/>
       </w:pPr>
       <w:r>
-        <w:t xml:space="preserve">When Lou poured coffee that day, he poured it for himself and for Hope. Not for me. I noticed, and I understood it was the closest thing to a blessing he was going to give.</w:t>
-      </w:r>
-    </w:p>
-    <w:p>
-      <w:pPr>
-        <w:pStyle w:val="BodyText"/>
-      </w:pPr>
-      <w:r>
-        <w:t xml:space="preserve">Before any of that, before the wedding, there was the day she met Lou. I was nervous. Not the wrestling-match kind. Not the holding-cell kind. This was precise, like one wrong word would miss the point.</w:t>
+        <w:t xml:space="preserve">Then there was the day she met Lou. I was nervous. Not the wrestling-match kind. Not the holding-cell kind. This was precise, like one wrong word would miss the point.</w:t>
       </w:r>
     </w:p>
     <w:p>

</xml_diff>

<commit_message>
Chapter 31: December 23–25 rewritten as a full scene in the author's voice, still bracketed and highlighted as a placeholder
Co-Authored-By: Claude Fable 5.1 <noreply@anthropic.com>
Claude-Session: https://claude.ai/code/session_013TTacQAr67Pe2VUwTPop1A
</commit_message>
<xml_diff>
--- a/The_Cardinals_Promise.docx
+++ b/The_Cardinals_Promise.docx
@@ -13511,7 +13511,7 @@
           <w:i/>
           <w:highlight w:val="yellow"/>
         </w:rPr>
-        <w:t xml:space="preserve">[PLACEHOLDER. The scene that follows holds the shape of December 23 to 25 until Rob replaces it with what happened. The details in it are drafted from what the book already says, not from memory.]</w:t>
+        <w:t xml:space="preserve">[PLACEHOLDER. December 23 to 25, written in Rob’s voice from what the book establishes. Not yet his memory. He replaces what is wrong.]</w:t>
       </w:r>
     </w:p>
     <w:p>
@@ -13522,14 +13522,24 @@
         <w:rPr>
           <w:highlight w:val="yellow"/>
         </w:rPr>
-        <w:t xml:space="preserve">I called Donna back that Tuesday night, after my mother had gone to bed. I asked her the questions I ask strangers. Is he comfortable. Is he eating. Who’s with him. She answered every one, and then she went quiet. I told her we’d be down Friday.</w:t>
-      </w:r>
+        <w:t xml:space="preserve">Donna called Tuesday afternoon. I was in the car outside a facility in Cary, between one visit and the next, and I watched her name light up and let it go. I told myself I’d call her from the house. What I did at the house was help my mother up the front steps, one at a time, her hand on my forearm and the tremor coming through it, and by the time she was settled in the good chair the phone was on the counter face down and I had a reason to leave it there.</w:t>
+      </w:r>
+    </w:p>
+    <w:p>
+      <w:pPr>
+        <w:pStyle w:val="BodyText"/>
+      </w:pPr>
       <w:r>
         <w:rPr>
           <w:highlight w:val="yellow"/>
         </w:rPr>
-        <w:t xml:space="preserve"> </w:t>
-      </w:r>
+        <w:t xml:space="preserve">I called Donna back after nine, from the garage, with the door down.</w:t>
+      </w:r>
+    </w:p>
+    <w:p>
+      <w:pPr>
+        <w:pStyle w:val="BodyText"/>
+      </w:pPr>
       <w:r>
         <w:rPr>
           <w:highlight w:val="yellow"/>
@@ -13540,7 +13550,7 @@
         <w:rPr>
           <w:highlight w:val="yellow"/>
         </w:rPr>
-        <w:t xml:space="preserve">Okay, honey,</w:t>
+        <w:t xml:space="preserve">They admitted him this afternoon,</w:t>
       </w:r>
       <w:r>
         <w:rPr>
@@ -13558,35 +13568,189 @@
         <w:rPr>
           <w:highlight w:val="yellow"/>
         </w:rPr>
-        <w:t xml:space="preserve">she said. I put the phone face down on the kitchen counter, and that is more or less where it stayed for two days.</w:t>
-      </w:r>
-    </w:p>
-    <w:p>
-      <w:pPr>
-        <w:pStyle w:val="BodyText"/>
-      </w:pPr>
+        <w:t xml:space="preserve">she said.</w:t>
+      </w:r>
       <w:r>
         <w:rPr>
           <w:highlight w:val="yellow"/>
         </w:rPr>
-        <w:t xml:space="preserve">My mother was in town. She has Parkinson’s now, and getting to me had cost her every ounce of energy she had. Christmas Eve she sat on a stool in our kitchen with a cup of tea she’d let go cold, both hands around it to keep them still, and watched Hope cook. I stood there and let her. Twice she asked how Dad was doing.</w:t>
+        <w:t xml:space="preserve"> </w:t>
       </w:r>
       <w:r>
         <w:rPr>
           <w:highlight w:val="yellow"/>
         </w:rPr>
-        <w:t xml:space="preserve"> </w:t>
+        <w:t xml:space="preserve">“</w:t>
       </w:r>
       <w:r>
         <w:rPr>
           <w:highlight w:val="yellow"/>
         </w:rPr>
-        <w:t xml:space="preserve">“</w:t>
+        <w:t xml:space="preserve">It’s pneumonia, Rob. It’s in both lungs.</w:t>
       </w:r>
       <w:r>
         <w:rPr>
           <w:highlight w:val="yellow"/>
         </w:rPr>
+        <w:t xml:space="preserve">”</w:t>
+      </w:r>
+      <w:r>
+        <w:rPr>
+          <w:highlight w:val="yellow"/>
+        </w:rPr>
+        <w:t xml:space="preserve"> </w:t>
+      </w:r>
+      <w:r>
+        <w:rPr>
+          <w:highlight w:val="yellow"/>
+        </w:rPr>
+        <w:t xml:space="preserve">She told me his oxygen number. I knew what the number meant. I ask about that number for a living.</w:t>
+      </w:r>
+      <w:r>
+        <w:rPr>
+          <w:highlight w:val="yellow"/>
+        </w:rPr>
+        <w:t xml:space="preserve"> </w:t>
+      </w:r>
+      <w:r>
+        <w:rPr>
+          <w:highlight w:val="yellow"/>
+        </w:rPr>
+        <w:t xml:space="preserve">“</w:t>
+      </w:r>
+      <w:r>
+        <w:rPr>
+          <w:highlight w:val="yellow"/>
+        </w:rPr>
+        <w:t xml:space="preserve">He’s tired, honey. He’s real tired.</w:t>
+      </w:r>
+      <w:r>
+        <w:rPr>
+          <w:highlight w:val="yellow"/>
+        </w:rPr>
+        <w:t xml:space="preserve">”</w:t>
+      </w:r>
+      <w:r>
+        <w:rPr>
+          <w:highlight w:val="yellow"/>
+        </w:rPr>
+        <w:t xml:space="preserve"> </w:t>
+      </w:r>
+      <w:r>
+        <w:rPr>
+          <w:highlight w:val="yellow"/>
+        </w:rPr>
+        <w:t xml:space="preserve">Then she said the thing I’ve heard a hundred wives say, and I had never once heard it aimed at me.</w:t>
+      </w:r>
+      <w:r>
+        <w:rPr>
+          <w:highlight w:val="yellow"/>
+        </w:rPr>
+        <w:t xml:space="preserve"> </w:t>
+      </w:r>
+      <w:r>
+        <w:rPr>
+          <w:highlight w:val="yellow"/>
+        </w:rPr>
+        <w:t xml:space="preserve">“</w:t>
+      </w:r>
+      <w:r>
+        <w:rPr>
+          <w:highlight w:val="yellow"/>
+        </w:rPr>
+        <w:t xml:space="preserve">You don’t have to come tonight.</w:t>
+      </w:r>
+      <w:r>
+        <w:rPr>
+          <w:highlight w:val="yellow"/>
+        </w:rPr>
+        <w:t xml:space="preserve">”</w:t>
+      </w:r>
+    </w:p>
+    <w:p>
+      <w:pPr>
+        <w:pStyle w:val="BodyText"/>
+      </w:pPr>
+      <w:r>
+        <w:rPr>
+          <w:highlight w:val="yellow"/>
+        </w:rPr>
+        <w:t xml:space="preserve">I asked her the questions I ask strangers. Is he comfortable. Is he eating. Who’s there. Lisa was on her way. Chris was coming Wednesday. I said we’d be down Friday, that Mom was here and needed a day. Donna said okay. She did not say it the way you say okay when you agree. She said it the way you say it when you’ve decided not to fight a man about his own father.</w:t>
+      </w:r>
+    </w:p>
+    <w:p>
+      <w:pPr>
+        <w:pStyle w:val="BodyText"/>
+      </w:pPr>
+      <w:r>
+        <w:rPr>
+          <w:highlight w:val="yellow"/>
+        </w:rPr>
+        <w:t xml:space="preserve">I came back in and Hope looked up from the stove and asked me with her face.</w:t>
+      </w:r>
+      <w:r>
+        <w:rPr>
+          <w:highlight w:val="yellow"/>
+        </w:rPr>
+        <w:t xml:space="preserve"> </w:t>
+      </w:r>
+      <w:r>
+        <w:rPr>
+          <w:highlight w:val="yellow"/>
+        </w:rPr>
+        <w:t xml:space="preserve">“</w:t>
+      </w:r>
+      <w:r>
+        <w:rPr>
+          <w:highlight w:val="yellow"/>
+        </w:rPr>
+        <w:t xml:space="preserve">Friday,</w:t>
+      </w:r>
+      <w:r>
+        <w:rPr>
+          <w:highlight w:val="yellow"/>
+        </w:rPr>
+        <w:t xml:space="preserve">”</w:t>
+      </w:r>
+      <w:r>
+        <w:rPr>
+          <w:highlight w:val="yellow"/>
+        </w:rPr>
+        <w:t xml:space="preserve"> </w:t>
+      </w:r>
+      <w:r>
+        <w:rPr>
+          <w:highlight w:val="yellow"/>
+        </w:rPr>
+        <w:t xml:space="preserve">I said. She needs a plan, and I had given her one. She didn’t ask whether it was the right one.</w:t>
+      </w:r>
+    </w:p>
+    <w:p>
+      <w:pPr>
+        <w:pStyle w:val="BodyText"/>
+      </w:pPr>
+      <w:r>
+        <w:rPr>
+          <w:highlight w:val="yellow"/>
+        </w:rPr>
+        <w:t xml:space="preserve">Christmas Eve my mother sat on a stool at the kitchen island and told Hope how to cut the peppers. Hope let her. That is something I love about my wife, that she can be told how to cut a pepper by a woman whose hands can’t hold the knife, and make it look like she needed the help. Twice my mother asked how Dad was doing.</w:t>
+      </w:r>
+      <w:r>
+        <w:rPr>
+          <w:highlight w:val="yellow"/>
+        </w:rPr>
+        <w:t xml:space="preserve"> </w:t>
+      </w:r>
+      <w:r>
+        <w:rPr>
+          <w:highlight w:val="yellow"/>
+        </w:rPr>
+        <w:t xml:space="preserve">“</w:t>
+      </w:r>
+      <w:r>
+        <w:rPr>
+          <w:highlight w:val="yellow"/>
+        </w:rPr>
         <w:t xml:space="preserve">Resting,</w:t>
       </w:r>
       <w:r>
@@ -13605,7 +13769,7 @@
         <w:rPr>
           <w:highlight w:val="yellow"/>
         </w:rPr>
-        <w:t xml:space="preserve">I said. It was the kind of word I hear families use, and I heard myself use it.</w:t>
+        <w:t xml:space="preserve">I said. It’s a word I hear families use. I heard myself use it.</w:t>
       </w:r>
     </w:p>
     <w:p>
@@ -13616,57 +13780,162 @@
         <w:rPr>
           <w:highlight w:val="yellow"/>
         </w:rPr>
-        <w:t xml:space="preserve">Around four I went out to the car in the driveway and sat in it with the engine off. Eighteen years earlier, in the worst of it, I used to drive past his house in Pensacola, see him out front washing his car, and wave and keep going, because pulling in meant questions. I knew how to do that. I was doing it from seven hundred miles away. Hope came out and stood by the window and didn’t knock. She just stayed until I came in.</w:t>
-      </w:r>
-    </w:p>
-    <w:p>
-      <w:pPr>
-        <w:pStyle w:val="BodyText"/>
-      </w:pPr>
+        <w:t xml:space="preserve">We went to the candlelight service at seven. My mother wanted to, and I wanted her to have it. We sat near the back so she wouldn’t have to stand long. Somewhere in</w:t>
+      </w:r>
       <w:r>
         <w:rPr>
           <w:highlight w:val="yellow"/>
         </w:rPr>
-        <w:t xml:space="preserve">That night, they put him on a morphine drip. Chris texted it. He was in the hospital, on comfort care — not hospice; it went that fast. I knew what the drip meant — it’s my work. Morphine at the end doesn’t take anyone. It eases the pain and the hunger for air while the dying does what it was already doing. The drip didn’t tell me what was coming. It told me where he already was. Comfort was the assignment now. I did not say any of that out loud in my own kitchen. I put the phone back face down. Part of the reason was simpler than I’ve made it sound, and harder to admit. I did not want my last memory of my father to be tubes in his nose. He had been bigger than two cancers and a scare. I couldn’t let the man in that bed become the last picture I kept of him. It was selfish. I’m sorry it was that way.</w:t>
-      </w:r>
-    </w:p>
-    <w:p>
-      <w:pPr>
-        <w:pStyle w:val="BodyText"/>
-      </w:pPr>
+        <w:t xml:space="preserve"> </w:t>
+      </w:r>
       <w:r>
         <w:rPr>
           <w:highlight w:val="yellow"/>
         </w:rPr>
-        <w:t xml:space="preserve">Christmas morning I was up before it was light. Mager called at the usual time, and we prayed the way we always do, a few plain sentences, and I did not tell him. I looked at the phone. Nothing from Chris since the night before. The texting had stopped, and the silence had a shape. I made coffee I didn’t drink. I heard my mother’s door.</w:t>
-      </w:r>
-    </w:p>
-    <w:p>
-      <w:pPr>
-        <w:pStyle w:val="BodyText"/>
-      </w:pPr>
+        <w:t xml:space="preserve">“</w:t>
+      </w:r>
       <w:r>
         <w:rPr>
           <w:highlight w:val="yellow"/>
         </w:rPr>
-        <w:t xml:space="preserve">Then the phone rang. Chris.</w:t>
+        <w:t xml:space="preserve">Silent Night,</w:t>
       </w:r>
       <w:r>
         <w:rPr>
           <w:highlight w:val="yellow"/>
         </w:rPr>
-        <w:t xml:space="preserve"> </w:t>
+        <w:t xml:space="preserve">”</w:t>
       </w:r>
       <w:r>
         <w:rPr>
           <w:highlight w:val="yellow"/>
         </w:rPr>
-        <w:t xml:space="preserve">“</w:t>
+        <w:t xml:space="preserve"> </w:t>
       </w:r>
       <w:r>
         <w:rPr>
           <w:highlight w:val="yellow"/>
         </w:rPr>
+        <w:t xml:space="preserve">with the little candle in my hand, the phone buzzed against my leg. I read it under the hymnal. Chris. They’d started a morphine drip. Comfort care. He was in the hospital, not hospice; it went that fast.</w:t>
+      </w:r>
+    </w:p>
+    <w:p>
+      <w:pPr>
+        <w:pStyle w:val="BodyText"/>
+      </w:pPr>
+      <w:r>
+        <w:rPr>
+          <w:highlight w:val="yellow"/>
+        </w:rPr>
+        <w:t xml:space="preserve">I know what a drip is. I explain it to families in their living rooms. It doesn’t take anyone. It eases the pain and the hunger for air while the dying does what it was already doing. I have said that sentence to strangers with a steady voice. I stood in a church holding a candle and could not say it to myself. I put the phone back in my pocket and sang the last verse with my mother, who didn’t know, and Hope, who did.</w:t>
+      </w:r>
+    </w:p>
+    <w:p>
+      <w:pPr>
+        <w:pStyle w:val="BodyText"/>
+      </w:pPr>
+      <w:r>
+        <w:rPr>
+          <w:highlight w:val="yellow"/>
+        </w:rPr>
+        <w:t xml:space="preserve">In the car she asked me if I wanted to drive down that night. It’s eleven hours. I said no. I said he always comes back. I said it out loud, in the car, to my wife, on Christmas Eve, and she let me.</w:t>
+      </w:r>
+    </w:p>
+    <w:p>
+      <w:pPr>
+        <w:pStyle w:val="BodyText"/>
+      </w:pPr>
+      <w:r>
+        <w:rPr>
+          <w:highlight w:val="yellow"/>
+        </w:rPr>
+        <w:t xml:space="preserve">Here is the part I can’t make sound better than it was. I did not want my last memory of my father to be tubes in his nose. He had been bigger than two cancers and a scare. I couldn’t let the man in that bed be the last picture I kept of him. So I kept the picture I had, from the breakfast in the fall, with the collar loose on his neck, and I stayed in Raleigh. It was selfish. I knew it while I was doing it. I sit with families who do the same math, and I have never once judged them for it.</w:t>
+      </w:r>
+    </w:p>
+    <w:p>
+      <w:pPr>
+        <w:pStyle w:val="BodyText"/>
+      </w:pPr>
+      <w:r>
+        <w:rPr>
+          <w:highlight w:val="yellow"/>
+        </w:rPr>
+        <w:t xml:space="preserve">Christmas morning I was up at five. I did not turn the phone over. I made coffee and stood at the window. The neighbors across the street had put a bicycle with a bow on it in the driveway sometime in the night. I looked at the phone at six. Nothing from Chris since the church. The texting had stopped, and the silence had a shape.</w:t>
+      </w:r>
+    </w:p>
+    <w:p>
+      <w:pPr>
+        <w:pStyle w:val="BodyText"/>
+      </w:pPr>
+      <w:r>
+        <w:rPr>
+          <w:highlight w:val="yellow"/>
+        </w:rPr>
+        <w:t xml:space="preserve">Mager called at his usual time. We prayed the way we always do, a few plain sentences, thank you and help. I told him. He didn’t say anything about God. He said,</w:t>
+      </w:r>
+      <w:r>
+        <w:rPr>
+          <w:highlight w:val="yellow"/>
+        </w:rPr>
+        <w:t xml:space="preserve"> </w:t>
+      </w:r>
+      <w:r>
+        <w:rPr>
+          <w:highlight w:val="yellow"/>
+        </w:rPr>
+        <w:t xml:space="preserve">“</w:t>
+      </w:r>
+      <w:r>
+        <w:rPr>
+          <w:highlight w:val="yellow"/>
+        </w:rPr>
+        <w:t xml:space="preserve">Then you already know, brother.</w:t>
+      </w:r>
+      <w:r>
+        <w:rPr>
+          <w:highlight w:val="yellow"/>
+        </w:rPr>
+        <w:t xml:space="preserve">”</w:t>
+      </w:r>
+      <w:r>
+        <w:rPr>
+          <w:highlight w:val="yellow"/>
+        </w:rPr>
+        <w:t xml:space="preserve"> </w:t>
+      </w:r>
+      <w:r>
+        <w:rPr>
+          <w:highlight w:val="yellow"/>
+        </w:rPr>
+        <w:t xml:space="preserve">I said I did.</w:t>
+      </w:r>
+    </w:p>
+    <w:p>
+      <w:pPr>
+        <w:pStyle w:val="BodyText"/>
+      </w:pPr>
+      <w:r>
+        <w:rPr>
+          <w:highlight w:val="yellow"/>
+        </w:rPr>
+        <w:t xml:space="preserve">The call came at twenty to nine. Chris.</w:t>
+      </w:r>
+      <w:r>
+        <w:rPr>
+          <w:highlight w:val="yellow"/>
+        </w:rPr>
+        <w:t xml:space="preserve"> </w:t>
+      </w:r>
+      <w:r>
+        <w:rPr>
+          <w:highlight w:val="yellow"/>
+        </w:rPr>
+        <w:t xml:space="preserve">“</w:t>
+      </w:r>
+      <w:r>
+        <w:rPr>
+          <w:highlight w:val="yellow"/>
+        </w:rPr>
         <w:t xml:space="preserve">Rob.</w:t>
       </w:r>
       <w:r>
@@ -13685,18 +13954,148 @@
         <w:rPr>
           <w:highlight w:val="yellow"/>
         </w:rPr>
-        <w:t xml:space="preserve">He didn’t have to finish it, and he did anyway. Our father was gone.</w:t>
-      </w:r>
-    </w:p>
-    <w:p>
-      <w:pPr>
-        <w:pStyle w:val="BodyText"/>
-      </w:pPr>
+        <w:t xml:space="preserve">Then a breath.</w:t>
+      </w:r>
       <w:r>
         <w:rPr>
           <w:highlight w:val="yellow"/>
         </w:rPr>
-        <w:t xml:space="preserve">I don’t know how long I stood there. I went and told my mother. She reached for my hand. Hope had come in behind me. I went back out to the car, and this time I didn’t sit in it. I stood in the driveway on Christmas morning with the phone in my hand.</w:t>
+        <w:t xml:space="preserve"> </w:t>
+      </w:r>
+      <w:r>
+        <w:rPr>
+          <w:highlight w:val="yellow"/>
+        </w:rPr>
+        <w:t xml:space="preserve">“</w:t>
+      </w:r>
+      <w:r>
+        <w:rPr>
+          <w:highlight w:val="yellow"/>
+        </w:rPr>
+        <w:t xml:space="preserve">He’s gone. About a half hour ago. Donna was with him.</w:t>
+      </w:r>
+      <w:r>
+        <w:rPr>
+          <w:highlight w:val="yellow"/>
+        </w:rPr>
+        <w:t xml:space="preserve">”</w:t>
+      </w:r>
+      <w:r>
+        <w:rPr>
+          <w:highlight w:val="yellow"/>
+        </w:rPr>
+        <w:t xml:space="preserve"> </w:t>
+      </w:r>
+      <w:r>
+        <w:rPr>
+          <w:highlight w:val="yellow"/>
+        </w:rPr>
+        <w:t xml:space="preserve">I asked if it was peaceful. I don’t know why that was my first question. It’s the question families ask me. He said yes. He said Dad had not woken up since the night before. I said okay. I said I’d call him back.</w:t>
+      </w:r>
+    </w:p>
+    <w:p>
+      <w:pPr>
+        <w:pStyle w:val="BodyText"/>
+      </w:pPr>
+      <w:r>
+        <w:rPr>
+          <w:highlight w:val="yellow"/>
+        </w:rPr>
+        <w:t xml:space="preserve">I went and told my mother. She was in the good chair with her tea. I said,</w:t>
+      </w:r>
+      <w:r>
+        <w:rPr>
+          <w:highlight w:val="yellow"/>
+        </w:rPr>
+        <w:t xml:space="preserve"> </w:t>
+      </w:r>
+      <w:r>
+        <w:rPr>
+          <w:highlight w:val="yellow"/>
+        </w:rPr>
+        <w:t xml:space="preserve">“</w:t>
+      </w:r>
+      <w:r>
+        <w:rPr>
+          <w:highlight w:val="yellow"/>
+        </w:rPr>
+        <w:t xml:space="preserve">Mom, Dad died.</w:t>
+      </w:r>
+      <w:r>
+        <w:rPr>
+          <w:highlight w:val="yellow"/>
+        </w:rPr>
+        <w:t xml:space="preserve">”</w:t>
+      </w:r>
+      <w:r>
+        <w:rPr>
+          <w:highlight w:val="yellow"/>
+        </w:rPr>
+        <w:t xml:space="preserve"> </w:t>
+      </w:r>
+      <w:r>
+        <w:rPr>
+          <w:highlight w:val="yellow"/>
+        </w:rPr>
+        <w:t xml:space="preserve">She looked at me for a long time and then she said,</w:t>
+      </w:r>
+      <w:r>
+        <w:rPr>
+          <w:highlight w:val="yellow"/>
+        </w:rPr>
+        <w:t xml:space="preserve"> </w:t>
+      </w:r>
+      <w:r>
+        <w:rPr>
+          <w:highlight w:val="yellow"/>
+        </w:rPr>
+        <w:t xml:space="preserve">“</w:t>
+      </w:r>
+      <w:r>
+        <w:rPr>
+          <w:highlight w:val="yellow"/>
+        </w:rPr>
+        <w:t xml:space="preserve">Oh, Louie.</w:t>
+      </w:r>
+      <w:r>
+        <w:rPr>
+          <w:highlight w:val="yellow"/>
+        </w:rPr>
+        <w:t xml:space="preserve">”</w:t>
+      </w:r>
+      <w:r>
+        <w:rPr>
+          <w:highlight w:val="yellow"/>
+        </w:rPr>
+        <w:t xml:space="preserve"> </w:t>
+      </w:r>
+      <w:r>
+        <w:rPr>
+          <w:highlight w:val="yellow"/>
+        </w:rPr>
+        <w:t xml:space="preserve">Just that. She had known him forty years, married him, left him, and toasted him at my wedding, and what she had left for him was his name. Hope had come in behind me and put her hand flat on my back and left it there.</w:t>
+      </w:r>
+    </w:p>
+    <w:p>
+      <w:pPr>
+        <w:pStyle w:val="BodyText"/>
+      </w:pPr>
+      <w:r>
+        <w:rPr>
+          <w:highlight w:val="yellow"/>
+        </w:rPr>
+        <w:t xml:space="preserve">Then my mother got up, which costs her something now, and went to the stove and started eggs. Nobody ate them. In our family that’s what you do. You cook it.</w:t>
+      </w:r>
+    </w:p>
+    <w:p>
+      <w:pPr>
+        <w:pStyle w:val="BodyText"/>
+      </w:pPr>
+      <w:r>
+        <w:rPr>
+          <w:highlight w:val="yellow"/>
+        </w:rPr>
+        <w:t xml:space="preserve">I went out to the driveway. The bicycle with the bow was still across the street. A kid came out in pajamas and got on it and rode it to the corner and back, and I stood there with the phone in my hand and watched him do it four times.</w:t>
       </w:r>
     </w:p>
     <w:p>

</xml_diff>

<commit_message>
Epilogue: anniversary paragraph placed after the third-row line
Co-Authored-By: Claude Fable 5.1 <noreply@anthropic.com>
Claude-Session: https://claude.ai/code/session_013TTacQAr67Pe2VUwTPop1A
</commit_message>
<xml_diff>
--- a/The_Cardinals_Promise.docx
+++ b/The_Cardinals_Promise.docx
@@ -15033,6 +15033,22 @@
         <w:pStyle w:val="BodyText"/>
       </w:pPr>
       <w:r>
+        <w:t xml:space="preserve">And then it lands, the cardinal, on the mirror, close enough to touch through the glass.</w:t>
+      </w:r>
+    </w:p>
+    <w:p>
+      <w:pPr>
+        <w:pStyle w:val="BodyText"/>
+      </w:pPr>
+      <w:r>
+        <w:t xml:space="preserve">Seventeen years from West Palm Beach, from the apartment with the blinds drawn and the extension cord running to the hallway, from the morning I opened the door and found Lou standing there. Seventeen, the age I was when I won the county championship. He’d been in the third row that day. He was always in the third row.</w:t>
+      </w:r>
+    </w:p>
+    <w:p>
+      <w:pPr>
+        <w:pStyle w:val="BodyText"/>
+      </w:pPr>
+      <w:r>
         <w:t xml:space="preserve">My father always made a big deal of my sobriety anniversary. Every January 9. My first year, he came to Gulf Breeze Hospital to hear me speak, sat in that room and listened to his son talk about staying sober for one year. He told me once, quietly, that whenever he mentioned my name to someone who knew me, they’d say the same thing:</w:t>
       </w:r>
       <w:r>
@@ -15046,22 +15062,6 @@
       </w:r>
       <w:r>
         <w:t xml:space="preserve">”</w:t>
-      </w:r>
-    </w:p>
-    <w:p>
-      <w:pPr>
-        <w:pStyle w:val="BodyText"/>
-      </w:pPr>
-      <w:r>
-        <w:t xml:space="preserve">And then it lands, the cardinal, on the mirror, close enough to touch through the glass.</w:t>
-      </w:r>
-    </w:p>
-    <w:p>
-      <w:pPr>
-        <w:pStyle w:val="BodyText"/>
-      </w:pPr>
-      <w:r>
-        <w:t xml:space="preserve">Seventeen years from West Palm Beach, from the apartment with the blinds drawn and the extension cord running to the hallway, from the morning I opened the door and found Lou standing there. Seventeen, the age I was when I won the county championship. He’d been in the third row that day. He was always in the third row.</w:t>
       </w:r>
     </w:p>
     <w:p>

</xml_diff>

<commit_message>
Restore chapter-ending hooks flattened by the cuts
Co-Authored-By: Claude Fable 5.1 <noreply@anthropic.com>
Claude-Session: https://claude.ai/code/session_013TTacQAr67Pe2VUwTPop1A
</commit_message>
<xml_diff>
--- a/The_Cardinals_Promise.docx
+++ b/The_Cardinals_Promise.docx
@@ -3028,7 +3028,7 @@
         <w:pStyle w:val="BodyText"/>
       </w:pPr>
       <w:r>
-        <w:t xml:space="preserve">I get it now. I didn’t back then.</w:t>
+        <w:t xml:space="preserve">I get it now. I didn’t back then. For me, it started on a Saturday. With a bucket of baseballs.</w:t>
       </w:r>
     </w:p>
     <w:p>
@@ -5314,7 +5314,7 @@
         <w:pStyle w:val="BodyText"/>
       </w:pPr>
       <w:r>
-        <w:t xml:space="preserve">My brother and I called him the most interesting man in the world. It started as a joke, the guy from the Dos Equis commercials. Stay thirsty, my friends. Then we realized we weren’t joking. Not for the people he knew, but for who he’d be in a kitchen on an ordinary night, keeping a straight face, waiting for you to fall for it.</w:t>
+        <w:t xml:space="preserve">My brother and I called him the most interesting man in the world. It started as a joke, the guy from the Dos Equis commercials. Stay thirsty, my friends. Then we realized we weren’t joking. He really was. Not for the people he knew, but for who he’d be in a kitchen on an ordinary night, keeping a straight face, waiting for you to fall for it.</w:t>
       </w:r>
     </w:p>
     <w:p>
@@ -5861,7 +5861,7 @@
         <w:pStyle w:val="BodyText"/>
       </w:pPr>
       <w:r>
-        <w:t xml:space="preserve">The man who made it possible was sharing a rental and paying back loans for years. I graduated in May 2000, Lou and my mom in the crowd, tracking the sea of identical caps until they found mine. I pointed my car west.</w:t>
+        <w:t xml:space="preserve">The man who made it possible was sharing a rental and paying back loans for years. I graduated in May 2000, Lou and my mom in the crowd, tracking the sea of identical caps until they found mine. I pointed my car west. California beckoned.</w:t>
       </w:r>
     </w:p>
     <w:p>
@@ -6466,7 +6466,7 @@
         <w:pStyle w:val="BodyText"/>
       </w:pPr>
       <w:r>
-        <w:t xml:space="preserve">The problem with hitting rock bottom is that sometimes you bounce. And then you have to hit again. And again.</w:t>
+        <w:t xml:space="preserve">The problem with hitting rock bottom is that sometimes you bounce. And then you have to hit again. And again. My elevator hadn’t yet reached bottom.</w:t>
       </w:r>
     </w:p>
     <w:p>
@@ -10006,7 +10006,7 @@
         <w:pStyle w:val="BodyText"/>
       </w:pPr>
       <w:r>
-        <w:t xml:space="preserve">Years later, when Hope walked through that door the first time, she didn’t say a word about the size. She noticed how it felt. We’d take a devotional out to the pool, or down to the dock, and read it together. The habit we still fall back into, the one that’s just part of the house now, started there. We sold it in 2019, a hundred thousand in equity, and put it down on the home Hope and I built together in East Hill, the kind I’d never let myself imagine from across the street.</w:t>
+        <w:t xml:space="preserve">Years later, when Hope walked through that door the first time, she didn’t say a word about the size. She noticed how it felt. We’d take a devotional out to the pool, or down to the dock, and read it together. The habit we still fall back into, the one that’s just part of the house now, started there. We sold it in 2019, a hundred thousand in equity, and put it down on the home Hope and I built together in East Hill, the kind I’d never let myself imagine from across the street. From a one-bedroom salmon castle to a house we built from the ground up.</w:t>
       </w:r>
     </w:p>
     <w:p>
@@ -10736,7 +10736,7 @@
         <w:t xml:space="preserve"> </w:t>
       </w:r>
       <w:r>
-        <w:t xml:space="preserve">He was right. Bob hadn’t needed me to fix anything. He’d needed me in the room.</w:t>
+        <w:t xml:space="preserve">He was right. Bob hadn’t needed me to fix anything. He’d needed me in the room. I was being let into places where presence was the only thing left to offer, and something in me already knew how to do that. Years later, that became the whole job.</w:t>
       </w:r>
     </w:p>
     <w:p>
@@ -14742,6 +14742,14 @@
         <w:pStyle w:val="BodyText"/>
       </w:pPr>
       <w:r>
+        <w:t xml:space="preserve">Lou spent eighty-four years showing up without needing to know exactly where he was going. I’m trying to do the same.</w:t>
+      </w:r>
+    </w:p>
+    <w:p>
+      <w:pPr>
+        <w:pStyle w:val="BodyText"/>
+      </w:pPr>
+      <w:r>
         <w:rPr>
           <w:bCs/>
           <w:b/>
@@ -14942,7 +14950,7 @@
         <w:pStyle w:val="FirstParagraph"/>
       </w:pPr>
       <w:r>
-        <w:t xml:space="preserve">Almost every morning for fifteen years, my phone has rung early and it’s Mager, or I’ve called him first, and we pray. A few plain sentences to start the day pointed the right way. Nothing eloquent. Two sober men on a phone line, saying thank you, asking for help, hanging up, going to work. People ask me where God was in all of it, and the honest answer is that He was never the one who left. I was. I still can’t explain God on paper, and I’ve stopped trying. What I can tell you is that every time I hit the bottom of myself, something I had not put there was holding the floor. Today my faith doesn’t look like certainty. It looks like that morning call. Walking into a dying stranger’s room with nothing useful in my hands and trusting that presence is its own kind of prayer. I stopped needing the theology airtight. I just needed to stay in the room, and to let myself be shown up for.</w:t>
+        <w:t xml:space="preserve">Almost every morning for fifteen years, my phone has rung early and it’s Mager, or I’ve called him first, and we pray. A few plain sentences to start the day pointed the right way. Nothing eloquent. Two sober men on a phone line, saying thank you, asking for help, hanging up, going to work. People ask me where God was in all of it, and the honest answer is that He was never the one who left. I was. I still can’t explain God on paper, and I’ve stopped trying. What I can tell you is that every time I hit the bottom of myself, something I had not put there was holding the floor. Today my faith doesn’t look like certainty. It looks like that morning call. Walking into a dying stranger’s room with nothing useful in my hands and trusting that presence is its own kind of prayer. I stopped needing the theology airtight. I just needed to stay in the room, and to let myself be shown up for. That, as much as anything, is what got me here.</w:t>
       </w:r>
     </w:p>
     <w:bookmarkEnd w:id="58"/>

</xml_diff>

<commit_message>
Round four: panel-eight continuity fixes, placeholder tells, therapy and program vocabulary cut, Reader's Guide updated
Co-Authored-By: Claude Fable 5.1 <noreply@anthropic.com>
Claude-Session: https://claude.ai/code/session_013TTacQAr67Pe2VUwTPop1A
</commit_message>
<xml_diff>
--- a/The_Cardinals_Promise.docx
+++ b/The_Cardinals_Promise.docx
@@ -2645,7 +2645,7 @@
         <w:rPr>
           <w:highlight w:val="yellow"/>
         </w:rPr>
-        <w:t xml:space="preserve">One job. You had one job.</w:t>
+        <w:t xml:space="preserve">What did I tell you? What did I tell you?</w:t>
       </w:r>
       <w:r>
         <w:rPr>
@@ -2699,14 +2699,6 @@
           <w:highlight w:val="yellow"/>
         </w:rPr>
         <w:t xml:space="preserve">[END PLACEHOLDER.]</w:t>
-      </w:r>
-    </w:p>
-    <w:p>
-      <w:pPr>
-        <w:pStyle w:val="BodyText"/>
-      </w:pPr>
-      <w:r>
-        <w:t xml:space="preserve">Some moments were hard. He was worth it.</w:t>
       </w:r>
     </w:p>
     <w:p>
@@ -8074,7 +8066,7 @@
         <w:pStyle w:val="BodyText"/>
       </w:pPr>
       <w:r>
-        <w:t xml:space="preserve">Somewhere in that year I learned what sobriety was actually asking of me. It was not about feeling better. I had spent twenty years chasing feeling better, relief, escape, approval, the next thing that would make the pressure quiet down, and feelings move around like weather. Sobriety was about learning to function differently. Going when I did not feel like it. Telling the truth when hiding would have been easier. Calling someone instead of isolating. Making the apology. Going to the meeting. Staying useful while I was hurting. Living by values instead of moods. That was the discovery that carried me through the year the feelings couldn’t.</w:t>
+        <w:t xml:space="preserve">Somewhere in that year I learned what sobriety was actually asking of me. It was not about feeling better. I had spent twenty years chasing feeling better, and feelings move around like weather. It was about going when I did not feel like it.</w:t>
       </w:r>
     </w:p>
     <w:p>
@@ -8258,7 +8250,7 @@
         <w:pStyle w:val="BodyText"/>
       </w:pPr>
       <w:r>
-        <w:t xml:space="preserve">One of the men I got sober alongside had been homeless with a tenth-grade education, and a few years later he had a Hollywood actor sleeping in his guest room. His name is Matt. The men God put in front of me weren’t the ones I would have picked, and the first of them came early, when I couldn’t yet see any of it.</w:t>
+        <w:t xml:space="preserve">One of the men I got sober alongside had been homeless with a tenth-grade education, and a few years later he had a Hollywood actor sleeping in his guest room, which is his story to tell and not mine. His name is Matt. The men God put in front of me weren’t the ones I would have picked, and the first of them came early, when I couldn’t yet see any of it.</w:t>
       </w:r>
     </w:p>
     <w:p>
@@ -8324,7 +8316,7 @@
         <w:pStyle w:val="BodyText"/>
       </w:pPr>
       <w:r>
-        <w:t xml:space="preserve">And there’s Matt Campbell, the man from the top of this chapter. When I met him he was at Jason’s Deli making ten dollars an hour, calling me about life on ten dollars an hour, the same calls I’d made to Andy. He had nothing but the program, and I think that’s exactly what he needed. You already know where it went. We all went to church together on Sundays, a pew full of lives rebuilt from wreckage, sitting there like the most normal thing in the world.</w:t>
+        <w:t xml:space="preserve">And there’s Matt Campbell, the man from the top of this chapter. When I met him he was at Jason’s Deli making ten dollars an hour, calling me about life on ten dollars an hour, the same calls I’d made to Andy. He had nothing but the program, and I think that’s exactly what he needed. It went where it goes when a man works it: he got his life back, and then some. We all went to church together on Sundays, a pew full of lives rebuilt from wreckage, sitting there like the most normal thing in the world.</w:t>
       </w:r>
     </w:p>
     <w:p>
@@ -8905,7 +8897,7 @@
         <w:t xml:space="preserve">“</w:t>
       </w:r>
       <w:r>
-        <w:t xml:space="preserve">How do you build trust and relationships with strangers? What do you do when the territory’s cold and the numbers aren’t there? How do you stay consistent when results don’t come?</w:t>
+        <w:t xml:space="preserve">How do you build trust with strangers?</w:t>
       </w:r>
       <w:r>
         <w:t xml:space="preserve">”</w:t>
@@ -9226,7 +9218,7 @@
         <w:pStyle w:val="BodyText"/>
       </w:pPr>
       <w:r>
-        <w:t xml:space="preserve">Home health wasn’t selling, not the way I’d done it. The people I called on spent their days in living rooms and nights in musty bedrooms, oxygen tanks humming in the corner, family members exhausted in ways sleep doesn’t fix. Time had slowed down in those houses.</w:t>
+        <w:t xml:space="preserve">Home health wasn’t selling, not the way I’d done it. The people I called on spent their days in living rooms and nights in musty bedrooms, oxygen concentrators humming in the corner, family members exhausted in ways sleep doesn’t fix. Time had slowed down in those houses.</w:t>
       </w:r>
     </w:p>
     <w:p>
@@ -9656,7 +9648,7 @@
         <w:pStyle w:val="BodyText"/>
       </w:pPr>
       <w:r>
-        <w:t xml:space="preserve">My mother’s money never went on that legal pad. What I owed her had no number on it. The lies I’d told her went into my fourth step and my fifth, and for years I told myself the rest was paid in the only currency she ever wanted — her son, alive and honest. Sober and alive is a start. It isn’t a settlement. She’s the last parent I have, down in South Florida, and I am not there enough. I’ve come to think this isn’t an amends you finish — not a letter, not a line in a book. It’s the trips, my time, which is the one thing she always wanted and the one thing I kept for myself.</w:t>
+        <w:t xml:space="preserve">My mother’s money never went on that legal pad. What I owed her had no number on it. The lies I’d told her went into my fourth step and my fifth, and for years I told myself the rest was paid in the only currency she ever wanted — her son, alive and honest. Sober and alive is a start. It isn’t a settlement. Of the two parents who raised me, she’s the one I have left, down in South Florida, and I am not there enough. I’ve come to think this isn’t an amends you finish — not a letter, not a line in a book. It’s the trips, my time, which is the one thing she always wanted and the one thing I kept for myself.</w:t>
       </w:r>
     </w:p>
     <w:p>
@@ -11937,15 +11929,15 @@
         <w:pStyle w:val="FirstParagraph"/>
       </w:pPr>
       <w:r>
-        <w:t xml:space="preserve">Hope’s parents divorced when she was twelve, and she carries some abandonment from it, the quiet kind that doesn’t announce itself. It wasn’t one big leaving, either. She once rode to the movies with friends and got left in the backseat, on the hump, forgotten while everybody else walked in. Small things like that stack in a person. She needs a plan — the trip, the week, the grocery run — and when something moves the pieces she feels it in her body. At first I tried to talk her out of it. Now I help her rebuild the plan instead. Hope was left once. She needs to know what’s coming.</w:t>
-      </w:r>
-    </w:p>
-    <w:p>
-      <w:pPr>
-        <w:pStyle w:val="BodyText"/>
-      </w:pPr>
-      <w:r>
-        <w:t xml:space="preserve">Early on she was a little codependent, and I’ll be honest, it felt good. I’d spent my whole life trying to feel chosen, trying to be enough for somebody. Here was a person who needed me. Two people with the same wound from opposite ends, hers being left, mine wondering if I was worth keeping, and for a while we filled each other’s empty places. We’ve both grown past the worst of it. But I understand now why we fit so fast.</w:t>
+        <w:t xml:space="preserve">Hope’s parents divorced when she was twelve. It wasn’t one big leaving. She once rode to the movies with friends and got left in the backseat, on the hump, forgotten while everybody else walked in. Small things like that stack in a person. She needs a plan — the trip, the week, the grocery run — and when something moves the pieces she feels it in her body. At first I tried to talk her out of it. Now I help her rebuild the plan instead. Hope was left once. She needs to know what’s coming.</w:t>
+      </w:r>
+    </w:p>
+    <w:p>
+      <w:pPr>
+        <w:pStyle w:val="BodyText"/>
+      </w:pPr>
+      <w:r>
+        <w:t xml:space="preserve">I’d spent my whole life trying to feel chosen, trying to be enough for somebody. Here was a person who needed me. She had been left. I had spent my life wondering if I was worth keeping. I understand now why we fit so fast.</w:t>
       </w:r>
     </w:p>
     <w:p>
@@ -13280,7 +13272,7 @@
         <w:rPr>
           <w:highlight w:val="yellow"/>
         </w:rPr>
-        <w:t xml:space="preserve">He’d dressed for it. Pressed shirt, the collar standing a little off his neck now, the hair done. Donna had driven. He walked in on his own. He asked me twice what time we were leaving, and the second time I answered him short, and I’ve had a year to wish I hadn’t. Eggs, toast, coffee he stirred and didn’t drink much of. He ate about a third of it and pushed the plate an inch away from himself, which was as close as he came to saying he was full.</w:t>
+        <w:t xml:space="preserve">He’d dressed for it. Pressed shirt, the collar standing a little off his neck now, the hair done. Donna had driven. He walked in on his own. He asked me twice what time we were leaving, and the second time I answered him short, and I’ve had months to wish I hadn’t. Eggs, toast, coffee he stirred and didn’t drink much of. He ate about a third of it and pushed the plate an inch away from himself, which was as close as he came to saying he was full.</w:t>
       </w:r>
     </w:p>
     <w:p>
@@ -13678,7 +13670,7 @@
         <w:rPr>
           <w:highlight w:val="yellow"/>
         </w:rPr>
-        <w:t xml:space="preserve">She told me his oxygen number. I knew what the number meant. I ask about that number for a living.</w:t>
+        <w:t xml:space="preserve">She told me his oxygen number. I knew what the number meant.</w:t>
       </w:r>
       <w:r>
         <w:rPr>
@@ -13714,7 +13706,7 @@
         <w:rPr>
           <w:highlight w:val="yellow"/>
         </w:rPr>
-        <w:t xml:space="preserve">Then she said the thing I’ve heard a hundred wives say, and I had never once heard it aimed at me.</w:t>
+        <w:t xml:space="preserve">Then she said the thing I’ve heard wives say in living rooms for ten years, and I had never once heard it aimed at me.</w:t>
       </w:r>
       <w:r>
         <w:rPr>
@@ -13807,7 +13799,7 @@
         <w:rPr>
           <w:highlight w:val="yellow"/>
         </w:rPr>
-        <w:t xml:space="preserve">Christmas Eve my mother sat on a stool at the kitchen island and told Hope how to cut the peppers. Hope let her. That is something I love about my wife, that she can be told how to cut a pepper by a woman whose hands can’t hold the knife, and make it look like she needed the help. Twice my mother asked how Dad was doing.</w:t>
+        <w:t xml:space="preserve">Christmas Eve my mother sat on a stool at the kitchen island and told Hope how to cut the peppers. Hope let her. That is something I love about my wife, that she can be told how to cut a pepper by a woman whose hands can’t be trusted with the knife anymore, and make it look like she needed the help. Twice my mother asked how Dad was doing.</w:t>
       </w:r>
       <w:r>
         <w:rPr>
@@ -13945,7 +13937,7 @@
         <w:rPr>
           <w:highlight w:val="yellow"/>
         </w:rPr>
-        <w:t xml:space="preserve">Mager called at his usual time. We prayed the way we always do, a few plain sentences, thank you and help. I told him. He didn’t say anything about God. He said,</w:t>
+        <w:t xml:space="preserve">Mager called at his usual time. We prayed the way we always do, a few plain sentences, thank you and help. I told him about the drip. He didn’t say anything about God. He said,</w:t>
       </w:r>
       <w:r>
         <w:rPr>
@@ -14158,7 +14150,7 @@
         <w:rPr>
           <w:highlight w:val="yellow"/>
         </w:rPr>
-        <w:t xml:space="preserve">Then my mother got up, which costs her something now, and went to the stove and started eggs. Nobody ate them. In our family that’s what you do. You cook it.</w:t>
+        <w:t xml:space="preserve">Then my mother got up, which costs her something now, and went to the stove and started eggs, Hope’s hand under her elbow the whole time. Nobody ate them. In our family that’s what you do. You cook it.</w:t>
       </w:r>
     </w:p>
     <w:p>
@@ -14190,7 +14182,7 @@
         <w:pStyle w:val="BodyText"/>
       </w:pPr>
       <w:r>
-        <w:t xml:space="preserve">I didn’t feel guilty at first. I had been at his bedside every other time — the surgeries, the pacemaker — and I had lived close to him for eighteen years. The guilt came later. Being absent from the last hour is not the same as being absent from the life.</w:t>
+        <w:t xml:space="preserve">Knowing it and feeling it turned out to be two different things. I didn’t feel guilty at first. I had been at his bedside every other time — the surgeries, the pacemaker — and I had lived close to him for eighteen years. The guilt came later. Being absent from the last hour is not the same as being absent from the life.</w:t>
       </w:r>
     </w:p>
     <w:p>
@@ -14678,15 +14670,15 @@
         <w:pStyle w:val="BodyText"/>
       </w:pPr>
       <w:r>
-        <w:t xml:space="preserve">I could tell you a dozen versions of the same room. The details change. The room doesn’t. A husband answering every question directed at his wife, because he has been her voice since the diagnosis, going quiet only when I ask what he’ll do with his mornings. A daughter who flew in from three time zones away and won’t sit down, because sitting down feels like agreeing to it. A Bible on the nightstand with a rubber band around it, fat with decades of funeral programs pressed inside. And at some point, out in the hallway, the question underneath every other question: how long? What they’re really asking is how long they have to say the thing they’ve been saving. I used to point them to the nurses and the ranges. Now I answer the real question. Don’t wait. Then I go back into the room with them, and we stay.</w:t>
-      </w:r>
-    </w:p>
-    <w:p>
-      <w:pPr>
-        <w:pStyle w:val="BodyText"/>
-      </w:pPr>
-      <w:r>
-        <w:t xml:space="preserve">The mechanics of it are simple. The first thing I do in any room is pull a chair up close, because distance reads as hurry and I am never in a hurry there. I remember an older woman with one framed photograph beside her bed, her daughter, a whole life narrowed down to the one face she wanted near her. I remember a man who told me his single regret, and there was nothing material in it. Nobody at the end talks about the things they bought. He wished he had traveled outside the country, just once. That was the whole confession. A woman with dementia once asked me to go to prom with her. People ask how I can stand this work. Some days the work asks you to prom. And once, after my father died, I sat with a man who reminded me so much of Lou that when he passed I had to step out of the room and stand there awhile before I could be useful to anybody. People ask what those rooms smell like, too, expecting something terrible. They smell clean. Hospital clean. That scrubbed-blank smell is to me now what rubber and sweat were to the wrestling room.</w:t>
+        <w:t xml:space="preserve">I could tell you a dozen versions of the same room. The details change. The room doesn’t. A husband answering every question directed at his wife, because he has been her voice since the diagnosis, going quiet only when I ask what he’ll do with his mornings. A daughter who flew in from three time zones away and won’t sit down, because sitting down feels like agreeing to it. A Bible on the nightstand with a rubber band around it, fat with decades of funeral programs pressed inside. And at some point, out in the hallway, the question underneath every other question: how long? What they’re really asking is how long they have to say the thing they’ve been saving. I used to point them to the nurses and the ranges. Now I answer the real question. Don’t wait.</w:t>
+      </w:r>
+    </w:p>
+    <w:p>
+      <w:pPr>
+        <w:pStyle w:val="BodyText"/>
+      </w:pPr>
+      <w:r>
+        <w:t xml:space="preserve">The mechanics of it are simple. The first thing I do in any room is pull a chair up close. I remember an older woman with one framed photograph beside her bed, her daughter, a whole life narrowed down to the one face she wanted near her. I remember a man who told me his single regret, and there was nothing material in it. Nobody at the end talks about the things they bought. He wished he had traveled outside the country, just once. That was the whole confession. A woman with dementia once asked me to go to prom with her. People ask how I can stand this work. Some days the work asks you to prom. And once, after my father died, I sat with a man who reminded me so much of Lou that when he passed I had to step out of the room and stand there awhile before I could be useful to anybody. People ask what those rooms smell like, too, expecting something terrible. They smell clean. Hospital clean. That scrubbed-blank smell is to me now what rubber and sweat were to the wrestling room.</w:t>
       </w:r>
     </w:p>
     <w:p>
@@ -15835,16 +15827,16 @@
         </w:numPr>
       </w:pPr>
       <w:r>
-        <w:t xml:space="preserve">Rob writes that the cardinal</w:t>
-      </w:r>
-      <w:r>
-        <w:t xml:space="preserve"> </w:t>
-      </w:r>
-      <w:r>
-        <w:t xml:space="preserve">“</w:t>
-      </w:r>
-      <w:r>
-        <w:t xml:space="preserve">wasn’t a miracle… the message is still being sent.</w:t>
+        <w:t xml:space="preserve">The book ends on one photograph and one line:</w:t>
+      </w:r>
+      <w:r>
+        <w:t xml:space="preserve"> </w:t>
+      </w:r>
+      <w:r>
+        <w:t xml:space="preserve">“</w:t>
+      </w:r>
+      <w:r>
+        <w:t xml:space="preserve">It has never landed on my car again.</w:t>
       </w:r>
       <w:r>
         <w:t xml:space="preserve">”</w:t>

</xml_diff>

<commit_message>
Round four continued: The Drives IV, guilt paragraph to one line, We're good at the breakfast, temper scene freed from the shift, seam sweep
Co-Authored-By: Claude Fable 5.1 <noreply@anthropic.com>
Claude-Session: https://claude.ai/code/session_013TTacQAr67Pe2VUwTPop1A
</commit_message>
<xml_diff>
--- a/The_Cardinals_Promise.docx
+++ b/The_Cardinals_Promise.docx
@@ -2616,7 +2616,7 @@
         <w:rPr>
           <w:highlight w:val="yellow"/>
         </w:rPr>
-        <w:t xml:space="preserve">The night I remember, Chris and I had the one job we always had, which was to make sure he was up for the eleven o’clock shift. He’d come in from the lawns, eaten standing up, and gone down on the couch with the television going. We got into something upstairs. A game, an argument, I don’t remember which. When I came down for water the clock on the stove said ten to eleven, and he was still on the couch.</w:t>
+        <w:t xml:space="preserve">The night I remember, he’d come in late from the city, eaten standing up, and gone down on the couch with the television going. He had told us to keep it down. Chris and I got into something upstairs, a game, an argument, I don’t remember which, and it got loud, and it woke him.</w:t>
       </w:r>
     </w:p>
     <w:p>
@@ -2627,7 +2627,7 @@
         <w:rPr>
           <w:highlight w:val="yellow"/>
         </w:rPr>
-        <w:t xml:space="preserve">I woke him. He came up off that couch already yelling, and this time it was at me.</w:t>
+        <w:t xml:space="preserve">He came up off that couch already yelling, and this time it was at me.</w:t>
       </w:r>
       <w:r>
         <w:rPr>
@@ -2663,18 +2663,7 @@
         <w:rPr>
           <w:highlight w:val="yellow"/>
         </w:rPr>
-        <w:t xml:space="preserve">He said it more than once, louder each time, getting his boots on. My mother came to the top of the stairs and said his name, and he didn’t answer her. Chris was behind me in the doorway, not moving. I stood there and took it.</w:t>
-      </w:r>
-    </w:p>
-    <w:p>
-      <w:pPr>
-        <w:pStyle w:val="BodyText"/>
-      </w:pPr>
-      <w:r>
-        <w:rPr>
-          <w:highlight w:val="yellow"/>
-        </w:rPr>
-        <w:t xml:space="preserve">The truck went down the street too fast.</w:t>
+        <w:t xml:space="preserve">He said it more than once, louder each time, coming up the stairs. My mother came out of the bedroom and said his name, and he didn’t answer her. Chris was behind me in the doorway, not moving. I stood there and took it.</w:t>
       </w:r>
     </w:p>
     <w:p>
@@ -3623,7 +3612,7 @@
         <w:pStyle w:val="BodyText"/>
       </w:pPr>
       <w:r>
-        <w:t xml:space="preserve">I had my own version of that feeling in that car coming home from upstate, the quiet after a long day, the two of us, the feeling that we had done the thing together. And when he was proud of me, he rarely said so. He’d give me a small smile and a look.</w:t>
+        <w:t xml:space="preserve">I had my own version of that feeling in that car coming home from upstate, the quiet after a long day, the two of us, the feeling that we had done the thing together. And when he was proud of me, in those years he rarely said so. He’d give me a small smile and a look.</w:t>
       </w:r>
     </w:p>
     <w:p>
@@ -10550,7 +10539,7 @@
         <w:pStyle w:val="BodyText"/>
       </w:pPr>
       <w:r>
-        <w:t xml:space="preserve">The surgery was brutal. Donna was there every day. I believe it’s because of Donna that my father lived another ten years. She was a nurse; she understood his body in ways the rest of us didn’t. She loved him completely and he loved her. He told me straight, more than once: Donna was the love of his life. My relationship with Donna was always centered on my dad. She was good to me, always. Who she is was exactly what Lou needed. The season she is in now is hard, because her life was organized entirely around his. I worry about her. I pray for her.</w:t>
+        <w:t xml:space="preserve">The surgery was brutal. Donna was there every day. I believe it’s because of Donna that my father lived another ten years. She was a nurse; she understood his body in ways the rest of us didn’t. She loved him completely and he loved her. He told me straight, more than once: Donna was the love of his life. My relationship with Donna was always centered on my dad. She was good to me, always. Who she is was exactly what Lou needed.</w:t>
       </w:r>
     </w:p>
     <w:p>
@@ -10812,7 +10801,7 @@
         <w:pStyle w:val="BodyText"/>
       </w:pPr>
       <w:r>
-        <w:t xml:space="preserve">The most important person I would meet sober didn’t come from a meeting room. She came from a dating profile that told me not to write to her. By the time I opened Match.com I wasn’t looking for anything. I’d been single a while, settled into my little life, my little condo, okay with it. I got on anyway. And there was this profile. The name on it: Read My Profile. She was tired of guys messaging without reading a word she wrote. Blonde, beautiful, a pharmacist. Nine and a half years younger than me, right at the edge of what I’d consider. The profile said she was studying for the boards and planning to move to Colorado. Don’t message me if you’re local in Pensacola.</w:t>
+        <w:t xml:space="preserve">She came from a dating profile that told me not to write to her. By the time I opened Match.com I wasn’t looking for anything. I’d been single a while, settled into my little life, my little condo, okay with it. I got on anyway. And there was this profile. The name on it: Read My Profile. She was tired of guys messaging without reading a word she wrote. Blonde, beautiful, a pharmacist. Nine and a half years younger than me, right at the edge of what I’d consider. The profile said she was studying for the boards and planning to move to Colorado. Don’t message me if you’re local in Pensacola.</w:t>
       </w:r>
     </w:p>
     <w:p>
@@ -11417,7 +11406,7 @@
         <w:pStyle w:val="BodyText"/>
       </w:pPr>
       <w:r>
-        <w:t xml:space="preserve">They went into the kitchen together while I stayed in the living room. I could hear drawers opening, plates moving. He was including her in the daily life of his household. When they came back, he poured the coffee. Two cups, not three. It wasn’t an oversight.</w:t>
+        <w:t xml:space="preserve">They went into the kitchen together while I stayed in the living room. I could hear drawers opening, plates moving. He was including her in the daily life of his household. When they came back, he poured the coffee. Two cups, not three. One for him and one for her. It wasn’t an oversight.</w:t>
       </w:r>
     </w:p>
     <w:p>
@@ -13142,7 +13131,7 @@
     </w:p>
     <w:bookmarkEnd w:id="52"/>
     <w:bookmarkEnd w:id="53"/>
-    <w:bookmarkStart w:id="59" w:name="the-drives-iii"/>
+    <w:bookmarkStart w:id="57" w:name="the-drives-iii"/>
     <w:p>
       <w:pPr>
         <w:pStyle w:val="Heading1"/>
@@ -13319,17 +13308,41 @@
         <w:rPr>
           <w:highlight w:val="yellow"/>
         </w:rPr>
-        <w:t xml:space="preserve">He had put that in me a long time ago, and he said it again like it was the first time.</w:t>
-      </w:r>
-    </w:p>
-    <w:p>
-      <w:pPr>
-        <w:pStyle w:val="BodyText"/>
-      </w:pPr>
+        <w:t xml:space="preserve">He had put that in me a long time ago, and he said it again like it was the first time. Later, while Hope was up at the counter, he looked at me and said,</w:t>
+      </w:r>
       <w:r>
         <w:rPr>
           <w:highlight w:val="yellow"/>
         </w:rPr>
+        <w:t xml:space="preserve"> </w:t>
+      </w:r>
+      <w:r>
+        <w:rPr>
+          <w:highlight w:val="yellow"/>
+        </w:rPr>
+        <w:t xml:space="preserve">“</w:t>
+      </w:r>
+      <w:r>
+        <w:rPr>
+          <w:highlight w:val="yellow"/>
+        </w:rPr>
+        <w:t xml:space="preserve">Rob, don’t worry about me. We’re good.</w:t>
+      </w:r>
+      <w:r>
+        <w:rPr>
+          <w:highlight w:val="yellow"/>
+        </w:rPr>
+        <w:t xml:space="preserve">”</w:t>
+      </w:r>
+    </w:p>
+    <w:p>
+      <w:pPr>
+        <w:pStyle w:val="BodyText"/>
+      </w:pPr>
+      <w:r>
+        <w:rPr>
+          <w:highlight w:val="yellow"/>
+        </w:rPr>
         <w:t xml:space="preserve">When we got up he didn’t walk us to the car. He stood inside the door and watched us go. It was the last time I saw him.</w:t>
       </w:r>
     </w:p>
@@ -13351,7 +13364,7 @@
         <w:pStyle w:val="BodyText"/>
       </w:pPr>
       <w:r>
-        <w:t xml:space="preserve">Five weeks after I started the hospice job, my father started to die. When the hospice opportunity came, it felt like a room I’d been circling for years with the door finally open.</w:t>
+        <w:t xml:space="preserve">When the hospice opportunity came, it felt like a room I’d been circling for years with the door finally open. Five weeks after I started the job, my father started to die.</w:t>
       </w:r>
     </w:p>
     <w:bookmarkStart w:id="54" w:name="strangers-rooms"/>
@@ -14056,7 +14069,7 @@
         <w:rPr>
           <w:highlight w:val="yellow"/>
         </w:rPr>
-        <w:t xml:space="preserve">I asked if it was peaceful. I don’t know why that was my first question. It’s the question families ask me. He said yes. He said Dad had not woken up since the night before. I said okay. I said I’d call him back.</w:t>
+        <w:t xml:space="preserve">I asked if it was peaceful. I don’t know why that was my first question. It’s the question families ask me. He said yes. He said Dad had not woken up since the night before. I said okay. I said I’d call him back. Then I called Donna, before anyone else. Neither of us said much. She said he hadn’t been alone, and I said thank you, which was not enough, and she knew it and let it be.</w:t>
       </w:r>
     </w:p>
     <w:p>
@@ -14182,7 +14195,7 @@
         <w:pStyle w:val="BodyText"/>
       </w:pPr>
       <w:r>
-        <w:t xml:space="preserve">Knowing it and feeling it turned out to be two different things. I didn’t feel guilty at first. I had been at his bedside every other time — the surgeries, the pacemaker — and I had lived close to him for eighteen years. The guilt came later. Being absent from the last hour is not the same as being absent from the life.</w:t>
+        <w:t xml:space="preserve">I had been at his bedside every other time — the surgeries, the pacemaker — and I had lived close to him for eighteen years. Being absent from the last hour is not the same as being absent from the life.</w:t>
       </w:r>
     </w:p>
     <w:p>
@@ -14286,7 +14299,7 @@
         <w:pStyle w:val="BodyText"/>
       </w:pPr>
       <w:r>
-        <w:t xml:space="preserve">Chris credited Donna, too, called her the reason Dad got his strength and his joy back in the last stretch of his life. It was true. She had given him good years, and she had been there for every one of the hard ones.</w:t>
+        <w:t xml:space="preserve">Chris credited Donna, too, called her the reason Dad got his strength and his joy back in the last stretch of his life. It was true. She had given him good years, and she had been there for every one of the hard ones. The season she is in now is hard, because her life was organized entirely around his. I worry about her. I pray for her.</w:t>
       </w:r>
     </w:p>
     <w:p>
@@ -14431,146 +14444,95 @@
         <w:t xml:space="preserve">In January we went through his things. His gray suit was hanging on the right side of the closet, between two work shirts. Always be the best-dressed person in the room. I pulled it off the rack and held it up, and I couldn’t put it back. I took it home in a garment bag with no plan. It hangs in my closet now, next to mine. It isn’t my size and it isn’t my style and I will never wear it. But some mornings I open the closet door and it’s there, and I know what it is, and I know who wore it, and I leave it alone. I tell families sometimes, when they’re clearing out a closet of their own: keep one thing. You’ll know which one. It will tell you.</w:t>
       </w:r>
     </w:p>
-    <w:p>
-      <w:pPr>
-        <w:pStyle w:val="BodyText"/>
+    <w:bookmarkEnd w:id="56"/>
+    <w:bookmarkEnd w:id="57"/>
+    <w:bookmarkStart w:id="60" w:name="the-drives-iv"/>
+    <w:p>
+      <w:pPr>
+        <w:pStyle w:val="Heading1"/>
       </w:pPr>
       <w:r>
         <w:rPr>
           <w:bCs/>
           <w:b/>
         </w:rPr>
-        <w:t xml:space="preserve">CHAPTER 32</w:t>
-      </w:r>
-      <w:r>
-        <w:t xml:space="preserve"> </w:t>
-      </w:r>
-      <w:r>
-        <w:t xml:space="preserve">##</w:t>
-      </w:r>
-      <w:r>
-        <w:t xml:space="preserve"> </w:t>
-      </w:r>
+        <w:t xml:space="preserve">THE DRIVES · IV</w:t>
+      </w:r>
+    </w:p>
+    <w:p>
+      <w:pPr>
+        <w:pStyle w:val="FirstParagraph"/>
+      </w:pPr>
+      <w:r>
+        <w:rPr>
+          <w:iCs/>
+          <w:i/>
+        </w:rPr>
+        <w:t xml:space="preserve">December 24, 2025. Our car in the driveway in Raleigh, engine off, eleven hours of interstate between me and a hospital bed in Pensacola. Hope asked once. I said he always comes back. He had driven to Ohio for me, to West Palm Beach, to Chumuckla and back. This time, I didn’t.</w:t>
+      </w:r>
+    </w:p>
+    <w:p>
+      <w:pPr>
+        <w:pStyle w:val="BodyText"/>
+      </w:pPr>
       <w:r>
         <w:rPr>
           <w:bCs/>
           <w:b/>
         </w:rPr>
-        <w:t xml:space="preserve">The First Honest Mile</w:t>
-      </w:r>
-    </w:p>
-    <w:p>
-      <w:pPr>
-        <w:pStyle w:val="BodyText"/>
-      </w:pPr>
-      <w:r>
-        <w:rPr>
-          <w:iCs/>
-          <w:i/>
-        </w:rPr>
-        <w:t xml:space="preserve">“</w:t>
-      </w:r>
-      <w:r>
-        <w:rPr>
-          <w:iCs/>
-          <w:i/>
-        </w:rPr>
-        <w:t xml:space="preserve">Blessed are they that mourn: for they shall be comforted.</w:t>
-      </w:r>
-      <w:r>
-        <w:rPr>
-          <w:iCs/>
-          <w:i/>
-        </w:rPr>
-        <w:t xml:space="preserve">”</w:t>
-      </w:r>
-      <w:r>
-        <w:t xml:space="preserve"> </w:t>
-      </w:r>
-      <w:r>
-        <w:rPr>
-          <w:iCs/>
-          <w:i/>
-        </w:rPr>
-        <w:t xml:space="preserve">— Matthew 5:4</w:t>
-      </w:r>
-    </w:p>
-    <w:p>
-      <w:pPr>
-        <w:pStyle w:val="BodyText"/>
-      </w:pPr>
+        <w:t xml:space="preserve">CHAPTER 32</w:t>
+      </w:r>
+      <w:r>
+        <w:t xml:space="preserve"> </w:t>
+      </w:r>
+      <w:r>
+        <w:t xml:space="preserve">##</w:t>
+      </w:r>
+      <w:r>
+        <w:t xml:space="preserve"> </w:t>
+      </w:r>
       <w:r>
         <w:rPr>
           <w:bCs/>
           <w:b/>
         </w:rPr>
-        <w:t xml:space="preserve">Raleigh, 2026</w:t>
-      </w:r>
-    </w:p>
-    <w:p>
-      <w:pPr>
-        <w:pStyle w:val="BodyText"/>
-      </w:pPr>
-      <w:r>
-        <w:t xml:space="preserve">I took one day off after my father died, then put on a tie and went back. He’d worn one for forty years, and he’d have gone back the next day, so I did too.</w:t>
-      </w:r>
-    </w:p>
-    <w:p>
-      <w:pPr>
-        <w:pStyle w:val="BodyText"/>
-      </w:pPr>
-      <w:r>
-        <w:t xml:space="preserve">The tie made it look like I was fine. I wasn’t.</w:t>
-      </w:r>
-    </w:p>
-    <w:p>
-      <w:pPr>
-        <w:pStyle w:val="BodyText"/>
-      </w:pPr>
-      <w:r>
-        <w:t xml:space="preserve">I never wanted a drink. That surprised me. What I wanted was to be gone. I let the routines slip. The gym went first, and I still haven’t found my way back to it very often. I haven’t watched a Yankees game since he died. Some things are still too closely connected to him. He was always the one who told me he was proud of me. I let the phone ring, sat in rooms without being in them. I’d get in the car and drive with no destination, park somewhere and cry, then drive some more. Sometimes I’d end up asleep on a couch in the lobby of a hotel where I wasn’t a guest. Numb. When I wasn’t driving the car I was working on it, hours at a time, jobs it didn’t need. What I needed, I kept telling myself, was to be alone. I’d write some and sleep. Some of the pages in this book come from those weeks. These chapters were the hardest to write; writing it meant living it twice. The hospice job was still new, and I kept going to it through all of this. I couldn’t tell you how. Hope never knew where I was. When I came home she’d ask, and the honest answer was nowhere. Disappearing, on a woman whose oldest wound is being left.</w:t>
-      </w:r>
-    </w:p>
-    <w:p>
-      <w:pPr>
-        <w:pStyle w:val="BodyText"/>
-      </w:pPr>
-      <w:r>
-        <w:t xml:space="preserve">She watched it get worse before I did. I got into a couple of fender benders, my head somewhere else at stop signs and in parking lots. Then I hit a guardrail. Twenty-two thousand dollars of damage. The cardinal had already come by then. I had stood in a parking lot on the ninth and felt peace, and I still put a car into a guardrail. Hope and her mom were worried, and said so. I got defensive. I didn’t want to look weak. They were right, which was the part I couldn’t stand. It was like cutting weight again. You’re starving, you won’t eat, and nobody at the table understands why, because from the inside it makes perfect sense. Hope started watching me the way you watch someone after a fall, and finally asked, seriously, whether I might have a concussion. That’s what grief looked like on me. Enough like a head injury that the person who knows me best couldn’t tell the difference. Then she said the thing that cut through.</w:t>
-      </w:r>
-      <w:r>
-        <w:t xml:space="preserve"> </w:t>
-      </w:r>
-      <w:r>
-        <w:t xml:space="preserve">“</w:t>
-      </w:r>
-      <w:r>
-        <w:t xml:space="preserve">I have you here, but I feel like you don’t care. Like you’re not here.</w:t>
-      </w:r>
-      <w:r>
-        <w:t xml:space="preserve">”</w:t>
-      </w:r>
-      <w:r>
-        <w:t xml:space="preserve"> </w:t>
-      </w:r>
-      <w:r>
-        <w:t xml:space="preserve">She wasn’t wrong. The body was in the house. The rest of me was out on those roads somewhere.</w:t>
-      </w:r>
-    </w:p>
-    <w:p>
-      <w:pPr>
-        <w:pStyle w:val="BodyText"/>
-      </w:pPr>
-      <w:r>
-        <w:t xml:space="preserve">And I was mean. That scared me more than a craving would have. I lashed out at the people carrying the same loss I was, short and sharp over nothing, hearing myself do it and doing it anyway. Part of it was this book. I was writing my way through the loss, and in that fog it felt like the family didn’t believe in what I was doing, didn’t want the story told, and I used that as a reason to push them further away. Looking back, I don’t think it was fair to them. Grief reads indifference into everything. At the time it felt like proof.</w:t>
-      </w:r>
-    </w:p>
-    <w:p>
-      <w:pPr>
-        <w:pStyle w:val="BodyText"/>
-      </w:pPr>
-      <w:r>
-        <w:t xml:space="preserve">Seventeen years sober, and I had hit a rock bottom again, an emotional one this time. The disease doesn’t need a bottle to run the old plays: isolation, anger, the closed door. The difference was that this time I had to feel it all the way through. And this time I knew what to do with a bottom. I went back to meetings, more of them than I’d been to in years. I got a therapist. The morning calls with Mager got longer. I said out loud, in the rooms and on the phone, that I was not okay. I went back to the people I’d been sharp with and said sorry, plainly. Seventeen years in, I was back on the first honest mile.</w:t>
+        <w:t xml:space="preserve">The First Honest Mile</w:t>
+      </w:r>
+    </w:p>
+    <w:p>
+      <w:pPr>
+        <w:pStyle w:val="BodyText"/>
+      </w:pPr>
+      <w:r>
+        <w:rPr>
+          <w:iCs/>
+          <w:i/>
+        </w:rPr>
+        <w:t xml:space="preserve">“</w:t>
+      </w:r>
+      <w:r>
+        <w:rPr>
+          <w:iCs/>
+          <w:i/>
+        </w:rPr>
+        <w:t xml:space="preserve">Blessed are they that mourn: for they shall be comforted.</w:t>
+      </w:r>
+      <w:r>
+        <w:rPr>
+          <w:iCs/>
+          <w:i/>
+        </w:rPr>
+        <w:t xml:space="preserve">”</w:t>
+      </w:r>
+      <w:r>
+        <w:t xml:space="preserve"> </w:t>
+      </w:r>
+      <w:r>
+        <w:rPr>
+          <w:iCs/>
+          <w:i/>
+        </w:rPr>
+        <w:t xml:space="preserve">— Matthew 5:4</w:t>
       </w:r>
     </w:p>
     <w:p>
@@ -14582,159 +14544,137 @@
           <w:bCs/>
           <w:b/>
         </w:rPr>
-        <w:t xml:space="preserve">CHAPTER 33</w:t>
-      </w:r>
-      <w:r>
-        <w:t xml:space="preserve"> </w:t>
-      </w:r>
-      <w:r>
-        <w:t xml:space="preserve">##</w:t>
-      </w:r>
-      <w:r>
-        <w:t xml:space="preserve"> </w:t>
-      </w:r>
+        <w:t xml:space="preserve">Raleigh, 2026</w:t>
+      </w:r>
+    </w:p>
+    <w:p>
+      <w:pPr>
+        <w:pStyle w:val="BodyText"/>
+      </w:pPr>
+      <w:r>
+        <w:t xml:space="preserve">I took one day off after my father died, then put on a tie and went back. He’d worn one for forty years, and he’d have gone back the next day, so I did too.</w:t>
+      </w:r>
+    </w:p>
+    <w:p>
+      <w:pPr>
+        <w:pStyle w:val="BodyText"/>
+      </w:pPr>
+      <w:r>
+        <w:t xml:space="preserve">The tie made it look like I was fine. I wasn’t.</w:t>
+      </w:r>
+    </w:p>
+    <w:p>
+      <w:pPr>
+        <w:pStyle w:val="BodyText"/>
+      </w:pPr>
+      <w:r>
+        <w:t xml:space="preserve">I never wanted a drink. That surprised me. What I wanted was to be gone. I let the routines slip. The gym went first, and I still haven’t found my way back to it very often. I haven’t watched a Yankees game since he died. Some things are still too closely connected to him. He was always the one who told me he was proud of me. I let the phone ring, sat in rooms without being in them. I’d get in the car and drive with no destination, park somewhere and cry, then drive some more. Sometimes I’d end up asleep on a couch in the lobby of a hotel where I wasn’t a guest. Numb. When I wasn’t driving the car I was working on it, hours at a time, jobs it didn’t need. What I needed, I kept telling myself, was to be alone. I’d write some and sleep. Some of the pages in this book come from those weeks. These chapters were the hardest to write; writing it meant living it twice. The hospice job was still new, and I kept going to it through all of this. I couldn’t tell you how. Hope never knew where I was. When I came home she’d ask, and the honest answer was nowhere. Disappearing, on a woman whose oldest wound is being left.</w:t>
+      </w:r>
+    </w:p>
+    <w:p>
+      <w:pPr>
+        <w:pStyle w:val="BodyText"/>
+      </w:pPr>
+      <w:r>
+        <w:t xml:space="preserve">She watched it get worse before I did. I got into a couple of fender benders, my head somewhere else at stop signs and in parking lots. Then I hit a guardrail. Twenty-two thousand dollars of damage. The cardinal had already come by then. I had stood in a parking lot on the ninth and felt peace, and I still put a car into a guardrail. Hope and her mom were worried, and said so. I got defensive. I didn’t want to look weak. They were right, which was the part I couldn’t stand. It was like cutting weight again. You’re starving, you won’t eat, and nobody at the table understands why, because from the inside it makes perfect sense. Hope started watching me the way you watch someone after a fall, and finally asked, seriously, whether I might have a concussion. That’s what grief looked like on me. Enough like a head injury that the person who knows me best couldn’t tell the difference. Then she said the thing that cut through.</w:t>
+      </w:r>
+      <w:r>
+        <w:t xml:space="preserve"> </w:t>
+      </w:r>
+      <w:r>
+        <w:t xml:space="preserve">“</w:t>
+      </w:r>
+      <w:r>
+        <w:t xml:space="preserve">I have you here, but I feel like you don’t care. Like you’re not here.</w:t>
+      </w:r>
+      <w:r>
+        <w:t xml:space="preserve">”</w:t>
+      </w:r>
+      <w:r>
+        <w:t xml:space="preserve"> </w:t>
+      </w:r>
+      <w:r>
+        <w:t xml:space="preserve">She wasn’t wrong. The body was in the house. The rest of me was out on those roads somewhere.</w:t>
+      </w:r>
+    </w:p>
+    <w:p>
+      <w:pPr>
+        <w:pStyle w:val="BodyText"/>
+      </w:pPr>
+      <w:r>
+        <w:t xml:space="preserve">And I was mean. That scared me more than a craving would have. I lashed out at the people carrying the same loss I was, short and sharp over nothing, hearing myself do it and doing it anyway. Part of it was this book. I was writing my way through the loss, and in that fog it felt like the family didn’t believe in what I was doing, didn’t want the story told, and I used that as a reason to push them further away. Looking back, I don’t think it was fair to them. Grief reads indifference into everything. At the time it felt like proof.</w:t>
+      </w:r>
+    </w:p>
+    <w:p>
+      <w:pPr>
+        <w:pStyle w:val="BodyText"/>
+      </w:pPr>
+      <w:r>
+        <w:t xml:space="preserve">Seventeen years sober, and I had hit a rock bottom again, an emotional one this time. The disease doesn’t need a bottle to run the old plays: isolation, anger, the closed door. The difference was that this time I had to feel it all the way through. And this time I knew what to do with a bottom. I went back to meetings, more of them than I’d been to in years. I got a therapist. The morning calls with Mager got longer. I said out loud, in the rooms and on the phone, that I was not okay. I went back to the people I’d been sharp with and said sorry, plainly. Seventeen years in, I was back on the first honest mile.</w:t>
+      </w:r>
+    </w:p>
+    <w:p>
+      <w:pPr>
+        <w:pStyle w:val="BodyText"/>
+      </w:pPr>
       <w:r>
         <w:rPr>
           <w:bCs/>
           <w:b/>
         </w:rPr>
-        <w:t xml:space="preserve">What Grief Taught the Job</w:t>
-      </w:r>
-    </w:p>
-    <w:p>
-      <w:pPr>
-        <w:pStyle w:val="BodyText"/>
-      </w:pPr>
-      <w:r>
-        <w:rPr>
-          <w:iCs/>
-          <w:i/>
-        </w:rPr>
-        <w:t xml:space="preserve">“</w:t>
-      </w:r>
-      <w:r>
-        <w:rPr>
-          <w:iCs/>
-          <w:i/>
-        </w:rPr>
-        <w:t xml:space="preserve">Weeping may endure for a night, but joy cometh in the morning.</w:t>
-      </w:r>
-      <w:r>
-        <w:rPr>
-          <w:iCs/>
-          <w:i/>
-        </w:rPr>
-        <w:t xml:space="preserve">”</w:t>
-      </w:r>
-      <w:r>
-        <w:t xml:space="preserve"> </w:t>
-      </w:r>
-      <w:r>
-        <w:rPr>
-          <w:iCs/>
-          <w:i/>
-        </w:rPr>
-        <w:t xml:space="preserve">— Psalm 30:5</w:t>
-      </w:r>
-    </w:p>
-    <w:p>
-      <w:pPr>
-        <w:pStyle w:val="BodyText"/>
-      </w:pPr>
+        <w:t xml:space="preserve">CHAPTER 33</w:t>
+      </w:r>
+      <w:r>
+        <w:t xml:space="preserve"> </w:t>
+      </w:r>
+      <w:r>
+        <w:t xml:space="preserve">##</w:t>
+      </w:r>
+      <w:r>
+        <w:t xml:space="preserve"> </w:t>
+      </w:r>
       <w:r>
         <w:rPr>
           <w:bCs/>
           <w:b/>
         </w:rPr>
-        <w:t xml:space="preserve">Raleigh, 2026</w:t>
-      </w:r>
-    </w:p>
-    <w:p>
-      <w:pPr>
-        <w:pStyle w:val="BodyText"/>
-      </w:pPr>
-      <w:r>
-        <w:t xml:space="preserve">Before I lost him, I was good at this job, but there was a gap in it, one I can only admit now. I would sit with a family and say the right things, nod at the right moments, and look like a man who understood exactly what they were feeling. Inside, I didn’t. I hadn’t lost the one I loved most yet. I was fluent in the words and a step removed from the weight. Losing my dad closed that gap. Now when I walk into a room where someone is losing the person they love most, I’m not performing understanding. I have it. It made me better at the work, which is a hard thing to be grateful for, and I am grateful for it anyway.</w:t>
-      </w:r>
-    </w:p>
-    <w:p>
-      <w:pPr>
-        <w:pStyle w:val="BodyText"/>
-      </w:pPr>
-      <w:r>
-        <w:t xml:space="preserve">Families would say, I’m terrified I won’t be there when it happens. What I offered was what I knew to be true: presence is cumulative. You build it in the ordinary.</w:t>
-      </w:r>
-    </w:p>
-    <w:p>
-      <w:pPr>
-        <w:pStyle w:val="BodyText"/>
-      </w:pPr>
-      <w:r>
-        <w:t xml:space="preserve">I could tell you a dozen versions of the same room. The details change. The room doesn’t. A husband answering every question directed at his wife, because he has been her voice since the diagnosis, going quiet only when I ask what he’ll do with his mornings. A daughter who flew in from three time zones away and won’t sit down, because sitting down feels like agreeing to it. A Bible on the nightstand with a rubber band around it, fat with decades of funeral programs pressed inside. And at some point, out in the hallway, the question underneath every other question: how long? What they’re really asking is how long they have to say the thing they’ve been saving. I used to point them to the nurses and the ranges. Now I answer the real question. Don’t wait.</w:t>
-      </w:r>
-    </w:p>
-    <w:p>
-      <w:pPr>
-        <w:pStyle w:val="BodyText"/>
-      </w:pPr>
-      <w:r>
-        <w:t xml:space="preserve">The mechanics of it are simple. The first thing I do in any room is pull a chair up close. I remember an older woman with one framed photograph beside her bed, her daughter, a whole life narrowed down to the one face she wanted near her. I remember a man who told me his single regret, and there was nothing material in it. Nobody at the end talks about the things they bought. He wished he had traveled outside the country, just once. That was the whole confession. A woman with dementia once asked me to go to prom with her. People ask how I can stand this work. Some days the work asks you to prom. And once, after my father died, I sat with a man who reminded me so much of Lou that when he passed I had to step out of the room and stand there awhile before I could be useful to anybody. People ask what those rooms smell like, too, expecting something terrible. They smell clean. Hospital clean. That scrubbed-blank smell is to me now what rubber and sweat were to the wrestling room.</w:t>
-      </w:r>
-    </w:p>
-    <w:p>
-      <w:pPr>
-        <w:pStyle w:val="BodyText"/>
-      </w:pPr>
-      <w:r>
-        <w:t xml:space="preserve">Put one of those rooms together and it goes like this. A living room with a hospital bed where the dining table used to be. The husband’s chair has been turned to face the bed. Three grown kids: one on the couch, one standing in the kitchen doorway, one who flew in last night and hasn’t taken her coat off. The television is on with the sound down. Nobody has eaten. I introduce myself, and nobody really hears the name, because to them I’m not a name. I’m the word hospice, standing in their mother’s living room in a tie.</w:t>
-      </w:r>
-    </w:p>
-    <w:p>
-      <w:pPr>
-        <w:pStyle w:val="BodyText"/>
-      </w:pPr>
-      <w:r>
-        <w:t xml:space="preserve">The one in the doorway says it before I can sit down. We’re not ready to give up on her.</w:t>
-      </w:r>
-    </w:p>
-    <w:p>
-      <w:pPr>
-        <w:pStyle w:val="BodyText"/>
-      </w:pPr>
-      <w:r>
-        <w:t xml:space="preserve">I don’t argue. Arguing with that sentence is how you lose the room, and I’m not there to win. I sit down where the husband can see me and ask the only question I ever open with. Tell me about her. Not the diagnosis. Her.</w:t>
-      </w:r>
-    </w:p>
-    <w:p>
-      <w:pPr>
-        <w:pStyle w:val="BodyText"/>
-      </w:pPr>
-      <w:r>
-        <w:t xml:space="preserve">The room changes. The husband starts talking, and the daughter in the coat finally sits down. Somebody laughs at a thing their mother said forty years ago, and somebody else cries at the same sentence. For twenty minutes the woman in the bed is not a diagnosis. She is the reason everyone in that room exists. And somewhere in those twenty minutes, hospice stops meaning giving up and starts meaning the way her people intend to love her through what’s coming.</w:t>
-      </w:r>
-    </w:p>
-    <w:p>
-      <w:pPr>
-        <w:pStyle w:val="BodyText"/>
-      </w:pPr>
-      <w:r>
-        <w:t xml:space="preserve">They don’t sign anything that day. Sometimes they don’t. But when I stand to go, the husband walks me to the door, which costs him something with his knees, and shakes my hand at the threshold. That’s how I know. Not ready isn’t a no. It’s a doorway, and somebody has to be willing to stand in it first.</w:t>
-      </w:r>
-    </w:p>
-    <w:p>
-      <w:pPr>
-        <w:pStyle w:val="BodyText"/>
-      </w:pPr>
-      <w:r>
-        <w:t xml:space="preserve">And some rooms stay with me whole. There was a couple I’ll call Ed and Eva. Ed sold medical equipment. Eva was a respiratory therapist. Between the two of them, healthcare was not a foreign language. They knew the words, the systems, what illness looked like from the professional side. And Ed was twelve years sober, a man who had already done the hardest thing most people can imagine, one day at a time, for over a decade. Recovery had taught him how to live. It had not taught him how to let go. I sat with them near the end. He understood medicine, but medicine did not tell him how to say goodbye. She had spent her working life at other people’s bedsides, and it did not make her less human in her own. Ed loved Eva. That was never in question. Love just needed help becoming a plan: who speaks when she cannot, what comfort means now, what matters most today. The room did not feel good at the end. It wasn’t supposed to. But Ed stayed in it, and the two of them got through it together. I watched them do it.</w:t>
-      </w:r>
-    </w:p>
-    <w:p>
-      <w:pPr>
-        <w:pStyle w:val="BodyText"/>
-      </w:pPr>
-      <w:r>
-        <w:t xml:space="preserve">Lou spent eighty-four years showing up without needing to know exactly where he was going. I’m trying to do the same.</w:t>
+        <w:t xml:space="preserve">What Grief Taught the Job</w:t>
+      </w:r>
+    </w:p>
+    <w:p>
+      <w:pPr>
+        <w:pStyle w:val="BodyText"/>
+      </w:pPr>
+      <w:r>
+        <w:rPr>
+          <w:iCs/>
+          <w:i/>
+        </w:rPr>
+        <w:t xml:space="preserve">“</w:t>
+      </w:r>
+      <w:r>
+        <w:rPr>
+          <w:iCs/>
+          <w:i/>
+        </w:rPr>
+        <w:t xml:space="preserve">Weeping may endure for a night, but joy cometh in the morning.</w:t>
+      </w:r>
+      <w:r>
+        <w:rPr>
+          <w:iCs/>
+          <w:i/>
+        </w:rPr>
+        <w:t xml:space="preserve">”</w:t>
+      </w:r>
+      <w:r>
+        <w:t xml:space="preserve"> </w:t>
+      </w:r>
+      <w:r>
+        <w:rPr>
+          <w:iCs/>
+          <w:i/>
+        </w:rPr>
+        <w:t xml:space="preserve">— Psalm 30:5</w:t>
       </w:r>
     </w:p>
     <w:p>
@@ -14746,218 +14686,216 @@
           <w:bCs/>
           <w:b/>
         </w:rPr>
-        <w:t xml:space="preserve">CHAPTER 34</w:t>
-      </w:r>
-      <w:r>
-        <w:t xml:space="preserve"> </w:t>
-      </w:r>
-      <w:r>
-        <w:t xml:space="preserve">##</w:t>
-      </w:r>
-      <w:r>
-        <w:t xml:space="preserve"> </w:t>
-      </w:r>
+        <w:t xml:space="preserve">Raleigh, 2026</w:t>
+      </w:r>
+    </w:p>
+    <w:p>
+      <w:pPr>
+        <w:pStyle w:val="BodyText"/>
+      </w:pPr>
+      <w:r>
+        <w:t xml:space="preserve">Before I lost him, I was good at this job, but there was a gap in it, one I can only admit now. I would sit with a family and say the right things, nod at the right moments, and look like a man who understood exactly what they were feeling. Inside, I didn’t. I hadn’t lost the one I loved most yet. I was fluent in the words and a step removed from the weight. Losing my dad closed that gap. Now when I walk into a room where someone is losing the person they love most, I’m not performing understanding. I have it. It made me better at the work, which is a hard thing to be grateful for, and I am grateful for it anyway.</w:t>
+      </w:r>
+    </w:p>
+    <w:p>
+      <w:pPr>
+        <w:pStyle w:val="BodyText"/>
+      </w:pPr>
+      <w:r>
+        <w:t xml:space="preserve">Families would say, I’m terrified I won’t be there when it happens. What I offered was what I knew to be true: presence is cumulative. You build it in the ordinary.</w:t>
+      </w:r>
+    </w:p>
+    <w:p>
+      <w:pPr>
+        <w:pStyle w:val="BodyText"/>
+      </w:pPr>
+      <w:r>
+        <w:t xml:space="preserve">I could tell you a dozen versions of the same room. The details change. The room doesn’t. A husband answering every question directed at his wife, because he has been her voice since the diagnosis, going quiet only when I ask what he’ll do with his mornings. A daughter who flew in from three time zones away and won’t sit down, because sitting down feels like agreeing to it. A Bible on the nightstand with a rubber band around it, fat with decades of funeral programs pressed inside. And at some point, out in the hallway, the question underneath every other question: how long? What they’re really asking is how long they have to say the thing they’ve been saving. I used to point them to the nurses and the ranges. Now I answer the real question. Don’t wait.</w:t>
+      </w:r>
+    </w:p>
+    <w:p>
+      <w:pPr>
+        <w:pStyle w:val="BodyText"/>
+      </w:pPr>
+      <w:r>
+        <w:t xml:space="preserve">The mechanics of it are simple. The first thing I do in any room is pull a chair up close. I remember an older woman with one framed photograph beside her bed, her daughter, a whole life narrowed down to the one face she wanted near her. I remember a man who told me his single regret, and there was nothing material in it. Nobody at the end talks about the things they bought. He wished he had traveled outside the country, just once. That was the whole confession. A woman with dementia once asked me to go to prom with her. People ask how I can stand this work. Some days the work asks you to prom. And once, after my father died, I sat with a man who reminded me so much of Lou that when he passed I had to step out of the room and stand there awhile before I could be useful to anybody. People ask what those rooms smell like, too, expecting something terrible. They smell clean. Hospital clean. That scrubbed-blank smell is to me now what rubber and sweat were to the wrestling room.</w:t>
+      </w:r>
+    </w:p>
+    <w:p>
+      <w:pPr>
+        <w:pStyle w:val="BodyText"/>
+      </w:pPr>
+      <w:r>
+        <w:t xml:space="preserve">Put one of those rooms together and it goes like this. A living room with a hospital bed where the dining table used to be. The husband’s chair has been turned to face the bed. Three grown kids: one on the couch, one standing in the kitchen doorway, one who flew in last night and hasn’t taken her coat off. The television is on with the sound down. Nobody has eaten. I introduce myself, and nobody really hears the name, because to them I’m not a name. I’m the word hospice, standing in their mother’s living room in a tie.</w:t>
+      </w:r>
+    </w:p>
+    <w:p>
+      <w:pPr>
+        <w:pStyle w:val="BodyText"/>
+      </w:pPr>
+      <w:r>
+        <w:t xml:space="preserve">The one in the doorway says it before I can sit down. We’re not ready to give up on her.</w:t>
+      </w:r>
+    </w:p>
+    <w:p>
+      <w:pPr>
+        <w:pStyle w:val="BodyText"/>
+      </w:pPr>
+      <w:r>
+        <w:t xml:space="preserve">I don’t argue. Arguing with that sentence is how you lose the room, and I’m not there to win. I sit down where the husband can see me and ask the only question I ever open with. Tell me about her. Not the diagnosis. Her.</w:t>
+      </w:r>
+    </w:p>
+    <w:p>
+      <w:pPr>
+        <w:pStyle w:val="BodyText"/>
+      </w:pPr>
+      <w:r>
+        <w:t xml:space="preserve">The room changes. The husband starts talking, and the daughter in the coat finally sits down. Somebody laughs at a thing their mother said forty years ago, and somebody else cries at the same sentence. For twenty minutes the woman in the bed is not a diagnosis. She is the reason everyone in that room exists. And somewhere in those twenty minutes, hospice stops meaning giving up and starts meaning the way her people intend to love her through what’s coming.</w:t>
+      </w:r>
+    </w:p>
+    <w:p>
+      <w:pPr>
+        <w:pStyle w:val="BodyText"/>
+      </w:pPr>
+      <w:r>
+        <w:t xml:space="preserve">They don’t sign anything that day. Sometimes they don’t. But when I stand to go, the husband walks me to the door, which costs him something with his knees, and shakes my hand at the threshold. That’s how I know. Not ready isn’t a no. It’s a doorway, and somebody has to be willing to stand in it first.</w:t>
+      </w:r>
+    </w:p>
+    <w:p>
+      <w:pPr>
+        <w:pStyle w:val="BodyText"/>
+      </w:pPr>
+      <w:r>
+        <w:t xml:space="preserve">And some rooms stay with me whole. There was a couple I’ll call Ed and Eva. Ed sold medical equipment. Eva was a respiratory therapist. Between the two of them, healthcare was not a foreign language. They knew the words, the systems, what illness looked like from the professional side. And Ed was twelve years sober, a man who had already done the hardest thing most people can imagine, one day at a time, for over a decade. Recovery had taught him how to live. It had not taught him how to let go. I sat with them near the end. He understood medicine, but medicine did not tell him how to say goodbye. She had spent her working life at other people’s bedsides, and it did not make her less human in her own. Ed loved Eva. That was never in question. Love just needed help becoming a plan: who speaks when she cannot, what comfort means now, what matters most today. The room did not feel good at the end. It wasn’t supposed to. But Ed stayed in it, and the two of them got through it together. I watched them do it.</w:t>
+      </w:r>
+    </w:p>
+    <w:p>
+      <w:pPr>
+        <w:pStyle w:val="BodyText"/>
+      </w:pPr>
+      <w:r>
+        <w:t xml:space="preserve">Lou spent eighty-four years showing up without needing to know exactly where he was going. I’m trying to do the same.</w:t>
+      </w:r>
+    </w:p>
+    <w:p>
+      <w:pPr>
+        <w:pStyle w:val="BodyText"/>
+      </w:pPr>
       <w:r>
         <w:rPr>
           <w:bCs/>
           <w:b/>
         </w:rPr>
-        <w:t xml:space="preserve">The Table</w:t>
-      </w:r>
-    </w:p>
-    <w:p>
-      <w:pPr>
-        <w:pStyle w:val="BodyText"/>
-      </w:pPr>
-      <w:r>
-        <w:rPr>
-          <w:iCs/>
-          <w:i/>
-        </w:rPr>
-        <w:t xml:space="preserve">“</w:t>
-      </w:r>
-      <w:r>
-        <w:rPr>
-          <w:iCs/>
-          <w:i/>
-        </w:rPr>
-        <w:t xml:space="preserve">Thou preparest a table before me in the presence of mine enemies.</w:t>
-      </w:r>
-      <w:r>
-        <w:rPr>
-          <w:iCs/>
-          <w:i/>
-        </w:rPr>
-        <w:t xml:space="preserve">”</w:t>
-      </w:r>
-      <w:r>
-        <w:t xml:space="preserve"> </w:t>
-      </w:r>
-      <w:r>
-        <w:rPr>
-          <w:iCs/>
-          <w:i/>
-        </w:rPr>
-        <w:t xml:space="preserve">— Psalm 23:5</w:t>
-      </w:r>
-    </w:p>
-    <w:p>
-      <w:pPr>
-        <w:pStyle w:val="BodyText"/>
-      </w:pPr>
+        <w:t xml:space="preserve">CHAPTER 34</w:t>
+      </w:r>
+      <w:r>
+        <w:t xml:space="preserve"> </w:t>
+      </w:r>
+      <w:r>
+        <w:t xml:space="preserve">##</w:t>
+      </w:r>
+      <w:r>
+        <w:t xml:space="preserve"> </w:t>
+      </w:r>
       <w:r>
         <w:rPr>
           <w:bCs/>
           <w:b/>
         </w:rPr>
-        <w:t xml:space="preserve">Raleigh, January 2026</w:t>
-      </w:r>
-    </w:p>
-    <w:p>
-      <w:pPr>
-        <w:pStyle w:val="BodyText"/>
-      </w:pPr>
-      <w:r>
-        <w:t xml:space="preserve">A few days after we buried my father, grief caught me somewhere I didn’t expect it.</w:t>
-      </w:r>
-    </w:p>
-    <w:p>
-      <w:pPr>
-        <w:pStyle w:val="BodyText"/>
-      </w:pPr>
-      <w:r>
-        <w:t xml:space="preserve">That morning I walked into one of the assisted-living communities I call on for a routine visit. Linda was at the round table near the nurses’ station. She’d been a nurse a long time. You could see it in how she carried herself. Compassionate, but not someone who let everybody in. A steadiness I recognized. We started talking. She was from the Buffalo area, upstate New York. We joked. It felt easy in a way things hadn’t in days.</w:t>
-      </w:r>
-    </w:p>
-    <w:p>
-      <w:pPr>
-        <w:pStyle w:val="BodyText"/>
-      </w:pPr>
-      <w:r>
-        <w:t xml:space="preserve">Then I told her we had buried my dad on Saturday. Her face changed. She just sat there with me. And I let myself go. I wouldn’t call it a breakdown, but I cried at that table, that raw, in front of someone I barely knew, and I don’t know whether you’re supposed to cry in front of a nurse you just met at a facility you’re calling on for work. But in that moment I felt something I can only call spiritual, a sense that God had put this person in my path. Not for referrals or business. For this.</w:t>
-      </w:r>
-    </w:p>
-    <w:p>
-      <w:pPr>
-        <w:pStyle w:val="BodyText"/>
-      </w:pPr>
-      <w:r>
-        <w:t xml:space="preserve">Two people at a round table, one of them grieving and the other choosing to stay in the room for it. We hugged. I gave her a kiss on the cheek. From that day on I’ve looked forward to the days I get to see Linda. For the person, not the place. The other staff joke about it, oh, you always come in and kiss Linda on the cheek. They don’t know the background, don’t know what was shared at that table the Wednesday after we buried my father. That’s fine. Not every connection needs an audience. As a rep, I’m the one who’s supposed to bring the chocolate and the goodies. When I go see Linda, I’m the one who feels taken care of. She gives me cookies. She checks in. The relationship runs backwards from the job description.</w:t>
-      </w:r>
-    </w:p>
-    <w:bookmarkEnd w:id="56"/>
-    <w:bookmarkStart w:id="57" w:name="lisas-table"/>
-    <w:p>
-      <w:pPr>
-        <w:pStyle w:val="Heading3"/>
-      </w:pPr>
-      <w:r>
-        <w:rPr>
-          <w:iCs/>
-          <w:i/>
-        </w:rPr>
-        <w:t xml:space="preserve">Lisa’s Table</w:t>
-      </w:r>
-    </w:p>
-    <w:p>
-      <w:pPr>
-        <w:pStyle w:val="FirstParagraph"/>
-      </w:pPr>
-      <w:r>
-        <w:t xml:space="preserve">My father was the gravity that held the family together. When he died, that gravity went with him, and I waited for everything to fly apart. We haven’t. The reason is my sister Lisa, and a table she has been setting for as long as I can remember.</w:t>
-      </w:r>
-    </w:p>
-    <w:p>
-      <w:pPr>
-        <w:pStyle w:val="BodyText"/>
-      </w:pPr>
-      <w:r>
-        <w:t xml:space="preserve">A stranger had set a place for me at one table. There was another, older one waiting back home. Lisa has Thanksgiving at her house every year. Every year. She sets the table, cooks the meal, opens the door, the way my nana did it, same recipes, same dishes. There’s a stubbornness required to keep a tradition alive when the person who started it is gone.</w:t>
-      </w:r>
-    </w:p>
-    <w:p>
-      <w:pPr>
-        <w:pStyle w:val="BodyText"/>
-      </w:pPr>
-      <w:r>
-        <w:t xml:space="preserve">Hope and I can’t make it every year. We come from two divorced families, and splitting the holidays is brutal. But the table is always there.</w:t>
-      </w:r>
-    </w:p>
-    <w:p>
-      <w:pPr>
-        <w:pStyle w:val="BodyText"/>
-      </w:pPr>
-      <w:r>
-        <w:t xml:space="preserve">That table has seen every version of me. For years, in active addiction, I’d show up to Thanksgiving and end up passed out on her couch, dead to the world, sprawled across the whole thing so nobody else could lie down. It turned into a running joke that outlived the using, get to the couch before Rob does. Lisa never shamed me for it. She set a plate for the worst version of me, no lecture, just a place at the table and a couch I’d hog. In those years there weren’t many people left in my corner. She was one of them. I’ve been back plenty of sober years since, no passing out, but the joke stuck.</w:t>
-      </w:r>
-    </w:p>
-    <w:p>
-      <w:pPr>
-        <w:pStyle w:val="BodyText"/>
-      </w:pPr>
-      <w:r>
-        <w:t xml:space="preserve">And every year there was the Turkey Bowl, Auburn against Alabama, her house split right down the middle, a room full of people who loved each other hollering at the same screen for opposite reasons. That was the table too.</w:t>
-      </w:r>
-    </w:p>
-    <w:p>
-      <w:pPr>
-        <w:pStyle w:val="BodyText"/>
-      </w:pPr>
-      <w:r>
-        <w:t xml:space="preserve">It wasn’t only Lisa’s table. In our family, nobody said love out loud. They cooked it. My mother outside the weigh-ins with Wendy’s chicken sandwiches the second I made weight. Nancey in Boca Raton, keeping whipped cream in the house because banana cream pie was my favorite, making me chicken parm for no occasion at all, feeding a nephew who’d shown up at her door with nowhere better to go and not asking him anything a pie couldn’t answer. I have eaten my way back to belonging at more tables than I can count, and not one of them ever handed me a bill.</w:t>
-      </w:r>
-    </w:p>
-    <w:p>
-      <w:pPr>
-        <w:pStyle w:val="BodyText"/>
-      </w:pPr>
-      <w:r>
-        <w:t xml:space="preserve">The first Thanksgiving without him hasn’t come yet. When it does, I know whose house it will be at, and I know the table will be set.</w:t>
-      </w:r>
-    </w:p>
-    <w:p>
-      <w:pPr>
-        <w:pStyle w:val="BodyText"/>
-      </w:pPr>
-      <w:r>
-        <w:t xml:space="preserve">I think about a night long ago when she cooked meatloaf for two boys who didn’t make it easy. She’s still standing at the counter. Still opening the door. The last time I was there for Thanksgiving, my father was still alive. I stood in her kitchen a minute before we sat down. I didn’t say anything. I just watched. We sat down. Someone said grace. The food was passed. And for a few hours everything had a center. Lisa made sure of that.</w:t>
-      </w:r>
-    </w:p>
-    <w:bookmarkEnd w:id="57"/>
-    <w:bookmarkStart w:id="58" w:name="the-floor"/>
-    <w:p>
-      <w:pPr>
-        <w:pStyle w:val="Heading3"/>
-      </w:pPr>
-      <w:r>
-        <w:rPr>
-          <w:iCs/>
-          <w:i/>
-        </w:rPr>
-        <w:t xml:space="preserve">The Floor</w:t>
-      </w:r>
-    </w:p>
-    <w:p>
-      <w:pPr>
-        <w:pStyle w:val="FirstParagraph"/>
-      </w:pPr>
-      <w:r>
-        <w:t xml:space="preserve">Almost every morning for fifteen years, my phone has rung early and it’s Mager, or I’ve called him first, and we pray. A few plain sentences to start the day pointed the right way. Nothing eloquent. Two sober men on a phone line, saying thank you, asking for help, hanging up, going to work. People ask me where God was in all of it, and the honest answer is that He was never the one who left. I was. I still can’t explain God on paper, and I’ve stopped trying. What I can tell you is that every time I hit the bottom of myself, something I had not put there was holding the floor. Today my faith doesn’t look like certainty. It looks like that morning call. Walking into a dying stranger’s room with nothing useful in my hands and trusting that presence is its own kind of prayer. I stopped needing the theology airtight. I just needed to stay in the room, and to let myself be shown up for. That, as much as anything, is what got me here.</w:t>
-      </w:r>
-    </w:p>
-    <w:bookmarkEnd w:id="58"/>
-    <w:bookmarkEnd w:id="59"/>
-    <w:bookmarkStart w:id="60" w:name="epilogue-the-cardinals-promise"/>
-    <w:p>
-      <w:pPr>
-        <w:pStyle w:val="Heading1"/>
+        <w:t xml:space="preserve">The Table</w:t>
+      </w:r>
+    </w:p>
+    <w:p>
+      <w:pPr>
+        <w:pStyle w:val="BodyText"/>
+      </w:pPr>
+      <w:r>
+        <w:rPr>
+          <w:iCs/>
+          <w:i/>
+        </w:rPr>
+        <w:t xml:space="preserve">“</w:t>
+      </w:r>
+      <w:r>
+        <w:rPr>
+          <w:iCs/>
+          <w:i/>
+        </w:rPr>
+        <w:t xml:space="preserve">Thou preparest a table before me in the presence of mine enemies.</w:t>
+      </w:r>
+      <w:r>
+        <w:rPr>
+          <w:iCs/>
+          <w:i/>
+        </w:rPr>
+        <w:t xml:space="preserve">”</w:t>
+      </w:r>
+      <w:r>
+        <w:t xml:space="preserve"> </w:t>
+      </w:r>
+      <w:r>
+        <w:rPr>
+          <w:iCs/>
+          <w:i/>
+        </w:rPr>
+        <w:t xml:space="preserve">— Psalm 23:5</w:t>
+      </w:r>
+    </w:p>
+    <w:p>
+      <w:pPr>
+        <w:pStyle w:val="BodyText"/>
       </w:pPr>
       <w:r>
         <w:rPr>
           <w:bCs/>
           <w:b/>
         </w:rPr>
-        <w:t xml:space="preserve">EPILOGUE: THE CARDINAL’S PROMISE</w:t>
+        <w:t xml:space="preserve">Raleigh, January 2026</w:t>
+      </w:r>
+    </w:p>
+    <w:p>
+      <w:pPr>
+        <w:pStyle w:val="BodyText"/>
+      </w:pPr>
+      <w:r>
+        <w:t xml:space="preserve">A few days after we buried my father, grief caught me somewhere I didn’t expect it.</w:t>
+      </w:r>
+    </w:p>
+    <w:p>
+      <w:pPr>
+        <w:pStyle w:val="BodyText"/>
+      </w:pPr>
+      <w:r>
+        <w:t xml:space="preserve">One morning that week I walked into one of the assisted-living communities I call on for a routine visit. Linda was at the round table near the nurses’ station. She’d been a nurse a long time. You could see it in how she carried herself. Compassionate, but not someone who let everybody in. A steadiness I recognized. We started talking. She was from the Buffalo area, upstate New York. We joked. It felt easy in a way things hadn’t in days.</w:t>
+      </w:r>
+    </w:p>
+    <w:p>
+      <w:pPr>
+        <w:pStyle w:val="BodyText"/>
+      </w:pPr>
+      <w:r>
+        <w:t xml:space="preserve">Then I told her we had buried my dad on Saturday. Her face changed. She just sat there with me. And I let myself go. I wouldn’t call it a breakdown, but I cried at that table, that raw, in front of someone I barely knew, and I don’t know whether you’re supposed to cry in front of a nurse you just met at a facility you’re calling on for work. But in that moment I felt something I can only call spiritual, a sense that God had put this person in my path. Not for referrals or business. For this.</w:t>
+      </w:r>
+    </w:p>
+    <w:p>
+      <w:pPr>
+        <w:pStyle w:val="BodyText"/>
+      </w:pPr>
+      <w:r>
+        <w:t xml:space="preserve">Two people at a round table, one of them grieving and the other choosing to stay in the room for it. We hugged. I gave her a kiss on the cheek. From that day on I’ve looked forward to the days I get to see Linda. For the person, not the place. The other staff joke about it, oh, you always come in and kiss Linda on the cheek. They don’t know the background, don’t know what was shared at that table the Wednesday after we buried my father. That’s fine. Not every connection needs an audience. As a rep, I’m the one who’s supposed to bring the chocolate and the goodies. When I go see Linda, I’m the one who feels taken care of. She gives me cookies. She checks in. The relationship runs backwards from the job description.</w:t>
+      </w:r>
+    </w:p>
+    <w:bookmarkStart w:id="58" w:name="lisas-table"/>
+    <w:p>
+      <w:pPr>
+        <w:pStyle w:val="Heading3"/>
+      </w:pPr>
+      <w:r>
+        <w:rPr>
+          <w:iCs/>
+          <w:i/>
+        </w:rPr>
+        <w:t xml:space="preserve">Lisa’s Table</w:t>
       </w:r>
     </w:p>
     <w:p>
@@ -14965,155 +14903,90 @@
         <w:pStyle w:val="FirstParagraph"/>
       </w:pPr>
       <w:r>
-        <w:rPr>
-          <w:iCs/>
-          <w:i/>
-        </w:rPr>
-        <w:t xml:space="preserve">“</w:t>
-      </w:r>
-      <w:r>
-        <w:rPr>
-          <w:iCs/>
-          <w:i/>
-        </w:rPr>
-        <w:t xml:space="preserve">You will surely meet some of us as you trudge the Road of Happy Destiny.</w:t>
-      </w:r>
-      <w:r>
-        <w:rPr>
-          <w:iCs/>
-          <w:i/>
-        </w:rPr>
-        <w:t xml:space="preserve">”</w:t>
-      </w:r>
-      <w:r>
-        <w:t xml:space="preserve"> </w:t>
-      </w:r>
-      <w:r>
-        <w:rPr>
-          <w:iCs/>
-          <w:i/>
-        </w:rPr>
-        <w:t xml:space="preserve">— Bill Wilson, Alcoholics Anonymous</w:t>
-      </w:r>
-    </w:p>
-    <w:p>
-      <w:pPr>
-        <w:pStyle w:val="BodyText"/>
-      </w:pPr>
-      <w:r>
-        <w:t xml:space="preserve">A cardinal lands on the driver’s side mirror of my car.</w:t>
-      </w:r>
-    </w:p>
-    <w:p>
-      <w:pPr>
-        <w:pStyle w:val="BodyText"/>
-      </w:pPr>
-      <w:r>
-        <w:t xml:space="preserve">Close. So close I can see individual feathers. It looks at me through the glass like it arrived with a purpose and is content to wait. It doesn’t move. Bright red against the gray.</w:t>
-      </w:r>
-    </w:p>
-    <w:p>
-      <w:pPr>
-        <w:pStyle w:val="BodyText"/>
-      </w:pPr>
-      <w:r>
-        <w:t xml:space="preserve">Let me tell you how I got to this parking lot.</w:t>
-      </w:r>
-    </w:p>
-    <w:p>
-      <w:pPr>
-        <w:pStyle w:val="BodyText"/>
-      </w:pPr>
-      <w:r>
-        <w:t xml:space="preserve">January 9, 2026. Seventeen years sober to the day, and fifteen days after my father died. I’m in my car in the parking lot of a skilled nursing facility in Raleigh, coffee in my hand, just out of a visit with a family still deciding whether to start hospice for their mother. I’d sat with them, answered their questions, stayed until the staying was done. A gray January morning, the coffee going cold, the space between one call and the next.</w:t>
-      </w:r>
-    </w:p>
-    <w:p>
-      <w:pPr>
-        <w:pStyle w:val="BodyText"/>
-      </w:pPr>
-      <w:r>
-        <w:t xml:space="preserve">And then it lands, the cardinal, on the mirror, close enough to touch through the glass.</w:t>
-      </w:r>
-    </w:p>
-    <w:p>
-      <w:pPr>
-        <w:pStyle w:val="BodyText"/>
-      </w:pPr>
-      <w:r>
-        <w:t xml:space="preserve">Seventeen years from West Palm Beach, from the apartment with the blinds drawn and the extension cord running to the hallway, from the morning I opened the door and found Lou standing there. Seventeen, the age I was when I won the county championship. He’d been in the third row that day. He was always in the third row.</w:t>
-      </w:r>
-    </w:p>
-    <w:p>
-      <w:pPr>
-        <w:pStyle w:val="BodyText"/>
-      </w:pPr>
-      <w:r>
-        <w:t xml:space="preserve">My father always made a big deal of my sobriety anniversary. Every January 9. My first year, he came to Gulf Breeze Hospital to hear me speak, sat in that room and listened to his son talk about staying sober for one year. He told me once, quietly, that whenever he mentioned my name to someone who knew me, they’d say the same thing:</w:t>
-      </w:r>
-      <w:r>
-        <w:t xml:space="preserve"> </w:t>
-      </w:r>
-      <w:r>
-        <w:t xml:space="preserve">“</w:t>
-      </w:r>
-      <w:r>
-        <w:t xml:space="preserve">He’s the best.</w:t>
-      </w:r>
-      <w:r>
-        <w:t xml:space="preserve">”</w:t>
-      </w:r>
-    </w:p>
-    <w:p>
-      <w:pPr>
-        <w:pStyle w:val="BodyText"/>
-      </w:pPr>
-      <w:r>
-        <w:t xml:space="preserve">The last time a cardinal landed on something I was riding in, he was at the wheel of a U-Haul and I was in no shape to notice. Grandma’s looking out for us. He’d said it the way he said most true things, lightly, and moved on.</w:t>
-      </w:r>
-    </w:p>
-    <w:p>
-      <w:pPr>
-        <w:pStyle w:val="BodyText"/>
-      </w:pPr>
-      <w:r>
-        <w:t xml:space="preserve">Dad, I say out loud. Alone in the car. Just his name. And then the words he and I mostly lived instead of spoke. I love you. Not because it went unsaid between us — it didn’t. Before the end he’d looked at me and told me, Rob, don’t worry about me. We’re good. When my father said we’re good, that was the whole of it: I love you, and I have closure with you. He never needed the sentence. But you don’t run out of wanting to say it to a man you can’t call anymore. I love you. The cardinal doesn’t move. Dad, I love you. I know you’re watching out for me.</w:t>
-      </w:r>
-    </w:p>
-    <w:p>
-      <w:pPr>
-        <w:pStyle w:val="BodyText"/>
-      </w:pPr>
-      <w:r>
-        <w:t xml:space="preserve">It sits there. Turns its head slightly. Still looking. I don’t know how long we stay like that. The parking lot goes away. Just me and the cardinal. Just me and Lou. Tears running down my face, not sobbing, the kind that comes from grief and relief colliding. Dad is gone. Dad is here.</w:t>
-      </w:r>
-    </w:p>
-    <w:p>
-      <w:pPr>
-        <w:pStyle w:val="BodyText"/>
-      </w:pPr>
-      <w:r>
-        <w:t xml:space="preserve">I pull out my phone, slow and careful. I think I’m recording video. I press the button. The cardinal sits. Two minutes, maybe less, maybe more. Finally I say, Dad, I have to go. And it flies, not startled, not sudden. Lifts off the mirror to a nearby tree, sits a moment, then is gone.</w:t>
-      </w:r>
-    </w:p>
-    <w:p>
-      <w:pPr>
-        <w:pStyle w:val="BodyText"/>
-      </w:pPr>
-      <w:r>
-        <w:t xml:space="preserve">I stand in the parking lot, phone in my hand, tears on my face, and feel peace. Not the absence of grief. Grief is still there, always will be. But peace underneath it. I look at my phone. The camera had been in photo mode. One picture. The cardinal on the mirror. I send it to Hope. To Chris. To Jon, Lisa, Joel. To Donna. The text: Dad came to see me. I told him I loved him.</w:t>
-      </w:r>
-    </w:p>
-    <w:p>
-      <w:pPr>
-        <w:pStyle w:val="BodyText"/>
-      </w:pPr>
-      <w:r>
-        <w:t xml:space="preserve">It has never landed on my car again.</w:t>
-      </w:r>
-    </w:p>
+        <w:t xml:space="preserve">My father was the gravity that held the family together. When he died, that gravity went with him, and I waited for everything to fly apart. We haven’t. The reason is my sister Lisa, and a table she has been setting for as long as I can remember.</w:t>
+      </w:r>
+    </w:p>
+    <w:p>
+      <w:pPr>
+        <w:pStyle w:val="BodyText"/>
+      </w:pPr>
+      <w:r>
+        <w:t xml:space="preserve">A stranger had set a place for me at one table. There was another, older one waiting back home. Lisa has Thanksgiving at her house every year. Every year. She sets the table, cooks the meal, opens the door, the way my nana did it, same recipes, same dishes. There’s a stubbornness required to keep a tradition alive when the person who started it is gone.</w:t>
+      </w:r>
+    </w:p>
+    <w:p>
+      <w:pPr>
+        <w:pStyle w:val="BodyText"/>
+      </w:pPr>
+      <w:r>
+        <w:t xml:space="preserve">Hope and I can’t make it every year. We come from two divorced families, and splitting the holidays is brutal. But the table is always there.</w:t>
+      </w:r>
+    </w:p>
+    <w:p>
+      <w:pPr>
+        <w:pStyle w:val="BodyText"/>
+      </w:pPr>
+      <w:r>
+        <w:t xml:space="preserve">That table has seen every version of me. For years, in active addiction, I’d show up to Thanksgiving and end up passed out on her couch, dead to the world, sprawled across the whole thing so nobody else could lie down. It turned into a running joke that outlived the using, get to the couch before Rob does. Lisa never shamed me for it. She set a plate for the worst version of me, no lecture, just a place at the table and a couch I’d hog. In those years there weren’t many people left in my corner. She was one of them. I’ve been back plenty of sober years since, no passing out, but the joke stuck.</w:t>
+      </w:r>
+    </w:p>
+    <w:p>
+      <w:pPr>
+        <w:pStyle w:val="BodyText"/>
+      </w:pPr>
+      <w:r>
+        <w:t xml:space="preserve">And every year there was the Turkey Bowl, Auburn against Alabama, her house split right down the middle, a room full of people who loved each other hollering at the same screen for opposite reasons. That was the table too.</w:t>
+      </w:r>
+    </w:p>
+    <w:p>
+      <w:pPr>
+        <w:pStyle w:val="BodyText"/>
+      </w:pPr>
+      <w:r>
+        <w:t xml:space="preserve">It wasn’t only Lisa’s table. In our family, nobody said love out loud. They cooked it. My mother outside the weigh-ins with Wendy’s chicken sandwiches the second I made weight. Nancey in Boca Raton, keeping whipped cream in the house because banana cream pie was my favorite, making me chicken parm for no occasion at all, feeding a nephew who’d shown up at her door with nowhere better to go and not asking him anything a pie couldn’t answer. I have eaten my way back to belonging at more tables than I can count, and not one of them ever handed me a bill.</w:t>
+      </w:r>
+    </w:p>
+    <w:p>
+      <w:pPr>
+        <w:pStyle w:val="BodyText"/>
+      </w:pPr>
+      <w:r>
+        <w:t xml:space="preserve">The first Thanksgiving without him hasn’t come yet. When it does, I know whose house it will be at, and I know the table will be set.</w:t>
+      </w:r>
+    </w:p>
+    <w:p>
+      <w:pPr>
+        <w:pStyle w:val="BodyText"/>
+      </w:pPr>
+      <w:r>
+        <w:t xml:space="preserve">I think about a night long ago when she cooked meatloaf for two boys who didn’t make it easy. She’s still standing at the counter. Still opening the door. The last time I was there for Thanksgiving, my father was still alive. I stood in her kitchen a minute before we sat down. I didn’t say anything. I just watched. We sat down. Someone said grace. The food was passed. And for a few hours everything had a center. Lisa made sure of that.</w:t>
+      </w:r>
+    </w:p>
+    <w:bookmarkEnd w:id="58"/>
+    <w:bookmarkStart w:id="59" w:name="the-floor"/>
+    <w:p>
+      <w:pPr>
+        <w:pStyle w:val="Heading3"/>
+      </w:pPr>
+      <w:r>
+        <w:rPr>
+          <w:iCs/>
+          <w:i/>
+        </w:rPr>
+        <w:t xml:space="preserve">The Floor</w:t>
+      </w:r>
+    </w:p>
+    <w:p>
+      <w:pPr>
+        <w:pStyle w:val="FirstParagraph"/>
+      </w:pPr>
+      <w:r>
+        <w:t xml:space="preserve">Almost every morning for fifteen years, my phone has rung early and it’s Mager, or I’ve called him first, and we pray. A few plain sentences to start the day pointed the right way. Nothing eloquent. Two sober men on a phone line, saying thank you, asking for help, hanging up, going to work. People ask me where God was in all of it, and the honest answer is that He was never the one who left. I was. I still can’t explain God on paper, and I’ve stopped trying. What I can tell you is that every time I hit the bottom of myself, something I had not put there was holding the floor. Today my faith doesn’t look like certainty. It looks like that morning call. Walking into a dying stranger’s room with nothing useful in my hands and trusting that presence is its own kind of prayer. I stopped needing the theology airtight. I just needed to stay in the room, and to let myself be shown up for. That, as much as anything, is what got me here.</w:t>
+      </w:r>
+    </w:p>
+    <w:bookmarkEnd w:id="59"/>
     <w:bookmarkEnd w:id="60"/>
-    <w:bookmarkStart w:id="61" w:name="the-rooms"/>
+    <w:bookmarkStart w:id="61" w:name="epilogue-the-cardinals-promise"/>
     <w:p>
       <w:pPr>
         <w:pStyle w:val="Heading1"/>
@@ -15123,7 +14996,7 @@
           <w:bCs/>
           <w:b/>
         </w:rPr>
-        <w:t xml:space="preserve">THE ROOMS</w:t>
+        <w:t xml:space="preserve">EPILOGUE: THE CARDINAL’S PROMISE</w:t>
       </w:r>
     </w:p>
     <w:p>
@@ -15135,99 +15008,151 @@
           <w:iCs/>
           <w:i/>
         </w:rPr>
-        <w:t xml:space="preserve">For Dale Perkins, and for Cardascia</w:t>
-      </w:r>
-    </w:p>
-    <w:p>
-      <w:pPr>
-        <w:pStyle w:val="BodyText"/>
-      </w:pPr>
-      <w:r>
-        <w:t xml:space="preserve">When I moved out of my father’s house I needed somewhere to live where I could still save. Dale Perkins rented me a room for five hundred a month, utilities included. That was the whole arrangement, and it explains nothing about what came after.</w:t>
-      </w:r>
-    </w:p>
-    <w:p>
-      <w:pPr>
-        <w:pStyle w:val="BodyText"/>
-      </w:pPr>
-      <w:r>
-        <w:t xml:space="preserve">Dale is a licensed clinical therapist and an alcoholic, and he is the least judgmental man I have ever met. He was built to do that job. Nothing I brought him made him flinch. I lived in that house about three years, until the Mirador. We fished. We went to meetings. We watched</w:t>
-      </w:r>
-      <w:r>
-        <w:t xml:space="preserve"> </w:t>
-      </w:r>
-      <w:r>
-        <w:rPr>
-          <w:iCs/>
-          <w:i/>
-        </w:rPr>
-        <w:t xml:space="preserve">The Walking Dead</w:t>
-      </w:r>
-      <w:r>
-        <w:t xml:space="preserve"> </w:t>
-      </w:r>
-      <w:r>
-        <w:t xml:space="preserve">like it was appointment television.</w:t>
-      </w:r>
-    </w:p>
-    <w:p>
-      <w:pPr>
-        <w:pStyle w:val="BodyText"/>
-      </w:pPr>
-      <w:r>
-        <w:t xml:space="preserve">Back in 2011 he had a cough that wouldn’t quit. They told him it was allergies.</w:t>
-      </w:r>
-    </w:p>
-    <w:p>
-      <w:pPr>
-        <w:pStyle w:val="BodyText"/>
-      </w:pPr>
-      <w:r>
-        <w:t xml:space="preserve">As I was finishing this book, I got the call. Dale is on hospice with mesothelioma, and they don’t think he has a month. It knocked me down, and not because of what he did for me. Because of who he is.</w:t>
-      </w:r>
-    </w:p>
-    <w:p>
-      <w:pPr>
-        <w:pStyle w:val="BodyText"/>
-      </w:pPr>
-      <w:r>
-        <w:t xml:space="preserve">I called him. I cried, and I told him I loved him, and he said it back.</w:t>
-      </w:r>
-    </w:p>
-    <w:p>
-      <w:pPr>
-        <w:pStyle w:val="BodyText"/>
-      </w:pPr>
-      <w:r>
-        <w:t xml:space="preserve">There’s another seat in those rooms. Cardascia and I had been friends since we were seventeen years old. He lost his fight with addiction in 2025. He never quit trying, and that’s the part I won’t let anyone forget. The disease tells you a man who goes back out is a failure. The rooms know better. He kept walking back in, every time, wanting to stop. That’s not weakness. That’s a fighter losing to something that kills fighters.</w:t>
-      </w:r>
-    </w:p>
-    <w:p>
-      <w:pPr>
-        <w:pStyle w:val="BodyText"/>
-      </w:pPr>
-      <w:r>
-        <w:t xml:space="preserve">I’m seventeen years sober and I’m not one bit safer than he was. None of us are. The only difference between his seat and mine is one day at a time.</w:t>
-      </w:r>
-    </w:p>
-    <w:p>
-      <w:pPr>
-        <w:pStyle w:val="BodyText"/>
-      </w:pPr>
-      <w:r>
-        <w:t xml:space="preserve">One chair is empty and one won’t be for long, and the only thing any of us can do about either is what the two of them did: show up. Go to a meeting this week, even if you’re good. Especially if you’re not. Call somebody. If today’s got you scared, say it out loud to one of us. That’s what the rooms are for. If you’re the one in the fight and nobody is coming for you: the rooms are full of men like Lou. Mine found me there. Walk in and let yours find you.</w:t>
-      </w:r>
-    </w:p>
-    <w:p>
-      <w:pPr>
-        <w:pStyle w:val="BodyText"/>
-      </w:pPr>
-      <w:r>
-        <w:t xml:space="preserve">Rest easy, Cardascia. We’ll keep the seat warm and the coffee bad.</w:t>
+        <w:t xml:space="preserve">“</w:t>
+      </w:r>
+      <w:r>
+        <w:rPr>
+          <w:iCs/>
+          <w:i/>
+        </w:rPr>
+        <w:t xml:space="preserve">You will surely meet some of us as you trudge the Road of Happy Destiny.</w:t>
+      </w:r>
+      <w:r>
+        <w:rPr>
+          <w:iCs/>
+          <w:i/>
+        </w:rPr>
+        <w:t xml:space="preserve">”</w:t>
+      </w:r>
+      <w:r>
+        <w:t xml:space="preserve"> </w:t>
+      </w:r>
+      <w:r>
+        <w:rPr>
+          <w:iCs/>
+          <w:i/>
+        </w:rPr>
+        <w:t xml:space="preserve">— Bill Wilson, Alcoholics Anonymous</w:t>
+      </w:r>
+    </w:p>
+    <w:p>
+      <w:pPr>
+        <w:pStyle w:val="BodyText"/>
+      </w:pPr>
+      <w:r>
+        <w:t xml:space="preserve">A cardinal lands on the driver’s side mirror of my car.</w:t>
+      </w:r>
+    </w:p>
+    <w:p>
+      <w:pPr>
+        <w:pStyle w:val="BodyText"/>
+      </w:pPr>
+      <w:r>
+        <w:t xml:space="preserve">Close. So close I can see individual feathers. It looks at me through the glass like it arrived with a purpose and is content to wait. It doesn’t move. Bright red against the gray.</w:t>
+      </w:r>
+    </w:p>
+    <w:p>
+      <w:pPr>
+        <w:pStyle w:val="BodyText"/>
+      </w:pPr>
+      <w:r>
+        <w:t xml:space="preserve">Let me tell you how I got to this parking lot.</w:t>
+      </w:r>
+    </w:p>
+    <w:p>
+      <w:pPr>
+        <w:pStyle w:val="BodyText"/>
+      </w:pPr>
+      <w:r>
+        <w:t xml:space="preserve">January 9, 2026. Seventeen years sober to the day, and fifteen days after my father died. I’m in my car in the parking lot of a skilled nursing facility in Raleigh, coffee in my hand, just out of a visit with a family still deciding whether to start hospice for their mother. I’d sat with them, answered their questions, stayed until the staying was done. A gray January morning, the coffee going cold, the space between one call and the next.</w:t>
+      </w:r>
+    </w:p>
+    <w:p>
+      <w:pPr>
+        <w:pStyle w:val="BodyText"/>
+      </w:pPr>
+      <w:r>
+        <w:t xml:space="preserve">And then it lands, the cardinal, on the mirror, close enough to touch through the glass.</w:t>
+      </w:r>
+    </w:p>
+    <w:p>
+      <w:pPr>
+        <w:pStyle w:val="BodyText"/>
+      </w:pPr>
+      <w:r>
+        <w:t xml:space="preserve">Seventeen years from West Palm Beach, from the apartment with the blinds drawn and the extension cord running to the hallway, from the morning I opened the door and found Lou standing there. Seventeen, the age I was when I won the county championship. He’d been in the third row that day. He was always in the third row.</w:t>
+      </w:r>
+    </w:p>
+    <w:p>
+      <w:pPr>
+        <w:pStyle w:val="BodyText"/>
+      </w:pPr>
+      <w:r>
+        <w:t xml:space="preserve">My father always made a big deal of my sobriety anniversary. Every January 9. My first year, he came to Gulf Breeze Hospital to hear me speak, sat in that room and listened to his son talk about staying sober for one year. He told me once, quietly, that whenever he mentioned my name to someone who knew me, they’d say the same thing:</w:t>
+      </w:r>
+      <w:r>
+        <w:t xml:space="preserve"> </w:t>
+      </w:r>
+      <w:r>
+        <w:t xml:space="preserve">“</w:t>
+      </w:r>
+      <w:r>
+        <w:t xml:space="preserve">He’s the best.</w:t>
+      </w:r>
+      <w:r>
+        <w:t xml:space="preserve">”</w:t>
+      </w:r>
+    </w:p>
+    <w:p>
+      <w:pPr>
+        <w:pStyle w:val="BodyText"/>
+      </w:pPr>
+      <w:r>
+        <w:t xml:space="preserve">The last time a cardinal landed on something I was riding in, he was at the wheel of a U-Haul and I was in no shape to notice. Grandma’s looking out for us. He’d said it the way he said most true things, lightly, and moved on.</w:t>
+      </w:r>
+    </w:p>
+    <w:p>
+      <w:pPr>
+        <w:pStyle w:val="BodyText"/>
+      </w:pPr>
+      <w:r>
+        <w:t xml:space="preserve">Dad, I say out loud. Alone in the car. Just his name. And then the words he and I mostly lived instead of spoke. I love you. Not because it went unsaid between us — it didn’t. Before the end he’d looked at me and told me, Rob, don’t worry about me. We’re good. When my father said we’re good, that was the whole of it: I love you, and I have closure with you. He never needed the sentence. But you don’t run out of wanting to say it to a man you can’t call anymore. I love you. The cardinal doesn’t move. Dad, I love you. I know you’re watching out for me.</w:t>
+      </w:r>
+    </w:p>
+    <w:p>
+      <w:pPr>
+        <w:pStyle w:val="BodyText"/>
+      </w:pPr>
+      <w:r>
+        <w:t xml:space="preserve">It sits there. Turns its head slightly. Still looking. I don’t know how long we stay like that. The parking lot goes away. Just me and the cardinal. Just me and Lou. Tears running down my face, not sobbing, the kind that comes from grief and relief colliding. Dad is gone. Dad is here.</w:t>
+      </w:r>
+    </w:p>
+    <w:p>
+      <w:pPr>
+        <w:pStyle w:val="BodyText"/>
+      </w:pPr>
+      <w:r>
+        <w:t xml:space="preserve">I pull out my phone, slow and careful. I think I’m recording video. I press the button. The cardinal sits. Two minutes, maybe less, maybe more. Finally I say, Dad, I have to go. And it flies, not startled, not sudden. Lifts off the mirror to a nearby tree, sits a moment, then is gone.</w:t>
+      </w:r>
+    </w:p>
+    <w:p>
+      <w:pPr>
+        <w:pStyle w:val="BodyText"/>
+      </w:pPr>
+      <w:r>
+        <w:t xml:space="preserve">I stand in the parking lot, phone in my hand, tears on my face, and feel peace. Not the absence of grief. Grief is still there, always will be. But peace underneath it. I look at my phone. The camera had been in photo mode. One picture. The cardinal on the mirror. I send it to Hope. To Chris. To Jon, Lisa, Joel. To Donna. The text: Dad came to see me. I told him I loved him.</w:t>
+      </w:r>
+    </w:p>
+    <w:p>
+      <w:pPr>
+        <w:pStyle w:val="BodyText"/>
+      </w:pPr>
+      <w:r>
+        <w:t xml:space="preserve">It has never landed on my car again.</w:t>
       </w:r>
     </w:p>
     <w:bookmarkEnd w:id="61"/>
-    <w:bookmarkStart w:id="62" w:name="authors-note"/>
+    <w:bookmarkStart w:id="62" w:name="the-rooms"/>
     <w:p>
       <w:pPr>
         <w:pStyle w:val="Heading1"/>
@@ -15237,7 +15162,7 @@
           <w:bCs/>
           <w:b/>
         </w:rPr>
-        <w:t xml:space="preserve">AUTHOR’S NOTE</w:t>
+        <w:t xml:space="preserve">THE ROOMS</w:t>
       </w:r>
     </w:p>
     <w:p>
@@ -15245,27 +15170,103 @@
         <w:pStyle w:val="FirstParagraph"/>
       </w:pPr>
       <w:r>
-        <w:t xml:space="preserve">For most of my life I wore a mask. Moving as much as I did as a kid — Mexico to New Jersey, town to town, later across the country — taught me one trick I used everywhere: read the room, become what it wanted, and hope that version got to stay. I got good at it. I performed a life that looked like success and kept the real inventory hidden. Even sober, even happy, I managed a careful image, online and off, and I called it protection.</w:t>
-      </w:r>
-    </w:p>
-    <w:p>
-      <w:pPr>
-        <w:pStyle w:val="BodyText"/>
-      </w:pPr>
-      <w:r>
-        <w:t xml:space="preserve">Writing this book took the mask off. Putting these years on the page, the parts I was proud of and the parts I’d spent decades hiding, I found there was nothing left to protect. The fear I’d built my whole life around — that if people saw the real thing, they’d turn away — was the lie. What replaced it is quieter than relief. It’s peace. For the first time, I’m not performing Rob Brizzi. I’m just him. That is what writing this cost me, and what it gave back.</w:t>
-      </w:r>
-    </w:p>
-    <w:p>
-      <w:pPr>
-        <w:pStyle w:val="BodyText"/>
-      </w:pPr>
-      <w:r>
-        <w:t xml:space="preserve">This is a true story, told from memory. Dialogue has been reconstructed as faithfully as memory allows; it keeps the substance of what was said, if not always the exact words. Some names and identifying details have been changed to protect privacy, above all those of the patients and families I served in home health and hospice, whose hardest days deserve protection, not exposure. Where the sober men and women of the rooms appear by their real names, it is with their permission; others have been renamed. A few of the rooms I describe from my work are composites of many rooms, for the same reason. Some events have been changed, and a few scenes, the ones I could not bring myself to remember whole, have been reconstructed from what I know to be true of the people in them. Where I did that, I did it to tell the truth of what happened, not to improve on it. My mother, who is all over this book, checked more of these memories than anyone. Whatever I still got wrong is mine.</w:t>
+        <w:rPr>
+          <w:iCs/>
+          <w:i/>
+        </w:rPr>
+        <w:t xml:space="preserve">For Dale Perkins, and for Cardascia</w:t>
+      </w:r>
+    </w:p>
+    <w:p>
+      <w:pPr>
+        <w:pStyle w:val="BodyText"/>
+      </w:pPr>
+      <w:r>
+        <w:t xml:space="preserve">When I moved out of my father’s house I needed somewhere to live where I could still save. Dale Perkins rented me a room for five hundred a month, utilities included. That was the whole arrangement, and it explains nothing about what came after.</w:t>
+      </w:r>
+    </w:p>
+    <w:p>
+      <w:pPr>
+        <w:pStyle w:val="BodyText"/>
+      </w:pPr>
+      <w:r>
+        <w:t xml:space="preserve">Dale is a licensed clinical therapist and an alcoholic, and he is the least judgmental man I have ever met. He was built to do that job. Nothing I brought him made him flinch. I lived in that house about three years, until the Mirador. We fished. We went to meetings. We watched</w:t>
+      </w:r>
+      <w:r>
+        <w:t xml:space="preserve"> </w:t>
+      </w:r>
+      <w:r>
+        <w:rPr>
+          <w:iCs/>
+          <w:i/>
+        </w:rPr>
+        <w:t xml:space="preserve">The Walking Dead</w:t>
+      </w:r>
+      <w:r>
+        <w:t xml:space="preserve"> </w:t>
+      </w:r>
+      <w:r>
+        <w:t xml:space="preserve">like it was appointment television.</w:t>
+      </w:r>
+    </w:p>
+    <w:p>
+      <w:pPr>
+        <w:pStyle w:val="BodyText"/>
+      </w:pPr>
+      <w:r>
+        <w:t xml:space="preserve">Back in 2011 he had a cough that wouldn’t quit. They told him it was allergies.</w:t>
+      </w:r>
+    </w:p>
+    <w:p>
+      <w:pPr>
+        <w:pStyle w:val="BodyText"/>
+      </w:pPr>
+      <w:r>
+        <w:t xml:space="preserve">As I was finishing this book, I got the call. Dale is on hospice with mesothelioma, and they don’t think he has a month. It knocked me down, and not because of what he did for me. Because of who he is.</w:t>
+      </w:r>
+    </w:p>
+    <w:p>
+      <w:pPr>
+        <w:pStyle w:val="BodyText"/>
+      </w:pPr>
+      <w:r>
+        <w:t xml:space="preserve">I called him. I cried, and I told him I loved him, and he said it back.</w:t>
+      </w:r>
+    </w:p>
+    <w:p>
+      <w:pPr>
+        <w:pStyle w:val="BodyText"/>
+      </w:pPr>
+      <w:r>
+        <w:t xml:space="preserve">There’s another seat in those rooms. Cardascia and I had been friends since we were seventeen years old. He lost his fight with addiction in 2025. He never quit trying, and that’s the part I won’t let anyone forget. The disease tells you a man who goes back out is a failure. The rooms know better. He kept walking back in, every time, wanting to stop. That’s not weakness. That’s a fighter losing to something that kills fighters.</w:t>
+      </w:r>
+    </w:p>
+    <w:p>
+      <w:pPr>
+        <w:pStyle w:val="BodyText"/>
+      </w:pPr>
+      <w:r>
+        <w:t xml:space="preserve">I’m seventeen years sober and I’m not one bit safer than he was. None of us are. The only difference between his seat and mine is one day at a time.</w:t>
+      </w:r>
+    </w:p>
+    <w:p>
+      <w:pPr>
+        <w:pStyle w:val="BodyText"/>
+      </w:pPr>
+      <w:r>
+        <w:t xml:space="preserve">One chair is empty and one won’t be for long, and the only thing any of us can do about either is what the two of them did: show up. Go to a meeting this week, even if you’re good. Especially if you’re not. Call somebody. If today’s got you scared, say it out loud to one of us. That’s what the rooms are for. If you’re the one in the fight and nobody is coming for you: the rooms are full of men like Lou. Mine found me there. Walk in and let yours find you.</w:t>
+      </w:r>
+    </w:p>
+    <w:p>
+      <w:pPr>
+        <w:pStyle w:val="BodyText"/>
+      </w:pPr>
+      <w:r>
+        <w:t xml:space="preserve">Rest easy, Cardascia. We’ll keep the seat warm and the coffee bad.</w:t>
       </w:r>
     </w:p>
     <w:bookmarkEnd w:id="62"/>
-    <w:bookmarkStart w:id="63" w:name="acknowledgments"/>
+    <w:bookmarkStart w:id="63" w:name="authors-note"/>
     <w:p>
       <w:pPr>
         <w:pStyle w:val="Heading1"/>
@@ -15275,7 +15276,7 @@
           <w:bCs/>
           <w:b/>
         </w:rPr>
-        <w:t xml:space="preserve">ACKNOWLEDGMENTS</w:t>
+        <w:t xml:space="preserve">AUTHOR’S NOTE</w:t>
       </w:r>
     </w:p>
     <w:p>
@@ -15283,117 +15284,27 @@
         <w:pStyle w:val="FirstParagraph"/>
       </w:pPr>
       <w:r>
-        <w:t xml:space="preserve">Hope. You tilted your head, said</w:t>
-      </w:r>
-      <w:r>
-        <w:t xml:space="preserve"> </w:t>
-      </w:r>
-      <w:r>
-        <w:t xml:space="preserve">“</w:t>
-      </w:r>
-      <w:r>
-        <w:t xml:space="preserve">We?</w:t>
-      </w:r>
-      <w:r>
-        <w:t xml:space="preserve">”</w:t>
-      </w:r>
-      <w:r>
-        <w:t xml:space="preserve"> </w:t>
-      </w:r>
-      <w:r>
-        <w:t xml:space="preserve">and never stopped meaning it. You read every page of this book and told me you were proud of me. That’s the only review I’ll ever need.</w:t>
-      </w:r>
-    </w:p>
-    <w:p>
-      <w:pPr>
-        <w:pStyle w:val="BodyText"/>
-      </w:pPr>
-      <w:r>
-        <w:t xml:space="preserve">My mother, who carried two boys out of Mexico City and then checked more of these memories than anyone. This book is half hers.</w:t>
-      </w:r>
-    </w:p>
-    <w:p>
-      <w:pPr>
-        <w:pStyle w:val="BodyText"/>
-      </w:pPr>
-      <w:r>
-        <w:t xml:space="preserve">Chris. My brother, my keeper. You know what you said to me that night. It worked.</w:t>
-      </w:r>
-    </w:p>
-    <w:p>
-      <w:pPr>
-        <w:pStyle w:val="BodyText"/>
-      </w:pPr>
-      <w:r>
-        <w:t xml:space="preserve">Jon, Lisa, and Joel — we shared him. I know what we lost.</w:t>
-      </w:r>
-    </w:p>
-    <w:p>
-      <w:pPr>
-        <w:pStyle w:val="BodyText"/>
-      </w:pPr>
-      <w:r>
-        <w:t xml:space="preserve">The men God put in front of me: Andy, Bob, Mager, Matt, and Quint. You walked into the room. So did I.</w:t>
-      </w:r>
-    </w:p>
-    <w:p>
-      <w:pPr>
-        <w:pStyle w:val="BodyText"/>
-      </w:pPr>
-      <w:r>
-        <w:t xml:space="preserve">Dave Meyer, for thirty-five years of friendship and for the words that open this book.</w:t>
-      </w:r>
-    </w:p>
-    <w:p>
-      <w:pPr>
-        <w:pStyle w:val="BodyText"/>
-      </w:pPr>
-      <w:r>
-        <w:t xml:space="preserve">Brenda Jahn, one of the best managers I ever worked for. She believed in me and pushed me, and it prepared me for everything that came after.</w:t>
-      </w:r>
-    </w:p>
-    <w:p>
-      <w:pPr>
-        <w:pStyle w:val="BodyText"/>
-      </w:pPr>
-      <w:r>
-        <w:t xml:space="preserve">Dr. Huet, and every nurse, aide, chaplain, and social worker I get to stand beside in the last chapter. You taught me what showing up looks like when it’s a profession.</w:t>
-      </w:r>
-    </w:p>
-    <w:p>
-      <w:pPr>
-        <w:pStyle w:val="BodyText"/>
-      </w:pPr>
-      <w:r>
-        <w:t xml:space="preserve">Scott, my editor, who made these pages better and let them stay mine.</w:t>
-      </w:r>
-    </w:p>
-    <w:p>
-      <w:pPr>
-        <w:pStyle w:val="BodyText"/>
-      </w:pPr>
-      <w:r>
-        <w:t xml:space="preserve">Grace Nobrega, for the cover design.</w:t>
-      </w:r>
-    </w:p>
-    <w:p>
-      <w:pPr>
-        <w:pStyle w:val="BodyText"/>
-      </w:pPr>
-      <w:r>
-        <w:t xml:space="preserve">The rooms, and the people in them, who keep teaching me that the door only had to open once.</w:t>
-      </w:r>
-    </w:p>
-    <w:p>
-      <w:pPr>
-        <w:pStyle w:val="BodyText"/>
-      </w:pPr>
-      <w:r>
-        <w:t xml:space="preserve">And Dad. I kept the promise.</w:t>
+        <w:t xml:space="preserve">For most of my life I wore a mask. Moving as much as I did as a kid — Mexico to New Jersey, town to town, later across the country — taught me one trick I used everywhere: read the room, become what it wanted, and hope that version got to stay. I got good at it. I performed a life that looked like success and kept the real inventory hidden. Even sober, even happy, I managed a careful image, online and off, and I called it protection.</w:t>
+      </w:r>
+    </w:p>
+    <w:p>
+      <w:pPr>
+        <w:pStyle w:val="BodyText"/>
+      </w:pPr>
+      <w:r>
+        <w:t xml:space="preserve">Writing this book took the mask off. Putting these years on the page, the parts I was proud of and the parts I’d spent decades hiding, I found there was nothing left to protect. The fear I’d built my whole life around — that if people saw the real thing, they’d turn away — was the lie. What replaced it is quieter than relief. It’s peace. For the first time, I’m not performing Rob Brizzi. I’m just him. That is what writing this cost me, and what it gave back.</w:t>
+      </w:r>
+    </w:p>
+    <w:p>
+      <w:pPr>
+        <w:pStyle w:val="BodyText"/>
+      </w:pPr>
+      <w:r>
+        <w:t xml:space="preserve">This is a true story, told from memory. Dialogue has been reconstructed as faithfully as memory allows; it keeps the substance of what was said, if not always the exact words. Some names and identifying details have been changed to protect privacy, above all those of the patients and families I served in home health and hospice, whose hardest days deserve protection, not exposure. Where the sober men and women of the rooms appear by their real names, it is with their permission; others have been renamed. A few of the rooms I describe from my work are composites of many rooms, for the same reason. Some events have been changed, and a few scenes, the ones I could not bring myself to remember whole, have been reconstructed from what I know to be true of the people in them. Where I did that, I did it to tell the truth of what happened, not to improve on it. My mother, who is all over this book, checked more of these memories than anyone. Whatever I still got wrong is mine.</w:t>
       </w:r>
     </w:p>
     <w:bookmarkEnd w:id="63"/>
-    <w:bookmarkStart w:id="64" w:name="a-note-to-the-one-who-loves-an-addict"/>
+    <w:bookmarkStart w:id="64" w:name="acknowledgments"/>
     <w:p>
       <w:pPr>
         <w:pStyle w:val="Heading1"/>
@@ -15403,7 +15314,7 @@
           <w:bCs/>
           <w:b/>
         </w:rPr>
-        <w:t xml:space="preserve">A NOTE TO THE ONE WHO LOVES AN ADDICT</w:t>
+        <w:t xml:space="preserve">ACKNOWLEDGMENTS</w:t>
       </w:r>
     </w:p>
     <w:p>
@@ -15411,51 +15322,117 @@
         <w:pStyle w:val="FirstParagraph"/>
       </w:pPr>
       <w:r>
-        <w:t xml:space="preserve">If you picked up this book because you love someone who is using, or you lost someone who did, I want to say something to you now that the story is done.</w:t>
-      </w:r>
-    </w:p>
-    <w:p>
-      <w:pPr>
-        <w:pStyle w:val="BodyText"/>
-      </w:pPr>
-      <w:r>
-        <w:t xml:space="preserve">It isn’t your fault.</w:t>
-      </w:r>
-    </w:p>
-    <w:p>
-      <w:pPr>
-        <w:pStyle w:val="BodyText"/>
-      </w:pPr>
-      <w:r>
-        <w:t xml:space="preserve">I know you’ve tried. I know you’ve lain awake turning someone else’s life over and over, looking for the thing you missed. I was the person on the other end of those nights. My mother wired me money she told herself was for rent. My father drove a truck across the state to haul me home. None of it made me stop. Not because they failed. Because it wasn’t theirs to win. But hear the other half, because it’s just as true: none of it was wasted either. Every one of those rescues bought time, and time was the only thing that could still help me. You cannot make them stop. You can help them live until they do.</w:t>
-      </w:r>
-    </w:p>
-    <w:p>
-      <w:pPr>
-        <w:pStyle w:val="BodyText"/>
-      </w:pPr>
-      <w:r>
-        <w:t xml:space="preserve">I have been on both sides of this. I did not understand addiction as a disease at first. I understood it as a disappearance. One day the person you love is still there, sitting across from you, using the same voice, wearing the same face, and somehow already slipping away. You keep reaching for the version of them you remember. You keep thinking love should be enough. Then life teaches you, slowly and brutally, that love is not a cure. It won’t make them stop. What it does is keep you from leaving.</w:t>
-      </w:r>
-    </w:p>
-    <w:p>
-      <w:pPr>
-        <w:pStyle w:val="BodyText"/>
-      </w:pPr>
-      <w:r>
-        <w:t xml:space="preserve">Years later I would learn that this is also the whole of hospice. You cannot cure the thing in the room. You can only refuse to leave it.</w:t>
-      </w:r>
-    </w:p>
-    <w:p>
-      <w:pPr>
-        <w:pStyle w:val="BodyText"/>
-      </w:pPr>
-      <w:r>
-        <w:t xml:space="preserve">What you can do is stay. Not fix, not control, not cure. Stay. Set the boundary that keeps you whole, leave the door open a crack, and be there in the ways that don’t cost you your own life. If you are not safe, the boundary is distance — my mother saved two boys by leaving.</w:t>
+        <w:t xml:space="preserve">Hope. You tilted your head, said</w:t>
+      </w:r>
+      <w:r>
+        <w:t xml:space="preserve"> </w:t>
+      </w:r>
+      <w:r>
+        <w:t xml:space="preserve">“</w:t>
+      </w:r>
+      <w:r>
+        <w:t xml:space="preserve">We?</w:t>
+      </w:r>
+      <w:r>
+        <w:t xml:space="preserve">”</w:t>
+      </w:r>
+      <w:r>
+        <w:t xml:space="preserve"> </w:t>
+      </w:r>
+      <w:r>
+        <w:t xml:space="preserve">and never stopped meaning it. You read every page of this book and told me you were proud of me. That’s the only review I’ll ever need.</w:t>
+      </w:r>
+    </w:p>
+    <w:p>
+      <w:pPr>
+        <w:pStyle w:val="BodyText"/>
+      </w:pPr>
+      <w:r>
+        <w:t xml:space="preserve">My mother, who carried two boys out of Mexico City and then checked more of these memories than anyone. This book is half hers.</w:t>
+      </w:r>
+    </w:p>
+    <w:p>
+      <w:pPr>
+        <w:pStyle w:val="BodyText"/>
+      </w:pPr>
+      <w:r>
+        <w:t xml:space="preserve">Chris. My brother, my keeper. You know what you said to me that night. It worked.</w:t>
+      </w:r>
+    </w:p>
+    <w:p>
+      <w:pPr>
+        <w:pStyle w:val="BodyText"/>
+      </w:pPr>
+      <w:r>
+        <w:t xml:space="preserve">Jon, Lisa, and Joel — we shared him. I know what we lost.</w:t>
+      </w:r>
+    </w:p>
+    <w:p>
+      <w:pPr>
+        <w:pStyle w:val="BodyText"/>
+      </w:pPr>
+      <w:r>
+        <w:t xml:space="preserve">The men God put in front of me: Andy, Bob, Mager, Matt, and Quint. You walked into the room. So did I.</w:t>
+      </w:r>
+    </w:p>
+    <w:p>
+      <w:pPr>
+        <w:pStyle w:val="BodyText"/>
+      </w:pPr>
+      <w:r>
+        <w:t xml:space="preserve">Dave Meyer, for thirty-five years of friendship and for the words that open this book.</w:t>
+      </w:r>
+    </w:p>
+    <w:p>
+      <w:pPr>
+        <w:pStyle w:val="BodyText"/>
+      </w:pPr>
+      <w:r>
+        <w:t xml:space="preserve">Brenda Jahn, one of the best managers I ever worked for. She believed in me and pushed me, and it prepared me for everything that came after.</w:t>
+      </w:r>
+    </w:p>
+    <w:p>
+      <w:pPr>
+        <w:pStyle w:val="BodyText"/>
+      </w:pPr>
+      <w:r>
+        <w:t xml:space="preserve">Dr. Huet, and every nurse, aide, chaplain, and social worker I get to stand beside in the last chapter. You taught me what showing up looks like when it’s a profession.</w:t>
+      </w:r>
+    </w:p>
+    <w:p>
+      <w:pPr>
+        <w:pStyle w:val="BodyText"/>
+      </w:pPr>
+      <w:r>
+        <w:t xml:space="preserve">Scott, my editor, who made these pages better and let them stay mine.</w:t>
+      </w:r>
+    </w:p>
+    <w:p>
+      <w:pPr>
+        <w:pStyle w:val="BodyText"/>
+      </w:pPr>
+      <w:r>
+        <w:t xml:space="preserve">Grace Nobrega, for the cover design.</w:t>
+      </w:r>
+    </w:p>
+    <w:p>
+      <w:pPr>
+        <w:pStyle w:val="BodyText"/>
+      </w:pPr>
+      <w:r>
+        <w:t xml:space="preserve">The rooms, and the people in them, who keep teaching me that the door only had to open once.</w:t>
+      </w:r>
+    </w:p>
+    <w:p>
+      <w:pPr>
+        <w:pStyle w:val="BodyText"/>
+      </w:pPr>
+      <w:r>
+        <w:t xml:space="preserve">And Dad. I kept the promise.</w:t>
       </w:r>
     </w:p>
     <w:bookmarkEnd w:id="64"/>
-    <w:bookmarkStart w:id="65" w:name="lous-way"/>
+    <w:bookmarkStart w:id="65" w:name="a-note-to-the-one-who-loves-an-addict"/>
     <w:p>
       <w:pPr>
         <w:pStyle w:val="Heading1"/>
@@ -15465,6 +15442,68 @@
           <w:bCs/>
           <w:b/>
         </w:rPr>
+        <w:t xml:space="preserve">A NOTE TO THE ONE WHO LOVES AN ADDICT</w:t>
+      </w:r>
+    </w:p>
+    <w:p>
+      <w:pPr>
+        <w:pStyle w:val="FirstParagraph"/>
+      </w:pPr>
+      <w:r>
+        <w:t xml:space="preserve">If you picked up this book because you love someone who is using, or you lost someone who did, I want to say something to you now that the story is done.</w:t>
+      </w:r>
+    </w:p>
+    <w:p>
+      <w:pPr>
+        <w:pStyle w:val="BodyText"/>
+      </w:pPr>
+      <w:r>
+        <w:t xml:space="preserve">It isn’t your fault.</w:t>
+      </w:r>
+    </w:p>
+    <w:p>
+      <w:pPr>
+        <w:pStyle w:val="BodyText"/>
+      </w:pPr>
+      <w:r>
+        <w:t xml:space="preserve">I know you’ve tried. I know you’ve lain awake turning someone else’s life over and over, looking for the thing you missed. I was the person on the other end of those nights. My mother wired me money she told herself was for rent. My father drove a truck across the state to haul me home. None of it made me stop. Not because they failed. Because it wasn’t theirs to win. But hear the other half, because it’s just as true: none of it was wasted either. Every one of those rescues bought time, and time was the only thing that could still help me. You cannot make them stop. You can help them live until they do.</w:t>
+      </w:r>
+    </w:p>
+    <w:p>
+      <w:pPr>
+        <w:pStyle w:val="BodyText"/>
+      </w:pPr>
+      <w:r>
+        <w:t xml:space="preserve">I have been on both sides of this. I did not understand addiction as a disease at first. I understood it as a disappearance. One day the person you love is still there, sitting across from you, using the same voice, wearing the same face, and somehow already slipping away. You keep reaching for the version of them you remember. You keep thinking love should be enough. Then life teaches you, slowly and brutally, that love is not a cure. It won’t make them stop. What it does is keep you from leaving.</w:t>
+      </w:r>
+    </w:p>
+    <w:p>
+      <w:pPr>
+        <w:pStyle w:val="BodyText"/>
+      </w:pPr>
+      <w:r>
+        <w:t xml:space="preserve">Years later I would learn that this is also the whole of hospice. You cannot cure the thing in the room. You can only refuse to leave it.</w:t>
+      </w:r>
+    </w:p>
+    <w:p>
+      <w:pPr>
+        <w:pStyle w:val="BodyText"/>
+      </w:pPr>
+      <w:r>
+        <w:t xml:space="preserve">What you can do is stay. Not fix, not control, not cure. Stay. Set the boundary that keeps you whole, leave the door open a crack, and be there in the ways that don’t cost you your own life. If you are not safe, the boundary is distance — my mother saved two boys by leaving.</w:t>
+      </w:r>
+    </w:p>
+    <w:bookmarkEnd w:id="65"/>
+    <w:bookmarkStart w:id="66" w:name="lous-way"/>
+    <w:p>
+      <w:pPr>
+        <w:pStyle w:val="Heading1"/>
+      </w:pPr>
+      <w:r>
+        <w:rPr>
+          <w:bCs/>
+          <w:b/>
+        </w:rPr>
         <w:t xml:space="preserve">LOU’S WAY</w:t>
       </w:r>
     </w:p>
@@ -15540,8 +15579,8 @@
         <w:t xml:space="preserve">He stayed.</w:t>
       </w:r>
     </w:p>
-    <w:bookmarkEnd w:id="65"/>
-    <w:bookmarkStart w:id="66" w:name="a-readers-guide"/>
+    <w:bookmarkEnd w:id="66"/>
+    <w:bookmarkStart w:id="67" w:name="a-readers-guide"/>
     <w:p>
       <w:pPr>
         <w:pStyle w:val="Heading1"/>
@@ -15877,8 +15916,8 @@
         <w:t xml:space="preserve">Who would you call — and when?</w:t>
       </w:r>
     </w:p>
-    <w:bookmarkEnd w:id="66"/>
-    <w:bookmarkStart w:id="71" w:name="resources"/>
+    <w:bookmarkEnd w:id="67"/>
+    <w:bookmarkStart w:id="72" w:name="resources"/>
     <w:p>
       <w:pPr>
         <w:pStyle w:val="Heading1"/>
@@ -15907,7 +15946,7 @@
         <w:t xml:space="preserve">988 Suicide &amp; Crisis Lifeline. Call or text 988. Twenty-four hours a day, free and confidential. For anyone reading this in a dark place — the addiction pages, the grief pages, any of it.</w:t>
       </w:r>
     </w:p>
-    <w:bookmarkStart w:id="67" w:name="Xce803ff55fdb1e3bbbead8a1b74abb7090248b3"/>
+    <w:bookmarkStart w:id="68" w:name="Xce803ff55fdb1e3bbbead8a1b74abb7090248b3"/>
     <w:p>
       <w:pPr>
         <w:pStyle w:val="Heading3"/>
@@ -15933,25 +15972,7 @@
         <w:pStyle w:val="BodyText"/>
       </w:pPr>
       <w:r>
-        <w:t xml:space="preserve">Alcoholics Anonymous. aa.org. Meetings, in person and online, almost everywhere. The chapter that gave this book its spine is called</w:t>
-      </w:r>
-      <w:r>
-        <w:t xml:space="preserve"> </w:t>
-      </w:r>
-      <w:r>
-        <w:t xml:space="preserve">“</w:t>
-      </w:r>
-      <w:r>
-        <w:t xml:space="preserve">There Is a Solution.</w:t>
-      </w:r>
-      <w:r>
-        <w:t xml:space="preserve">”</w:t>
-      </w:r>
-      <w:r>
-        <w:t xml:space="preserve"> </w:t>
-      </w:r>
-      <w:r>
-        <w:t xml:space="preserve">It is the second chapter of the book they call the Big Book.</w:t>
+        <w:t xml:space="preserve">Alcoholics Anonymous. aa.org. Meetings, in person and online, almost everywhere.</w:t>
       </w:r>
     </w:p>
     <w:p>
@@ -15962,8 +15983,8 @@
         <w:t xml:space="preserve">Al-Anon Family Groups. al-anon.org. For the families and friends of alcoholics. If you love someone who drinks, this one is for you, whether or not they ever get help themselves.</w:t>
       </w:r>
     </w:p>
-    <w:bookmarkEnd w:id="67"/>
-    <w:bookmarkStart w:id="68" w:name="X8df9206620c0de36db74bea783091dd4c0ba532"/>
+    <w:bookmarkEnd w:id="68"/>
+    <w:bookmarkStart w:id="69" w:name="X8df9206620c0de36db74bea783091dd4c0ba532"/>
     <w:p>
       <w:pPr>
         <w:pStyle w:val="Heading3"/>
@@ -16016,8 +16037,8 @@
         <w:t xml:space="preserve">Medicare Care Compare. medicare.gov/care-compare. Compare hospice providers in your area, including quality measures and family feedback.</w:t>
       </w:r>
     </w:p>
-    <w:bookmarkEnd w:id="68"/>
-    <w:bookmarkStart w:id="69" w:name="further-reading"/>
+    <w:bookmarkEnd w:id="69"/>
+    <w:bookmarkStart w:id="70" w:name="further-reading"/>
     <w:p>
       <w:pPr>
         <w:pStyle w:val="Heading3"/>
@@ -16072,8 +16093,8 @@
         <w:t xml:space="preserve">.</w:t>
       </w:r>
     </w:p>
-    <w:bookmarkEnd w:id="69"/>
-    <w:bookmarkStart w:id="70" w:name="a-note-on-these-resources"/>
+    <w:bookmarkEnd w:id="70"/>
+    <w:bookmarkStart w:id="71" w:name="a-note-on-these-resources"/>
     <w:p>
       <w:pPr>
         <w:pStyle w:val="Heading3"/>
@@ -16094,9 +16115,9 @@
         <w:t xml:space="preserve">The phone numbers and web addresses were current when this book went to press. Organizations change. If a number stops working, search the name. None of this is medical or legal advice. It is a place to begin. One caution: stopping alcohol suddenly after heavy, steady drinking can be medically dangerous. Withdrawal can bring seizures. Let a doctor or a detox program supervise it.</w:t>
       </w:r>
     </w:p>
-    <w:bookmarkEnd w:id="70"/>
     <w:bookmarkEnd w:id="71"/>
-    <w:bookmarkStart w:id="72" w:name="about-the-author"/>
+    <w:bookmarkEnd w:id="72"/>
+    <w:bookmarkStart w:id="73" w:name="about-the-author"/>
     <w:p>
       <w:pPr>
         <w:pStyle w:val="Heading1"/>
@@ -16133,7 +16154,7 @@
         <w:t xml:space="preserve">is his first book.</w:t>
       </w:r>
     </w:p>
-    <w:bookmarkEnd w:id="72"/>
+    <w:bookmarkEnd w:id="73"/>
     <w:sectPr>
       <w:footerReference w:type="default" r:id="rIdFtr1"/>
       <w:pgSz w:w="12240" w:h="15840"/>

</xml_diff>

<commit_message>
9.2 push: five reconstructed scenes (the Saturday, the temper night, one call to Mom, one porch evening, Bob's hour), the hospice beat, breakfast given a place; seam fixes
Co-Authored-By: Claude Fable 5.1 <noreply@anthropic.com>
Claude-Session: https://claude.ai/code/session_013TTacQAr67Pe2VUwTPop1A
</commit_message>
<xml_diff>
--- a/The_Cardinals_Promise.docx
+++ b/The_Cardinals_Promise.docx
@@ -1934,7 +1934,7 @@
         <w:pStyle w:val="BodyText"/>
       </w:pPr>
       <w:r>
-        <w:t xml:space="preserve">Then the airport. My mother carried a suitcase and Chris while I dragged a little red one behind me. I’d flown once before, to Houston, when I was two and a half, the trip to see Aunt Terry when Kevin was born, but I didn’t remember any of it. As far as I knew, I’d never seen a plane up close. The engines came up through the floor and the seat and into me. When we started down the runway something pushed me back into my seat. I looked out the window. The houses and the streets slid by, slow and then fast, until they ran together and dropped away under the clouds.</w:t>
+        <w:t xml:space="preserve">Then the airport. My mother carried a suitcase and Chris while I dragged a little red one behind me. I’d flown once before, when I was two and a half, the trip to see Aunt Terry when Kevin was born, but I didn’t remember any of it. As far as I knew, I’d never seen a plane up close. The engines came up through the floor and the seat and into me. When we started down the runway something pushed me back into my seat. I looked out the window. The houses and the streets slid by, slow and then fast, until they ran together and dropped away under the clouds.</w:t>
       </w:r>
     </w:p>
     <w:p>
@@ -2592,6 +2592,312 @@
         <w:pStyle w:val="BodyText"/>
       </w:pPr>
       <w:r>
+        <w:t xml:space="preserve">Lou’s upbringing explained some of it. His father sold produce. When men in suits walked into his market, his father went out back to discuss things in private. When relatives came over from Italy, Lou was the boy who lost his bed to them and slept in the attic. He carried that longer than anybody knew. Years later, during a stretch when he was going to therapy, he recalled a family Christmas and an old man yelling at his uncle about a boy who had to sleep in the attic. The temper was the Italian kind you see in the movies. It was older than any of us, and it was never about us.</w:t>
+      </w:r>
+    </w:p>
+    <w:p>
+      <w:pPr>
+        <w:pStyle w:val="BodyText"/>
+      </w:pPr>
+      <w:r>
+        <w:t xml:space="preserve">He had three kids before he was twenty-five. His first wife, Judy, was a couple of years younger and fighting postpartum depression in an era that had no name for it and no help. To avoid her moods, he stayed out late some nights, partying. The marriage couldn’t hold, and the kids spent most of their time with his mother, Mag.</w:t>
+      </w:r>
+    </w:p>
+    <w:p>
+      <w:pPr>
+        <w:pStyle w:val="BodyText"/>
+      </w:pPr>
+      <w:r>
+        <w:t xml:space="preserve">“</w:t>
+      </w:r>
+      <w:r>
+        <w:t xml:space="preserve">No excuses,</w:t>
+      </w:r>
+      <w:r>
+        <w:t xml:space="preserve">”</w:t>
+      </w:r>
+      <w:r>
+        <w:t xml:space="preserve"> </w:t>
+      </w:r>
+      <w:r>
+        <w:t xml:space="preserve">he confided in me years later.</w:t>
+      </w:r>
+      <w:r>
+        <w:t xml:space="preserve"> </w:t>
+      </w:r>
+      <w:r>
+        <w:t xml:space="preserve">“</w:t>
+      </w:r>
+      <w:r>
+        <w:t xml:space="preserve">I wasn’t the best dad. My kids deserved a better one than the one they got.</w:t>
+      </w:r>
+      <w:r>
+        <w:t xml:space="preserve">”</w:t>
+      </w:r>
+    </w:p>
+    <w:p>
+      <w:pPr>
+        <w:pStyle w:val="BodyText"/>
+      </w:pPr>
+      <w:r>
+        <w:t xml:space="preserve">Then there was Mag, who babysat Chris and me when we were boys. I saw her as the goddess of comfort. Friendly’s when she was watching us. TV together on the couch. Some nights she’d fry hamburgers in butter in a pan, and I can still taste them. Whenever I lobbied for White Castle, she waved off my suggestion — she didn’t like driving on the highway, and that was that.</w:t>
+      </w:r>
+      <w:r>
+        <w:t xml:space="preserve"> </w:t>
+      </w:r>
+      <w:r>
+        <w:t xml:space="preserve">“</w:t>
+      </w:r>
+      <w:r>
+        <w:t xml:space="preserve">You telling me I can’t make a better hamburger right here?</w:t>
+      </w:r>
+      <w:r>
+        <w:t xml:space="preserve">”</w:t>
+      </w:r>
+      <w:r>
+        <w:t xml:space="preserve"> </w:t>
+      </w:r>
+      <w:r>
+        <w:t xml:space="preserve">she’d ask in mock offense.</w:t>
+      </w:r>
+    </w:p>
+    <w:p>
+      <w:pPr>
+        <w:pStyle w:val="BodyText"/>
+      </w:pPr>
+      <w:r>
+        <w:t xml:space="preserve">A die-hard Yankees fan, she passed that passion on to Lou. If the games weren’t televised, she’d listen on the radio. When she got tired, she’d take the radio to bed and listen until she fell asleep.</w:t>
+      </w:r>
+    </w:p>
+    <w:p>
+      <w:pPr>
+        <w:pStyle w:val="BodyText"/>
+      </w:pPr>
+      <w:r>
+        <w:t xml:space="preserve">Lou worked IT most of his life, a lot of it on the help desk, the guy you call when the thing won’t work. He didn’t stop until he was eighty-two. Never wealthy, Lou always angled for a second income to help pay the bills. For a while he had a booth at the Union Flea Market, called Lew’s, a different spelling of his own name. I hated every Saturday I spent working it, but nobody asked. Left alone on Sundays, he watched his games: the Yankees in the summer, the Giants in the fall. That was the whole vice.</w:t>
+      </w:r>
+    </w:p>
+    <w:p>
+      <w:pPr>
+        <w:pStyle w:val="BodyText"/>
+      </w:pPr>
+      <w:r>
+        <w:t xml:space="preserve">People asked Lou why he decided to take on somebody else’s two boys. He never dressed up the answer.</w:t>
+      </w:r>
+    </w:p>
+    <w:p>
+      <w:pPr>
+        <w:pStyle w:val="BodyText"/>
+      </w:pPr>
+      <w:r>
+        <w:t xml:space="preserve">“</w:t>
+      </w:r>
+      <w:r>
+        <w:t xml:space="preserve">Have you seen their mother? She’s drop-dead gorgeous. Beautiful and ten years younger than me. You do the math.</w:t>
+      </w:r>
+      <w:r>
+        <w:t xml:space="preserve">”</w:t>
+      </w:r>
+    </w:p>
+    <w:p>
+      <w:pPr>
+        <w:pStyle w:val="BodyText"/>
+      </w:pPr>
+      <w:r>
+        <w:t xml:space="preserve">That was the honest start of it. The staying part he never explained.</w:t>
+      </w:r>
+    </w:p>
+    <w:p>
+      <w:pPr>
+        <w:pStyle w:val="BodyText"/>
+      </w:pPr>
+      <w:r>
+        <w:t xml:space="preserve">Lou and Mom married at Pines Lake, in Wayne, New Jersey, where Aunt Terry’s family lived, the same place the Halloween candy hit the kitchen floor. Around the time Lou came into our lives, we left West Paterson for a house of our own in Woodridge. That was the home of my grade-school years, before Ramsey.</w:t>
+      </w:r>
+    </w:p>
+    <w:p>
+      <w:pPr>
+        <w:pStyle w:val="BodyText"/>
+      </w:pPr>
+      <w:r>
+        <w:t xml:space="preserve">He adopted us when I was eight. The paperwork had taken years. International adoption in the eighties crawled and required everything in triplicate. Lou wasn’t a patient man by nature, but he was patient in practice. He made the trips, sat in the offices, signed what they put in front of him, and waited for the next form.</w:t>
+      </w:r>
+    </w:p>
+    <w:p>
+      <w:pPr>
+        <w:pStyle w:val="BodyText"/>
+      </w:pPr>
+      <w:r>
+        <w:t xml:space="preserve">When the time came to change our names, my mother told me Grandpa wanted to ask me something. We went down to the basement of the Woodridge house, surrounded by wood paneling, brown shag carpet, and the cool stale smell of basement air. Grandpa Bob sat me down and got to the point the way he always did.</w:t>
+      </w:r>
+    </w:p>
+    <w:p>
+      <w:pPr>
+        <w:pStyle w:val="BodyText"/>
+      </w:pPr>
+      <w:r>
+        <w:t xml:space="preserve">“</w:t>
+      </w:r>
+      <w:r>
+        <w:t xml:space="preserve">Change your first name to Robert,</w:t>
+      </w:r>
+      <w:r>
+        <w:t xml:space="preserve">”</w:t>
+      </w:r>
+      <w:r>
+        <w:t xml:space="preserve"> </w:t>
+      </w:r>
+      <w:r>
+        <w:t xml:space="preserve">he said.</w:t>
+      </w:r>
+      <w:r>
+        <w:t xml:space="preserve"> </w:t>
+      </w:r>
+      <w:r>
+        <w:t xml:space="preserve">“</w:t>
+      </w:r>
+      <w:r>
+        <w:t xml:space="preserve">Rob. And I’ll give you a hundred dollars.</w:t>
+      </w:r>
+      <w:r>
+        <w:t xml:space="preserve">”</w:t>
+      </w:r>
+    </w:p>
+    <w:p>
+      <w:pPr>
+        <w:pStyle w:val="BodyText"/>
+      </w:pPr>
+      <w:r>
+        <w:t xml:space="preserve">I was eight. A hundred dollars was a fortune. I didn’t even have to think about it.</w:t>
+      </w:r>
+    </w:p>
+    <w:p>
+      <w:pPr>
+        <w:pStyle w:val="BodyText"/>
+      </w:pPr>
+      <w:r>
+        <w:t xml:space="preserve">“</w:t>
+      </w:r>
+      <w:r>
+        <w:t xml:space="preserve">Okay,</w:t>
+      </w:r>
+      <w:r>
+        <w:t xml:space="preserve">”</w:t>
+      </w:r>
+      <w:r>
+        <w:t xml:space="preserve"> </w:t>
+      </w:r>
+      <w:r>
+        <w:t xml:space="preserve">I said.</w:t>
+      </w:r>
+    </w:p>
+    <w:p>
+      <w:pPr>
+        <w:pStyle w:val="BodyText"/>
+      </w:pPr>
+      <w:r>
+        <w:t xml:space="preserve">Then I asked him something he hadn’t planned for.</w:t>
+      </w:r>
+    </w:p>
+    <w:p>
+      <w:pPr>
+        <w:pStyle w:val="BodyText"/>
+      </w:pPr>
+      <w:r>
+        <w:t xml:space="preserve">“</w:t>
+      </w:r>
+      <w:r>
+        <w:t xml:space="preserve">Can my middle name be Lou?</w:t>
+      </w:r>
+      <w:r>
+        <w:t xml:space="preserve">”</w:t>
+      </w:r>
+    </w:p>
+    <w:p>
+      <w:pPr>
+        <w:pStyle w:val="BodyText"/>
+      </w:pPr>
+      <w:r>
+        <w:t xml:space="preserve">Nobody had suggested it. That day Claudio Horacio Balderas became Robert Louis Brizzi. I had carried one father’s name in the middle of mine my whole life. Now I would carry the other’s. I’ve never once wished it back.</w:t>
+      </w:r>
+    </w:p>
+    <w:p>
+      <w:pPr>
+        <w:pStyle w:val="BodyText"/>
+      </w:pPr>
+      <w:r>
+        <w:t xml:space="preserve">When I was six, Lou taught me to swim by carrying me to the edge of the pool and throwing me in. I came up coughing and furious, my arms going the way arms go when a body fights drowning. I reached the wall and pulled myself out. Lou stood there watching, not laughing, just paying attention the way a man does when he’s handed his kid something he’ll need. I got back in the water the next time, and the time after that.</w:t>
+      </w:r>
+    </w:p>
+    <w:p>
+      <w:pPr>
+        <w:pStyle w:val="BodyText"/>
+      </w:pPr>
+      <w:r>
+        <w:t xml:space="preserve">His whole hobby was us. Saturday mornings at the batting cages in Woodridge, his hands on my shoulders fixing my stance, not because I was ever going to play ball but because he believed doing a thing right was a habit worth building. Soccer fields in the New Jersey cold, Lou on the sideline in a coat he didn’t need to be wearing, watching me play a sport I was actually pretty good at. I took it all for granted, the way a child is supposed to do with childhood.</w:t>
+      </w:r>
+    </w:p>
+    <w:p>
+      <w:pPr>
+        <w:pStyle w:val="BodyText"/>
+      </w:pPr>
+      <w:r>
+        <w:t xml:space="preserve">Lou and my mother decided early that Chris and I would be raised in church. It wasn’t up for discussion. Sunday mornings, confirmation, and at thirteen I chose God and accepted Him into my heart. It was mine — the first real decision I ever made for myself besides taking Lou as my middle name. I meant it. I’d lose the thread of it for a long time, the drinking years, California, the stretch when I was too busy performing life to remember what mine was built on. I left my faith, but it waited for me to return.</w:t>
+      </w:r>
+    </w:p>
+    <w:p>
+      <w:pPr>
+        <w:pStyle w:val="BodyText"/>
+      </w:pPr>
+      <w:r>
+        <w:t xml:space="preserve">We moved to Ramsey when I was in sixth grade. Bigger house, new school, a town where the kids had known each other since before I showed up, and I came in as the new boy with dark olive skin and features that didn’t match the rest of Bergen County.</w:t>
+      </w:r>
+    </w:p>
+    <w:p>
+      <w:pPr>
+        <w:pStyle w:val="BodyText"/>
+      </w:pPr>
+      <w:r>
+        <w:t xml:space="preserve">At lunch I sat at the end of the table, in the back corner, trying to be invisible and still wanting to be let in. It wasn’t long before they started in on me.</w:t>
+      </w:r>
+    </w:p>
+    <w:p>
+      <w:pPr>
+        <w:pStyle w:val="BodyText"/>
+      </w:pPr>
+      <w:r>
+        <w:t xml:space="preserve">Lou couldn’t fix school for me. He was home when I got there.</w:t>
+      </w:r>
+    </w:p>
+    <w:p>
+      <w:pPr>
+        <w:pStyle w:val="BodyText"/>
+      </w:pPr>
+      <w:r>
+        <w:t xml:space="preserve">The school paired me with a buddy to show me around those first weeks, a kid everybody called Whitey. We didn’t get close then — that year I was mostly on my own. But by high school, Whitey had become one of my best friends, and all these years later, he still is. When I got into Miami of Ohio, part of me hoped Whitey would land there too, an easy way to carry the friendship forward. He chose Bates College, up in Maine.</w:t>
+      </w:r>
+    </w:p>
+    <w:p>
+      <w:pPr>
+        <w:pStyle w:val="BodyText"/>
+      </w:pPr>
+      <w:r>
+        <w:t xml:space="preserve">And there was my neighbor Rich, a fellow member of the school’s wrestling team. We were always into something together. In high school he turned himself into an overachiever at it — the way he was at everything he touched.</w:t>
+      </w:r>
+    </w:p>
+    <w:p>
+      <w:pPr>
+        <w:pStyle w:val="BodyText"/>
+      </w:pPr>
+      <w:r>
+        <w:t xml:space="preserve">The year I left for college my mother told Lou she was done. He didn’t take it well. He wanted the unit held together — that was the thing he had built, and he wasn’t ready to watch it come apart.</w:t>
+      </w:r>
+    </w:p>
+    <w:p>
+      <w:pPr>
+        <w:pStyle w:val="BodyText"/>
+      </w:pPr>
+      <w:r>
         <w:t xml:space="preserve">Lou was no saint, and I won’t pretend he was. He had a temper that showed up at the wrong moments, and he knew that about himself. Once a mood had him, it was hard to pull him out of it.</w:t>
       </w:r>
     </w:p>
@@ -2605,76 +2911,111 @@
           <w:i/>
           <w:highlight w:val="yellow"/>
         </w:rPr>
-        <w:t xml:space="preserve">[PLACEHOLDER. One evening of the temper, drafted to hold the place until Rob replaces it with a true one.]</w:t>
-      </w:r>
-    </w:p>
-    <w:p>
-      <w:pPr>
-        <w:pStyle w:val="BodyText"/>
-      </w:pPr>
-      <w:r>
-        <w:rPr>
-          <w:highlight w:val="yellow"/>
-        </w:rPr>
-        <w:t xml:space="preserve">The night I remember, he’d come in late from the city, eaten standing up, and gone down on the couch with the television going. He had told us to keep it down. Chris and I got into something upstairs, a game, an argument, I don’t remember which, and it got loud, and it woke him.</w:t>
-      </w:r>
-    </w:p>
-    <w:p>
-      <w:pPr>
-        <w:pStyle w:val="BodyText"/>
-      </w:pPr>
-      <w:r>
-        <w:rPr>
-          <w:highlight w:val="yellow"/>
-        </w:rPr>
-        <w:t xml:space="preserve">He came up off that couch already yelling, and this time it was at me.</w:t>
-      </w:r>
-      <w:r>
-        <w:rPr>
-          <w:highlight w:val="yellow"/>
-        </w:rPr>
-        <w:t xml:space="preserve"> </w:t>
-      </w:r>
-      <w:r>
-        <w:rPr>
-          <w:highlight w:val="yellow"/>
-        </w:rPr>
-        <w:t xml:space="preserve">“</w:t>
-      </w:r>
-      <w:r>
-        <w:rPr>
-          <w:highlight w:val="yellow"/>
-        </w:rPr>
-        <w:t xml:space="preserve">What did I tell you? What did I tell you?</w:t>
-      </w:r>
-      <w:r>
-        <w:rPr>
-          <w:highlight w:val="yellow"/>
-        </w:rPr>
-        <w:t xml:space="preserve">”</w:t>
-      </w:r>
-      <w:r>
-        <w:rPr>
-          <w:highlight w:val="yellow"/>
-        </w:rPr>
-        <w:t xml:space="preserve"> </w:t>
-      </w:r>
-      <w:r>
-        <w:rPr>
-          <w:highlight w:val="yellow"/>
-        </w:rPr>
-        <w:t xml:space="preserve">He said it more than once, louder each time, coming up the stairs. My mother came out of the bedroom and said his name, and he didn’t answer her. Chris was behind me in the doorway, not moving. I stood there and took it.</w:t>
-      </w:r>
-    </w:p>
-    <w:p>
-      <w:pPr>
-        <w:pStyle w:val="BodyText"/>
-      </w:pPr>
-      <w:r>
-        <w:rPr>
-          <w:highlight w:val="yellow"/>
-        </w:rPr>
-        <w:t xml:space="preserve">In the morning he was at the counter in a pressed shirt making our lunches. He didn’t say anything about it, and neither did I. He drove us to school.</w:t>
+        <w:t xml:space="preserve">[PLACEHOLDER. One evening of the temper, reconstructed. Rob replaces it with the night he remembers.]</w:t>
+      </w:r>
+    </w:p>
+    <w:p>
+      <w:pPr>
+        <w:pStyle w:val="BodyText"/>
+      </w:pPr>
+      <w:r>
+        <w:rPr>
+          <w:highlight w:val="yellow"/>
+        </w:rPr>
+        <w:t xml:space="preserve">The night I remember, the Yankees were on and we were told to keep it down. Chris and I got into something upstairs, the kind of fight two boys have over nothing, and it got loud, and it got loud right when the game got close. I heard the recliner. I heard him on the stairs. By the time the door opened I was already where I went, knees up on the far side of the bed, small, the hallway light coming in around him.</w:t>
+      </w:r>
+    </w:p>
+    <w:p>
+      <w:pPr>
+        <w:pStyle w:val="BodyText"/>
+      </w:pPr>
+      <w:r>
+        <w:rPr>
+          <w:highlight w:val="yellow"/>
+        </w:rPr>
+        <w:t xml:space="preserve">“</w:t>
+      </w:r>
+      <w:r>
+        <w:rPr>
+          <w:highlight w:val="yellow"/>
+        </w:rPr>
+        <w:t xml:space="preserve">Whatsa matter with the two of yous? I got a game on and I gotta hear you through the ceiling.</w:t>
+      </w:r>
+      <w:r>
+        <w:rPr>
+          <w:highlight w:val="yellow"/>
+        </w:rPr>
+        <w:t xml:space="preserve">”</w:t>
+      </w:r>
+      <w:r>
+        <w:rPr>
+          <w:highlight w:val="yellow"/>
+        </w:rPr>
+        <w:t xml:space="preserve"> </w:t>
+      </w:r>
+      <w:r>
+        <w:rPr>
+          <w:highlight w:val="yellow"/>
+        </w:rPr>
+        <w:t xml:space="preserve">Then louder, at me, because I was the older one.</w:t>
+      </w:r>
+      <w:r>
+        <w:rPr>
+          <w:highlight w:val="yellow"/>
+        </w:rPr>
+        <w:t xml:space="preserve"> </w:t>
+      </w:r>
+      <w:r>
+        <w:rPr>
+          <w:highlight w:val="yellow"/>
+        </w:rPr>
+        <w:t xml:space="preserve">“</w:t>
+      </w:r>
+      <w:r>
+        <w:rPr>
+          <w:highlight w:val="yellow"/>
+        </w:rPr>
+        <w:t xml:space="preserve">Every night. Every night with this.</w:t>
+      </w:r>
+      <w:r>
+        <w:rPr>
+          <w:highlight w:val="yellow"/>
+        </w:rPr>
+        <w:t xml:space="preserve">”</w:t>
+      </w:r>
+      <w:r>
+        <w:rPr>
+          <w:highlight w:val="yellow"/>
+        </w:rPr>
+        <w:t xml:space="preserve"> </w:t>
+      </w:r>
+      <w:r>
+        <w:rPr>
+          <w:highlight w:val="yellow"/>
+        </w:rPr>
+        <w:t xml:space="preserve">He wasn’t done, and none of the rest of it was anything I’d repeat, and none of it was anything I hadn’t heard a grown man say before. That was the part that scared me. Not the words. That I knew the shape of it from another house.</w:t>
+      </w:r>
+    </w:p>
+    <w:p>
+      <w:pPr>
+        <w:pStyle w:val="BodyText"/>
+      </w:pPr>
+      <w:r>
+        <w:rPr>
+          <w:highlight w:val="yellow"/>
+        </w:rPr>
+        <w:t xml:space="preserve">My mother said his name from the hall, once, and he didn’t answer her. He shut the door harder than he meant to. Chris didn’t say anything, and I didn’t, and downstairs the game came back up.</w:t>
+      </w:r>
+    </w:p>
+    <w:p>
+      <w:pPr>
+        <w:pStyle w:val="BodyText"/>
+      </w:pPr>
+      <w:r>
+        <w:rPr>
+          <w:highlight w:val="yellow"/>
+        </w:rPr>
+        <w:t xml:space="preserve">In the morning he was at the counter in a pressed shirt making our lunches. He didn’t say anything about it, and neither did I. He drove us to school. I left the lunch in the bag that day and threw it out behind the gym, which is the only way I had of saying anything back. He never knew. I’ve never told him. I’m telling him now.</w:t>
       </w:r>
     </w:p>
     <w:p>
@@ -2688,312 +3029,6 @@
           <w:highlight w:val="yellow"/>
         </w:rPr>
         <w:t xml:space="preserve">[END PLACEHOLDER.]</w:t>
-      </w:r>
-    </w:p>
-    <w:p>
-      <w:pPr>
-        <w:pStyle w:val="BodyText"/>
-      </w:pPr>
-      <w:r>
-        <w:t xml:space="preserve">Lou’s upbringing explained some of it. His father sold produce. When men in suits walked into his market, his father went out back to discuss things in private. When relatives came over from Italy, Lou was the boy who lost his bed to them and slept in the attic. He carried that longer than anybody knew. Years later, during a stretch when he was going to therapy, he recalled a family Christmas and an old man yelling at his uncle about a boy who had to sleep in the attic. The temper was the Italian kind you see in the movies. It was older than any of us, and it was never about us.</w:t>
-      </w:r>
-    </w:p>
-    <w:p>
-      <w:pPr>
-        <w:pStyle w:val="BodyText"/>
-      </w:pPr>
-      <w:r>
-        <w:t xml:space="preserve">He had three kids before he was twenty-five. His first wife, Judy, was a couple of years younger and fighting postpartum depression in an era that had no name for it and no help. To avoid her moods, he stayed out late some nights, partying. The marriage couldn’t hold, and the kids spent most of their time with his mother, Mag.</w:t>
-      </w:r>
-    </w:p>
-    <w:p>
-      <w:pPr>
-        <w:pStyle w:val="BodyText"/>
-      </w:pPr>
-      <w:r>
-        <w:t xml:space="preserve">“</w:t>
-      </w:r>
-      <w:r>
-        <w:t xml:space="preserve">No excuses,</w:t>
-      </w:r>
-      <w:r>
-        <w:t xml:space="preserve">”</w:t>
-      </w:r>
-      <w:r>
-        <w:t xml:space="preserve"> </w:t>
-      </w:r>
-      <w:r>
-        <w:t xml:space="preserve">he confided in me years later.</w:t>
-      </w:r>
-      <w:r>
-        <w:t xml:space="preserve"> </w:t>
-      </w:r>
-      <w:r>
-        <w:t xml:space="preserve">“</w:t>
-      </w:r>
-      <w:r>
-        <w:t xml:space="preserve">I wasn’t the best dad. My kids deserved a better one than the one they got.</w:t>
-      </w:r>
-      <w:r>
-        <w:t xml:space="preserve">”</w:t>
-      </w:r>
-    </w:p>
-    <w:p>
-      <w:pPr>
-        <w:pStyle w:val="BodyText"/>
-      </w:pPr>
-      <w:r>
-        <w:t xml:space="preserve">Then there was Mag, who babysat Chris and me when we were boys. I saw her as the goddess of comfort. Friendly’s when she was watching us. TV together on the couch. Some nights she’d fry hamburgers in butter in a pan, and I can still taste them. Whenever I lobbied for White Castle, she waved off my suggestion — she didn’t like driving on the highway, and that was that.</w:t>
-      </w:r>
-      <w:r>
-        <w:t xml:space="preserve"> </w:t>
-      </w:r>
-      <w:r>
-        <w:t xml:space="preserve">“</w:t>
-      </w:r>
-      <w:r>
-        <w:t xml:space="preserve">You telling me I can’t make a better hamburger right here?</w:t>
-      </w:r>
-      <w:r>
-        <w:t xml:space="preserve">”</w:t>
-      </w:r>
-      <w:r>
-        <w:t xml:space="preserve"> </w:t>
-      </w:r>
-      <w:r>
-        <w:t xml:space="preserve">she’d ask in mock offense.</w:t>
-      </w:r>
-    </w:p>
-    <w:p>
-      <w:pPr>
-        <w:pStyle w:val="BodyText"/>
-      </w:pPr>
-      <w:r>
-        <w:t xml:space="preserve">A die-hard Yankees fan, she passed that passion on to Lou. If the games weren’t televised, she’d listen on the radio. When she got tired, she’d take the radio to bed and listen until she fell asleep.</w:t>
-      </w:r>
-    </w:p>
-    <w:p>
-      <w:pPr>
-        <w:pStyle w:val="BodyText"/>
-      </w:pPr>
-      <w:r>
-        <w:t xml:space="preserve">Lou worked IT most of his life, a lot of it on the help desk, the guy you call when the thing won’t work. He didn’t stop until he was eighty-two. Never wealthy, Lou always angled for a second income to help pay the bills. For a while he had a booth at the Union Flea Market, called Lew’s, a different spelling of his own name. I hated every Saturday I spent working it, but nobody asked. Left alone on Sundays, he watched his games: the Yankees in the summer, the Giants in the fall. That was the whole vice.</w:t>
-      </w:r>
-    </w:p>
-    <w:p>
-      <w:pPr>
-        <w:pStyle w:val="BodyText"/>
-      </w:pPr>
-      <w:r>
-        <w:t xml:space="preserve">People asked Lou why he decided to take on somebody else’s two boys. He never dressed up the answer.</w:t>
-      </w:r>
-    </w:p>
-    <w:p>
-      <w:pPr>
-        <w:pStyle w:val="BodyText"/>
-      </w:pPr>
-      <w:r>
-        <w:t xml:space="preserve">“</w:t>
-      </w:r>
-      <w:r>
-        <w:t xml:space="preserve">Have you seen their mother? She’s drop-dead gorgeous. Beautiful and ten years younger than me. You do the math.</w:t>
-      </w:r>
-      <w:r>
-        <w:t xml:space="preserve">”</w:t>
-      </w:r>
-    </w:p>
-    <w:p>
-      <w:pPr>
-        <w:pStyle w:val="BodyText"/>
-      </w:pPr>
-      <w:r>
-        <w:t xml:space="preserve">That was the honest start of it. The staying part he never explained.</w:t>
-      </w:r>
-    </w:p>
-    <w:p>
-      <w:pPr>
-        <w:pStyle w:val="BodyText"/>
-      </w:pPr>
-      <w:r>
-        <w:t xml:space="preserve">Lou and Mom married at Pines Lake, in Wayne, New Jersey, where Aunt Terry’s family lived, the same place the Halloween candy hit the kitchen floor. Around the time Lou came into our lives, we left West Paterson for a house of our own in Woodridge. That was the home of my grade-school years, before Ramsey.</w:t>
-      </w:r>
-    </w:p>
-    <w:p>
-      <w:pPr>
-        <w:pStyle w:val="BodyText"/>
-      </w:pPr>
-      <w:r>
-        <w:t xml:space="preserve">He adopted us when I was eight. The paperwork had taken years. International adoption in the eighties crawled and required everything in triplicate. Lou wasn’t a patient man by nature, but he was patient in practice. He made the trips, sat in the offices, signed what they put in front of him, and waited for the next form.</w:t>
-      </w:r>
-    </w:p>
-    <w:p>
-      <w:pPr>
-        <w:pStyle w:val="BodyText"/>
-      </w:pPr>
-      <w:r>
-        <w:t xml:space="preserve">When the time came to change our names, my mother told me Grandpa wanted to ask me something. We went down to the basement of the Woodridge house, surrounded by wood paneling, brown shag carpet, and the cool stale smell of basement air. Grandpa Bob sat me down and got to the point the way he always did.</w:t>
-      </w:r>
-    </w:p>
-    <w:p>
-      <w:pPr>
-        <w:pStyle w:val="BodyText"/>
-      </w:pPr>
-      <w:r>
-        <w:t xml:space="preserve">“</w:t>
-      </w:r>
-      <w:r>
-        <w:t xml:space="preserve">Change your first name to Robert,</w:t>
-      </w:r>
-      <w:r>
-        <w:t xml:space="preserve">”</w:t>
-      </w:r>
-      <w:r>
-        <w:t xml:space="preserve"> </w:t>
-      </w:r>
-      <w:r>
-        <w:t xml:space="preserve">he said.</w:t>
-      </w:r>
-      <w:r>
-        <w:t xml:space="preserve"> </w:t>
-      </w:r>
-      <w:r>
-        <w:t xml:space="preserve">“</w:t>
-      </w:r>
-      <w:r>
-        <w:t xml:space="preserve">Rob. And I’ll give you a hundred dollars.</w:t>
-      </w:r>
-      <w:r>
-        <w:t xml:space="preserve">”</w:t>
-      </w:r>
-    </w:p>
-    <w:p>
-      <w:pPr>
-        <w:pStyle w:val="BodyText"/>
-      </w:pPr>
-      <w:r>
-        <w:t xml:space="preserve">I was eight. A hundred dollars was a fortune. I didn’t even have to think about it.</w:t>
-      </w:r>
-    </w:p>
-    <w:p>
-      <w:pPr>
-        <w:pStyle w:val="BodyText"/>
-      </w:pPr>
-      <w:r>
-        <w:t xml:space="preserve">“</w:t>
-      </w:r>
-      <w:r>
-        <w:t xml:space="preserve">Okay,</w:t>
-      </w:r>
-      <w:r>
-        <w:t xml:space="preserve">”</w:t>
-      </w:r>
-      <w:r>
-        <w:t xml:space="preserve"> </w:t>
-      </w:r>
-      <w:r>
-        <w:t xml:space="preserve">I said.</w:t>
-      </w:r>
-    </w:p>
-    <w:p>
-      <w:pPr>
-        <w:pStyle w:val="BodyText"/>
-      </w:pPr>
-      <w:r>
-        <w:t xml:space="preserve">Then I asked him something he hadn’t planned for.</w:t>
-      </w:r>
-    </w:p>
-    <w:p>
-      <w:pPr>
-        <w:pStyle w:val="BodyText"/>
-      </w:pPr>
-      <w:r>
-        <w:t xml:space="preserve">“</w:t>
-      </w:r>
-      <w:r>
-        <w:t xml:space="preserve">Can my middle name be Lou?</w:t>
-      </w:r>
-      <w:r>
-        <w:t xml:space="preserve">”</w:t>
-      </w:r>
-    </w:p>
-    <w:p>
-      <w:pPr>
-        <w:pStyle w:val="BodyText"/>
-      </w:pPr>
-      <w:r>
-        <w:t xml:space="preserve">Nobody had suggested it. That day Claudio Horacio Balderas became Robert Louis Brizzi. I had carried one father’s name in the middle of mine my whole life. Now I would carry the other’s. I’ve never once wished it back.</w:t>
-      </w:r>
-    </w:p>
-    <w:p>
-      <w:pPr>
-        <w:pStyle w:val="BodyText"/>
-      </w:pPr>
-      <w:r>
-        <w:t xml:space="preserve">When I was six, Lou taught me to swim by carrying me to the edge of the pool and throwing me in. I came up coughing and furious, my arms going the way arms go when a body fights drowning. I reached the wall and pulled myself out. Lou stood there watching, not laughing, just paying attention the way a man does when he’s handed his kid something he’ll need. I got back in the water the next time, and the time after that.</w:t>
-      </w:r>
-    </w:p>
-    <w:p>
-      <w:pPr>
-        <w:pStyle w:val="BodyText"/>
-      </w:pPr>
-      <w:r>
-        <w:t xml:space="preserve">His whole hobby was us. Saturday mornings at the batting cages in Woodridge, his hands on my shoulders fixing my stance, not because I was ever going to play ball but because he believed doing a thing right was a habit worth building. Soccer fields in the New Jersey cold, Lou on the sideline in a coat he didn’t need to be wearing, watching me play a sport I was actually pretty good at. I took it all for granted, the way a child is supposed to do with childhood.</w:t>
-      </w:r>
-    </w:p>
-    <w:p>
-      <w:pPr>
-        <w:pStyle w:val="BodyText"/>
-      </w:pPr>
-      <w:r>
-        <w:t xml:space="preserve">Lou and my mother decided early that Chris and I would be raised in church. It wasn’t up for discussion. Sunday mornings, confirmation, and at thirteen I chose God and accepted Him into my heart. It was mine — the first real decision I ever made for myself besides taking Lou as my middle name. I meant it. I’d lose the thread of it for a long time, the drinking years, California, the stretch when I was too busy performing life to remember what mine was built on. I left my faith, but it waited for me to return.</w:t>
-      </w:r>
-    </w:p>
-    <w:p>
-      <w:pPr>
-        <w:pStyle w:val="BodyText"/>
-      </w:pPr>
-      <w:r>
-        <w:t xml:space="preserve">We moved to Ramsey when I was in sixth grade. Bigger house, new school, a town where the kids had known each other since before I showed up, and I came in as the new boy with dark olive skin and features that didn’t match the rest of Bergen County.</w:t>
-      </w:r>
-    </w:p>
-    <w:p>
-      <w:pPr>
-        <w:pStyle w:val="BodyText"/>
-      </w:pPr>
-      <w:r>
-        <w:t xml:space="preserve">At lunch I sat at the end of the table, in the back corner, trying to be invisible and still wanting to be let in. It wasn’t long before they started in on me.</w:t>
-      </w:r>
-    </w:p>
-    <w:p>
-      <w:pPr>
-        <w:pStyle w:val="BodyText"/>
-      </w:pPr>
-      <w:r>
-        <w:t xml:space="preserve">Lou couldn’t fix school for me. He was home when I got there.</w:t>
-      </w:r>
-    </w:p>
-    <w:p>
-      <w:pPr>
-        <w:pStyle w:val="BodyText"/>
-      </w:pPr>
-      <w:r>
-        <w:t xml:space="preserve">The school paired me with a buddy to show me around those first weeks, a kid everybody called Whitey. We didn’t get close then — that year I was mostly on my own. But by high school, Whitey had become one of my best friends, and all these years later, he still is. When I got into Miami of Ohio, part of me hoped Whitey would land there too, an easy way to carry the friendship forward. He chose Bates College, up in Maine.</w:t>
-      </w:r>
-    </w:p>
-    <w:p>
-      <w:pPr>
-        <w:pStyle w:val="BodyText"/>
-      </w:pPr>
-      <w:r>
-        <w:t xml:space="preserve">And there was my neighbor Rich, a fellow member of the school’s wrestling team. We were always into something together. In high school he turned himself into an overachiever at it — the way he was at everything he touched.</w:t>
-      </w:r>
-    </w:p>
-    <w:p>
-      <w:pPr>
-        <w:pStyle w:val="BodyText"/>
-      </w:pPr>
-      <w:r>
-        <w:t xml:space="preserve">The year I left for college my mother told Lou she was done. He didn’t take it well. He wanted the unit held together — that was the thing he had built, and he wasn’t ready to watch it come apart.</w:t>
       </w:r>
     </w:p>
     <w:p>
@@ -3086,6 +3121,148 @@
           <w:b/>
         </w:rPr>
         <w:t xml:space="preserve">New Jersey, 1986</w:t>
+      </w:r>
+    </w:p>
+    <w:p>
+      <w:pPr>
+        <w:pStyle w:val="BodyText"/>
+      </w:pPr>
+      <w:r>
+        <w:rPr>
+          <w:iCs/>
+          <w:i/>
+          <w:highlight w:val="yellow"/>
+        </w:rPr>
+        <w:t xml:space="preserve">[PLACEHOLDER. The first Saturday, reconstructed. Rob replaces it with the one he remembers.]</w:t>
+      </w:r>
+    </w:p>
+    <w:p>
+      <w:pPr>
+        <w:pStyle w:val="BodyText"/>
+      </w:pPr>
+      <w:r>
+        <w:rPr>
+          <w:highlight w:val="yellow"/>
+        </w:rPr>
+        <w:t xml:space="preserve">He came by on a Saturday morning before he lived with us, in the tan car, and there was a white plastic bucket on the passenger seat with a lid on it. I thought it was paint. It was baseballs, most of them scuffed gray, a few with the stitching gone soft, and a glove that was too big for me that he’d gotten from somebody at work.</w:t>
+      </w:r>
+    </w:p>
+    <w:p>
+      <w:pPr>
+        <w:pStyle w:val="BodyText"/>
+      </w:pPr>
+      <w:r>
+        <w:rPr>
+          <w:highlight w:val="yellow"/>
+        </w:rPr>
+        <w:t xml:space="preserve">We went to the field behind the school. He didn’t explain anything. He walked out to the middle of the grass with the bucket and a bat and said,</w:t>
+      </w:r>
+      <w:r>
+        <w:rPr>
+          <w:highlight w:val="yellow"/>
+        </w:rPr>
+        <w:t xml:space="preserve"> </w:t>
+      </w:r>
+      <w:r>
+        <w:rPr>
+          <w:highlight w:val="yellow"/>
+        </w:rPr>
+        <w:t xml:space="preserve">“</w:t>
+      </w:r>
+      <w:r>
+        <w:rPr>
+          <w:highlight w:val="yellow"/>
+        </w:rPr>
+        <w:t xml:space="preserve">Go stand out there,</w:t>
+      </w:r>
+      <w:r>
+        <w:rPr>
+          <w:highlight w:val="yellow"/>
+        </w:rPr>
+        <w:t xml:space="preserve">”</w:t>
+      </w:r>
+      <w:r>
+        <w:rPr>
+          <w:highlight w:val="yellow"/>
+        </w:rPr>
+        <w:t xml:space="preserve"> </w:t>
+      </w:r>
+      <w:r>
+        <w:rPr>
+          <w:highlight w:val="yellow"/>
+        </w:rPr>
+        <w:t xml:space="preserve">and pointed, and I went and stood out there. Then he hit me a ball. It went over my head. He hit me another one. I got my glove on it and it fell out. He didn’t say anything about that either. He reached into the bucket and hit me another one.</w:t>
+      </w:r>
+    </w:p>
+    <w:p>
+      <w:pPr>
+        <w:pStyle w:val="BodyText"/>
+      </w:pPr>
+      <w:r>
+        <w:rPr>
+          <w:highlight w:val="yellow"/>
+        </w:rPr>
+        <w:t xml:space="preserve">I don’t know how many. The bucket got empty and he walked out with me to pick them all up, and we filled it, and he walked back and did it again. Somewhere in the second bucket I caught one and held it, and I looked up, and he was already reaching for the next ball. That was the whole reaction. He hit me a hundred, then a hundred more, and when the sun got on top of us he said,</w:t>
+      </w:r>
+      <w:r>
+        <w:rPr>
+          <w:highlight w:val="yellow"/>
+        </w:rPr>
+        <w:t xml:space="preserve"> </w:t>
+      </w:r>
+      <w:r>
+        <w:rPr>
+          <w:highlight w:val="yellow"/>
+        </w:rPr>
+        <w:t xml:space="preserve">“</w:t>
+      </w:r>
+      <w:r>
+        <w:rPr>
+          <w:highlight w:val="yellow"/>
+        </w:rPr>
+        <w:t xml:space="preserve">That’s enough for today,</w:t>
+      </w:r>
+      <w:r>
+        <w:rPr>
+          <w:highlight w:val="yellow"/>
+        </w:rPr>
+        <w:t xml:space="preserve">”</w:t>
+      </w:r>
+      <w:r>
+        <w:rPr>
+          <w:highlight w:val="yellow"/>
+        </w:rPr>
+        <w:t xml:space="preserve"> </w:t>
+      </w:r>
+      <w:r>
+        <w:rPr>
+          <w:highlight w:val="yellow"/>
+        </w:rPr>
+        <w:t xml:space="preserve">which meant there would be another day.</w:t>
+      </w:r>
+    </w:p>
+    <w:p>
+      <w:pPr>
+        <w:pStyle w:val="BodyText"/>
+      </w:pPr>
+      <w:r>
+        <w:rPr>
+          <w:highlight w:val="yellow"/>
+        </w:rPr>
+        <w:t xml:space="preserve">My mother had lunch on the table when we got back. He didn’t stay for it. He set the bucket down inside our door like it lived there now, and I understood, without anyone saying it, that it did.</w:t>
+      </w:r>
+    </w:p>
+    <w:p>
+      <w:pPr>
+        <w:pStyle w:val="BodyText"/>
+      </w:pPr>
+      <w:r>
+        <w:rPr>
+          <w:iCs/>
+          <w:i/>
+          <w:highlight w:val="yellow"/>
+        </w:rPr>
+        <w:t xml:space="preserve">[END PLACEHOLDER.]</w:t>
       </w:r>
     </w:p>
     <w:p>
@@ -5157,7 +5334,7 @@
         <w:pStyle w:val="BodyText"/>
       </w:pPr>
       <w:r>
-        <w:t xml:space="preserve">Years later we’re at my sister Lisa’s place in Sarasota, walking into breakfast at Another Broken Egg, and my dad spots a guy outside. His face lights up. Dickie V! The guy turns, and it’s Dick Vitale — the actual Dick Vitale. They’d been friends back in the same part of Jersey, and my dad had been telling me about it for years. Me and Dickie V. I’d nod the way you nod at a man who also swore the lawn was being handled by a goat. Then one morning there’s Dickie V himself, turning around at the sound of my father’s voice and lighting up right back at him.</w:t>
+        <w:t xml:space="preserve">Years later we’re at my sister Lisa’s place in Sarasota, walking into breakfast at Another Broken Egg, and my dad spots a guy outside. His face lights up. Dickie V! The guy turns, and it’s Dick Vitale — the actual Dick Vitale. They’d been friends back in the same part of Jersey, and my dad had been telling me about it for years. Me and Dickie V. I’d nod the way you nod at a man who also swore the lawn was being handled by somebody who worked for free. Then one morning there’s Dickie V himself, turning around at the sound of my father’s voice and lighting up right back at him.</w:t>
       </w:r>
     </w:p>
     <w:p>
@@ -7123,6 +7300,205 @@
         <w:pStyle w:val="BodyText"/>
       </w:pPr>
       <w:r>
+        <w:rPr>
+          <w:iCs/>
+          <w:i/>
+          <w:highlight w:val="yellow"/>
+        </w:rPr>
+        <w:t xml:space="preserve">[PLACEHOLDER. One of the calls, reconstructed. Rob replaces it with a call he remembers.]</w:t>
+      </w:r>
+    </w:p>
+    <w:p>
+      <w:pPr>
+        <w:pStyle w:val="BodyText"/>
+      </w:pPr>
+      <w:r>
+        <w:rPr>
+          <w:highlight w:val="yellow"/>
+        </w:rPr>
+        <w:t xml:space="preserve">I can give you one of the calls. It was a Tuesday, because Tuesday was when the pharmacy would fill it, and I called her from the balcony so she’d hear traffic and think I was out.</w:t>
+      </w:r>
+    </w:p>
+    <w:p>
+      <w:pPr>
+        <w:pStyle w:val="BodyText"/>
+      </w:pPr>
+      <w:r>
+        <w:rPr>
+          <w:highlight w:val="yellow"/>
+        </w:rPr>
+        <w:t xml:space="preserve">“</w:t>
+      </w:r>
+      <w:r>
+        <w:rPr>
+          <w:highlight w:val="yellow"/>
+        </w:rPr>
+        <w:t xml:space="preserve">Ma. Hey. Listen, rent’s due Friday and they moved the commission checks to the fifteenth.</w:t>
+      </w:r>
+      <w:r>
+        <w:rPr>
+          <w:highlight w:val="yellow"/>
+        </w:rPr>
+        <w:t xml:space="preserve">”</w:t>
+      </w:r>
+      <w:r>
+        <w:rPr>
+          <w:highlight w:val="yellow"/>
+        </w:rPr>
+        <w:t xml:space="preserve"> </w:t>
+      </w:r>
+      <w:r>
+        <w:rPr>
+          <w:highlight w:val="yellow"/>
+        </w:rPr>
+        <w:t xml:space="preserve">I had rehearsed the sentence. I had the number ready, four hundred, which was rent minus what I’d already spent of it.</w:t>
+      </w:r>
+    </w:p>
+    <w:p>
+      <w:pPr>
+        <w:pStyle w:val="BodyText"/>
+      </w:pPr>
+      <w:r>
+        <w:rPr>
+          <w:highlight w:val="yellow"/>
+        </w:rPr>
+        <w:t xml:space="preserve">“</w:t>
+      </w:r>
+      <w:r>
+        <w:rPr>
+          <w:highlight w:val="yellow"/>
+        </w:rPr>
+        <w:t xml:space="preserve">Are you eating?</w:t>
+      </w:r>
+      <w:r>
+        <w:rPr>
+          <w:highlight w:val="yellow"/>
+        </w:rPr>
+        <w:t xml:space="preserve">”</w:t>
+      </w:r>
+    </w:p>
+    <w:p>
+      <w:pPr>
+        <w:pStyle w:val="BodyText"/>
+      </w:pPr>
+      <w:r>
+        <w:rPr>
+          <w:highlight w:val="yellow"/>
+        </w:rPr>
+        <w:t xml:space="preserve">“</w:t>
+      </w:r>
+      <w:r>
+        <w:rPr>
+          <w:highlight w:val="yellow"/>
+        </w:rPr>
+        <w:t xml:space="preserve">I’m eating.</w:t>
+      </w:r>
+      <w:r>
+        <w:rPr>
+          <w:highlight w:val="yellow"/>
+        </w:rPr>
+        <w:t xml:space="preserve">”</w:t>
+      </w:r>
+      <w:r>
+        <w:rPr>
+          <w:highlight w:val="yellow"/>
+        </w:rPr>
+        <w:t xml:space="preserve"> </w:t>
+      </w:r>
+      <w:r>
+        <w:rPr>
+          <w:highlight w:val="yellow"/>
+        </w:rPr>
+        <w:t xml:space="preserve">I was not eating. There were two yogurts in the refrigerator and I don’t know how old they were.</w:t>
+      </w:r>
+    </w:p>
+    <w:p>
+      <w:pPr>
+        <w:pStyle w:val="BodyText"/>
+      </w:pPr>
+      <w:r>
+        <w:rPr>
+          <w:highlight w:val="yellow"/>
+        </w:rPr>
+        <w:t xml:space="preserve">“</w:t>
+      </w:r>
+      <w:r>
+        <w:rPr>
+          <w:highlight w:val="yellow"/>
+        </w:rPr>
+        <w:t xml:space="preserve">Are you taking your medicine right? Like the doctor said?</w:t>
+      </w:r>
+      <w:r>
+        <w:rPr>
+          <w:highlight w:val="yellow"/>
+        </w:rPr>
+        <w:t xml:space="preserve">”</w:t>
+      </w:r>
+    </w:p>
+    <w:p>
+      <w:pPr>
+        <w:pStyle w:val="BodyText"/>
+      </w:pPr>
+      <w:r>
+        <w:rPr>
+          <w:highlight w:val="yellow"/>
+        </w:rPr>
+        <w:t xml:space="preserve">“</w:t>
+      </w:r>
+      <w:r>
+        <w:rPr>
+          <w:highlight w:val="yellow"/>
+        </w:rPr>
+        <w:t xml:space="preserve">Like the doctor said.</w:t>
+      </w:r>
+      <w:r>
+        <w:rPr>
+          <w:highlight w:val="yellow"/>
+        </w:rPr>
+        <w:t xml:space="preserve">”</w:t>
+      </w:r>
+      <w:r>
+        <w:rPr>
+          <w:highlight w:val="yellow"/>
+        </w:rPr>
+        <w:t xml:space="preserve"> </w:t>
+      </w:r>
+      <w:r>
+        <w:rPr>
+          <w:highlight w:val="yellow"/>
+        </w:rPr>
+        <w:t xml:space="preserve">That one I said fast. It was the only question I could not stand to hear her ask, and she asked it every time, in the same voice, and every time I answered it the same way, and she wired the money. She said she’d go to Western Union at lunch. She said she loved me. I said it back, and I meant it, which is the part I have never been able to explain to anyone who hasn’t done this. I meant it while I was lying to her. I meant it while I was already putting my shoes on.</w:t>
+      </w:r>
+    </w:p>
+    <w:p>
+      <w:pPr>
+        <w:pStyle w:val="BodyText"/>
+      </w:pPr>
+      <w:r>
+        <w:rPr>
+          <w:highlight w:val="yellow"/>
+        </w:rPr>
+        <w:t xml:space="preserve">The wire landed at 1:40. By 2:15 I had the bottle. By dark the rest of the four hundred was gone, and I was in a place with no windows telling a girl whose name I never got that my father was a big deal in New Jersey.</w:t>
+      </w:r>
+    </w:p>
+    <w:p>
+      <w:pPr>
+        <w:pStyle w:val="BodyText"/>
+      </w:pPr>
+      <w:r>
+        <w:rPr>
+          <w:iCs/>
+          <w:i/>
+          <w:highlight w:val="yellow"/>
+        </w:rPr>
+        <w:t xml:space="preserve">[END PLACEHOLDER.]</w:t>
+      </w:r>
+    </w:p>
+    <w:p>
+      <w:pPr>
+        <w:pStyle w:val="BodyText"/>
+      </w:pPr>
+      <w:r>
         <w:t xml:space="preserve">She kept sending it. Hope can look a lot like enabling from the outside. From inside a mother, I think it looked like keeping her son alive.</w:t>
       </w:r>
     </w:p>
@@ -8239,7 +8615,7 @@
         <w:pStyle w:val="BodyText"/>
       </w:pPr>
       <w:r>
-        <w:t xml:space="preserve">One of the men I got sober alongside had been homeless with a tenth-grade education, and a few years later he had a Hollywood actor sleeping in his guest room, which is his story to tell and not mine. His name is Matt. The men God put in front of me weren’t the ones I would have picked, and the first of them came early, when I couldn’t yet see any of it.</w:t>
+        <w:t xml:space="preserve">One of the men I got sober alongside had been homeless with a tenth-grade education, and a few years later he had a Hollywood actor sleeping in his guest room. His name is Matt. The men God put in front of me weren’t the ones I would have picked, and the first of them came early, when I couldn’t yet see any of it.</w:t>
       </w:r>
     </w:p>
     <w:p>
@@ -10427,7 +10803,7 @@
         <w:pStyle w:val="BodyText"/>
       </w:pPr>
       <w:r>
-        <w:t xml:space="preserve">The first death that stayed with me wasn’t a patient, and it came years before hospice was ever my job. It was Detroit Bob.</w:t>
+        <w:t xml:space="preserve">The first death I was in the room for wasn’t a patient, and it came years before hospice was ever my job. It was Detroit Bob.</w:t>
       </w:r>
     </w:p>
     <w:p>
@@ -10563,7 +10939,99 @@
         <w:pStyle w:val="BodyText"/>
       </w:pPr>
       <w:r>
-        <w:t xml:space="preserve">I was in the room when he passed, in 2016. I had been around a lot by then, but not that, not the actual leaving. I watched it happen, and afterward I stayed for his wife, a woman I loved, because there was nothing left to do but be there and not go. That was when it finally landed. Bob was gone. There was no fixing it, no deal to close, no right answer that would have bought him one more minute.</w:t>
+        <w:t xml:space="preserve">I was in the room when he passed, in 2016. I had been around a lot by then, but not that, not the actual leaving.</w:t>
+      </w:r>
+    </w:p>
+    <w:p>
+      <w:pPr>
+        <w:pStyle w:val="BodyText"/>
+      </w:pPr>
+      <w:r>
+        <w:rPr>
+          <w:iCs/>
+          <w:i/>
+          <w:highlight w:val="yellow"/>
+        </w:rPr>
+        <w:t xml:space="preserve">[PLACEHOLDER. The hour itself, reconstructed. Rob replaces it with what he saw.]</w:t>
+      </w:r>
+    </w:p>
+    <w:p>
+      <w:pPr>
+        <w:pStyle w:val="BodyText"/>
+      </w:pPr>
+      <w:r>
+        <w:rPr>
+          <w:highlight w:val="yellow"/>
+        </w:rPr>
+        <w:t xml:space="preserve">It was a Sunday afternoon and the room had thinned out to four of us. His breathing had changed that morning, the nurse said, and once she said it I could hear it. Long pulls, and then a space, and then another pull. The spaces got longer. Every time one came, the four of us stopped breathing too, and every time he started again, somebody let out a little laugh, the kind you’re ashamed of. His wife sat on the bed with her hand under his. Nobody talked. The Old Spice was still there. I had my hands folded in my lap like I was in church, and I remember noticing that and not knowing what else to do with them.</w:t>
+      </w:r>
+    </w:p>
+    <w:p>
+      <w:pPr>
+        <w:pStyle w:val="BodyText"/>
+      </w:pPr>
+      <w:r>
+        <w:rPr>
+          <w:highlight w:val="yellow"/>
+        </w:rPr>
+        <w:t xml:space="preserve">At some point the space didn’t end. His wife knew before the nurse did. She said his name, not loud, and then she said,</w:t>
+      </w:r>
+      <w:r>
+        <w:rPr>
+          <w:highlight w:val="yellow"/>
+        </w:rPr>
+        <w:t xml:space="preserve"> </w:t>
+      </w:r>
+      <w:r>
+        <w:rPr>
+          <w:highlight w:val="yellow"/>
+        </w:rPr>
+        <w:t xml:space="preserve">“</w:t>
+      </w:r>
+      <w:r>
+        <w:rPr>
+          <w:highlight w:val="yellow"/>
+        </w:rPr>
+        <w:t xml:space="preserve">Okay,</w:t>
+      </w:r>
+      <w:r>
+        <w:rPr>
+          <w:highlight w:val="yellow"/>
+        </w:rPr>
+        <w:t xml:space="preserve">”</w:t>
+      </w:r>
+      <w:r>
+        <w:rPr>
+          <w:highlight w:val="yellow"/>
+        </w:rPr>
+        <w:t xml:space="preserve"> </w:t>
+      </w:r>
+      <w:r>
+        <w:rPr>
+          <w:highlight w:val="yellow"/>
+        </w:rPr>
+        <w:t xml:space="preserve">and that was all. I looked at the clock because I’d seen people do that on television. Four twenty. Then I went and stood in the kitchen until she called me back in.</w:t>
+      </w:r>
+    </w:p>
+    <w:p>
+      <w:pPr>
+        <w:pStyle w:val="BodyText"/>
+      </w:pPr>
+      <w:r>
+        <w:rPr>
+          <w:iCs/>
+          <w:i/>
+          <w:highlight w:val="yellow"/>
+        </w:rPr>
+        <w:t xml:space="preserve">[END PLACEHOLDER.]</w:t>
+      </w:r>
+    </w:p>
+    <w:p>
+      <w:pPr>
+        <w:pStyle w:val="BodyText"/>
+      </w:pPr>
+      <w:r>
+        <w:t xml:space="preserve">Afterward I stayed for his wife, a woman I loved, because there was nothing left to do but be there and not go. That was when it finally landed. Bob was gone. There was no fixing it, no deal to close, no right answer that would have bought him one more minute.</w:t>
       </w:r>
     </w:p>
     <w:p>
@@ -12110,7 +12578,7 @@
         <w:pStyle w:val="BodyText"/>
       </w:pPr>
       <w:r>
-        <w:t xml:space="preserve">The first three years we laughed all the time, the real kind that takes her all the way over and pulls the whole room in with her. Then the heavy years came, the ones this book is mostly about, and the laughing got rare without either of us deciding it should. It’s coming back, a little more each month. We are safe with each other, and because we’re safe we are sometimes harder on each other than we should be. That’s the cost of letting your guard all the way down with the one person you’re sure won’t leave.</w:t>
+        <w:t xml:space="preserve">The first three years we laughed all the time, the real kind that takes her all the way over and pulls the whole room in with her. Then the heavy years came, the ones the last part of this book is about, and the laughing got rare without either of us deciding it should. It’s coming back, a little more each month. We are safe with each other, and because we’re safe we are sometimes harder on each other than we should be. That’s the cost of letting your guard all the way down with the one person you’re sure won’t leave.</w:t>
       </w:r>
     </w:p>
     <w:bookmarkEnd w:id="43"/>
@@ -12839,6 +13307,207 @@
         <w:t xml:space="preserve">And he never stopped wanting to be useful. He’d retired on paper and kept working anyway, into his eighties, answering phones and untangling computer problems. The pay was almost nothing, and one day he called me like he’d won a sweepstakes because his boss had doubled it. What I remember isn’t the money. It’s an eighty-year-old man beaming over a good performance review. At eighty, he did a 5K with Hope and me — beanie, glasses, a finisher’s medal — finished dead last, and took home the tortoise award, which somehow made the whole thing better. After the 2015 surgery — they took about half of his esophagus and half of his stomach — he ate less, weighed less, took his vitamins, saw his holistic doctor. He won himself years. He spent them wanting things. Strength. Respect. A good review. Proof he wasn’t finished.</w:t>
       </w:r>
     </w:p>
+    <w:p>
+      <w:pPr>
+        <w:pStyle w:val="BodyText"/>
+      </w:pPr>
+      <w:r>
+        <w:rPr>
+          <w:iCs/>
+          <w:i/>
+          <w:highlight w:val="yellow"/>
+        </w:rPr>
+        <w:t xml:space="preserve">[PLACEHOLDER. One ordinary evening, reconstructed. Rob replaces it with one he remembers.]</w:t>
+      </w:r>
+    </w:p>
+    <w:p>
+      <w:pPr>
+        <w:pStyle w:val="BodyText"/>
+      </w:pPr>
+      <w:r>
+        <w:rPr>
+          <w:highlight w:val="yellow"/>
+        </w:rPr>
+        <w:t xml:space="preserve">I’ll give you one evening, because the years were made of them. A Tuesday in 2019, Hope working late, me on his back porch in Pensacola with a plate Donna had handed me through the door without asking whether I’d eaten. The Yankees were on the television inside with the sound up, and he was outside with me, watching it through the screen, because he had decided that was where we were sitting.</w:t>
+      </w:r>
+    </w:p>
+    <w:p>
+      <w:pPr>
+        <w:pStyle w:val="BodyText"/>
+      </w:pPr>
+      <w:r>
+        <w:rPr>
+          <w:highlight w:val="yellow"/>
+        </w:rPr>
+        <w:t xml:space="preserve">“</w:t>
+      </w:r>
+      <w:r>
+        <w:rPr>
+          <w:highlight w:val="yellow"/>
+        </w:rPr>
+        <w:t xml:space="preserve">Who’s pitching?</w:t>
+      </w:r>
+      <w:r>
+        <w:rPr>
+          <w:highlight w:val="yellow"/>
+        </w:rPr>
+        <w:t xml:space="preserve">”</w:t>
+      </w:r>
+      <w:r>
+        <w:rPr>
+          <w:highlight w:val="yellow"/>
+        </w:rPr>
+        <w:t xml:space="preserve"> </w:t>
+      </w:r>
+      <w:r>
+        <w:rPr>
+          <w:highlight w:val="yellow"/>
+        </w:rPr>
+        <w:t xml:space="preserve">I said.</w:t>
+      </w:r>
+    </w:p>
+    <w:p>
+      <w:pPr>
+        <w:pStyle w:val="BodyText"/>
+      </w:pPr>
+      <w:r>
+        <w:rPr>
+          <w:highlight w:val="yellow"/>
+        </w:rPr>
+        <w:t xml:space="preserve">“</w:t>
+      </w:r>
+      <w:r>
+        <w:rPr>
+          <w:highlight w:val="yellow"/>
+        </w:rPr>
+        <w:t xml:space="preserve">Who’s pitching. You don’t know who’s pitching.</w:t>
+      </w:r>
+      <w:r>
+        <w:rPr>
+          <w:highlight w:val="yellow"/>
+        </w:rPr>
+        <w:t xml:space="preserve">”</w:t>
+      </w:r>
+      <w:r>
+        <w:rPr>
+          <w:highlight w:val="yellow"/>
+        </w:rPr>
+        <w:t xml:space="preserve"> </w:t>
+      </w:r>
+      <w:r>
+        <w:rPr>
+          <w:highlight w:val="yellow"/>
+        </w:rPr>
+        <w:t xml:space="preserve">He told me who was pitching. He told me the man’s ERA and where he went to high school and what his father did for a living, and none of it was in the newspaper, and I have never known where he got it.</w:t>
+      </w:r>
+    </w:p>
+    <w:p>
+      <w:pPr>
+        <w:pStyle w:val="BodyText"/>
+      </w:pPr>
+      <w:r>
+        <w:rPr>
+          <w:highlight w:val="yellow"/>
+        </w:rPr>
+        <w:t xml:space="preserve">He asked about work the way he always asked about work, which was completely. He wanted the names. Who was the manager, what was she like, was I listening to her. He’d tell me what to do about a problem I hadn’t told him I had. Then somebody hit one, and he said,</w:t>
+      </w:r>
+      <w:r>
+        <w:rPr>
+          <w:highlight w:val="yellow"/>
+        </w:rPr>
+        <w:t xml:space="preserve"> </w:t>
+      </w:r>
+      <w:r>
+        <w:rPr>
+          <w:highlight w:val="yellow"/>
+        </w:rPr>
+        <w:t xml:space="preserve">“</w:t>
+      </w:r>
+      <w:r>
+        <w:rPr>
+          <w:highlight w:val="yellow"/>
+        </w:rPr>
+        <w:t xml:space="preserve">There it is,</w:t>
+      </w:r>
+      <w:r>
+        <w:rPr>
+          <w:highlight w:val="yellow"/>
+        </w:rPr>
+        <w:t xml:space="preserve">”</w:t>
+      </w:r>
+      <w:r>
+        <w:rPr>
+          <w:highlight w:val="yellow"/>
+        </w:rPr>
+        <w:t xml:space="preserve"> </w:t>
+      </w:r>
+      <w:r>
+        <w:rPr>
+          <w:highlight w:val="yellow"/>
+        </w:rPr>
+        <w:t xml:space="preserve">and put his hand flat on the arm of the chair, which for him was standing up and cheering.</w:t>
+      </w:r>
+    </w:p>
+    <w:p>
+      <w:pPr>
+        <w:pStyle w:val="BodyText"/>
+      </w:pPr>
+      <w:r>
+        <w:rPr>
+          <w:highlight w:val="yellow"/>
+        </w:rPr>
+        <w:t xml:space="preserve">Nothing happened. Around nine he said,</w:t>
+      </w:r>
+      <w:r>
+        <w:rPr>
+          <w:highlight w:val="yellow"/>
+        </w:rPr>
+        <w:t xml:space="preserve"> </w:t>
+      </w:r>
+      <w:r>
+        <w:rPr>
+          <w:highlight w:val="yellow"/>
+        </w:rPr>
+        <w:t xml:space="preserve">“</w:t>
+      </w:r>
+      <w:r>
+        <w:rPr>
+          <w:highlight w:val="yellow"/>
+        </w:rPr>
+        <w:t xml:space="preserve">Alright,</w:t>
+      </w:r>
+      <w:r>
+        <w:rPr>
+          <w:highlight w:val="yellow"/>
+        </w:rPr>
+        <w:t xml:space="preserve">”</w:t>
+      </w:r>
+      <w:r>
+        <w:rPr>
+          <w:highlight w:val="yellow"/>
+        </w:rPr>
+        <w:t xml:space="preserve"> </w:t>
+      </w:r>
+      <w:r>
+        <w:rPr>
+          <w:highlight w:val="yellow"/>
+        </w:rPr>
+        <w:t xml:space="preserve">which meant the evening was over, and he walked me to the door, which he did every time, and stood in it while I backed out, which he did every time. I drove home. I can’t tell you a single thing that was said that mattered, and I can tell you it was one of the best nights of my life, and I could tell you the same about two hundred more.</w:t>
+      </w:r>
+    </w:p>
+    <w:p>
+      <w:pPr>
+        <w:pStyle w:val="BodyText"/>
+      </w:pPr>
+      <w:r>
+        <w:rPr>
+          <w:iCs/>
+          <w:i/>
+          <w:highlight w:val="yellow"/>
+        </w:rPr>
+        <w:t xml:space="preserve">[END PLACEHOLDER.]</w:t>
+      </w:r>
+    </w:p>
     <w:bookmarkEnd w:id="48"/>
     <w:bookmarkStart w:id="49" w:name="dont-go-dying-on-me"/>
     <w:p>
@@ -13096,7 +13765,7 @@
         <w:pStyle w:val="BodyText"/>
       </w:pPr>
       <w:r>
-        <w:t xml:space="preserve">That spring, Hope and I told him we were moving to Raleigh. I could tell he was disappointed. I’d lived close to him in Pensacola for eighteen years, almost nineteen. But he understood, and he told me to go. The last time I saw him before the move we went to McGuire’s. He looked fine. He said he wasn’t worried, said as long as Donna was there he was okay. Part of me looks back and wonders if I should have stayed longer.</w:t>
+        <w:t xml:space="preserve">That spring, Hope and I told him we were moving to Raleigh. I could tell he was disappointed. I’d lived close to him in Pensacola for eighteen years, almost nineteen. But he understood, and he told me to go. The last time I saw him before the move we went to McGuire’s. He looked fine. He said he wasn’t worried. Part of me looks back and wonders if I should have stayed longer.</w:t>
       </w:r>
     </w:p>
     <w:p>
@@ -13261,7 +13930,43 @@
         <w:rPr>
           <w:highlight w:val="yellow"/>
         </w:rPr>
-        <w:t xml:space="preserve">He’d dressed for it. Pressed shirt, the collar standing a little off his neck now, the hair done. Donna had driven. He walked in on his own. He asked me twice what time we were leaving, and the second time I answered him short, and I’ve had months to wish I hadn’t. Eggs, toast, coffee he stirred and didn’t drink much of. He ate about a third of it and pushed the plate an inch away from himself, which was as close as he came to saying he was full.</w:t>
+        <w:t xml:space="preserve">Another Broken Egg on Bayfront, because it was his, and because the girl at the register said</w:t>
+      </w:r>
+      <w:r>
+        <w:rPr>
+          <w:highlight w:val="yellow"/>
+        </w:rPr>
+        <w:t xml:space="preserve"> </w:t>
+      </w:r>
+      <w:r>
+        <w:rPr>
+          <w:highlight w:val="yellow"/>
+        </w:rPr>
+        <w:t xml:space="preserve">“</w:t>
+      </w:r>
+      <w:r>
+        <w:rPr>
+          <w:highlight w:val="yellow"/>
+        </w:rPr>
+        <w:t xml:space="preserve">Where you been, Mr. Brizzi?</w:t>
+      </w:r>
+      <w:r>
+        <w:rPr>
+          <w:highlight w:val="yellow"/>
+        </w:rPr>
+        <w:t xml:space="preserve">”</w:t>
+      </w:r>
+      <w:r>
+        <w:rPr>
+          <w:highlight w:val="yellow"/>
+        </w:rPr>
+        <w:t xml:space="preserve"> </w:t>
+      </w:r>
+      <w:r>
+        <w:rPr>
+          <w:highlight w:val="yellow"/>
+        </w:rPr>
+        <w:t xml:space="preserve">before we sat down, which was the point of going there. He’d dressed for it. Pressed shirt, the collar standing a little off his neck now, the hair done. Donna had driven. He walked in on his own. He asked me twice what time we were leaving, and the second time I answered him short, and I’ve had months to wish I hadn’t. Eggs, toast, coffee he stirred and didn’t drink much of. He ate about a third of it and pushed the plate an inch away from himself, which was as close as he came to saying he was full.</w:t>
       </w:r>
     </w:p>
     <w:p>
@@ -13343,7 +14048,7 @@
         <w:rPr>
           <w:highlight w:val="yellow"/>
         </w:rPr>
-        <w:t xml:space="preserve">When we got up he didn’t walk us to the car. He stood inside the door and watched us go. It was the last time I saw him.</w:t>
+        <w:t xml:space="preserve">He left a twenty on a thirty-dollar check. When we got up he didn’t walk us to the car. He stood inside the door and watched us go.</w:t>
       </w:r>
     </w:p>
     <w:p>
@@ -14188,6 +14893,17 @@
           <w:highlight w:val="yellow"/>
         </w:rPr>
         <w:t xml:space="preserve">[END PLACEHOLDER.]</w:t>
+      </w:r>
+    </w:p>
+    <w:p>
+      <w:pPr>
+        <w:pStyle w:val="BodyText"/>
+      </w:pPr>
+      <w:r>
+        <w:rPr>
+          <w:highlight w:val="yellow"/>
+        </w:rPr>
+        <w:t xml:space="preserve">Nobody said the word hospice about my father. Not Donna, who is a nurse. Not Chris. Not me, who says it for a living. It went that fast, and that is true, and it is also the sentence I hear from families every week, and I have never once believed it was the whole reason.</w:t>
       </w:r>
     </w:p>
     <w:p>
@@ -14858,7 +15574,7 @@
         <w:pStyle w:val="BodyText"/>
       </w:pPr>
       <w:r>
-        <w:t xml:space="preserve">A few days after we buried my father, grief caught me somewhere I didn’t expect it.</w:t>
+        <w:t xml:space="preserve">Before the guardrail, before I went back to the rooms, a few days after we buried my father, grief caught me somewhere I didn’t expect it.</w:t>
       </w:r>
     </w:p>
     <w:p>

</xml_diff>

<commit_message>
Fill the remaining gaps as highlighted reconstructions: Melvin's room, Ed and Eva, one afternoon of the In-Between, Hope's ninth night, Lisa in the closet, why Mom wasn't told
Co-Authored-By: Claude Fable 5.1 <noreply@anthropic.com>
Claude-Session: https://claude.ai/code/session_013TTacQAr67Pe2VUwTPop1A
</commit_message>
<xml_diff>
--- a/The_Cardinals_Promise.docx
+++ b/The_Cardinals_Promise.docx
@@ -12518,7 +12518,181 @@
         <w:pStyle w:val="BodyText"/>
       </w:pPr>
       <w:r>
-        <w:t xml:space="preserve">The hardest stretch we hit came with the move to Raleigh. We were carrying two mortgages, the East Hill house wouldn’t sell until this year, 2026, and money became the thing we kept circling back to. Part of that was on me. Early on I’d make a big decision on my own and tell her after it was already done. For a woman who needs to see the pieces before they move, it was never really about the money. It was about being left out of something that was ours. Hope isn’t a fighter, and she didn’t yell. She went quiet, and the quiet lasted, which was harder than being yelled at. When she finally came to me she wasn’t cruel about it. She said the only thing she needed to: no more impulse decisions. I haven’t made one on my own since. The big calls are ours, not mine.</w:t>
+        <w:t xml:space="preserve">The hardest stretch we hit came with the move to Raleigh. We were carrying two mortgages, the East Hill house wouldn’t sell until this year, 2026, and money became the thing we kept circling back to. Part of that was on me. Early on I’d make a big decision on my own and tell her after it was already done. For a woman who needs to see the pieces before they move, it was never really about the money. It was about being left out of something that was ours. Hope isn’t a fighter, and she didn’t yell. She went quiet, and the quiet lasted, which was harder than being yelled at.</w:t>
+      </w:r>
+    </w:p>
+    <w:p>
+      <w:pPr>
+        <w:pStyle w:val="BodyText"/>
+      </w:pPr>
+      <w:r>
+        <w:rPr>
+          <w:iCs/>
+          <w:i/>
+          <w:highlight w:val="yellow"/>
+        </w:rPr>
+        <w:t xml:space="preserve">[PLACEHOLDER. The evening she came to me, reconstructed.]</w:t>
+      </w:r>
+    </w:p>
+    <w:p>
+      <w:pPr>
+        <w:pStyle w:val="BodyText"/>
+      </w:pPr>
+      <w:r>
+        <w:rPr>
+          <w:highlight w:val="yellow"/>
+        </w:rPr>
+        <w:t xml:space="preserve">It was nine days. I counted, the way you count days. On the ninth night she came into the room where I was pretending to read and sat on the end of the bed with her planner, the paper one she still keeps, and opened it to a page with two columns on it. My handwriting was in neither of them. She had done the math on both houses by herself, because I’d made her feel like she had to.</w:t>
+      </w:r>
+    </w:p>
+    <w:p>
+      <w:pPr>
+        <w:pStyle w:val="BodyText"/>
+      </w:pPr>
+      <w:r>
+        <w:rPr>
+          <w:highlight w:val="yellow"/>
+        </w:rPr>
+        <w:t xml:space="preserve">“</w:t>
+      </w:r>
+      <w:r>
+        <w:rPr>
+          <w:highlight w:val="yellow"/>
+        </w:rPr>
+        <w:t xml:space="preserve">I’m not mad about the money,</w:t>
+      </w:r>
+      <w:r>
+        <w:rPr>
+          <w:highlight w:val="yellow"/>
+        </w:rPr>
+        <w:t xml:space="preserve">”</w:t>
+      </w:r>
+      <w:r>
+        <w:rPr>
+          <w:highlight w:val="yellow"/>
+        </w:rPr>
+        <w:t xml:space="preserve"> </w:t>
+      </w:r>
+      <w:r>
+        <w:rPr>
+          <w:highlight w:val="yellow"/>
+        </w:rPr>
+        <w:t xml:space="preserve">she said.</w:t>
+      </w:r>
+      <w:r>
+        <w:rPr>
+          <w:highlight w:val="yellow"/>
+        </w:rPr>
+        <w:t xml:space="preserve"> </w:t>
+      </w:r>
+      <w:r>
+        <w:rPr>
+          <w:highlight w:val="yellow"/>
+        </w:rPr>
+        <w:t xml:space="preserve">“</w:t>
+      </w:r>
+      <w:r>
+        <w:rPr>
+          <w:highlight w:val="yellow"/>
+        </w:rPr>
+        <w:t xml:space="preserve">I can fix money. I’m mad that I found out from the bank.</w:t>
+      </w:r>
+      <w:r>
+        <w:rPr>
+          <w:highlight w:val="yellow"/>
+        </w:rPr>
+        <w:t xml:space="preserve">”</w:t>
+      </w:r>
+    </w:p>
+    <w:p>
+      <w:pPr>
+        <w:pStyle w:val="BodyText"/>
+      </w:pPr>
+      <w:r>
+        <w:rPr>
+          <w:highlight w:val="yellow"/>
+        </w:rPr>
+        <w:t xml:space="preserve">I started to explain, and she put her hand flat on the page.</w:t>
+      </w:r>
+    </w:p>
+    <w:p>
+      <w:pPr>
+        <w:pStyle w:val="BodyText"/>
+      </w:pPr>
+      <w:r>
+        <w:rPr>
+          <w:highlight w:val="yellow"/>
+        </w:rPr>
+        <w:t xml:space="preserve">“</w:t>
+      </w:r>
+      <w:r>
+        <w:rPr>
+          <w:highlight w:val="yellow"/>
+        </w:rPr>
+        <w:t xml:space="preserve">No more impulse decisions,</w:t>
+      </w:r>
+      <w:r>
+        <w:rPr>
+          <w:highlight w:val="yellow"/>
+        </w:rPr>
+        <w:t xml:space="preserve">”</w:t>
+      </w:r>
+      <w:r>
+        <w:rPr>
+          <w:highlight w:val="yellow"/>
+        </w:rPr>
+        <w:t xml:space="preserve"> </w:t>
+      </w:r>
+      <w:r>
+        <w:rPr>
+          <w:highlight w:val="yellow"/>
+        </w:rPr>
+        <w:t xml:space="preserve">she said.</w:t>
+      </w:r>
+      <w:r>
+        <w:rPr>
+          <w:highlight w:val="yellow"/>
+        </w:rPr>
+        <w:t xml:space="preserve"> </w:t>
+      </w:r>
+      <w:r>
+        <w:rPr>
+          <w:highlight w:val="yellow"/>
+        </w:rPr>
+        <w:t xml:space="preserve">“</w:t>
+      </w:r>
+      <w:r>
+        <w:rPr>
+          <w:highlight w:val="yellow"/>
+        </w:rPr>
+        <w:t xml:space="preserve">That’s it. That’s the whole thing I need.</w:t>
+      </w:r>
+      <w:r>
+        <w:rPr>
+          <w:highlight w:val="yellow"/>
+        </w:rPr>
+        <w:t xml:space="preserve">”</w:t>
+      </w:r>
+    </w:p>
+    <w:p>
+      <w:pPr>
+        <w:pStyle w:val="BodyText"/>
+      </w:pPr>
+      <w:r>
+        <w:rPr>
+          <w:iCs/>
+          <w:i/>
+          <w:highlight w:val="yellow"/>
+        </w:rPr>
+        <w:t xml:space="preserve">[END PLACEHOLDER.]</w:t>
+      </w:r>
+    </w:p>
+    <w:p>
+      <w:pPr>
+        <w:pStyle w:val="BodyText"/>
+      </w:pPr>
+      <w:r>
+        <w:t xml:space="preserve">She wasn’t cruel about it. She said the only thing she needed to say. I haven’t made one on my own since. The big calls are ours, not mine.</w:t>
       </w:r>
     </w:p>
     <w:p>
@@ -13795,7 +13969,61 @@
         <w:pStyle w:val="FirstParagraph"/>
       </w:pPr>
       <w:r>
-        <w:t xml:space="preserve">I told people I was going to take some time off. Be there for my dad. Be there for my mom. Be present the way I’d spent years telling families to be present, while there was still time. That was the plan. It’s not what happened. What happened was I retreated into myself. The time I’d set aside became something else, a depression I didn’t see coming and couldn’t recognize from the inside. I was grieving what was already happening and what was coming, and it kept me from doing the thing I’d left my career to do. I know the name for it now. The grief showed up before the loss did, and it froze me. I wasn’t working. I wasn’t fully showing up for my parents. I was stuck in a version of myself that couldn’t move in any direction. Hospice, when it came, was a return, to the rooms I’d been thinking about since the home health years. It pulled me out of that in-between place.</w:t>
+        <w:t xml:space="preserve">I told people I was going to take some time off. Be there for my dad. Be there for my mom. Be present the way I’d spent years telling families to be present, while there was still time. That was the plan. It’s not what happened. What happened was I retreated into myself. The time I’d set aside became something else, a depression I didn’t see coming and couldn’t recognize from the inside. I was grieving what was already happening and what was coming, and it kept me from doing the thing I’d left my career to do. I know the name for it now. The grief showed up before the loss did, and it froze me. I wasn’t working. I wasn’t fully showing up for my parents. I was stuck in a version of myself that couldn’t move in any direction.</w:t>
+      </w:r>
+    </w:p>
+    <w:p>
+      <w:pPr>
+        <w:pStyle w:val="BodyText"/>
+      </w:pPr>
+      <w:r>
+        <w:rPr>
+          <w:iCs/>
+          <w:i/>
+          <w:highlight w:val="yellow"/>
+        </w:rPr>
+        <w:t xml:space="preserve">[PLACEHOLDER. One afternoon of it, reconstructed.]</w:t>
+      </w:r>
+    </w:p>
+    <w:p>
+      <w:pPr>
+        <w:pStyle w:val="BodyText"/>
+      </w:pPr>
+      <w:r>
+        <w:rPr>
+          <w:highlight w:val="yellow"/>
+        </w:rPr>
+        <w:t xml:space="preserve">Here is what it looked like. A Thursday in June, no job to go to, Dad twenty minutes away and expecting me for lunch, because I’d said Thursday. I got as far as the driveway. I sat in the car with the keys in my hand and the air conditioning not on yet and I watched the clock on the dash go from 11:40 to 12:10, and at 12:10 I texted him that something had come up with the house. He wrote back, No problem. Next week. He always wrote back like that. I went inside and lay down on top of the made bed in my clothes, and Hope found me there at six.</w:t>
+      </w:r>
+    </w:p>
+    <w:p>
+      <w:pPr>
+        <w:pStyle w:val="BodyText"/>
+      </w:pPr>
+      <w:r>
+        <w:rPr>
+          <w:highlight w:val="yellow"/>
+        </w:rPr>
+        <w:t xml:space="preserve">I did that more than once that summer. I have sat across from families and explained anticipatory grief in a calm voice, and I did not know I was in it. I thought I was tired. I thought I was being a bad son on purpose. It was neither. It was a man who could feel the weight coming and had lain down under it early.</w:t>
+      </w:r>
+    </w:p>
+    <w:p>
+      <w:pPr>
+        <w:pStyle w:val="BodyText"/>
+      </w:pPr>
+      <w:r>
+        <w:rPr>
+          <w:iCs/>
+          <w:i/>
+          <w:highlight w:val="yellow"/>
+        </w:rPr>
+        <w:t xml:space="preserve">[END PLACEHOLDER.]</w:t>
+      </w:r>
+      <w:r>
+        <w:t xml:space="preserve"> </w:t>
+      </w:r>
+      <w:r>
+        <w:t xml:space="preserve">Hospice, when it came, was a return, to the rooms I’d been thinking about since the home health years. It pulled me out of that in-between place.</w:t>
       </w:r>
     </w:p>
     <w:bookmarkEnd w:id="52"/>
@@ -14174,6 +14402,43 @@
         <w:pStyle w:val="BodyText"/>
       </w:pPr>
       <w:r>
+        <w:rPr>
+          <w:iCs/>
+          <w:i/>
+          <w:highlight w:val="yellow"/>
+        </w:rPr>
+        <w:t xml:space="preserve">[PLACEHOLDER. What Rob saw in that room, reconstructed.]</w:t>
+      </w:r>
+    </w:p>
+    <w:p>
+      <w:pPr>
+        <w:pStyle w:val="BodyText"/>
+      </w:pPr>
+      <w:r>
+        <w:rPr>
+          <w:highlight w:val="yellow"/>
+        </w:rPr>
+        <w:t xml:space="preserve">He had been a big man. You could tell from the suits in the open closet and from the way the bed didn’t fit him anymore, the way a bed doesn’t fit a man who has lost sixty pounds in a season. His mouth was open. The oxygen was on and it wasn’t doing much, and every breath had a catch at the top of it, like a door on a bad hinge. His grandson was reading him the sports page, all of it, the box scores, because somebody had told the boy that hearing goes last and he had decided to believe it.</w:t>
+      </w:r>
+    </w:p>
+    <w:p>
+      <w:pPr>
+        <w:pStyle w:val="BodyText"/>
+      </w:pPr>
+      <w:r>
+        <w:rPr>
+          <w:iCs/>
+          <w:i/>
+          <w:highlight w:val="yellow"/>
+        </w:rPr>
+        <w:t xml:space="preserve">[END PLACEHOLDER.]</w:t>
+      </w:r>
+    </w:p>
+    <w:p>
+      <w:pPr>
+        <w:pStyle w:val="BodyText"/>
+      </w:pPr>
+      <w:r>
         <w:t xml:space="preserve">I wasn’t there for the very end. I saw him close to it, and a single thought went through me that I couldn’t take back: I never want to see my own dad like that. I had no idea how few weeks were left before that stopped being a fear and became a choice in front of me.</w:t>
       </w:r>
     </w:p>
@@ -14611,7 +14876,7 @@
         <w:rPr>
           <w:highlight w:val="yellow"/>
         </w:rPr>
-        <w:t xml:space="preserve">I know what a drip is. I explain it to families in their living rooms. It doesn’t take anyone. It eases the pain and the hunger for air while the dying does what it was already doing. I have said that sentence to strangers with a steady voice. I stood in a church holding a candle and could not say it to myself. I put the phone back in my pocket and sang the last verse with my mother, who didn’t know, and Hope, who did.</w:t>
+        <w:t xml:space="preserve">I know what a drip is. I explain it to families in their living rooms. It doesn’t take anyone. It eases the pain and the hunger for air while the dying does what it was already doing. I have said that sentence to strangers with a steady voice. I stood in a church holding a candle and could not say it to myself. I put the phone back in my pocket and sang the last verse with my mother, who didn’t know, and Hope, who did. I didn’t tell her because she had come seven hundred miles to have a Christmas, and because if I said it out loud in that pew it would be true.</w:t>
       </w:r>
     </w:p>
     <w:p>
@@ -15157,7 +15422,94 @@
         <w:pStyle w:val="BodyText"/>
       </w:pPr>
       <w:r>
-        <w:t xml:space="preserve">In January we went through his things. His gray suit was hanging on the right side of the closet, between two work shirts. Always be the best-dressed person in the room. I pulled it off the rack and held it up, and I couldn’t put it back. I took it home in a garment bag with no plan. It hangs in my closet now, next to mine. It isn’t my size and it isn’t my style and I will never wear it. But some mornings I open the closet door and it’s there, and I know what it is, and I know who wore it, and I leave it alone. I tell families sometimes, when they’re clearing out a closet of their own: keep one thing. You’ll know which one. It will tell you.</w:t>
+        <w:t xml:space="preserve">In January we went through his things.</w:t>
+      </w:r>
+      <w:r>
+        <w:t xml:space="preserve"> </w:t>
+      </w:r>
+      <w:r>
+        <w:rPr>
+          <w:highlight w:val="yellow"/>
+        </w:rPr>
+        <w:t xml:space="preserve">Lisa and I did the closet. Somewhere in the second box of shoes she said, without looking up,</w:t>
+      </w:r>
+      <w:r>
+        <w:rPr>
+          <w:highlight w:val="yellow"/>
+        </w:rPr>
+        <w:t xml:space="preserve"> </w:t>
+      </w:r>
+      <w:r>
+        <w:rPr>
+          <w:highlight w:val="yellow"/>
+        </w:rPr>
+        <w:t xml:space="preserve">“</w:t>
+      </w:r>
+      <w:r>
+        <w:rPr>
+          <w:highlight w:val="yellow"/>
+        </w:rPr>
+        <w:t xml:space="preserve">You know you got the good one, right?</w:t>
+      </w:r>
+      <w:r>
+        <w:rPr>
+          <w:highlight w:val="yellow"/>
+        </w:rPr>
+        <w:t xml:space="preserve">”</w:t>
+      </w:r>
+      <w:r>
+        <w:rPr>
+          <w:highlight w:val="yellow"/>
+        </w:rPr>
+        <w:t xml:space="preserve"> </w:t>
+      </w:r>
+      <w:r>
+        <w:rPr>
+          <w:highlight w:val="yellow"/>
+        </w:rPr>
+        <w:t xml:space="preserve">I said I knew.</w:t>
+      </w:r>
+      <w:r>
+        <w:rPr>
+          <w:highlight w:val="yellow"/>
+        </w:rPr>
+        <w:t xml:space="preserve"> </w:t>
+      </w:r>
+      <w:r>
+        <w:rPr>
+          <w:highlight w:val="yellow"/>
+        </w:rPr>
+        <w:t xml:space="preserve">“</w:t>
+      </w:r>
+      <w:r>
+        <w:rPr>
+          <w:highlight w:val="yellow"/>
+        </w:rPr>
+        <w:t xml:space="preserve">We got the one who had to work. You got the one who got to stay.</w:t>
+      </w:r>
+      <w:r>
+        <w:rPr>
+          <w:highlight w:val="yellow"/>
+        </w:rPr>
+        <w:t xml:space="preserve">”</w:t>
+      </w:r>
+      <w:r>
+        <w:rPr>
+          <w:highlight w:val="yellow"/>
+        </w:rPr>
+        <w:t xml:space="preserve"> </w:t>
+      </w:r>
+      <w:r>
+        <w:rPr>
+          <w:highlight w:val="yellow"/>
+        </w:rPr>
+        <w:t xml:space="preserve">She said it plain, no edge on it, the way you say a thing you’ve had thirty years to get used to. Then she handed me a shoe box and we kept going, and I’ve thought about that sentence more than anything anybody said at the funeral.</w:t>
+      </w:r>
+      <w:r>
+        <w:t xml:space="preserve"> </w:t>
+      </w:r>
+      <w:r>
+        <w:t xml:space="preserve">His gray suit was hanging on the right side of the closet, between two work shirts. Always be the best-dressed person in the room. I pulled it off the rack and held it up, and I couldn’t put it back. I took it home in a garment bag with no plan. It hangs in my closet now, next to mine. It isn’t my size and it isn’t my style and I will never wear it. But some mornings I open the closet door and it’s there, and I know what it is, and I know who wore it, and I leave it alone. I tell families sometimes, when they’re clearing out a closet of their own: keep one thing. You’ll know which one. It will tell you.</w:t>
       </w:r>
     </w:p>
     <w:bookmarkEnd w:id="56"/>
@@ -15482,7 +15834,22 @@
         <w:pStyle w:val="BodyText"/>
       </w:pPr>
       <w:r>
-        <w:t xml:space="preserve">And some rooms stay with me whole. There was a couple I’ll call Ed and Eva. Ed sold medical equipment. Eva was a respiratory therapist. Between the two of them, healthcare was not a foreign language. They knew the words, the systems, what illness looked like from the professional side. And Ed was twelve years sober, a man who had already done the hardest thing most people can imagine, one day at a time, for over a decade. Recovery had taught him how to live. It had not taught him how to let go. I sat with them near the end. He understood medicine, but medicine did not tell him how to say goodbye. She had spent her working life at other people’s bedsides, and it did not make her less human in her own. Ed loved Eva. That was never in question. Love just needed help becoming a plan: who speaks when she cannot, what comfort means now, what matters most today. The room did not feel good at the end. It wasn’t supposed to. But Ed stayed in it, and the two of them got through it together. I watched them do it.</w:t>
+        <w:t xml:space="preserve">And some rooms stay with me whole. There was a couple I’ll call Ed and Eva. Ed sold medical equipment. Eva was a respiratory therapist. Between the two of them, healthcare was not a foreign language. They knew the words, the systems, what illness looked like from the professional side. And Ed was twelve years sober, a man who had already done the hardest thing most people can imagine, one day at a time, for over a decade. Recovery had taught him how to live. It had not taught him how to let go. I sat with them near the end. He understood medicine, but medicine did not tell him how to say goodbye. She had spent her working life at other people’s bedsides, and it did not make her less human in her own. Ed loved Eva. That was never in question. Love just needed help becoming a plan: who speaks when she cannot, what comfort means now, what matters most today. The room did not feel good at the end. It wasn’t supposed to.</w:t>
+      </w:r>
+      <w:r>
+        <w:t xml:space="preserve"> </w:t>
+      </w:r>
+      <w:r>
+        <w:rPr>
+          <w:highlight w:val="yellow"/>
+        </w:rPr>
+        <w:t xml:space="preserve">What I remember is Ed at the kitchen table with her medication list, the one she had written herself in a therapist’s block capitals, going down it with a pen the way he’d once gone down a sales sheet, crossing off what she didn’t need anymore. He got to the bottom of the page and there was nothing left on it. He sat there with the pen. Then he went back into the bedroom and sat down and took her hand, and that was the plan.</w:t>
+      </w:r>
+      <w:r>
+        <w:t xml:space="preserve"> </w:t>
+      </w:r>
+      <w:r>
+        <w:t xml:space="preserve">Ed stayed in it, and the two of them got through it together.</w:t>
       </w:r>
     </w:p>
     <w:p>

</xml_diff>

<commit_message>
Cadence pass merged (54 edits); remaining Not-X-Y pairs reduced to the load-bearing few; three vocabulary tells cut
Co-Authored-By: Claude Fable 5.1 <noreply@anthropic.com>
Claude-Session: https://claude.ai/code/session_013TTacQAr67Pe2VUwTPop1A
</commit_message>
<xml_diff>
--- a/The_Cardinals_Promise.docx
+++ b/The_Cardinals_Promise.docx
@@ -1966,7 +1966,7 @@
         <w:pStyle w:val="BodyText"/>
       </w:pPr>
       <w:r>
-        <w:t xml:space="preserve">We landed in New Jersey at the start of winter. The airport felt like home at first. Same crowds, same noise, everyone rushing. Then I started listening. The words were wrong. Not Spanish. Something else. Everybody around me knew something I didn’t.</w:t>
+        <w:t xml:space="preserve">We landed in New Jersey at the start of winter. The airport felt like home at first. Same crowds, same noise, everyone rushing. Then I started listening. The words were wrong, not Spanish, something else. Everybody around me knew something I didn’t.</w:t>
       </w:r>
     </w:p>
     <w:p>
@@ -2058,7 +2058,7 @@
         <w:pStyle w:val="BodyText"/>
       </w:pPr>
       <w:r>
-        <w:t xml:space="preserve">My Spanish disappeared almost overnight. English was everywhere. I picked it up the way kids do, without deciding to. Back home I’d had a lisp. In New Jersey they sent me to speech therapy twice a week to fix the way I talked. Decades later it still comes out at the worst times.</w:t>
+        <w:t xml:space="preserve">My Spanish disappeared almost overnight. English was everywhere. I picked it up without deciding to. Back home I’d had a lisp. In New Jersey they sent me to speech therapy twice a week to fix the way I talked. Decades later it still comes out at the worst times.</w:t>
       </w:r>
     </w:p>
     <w:p>
@@ -2224,7 +2224,7 @@
         <w:pStyle w:val="BodyText"/>
       </w:pPr>
       <w:r>
-        <w:t xml:space="preserve">At night I thought about Horacio, not with anger, with confusion, half-expecting him to turn up one day so we could pick things back up. I didn’t know how to love a man who was gone but not dead. No funeral, no grave, no explanation a child could hold. Grief has a shape when somebody dies, something to point at, a day people mark on a calendar. What I had instead was a door I kept checking, quietly, for years, without ever admitting that’s what I was doing. The grown-ups rarely spoke of him, and when they did, they mentioned him carefully, the way you handle something that might break if you name it straight.</w:t>
+        <w:t xml:space="preserve">At night I thought about Horacio, not with anger, with confusion, half-expecting him to turn up one day so we could pick things back up. I didn’t know how to love a man who was gone but not dead. No funeral, no grave, no explanation a child could hold. Grief has a shape when somebody dies, something to point at, a day people mark on a calendar. What I had instead was a door I kept checking, quietly, for years, without ever admitting that’s what I was doing. The grown-ups rarely spoke of him, and when they did, they mentioned him carefully, as if naming him straight might break something.</w:t>
       </w:r>
     </w:p>
     <w:p>
@@ -2674,7 +2674,7 @@
         <w:pStyle w:val="BodyText"/>
       </w:pPr>
       <w:r>
-        <w:t xml:space="preserve">Lou worked IT most of his life, a lot of it on the help desk, the guy you call when the thing won’t work. He didn’t stop until he was eighty-two. Never wealthy, Lou always angled for a second income to help pay the bills. For a while he had a booth at the Union Flea Market, called Lew’s, a different spelling of his own name. I hated every Saturday I spent working it, but nobody asked. Left alone on Sundays, he watched his games: the Yankees in the summer, the Giants in the fall. That was the whole vice.</w:t>
+        <w:t xml:space="preserve">Lou worked IT most of his life, a lot of it on the help desk, the guy you call when the thing won’t work. He didn’t stop until he was eighty-two. Never wealthy, Lou always angled for a second income to help pay the bills. For a while he had a booth at the Union Flea Market, called Lew’s, a different spelling of his own name. I hated every Saturday I spent working it, but nobody asked. Left alone on Sundays, he watched his games: the Yankees in the summer, the Giants in the fall. It was the only vice he had.</w:t>
       </w:r>
     </w:p>
     <w:p>
@@ -2826,15 +2826,15 @@
         <w:pStyle w:val="BodyText"/>
       </w:pPr>
       <w:r>
-        <w:t xml:space="preserve">When I was six, Lou taught me to swim by carrying me to the edge of the pool and throwing me in. I came up coughing and furious, my arms going the way arms go when a body fights drowning. I reached the wall and pulled myself out. Lou stood there watching, not laughing, just paying attention the way a man does when he’s handed his kid something he’ll need. I got back in the water the next time, and the time after that.</w:t>
-      </w:r>
-    </w:p>
-    <w:p>
-      <w:pPr>
-        <w:pStyle w:val="BodyText"/>
-      </w:pPr>
-      <w:r>
-        <w:t xml:space="preserve">His whole hobby was us. Saturday mornings at the batting cages in Woodridge, his hands on my shoulders fixing my stance, not because I was ever going to play ball but because he believed doing a thing right was a habit worth building. Soccer fields in the New Jersey cold, Lou on the sideline in a coat he didn’t need to be wearing, watching me play a sport I was actually pretty good at. I took it all for granted, the way a child is supposed to do with childhood.</w:t>
+        <w:t xml:space="preserve">When I was six, Lou taught me to swim by carrying me to the edge of the pool and throwing me in. I came up coughing and furious, my arms thrashing. I reached the wall and pulled myself out. Lou stood there watching, not laughing, just paying attention the way a man does when he’s handed his kid something he’ll need. I got back in the water the next time, and the time after that.</w:t>
+      </w:r>
+    </w:p>
+    <w:p>
+      <w:pPr>
+        <w:pStyle w:val="BodyText"/>
+      </w:pPr>
+      <w:r>
+        <w:t xml:space="preserve">His whole hobby was us. Saturday mornings at the batting cages in Woodridge, his hands on my shoulders fixing my stance, not because I was ever going to play ball but because he believed doing a thing right was a habit worth building. Soccer fields in the New Jersey cold, Lou on the sideline in a coat he didn’t need to be wearing, watching me play a sport I was actually pretty good at. I took it all for granted, as a child is supposed to.</w:t>
       </w:r>
     </w:p>
     <w:p>
@@ -2850,7 +2850,7 @@
         <w:pStyle w:val="BodyText"/>
       </w:pPr>
       <w:r>
-        <w:t xml:space="preserve">We moved to Ramsey when I was in sixth grade. Bigger house, new school, a town where the kids had known each other since before I showed up, and I came in as the new boy with dark olive skin and features that didn’t match the rest of Bergen County.</w:t>
+        <w:t xml:space="preserve">We moved to Ramsey when I was in sixth grade. Bigger house, new school, a town where the kids had known each other since before I arrived, and I came in as the new boy with dark olive skin and features that didn’t match the rest of Bergen County.</w:t>
       </w:r>
     </w:p>
     <w:p>
@@ -2898,7 +2898,7 @@
         <w:pStyle w:val="BodyText"/>
       </w:pPr>
       <w:r>
-        <w:t xml:space="preserve">Lou was no saint, and I won’t pretend he was. He had a temper that showed up at the wrong moments, and he knew that about himself. Once a mood had him, it was hard to pull him out of it.</w:t>
+        <w:t xml:space="preserve">Lou was no saint, and I won’t pretend he was. He had a temper that came out at the wrong moments, and he knew that about himself. Once a mood had him, it was hard to pull him out of it.</w:t>
       </w:r>
     </w:p>
     <w:p>
@@ -2993,7 +2993,7 @@
         <w:rPr>
           <w:highlight w:val="yellow"/>
         </w:rPr>
-        <w:t xml:space="preserve">He wasn’t done, and none of the rest of it was anything I’d repeat, and none of it was anything I hadn’t heard a grown man say before. That was the part that scared me. Not the words. That I knew the shape of it from another house.</w:t>
+        <w:t xml:space="preserve">He wasn’t done, and none of the rest of it was anything I’d repeat, and none of it was anything I hadn’t heard a grown man say before. That was the part that scared me, not the words, that I knew the shape of it from another house.</w:t>
       </w:r>
     </w:p>
     <w:p>
@@ -3270,7 +3270,7 @@
         <w:pStyle w:val="BodyText"/>
       </w:pPr>
       <w:r>
-        <w:t xml:space="preserve">Overnight, I gained a big sister and two big brothers I hadn’t even known to hope for. Lou had three children of his own long before he ever met my mother: Jon, Lisa, and Joel, thirteen to seventeen years older than me and grown or nearly grown by the time he met her. When he chose us, we inherited his existing family. Chris and I were thrilled. We felt blessed. His other children didn’t have to accept us, though. They already had their own lives and never expected they’d need to make room for two boys from Mexico City who showed up attached to their father’s new marriage. But they did. They treated us like brothers.</w:t>
+        <w:t xml:space="preserve">Overnight, I gained a big sister and two big brothers I hadn’t even known to hope for. Lou had three children of his own long before he ever met my mother: Jon, Lisa, and Joel, thirteen to seventeen years older than me and grown or nearly grown by the time he met her. When he chose us, we inherited his existing family. Chris and I were thrilled. We felt blessed. His other children didn’t have to accept us, though. They already had their own lives and never expected they’d need to make room for two boys from Mexico City who arrived attached to their father’s new marriage. But they did. They treated us like brothers.</w:t>
       </w:r>
     </w:p>
     <w:p>
@@ -3344,7 +3344,7 @@
         <w:pStyle w:val="BodyText"/>
       </w:pPr>
       <w:r>
-        <w:t xml:space="preserve">The moment I felt closest to Jon came years later, both of us grown. He was successful by then, getting close to retirement. I was up in New Jersey for a work training, and I took an hour-and-a-half Uber ride just to go see him. We ended up walking, the two of us, and he told me about a guy he’d mentored at his company, how grateful the man was for the chance, and what it had done for his whole family. The way Jon told it, the thing he was proud of wasn’t the success. It was having been of use to somebody. That was a side of him I’d only seen in pieces. That day I got the whole of it.</w:t>
+        <w:t xml:space="preserve">The moment I felt closest to Jon came years later, both of us grown. He was successful by then, getting close to retirement. I was up in New Jersey for a work training, and I took an hour-and-a-half Uber ride just to go see him. We ended up walking, the two of us, and he told me about a guy he’d mentored at his company, how grateful the man was for the chance, and what it had done for his whole family. The way Jon told it, the thing he was proud of wasn’t the success. It was having been of use to somebody. That was a side of him I’d only seen in pieces. That day I saw it whole.</w:t>
       </w:r>
     </w:p>
     <w:p>
@@ -3467,7 +3467,7 @@
         <w:pStyle w:val="BodyText"/>
       </w:pPr>
       <w:r>
-        <w:t xml:space="preserve">For years I felt guilty about Horacio. I knew, the way a kid knows things without being told, what losing me had done to him. Some part of me decided it was my fault, as if I were the one who had done the leaving. I was four. Nothing about the decision to leave had been mine. The guilt didn’t care. It stayed anyway.</w:t>
+        <w:t xml:space="preserve">For years I felt guilty about Horacio. I knew, without being told, what losing me had done to him. Some part of me decided it was my fault, as if I were the one who had done the leaving. I was four. Nothing about the decision to leave had been mine. The guilt didn’t care. It stayed anyway.</w:t>
       </w:r>
     </w:p>
     <w:p>
@@ -4078,7 +4078,7 @@
         <w:pStyle w:val="BodyText"/>
       </w:pPr>
       <w:r>
-        <w:t xml:space="preserve">I was twelve when wrestling first came up, and it came up between Charlie and my dad. The two of them talked it over before anybody said a word to me. It wasn’t a read on any talent. I didn’t have any. I was awkward, undersized, the kid picked somewhere in the middle in gym class, not last, which would’ve been a story, just middle. It was a hunch, the way people point a kid at something because nothing else has stuck.</w:t>
+        <w:t xml:space="preserve">I was twelve when wrestling first came up, and it came up between Charlie and my dad. The two of them talked it over before anybody said a word to me. It wasn’t a read on any talent. I didn’t have any. I was awkward, undersized, the kid picked somewhere in the middle in gym class, not last, which would’ve been a story, just middle. It was a hunch, pointing a kid at something because nothing else has stuck.</w:t>
       </w:r>
     </w:p>
     <w:p>
@@ -4419,7 +4419,7 @@
         <w:pStyle w:val="FirstParagraph"/>
       </w:pPr>
       <w:r>
-        <w:t xml:space="preserve">The projections had Dave Meyer at quarterback, until a kid named Michael Vick showed up.</w:t>
+        <w:t xml:space="preserve">The projections had Dave Meyer at quarterback, until a kid named Michael Vick came along.</w:t>
       </w:r>
     </w:p>
     <w:p>
@@ -4724,7 +4724,7 @@
         <w:pStyle w:val="FirstParagraph"/>
       </w:pPr>
       <w:r>
-        <w:t xml:space="preserve">I was in middle school when I got the news about Charlie. He and Nancey had separated and he’d drifted somewhere harder to reach. The disease had him, the same one that had Papa, and the same one that came for me a decade later, though I didn’t know that yet. My dad was the one who went and got him, found him alone in his apartment the way you find someone who’s stopped being able to take care of himself. Charlie died about four years after that. I never knew if he got sober in there. He felt sober to me when I saw him — but a kid reads what he wants to read, and to this day I can’t tell you whether those last years were clean or whether the disease had just gone quiet.</w:t>
+        <w:t xml:space="preserve">I was in middle school when I got the news about Charlie. He and Nancey had separated and he’d drifted somewhere harder to reach. The disease had him, the same one that had Papa, and the same one that came for me a decade later, though I didn’t know that yet. My dad was the one who went and got him, found him alone in his apartment, a man who’d stopped being able to take care of himself. Charlie died about four years after that. I never knew if he got sober in there. He felt sober to me when I saw him — but a kid reads what he wants to read, and to this day I can’t tell you whether those last years were clean or whether the disease had just gone quiet.</w:t>
       </w:r>
     </w:p>
     <w:p>
@@ -5032,7 +5032,7 @@
         <w:pStyle w:val="BodyText"/>
       </w:pPr>
       <w:r>
-        <w:t xml:space="preserve">The recruiter had put it to him straight, the way you tell a man something for his own good. They’re going to look at you and see an old man. A grown man, a husband, a father, told he had to look younger than his years to be deemed worthy of a chance.</w:t>
+        <w:t xml:space="preserve">The recruiter had put it to him straight, for his own good. They’re going to look at you and see an old man. A grown man, a husband, a father, told he had to look younger than his years to be deemed worthy of a chance.</w:t>
       </w:r>
     </w:p>
     <w:p>
@@ -5196,7 +5196,7 @@
         <w:pStyle w:val="BodyText"/>
       </w:pPr>
       <w:r>
-        <w:t xml:space="preserve">After the divorce, he lived in Mahwah. He’d go out, have a drink, talk to people. He could sit next to a stranger and walk out with a new friend and a business opportunity. Not scheming. Just how he worked.</w:t>
+        <w:t xml:space="preserve">After the divorce, he lived in Mahwah. He’d go out, have a drink, talk to people. He could sit next to a stranger and walk out with a new friend and a business opportunity. It wasn’t scheming; it was just how he worked.</w:t>
       </w:r>
     </w:p>
     <w:p>
@@ -5334,23 +5334,23 @@
         <w:pStyle w:val="BodyText"/>
       </w:pPr>
       <w:r>
-        <w:t xml:space="preserve">Years later we’re at my sister Lisa’s place in Sarasota, walking into breakfast at Another Broken Egg, and my dad spots a guy outside. His face lights up. Dickie V! The guy turns, and it’s Dick Vitale — the actual Dick Vitale. They’d been friends back in the same part of Jersey, and my dad had been telling me about it for years. Me and Dickie V. I’d nod the way you nod at a man who also swore the lawn was being handled by somebody who worked for free. Then one morning there’s Dickie V himself, turning around at the sound of my father’s voice and lighting up right back at him.</w:t>
-      </w:r>
-    </w:p>
-    <w:p>
-      <w:pPr>
-        <w:pStyle w:val="BodyText"/>
-      </w:pPr>
-      <w:r>
-        <w:t xml:space="preserve">That was Lou. He could not help mentioning the people he knew — the Rascals, Dickie V, a guy from the union hall — all in the same easy tone. It should have been insufferable. It wasn’t, because every name was true. He name-dropped the way a kid spreads out his baseball cards, tickled you were finally looking.</w:t>
-      </w:r>
-    </w:p>
-    <w:p>
-      <w:pPr>
-        <w:pStyle w:val="BodyText"/>
-      </w:pPr>
-      <w:r>
-        <w:t xml:space="preserve">There’s one story I only heard a couple of years ago, from someone close to the family I won’t name. He was a teenager then, and my dad used to put odd jobs his way, errands, cash in his pocket. One day an acquaintance of my dad’s pulled up outside his house and told him to get in the car. A kid at school had been picking on the man’s daughter, calling her fat. He drove him there and told him to handle it. The kid found the boy, told him to stop, got mouthed off at, and dropped him with one punch. Told him he’d better apologize, or he’d be back tomorrow and it would be worse. The boy apologized. A few days later the man came back with a tailor, took measurements right there in the driveway, and within the week five custom suits showed up at the door. No invoice, no explanation. You did somebody a favor, and a tailor showed up at your house.</w:t>
+        <w:t xml:space="preserve">Years later we’re at my sister Lisa’s place in Sarasota, walking into breakfast at Another Broken Egg, and my dad spots a guy outside. His face lights up. Dickie V! The guy turns, and it’s Dick Vitale — the actual Dick Vitale. They’d been friends back in the same part of Jersey, and my dad had been telling me about it for years. Me and Dickie V. I’d nod, since this was also the man who swore the lawn was being handled by somebody who worked for free. Then one morning there’s Dickie V himself, turning around at the sound of my father’s voice and lighting up right back at him.</w:t>
+      </w:r>
+    </w:p>
+    <w:p>
+      <w:pPr>
+        <w:pStyle w:val="BodyText"/>
+      </w:pPr>
+      <w:r>
+        <w:t xml:space="preserve">He could not help mentioning the people he knew — the Rascals, Dickie V, a guy from the union hall — all in the same easy tone. It should have been insufferable. It wasn’t, because every name was true. He name-dropped the way a kid spreads out his baseball cards, tickled you were finally looking.</w:t>
+      </w:r>
+    </w:p>
+    <w:p>
+      <w:pPr>
+        <w:pStyle w:val="BodyText"/>
+      </w:pPr>
+      <w:r>
+        <w:t xml:space="preserve">There’s one story I only heard a couple of years ago, from someone close to the family I won’t name. He was a teenager then, and my dad used to put odd jobs his way, errands, cash in his pocket. One day an acquaintance of my dad’s pulled up outside his house and told him to get in the car. A kid at school had been picking on the man’s daughter, calling her fat. He drove him there and told him to handle it. The kid found the boy, told him to stop, got mouthed off at, and dropped him with one punch. Told him he’d better apologize, or he’d be back tomorrow and it would be worse. The boy apologized. A few days later the man came back with a tailor, took measurements right there in the driveway, and within the week five custom suits arrived at the door. No invoice, no explanation. You did somebody a favor, and a tailor came to your house.</w:t>
       </w:r>
     </w:p>
     <w:p>
@@ -5619,7 +5619,7 @@
         <w:pStyle w:val="BodyText"/>
       </w:pPr>
       <w:r>
-        <w:t xml:space="preserve">There was a version of me I cultivated at Miami. Not Claudio. Rob — county wrestling champion, Miami student, American. Nobody here knew who I’d been before I arrived. Being the darker-skinned kid on a mostly white-bread campus gave me something, and I connected in ways that hadn’t come as easily in high school.</w:t>
+        <w:t xml:space="preserve">There was a version of me I cultivated at Miami, and it wasn’t Claudio. It was Rob — county wrestling champion, Miami student, American. Nobody here knew who I’d been before I arrived. Being the darker-skinned kid on a mostly white-bread campus gave me something, and I connected in ways that hadn’t come as easily in high school.</w:t>
       </w:r>
     </w:p>
     <w:p>
@@ -5659,7 +5659,7 @@
         <w:pStyle w:val="BodyText"/>
       </w:pPr>
       <w:r>
-        <w:t xml:space="preserve">Kappa Sigma did something I didn’t expect. After the standard rush, they came back for me. Not a form letter — a specific ask. I knew the feeling. The thin envelope from the coach. Lou walking into my mother’s life and not leaving. I joined. For the first time I wasn’t the wrestler. I was just Rob, still working out what that meant.</w:t>
+        <w:t xml:space="preserve">Kappa Sigma did something I didn’t expect. After the standard rush, they came back for me with a specific ask, not a form letter. I knew the feeling. The thin envelope from the coach. Lou walking into my mother’s life and not leaving. I joined. For the first time I wasn’t the wrestler. I was just Rob, still working out what that meant.</w:t>
       </w:r>
     </w:p>
     <w:p>
@@ -5691,7 +5691,7 @@
         <w:pStyle w:val="BodyText"/>
       </w:pPr>
       <w:r>
-        <w:t xml:space="preserve">It started at a bar in Oxford, in 1999. Marc held one out and asked if I wanted one. No, I said. I don’t do drugs. It’s a prescription, he said. Oh. Okay. That was the whole negotiation — the entire distance between the man I was and the man I’d become was one word, prescription, and one shrug.</w:t>
+        <w:t xml:space="preserve">It started at a bar in Oxford, in 1999. Marc held one out and asked if I wanted one. No, I said. I don’t do drugs. It’s a prescription, he said. Oh. Okay. The entire distance between the man I was and the man I’d become was one word, prescription, and one shrug.</w:t>
       </w:r>
     </w:p>
     <w:p>
@@ -5715,7 +5715,7 @@
         <w:pStyle w:val="BodyText"/>
       </w:pPr>
       <w:r>
-        <w:t xml:space="preserve">But the freedom only came in the pills and the alcohol. The cost hid inside the gift. Without them, I felt naked. Not shy. Naked. Like I’d been dressed my whole life in borrowed confidence and now everyone could see there was nothing underneath. The inhibition came back the moment the chemicals wore off, and it came back worse, because now I knew exactly what I was missing. So I stopped letting them wear off. The thing that let me be myself was the thing I could no longer be myself without.</w:t>
+        <w:t xml:space="preserve">But the freedom only came in the pills and the alcohol. The cost hid inside the gift. Without them, I felt naked, and I don’t mean shy. I mean like I’d been dressed my whole life in borrowed confidence and now everyone could see there was nothing underneath. The inhibition came back the moment the chemicals wore off, and it came back worse, because now I knew exactly what I was missing. So I stopped letting them wear off. The thing that let me be myself was the thing I could no longer be myself without.</w:t>
       </w:r>
     </w:p>
     <w:p>
@@ -6258,7 +6258,7 @@
         <w:pStyle w:val="BodyText"/>
       </w:pPr>
       <w:r>
-        <w:t xml:space="preserve">The job was selling uniform services to businesses: cold calls, presentations, lunches in parking lots while I ran the next hour in my head. The quota was real. Your manager knew your numbers before breakfast. I loved the structure — clear rules, obvious targets, a scoreboard that updated each day. Lou had raised me in the language of milestones and metrics, where doing the work would show up in the results.</w:t>
+        <w:t xml:space="preserve">The job was selling uniform services to businesses: cold calls, presentations, lunches in parking lots while I ran the next hour in my head. The quota was real. Your manager knew your numbers before breakfast. I loved the structure — clear rules, obvious targets, a scoreboard that updated each day. Lou had raised me in the language of milestones and metrics, where doing the work would register in the results.</w:t>
       </w:r>
     </w:p>
     <w:p>
@@ -7128,7 +7128,7 @@
         <w:pStyle w:val="BodyText"/>
       </w:pPr>
       <w:r>
-        <w:t xml:space="preserve">She knew my favorites were banana cream pie and chicken parm, so there was always whipped cream in the house and she made the pies. Not once. Regularly.</w:t>
+        <w:t xml:space="preserve">She knew my favorites were banana cream pie and chicken parm, so there was always whipped cream in the house and she made the pies, not once but regularly.</w:t>
       </w:r>
     </w:p>
     <w:p>
@@ -7276,7 +7276,7 @@
         <w:pStyle w:val="BodyText"/>
       </w:pPr>
       <w:r>
-        <w:t xml:space="preserve">I covered the walls in Post-it notes — ideas, plans, schemes, businesses I was going to start, money I was going to make. The whole next version of my life mapped out in ballpoint on yellow squares. It wasn’t genius. I was a man who couldn’t finish a thought papering a room with brightly colored evidence of my profound addiction.</w:t>
+        <w:t xml:space="preserve">I covered the walls in Post-it notes — ideas, plans, schemes, businesses I was going to start, money I was going to make. The whole next version of my life mapped out in ballpoint on yellow squares. It wasn’t genius. I was a man who couldn’t finish a thought papering a room with brightly colored evidence of my addiction.</w:t>
       </w:r>
     </w:p>
     <w:p>
@@ -7817,7 +7817,7 @@
         <w:pStyle w:val="BodyText"/>
       </w:pPr>
       <w:r>
-        <w:t xml:space="preserve">The next two weeks were pure panic. Not fear of dying — fear of being caught. I moved through the days certain people were talking about me in rooms I wasn’t in. They were. My mother and Lou, divorced twelve years, were coordinating a rehab intervention because their son was dying and that outranked everything.</w:t>
+        <w:t xml:space="preserve">The next two weeks were pure panic, not over dying but over being caught. I moved through the days certain people were talking about me in rooms I wasn’t in. They were. My mother and Lou, divorced twelve years, were coordinating a rehab intervention because their son was dying and that outranked everything.</w:t>
       </w:r>
     </w:p>
     <w:p>
@@ -7861,7 +7861,7 @@
         <w:pStyle w:val="BodyText"/>
       </w:pPr>
       <w:r>
-        <w:t xml:space="preserve">After Chris hung up, the first thing I did was go to the pharmacy and fill my last Adderall script. Not to use it. That’s what I told myself. I filled it because a bottle in my hand felt better than no bottle.</w:t>
+        <w:t xml:space="preserve">After Chris hung up, the first thing I did was go to the pharmacy and fill my last Adderall script. I told myself it wasn’t to use it. I filled it because a bottle in my hand felt better than no bottle.</w:t>
       </w:r>
     </w:p>
     <w:p>
@@ -8189,7 +8189,7 @@
         <w:pStyle w:val="BodyText"/>
       </w:pPr>
       <w:r>
-        <w:t xml:space="preserve">Then it started raining. Not a storm. Rain from a clear sky, on the fire, on my face, on the other men. It lasted maybe a minute. Something sealed shut in me broke open. That was the first night I believed God was there with me. In a muddy field in Chumuckla.</w:t>
+        <w:t xml:space="preserve">Then it started raining, not a storm but rain from a clear sky, on the fire, on my face, on the other men. It lasted maybe a minute. Something sealed shut in me broke open. That was the first night I believed God was there with me. In a muddy field in Chumuckla.</w:t>
       </w:r>
     </w:p>
     <w:p>
@@ -8205,7 +8205,7 @@
         <w:pStyle w:val="BodyText"/>
       </w:pPr>
       <w:r>
-        <w:t xml:space="preserve">Ninety days later, I walked out different. Not fixed. Different. Cliff, a volunteer with more sober time, pulled me aside on my last day.</w:t>
+        <w:t xml:space="preserve">Ninety days later, I walked out different, which isn’t the same as fixed. Cliff, a volunteer with more sober time, pulled me aside on my last day.</w:t>
       </w:r>
       <w:r>
         <w:t xml:space="preserve"> </w:t>
@@ -8623,7 +8623,7 @@
         <w:pStyle w:val="BodyText"/>
       </w:pPr>
       <w:r>
-        <w:t xml:space="preserve">Early in sobriety, your brain is rewiring itself. You walk around in a fog, not drunk, not high, just flat. I was depressed, living with my parents, going to meetings, trying to figure out what came next, and I kept landing on the same thought: I’d never build something real again. Not somebody like me. Somewhere in there I heard people say how few stay sober. I never looked it up. When you’re new, you don’t hear that as information. You look around the room and wonder which one of you it’s going to be. I was a long shot.</w:t>
+        <w:t xml:space="preserve">Early in sobriety, your brain is rewiring itself. You walk around in a fog, not drunk, not high, just flat. I was depressed, living with my parents, going to meetings, trying to figure out what came next, and I kept landing on the same thought: I’d never build something real again, not somebody like me. Somewhere in there I heard people say how few stay sober. I never looked it up. When you’re new, you don’t hear that as information. You look around the room and wonder which one of you it’s going to be. I was a long shot.</w:t>
       </w:r>
     </w:p>
     <w:p>
@@ -8689,7 +8689,7 @@
         <w:pStyle w:val="BodyText"/>
       </w:pPr>
       <w:r>
-        <w:t xml:space="preserve">And then there was Quint Studer. I was thirty-three, sober long enough to know I wasn’t going back, and I couldn’t shake the feeling there was something left in the tank. Not ego. A quiet sense that maybe God hadn’t kept me alive just to sit in meetings the rest of my life trying not to mess up again. I wanted to do more. I just hadn’t seen many examples of what that looked like.</w:t>
+        <w:t xml:space="preserve">And then there was Quint Studer. I was thirty-three, sober long enough to know I wasn’t going back, and I couldn’t shake the feeling there was something left in the tank. It wasn’t ego. It was a quiet sense that maybe God hadn’t kept me alive just to sit in meetings the rest of my life trying not to mess up again. I wanted to do more. I just hadn’t seen many examples of what that looked like.</w:t>
       </w:r>
     </w:p>
     <w:p>
@@ -8973,7 +8973,7 @@
         <w:pStyle w:val="BodyText"/>
       </w:pPr>
       <w:r>
-        <w:t xml:space="preserve">Lou set a boundary that landed harder than any consequence I’d faced, not because it was cruel but because it was clean. He’d done what he could do, and he would not stand by and watch me die slowly while pretending that watching helped.</w:t>
+        <w:t xml:space="preserve">He’d done what he could do, and he would not stand by and watch me die slowly while pretending that watching helped.</w:t>
       </w:r>
     </w:p>
     <w:p>
@@ -9251,7 +9251,7 @@
         <w:pStyle w:val="BodyText"/>
       </w:pPr>
       <w:r>
-        <w:t xml:space="preserve">Caroline, the home health leader who would hire me, didn’t waste time. She read my résumé the way people do when they’re not looking to be impressed, following the rise all the way to where it stopped. She didn’t ask about the gaps. She asked about trust.</w:t>
+        <w:t xml:space="preserve">Caroline, the home health leader who would hire me, didn’t waste time. She read my résumé without looking to be impressed, following the rise all the way to where it stopped. She didn’t ask about the gaps. She asked about trust.</w:t>
       </w:r>
     </w:p>
     <w:p>
@@ -9435,7 +9435,7 @@
         <w:pStyle w:val="BodyText"/>
       </w:pPr>
       <w:r>
-        <w:t xml:space="preserve">So I told her. Not the funny version about the nachos. What I did, what it cost me, and what had changed since then. When I finished, the line stayed quiet.</w:t>
+        <w:t xml:space="preserve">So I told her, and not the funny version about the nachos: what I did, what it cost me, and what had changed since then. When I finished, the line stayed quiet.</w:t>
       </w:r>
     </w:p>
     <w:p>
@@ -10263,7 +10263,7 @@
         <w:pStyle w:val="BodyText"/>
       </w:pPr>
       <w:r>
-        <w:t xml:space="preserve">Prices in Pensacola were still down in 2014, which is the only reason a place like that ever came within my budget. It was listed at a hundred and thirty thousand. I offered a hundred and nine, and they accepted. The only thing between me and the keys was the down payment, and I was short. Not dramatically. But enough to matter. So, I called my brother, and I hated every second of it.</w:t>
+        <w:t xml:space="preserve">Prices in Pensacola were still down in 2014, which is the only reason a place like that ever came within my budget. It was listed at a hundred and thirty thousand. I offered a hundred and nine, and they accepted. The only thing between me and the keys was the down payment, and I was short, not dramatically but enough to matter. So, I called my brother, and I hated every second of it.</w:t>
       </w:r>
     </w:p>
     <w:p>
@@ -10499,7 +10499,7 @@
         <w:t xml:space="preserve"> </w:t>
       </w:r>
       <w:r>
-        <w:t xml:space="preserve">There was a hole in me where he had been, an ache carried so long I’d stopped noticing it, and his voice opened it right back up. Years of something close to hatred had grown in that empty space, and even so, looking back, I can’t lay it at anyone’s feet. It was nobody’s fault.</w:t>
+        <w:t xml:space="preserve">There was a hole in me where he had been, an ache carried so long I’d stopped noticing it, and his voice opened it right back up. Years of something close to hatred had grown in that empty space, and even so, I can’t lay it at anyone’s feet. It was nobody’s fault.</w:t>
       </w:r>
     </w:p>
     <w:p>
@@ -10811,15 +10811,15 @@
         <w:pStyle w:val="BodyText"/>
       </w:pPr>
       <w:r>
-        <w:t xml:space="preserve">I met him at Courage at Noon during my first year sober. About eighty, bald, a scratchy voice, a face that looked permanently annoyed, like the world had let him down personally and he hadn’t decided yet whether to forgive it. He smelled like Old Spice, just enough, never too much. His favorite line, and I heard it a hundred times: I’m not here to help any of you. I’m here to save my own butt. And you’re listening to me? That’s just a fringe benefit. People figured he was cynical. Not Bob. Bob had done the work. He just wasn’t going to perform it for an audience. And he had the one thing I could not stop staring at: decades sober, old, and at peace with all of it. I needed to understand how a person did that.</w:t>
-      </w:r>
-    </w:p>
-    <w:p>
-      <w:pPr>
-        <w:pStyle w:val="BodyText"/>
-      </w:pPr>
-      <w:r>
-        <w:t xml:space="preserve">So we got close. We’d go to the diner together after meetings, me at thirty-one, him at eighty, the most unlikely pair in the place, and crack up. He’d tell stories that had no business being that funny, and whatever mess I was in he’d make smaller just by laughing at it. Not at me. With me. Bob knew the difference. Then, years into the friendship, the cancer came. He knew it was going to take him, and he stayed sober anyway, a man at the very end of his life with every excuse in the world to pick up, choosing not to. He fought it for about six months, and somewhere in there he went on hospice, the first time that word ever meant someone I loved instead of a thing I would one day do for a living.</w:t>
+        <w:t xml:space="preserve">I met him at Courage at Noon during my first year sober. About eighty, bald, a scratchy voice, a face that looked permanently annoyed, like the world had let him down personally and he hadn’t decided yet whether to forgive it. He smelled like Old Spice, just enough, never too much. His favorite line, and I heard it a hundred times: I’m not here to help any of you. I’m here to save my own butt. And you’re listening to me? That’s just a fringe benefit. People figured he was cynical, but Bob had done the work. He just wasn’t going to perform it for an audience. And he had the one thing I could not stop staring at: decades sober, old, and at peace with all of it. I needed to understand how a person did that.</w:t>
+      </w:r>
+    </w:p>
+    <w:p>
+      <w:pPr>
+        <w:pStyle w:val="BodyText"/>
+      </w:pPr>
+      <w:r>
+        <w:t xml:space="preserve">So we got close. We’d go to the diner together after meetings, me at thirty-one, him at eighty, the most unlikely pair in the place, and crack up. He’d tell stories that had no business being that funny, and whatever mess I was in he’d make smaller just by laughing at it, with me, not at me. Bob knew the difference. Then, years into the friendship, the cancer came. He knew it was going to take him, and he stayed sober anyway, a man at the very end of his life with every excuse in the world to pick up, choosing not to. He fought it for about six months, and somewhere in there he went on hospice, the first time that word ever meant someone I loved instead of a thing I would one day do for a living.</w:t>
       </w:r>
     </w:p>
     <w:p>
@@ -10907,7 +10907,7 @@
         <w:t xml:space="preserve"> </w:t>
       </w:r>
       <w:r>
-        <w:t xml:space="preserve">I said, which meant, I hear you, and I’ll show up for whatever comes next.</w:t>
+        <w:t xml:space="preserve">I said, which meant, I hear you, and I’ll be there for whatever comes next.</w:t>
       </w:r>
     </w:p>
     <w:p>
@@ -11031,15 +11031,15 @@
         <w:pStyle w:val="BodyText"/>
       </w:pPr>
       <w:r>
-        <w:t xml:space="preserve">Afterward I stayed for his wife, a woman I loved, because there was nothing left to do but be there and not go. That was when it finally landed. Bob was gone. There was no fixing it, no deal to close, no right answer that would have bought him one more minute.</w:t>
-      </w:r>
-    </w:p>
-    <w:p>
-      <w:pPr>
-        <w:pStyle w:val="BodyText"/>
-      </w:pPr>
-      <w:r>
-        <w:t xml:space="preserve">Around that same stretch, the recognition I’d chased my whole life finally showed up at work, and it barely registered. Someone forwarded an internal article. A colleague congratulated me in passing. I skimmed it once and closed the screen. Lou noticed the change in me, the way he noticed everything.</w:t>
+        <w:t xml:space="preserve">Afterward I stayed for his wife, a woman I loved, because there was nothing left to do but be there and not go. There was no fixing it, no deal to close, no right answer that would have bought him one more minute.</w:t>
+      </w:r>
+    </w:p>
+    <w:p>
+      <w:pPr>
+        <w:pStyle w:val="BodyText"/>
+      </w:pPr>
+      <w:r>
+        <w:t xml:space="preserve">Around that same stretch, the recognition I’d chased my whole life finally came, at work, and it barely registered. Someone forwarded an internal article. A colleague congratulated me in passing. I skimmed it once and closed the screen. Lou noticed the change in me, the way he noticed everything.</w:t>
       </w:r>
       <w:r>
         <w:t xml:space="preserve"> </w:t>
@@ -11796,7 +11796,7 @@
         <w:pStyle w:val="FirstParagraph"/>
       </w:pPr>
       <w:r>
-        <w:t xml:space="preserve">Then there was the day she met Lou. I was nervous. Not the wrestling-match kind. Not the holding-cell kind. This was precise, like one wrong word would miss the point.</w:t>
+        <w:t xml:space="preserve">Then there was the day she met Lou. I was nervous, and not the wrestling-match kind or the holding-cell kind. This was precise, like one wrong word would miss the point.</w:t>
       </w:r>
     </w:p>
     <w:p>
@@ -11866,7 +11866,7 @@
         <w:t xml:space="preserve"> </w:t>
       </w:r>
       <w:r>
-        <w:t xml:space="preserve">Not I’ve heard. I know. Lou sat with it, then smiled, small and private.</w:t>
+        <w:t xml:space="preserve">She didn’t say she’d heard; she said she knew. Lou sat with it, then smiled, small and private.</w:t>
       </w:r>
     </w:p>
     <w:p>
@@ -12194,7 +12194,7 @@
         <w:t xml:space="preserve"> </w:t>
       </w:r>
       <w:r>
-        <w:t xml:space="preserve">Not embarrassed, not defensive. Factual.</w:t>
+        <w:t xml:space="preserve">She wasn’t embarrassed or defensive about it, just factual.</w:t>
       </w:r>
       <w:r>
         <w:t xml:space="preserve"> </w:t>
@@ -12804,7 +12804,7 @@
         <w:pStyle w:val="BodyText"/>
       </w:pPr>
       <w:r>
-        <w:t xml:space="preserve">Europe was four countries in two weeks, one carry-on each. In Paris, Hope had planned a real photo shoot, a professional one, the Eiffel Tower behind us, and she told me to pack a suit. Not a blazer. A suit, dress shoes, a tie. I teased her about hauling it across four countries in half of my one bag, but the truth is I loved what it said about her. She doesn’t just take a trip. She plans the memory, puts the effort in ahead of time, and hands you something to keep. All I had to do was put on the suit and stand where she told me. I’ve done harder things for less.</w:t>
+        <w:t xml:space="preserve">Europe was four countries in two weeks, one carry-on each. In Paris, Hope had planned a real photo shoot, a professional one, the Eiffel Tower behind us, and she told me to pack a suit — not a blazer, a suit, with dress shoes and a tie. I teased her about hauling it across four countries in half of my one bag, and I loved what it said about her. She doesn’t just take a trip. She plans the memory, puts the effort in ahead of time, and hands you something to keep. All I had to do was put on the suit and stand where she told me. I’ve done harder things for less.</w:t>
       </w:r>
     </w:p>
     <w:p>
@@ -13062,7 +13062,7 @@
         <w:pStyle w:val="BodyText"/>
       </w:pPr>
       <w:r>
-        <w:t xml:space="preserve">About six months in, I brought Hope to meet my mom. Gary, my mom’s boyfriend, was there too, one of the good people I’ve known. We had lunch at Tavern on the Green and walked through Central Park. A good day. Then she stepped over a curb and her leg gave out. Not a stumble you laugh off, her body just quit. I helped her up. She brushed it off. But I saw it. The first time I looked at my mother and saw someone fragile.</w:t>
+        <w:t xml:space="preserve">About six months in, I brought Hope to meet my mom. Gary, my mom’s boyfriend, was there too, one of the good people I’ve known. We had lunch at Tavern on the Green and walked through Central Park. A good day. Then she stepped over a curb and her leg gave out. It wasn’t a stumble you laugh off; her body just quit. I helped her up. She brushed it off. But I saw it. The first time I looked at my mother and saw someone fragile.</w:t>
       </w:r>
     </w:p>
     <w:p>
@@ -13374,7 +13374,7 @@
         <w:pStyle w:val="FirstParagraph"/>
       </w:pPr>
       <w:r>
-        <w:t xml:space="preserve">They called him Diabetes Dave in Panama City. Not behind his back. To his face. He doesn’t even go to the front door. He goes to the back. Dave was my mentor. He took the time.</w:t>
+        <w:t xml:space="preserve">They called him Diabetes Dave in Panama City, to his face, not behind his back. He doesn’t even go to the front door. He goes to the back. Dave was my mentor. He took the time.</w:t>
       </w:r>
     </w:p>
     <w:p>
@@ -13791,7 +13791,7 @@
         <w:pStyle w:val="BodyText"/>
       </w:pPr>
       <w:r>
-        <w:t xml:space="preserve">Lisa and I talked. We knew he had to do something. Chris was the one who got through to him, researched, found a surgeon in Birmingham using connections from a previous job, got him an appointment. The surgeon looked at him and said, stage 4, your age, no surgeon is going to operate on you. We were distraught. Surgery had worked the first time; we thought it was the answer again. Immunotherapy came up, usually not as hard on the body as chemo or radiation, we were told. Lou agreed to try. He was choosing to try. Not for himself. For us.</w:t>
+        <w:t xml:space="preserve">Lisa and I talked. We knew he had to do something. Chris was the one who got through to him, researched, found a surgeon in Birmingham using connections from a previous job, got him an appointment. The surgeon looked at him and said, stage 4, your age, no surgeon is going to operate on you. We were distraught. Surgery had worked the first time; we thought it was the answer again. Immunotherapy came up, usually not as hard on the body as chemo or radiation, we were told. Lou agreed to try. He was choosing to try, for us, not for himself.</w:t>
       </w:r>
     </w:p>
     <w:bookmarkEnd w:id="49"/>
@@ -13813,7 +13813,7 @@
         <w:pStyle w:val="FirstParagraph"/>
       </w:pPr>
       <w:r>
-        <w:t xml:space="preserve">The immunotherapy started in summer 2024. At first, impossibly, it worked. The tumor in his lung nearly dissolved. The oncologist used the word encouraging. Then the side effects came, rashes all over his body. Lou never complained. His heart rate and blood pressure started going off and he ended up in the hospital. I was there when they put the pacemaker in. He was upbeat about it, ready to keep fighting. A pacemaker at eighty-three and he came out looking for the next round. He did a second round of immunotherapy, then a third, trying to clear the lymph nodes. The third round was what finally took a toll. He got weak. By mid-2025 the phone calls had changed, and he stopped asking about my work. Not because he didn’t care. Because asking took focus that was going to the basic maintenance of existing. And in July 2025, a year and a half into the fight, he was there when Chris and Nisha’s daughter, Priya, was born. He held her.</w:t>
+        <w:t xml:space="preserve">The immunotherapy started in summer 2024. At first, impossibly, it worked. The tumor in his lung nearly dissolved. The oncologist used the word encouraging. Then the side effects came, rashes all over his body. Lou never complained. His heart rate and blood pressure started going off and he ended up in the hospital. I was there when they put the pacemaker in. He was upbeat about it, ready to keep fighting. A pacemaker at eighty-three and he came out looking for the next round. He did a second round of immunotherapy, then a third, trying to clear the lymph nodes. The third round was what finally took a toll. He got weak. By mid-2025 the phone calls had changed, and he stopped asking about my work, not because he didn’t care but because asking took focus that was going to the basic maintenance of existing. And in July 2025, a year and a half into the fight, he was there when Chris and Nisha’s daughter, Priya, was born. He held her.</w:t>
       </w:r>
     </w:p>
     <w:bookmarkEnd w:id="50"/>
@@ -14326,15 +14326,15 @@
         <w:pStyle w:val="BodyText"/>
       </w:pPr>
       <w:r>
-        <w:t xml:space="preserve">Recovery had handed me a script and made me practice it daily. Tell the truth. Ask for help. Go to the meeting. Call the sponsor. Pray. Stay sober today. Be useful to someone else. Hospice was the same script in a different room. Stay present. Tell the truth gently. Don’t run from silence. Don’t make dying about your own discomfort.</w:t>
-      </w:r>
-    </w:p>
-    <w:p>
-      <w:pPr>
-        <w:pStyle w:val="BodyText"/>
-      </w:pPr>
-      <w:r>
-        <w:t xml:space="preserve">I met with a family once. I’ll call the daughter Mary. Her mother was ninety-five, couldn’t get out of bed, couldn’t stand more than thirty seconds. The family had misgivings. They always do. So I didn’t lead with information. I led with a question. How is seeing her like this affecting you? The room shifted. One by one they started talking, the hospitalizations, the rehab stays, the hope that kept arriving and retreating, the exhaustion they hadn’t given themselves permission to name. At some point we prayed. When we were done the family made the decision together. Someone had finally asked them how they were carrying it.</w:t>
+        <w:t xml:space="preserve">Recovery had handed me a script and made me practice it daily. Tell the truth. Ask for help. Go to the meeting. Call the sponsor. Pray. Stay sober today. Be useful to someone else. In hospice it read: Stay present. Tell the truth gently. Don’t run from silence. Don’t make dying about your own discomfort.</w:t>
+      </w:r>
+    </w:p>
+    <w:p>
+      <w:pPr>
+        <w:pStyle w:val="BodyText"/>
+      </w:pPr>
+      <w:r>
+        <w:t xml:space="preserve">I met with a family once. I’ll call the daughter Mary. Her mother was ninety-five, couldn’t get out of bed, couldn’t stand more than thirty seconds. The family had misgivings. They always do. So I didn’t lead with information. I led with a question. How is seeing her like this affecting you? The room shifted. One by one they started talking, the hospitalizations, the rehab stays, the hope that kept arriving and retreating, the exhaustion they hadn’t given themselves permission to name. At some point we prayed. When we were done the family made the decision together.</w:t>
       </w:r>
     </w:p>
     <w:p>
@@ -14386,7 +14386,7 @@
         <w:t xml:space="preserve"> </w:t>
       </w:r>
       <w:r>
-        <w:t xml:space="preserve">I’d walked into that room to sit with a dying man and ended up holding his wife’s other grief, the living one. Addiction doesn’t wait outside the hospice door. It’s already in half the rooms.</w:t>
+        <w:t xml:space="preserve">Addiction doesn’t wait outside the hospice door. It’s already in half the rooms.</w:t>
       </w:r>
     </w:p>
     <w:p>
@@ -15168,7 +15168,7 @@
         <w:rPr>
           <w:highlight w:val="yellow"/>
         </w:rPr>
-        <w:t xml:space="preserve">Nobody said the word hospice about my father. Not Donna, who is a nurse. Not Chris. Not me, who says it for a living. It went that fast, and that is true, and it is also the sentence I hear from families every week, and I have never once believed it was the whole reason.</w:t>
+        <w:t xml:space="preserve">Nobody said the word hospice about my father, not Donna, who is a nurse, not Chris, not me, who says it for a living. It went that fast, and that is true, and it is also the sentence I hear from families every week, and I have never once believed it was the whole reason.</w:t>
       </w:r>
     </w:p>
     <w:p>
@@ -15334,7 +15334,7 @@
         <w:pStyle w:val="FirstParagraph"/>
       </w:pPr>
       <w:r>
-        <w:t xml:space="preserve">The relationship between my father and me was not perfect. Nothing in this story has been. But in the years of my sobriety, the real years, the years of staying, we said what needed saying. Not in one conversation. Not in a deathbed scene. In the ordinary: Sunday phone calls, the back porch in Pensacola, the moment at my wedding when my mother’s toast reached him and his fist went up, the moment at the business conference when Quint said his name in a room full of leaders. I made amends to him with years of behavior that said: I know what you did, I know what it cost, I’m not going to waste it. He told me. Four words on a phone call.</w:t>
+        <w:t xml:space="preserve">The relationship between my father and me was not perfect. Nothing in this story has been. But in the years of my sobriety, the real years, the years of staying, we said what needed saying, not in one conversation or a deathbed scene but in the ordinary: Sunday phone calls, the back porch in Pensacola, the moment at my wedding when my mother’s toast reached him and his fist went up, the moment at the business conference when Quint said his name in a room full of leaders. I made amends to him with years of behavior that said: I know what you did, I know what it cost, I’m not going to waste it. He told me. Four words on a phone call.</w:t>
       </w:r>
       <w:r>
         <w:t xml:space="preserve"> </w:t>
@@ -15406,7 +15406,7 @@
         <w:pStyle w:val="BodyText"/>
       </w:pPr>
       <w:r>
-        <w:t xml:space="preserve">Grief changed my tolerance. Comments that used to roll past me landed wrong now. I hadn’t gotten softer. I’d gotten honest. After Lou died there were conversations I’d leave early, rooms I’d step out of, people I’d stop calling back. Not out of anger. Out of survival.</w:t>
+        <w:t xml:space="preserve">Grief changed my tolerance. Comments that used to roll past me landed wrong now. I hadn’t gotten softer. I’d gotten honest. After Lou died there were conversations I’d leave early, rooms I’d step out of, people I’d stop calling back, out of survival, not anger.</w:t>
       </w:r>
     </w:p>
     <w:p>
@@ -15636,15 +15636,15 @@
         <w:pStyle w:val="BodyText"/>
       </w:pPr>
       <w:r>
-        <w:t xml:space="preserve">I never wanted a drink. That surprised me. What I wanted was to be gone. I let the routines slip. The gym went first, and I still haven’t found my way back to it very often. I haven’t watched a Yankees game since he died. Some things are still too closely connected to him. He was always the one who told me he was proud of me. I let the phone ring, sat in rooms without being in them. I’d get in the car and drive with no destination, park somewhere and cry, then drive some more. Sometimes I’d end up asleep on a couch in the lobby of a hotel where I wasn’t a guest. Numb. When I wasn’t driving the car I was working on it, hours at a time, jobs it didn’t need. What I needed, I kept telling myself, was to be alone. I’d write some and sleep. Some of the pages in this book come from those weeks. These chapters were the hardest to write; writing it meant living it twice. The hospice job was still new, and I kept going to it through all of this. I couldn’t tell you how. Hope never knew where I was. When I came home she’d ask, and the honest answer was nowhere. Disappearing, on a woman whose oldest wound is being left.</w:t>
-      </w:r>
-    </w:p>
-    <w:p>
-      <w:pPr>
-        <w:pStyle w:val="BodyText"/>
-      </w:pPr>
-      <w:r>
-        <w:t xml:space="preserve">She watched it get worse before I did. I got into a couple of fender benders, my head somewhere else at stop signs and in parking lots. Then I hit a guardrail. Twenty-two thousand dollars of damage. The cardinal had already come by then. I had stood in a parking lot on the ninth and felt peace, and I still put a car into a guardrail. Hope and her mom were worried, and said so. I got defensive. I didn’t want to look weak. They were right, which was the part I couldn’t stand. It was like cutting weight again. You’re starving, you won’t eat, and nobody at the table understands why, because from the inside it makes perfect sense. Hope started watching me the way you watch someone after a fall, and finally asked, seriously, whether I might have a concussion. That’s what grief looked like on me. Enough like a head injury that the person who knows me best couldn’t tell the difference. Then she said the thing that cut through.</w:t>
+        <w:t xml:space="preserve">I never wanted a drink. That surprised me. What I wanted was to be gone. I let the routines slip. The gym went first, and I still haven’t found my way back to it very often. I haven’t watched a Yankees game since he died. Some things are still too closely connected to him. I let the phone ring, sat in rooms without being in them. I’d get in the car and drive with no destination, park somewhere and cry, then drive some more. Sometimes I’d end up asleep on a couch in the lobby of a hotel where I wasn’t a guest. Numb. When I wasn’t driving the car I was working on it, hours at a time, jobs it didn’t need. What I needed, I kept telling myself, was to be alone. I’d write some and sleep. Some of the pages in this book come from those weeks. These chapters were the hardest to write; writing it meant living it twice. The hospice job was still new, and I kept going to it through all of this. I couldn’t tell you how. Hope never knew where I was. When I came home she’d ask, and the honest answer was nowhere. Disappearing, on a woman whose oldest wound is being left.</w:t>
+      </w:r>
+    </w:p>
+    <w:p>
+      <w:pPr>
+        <w:pStyle w:val="BodyText"/>
+      </w:pPr>
+      <w:r>
+        <w:t xml:space="preserve">She watched it get worse before I did. I got into a couple of fender benders, my head somewhere else at stop signs and in parking lots. Then I hit a guardrail. Twenty-two thousand dollars of damage. The cardinal had already come by then. I had stood in a parking lot on the ninth and felt peace, and I still put a car into a guardrail. Hope and her mom were worried, and said so. I got defensive. I didn’t want to look weak. They were right, which was the part I couldn’t stand. It was like cutting weight again. You’re starving, you won’t eat, and nobody at the table understands why, because from the inside it makes perfect sense. Hope started watching me the way you watch someone after a fall, and finally asked, seriously, whether I might have a concussion. Then she said the thing that cut through.</w:t>
       </w:r>
       <w:r>
         <w:t xml:space="preserve"> </w:t>
@@ -15786,7 +15786,7 @@
         <w:pStyle w:val="BodyText"/>
       </w:pPr>
       <w:r>
-        <w:t xml:space="preserve">The mechanics of it are simple. The first thing I do in any room is pull a chair up close. I remember an older woman with one framed photograph beside her bed, her daughter, a whole life narrowed down to the one face she wanted near her. I remember a man who told me his single regret, and there was nothing material in it. Nobody at the end talks about the things they bought. He wished he had traveled outside the country, just once. That was the whole confession. A woman with dementia once asked me to go to prom with her. People ask how I can stand this work. Some days the work asks you to prom. And once, after my father died, I sat with a man who reminded me so much of Lou that when he passed I had to step out of the room and stand there awhile before I could be useful to anybody. People ask what those rooms smell like, too, expecting something terrible. They smell clean. Hospital clean. That scrubbed-blank smell is to me now what rubber and sweat were to the wrestling room.</w:t>
+        <w:t xml:space="preserve">The mechanics of it are simple. The first thing I do in any room is pull a chair up close. I remember an older woman with one framed photograph beside her bed, her daughter, a whole life narrowed down to the one face she wanted near her. I remember a man who told me his single regret, and there was nothing material in it. Nobody at the end talks about the things they bought. He wished he had traveled outside the country, just once. A woman with dementia once asked me to go to prom with her. People ask how I can stand this work. Some days the work asks you to prom. And once, after my father died, I sat with a man who reminded me so much of Lou that when he passed I had to step out of the room and stand there awhile before I could be useful to anybody. People ask what those rooms smell like, too, expecting something terrible. They smell clean. Hospital clean. That scrubbed-blank smell is to me now what rubber and sweat were to the wrestling room.</w:t>
       </w:r>
     </w:p>
     <w:p>
@@ -15957,7 +15957,7 @@
         <w:pStyle w:val="BodyText"/>
       </w:pPr>
       <w:r>
-        <w:t xml:space="preserve">Then I told her we had buried my dad on Saturday. Her face changed. She just sat there with me. And I let myself go. I wouldn’t call it a breakdown, but I cried at that table, that raw, in front of someone I barely knew, and I don’t know whether you’re supposed to cry in front of a nurse you just met at a facility you’re calling on for work. But in that moment I felt something I can only call spiritual, a sense that God had put this person in my path. Not for referrals or business. For this.</w:t>
+        <w:t xml:space="preserve">Then I told her we had buried my dad on Saturday. Her face changed. She just sat there with me. And I let myself go. I wouldn’t call it a breakdown, but I cried at that table, that raw, in front of someone I barely knew, and I don’t know whether you’re supposed to cry in front of a nurse you just met at a facility you’re calling on for work. But in that moment I felt something I can only call spiritual, a sense that God had put this person in my path, not for referrals or business but for this.</w:t>
       </w:r>
     </w:p>
     <w:p>
@@ -16010,7 +16010,7 @@
         <w:pStyle w:val="BodyText"/>
       </w:pPr>
       <w:r>
-        <w:t xml:space="preserve">That table has seen every version of me. For years, in active addiction, I’d show up to Thanksgiving and end up passed out on her couch, dead to the world, sprawled across the whole thing so nobody else could lie down. It turned into a running joke that outlived the using, get to the couch before Rob does. Lisa never shamed me for it. She set a plate for the worst version of me, no lecture, just a place at the table and a couch I’d hog. In those years there weren’t many people left in my corner. She was one of them. I’ve been back plenty of sober years since, no passing out, but the joke stuck.</w:t>
+        <w:t xml:space="preserve">That table has seen every version of me. For years, in active addiction, I’d come to Thanksgiving and end up passed out on her couch, dead to the world, sprawled across the whole thing so nobody else could lie down. It turned into a running joke that outlived the using, get to the couch before Rob does. Lisa never shamed me for it. She set a plate for the worst version of me, no lecture, just a place at the table and a couch I’d hog. In those years there weren’t many people left in my corner. She was one of them. I’ve been back plenty of sober years since, no passing out, but the joke stuck.</w:t>
       </w:r>
     </w:p>
     <w:p>
@@ -16223,7 +16223,7 @@
         <w:pStyle w:val="BodyText"/>
       </w:pPr>
       <w:r>
-        <w:t xml:space="preserve">I stand in the parking lot, phone in my hand, tears on my face, and feel peace. Not the absence of grief. Grief is still there, always will be. But peace underneath it. I look at my phone. The camera had been in photo mode. One picture. The cardinal on the mirror. I send it to Hope. To Chris. To Jon, Lisa, Joel. To Donna. The text: Dad came to see me. I told him I loved him.</w:t>
+        <w:t xml:space="preserve">I stand in the parking lot, phone in my hand, tears on my face, and feel peace. It wasn’t the absence of grief. Grief is still there, always will be. But peace underneath it. I look at my phone. The camera had been in photo mode. One picture. The cardinal on the mirror. I send it to Hope. To Chris. To Jon, Lisa, Joel. To Donna. The text: Dad came to see me. I told him I loved him.</w:t>
       </w:r>
     </w:p>
     <w:p>
@@ -16549,7 +16549,7 @@
         <w:pStyle w:val="BodyText"/>
       </w:pPr>
       <w:r>
-        <w:t xml:space="preserve">I know you’ve tried. I know you’ve lain awake turning someone else’s life over and over, looking for the thing you missed. I was the person on the other end of those nights. My mother wired me money she told herself was for rent. My father drove a truck across the state to haul me home. None of it made me stop. Not because they failed. Because it wasn’t theirs to win. But hear the other half, because it’s just as true: none of it was wasted either. Every one of those rescues bought time, and time was the only thing that could still help me. You cannot make them stop. You can help them live until they do.</w:t>
+        <w:t xml:space="preserve">I know you’ve tried. I know you’ve lain awake turning someone else’s life over and over, looking for the thing you missed. I was the person on the other end of those nights. My mother wired me money she told herself was for rent. My father drove a truck across the state to haul me home. None of it made me stop, and not because they failed. It wasn’t theirs to win. But hear the other half, because it’s just as true: none of it was wasted either. Every one of those rescues bought time, and time was the only thing that could still help me. You cannot make them stop. You can help them live until they do.</w:t>
       </w:r>
     </w:p>
     <w:p>

</xml_diff>

<commit_message>
Name the promise once in the Epilogue; six consistency fixes from the proofreader and panel ten
Co-Authored-By: Claude Opus 5 <noreply@anthropic.com>
Claude-Session: https://claude.ai/code/session_013TTacQAr67Pe2VUwTPop1A
</commit_message>
<xml_diff>
--- a/The_Cardinals_Promise.docx
+++ b/The_Cardinals_Promise.docx
@@ -922,7 +922,7 @@
         <w:pStyle w:val="BodyText"/>
       </w:pPr>
       <w:r>
-        <w:t xml:space="preserve">Lou was a father like that. He hit a hundred fly balls at Finch Park in Ramsey, drove Rob and his brother Chris to wrestling practice three nights a week, and leaned in at every turn because he wanted his boys to be the best version of themselves in every part of life. That love left a mark on Rob, and he carries it forward now, offering families the same presence his father once gave him.</w:t>
+        <w:t xml:space="preserve">Lou was a father like that. He hit a hundred fly balls at Finch Park in Ramsey, drove Rob and his brother Chris to wrestling practice four nights a week, and leaned in at every turn because he wanted his boys to be the best version of themselves in every part of life. That love left a mark on Rob, and he carries it forward now, offering families the same presence his father once gave him.</w:t>
       </w:r>
     </w:p>
     <w:p>
@@ -3334,7 +3334,7 @@
         <w:pStyle w:val="BodyText"/>
       </w:pPr>
       <w:r>
-        <w:t xml:space="preserve">Lisa served as our babysitter when we were not the easiest to look after. She did it without making it out to be a sacrifice. She still hosts Thanksgiving every year, and keeps the table set the way our nana did. You’ll meet her again later, at that table.</w:t>
+        <w:t xml:space="preserve">Lisa served as our babysitter when we were not the easiest to look after. She did it without making it out to be a sacrifice. She still hosts Thanksgiving every year, and keeps the table set the way it has always been set. You’ll meet her again later, at that table.</w:t>
       </w:r>
     </w:p>
     <w:p>
@@ -3408,7 +3408,7 @@
         <w:pStyle w:val="BodyText"/>
       </w:pPr>
       <w:r>
-        <w:t xml:space="preserve">We lived on Woodridge Street, and Domino’s was our pizza. Back then they ran the promise: thirty minutes or it’s free. What they didn’t account for was that our town had a Woodridge Street and a Woodridge Avenue, and the driver went to the Avenue every single time. He’d turn up at our door late and apologizing, and he’d hand us the pizza and our money back. Free Domino’s, over and over, because a guy couldn’t tell a street from an avenue. Chris and I were sure we’d beaten the system.</w:t>
+        <w:t xml:space="preserve">We lived on Woodridge Street, and Domino’s was our pizza. Back then they ran the promise: thirty minutes or it’s free. What they didn’t account for was that Woodridge had both a Woodridge Street and a Woodridge Avenue, and the driver went to the Avenue every single time. He’d turn up at our door late and apologizing, and he’d hand us the pizza and our money back. Free Domino’s, over and over, because a guy couldn’t tell a street from an avenue. Chris and I were sure we’d beaten the system.</w:t>
       </w:r>
     </w:p>
     <w:bookmarkStart w:id="23" w:name="claudio-and-rob"/>
@@ -10511,7 +10511,7 @@
         <w:pStyle w:val="BodyText"/>
       </w:pPr>
       <w:r>
-        <w:t xml:space="preserve">The first time I heard from him after Mexico, I was fifteen. Just his voice undid me, tears before I could get a word out. He was gentle about it.</w:t>
+        <w:t xml:space="preserve">The first time I heard from him after he went back, I was fifteen. Just his voice undid me, tears before I could get a word out. He was gentle about it.</w:t>
       </w:r>
       <w:r>
         <w:t xml:space="preserve"> </w:t>
@@ -10843,7 +10843,7 @@
         <w:pStyle w:val="BodyText"/>
       </w:pPr>
       <w:r>
-        <w:t xml:space="preserve">The very first time I was in a room with someone dying, I was too young to know that was what it was. My grandfather’s mother was in a nursing home, near the end. I was a little boy, barely talking, and the only language I had yet was Spanish. She lay against the pillows, white-haired and round-faced, and to me she looked like exactly one thing. Santa Claus. So I told her so. Ho, ho, ho. My mother said, Stop. I didn’t understand the hush in the room, or that the woman in the bed was leaving, or that I would spend my life walking into rooms just like it. I only remember her face, and my mother’s hand steering me out.</w:t>
+        <w:t xml:space="preserve">The very first time I was in a room with someone dying, I was too young to know that was what it was. My grandfather’s mother was in a nursing home, near the end. I was a little boy with almost no English yet, Spanish still the only language I trusted. She lay against the pillows, white-haired and round-faced, and to me she looked like exactly one thing. Santa Claus. So I told her so. Ho, ho, ho. My mother said, Stop. I didn’t understand the hush in the room, or that the woman in the bed was leaving, or that I would spend my life walking into rooms just like it. I only remember her face, and my mother’s hand steering me out.</w:t>
       </w:r>
     </w:p>
     <w:p>
@@ -16044,7 +16044,7 @@
         <w:pStyle w:val="BodyText"/>
       </w:pPr>
       <w:r>
-        <w:t xml:space="preserve">A stranger had set a place for me at one table. There was another, older one waiting back home. Lisa has Thanksgiving at her house every year. Every year. She sets the table, cooks the meal, opens the door, the way my nana did it, same recipes, same dishes. There’s a stubbornness required to keep a tradition alive when the person who started it is gone.</w:t>
+        <w:t xml:space="preserve">A stranger had set a place for me at one table. There was another, older one waiting back home. Lisa has Thanksgiving at her house every year. Every year. She sets the table, cooks the meal, opens the door, the way it was always done, same recipes, same dishes. There’s a stubbornness required to keep a tradition alive when the person who started it is gone.</w:t>
       </w:r>
     </w:p>
     <w:p>
@@ -16241,7 +16241,7 @@
         <w:pStyle w:val="BodyText"/>
       </w:pPr>
       <w:r>
-        <w:t xml:space="preserve">The last time a cardinal landed on something I was riding in, he was at the wheel of a U-Haul and I was in no shape to notice. Grandma’s looking out for us. He’d said it the way he said most true things, lightly, and moved on.</w:t>
+        <w:t xml:space="preserve">The last time a cardinal landed on something I was riding in, he was at the wheel of a U-Haul and I was in no shape to notice. Grandma’s looking out for us. He’d said it the way he said most true things, lightly, and moved on. That was the promise, and he never called it one. The people who love you don’t stop looking out for you. He believed it about his mother. I am sitting in a parking lot in Raleigh believing it about him.</w:t>
       </w:r>
     </w:p>
     <w:p>

</xml_diff>

<commit_message>
Merge the tightened draft selectively: 40 of 60 lossless compressions adopted, ~620 words cut; rejected every cut that removed protected material
Co-Authored-By: Claude Opus 5 <noreply@anthropic.com>
Claude-Session: https://claude.ai/code/session_013TTacQAr67Pe2VUwTPop1A
</commit_message>
<xml_diff>
--- a/The_Cardinals_Promise.docx
+++ b/The_Cardinals_Promise.docx
@@ -1732,7 +1732,7 @@
         <w:pStyle w:val="BodyText"/>
       </w:pPr>
       <w:r>
-        <w:t xml:space="preserve">My mom got pregnant with Chris when I was two; he was born just before I turned three. The week before, I wouldn’t let my mother put me down. I’d grab her hips while she walked and let her drag me along the floor.</w:t>
+        <w:t xml:space="preserve">Chris was born just before I turned three. The week before, I wouldn’t let my mother put me down. I’d grab her hips while she walked and let her drag me along the floor.</w:t>
       </w:r>
       <w:r>
         <w:t xml:space="preserve"> </w:t>
@@ -2382,7 +2382,7 @@
         <w:pStyle w:val="BodyText"/>
       </w:pPr>
       <w:r>
-        <w:t xml:space="preserve">Nancey, my mother’s youngest sister, treated Chris and me as her own from the start. She was at the games and the matches, always in our corner. Nancey was in her early twenties when we arrived from Mexico, years before she met Charlie. She started seeing him when I was eight and married him two years later. He became my uncle. She told me not long ago that no matter how old I get, she’ll always see the same little kid, and I know the one she means: the boy in the backseat too scared to get out of the car.</w:t>
+        <w:t xml:space="preserve">Nancey, my mother’s youngest sister, treated Chris and me as her own. She was at the games and matches, always in our corner. In her early twenties when we arrived from Mexico, she started seeing Charlie when I was eight and married him two years later. She told me recently that no matter how old I get, she’ll see the same little kid. I know the one: the boy in the backseat too scared to get out.</w:t>
       </w:r>
     </w:p>
     <w:p>
@@ -2616,7 +2616,7 @@
         <w:pStyle w:val="BodyText"/>
       </w:pPr>
       <w:r>
-        <w:t xml:space="preserve">I was six the first time I met him. He came over to my grandparents’ place, where we were living, when Nana and Grandpa invited him to dinner. Tootsie Rolls. That’s all I remember about that night. Lou brought Chris and me Tootsie Rolls. A stranger walked into the house with something in his pocket for two boys who weren’t even his.</w:t>
+        <w:t xml:space="preserve">I was six when Nana and Grandpa invited him to dinner. Tootsie Rolls. That’s all I remember about that night. Lou brought Chris and me Tootsie Rolls. A stranger walked into the house with something in his pocket for two boys who weren’t even his.</w:t>
       </w:r>
     </w:p>
     <w:p>
@@ -2776,7 +2776,7 @@
         <w:pStyle w:val="BodyText"/>
       </w:pPr>
       <w:r>
-        <w:t xml:space="preserve">When the time came to change our names, my mother told me Grandpa wanted to ask me something. We went down to the basement of the Woodridge house, surrounded by wood paneling, brown shag carpet, and the cool stale smell of basement air. Grandpa Bob sat me down and got to the point the way he always did.</w:t>
+        <w:t xml:space="preserve">When it was time to change our names, my mother said Grandpa wanted to ask me something. We went to the basement of the Woodridge house: wood paneling, brown shag carpet, cool stale air. Grandpa Bob got to the point.</w:t>
       </w:r>
     </w:p>
     <w:p>
@@ -2898,7 +2898,7 @@
         <w:pStyle w:val="BodyText"/>
       </w:pPr>
       <w:r>
-        <w:t xml:space="preserve">We moved to Ramsey when I was in sixth grade. Bigger house, new school, a town where the kids had known each other since before I arrived, and I came in as the new boy with dark olive skin and features that didn’t match the rest of Bergen County.</w:t>
+        <w:t xml:space="preserve">We moved to Ramsey when I was in sixth grade. Bigger house, new school. I was the new boy with dark olive skin and features that didn’t match the rest of Bergen County.</w:t>
       </w:r>
     </w:p>
     <w:p>
@@ -4076,7 +4076,7 @@
         <w:pStyle w:val="BodyText"/>
       </w:pPr>
       <w:r>
-        <w:t xml:space="preserve">Kris and Kyle were twin brothers, the most popular kids in the grade, and they sat there too, and they never once joined in. They didn’t stop it. They just left me alone, and being left alone by the popular kids was as close to safe as that room got. I remembered their names for thirty years. I never remembered the ones who did it.</w:t>
+        <w:t xml:space="preserve">Kris and Kyle were twin brothers, the most popular kids in the grade. They sat there too, and never once joined in. They didn’t stop it. Being left alone by them was as close to safe as that room got. I remembered their names for thirty years. I never remembered the ones who did it.</w:t>
       </w:r>
     </w:p>
     <w:p>
@@ -4134,7 +4134,7 @@
         <w:pStyle w:val="BodyText"/>
       </w:pPr>
       <w:r>
-        <w:t xml:space="preserve">Charlie was Aunt Nancey’s husband, and a room got lighter the moment he walked into it. He laughed easily. He looked at you, even when you were a kid, like what you were saying was the most interesting thing he’d heard all day. He loved my aunt, and she loved him. I talked to Nancey recently and she didn’t dress it up: there will never be another man like Charlie. She hasn’t dated in years.</w:t>
+        <w:t xml:space="preserve">Charlie was Aunt Nancey’s husband, and a room got lighter when he walked into it. He laughed easily. He looked at you, even when you were a kid, like what you were saying was the most interesting thing he’d heard all day. I talked to Nancey recently and she didn’t dress it up: there will never be another man like Charlie. She hasn’t dated in years.</w:t>
       </w:r>
     </w:p>
     <w:p>
@@ -4150,7 +4150,7 @@
         <w:pStyle w:val="BodyText"/>
       </w:pPr>
       <w:r>
-        <w:t xml:space="preserve">Before Charlie ever came over to make his case to Chris and me, my dad sat me down and asked if it was something I wanted to do. He didn’t sign me up. He asked. Then he said, we’ll try it, the way he said that about a lot of things, not with any heat, just the quiet of a man who figured most things give way to persistence. So I went.</w:t>
+        <w:t xml:space="preserve">Before Charlie came over to make his case to Chris and me, my dad asked if it was something I wanted to do. He didn’t sign me up. He asked. Then he said, we’ll try it, with the quiet of a man who figured most things give way to persistence. So I went.</w:t>
       </w:r>
     </w:p>
     <w:p>
@@ -4407,7 +4407,7 @@
         <w:pStyle w:val="BodyText"/>
       </w:pPr>
       <w:r>
-        <w:t xml:space="preserve">It was three and a half hours from our house, the Baseball Hall of Fame, and he kept driving like it was nothing.</w:t>
+        <w:t xml:space="preserve">The Baseball Hall of Fame was three and a half hours from our house. He kept driving like it was nothing.</w:t>
       </w:r>
     </w:p>
     <w:p>
@@ -4780,7 +4780,7 @@
         <w:pStyle w:val="BodyText"/>
       </w:pPr>
       <w:r>
-        <w:t xml:space="preserve">I loved him, and that’s hard to explain to people who think grief needs proximity. I hadn’t talked to him in years. I was sixteen, buried in wrestling and school. But I’d loved him, and when he died something opened in me I didn’t have a name for. Nobody validated it. He was the first person I loved who died. I’d lost Papa years before, but there was no funeral, nothing to stand in front of. Papa was gone and still alive somewhere. Charlie was gone.</w:t>
+        <w:t xml:space="preserve">I hadn’t talked to Charlie in years. I was sixteen, buried in wrestling and school. But I loved him, and when he died something opened in me I didn’t have a name for. Nobody validated it. He was the first person I loved who died. I’d lost Papa years before, but there was no funeral, nothing to stand in front of. Papa was gone and still alive somewhere. Charlie was gone.</w:t>
       </w:r>
     </w:p>
     <w:p>
@@ -5040,7 +5040,7 @@
         <w:pStyle w:val="BodyText"/>
       </w:pPr>
       <w:r>
-        <w:t xml:space="preserve">A recruiter looked at my father across a desk and told him to dye the gray out of his hair. He went home and did it and never said a word about it. I understood the cost only later, when money got tight. By then he was in his early fifties, and we were living in Ramsey. I was in high school — old enough to notice tension, too young to know its price.</w:t>
+        <w:t xml:space="preserve">A recruiter told my father to dye the gray out of his hair. He went home and did it and never said a word about it. He was in his early fifties, and we were living in Ramsey. I was in high school — old enough to notice tension, too young to know its price.</w:t>
       </w:r>
     </w:p>
     <w:p>
@@ -5088,7 +5088,7 @@
         <w:pStyle w:val="BodyText"/>
       </w:pPr>
       <w:r>
-        <w:t xml:space="preserve">Every day he put on a suit. Every single day, even when there was no interview on the calendar, nowhere definite to go. He shaved, tied the tie, polished his shoes, and walked out the door like a man with somewhere to be. He treated looking for work as work.</w:t>
+        <w:t xml:space="preserve">Every day he put on a suit, even when there was no interview on the calendar. He shaved, tied the tie, polished his shoes, and walked out the door. He treated looking for work as work.</w:t>
       </w:r>
     </w:p>
     <w:p>
@@ -6354,7 +6354,7 @@
         <w:t xml:space="preserve"> </w:t>
       </w:r>
       <w:r>
-        <w:t xml:space="preserve">I’d say, trying to get him to tell me he was proud of me or that he recognized my success.</w:t>
+        <w:t xml:space="preserve">I’d say, waiting for him to say he was proud.</w:t>
       </w:r>
     </w:p>
     <w:p>
@@ -6854,7 +6854,7 @@
         <w:pStyle w:val="BodyText"/>
       </w:pPr>
       <w:r>
-        <w:t xml:space="preserve">Chris did not make a scene. He didn’t lecture me or turn the bottle into some bigger moment than it already was. He sat there and stayed calm. He had his own problems and very little room to express them, because mine had become so large.</w:t>
+        <w:t xml:space="preserve">Chris didn’t lecture me or make a scene. He stayed calm. He had his own problems and very little room to express them, because mine had become so large.</w:t>
       </w:r>
     </w:p>
     <w:p>
@@ -7038,7 +7038,7 @@
         <w:pStyle w:val="BodyText"/>
       </w:pPr>
       <w:r>
-        <w:t xml:space="preserve">I made a friend there, Tristan. He’d been on a soap opera. An absolute lunatic. He had done a lot of cocaine and hit a wall, and we clicked because we both came from lives that looked good from the street and were rotting inside. Between sessions we sat out on the grounds and talked about nothing and laughed. It felt like summer camp. That was the problem.</w:t>
+        <w:t xml:space="preserve">I made a friend, Tristan. He’d been on a soap opera. An absolute lunatic. He’d done a lot of cocaine and hit a wall. We both came from lives that looked good from the street and were rotting inside. Between sessions we sat outside talking about nothing and laughing. It felt like summer camp. That was the problem.</w:t>
       </w:r>
     </w:p>
     <w:p>
@@ -7128,7 +7128,7 @@
         <w:pStyle w:val="BodyText"/>
       </w:pPr>
       <w:r>
-        <w:t xml:space="preserve">I stopped at a red light and looked left. A cop. I looked right. Another cop. I was a man with a suspended license and liquor on my breath, boxed in on both sides, in a town where nobody knew me yet. I put both hands on the wheel and held my breath. I did not look at either of them. The light took forever.</w:t>
+        <w:t xml:space="preserve">At a red light I looked left. A cop. Right. Another cop. Suspended license, liquor on my breath, boxed in. I put both hands on the wheel and held my breath. I did not look at either of them. The light took forever.</w:t>
       </w:r>
     </w:p>
     <w:p>
@@ -7176,7 +7176,7 @@
         <w:pStyle w:val="BodyText"/>
       </w:pPr>
       <w:r>
-        <w:t xml:space="preserve">She knew my favorites were banana cream pie and chicken parm, so there was always whipped cream in the house and she made the pies, not once but regularly.</w:t>
+        <w:t xml:space="preserve">She knew my favorites were banana cream pie and chicken parm. There was always whipped cream in the house, and she made the pies regularly.</w:t>
       </w:r>
     </w:p>
     <w:p>
@@ -7216,7 +7216,7 @@
         <w:pStyle w:val="BodyText"/>
       </w:pPr>
       <w:r>
-        <w:t xml:space="preserve">I left and got an apartment in West Palm Beach, and I can’t hand you a clean reason. The disease wanted more room than my aunt’s couch gave it, and it sold me the move as a fresh start. In West Palm the drinking came back. I added cocaine. I all but stopped eating. My body started filing its own reports, malnutrition, metabolic syndrome, the machinery quietly failing while I told anyone who asked that I was fine.</w:t>
+        <w:t xml:space="preserve">I left for an apartment in West Palm Beach, and I can’t hand you a clean reason. The disease wanted more room than my aunt’s couch gave it and sold me a fresh start. The drinking came back. I added cocaine and all but stopped eating. Malnutrition, metabolic syndrome, my body failing while I told anyone who asked I was fine.</w:t>
       </w:r>
     </w:p>
     <w:p>
@@ -7909,7 +7909,7 @@
         <w:pStyle w:val="BodyText"/>
       </w:pPr>
       <w:r>
-        <w:t xml:space="preserve">After Chris hung up, the first thing I did was go to the pharmacy and fill my last Adderall script. I told myself it wasn’t to use it. I filled it because a bottle in my hand felt better than no bottle.</w:t>
+        <w:t xml:space="preserve">After Chris hung up, I went to the pharmacy and filled my last Adderall script. I told myself it wasn’t to use. A bottle in my hand felt better than no bottle.</w:t>
       </w:r>
     </w:p>
     <w:p>
@@ -7925,7 +7925,7 @@
         <w:pStyle w:val="BodyText"/>
       </w:pPr>
       <w:r>
-        <w:t xml:space="preserve">He was in the kitchen. I walked in and took it out and held it toward him. For a second he didn’t move. I had never seen that look on him. Lou Brizzi did not get caught off guard, and he was caught. He looked at the bottle and then at me.</w:t>
+        <w:t xml:space="preserve">Lou was in the kitchen. I held out the bottle. For a second he didn’t move. Lou Brizzi did not get caught off guard, and he was caught. He looked at the bottle and then at me.</w:t>
       </w:r>
     </w:p>
     <w:p>
@@ -8005,7 +8005,7 @@
         <w:pStyle w:val="BodyText"/>
       </w:pPr>
       <w:r>
-        <w:t xml:space="preserve">He didn’t ask what had changed or why now or whether I meant it this time. He had the bottle and he had my word, and he was going to act on both before I could take either one back.</w:t>
+        <w:t xml:space="preserve">He didn’t ask why now or whether I meant it. He had the bottle and my word, and he was going to act before I could take either back.</w:t>
       </w:r>
     </w:p>
     <w:p>
@@ -9523,7 +9523,7 @@
         <w:pStyle w:val="BodyText"/>
       </w:pPr>
       <w:r>
-        <w:t xml:space="preserve">The next four days took forever. I went to work, attended meetings, ate, slept, woke up, and did it all over again.</w:t>
+        <w:t xml:space="preserve">For four days I worked, went to meetings, ate, slept. The wait took forever.</w:t>
       </w:r>
     </w:p>
     <w:p>
@@ -9553,7 +9553,7 @@
         <w:pStyle w:val="BodyText"/>
       </w:pPr>
       <w:r>
-        <w:t xml:space="preserve">I didn’t answer right away. I sat in my car in Lou’s driveway and let it sink in. Someone had looked at me and decided I was enough. I called Lou.</w:t>
+        <w:t xml:space="preserve">I sat in my car in Lou’s driveway and let it sink in. Someone had decided I was enough. I called Lou.</w:t>
       </w:r>
     </w:p>
     <w:p>
@@ -9725,7 +9725,7 @@
         <w:pStyle w:val="BodyText"/>
       </w:pPr>
       <w:r>
-        <w:t xml:space="preserve">I remembered needing help and not wanting to be helped. It hadn’t been long since I’d felt I owed every human on the planet an apology for taking up space. So when families talked, I didn’t rush them or fill the silence. I listened.</w:t>
+        <w:t xml:space="preserve">I remembered feeling I owed everyone an apology for taking up space. When families talked, I didn’t rush them or fill the silence. I listened.</w:t>
       </w:r>
     </w:p>
     <w:p>
@@ -10387,7 +10387,7 @@
         <w:pStyle w:val="BodyText"/>
       </w:pPr>
       <w:r>
-        <w:t xml:space="preserve">I set up an automatic payment to pay him back two hundred a month and paid extra when I could. It took me four years. I never missed a payment.</w:t>
+        <w:t xml:space="preserve">I set up an automatic payment of two hundred a month and paid extra when I could. It took me four years. I never missed a payment.</w:t>
       </w:r>
     </w:p>
     <w:p>
@@ -10603,7 +10603,7 @@
         <w:pStyle w:val="BodyText"/>
       </w:pPr>
       <w:r>
-        <w:t xml:space="preserve">For a couple of months, our conversations were easy. We were just two men on the phone, talking about games.</w:t>
+        <w:t xml:space="preserve">For a while, we were just two men on the phone, talking about games.</w:t>
       </w:r>
     </w:p>
     <w:p>
@@ -10619,7 +10619,7 @@
         <w:pStyle w:val="BodyText"/>
       </w:pPr>
       <w:r>
-        <w:t xml:space="preserve">I hadn’t thought of things from his perspective, and I felt sorry for him. I couldn’t imagine what it must have done to him to lose his children and the woman he loved in the same leaving, and then to just stay there, in that spot, all these years. I had built a whole life since Mexico. He had stayed where we left him.</w:t>
+        <w:t xml:space="preserve">I hadn’t thought of it from his side. I couldn’t imagine losing his children and the woman he loved in the same leaving. I had built a whole life since Mexico. He had stayed where we left him.</w:t>
       </w:r>
     </w:p>
     <w:p>
@@ -10901,7 +10901,7 @@
         <w:pStyle w:val="BodyText"/>
       </w:pPr>
       <w:r>
-        <w:t xml:space="preserve">Bob wasn’t the only man I loved who got cancer that year. Lou was diagnosed with stomach and esophageal cancer in the spring of 2015. He was seventy-three. He called me on a Tuesday, no preamble.</w:t>
+        <w:t xml:space="preserve">Bob wasn’t the only man I loved who got cancer. Lou was diagnosed with stomach and esophageal cancer in the spring of 2015. He was seventy-three. He called me on a Tuesday.</w:t>
       </w:r>
       <w:r>
         <w:t xml:space="preserve"> </w:t>
@@ -10955,7 +10955,7 @@
         <w:t xml:space="preserve"> </w:t>
       </w:r>
       <w:r>
-        <w:t xml:space="preserve">I said, which meant, I hear you, and I’ll be there for whatever comes next.</w:t>
+        <w:t xml:space="preserve">I said.</w:t>
       </w:r>
     </w:p>
     <w:p>
@@ -11087,7 +11087,7 @@
         <w:pStyle w:val="BodyText"/>
       </w:pPr>
       <w:r>
-        <w:t xml:space="preserve">Around that same stretch, the recognition I’d chased my whole life finally came, at work, and it barely registered. Someone forwarded an internal article. A colleague congratulated me in passing. I skimmed it once and closed the screen. Lou noticed the change in me, the way he noticed everything.</w:t>
+        <w:t xml:space="preserve">Around then, the recognition I’d chased at work finally came, and it barely registered. Someone forwarded an internal article. A colleague congratulated me. I skimmed it and closed the screen. Lou noticed.</w:t>
       </w:r>
       <w:r>
         <w:t xml:space="preserve"> </w:t>
@@ -11688,7 +11688,7 @@
         <w:pStyle w:val="BodyText"/>
       </w:pPr>
       <w:r>
-        <w:t xml:space="preserve">He nodded slowly. He didn’t follow up. He had heard the one thing he wanted to hear.</w:t>
+        <w:t xml:space="preserve">He nodded.</w:t>
       </w:r>
       <w:r>
         <w:t xml:space="preserve"> </w:t>
@@ -11773,12 +11773,6 @@
       </w:r>
       <w:r>
         <w:t xml:space="preserve">”</w:t>
-      </w:r>
-      <w:r>
-        <w:t xml:space="preserve"> </w:t>
-      </w:r>
-      <w:r>
-        <w:t xml:space="preserve">He was handing me his own regret and trusting me with it.</w:t>
       </w:r>
       <w:r>
         <w:t xml:space="preserve"> </w:t>
@@ -13757,7 +13751,7 @@
         <w:pStyle w:val="BodyText"/>
       </w:pPr>
       <w:r>
-        <w:t xml:space="preserve">I noticed it before I knew what I was noticing, his mood a little off, something in the quality of him I couldn’t name. Chris was getting married in February, and Lou had decided, quietly and completely, that his son’s wedding wasn’t going to be about his diagnosis. So he showed up. He danced. He celebrated. Nisha’s father had passed the year before, and the wedding was a big Indian celebration in Fort Lauderdale, joyful and carrying grief as well as love. Lou understood that. He held it inside and let the day be what it was supposed to be.</w:t>
+        <w:t xml:space="preserve">His mood was off before I knew why. Chris was getting married in February, and Lou wasn’t going to make it about his diagnosis. He danced. He celebrated. Nisha’s father had died the year before. The big Indian wedding in Fort Lauderdale already carried grief. Lou kept his news to himself.</w:t>
       </w:r>
     </w:p>
     <w:p>
@@ -13935,7 +13929,7 @@
         <w:pStyle w:val="BodyText"/>
       </w:pPr>
       <w:r>
-        <w:t xml:space="preserve">I respected the toughness. I also saw the loneliness inside it. It kept him going. It also kept us from helping him.</w:t>
+        <w:t xml:space="preserve">His toughness kept him going. It also kept us from helping.</w:t>
       </w:r>
     </w:p>
     <w:p>
@@ -13995,7 +13989,7 @@
         <w:pStyle w:val="BodyText"/>
       </w:pPr>
       <w:r>
-        <w:t xml:space="preserve">We were moving because life was expanding. Hope had been a pharmacist for eight years. Raleigh made sense: jobs, community, a church that felt like ours. Hope never wavered. She sees clearly and asks hard questions, and under all of it is a bedrock belief that God has a plan for us to be of service.</w:t>
+        <w:t xml:space="preserve">Hope had been a pharmacist for eight years. Raleigh made sense: jobs, community, a church that felt like ours. Hope never wavered. She sees clearly, asks hard questions, and believes God has a plan for us to be of service.</w:t>
       </w:r>
     </w:p>
     <w:bookmarkEnd w:id="51"/>
@@ -14073,7 +14067,7 @@
         <w:pStyle w:val="BodyText"/>
       </w:pPr>
       <w:r>
-        <w:t xml:space="preserve">Hospice, when it came, was a return, to the rooms I’d been thinking about since the home health years. It pulled me out of that in-between place.</w:t>
+        <w:t xml:space="preserve">Hospice brought me back to the rooms I’d been thinking about since the home health years. It pulled me out of that in-between place.</w:t>
       </w:r>
     </w:p>
     <w:bookmarkEnd w:id="52"/>
@@ -14347,7 +14341,7 @@
         <w:pStyle w:val="BodyText"/>
       </w:pPr>
       <w:r>
-        <w:t xml:space="preserve">When the hospice opportunity came, it felt like a room I’d been circling for years with the door finally open. Five weeks after I started the job, my father started to die.</w:t>
+        <w:t xml:space="preserve">When the hospice job came, it felt like a door had finally opened. Five weeks after I started, my father started to die.</w:t>
       </w:r>
     </w:p>
     <w:bookmarkStart w:id="54" w:name="strangers-rooms"/>
@@ -14376,7 +14370,7 @@
         <w:pStyle w:val="BodyText"/>
       </w:pPr>
       <w:r>
-        <w:t xml:space="preserve">Recovery had handed me a script and made me practice it daily. Tell the truth. Ask for help. Go to the meeting. Call the sponsor. Pray. Stay sober today. Be useful to someone else. In hospice it read: Stay present. Tell the truth gently. Don’t run from silence. Don’t make dying about your own discomfort.</w:t>
+        <w:t xml:space="preserve">Recovery had made me practice daily: Tell the truth. Ask for help. Go to the meeting. Call the sponsor. Pray. Stay sober today. Be useful. In hospice: Stay present. Tell the truth gently. Don’t make dying about your own discomfort.</w:t>
       </w:r>
     </w:p>
     <w:p>
@@ -14489,15 +14483,15 @@
         <w:pStyle w:val="BodyText"/>
       </w:pPr>
       <w:r>
-        <w:t xml:space="preserve">I wasn’t there for the very end. I saw him close to it, and a single thought went through me that I couldn’t take back: I never want to see my own dad like that. I had no idea how few weeks were left before that stopped being a fear and became a choice in front of me.</w:t>
-      </w:r>
-    </w:p>
-    <w:p>
-      <w:pPr>
-        <w:pStyle w:val="BodyText"/>
-      </w:pPr>
-      <w:r>
-        <w:t xml:space="preserve">Dad’s decline wasn’t dramatic at first, less energy in his voice on the phone, conversations that used to run long wrapping up faster, with less of the texture that made them his. I’d just spent five weeks learning to read exactly this. I was walking into strangers’ homes explaining what hospice was and wasn’t, and the whole time my own father was crossing the same line I’d been describing to families all week. I didn’t tell them my dad was dying too. I didn’t need to.</w:t>
+        <w:t xml:space="preserve">I wasn’t there for the very end. I saw him close to it and thought: I never want to see my own dad like that. I had no idea how few weeks remained before that fear became a choice.</w:t>
+      </w:r>
+    </w:p>
+    <w:p>
+      <w:pPr>
+        <w:pStyle w:val="BodyText"/>
+      </w:pPr>
+      <w:r>
+        <w:t xml:space="preserve">Dad’s decline wasn’t dramatic at first. Less energy in his voice on the phone. Conversations wrapping up faster. I’d spent five weeks learning to read this in strangers’ homes. My own father was crossing the line I described to families all week. I didn’t tell them my dad was dying too.</w:t>
       </w:r>
     </w:p>
     <w:p>
@@ -15354,7 +15348,7 @@
         <w:pStyle w:val="BodyText"/>
       </w:pPr>
       <w:r>
-        <w:t xml:space="preserve">Then I stood at the casket. I looked down at my father, and it wasn’t him anymore. The body was there, but he wasn’t. I knew his soul had already gone on ahead. I had watched that line get crossed in other people’s rooms more times than I can count, and I knew it the moment I saw it. It still didn’t stop the feeling. I stood there and loved him, for everything he was, and everything he wasn’t.</w:t>
+        <w:t xml:space="preserve">Then I stood at the casket. The body was there, but my father wasn’t. I knew his soul had gone on ahead. I had seen that in other people’s rooms. It didn’t stop the feeling. I stood there and loved him, for everything he was and everything he wasn’t.</w:t>
       </w:r>
     </w:p>
     <w:p>
@@ -16583,7 +16577,7 @@
         <w:pStyle w:val="FirstParagraph"/>
       </w:pPr>
       <w:r>
-        <w:t xml:space="preserve">If you picked up this book because you love someone who is using, or you lost someone who did, I want to say something to you now that the story is done.</w:t>
+        <w:t xml:space="preserve">If you love someone who is using, or lost someone who did, this is for you.</w:t>
       </w:r>
     </w:p>
     <w:p>

</xml_diff>

<commit_message>
Nine proofreader seams closed after the merge (orphaned referents, a name never introduced, two verbless clauses, a repeated phrase)
Co-Authored-By: Claude Fable 5.1 <noreply@anthropic.com>
Claude-Session: https://claude.ai/code/session_013TTacQAr67Pe2VUwTPop1A
</commit_message>
<xml_diff>
--- a/The_Cardinals_Promise.docx
+++ b/The_Cardinals_Promise.docx
@@ -1130,7 +1130,7 @@
         <w:pStyle w:val="BodyText"/>
       </w:pPr>
       <w:r>
-        <w:t xml:space="preserve">He had the watch off my wrist inside a minute. Then the bag. Then everything else in my pockets, one item at a time, no hurry in it anywhere, and the no-hurry was the part that scared me. For a moment I thought that might be the end of it, that I’d be sent back across the line with one more story I’d never tell. Then he took my arm and walked me to a car that wasn’t marked like the ones on TV. No lights. A plain sedan with a man in the passenger seat who never turned around. A hand on my shoulder put me in the back. The car smelled musty, like old smoke had soaked into the seats and stayed. He said things from the front I couldn’t understand, and then he stopped saying anything. Some part of me kept running the old math, telling me this was a toll, a cost of doing business, a story I’d never tell. Then I reached for the door and there was no handle on the inside, and the math stopped working.</w:t>
+        <w:t xml:space="preserve">He had the watch off my wrist inside a minute. Then the bag. Then everything else in my pockets, one item at a time, no hurry in it anywhere, and the no-hurry was the part that scared me. For a moment I thought that might be the end of it, that I’d be sent back across the line with one more story I’d never tell. Then he took my arm and walked me to a car that wasn’t marked like the ones on TV. No lights. A plain sedan with a man in the passenger seat who never turned around. A hand on my shoulder put me in the back. The car smelled musty, like old smoke had soaked into the seats and stayed. He said things from the front I couldn’t understand, and then he stopped saying anything. Some part of me kept running the old math, telling me this was a toll, a cost of doing business. Then I reached for the door and there was no handle on the inside, and the math stopped working.</w:t>
       </w:r>
     </w:p>
     <w:p>
@@ -1724,7 +1724,7 @@
         <w:pStyle w:val="BodyText"/>
       </w:pPr>
       <w:r>
-        <w:t xml:space="preserve">After Mama and Papa, I loved Marcelo, my older cousin. A few years ahead of me, which at that age is a whole generation, and I followed him everywhere. One day he took me to the market for gum. He walked me down the rows, naming things, while I looked at all of it. The gum came in big wrappers in every color, and there was one flavor every kid in the neighborhood wanted. Mango. We found it. I walked home with a piece of it in my cheek.</w:t>
+        <w:t xml:space="preserve">After Mama and Papa, I loved Marcelo, my older cousin. He was a few years ahead of me, which at that age is a whole generation, and I followed him everywhere. One day he took me to the market for gum. He walked me down the rows, naming things, while I looked at all of it. The gum came in big wrappers in every color, and there was one flavor every kid in the neighborhood wanted. Mango. We found it. I walked home with a piece of it in my cheek.</w:t>
       </w:r>
     </w:p>
     <w:p>
@@ -3384,7 +3384,7 @@
         <w:pStyle w:val="BodyText"/>
       </w:pPr>
       <w:r>
-        <w:t xml:space="preserve">Years later he did it again, the three of us driving down to Philadelphia for a Giants game, no occasion, just an excuse to be together. That was Lou’s way, even beyond childhood: make a regular Sunday feel like it mattered.</w:t>
+        <w:t xml:space="preserve">Years later the three of us, Lou and Jon and I, drove down to Philadelphia for a Giants game, no occasion, just an excuse to be together. That was Lou’s way, even beyond childhood: make a regular Sunday feel like it mattered.</w:t>
       </w:r>
     </w:p>
     <w:p>
@@ -4467,7 +4467,7 @@
         <w:pStyle w:val="FirstParagraph"/>
       </w:pPr>
       <w:r>
-        <w:t xml:space="preserve">The projections had Dave Meyer at quarterback, until a kid named Michael Vick came along.</w:t>
+        <w:t xml:space="preserve">The projections had Dave Meyer at quarterback at Virginia Tech, until a kid named Michael Vick came along.</w:t>
       </w:r>
     </w:p>
     <w:p>
@@ -5739,7 +5739,7 @@
         <w:pStyle w:val="BodyText"/>
       </w:pPr>
       <w:r>
-        <w:t xml:space="preserve">It started at a bar in Oxford, in 1999. Marc held one out and asked if I wanted one. No, I said. I don’t do drugs. It’s a prescription, he said. Oh. Okay. The entire distance between the man I was and the man I’d become was one word, prescription, and one shrug.</w:t>
+        <w:t xml:space="preserve">It started at a bar in Oxford, in 1999. A guy I knew named Marc held out a pill and asked if I wanted one. No, I said. I don’t do drugs. It’s a prescription, he said. Oh. Okay. The entire distance between the man I was and the man I’d become was one word, prescription, and one shrug.</w:t>
       </w:r>
     </w:p>
     <w:p>
@@ -7014,7 +7014,7 @@
         <w:pStyle w:val="BodyText"/>
       </w:pPr>
       <w:r>
-        <w:t xml:space="preserve">If you are going to be forced into rehab, you could do worse. It was the kind of place Hollywood people land when their publicists run out of excuses. They kept the grounds manicured like a private golf course, and the ocean so close I could hear the surf pounding at night. And the other inmates or residents were retired grandfathers who had been passing out in the garage, and younger guys who had burned through their twenties faster than they planned. I fit somewhere in the middle and told myself I fit nowhere.</w:t>
+        <w:t xml:space="preserve">If you are going to be forced into rehab, you could do worse. It was the kind of place Hollywood people land when their publicists run out of excuses. They kept the grounds manicured like a private golf course, and the ocean was so close I could hear the surf pounding at night. And the other inmates or residents were retired grandfathers who had been passing out in the garage, and younger guys who had burned through their twenties faster than they planned. I fit somewhere in the middle and told myself I fit nowhere.</w:t>
       </w:r>
     </w:p>
     <w:p>
@@ -13416,7 +13416,7 @@
         <w:pStyle w:val="FirstParagraph"/>
       </w:pPr>
       <w:r>
-        <w:t xml:space="preserve">They called him Diabetes Dave in Panama City, to his face, not behind his back. He doesn’t even go to the front door. He goes to the back. Dave was my mentor. He took the time.</w:t>
+        <w:t xml:space="preserve">They called him Diabetes Dave in Panama City, to his face, not behind his back. At the offices he called on he didn’t even go to the front door. He went to the back. Dave was my mentor. He took the time.</w:t>
       </w:r>
     </w:p>
     <w:p>
@@ -14378,7 +14378,7 @@
         <w:pStyle w:val="BodyText"/>
       </w:pPr>
       <w:r>
-        <w:t xml:space="preserve">I met with a family once. I’ll call the daughter Mary. Her mother was ninety-five, couldn’t get out of bed, couldn’t stand more than thirty seconds. The family had misgivings. They always do. So I didn’t lead with information. I led with a question. How is seeing her like this affecting you? The room shifted. One by one they started talking, the hospitalizations, the rehab stays, the hope that kept arriving and retreating, the exhaustion they hadn’t given themselves permission to name. At some point we prayed. When we were done the family made the decision together.</w:t>
+        <w:t xml:space="preserve">I met with a family once whose mother was ninety-five, couldn’t get out of bed, couldn’t stand more than thirty seconds. The family had misgivings. They always do. So I didn’t lead with information. I led with a question. How is seeing her like this affecting you? The room shifted. One by one they started talking, the hospitalizations, the rehab stays, the hope that kept arriving and retreating, the exhaustion they hadn’t given themselves permission to name. At some point we prayed. When we were done the family made the decision together.</w:t>
       </w:r>
     </w:p>
     <w:p>
@@ -15870,7 +15870,7 @@
         <w:pStyle w:val="BodyText"/>
       </w:pPr>
       <w:r>
-        <w:t xml:space="preserve">They don’t sign anything that day. Sometimes they don’t. But when I stand to go, the husband walks me to the door, which costs him something with his knees, and shakes my hand at the threshold. That’s how I know. Not ready isn’t a no. It’s a doorway, and somebody has to be willing to stand in it first.</w:t>
+        <w:t xml:space="preserve">They don’t sign anything that day. Families often don’t. But when I stand to go, the husband walks me to the door, which costs him something with his knees, and shakes my hand at the threshold. That’s how I know. Not ready isn’t a no. It’s a doorway, and somebody has to be willing to stand in it first.</w:t>
       </w:r>
     </w:p>
     <w:p>

</xml_diff>

<commit_message>
We're good confirmed by the author; line unhighlighted, lock note updated
Co-Authored-By: Claude Fable 5.1 <noreply@anthropic.com>
Claude-Session: https://claude.ai/code/session_013TTacQAr67Pe2VUwTPop1A
</commit_message>
<xml_diff>
--- a/The_Cardinals_Promise.docx
+++ b/The_Cardinals_Promise.docx
@@ -14285,30 +14285,24 @@
         <w:rPr>
           <w:highlight w:val="yellow"/>
         </w:rPr>
-        <w:t xml:space="preserve">He had put that in me a long time ago, and he said it again like it was the first time. Later, while Hope was up at the counter, he looked at me and said,</w:t>
-      </w:r>
-      <w:r>
-        <w:rPr>
-          <w:highlight w:val="yellow"/>
-        </w:rPr>
-        <w:t xml:space="preserve"> </w:t>
-      </w:r>
-      <w:r>
-        <w:rPr>
-          <w:highlight w:val="yellow"/>
-        </w:rPr>
-        <w:t xml:space="preserve">“</w:t>
-      </w:r>
-      <w:r>
-        <w:rPr>
-          <w:highlight w:val="yellow"/>
-        </w:rPr>
+        <w:t xml:space="preserve">He had put that in me a long time ago, and he said it again like it was the first time. Later, while Hope was up at the counter,</w:t>
+      </w:r>
+      <w:r>
+        <w:t xml:space="preserve"> </w:t>
+      </w:r>
+      <w:r>
+        <w:t xml:space="preserve">he looked at me and said,</w:t>
+      </w:r>
+      <w:r>
+        <w:t xml:space="preserve"> </w:t>
+      </w:r>
+      <w:r>
+        <w:t xml:space="preserve">“</w:t>
+      </w:r>
+      <w:r>
         <w:t xml:space="preserve">Rob, don’t worry about me. We’re good.</w:t>
       </w:r>
       <w:r>
-        <w:rPr>
-          <w:highlight w:val="yellow"/>
-        </w:rPr>
         <w:t xml:space="preserve">”</w:t>
       </w:r>
     </w:p>

</xml_diff>

<commit_message>
Christmas week: the calls were with Chris, who was already in Pensacola; Donna's calls unanswered; no oxygen line for Lou
Co-Authored-By: Claude Fable 5.1 <noreply@anthropic.com>
Claude-Session: https://claude.ai/code/session_013TTacQAr67Pe2VUwTPop1A
</commit_message>
<xml_diff>
--- a/The_Cardinals_Promise.docx
+++ b/The_Cardinals_Promise.docx
@@ -14620,7 +14620,7 @@
         <w:rPr>
           <w:highlight w:val="yellow"/>
         </w:rPr>
-        <w:t xml:space="preserve">I called Donna back after nine, from the garage, with the door down.</w:t>
+        <w:t xml:space="preserve">I didn’t call her back. I called Chris after nine, from the garage, with the door down. He was already down there.</w:t>
       </w:r>
     </w:p>
     <w:p>
@@ -14655,7 +14655,7 @@
         <w:rPr>
           <w:highlight w:val="yellow"/>
         </w:rPr>
-        <w:t xml:space="preserve">she said.</w:t>
+        <w:t xml:space="preserve">he said.</w:t>
       </w:r>
       <w:r>
         <w:rPr>
@@ -14691,43 +14691,43 @@
         <w:rPr>
           <w:highlight w:val="yellow"/>
         </w:rPr>
-        <w:t xml:space="preserve">She told me his oxygen number. I knew what the number meant.</w:t>
-      </w:r>
-      <w:r>
-        <w:rPr>
-          <w:highlight w:val="yellow"/>
-        </w:rPr>
-        <w:t xml:space="preserve"> </w:t>
-      </w:r>
-      <w:r>
-        <w:rPr>
-          <w:highlight w:val="yellow"/>
-        </w:rPr>
-        <w:t xml:space="preserve">“</w:t>
-      </w:r>
-      <w:r>
-        <w:rPr>
-          <w:highlight w:val="yellow"/>
-        </w:rPr>
-        <w:t xml:space="preserve">He’s tired, honey. He’s real tired.</w:t>
-      </w:r>
-      <w:r>
-        <w:rPr>
-          <w:highlight w:val="yellow"/>
-        </w:rPr>
-        <w:t xml:space="preserve">”</w:t>
-      </w:r>
-      <w:r>
-        <w:rPr>
-          <w:highlight w:val="yellow"/>
-        </w:rPr>
-        <w:t xml:space="preserve"> </w:t>
-      </w:r>
-      <w:r>
-        <w:rPr>
-          <w:highlight w:val="yellow"/>
-        </w:rPr>
-        <w:t xml:space="preserve">Then she said the thing I’ve heard wives say in living rooms for ten years, and I had never once heard it aimed at me.</w:t>
+        <w:t xml:space="preserve">I knew what that meant in a man with nothing left to fight with.</w:t>
+      </w:r>
+      <w:r>
+        <w:rPr>
+          <w:highlight w:val="yellow"/>
+        </w:rPr>
+        <w:t xml:space="preserve"> </w:t>
+      </w:r>
+      <w:r>
+        <w:rPr>
+          <w:highlight w:val="yellow"/>
+        </w:rPr>
+        <w:t xml:space="preserve">“</w:t>
+      </w:r>
+      <w:r>
+        <w:rPr>
+          <w:highlight w:val="yellow"/>
+        </w:rPr>
+        <w:t xml:space="preserve">He’s tired. He’s real tired.</w:t>
+      </w:r>
+      <w:r>
+        <w:rPr>
+          <w:highlight w:val="yellow"/>
+        </w:rPr>
+        <w:t xml:space="preserve">”</w:t>
+      </w:r>
+      <w:r>
+        <w:rPr>
+          <w:highlight w:val="yellow"/>
+        </w:rPr>
+        <w:t xml:space="preserve"> </w:t>
+      </w:r>
+      <w:r>
+        <w:rPr>
+          <w:highlight w:val="yellow"/>
+        </w:rPr>
+        <w:t xml:space="preserve">Then my brother said the thing I’ve heard families say in living rooms for ten years, and I had never once heard it aimed at me.</w:t>
       </w:r>
       <w:r>
         <w:rPr>
@@ -14762,7 +14762,7 @@
         <w:rPr>
           <w:highlight w:val="yellow"/>
         </w:rPr>
-        <w:t xml:space="preserve">I asked her the questions I ask strangers. Is he comfortable. Is he eating. Who’s there. Lisa was on her way. Chris was coming Wednesday. I said we’d be down Friday, that Mom was here and needed a day. Donna said okay. She did not say it the way you say okay when you agree. She said it the way you say it when you’ve decided not to fight a man about his own father.</w:t>
+        <w:t xml:space="preserve">I asked him the questions I ask strangers. Is he comfortable. Is he eating. Who’s there. Donna hadn’t left the room. Lisa was on her way. I said we’d be down Friday, that Mom was here and needed a day. Chris said okay. He did not say it the way you say okay when you agree. He said it the way you say it when you’ve decided not to fight a man about his own father.</w:t>
       </w:r>
     </w:p>
     <w:p>
@@ -15077,7 +15077,7 @@
         <w:rPr>
           <w:highlight w:val="yellow"/>
         </w:rPr>
-        <w:t xml:space="preserve">I asked if it was peaceful. I don’t know why that was my first question. It’s the question families ask me. He said yes. He said Dad had not woken up since the night before. I said okay. I said I’d call him back. Then I called Donna, before anyone else. Neither of us said much. She said he hadn’t been alone. I said thank you, which was not enough, and she knew it and let it be.</w:t>
+        <w:t xml:space="preserve">I asked if it was peaceful. I don’t know why that was my first question. It’s the question families ask me. He said yes. He said Dad had not woken up since the night before. I said okay. I said I’d call him back.</w:t>
       </w:r>
     </w:p>
     <w:p>

</xml_diff>

<commit_message>
Lisa's line moved out of the closet: Rob and Lisa never went through Lou's things together
Co-Authored-By: Claude Fable 5.1 <noreply@anthropic.com>
Claude-Session: https://claude.ai/code/session_013TTacQAr67Pe2VUwTPop1A
</commit_message>
<xml_diff>
--- a/The_Cardinals_Promise.docx
+++ b/The_Cardinals_Promise.docx
@@ -15460,16 +15460,10 @@
         <w:pStyle w:val="BodyText"/>
       </w:pPr>
       <w:r>
-        <w:t xml:space="preserve">In January we went through his things.</w:t>
-      </w:r>
-      <w:r>
-        <w:t xml:space="preserve"> </w:t>
-      </w:r>
-      <w:r>
-        <w:rPr>
-          <w:highlight w:val="yellow"/>
-        </w:rPr>
-        <w:t xml:space="preserve">Lisa and I did the closet. Somewhere in the second box of shoes she said, without looking up,</w:t>
+        <w:rPr>
+          <w:highlight w:val="yellow"/>
+        </w:rPr>
+        <w:t xml:space="preserve">Lisa called me that January, no reason, the way she does. Somewhere in it she said,</w:t>
       </w:r>
       <w:r>
         <w:rPr>
@@ -15541,13 +15535,15 @@
         <w:rPr>
           <w:highlight w:val="yellow"/>
         </w:rPr>
-        <w:t xml:space="preserve">She said it plain, no edge on it, the way you say a thing you’ve had thirty years to get used to. Then she handed me a shoe box and we kept going, and I’ve thought about that sentence more than anything anybody said at the funeral.</w:t>
-      </w:r>
-      <w:r>
-        <w:t xml:space="preserve"> </w:t>
-      </w:r>
-      <w:r>
-        <w:t xml:space="preserve">His gray suit was hanging on the right side of the closet, between two work shirts. Always be the best-dressed person in the room. I pulled it off the rack and held it up, and I couldn’t put it back. I took it home in a garment bag with no plan. It hangs in my closet now, next to mine. It isn’t my size and it isn’t my style and I will never wear it. But some mornings I open the closet door and it’s there, and I know what it is, and I know who wore it, and I leave it alone. I tell families sometimes, when they’re clearing out a closet of their own: keep one thing. You’ll know which one. It will tell you.</w:t>
+        <w:t xml:space="preserve">She said it plain, no edge on it, the way you say a thing you’ve had thirty years to get used to, and I’ve thought about that sentence more than anything anybody said at the funeral.</w:t>
+      </w:r>
+    </w:p>
+    <w:p>
+      <w:pPr>
+        <w:pStyle w:val="BodyText"/>
+      </w:pPr>
+      <w:r>
+        <w:t xml:space="preserve">In January we went through his things. His gray suit was hanging on the right side of the closet, between two work shirts. Always be the best-dressed person in the room. I pulled it off the rack and held it up, and I couldn’t put it back. I took it home in a garment bag with no plan. It hangs in my closet now, next to mine. It isn’t my size and it isn’t my style and I will never wear it. But some mornings I open the closet door and it’s there, and I know what it is, and I know who wore it, and I leave it alone. I tell families sometimes, when they’re clearing out a closet of their own: keep one thing. You’ll know which one. It will tell you.</w:t>
       </w:r>
     </w:p>
     <w:bookmarkEnd w:id="56"/>

</xml_diff>

<commit_message>
Print text: highlights and placeholder markers removed after the author confirmed the reconstructed scenes
Co-Authored-By: Claude Fable 5.1 <noreply@anthropic.com>
Claude-Session: https://claude.ai/code/session_013TTacQAr67Pe2VUwTPop1A
</commit_message>
<xml_diff>
--- a/The_Cardinals_Promise.docx
+++ b/The_Cardinals_Promise.docx
@@ -2954,22 +2954,6 @@
         <w:pStyle w:val="BodyText"/>
       </w:pPr>
       <w:r>
-        <w:rPr>
-          <w:iCs/>
-          <w:i/>
-          <w:highlight w:val="yellow"/>
-        </w:rPr>
-        <w:t xml:space="preserve">[PLACEHOLDER. One evening of the temper, reconstructed. Rob replaces it with the night he remembers.]</w:t>
-      </w:r>
-    </w:p>
-    <w:p>
-      <w:pPr>
-        <w:pStyle w:val="BodyText"/>
-      </w:pPr>
-      <w:r>
-        <w:rPr>
-          <w:highlight w:val="yellow"/>
-        </w:rPr>
         <w:t xml:space="preserve">The night I remember, the Yankees were on and we were told to keep it down. Chris and I got into something upstairs, the kind of fight two boys have over nothing, and it got loud, and it got loud right when the game got close. I heard the recliner. I heard him on the stairs. By the time the door opened I was already where I went, knees up on the far side of the bed, small, the hallway light coming in around him.</w:t>
       </w:r>
     </w:p>
@@ -2978,69 +2962,36 @@
         <w:pStyle w:val="BodyText"/>
       </w:pPr>
       <w:r>
-        <w:rPr>
-          <w:highlight w:val="yellow"/>
-        </w:rPr>
-        <w:t xml:space="preserve">“</w:t>
-      </w:r>
-      <w:r>
-        <w:rPr>
-          <w:highlight w:val="yellow"/>
-        </w:rPr>
+        <w:t xml:space="preserve">“</w:t>
+      </w:r>
+      <w:r>
         <w:t xml:space="preserve">Whatsa matter with the two of yous? I got a game on and I gotta hear you through the ceiling.</w:t>
       </w:r>
       <w:r>
-        <w:rPr>
-          <w:highlight w:val="yellow"/>
-        </w:rPr>
-        <w:t xml:space="preserve">”</w:t>
-      </w:r>
-      <w:r>
-        <w:rPr>
-          <w:highlight w:val="yellow"/>
-        </w:rPr>
-        <w:t xml:space="preserve"> </w:t>
-      </w:r>
-      <w:r>
-        <w:rPr>
-          <w:highlight w:val="yellow"/>
-        </w:rPr>
+        <w:t xml:space="preserve">”</w:t>
+      </w:r>
+      <w:r>
+        <w:t xml:space="preserve"> </w:t>
+      </w:r>
+      <w:r>
         <w:t xml:space="preserve">Then louder, at me, because I was the older one.</w:t>
       </w:r>
       <w:r>
-        <w:rPr>
-          <w:highlight w:val="yellow"/>
-        </w:rPr>
-        <w:t xml:space="preserve"> </w:t>
-      </w:r>
-      <w:r>
-        <w:rPr>
-          <w:highlight w:val="yellow"/>
-        </w:rPr>
-        <w:t xml:space="preserve">“</w:t>
-      </w:r>
-      <w:r>
-        <w:rPr>
-          <w:highlight w:val="yellow"/>
-        </w:rPr>
+        <w:t xml:space="preserve"> </w:t>
+      </w:r>
+      <w:r>
+        <w:t xml:space="preserve">“</w:t>
+      </w:r>
+      <w:r>
         <w:t xml:space="preserve">Every night. Every night with this.</w:t>
       </w:r>
       <w:r>
-        <w:rPr>
-          <w:highlight w:val="yellow"/>
-        </w:rPr>
-        <w:t xml:space="preserve">”</w:t>
-      </w:r>
-      <w:r>
-        <w:rPr>
-          <w:highlight w:val="yellow"/>
-        </w:rPr>
-        <w:t xml:space="preserve"> </w:t>
-      </w:r>
-      <w:r>
-        <w:rPr>
-          <w:highlight w:val="yellow"/>
-        </w:rPr>
+        <w:t xml:space="preserve">”</w:t>
+      </w:r>
+      <w:r>
+        <w:t xml:space="preserve"> </w:t>
+      </w:r>
+      <w:r>
         <w:t xml:space="preserve">He wasn’t done, and none of the rest of it was anything I’d repeat, and none of it was anything I hadn’t heard a grown man say before. That was the part that scared me, not the words, that I knew the shape of it from another house.</w:t>
       </w:r>
     </w:p>
@@ -3049,9 +3000,6 @@
         <w:pStyle w:val="BodyText"/>
       </w:pPr>
       <w:r>
-        <w:rPr>
-          <w:highlight w:val="yellow"/>
-        </w:rPr>
         <w:t xml:space="preserve">My mother said his name from the hall, once, and he didn’t answer her. He shut the door harder than he meant to. Chris didn’t say anything, and I didn’t, and downstairs the game came back up.</w:t>
       </w:r>
     </w:p>
@@ -3060,23 +3008,7 @@
         <w:pStyle w:val="BodyText"/>
       </w:pPr>
       <w:r>
-        <w:rPr>
-          <w:highlight w:val="yellow"/>
-        </w:rPr>
         <w:t xml:space="preserve">In the morning he was at the counter in a pressed shirt making our lunches. He didn’t say anything about it, and neither did I. He drove us to school. I left the lunch in the bag that day and threw it out behind the gym, which is the only way I had of saying anything back. He never knew.</w:t>
-      </w:r>
-    </w:p>
-    <w:p>
-      <w:pPr>
-        <w:pStyle w:val="BodyText"/>
-      </w:pPr>
-      <w:r>
-        <w:rPr>
-          <w:iCs/>
-          <w:i/>
-          <w:highlight w:val="yellow"/>
-        </w:rPr>
-        <w:t xml:space="preserve">[END PLACEHOLDER.]</w:t>
       </w:r>
     </w:p>
     <w:p>
@@ -3176,22 +3108,6 @@
         <w:pStyle w:val="BodyText"/>
       </w:pPr>
       <w:r>
-        <w:rPr>
-          <w:iCs/>
-          <w:i/>
-          <w:highlight w:val="yellow"/>
-        </w:rPr>
-        <w:t xml:space="preserve">[PLACEHOLDER. The first Saturday, reconstructed. Rob replaces it with the one he remembers.]</w:t>
-      </w:r>
-    </w:p>
-    <w:p>
-      <w:pPr>
-        <w:pStyle w:val="BodyText"/>
-      </w:pPr>
-      <w:r>
-        <w:rPr>
-          <w:highlight w:val="yellow"/>
-        </w:rPr>
         <w:t xml:space="preserve">He came by on a Saturday morning before he lived with us, in the tan car, and there was a white plastic bucket on the passenger seat with a lid on it. I thought it was paint. It was baseballs, most of them scuffed gray, a few with the stitching gone soft, and a glove that was too big for me that he’d gotten from somebody at work.</w:t>
       </w:r>
     </w:p>
@@ -3200,45 +3116,24 @@
         <w:pStyle w:val="BodyText"/>
       </w:pPr>
       <w:r>
-        <w:rPr>
-          <w:highlight w:val="yellow"/>
-        </w:rPr>
         <w:t xml:space="preserve">We went to the field behind the school. He didn’t explain anything. He walked out to the middle of the grass with the bucket and a bat and said,</w:t>
       </w:r>
       <w:r>
-        <w:rPr>
-          <w:highlight w:val="yellow"/>
-        </w:rPr>
-        <w:t xml:space="preserve"> </w:t>
-      </w:r>
-      <w:r>
-        <w:rPr>
-          <w:highlight w:val="yellow"/>
-        </w:rPr>
-        <w:t xml:space="preserve">“</w:t>
-      </w:r>
-      <w:r>
-        <w:rPr>
-          <w:highlight w:val="yellow"/>
-        </w:rPr>
+        <w:t xml:space="preserve"> </w:t>
+      </w:r>
+      <w:r>
+        <w:t xml:space="preserve">“</w:t>
+      </w:r>
+      <w:r>
         <w:t xml:space="preserve">Go stand out there,</w:t>
       </w:r>
       <w:r>
-        <w:rPr>
-          <w:highlight w:val="yellow"/>
-        </w:rPr>
-        <w:t xml:space="preserve">”</w:t>
-      </w:r>
-      <w:r>
-        <w:rPr>
-          <w:highlight w:val="yellow"/>
-        </w:rPr>
-        <w:t xml:space="preserve"> </w:t>
-      </w:r>
-      <w:r>
-        <w:rPr>
-          <w:highlight w:val="yellow"/>
-        </w:rPr>
+        <w:t xml:space="preserve">”</w:t>
+      </w:r>
+      <w:r>
+        <w:t xml:space="preserve"> </w:t>
+      </w:r>
+      <w:r>
         <w:t xml:space="preserve">and pointed, and I went and stood out there. Then he hit me a ball. It went over my head. He hit me another one. I got my glove on it and it fell out. He didn’t say anything about that either. He reached into the bucket and hit me another one.</w:t>
       </w:r>
     </w:p>
@@ -3247,45 +3142,24 @@
         <w:pStyle w:val="BodyText"/>
       </w:pPr>
       <w:r>
-        <w:rPr>
-          <w:highlight w:val="yellow"/>
-        </w:rPr>
         <w:t xml:space="preserve">I don’t know how many. The bucket got empty and he walked out with me to pick them all up, and we filled it, and he walked back and did it again. Somewhere in the second bucket I caught one and held it, and I looked up, and he was already reaching for the next ball. He hit balls until the sun got on top of us, and then he said,</w:t>
       </w:r>
       <w:r>
-        <w:rPr>
-          <w:highlight w:val="yellow"/>
-        </w:rPr>
-        <w:t xml:space="preserve"> </w:t>
-      </w:r>
-      <w:r>
-        <w:rPr>
-          <w:highlight w:val="yellow"/>
-        </w:rPr>
-        <w:t xml:space="preserve">“</w:t>
-      </w:r>
-      <w:r>
-        <w:rPr>
-          <w:highlight w:val="yellow"/>
-        </w:rPr>
+        <w:t xml:space="preserve"> </w:t>
+      </w:r>
+      <w:r>
+        <w:t xml:space="preserve">“</w:t>
+      </w:r>
+      <w:r>
         <w:t xml:space="preserve">That’s enough for today,</w:t>
       </w:r>
       <w:r>
-        <w:rPr>
-          <w:highlight w:val="yellow"/>
-        </w:rPr>
-        <w:t xml:space="preserve">”</w:t>
-      </w:r>
-      <w:r>
-        <w:rPr>
-          <w:highlight w:val="yellow"/>
-        </w:rPr>
-        <w:t xml:space="preserve"> </w:t>
-      </w:r>
-      <w:r>
-        <w:rPr>
-          <w:highlight w:val="yellow"/>
-        </w:rPr>
+        <w:t xml:space="preserve">”</w:t>
+      </w:r>
+      <w:r>
+        <w:t xml:space="preserve"> </w:t>
+      </w:r>
+      <w:r>
         <w:t xml:space="preserve">which meant there would be another day.</w:t>
       </w:r>
     </w:p>
@@ -3294,23 +3168,7 @@
         <w:pStyle w:val="BodyText"/>
       </w:pPr>
       <w:r>
-        <w:rPr>
-          <w:highlight w:val="yellow"/>
-        </w:rPr>
         <w:t xml:space="preserve">My mother had lunch on the table when we got back. He didn’t stay for it. He set the bucket down inside our door like it lived there now, and I understood, without anyone saying it, that it did.</w:t>
-      </w:r>
-    </w:p>
-    <w:p>
-      <w:pPr>
-        <w:pStyle w:val="BodyText"/>
-      </w:pPr>
-      <w:r>
-        <w:rPr>
-          <w:iCs/>
-          <w:i/>
-          <w:highlight w:val="yellow"/>
-        </w:rPr>
-        <w:t xml:space="preserve">[END PLACEHOLDER.]</w:t>
       </w:r>
     </w:p>
     <w:p>
@@ -7348,22 +7206,6 @@
         <w:pStyle w:val="BodyText"/>
       </w:pPr>
       <w:r>
-        <w:rPr>
-          <w:iCs/>
-          <w:i/>
-          <w:highlight w:val="yellow"/>
-        </w:rPr>
-        <w:t xml:space="preserve">[PLACEHOLDER. One of the calls, reconstructed. Rob replaces it with a call he remembers.]</w:t>
-      </w:r>
-    </w:p>
-    <w:p>
-      <w:pPr>
-        <w:pStyle w:val="BodyText"/>
-      </w:pPr>
-      <w:r>
-        <w:rPr>
-          <w:highlight w:val="yellow"/>
-        </w:rPr>
         <w:t xml:space="preserve">It was a Tuesday, because Tuesday was when the pharmacy would fill it, and I called her from the balcony so she’d hear traffic and think I was out.</w:t>
       </w:r>
     </w:p>
@@ -7372,33 +7214,18 @@
         <w:pStyle w:val="BodyText"/>
       </w:pPr>
       <w:r>
-        <w:rPr>
-          <w:highlight w:val="yellow"/>
-        </w:rPr>
-        <w:t xml:space="preserve">“</w:t>
-      </w:r>
-      <w:r>
-        <w:rPr>
-          <w:highlight w:val="yellow"/>
-        </w:rPr>
+        <w:t xml:space="preserve">“</w:t>
+      </w:r>
+      <w:r>
         <w:t xml:space="preserve">Ma. Hey. Listen, rent’s due Friday and they moved the commission checks to the fifteenth.</w:t>
       </w:r>
       <w:r>
-        <w:rPr>
-          <w:highlight w:val="yellow"/>
-        </w:rPr>
-        <w:t xml:space="preserve">”</w:t>
-      </w:r>
-      <w:r>
-        <w:rPr>
-          <w:highlight w:val="yellow"/>
-        </w:rPr>
-        <w:t xml:space="preserve"> </w:t>
-      </w:r>
-      <w:r>
-        <w:rPr>
-          <w:highlight w:val="yellow"/>
-        </w:rPr>
+        <w:t xml:space="preserve">”</w:t>
+      </w:r>
+      <w:r>
+        <w:t xml:space="preserve"> </w:t>
+      </w:r>
+      <w:r>
         <w:t xml:space="preserve">I had rehearsed the sentence. I had the number ready, four hundred, which was rent minus what I’d already spent of it.</w:t>
       </w:r>
     </w:p>
@@ -7407,56 +7234,32 @@
         <w:pStyle w:val="BodyText"/>
       </w:pPr>
       <w:r>
-        <w:rPr>
-          <w:highlight w:val="yellow"/>
-        </w:rPr>
-        <w:t xml:space="preserve">“</w:t>
-      </w:r>
-      <w:r>
-        <w:rPr>
-          <w:highlight w:val="yellow"/>
-        </w:rPr>
+        <w:t xml:space="preserve">“</w:t>
+      </w:r>
+      <w:r>
         <w:t xml:space="preserve">Are you eating?</w:t>
       </w:r>
       <w:r>
-        <w:rPr>
-          <w:highlight w:val="yellow"/>
-        </w:rPr>
-        <w:t xml:space="preserve">”</w:t>
-      </w:r>
-    </w:p>
-    <w:p>
-      <w:pPr>
-        <w:pStyle w:val="BodyText"/>
-      </w:pPr>
-      <w:r>
-        <w:rPr>
-          <w:highlight w:val="yellow"/>
-        </w:rPr>
-        <w:t xml:space="preserve">“</w:t>
-      </w:r>
-      <w:r>
-        <w:rPr>
-          <w:highlight w:val="yellow"/>
-        </w:rPr>
+        <w:t xml:space="preserve">”</w:t>
+      </w:r>
+    </w:p>
+    <w:p>
+      <w:pPr>
+        <w:pStyle w:val="BodyText"/>
+      </w:pPr>
+      <w:r>
+        <w:t xml:space="preserve">“</w:t>
+      </w:r>
+      <w:r>
         <w:t xml:space="preserve">I’m eating.</w:t>
       </w:r>
       <w:r>
-        <w:rPr>
-          <w:highlight w:val="yellow"/>
-        </w:rPr>
-        <w:t xml:space="preserve">”</w:t>
-      </w:r>
-      <w:r>
-        <w:rPr>
-          <w:highlight w:val="yellow"/>
-        </w:rPr>
-        <w:t xml:space="preserve"> </w:t>
-      </w:r>
-      <w:r>
-        <w:rPr>
-          <w:highlight w:val="yellow"/>
-        </w:rPr>
+        <w:t xml:space="preserve">”</w:t>
+      </w:r>
+      <w:r>
+        <w:t xml:space="preserve"> </w:t>
+      </w:r>
+      <w:r>
         <w:t xml:space="preserve">I was not eating. There were two yogurts in the refrigerator and I don’t know how old they were.</w:t>
       </w:r>
     </w:p>
@@ -7465,56 +7268,32 @@
         <w:pStyle w:val="BodyText"/>
       </w:pPr>
       <w:r>
-        <w:rPr>
-          <w:highlight w:val="yellow"/>
-        </w:rPr>
-        <w:t xml:space="preserve">“</w:t>
-      </w:r>
-      <w:r>
-        <w:rPr>
-          <w:highlight w:val="yellow"/>
-        </w:rPr>
+        <w:t xml:space="preserve">“</w:t>
+      </w:r>
+      <w:r>
         <w:t xml:space="preserve">Are you taking your medicine right? Like the doctor said?</w:t>
       </w:r>
       <w:r>
-        <w:rPr>
-          <w:highlight w:val="yellow"/>
-        </w:rPr>
-        <w:t xml:space="preserve">”</w:t>
-      </w:r>
-    </w:p>
-    <w:p>
-      <w:pPr>
-        <w:pStyle w:val="BodyText"/>
-      </w:pPr>
-      <w:r>
-        <w:rPr>
-          <w:highlight w:val="yellow"/>
-        </w:rPr>
-        <w:t xml:space="preserve">“</w:t>
-      </w:r>
-      <w:r>
-        <w:rPr>
-          <w:highlight w:val="yellow"/>
-        </w:rPr>
+        <w:t xml:space="preserve">”</w:t>
+      </w:r>
+    </w:p>
+    <w:p>
+      <w:pPr>
+        <w:pStyle w:val="BodyText"/>
+      </w:pPr>
+      <w:r>
+        <w:t xml:space="preserve">“</w:t>
+      </w:r>
+      <w:r>
         <w:t xml:space="preserve">Like the doctor said.</w:t>
       </w:r>
       <w:r>
-        <w:rPr>
-          <w:highlight w:val="yellow"/>
-        </w:rPr>
-        <w:t xml:space="preserve">”</w:t>
-      </w:r>
-      <w:r>
-        <w:rPr>
-          <w:highlight w:val="yellow"/>
-        </w:rPr>
-        <w:t xml:space="preserve"> </w:t>
-      </w:r>
-      <w:r>
-        <w:rPr>
-          <w:highlight w:val="yellow"/>
-        </w:rPr>
+        <w:t xml:space="preserve">”</w:t>
+      </w:r>
+      <w:r>
+        <w:t xml:space="preserve"> </w:t>
+      </w:r>
+      <w:r>
         <w:t xml:space="preserve">That one I said fast. It was the only question I could not stand to hear her ask, and she asked it every time, in the same voice, and every time I answered it the same way, and she wired the money. She said she’d go to Western Union at lunch. She said she loved me. I said it back, and I meant it, which is the part I have never been able to explain to anyone who hasn’t done this. I meant it while I was lying to her. I meant it while I was already putting my shoes on.</w:t>
       </w:r>
     </w:p>
@@ -7523,23 +7302,7 @@
         <w:pStyle w:val="BodyText"/>
       </w:pPr>
       <w:r>
-        <w:rPr>
-          <w:highlight w:val="yellow"/>
-        </w:rPr>
         <w:t xml:space="preserve">The wire landed at 1:40. By 2:15 I had the bottle. By dark the rest of the four hundred was gone, and I was in a place with no windows telling a girl whose name I never got that my father was a big deal in New Jersey.</w:t>
-      </w:r>
-    </w:p>
-    <w:p>
-      <w:pPr>
-        <w:pStyle w:val="BodyText"/>
-      </w:pPr>
-      <w:r>
-        <w:rPr>
-          <w:iCs/>
-          <w:i/>
-          <w:highlight w:val="yellow"/>
-        </w:rPr>
-        <w:t xml:space="preserve">[END PLACEHOLDER.]</w:t>
       </w:r>
     </w:p>
     <w:p>
@@ -10995,22 +10758,6 @@
         <w:pStyle w:val="BodyText"/>
       </w:pPr>
       <w:r>
-        <w:rPr>
-          <w:iCs/>
-          <w:i/>
-          <w:highlight w:val="yellow"/>
-        </w:rPr>
-        <w:t xml:space="preserve">[PLACEHOLDER. The hour itself, reconstructed. Rob replaces it with what he saw.]</w:t>
-      </w:r>
-    </w:p>
-    <w:p>
-      <w:pPr>
-        <w:pStyle w:val="BodyText"/>
-      </w:pPr>
-      <w:r>
-        <w:rPr>
-          <w:highlight w:val="yellow"/>
-        </w:rPr>
         <w:t xml:space="preserve">It was a Sunday afternoon and the room had thinned out to four of us. His breathing had changed that morning, the nurse said, and once she said it I could hear it. Long pulls, and then a space, and then another pull. The spaces got longer. Every time one came, the four of us stopped breathing too, and every time he started again, somebody let out a little laugh, the kind you’re ashamed of. His wife sat on the bed with her hand under his. Nobody talked. The Old Spice was still there. I had my hands folded in my lap like I was in church, and I remember noticing that and not knowing what else to do with them.</w:t>
       </w:r>
     </w:p>
@@ -11019,59 +10766,25 @@
         <w:pStyle w:val="BodyText"/>
       </w:pPr>
       <w:r>
-        <w:rPr>
-          <w:highlight w:val="yellow"/>
-        </w:rPr>
         <w:t xml:space="preserve">At some point the space didn’t end. His wife knew before the nurse did. She said his name, not loud, and then she said,</w:t>
       </w:r>
       <w:r>
-        <w:rPr>
-          <w:highlight w:val="yellow"/>
-        </w:rPr>
-        <w:t xml:space="preserve"> </w:t>
-      </w:r>
-      <w:r>
-        <w:rPr>
-          <w:highlight w:val="yellow"/>
-        </w:rPr>
-        <w:t xml:space="preserve">“</w:t>
-      </w:r>
-      <w:r>
-        <w:rPr>
-          <w:highlight w:val="yellow"/>
-        </w:rPr>
+        <w:t xml:space="preserve"> </w:t>
+      </w:r>
+      <w:r>
+        <w:t xml:space="preserve">“</w:t>
+      </w:r>
+      <w:r>
         <w:t xml:space="preserve">Okay,</w:t>
       </w:r>
       <w:r>
-        <w:rPr>
-          <w:highlight w:val="yellow"/>
-        </w:rPr>
-        <w:t xml:space="preserve">”</w:t>
-      </w:r>
-      <w:r>
-        <w:rPr>
-          <w:highlight w:val="yellow"/>
-        </w:rPr>
-        <w:t xml:space="preserve"> </w:t>
-      </w:r>
-      <w:r>
-        <w:rPr>
-          <w:highlight w:val="yellow"/>
-        </w:rPr>
+        <w:t xml:space="preserve">”</w:t>
+      </w:r>
+      <w:r>
+        <w:t xml:space="preserve"> </w:t>
+      </w:r>
+      <w:r>
         <w:t xml:space="preserve">and that was all. I looked at the clock because I’d seen people do that on television. Four twenty. Then I went and stood in the kitchen until she called me back in.</w:t>
-      </w:r>
-    </w:p>
-    <w:p>
-      <w:pPr>
-        <w:pStyle w:val="BodyText"/>
-      </w:pPr>
-      <w:r>
-        <w:rPr>
-          <w:iCs/>
-          <w:i/>
-          <w:highlight w:val="yellow"/>
-        </w:rPr>
-        <w:t xml:space="preserve">[END PLACEHOLDER.]</w:t>
       </w:r>
     </w:p>
     <w:p>
@@ -12568,22 +12281,6 @@
         <w:pStyle w:val="BodyText"/>
       </w:pPr>
       <w:r>
-        <w:rPr>
-          <w:iCs/>
-          <w:i/>
-          <w:highlight w:val="yellow"/>
-        </w:rPr>
-        <w:t xml:space="preserve">[PLACEHOLDER. The evening she came to me, reconstructed.]</w:t>
-      </w:r>
-    </w:p>
-    <w:p>
-      <w:pPr>
-        <w:pStyle w:val="BodyText"/>
-      </w:pPr>
-      <w:r>
-        <w:rPr>
-          <w:highlight w:val="yellow"/>
-        </w:rPr>
         <w:t xml:space="preserve">It was nine days. I know because I counted them. On the ninth night she came into the room where I was pretending to read and sat on the end of the bed with her planner, the paper one she still keeps, open to a page with two columns on it. My handwriting was in neither of them. She had done the math on both houses by herself, because I’d made her feel like she had to.</w:t>
       </w:r>
     </w:p>
@@ -12592,68 +12289,38 @@
         <w:pStyle w:val="BodyText"/>
       </w:pPr>
       <w:r>
-        <w:rPr>
-          <w:highlight w:val="yellow"/>
-        </w:rPr>
-        <w:t xml:space="preserve">“</w:t>
-      </w:r>
-      <w:r>
-        <w:rPr>
-          <w:highlight w:val="yellow"/>
-        </w:rPr>
+        <w:t xml:space="preserve">“</w:t>
+      </w:r>
+      <w:r>
         <w:t xml:space="preserve">I’m not mad about the money,</w:t>
       </w:r>
       <w:r>
-        <w:rPr>
-          <w:highlight w:val="yellow"/>
-        </w:rPr>
-        <w:t xml:space="preserve">”</w:t>
-      </w:r>
-      <w:r>
-        <w:rPr>
-          <w:highlight w:val="yellow"/>
-        </w:rPr>
-        <w:t xml:space="preserve"> </w:t>
-      </w:r>
-      <w:r>
-        <w:rPr>
-          <w:highlight w:val="yellow"/>
-        </w:rPr>
+        <w:t xml:space="preserve">”</w:t>
+      </w:r>
+      <w:r>
+        <w:t xml:space="preserve"> </w:t>
+      </w:r>
+      <w:r>
         <w:t xml:space="preserve">she said.</w:t>
       </w:r>
       <w:r>
-        <w:rPr>
-          <w:highlight w:val="yellow"/>
-        </w:rPr>
-        <w:t xml:space="preserve"> </w:t>
-      </w:r>
-      <w:r>
-        <w:rPr>
-          <w:highlight w:val="yellow"/>
-        </w:rPr>
-        <w:t xml:space="preserve">“</w:t>
-      </w:r>
-      <w:r>
-        <w:rPr>
-          <w:highlight w:val="yellow"/>
-        </w:rPr>
+        <w:t xml:space="preserve"> </w:t>
+      </w:r>
+      <w:r>
+        <w:t xml:space="preserve">“</w:t>
+      </w:r>
+      <w:r>
         <w:t xml:space="preserve">I can fix money. I’m mad that I found out from the bank.</w:t>
       </w:r>
       <w:r>
-        <w:rPr>
-          <w:highlight w:val="yellow"/>
-        </w:rPr>
-        <w:t xml:space="preserve">”</w:t>
-      </w:r>
-    </w:p>
-    <w:p>
-      <w:pPr>
-        <w:pStyle w:val="BodyText"/>
-      </w:pPr>
-      <w:r>
-        <w:rPr>
-          <w:highlight w:val="yellow"/>
-        </w:rPr>
+        <w:t xml:space="preserve">”</w:t>
+      </w:r>
+    </w:p>
+    <w:p>
+      <w:pPr>
+        <w:pStyle w:val="BodyText"/>
+      </w:pPr>
+      <w:r>
         <w:t xml:space="preserve">I started to explain, and she put her hand down on the page.</w:t>
       </w:r>
     </w:p>
@@ -12662,71 +12329,31 @@
         <w:pStyle w:val="BodyText"/>
       </w:pPr>
       <w:r>
-        <w:rPr>
-          <w:highlight w:val="yellow"/>
-        </w:rPr>
-        <w:t xml:space="preserve">“</w:t>
-      </w:r>
-      <w:r>
-        <w:rPr>
-          <w:highlight w:val="yellow"/>
-        </w:rPr>
+        <w:t xml:space="preserve">“</w:t>
+      </w:r>
+      <w:r>
         <w:t xml:space="preserve">No more impulse decisions,</w:t>
       </w:r>
       <w:r>
-        <w:rPr>
-          <w:highlight w:val="yellow"/>
-        </w:rPr>
-        <w:t xml:space="preserve">”</w:t>
-      </w:r>
-      <w:r>
-        <w:rPr>
-          <w:highlight w:val="yellow"/>
-        </w:rPr>
-        <w:t xml:space="preserve"> </w:t>
-      </w:r>
-      <w:r>
-        <w:rPr>
-          <w:highlight w:val="yellow"/>
-        </w:rPr>
+        <w:t xml:space="preserve">”</w:t>
+      </w:r>
+      <w:r>
+        <w:t xml:space="preserve"> </w:t>
+      </w:r>
+      <w:r>
         <w:t xml:space="preserve">she said.</w:t>
       </w:r>
       <w:r>
-        <w:rPr>
-          <w:highlight w:val="yellow"/>
-        </w:rPr>
-        <w:t xml:space="preserve"> </w:t>
-      </w:r>
-      <w:r>
-        <w:rPr>
-          <w:highlight w:val="yellow"/>
-        </w:rPr>
-        <w:t xml:space="preserve">“</w:t>
-      </w:r>
-      <w:r>
-        <w:rPr>
-          <w:highlight w:val="yellow"/>
-        </w:rPr>
+        <w:t xml:space="preserve"> </w:t>
+      </w:r>
+      <w:r>
+        <w:t xml:space="preserve">“</w:t>
+      </w:r>
+      <w:r>
         <w:t xml:space="preserve">That’s it. That’s the whole thing I need.</w:t>
       </w:r>
       <w:r>
-        <w:rPr>
-          <w:highlight w:val="yellow"/>
-        </w:rPr>
-        <w:t xml:space="preserve">”</w:t>
-      </w:r>
-    </w:p>
-    <w:p>
-      <w:pPr>
-        <w:pStyle w:val="BodyText"/>
-      </w:pPr>
-      <w:r>
-        <w:rPr>
-          <w:iCs/>
-          <w:i/>
-          <w:highlight w:val="yellow"/>
-        </w:rPr>
-        <w:t xml:space="preserve">[END PLACEHOLDER.]</w:t>
+        <w:t xml:space="preserve">”</w:t>
       </w:r>
     </w:p>
     <w:p>
@@ -13528,22 +13155,6 @@
         <w:pStyle w:val="BodyText"/>
       </w:pPr>
       <w:r>
-        <w:rPr>
-          <w:iCs/>
-          <w:i/>
-          <w:highlight w:val="yellow"/>
-        </w:rPr>
-        <w:t xml:space="preserve">[PLACEHOLDER. One ordinary evening, reconstructed. Rob replaces it with one he remembers.]</w:t>
-      </w:r>
-    </w:p>
-    <w:p>
-      <w:pPr>
-        <w:pStyle w:val="BodyText"/>
-      </w:pPr>
-      <w:r>
-        <w:rPr>
-          <w:highlight w:val="yellow"/>
-        </w:rPr>
         <w:t xml:space="preserve">A Tuesday in 2019, Hope working late, me on his back porch in Pensacola with a plate Donna had handed me through the door without asking whether I’d eaten. The Yankees were on the television inside with the sound up, and he was outside with me, watching it through the screen, because he had decided that was where we were sitting.</w:t>
       </w:r>
     </w:p>
@@ -13552,33 +13163,18 @@
         <w:pStyle w:val="BodyText"/>
       </w:pPr>
       <w:r>
-        <w:rPr>
-          <w:highlight w:val="yellow"/>
-        </w:rPr>
-        <w:t xml:space="preserve">“</w:t>
-      </w:r>
-      <w:r>
-        <w:rPr>
-          <w:highlight w:val="yellow"/>
-        </w:rPr>
+        <w:t xml:space="preserve">“</w:t>
+      </w:r>
+      <w:r>
         <w:t xml:space="preserve">Who’s pitching?</w:t>
       </w:r>
       <w:r>
-        <w:rPr>
-          <w:highlight w:val="yellow"/>
-        </w:rPr>
-        <w:t xml:space="preserve">”</w:t>
-      </w:r>
-      <w:r>
-        <w:rPr>
-          <w:highlight w:val="yellow"/>
-        </w:rPr>
-        <w:t xml:space="preserve"> </w:t>
-      </w:r>
-      <w:r>
-        <w:rPr>
-          <w:highlight w:val="yellow"/>
-        </w:rPr>
+        <w:t xml:space="preserve">”</w:t>
+      </w:r>
+      <w:r>
+        <w:t xml:space="preserve"> </w:t>
+      </w:r>
+      <w:r>
         <w:t xml:space="preserve">I said.</w:t>
       </w:r>
     </w:p>
@@ -13587,33 +13183,18 @@
         <w:pStyle w:val="BodyText"/>
       </w:pPr>
       <w:r>
-        <w:rPr>
-          <w:highlight w:val="yellow"/>
-        </w:rPr>
-        <w:t xml:space="preserve">“</w:t>
-      </w:r>
-      <w:r>
-        <w:rPr>
-          <w:highlight w:val="yellow"/>
-        </w:rPr>
+        <w:t xml:space="preserve">“</w:t>
+      </w:r>
+      <w:r>
         <w:t xml:space="preserve">Who’s pitching. You don’t know who’s pitching.</w:t>
       </w:r>
       <w:r>
-        <w:rPr>
-          <w:highlight w:val="yellow"/>
-        </w:rPr>
-        <w:t xml:space="preserve">”</w:t>
-      </w:r>
-      <w:r>
-        <w:rPr>
-          <w:highlight w:val="yellow"/>
-        </w:rPr>
-        <w:t xml:space="preserve"> </w:t>
-      </w:r>
-      <w:r>
-        <w:rPr>
-          <w:highlight w:val="yellow"/>
-        </w:rPr>
+        <w:t xml:space="preserve">”</w:t>
+      </w:r>
+      <w:r>
+        <w:t xml:space="preserve"> </w:t>
+      </w:r>
+      <w:r>
         <w:t xml:space="preserve">He told me who was pitching. He told me the man’s ERA and where he went to high school and what his father did for a living, and none of it was in the newspaper, and I have never known where he got it.</w:t>
       </w:r>
     </w:p>
@@ -13622,45 +13203,24 @@
         <w:pStyle w:val="BodyText"/>
       </w:pPr>
       <w:r>
-        <w:rPr>
-          <w:highlight w:val="yellow"/>
-        </w:rPr>
         <w:t xml:space="preserve">He asked about work. He wanted all of it. He wanted the names. Who was the manager, what was she like, was I listening to her. He’d tell me what to do about a problem I hadn’t told him I had. Then somebody hit one, and he said,</w:t>
       </w:r>
       <w:r>
-        <w:rPr>
-          <w:highlight w:val="yellow"/>
-        </w:rPr>
-        <w:t xml:space="preserve"> </w:t>
-      </w:r>
-      <w:r>
-        <w:rPr>
-          <w:highlight w:val="yellow"/>
-        </w:rPr>
-        <w:t xml:space="preserve">“</w:t>
-      </w:r>
-      <w:r>
-        <w:rPr>
-          <w:highlight w:val="yellow"/>
-        </w:rPr>
+        <w:t xml:space="preserve"> </w:t>
+      </w:r>
+      <w:r>
+        <w:t xml:space="preserve">“</w:t>
+      </w:r>
+      <w:r>
         <w:t xml:space="preserve">There it is,</w:t>
       </w:r>
       <w:r>
-        <w:rPr>
-          <w:highlight w:val="yellow"/>
-        </w:rPr>
-        <w:t xml:space="preserve">”</w:t>
-      </w:r>
-      <w:r>
-        <w:rPr>
-          <w:highlight w:val="yellow"/>
-        </w:rPr>
-        <w:t xml:space="preserve"> </w:t>
-      </w:r>
-      <w:r>
-        <w:rPr>
-          <w:highlight w:val="yellow"/>
-        </w:rPr>
+        <w:t xml:space="preserve">”</w:t>
+      </w:r>
+      <w:r>
+        <w:t xml:space="preserve"> </w:t>
+      </w:r>
+      <w:r>
         <w:t xml:space="preserve">and put his hand flat on the arm of the chair, which for him was standing up and cheering.</w:t>
       </w:r>
     </w:p>
@@ -13669,59 +13229,25 @@
         <w:pStyle w:val="BodyText"/>
       </w:pPr>
       <w:r>
-        <w:rPr>
-          <w:highlight w:val="yellow"/>
-        </w:rPr>
         <w:t xml:space="preserve">Nothing happened. Around nine he said,</w:t>
       </w:r>
       <w:r>
-        <w:rPr>
-          <w:highlight w:val="yellow"/>
-        </w:rPr>
-        <w:t xml:space="preserve"> </w:t>
-      </w:r>
-      <w:r>
-        <w:rPr>
-          <w:highlight w:val="yellow"/>
-        </w:rPr>
-        <w:t xml:space="preserve">“</w:t>
-      </w:r>
-      <w:r>
-        <w:rPr>
-          <w:highlight w:val="yellow"/>
-        </w:rPr>
+        <w:t xml:space="preserve"> </w:t>
+      </w:r>
+      <w:r>
+        <w:t xml:space="preserve">“</w:t>
+      </w:r>
+      <w:r>
         <w:t xml:space="preserve">Alright,</w:t>
       </w:r>
       <w:r>
-        <w:rPr>
-          <w:highlight w:val="yellow"/>
-        </w:rPr>
-        <w:t xml:space="preserve">”</w:t>
-      </w:r>
-      <w:r>
-        <w:rPr>
-          <w:highlight w:val="yellow"/>
-        </w:rPr>
-        <w:t xml:space="preserve"> </w:t>
-      </w:r>
-      <w:r>
-        <w:rPr>
-          <w:highlight w:val="yellow"/>
-        </w:rPr>
+        <w:t xml:space="preserve">”</w:t>
+      </w:r>
+      <w:r>
+        <w:t xml:space="preserve"> </w:t>
+      </w:r>
+      <w:r>
         <w:t xml:space="preserve">which meant the evening was over, and he walked me to the door, which he did every time, and stood in it while I backed out, which he did every time. I drove home. I can’t tell you a single thing that was said that mattered, and there were two hundred more like it.</w:t>
-      </w:r>
-    </w:p>
-    <w:p>
-      <w:pPr>
-        <w:pStyle w:val="BodyText"/>
-      </w:pPr>
-      <w:r>
-        <w:rPr>
-          <w:iCs/>
-          <w:i/>
-          <w:highlight w:val="yellow"/>
-        </w:rPr>
-        <w:t xml:space="preserve">[END PLACEHOLDER.]</w:t>
       </w:r>
     </w:p>
     <w:bookmarkEnd w:id="48"/>
@@ -14019,22 +13545,6 @@
         <w:pStyle w:val="BodyText"/>
       </w:pPr>
       <w:r>
-        <w:rPr>
-          <w:iCs/>
-          <w:i/>
-          <w:highlight w:val="yellow"/>
-        </w:rPr>
-        <w:t xml:space="preserve">[PLACEHOLDER. One afternoon of it, reconstructed.]</w:t>
-      </w:r>
-    </w:p>
-    <w:p>
-      <w:pPr>
-        <w:pStyle w:val="BodyText"/>
-      </w:pPr>
-      <w:r>
-        <w:rPr>
-          <w:highlight w:val="yellow"/>
-        </w:rPr>
         <w:t xml:space="preserve">A Thursday in June, no job to go to, Dad twenty minutes away and expecting me for lunch, because I’d said Thursday. I got as far as the driveway. I sat in the car with the keys in my hand and the air conditioning not on yet and I watched the clock on the dash go from 11:40 to 12:10, and at 12:10 I texted him that something had come up with the house. He wrote back, No problem. Next week. He always wrote back like that. I went inside and lay down on top of the made bed in my clothes, and Hope found me there at six.</w:t>
       </w:r>
     </w:p>
@@ -14043,23 +13553,7 @@
         <w:pStyle w:val="BodyText"/>
       </w:pPr>
       <w:r>
-        <w:rPr>
-          <w:highlight w:val="yellow"/>
-        </w:rPr>
         <w:t xml:space="preserve">I did that more than once that summer. I have sat across from families and explained anticipatory grief in a calm voice, and I did not know I was in it. I thought I was tired. I thought I was being a bad son on purpose. It was neither. It was a man who could feel the weight coming and had lain down under it early.</w:t>
-      </w:r>
-    </w:p>
-    <w:p>
-      <w:pPr>
-        <w:pStyle w:val="BodyText"/>
-      </w:pPr>
-      <w:r>
-        <w:rPr>
-          <w:iCs/>
-          <w:i/>
-          <w:highlight w:val="yellow"/>
-        </w:rPr>
-        <w:t xml:space="preserve">[END PLACEHOLDER.]</w:t>
       </w:r>
     </w:p>
     <w:p>
@@ -14186,58 +13680,24 @@
         <w:pStyle w:val="BodyText"/>
       </w:pPr>
       <w:r>
-        <w:rPr>
-          <w:iCs/>
-          <w:i/>
-          <w:highlight w:val="yellow"/>
-        </w:rPr>
-        <w:t xml:space="preserve">[PLACEHOLDER. The breakfast, drafted from what the book already says about him. Rob replaces the details with what happened.]</w:t>
-      </w:r>
-    </w:p>
-    <w:p>
-      <w:pPr>
-        <w:pStyle w:val="BodyText"/>
-      </w:pPr>
-      <w:r>
-        <w:rPr>
-          <w:highlight w:val="yellow"/>
-        </w:rPr>
         <w:t xml:space="preserve">Another Broken Egg on Bayfront, because it was his, and because the girl at the register said</w:t>
       </w:r>
       <w:r>
-        <w:rPr>
-          <w:highlight w:val="yellow"/>
-        </w:rPr>
-        <w:t xml:space="preserve"> </w:t>
-      </w:r>
-      <w:r>
-        <w:rPr>
-          <w:highlight w:val="yellow"/>
-        </w:rPr>
-        <w:t xml:space="preserve">“</w:t>
-      </w:r>
-      <w:r>
-        <w:rPr>
-          <w:highlight w:val="yellow"/>
-        </w:rPr>
+        <w:t xml:space="preserve"> </w:t>
+      </w:r>
+      <w:r>
+        <w:t xml:space="preserve">“</w:t>
+      </w:r>
+      <w:r>
         <w:t xml:space="preserve">Where you been, Mr. Brizzi?</w:t>
       </w:r>
       <w:r>
-        <w:rPr>
-          <w:highlight w:val="yellow"/>
-        </w:rPr>
-        <w:t xml:space="preserve">”</w:t>
-      </w:r>
-      <w:r>
-        <w:rPr>
-          <w:highlight w:val="yellow"/>
-        </w:rPr>
-        <w:t xml:space="preserve"> </w:t>
-      </w:r>
-      <w:r>
-        <w:rPr>
-          <w:highlight w:val="yellow"/>
-        </w:rPr>
+        <w:t xml:space="preserve">”</w:t>
+      </w:r>
+      <w:r>
+        <w:t xml:space="preserve"> </w:t>
+      </w:r>
+      <w:r>
         <w:t xml:space="preserve">before we sat down, which was the point of going there. He’d dressed for it. Pressed shirt, the collar standing a little off his neck now, the hair done. Donna had driven. He walked in on his own. He asked me twice what time we were leaving, and the second time I answered him short, and I’ve had months to wish I hadn’t. Eggs, toast, coffee he stirred and didn’t drink much of. He ate about a third of it and pushed the plate an inch away from himself, which was as close as he came to saying he was full.</w:t>
       </w:r>
     </w:p>
@@ -14246,52 +13706,25 @@
         <w:pStyle w:val="BodyText"/>
       </w:pPr>
       <w:r>
-        <w:rPr>
-          <w:highlight w:val="yellow"/>
-        </w:rPr>
         <w:t xml:space="preserve">There was an opening in hospice, at a company I had already given ten years to, and I told him about it. He listened to all of it. Then he told me what he always told me.</w:t>
       </w:r>
       <w:r>
-        <w:rPr>
-          <w:highlight w:val="yellow"/>
-        </w:rPr>
-        <w:t xml:space="preserve"> </w:t>
-      </w:r>
-      <w:r>
-        <w:rPr>
-          <w:highlight w:val="yellow"/>
-        </w:rPr>
-        <w:t xml:space="preserve">“</w:t>
-      </w:r>
-      <w:r>
-        <w:rPr>
-          <w:highlight w:val="yellow"/>
-        </w:rPr>
+        <w:t xml:space="preserve"> </w:t>
+      </w:r>
+      <w:r>
+        <w:t xml:space="preserve">“</w:t>
+      </w:r>
+      <w:r>
         <w:t xml:space="preserve">Listen to your boss. Work hard.</w:t>
       </w:r>
       <w:r>
-        <w:rPr>
-          <w:highlight w:val="yellow"/>
-        </w:rPr>
-        <w:t xml:space="preserve">”</w:t>
-      </w:r>
-      <w:r>
-        <w:rPr>
-          <w:highlight w:val="yellow"/>
-        </w:rPr>
-        <w:t xml:space="preserve"> </w:t>
-      </w:r>
-      <w:r>
-        <w:rPr>
-          <w:highlight w:val="yellow"/>
-        </w:rPr>
-        <w:t xml:space="preserve">He had put that in me a long time ago, and he said it again like it was the first time. Later, while Hope was up at the counter,</w:t>
-      </w:r>
-      <w:r>
-        <w:t xml:space="preserve"> </w:t>
-      </w:r>
-      <w:r>
-        <w:t xml:space="preserve">he looked at me and said,</w:t>
+        <w:t xml:space="preserve">”</w:t>
+      </w:r>
+      <w:r>
+        <w:t xml:space="preserve"> </w:t>
+      </w:r>
+      <w:r>
+        <w:t xml:space="preserve">He had put that in me a long time ago, and he said it again like it was the first time. Later, while Hope was up at the counter, he looked at me and said,</w:t>
       </w:r>
       <w:r>
         <w:t xml:space="preserve"> </w:t>
@@ -14311,9 +13744,6 @@
         <w:pStyle w:val="BodyText"/>
       </w:pPr>
       <w:r>
-        <w:rPr>
-          <w:highlight w:val="yellow"/>
-        </w:rPr>
         <w:t xml:space="preserve">He left a twenty on a thirty-dollar check. When we got up he didn’t walk us to the car. He stood inside the door and watched us go.</w:t>
       </w:r>
     </w:p>
@@ -14322,19 +13752,6 @@
         <w:pStyle w:val="BodyText"/>
       </w:pPr>
       <w:r>
-        <w:rPr>
-          <w:iCs/>
-          <w:i/>
-          <w:highlight w:val="yellow"/>
-        </w:rPr>
-        <w:t xml:space="preserve">[END PLACEHOLDER.]</w:t>
-      </w:r>
-    </w:p>
-    <w:p>
-      <w:pPr>
-        <w:pStyle w:val="BodyText"/>
-      </w:pPr>
-      <w:r>
         <w:t xml:space="preserve">When the hospice job came, it felt like a door had finally opened. Five weeks after I started, my father started to die.</w:t>
       </w:r>
     </w:p>
@@ -14440,36 +13857,7 @@
         <w:pStyle w:val="BodyText"/>
       </w:pPr>
       <w:r>
-        <w:rPr>
-          <w:iCs/>
-          <w:i/>
-          <w:highlight w:val="yellow"/>
-        </w:rPr>
-        <w:t xml:space="preserve">[PLACEHOLDER. What Rob saw in that room, reconstructed.]</w:t>
-      </w:r>
-    </w:p>
-    <w:p>
-      <w:pPr>
-        <w:pStyle w:val="BodyText"/>
-      </w:pPr>
-      <w:r>
-        <w:rPr>
-          <w:highlight w:val="yellow"/>
-        </w:rPr>
         <w:t xml:space="preserve">He had been a big man. You could tell from the suits in the open closet and from the way the bed didn’t fit him anymore, the way a bed doesn’t fit a man who has lost sixty pounds in a season. His mouth was open. The oxygen was on and it wasn’t doing much, and every breath had a catch at the top of it, like a door on a bad hinge. His grandson was reading him the sports page, all of it, the box scores, because somebody had told the boy that hearing goes last and he had decided to believe it.</w:t>
-      </w:r>
-    </w:p>
-    <w:p>
-      <w:pPr>
-        <w:pStyle w:val="BodyText"/>
-      </w:pPr>
-      <w:r>
-        <w:rPr>
-          <w:iCs/>
-          <w:i/>
-          <w:highlight w:val="yellow"/>
-        </w:rPr>
-        <w:t xml:space="preserve">[END PLACEHOLDER.]</w:t>
       </w:r>
     </w:p>
     <w:p>
@@ -14593,22 +13981,6 @@
         <w:pStyle w:val="BodyText"/>
       </w:pPr>
       <w:r>
-        <w:rPr>
-          <w:iCs/>
-          <w:i/>
-          <w:highlight w:val="yellow"/>
-        </w:rPr>
-        <w:t xml:space="preserve">[PLACEHOLDER. December 23 to 25, written in Rob’s voice from what the book establishes. Not yet his memory. He replaces what is wrong.]</w:t>
-      </w:r>
-    </w:p>
-    <w:p>
-      <w:pPr>
-        <w:pStyle w:val="BodyText"/>
-      </w:pPr>
-      <w:r>
-        <w:rPr>
-          <w:highlight w:val="yellow"/>
-        </w:rPr>
         <w:t xml:space="preserve">Donna called Tuesday afternoon. I was in the car outside a facility in Cary, between one visit and the next, and I watched her name light up and let it go. I told myself I’d call her from the house. What I did at the house was help my mother up the front steps, one at a time, her hand on my forearm and the tremor coming through it, and by the time she was settled in the good chair the phone was on the counter face down and I had a reason to leave it there.</w:t>
       </w:r>
     </w:p>
@@ -14617,9 +13989,6 @@
         <w:pStyle w:val="BodyText"/>
       </w:pPr>
       <w:r>
-        <w:rPr>
-          <w:highlight w:val="yellow"/>
-        </w:rPr>
         <w:t xml:space="preserve">I didn’t call her back. I called Chris after nine, from the garage, with the door down. He was already down there.</w:t>
       </w:r>
     </w:p>
@@ -14628,140 +13997,74 @@
         <w:pStyle w:val="BodyText"/>
       </w:pPr>
       <w:r>
-        <w:rPr>
-          <w:highlight w:val="yellow"/>
-        </w:rPr>
-        <w:t xml:space="preserve">“</w:t>
-      </w:r>
-      <w:r>
-        <w:rPr>
-          <w:highlight w:val="yellow"/>
-        </w:rPr>
+        <w:t xml:space="preserve">“</w:t>
+      </w:r>
+      <w:r>
         <w:t xml:space="preserve">They admitted him this afternoon,</w:t>
       </w:r>
       <w:r>
-        <w:rPr>
-          <w:highlight w:val="yellow"/>
-        </w:rPr>
-        <w:t xml:space="preserve">”</w:t>
-      </w:r>
-      <w:r>
-        <w:rPr>
-          <w:highlight w:val="yellow"/>
-        </w:rPr>
-        <w:t xml:space="preserve"> </w:t>
-      </w:r>
-      <w:r>
-        <w:rPr>
-          <w:highlight w:val="yellow"/>
-        </w:rPr>
+        <w:t xml:space="preserve">”</w:t>
+      </w:r>
+      <w:r>
+        <w:t xml:space="preserve"> </w:t>
+      </w:r>
+      <w:r>
         <w:t xml:space="preserve">he said.</w:t>
       </w:r>
       <w:r>
-        <w:rPr>
-          <w:highlight w:val="yellow"/>
-        </w:rPr>
-        <w:t xml:space="preserve"> </w:t>
-      </w:r>
-      <w:r>
-        <w:rPr>
-          <w:highlight w:val="yellow"/>
-        </w:rPr>
-        <w:t xml:space="preserve">“</w:t>
-      </w:r>
-      <w:r>
-        <w:rPr>
-          <w:highlight w:val="yellow"/>
-        </w:rPr>
+        <w:t xml:space="preserve"> </w:t>
+      </w:r>
+      <w:r>
+        <w:t xml:space="preserve">“</w:t>
+      </w:r>
+      <w:r>
         <w:t xml:space="preserve">It’s pneumonia, Rob. It’s in both lungs.</w:t>
       </w:r>
       <w:r>
-        <w:rPr>
-          <w:highlight w:val="yellow"/>
-        </w:rPr>
-        <w:t xml:space="preserve">”</w:t>
-      </w:r>
-      <w:r>
-        <w:rPr>
-          <w:highlight w:val="yellow"/>
-        </w:rPr>
-        <w:t xml:space="preserve"> </w:t>
-      </w:r>
-      <w:r>
-        <w:rPr>
-          <w:highlight w:val="yellow"/>
-        </w:rPr>
+        <w:t xml:space="preserve">”</w:t>
+      </w:r>
+      <w:r>
+        <w:t xml:space="preserve"> </w:t>
+      </w:r>
+      <w:r>
         <w:t xml:space="preserve">I knew what that meant in a man with nothing left to fight with.</w:t>
       </w:r>
       <w:r>
-        <w:rPr>
-          <w:highlight w:val="yellow"/>
-        </w:rPr>
-        <w:t xml:space="preserve"> </w:t>
-      </w:r>
-      <w:r>
-        <w:rPr>
-          <w:highlight w:val="yellow"/>
-        </w:rPr>
-        <w:t xml:space="preserve">“</w:t>
-      </w:r>
-      <w:r>
-        <w:rPr>
-          <w:highlight w:val="yellow"/>
-        </w:rPr>
+        <w:t xml:space="preserve"> </w:t>
+      </w:r>
+      <w:r>
+        <w:t xml:space="preserve">“</w:t>
+      </w:r>
+      <w:r>
         <w:t xml:space="preserve">He’s tired. He’s real tired.</w:t>
       </w:r>
       <w:r>
-        <w:rPr>
-          <w:highlight w:val="yellow"/>
-        </w:rPr>
-        <w:t xml:space="preserve">”</w:t>
-      </w:r>
-      <w:r>
-        <w:rPr>
-          <w:highlight w:val="yellow"/>
-        </w:rPr>
-        <w:t xml:space="preserve"> </w:t>
-      </w:r>
-      <w:r>
-        <w:rPr>
-          <w:highlight w:val="yellow"/>
-        </w:rPr>
+        <w:t xml:space="preserve">”</w:t>
+      </w:r>
+      <w:r>
+        <w:t xml:space="preserve"> </w:t>
+      </w:r>
+      <w:r>
         <w:t xml:space="preserve">Then my brother said the thing I’ve heard families say in living rooms for ten years, and I had never once heard it aimed at me.</w:t>
       </w:r>
       <w:r>
-        <w:rPr>
-          <w:highlight w:val="yellow"/>
-        </w:rPr>
-        <w:t xml:space="preserve"> </w:t>
-      </w:r>
-      <w:r>
-        <w:rPr>
-          <w:highlight w:val="yellow"/>
-        </w:rPr>
-        <w:t xml:space="preserve">“</w:t>
-      </w:r>
-      <w:r>
-        <w:rPr>
-          <w:highlight w:val="yellow"/>
-        </w:rPr>
+        <w:t xml:space="preserve"> </w:t>
+      </w:r>
+      <w:r>
+        <w:t xml:space="preserve">“</w:t>
+      </w:r>
+      <w:r>
         <w:t xml:space="preserve">You don’t have to come tonight.</w:t>
       </w:r>
       <w:r>
-        <w:rPr>
-          <w:highlight w:val="yellow"/>
-        </w:rPr>
-        <w:t xml:space="preserve">”</w:t>
-      </w:r>
-    </w:p>
-    <w:p>
-      <w:pPr>
-        <w:pStyle w:val="BodyText"/>
-      </w:pPr>
-      <w:r>
-        <w:rPr>
-          <w:highlight w:val="yellow"/>
-        </w:rPr>
+        <w:t xml:space="preserve">”</w:t>
+      </w:r>
+    </w:p>
+    <w:p>
+      <w:pPr>
+        <w:pStyle w:val="BodyText"/>
+      </w:pPr>
+      <w:r>
         <w:t xml:space="preserve">I asked him the questions I ask strangers. Is he comfortable. Is he eating. Who’s there. Donna hadn’t left the room. Lisa was on her way. I said we’d be down Friday, that Mom was here and needed a day. Chris said okay. He did not say it the way you say okay when you agree. He said it the way you say it when you’ve decided not to fight a man about his own father.</w:t>
       </w:r>
     </w:p>
@@ -14770,45 +14073,24 @@
         <w:pStyle w:val="BodyText"/>
       </w:pPr>
       <w:r>
-        <w:rPr>
-          <w:highlight w:val="yellow"/>
-        </w:rPr>
         <w:t xml:space="preserve">I came back in and Hope looked up from the stove and asked me with her face.</w:t>
       </w:r>
       <w:r>
-        <w:rPr>
-          <w:highlight w:val="yellow"/>
-        </w:rPr>
-        <w:t xml:space="preserve"> </w:t>
-      </w:r>
-      <w:r>
-        <w:rPr>
-          <w:highlight w:val="yellow"/>
-        </w:rPr>
-        <w:t xml:space="preserve">“</w:t>
-      </w:r>
-      <w:r>
-        <w:rPr>
-          <w:highlight w:val="yellow"/>
-        </w:rPr>
+        <w:t xml:space="preserve"> </w:t>
+      </w:r>
+      <w:r>
+        <w:t xml:space="preserve">“</w:t>
+      </w:r>
+      <w:r>
         <w:t xml:space="preserve">Friday,</w:t>
       </w:r>
       <w:r>
-        <w:rPr>
-          <w:highlight w:val="yellow"/>
-        </w:rPr>
-        <w:t xml:space="preserve">”</w:t>
-      </w:r>
-      <w:r>
-        <w:rPr>
-          <w:highlight w:val="yellow"/>
-        </w:rPr>
-        <w:t xml:space="preserve"> </w:t>
-      </w:r>
-      <w:r>
-        <w:rPr>
-          <w:highlight w:val="yellow"/>
-        </w:rPr>
+        <w:t xml:space="preserve">”</w:t>
+      </w:r>
+      <w:r>
+        <w:t xml:space="preserve"> </w:t>
+      </w:r>
+      <w:r>
         <w:t xml:space="preserve">I said. She needs a plan, and I had given her one. She didn’t ask whether it was the right one.</w:t>
       </w:r>
     </w:p>
@@ -14817,45 +14099,24 @@
         <w:pStyle w:val="BodyText"/>
       </w:pPr>
       <w:r>
-        <w:rPr>
-          <w:highlight w:val="yellow"/>
-        </w:rPr>
         <w:t xml:space="preserve">Christmas Eve my mother sat on a stool at the kitchen island and told Hope how to cut the peppers. Hope let her. That is something I love about my wife, that she can be told how to cut a pepper by a woman whose hands can’t be trusted with the knife anymore, and make it look like she needed the help. Twice my mother asked how Dad was doing.</w:t>
       </w:r>
       <w:r>
-        <w:rPr>
-          <w:highlight w:val="yellow"/>
-        </w:rPr>
-        <w:t xml:space="preserve"> </w:t>
-      </w:r>
-      <w:r>
-        <w:rPr>
-          <w:highlight w:val="yellow"/>
-        </w:rPr>
-        <w:t xml:space="preserve">“</w:t>
-      </w:r>
-      <w:r>
-        <w:rPr>
-          <w:highlight w:val="yellow"/>
-        </w:rPr>
+        <w:t xml:space="preserve"> </w:t>
+      </w:r>
+      <w:r>
+        <w:t xml:space="preserve">“</w:t>
+      </w:r>
+      <w:r>
         <w:t xml:space="preserve">Resting,</w:t>
       </w:r>
       <w:r>
-        <w:rPr>
-          <w:highlight w:val="yellow"/>
-        </w:rPr>
-        <w:t xml:space="preserve">”</w:t>
-      </w:r>
-      <w:r>
-        <w:rPr>
-          <w:highlight w:val="yellow"/>
-        </w:rPr>
-        <w:t xml:space="preserve"> </w:t>
-      </w:r>
-      <w:r>
-        <w:rPr>
-          <w:highlight w:val="yellow"/>
-        </w:rPr>
+        <w:t xml:space="preserve">”</w:t>
+      </w:r>
+      <w:r>
+        <w:t xml:space="preserve"> </w:t>
+      </w:r>
+      <w:r>
         <w:t xml:space="preserve">I said. It’s a word I hear families use. I heard myself use it.</w:t>
       </w:r>
     </w:p>
@@ -14864,45 +14125,24 @@
         <w:pStyle w:val="BodyText"/>
       </w:pPr>
       <w:r>
-        <w:rPr>
-          <w:highlight w:val="yellow"/>
-        </w:rPr>
         <w:t xml:space="preserve">We went to the candlelight service at seven. My mother wanted to, and I wanted her to have it. We sat near the back so she wouldn’t have to stand long. Somewhere in</w:t>
       </w:r>
       <w:r>
-        <w:rPr>
-          <w:highlight w:val="yellow"/>
-        </w:rPr>
-        <w:t xml:space="preserve"> </w:t>
-      </w:r>
-      <w:r>
-        <w:rPr>
-          <w:highlight w:val="yellow"/>
-        </w:rPr>
-        <w:t xml:space="preserve">“</w:t>
-      </w:r>
-      <w:r>
-        <w:rPr>
-          <w:highlight w:val="yellow"/>
-        </w:rPr>
+        <w:t xml:space="preserve"> </w:t>
+      </w:r>
+      <w:r>
+        <w:t xml:space="preserve">“</w:t>
+      </w:r>
+      <w:r>
         <w:t xml:space="preserve">Silent Night,</w:t>
       </w:r>
       <w:r>
-        <w:rPr>
-          <w:highlight w:val="yellow"/>
-        </w:rPr>
-        <w:t xml:space="preserve">”</w:t>
-      </w:r>
-      <w:r>
-        <w:rPr>
-          <w:highlight w:val="yellow"/>
-        </w:rPr>
-        <w:t xml:space="preserve"> </w:t>
-      </w:r>
-      <w:r>
-        <w:rPr>
-          <w:highlight w:val="yellow"/>
-        </w:rPr>
+        <w:t xml:space="preserve">”</w:t>
+      </w:r>
+      <w:r>
+        <w:t xml:space="preserve"> </w:t>
+      </w:r>
+      <w:r>
         <w:t xml:space="preserve">with the little candle in my hand, the phone buzzed against my leg. I read it under the hymnal. Chris. They’d started a morphine drip. Comfort care. He was in the hospital, not hospice; it went that fast.</w:t>
       </w:r>
     </w:p>
@@ -14911,9 +14151,6 @@
         <w:pStyle w:val="BodyText"/>
       </w:pPr>
       <w:r>
-        <w:rPr>
-          <w:highlight w:val="yellow"/>
-        </w:rPr>
         <w:t xml:space="preserve">I know what a drip is. I explain it to families in their living rooms. It doesn’t take anyone. It eases the pain and the hunger for air while the dying does what it was already doing. I have said that sentence to strangers with a steady voice. I stood in a church holding a candle and could not say it to myself. I put the phone back in my pocket and sang the last verse with my mother, who didn’t know, and Hope, who did. I didn’t tell her because she had come seven hundred miles to have a Christmas, and because if I said it out loud in that pew it would be true.</w:t>
       </w:r>
     </w:p>
@@ -14922,9 +14159,6 @@
         <w:pStyle w:val="BodyText"/>
       </w:pPr>
       <w:r>
-        <w:rPr>
-          <w:highlight w:val="yellow"/>
-        </w:rPr>
         <w:t xml:space="preserve">In the car she asked me if I wanted to drive down that night. It’s eleven hours. I said no. I said he always comes back. I said it out loud, in the car, to my wife, on Christmas Eve, and she let me.</w:t>
       </w:r>
     </w:p>
@@ -14933,9 +14167,6 @@
         <w:pStyle w:val="BodyText"/>
       </w:pPr>
       <w:r>
-        <w:rPr>
-          <w:highlight w:val="yellow"/>
-        </w:rPr>
         <w:t xml:space="preserve">I did not want my last memory of my father to be tubes in his nose. He had been bigger than two cancers and a scare. I couldn’t let the man in that bed be the last picture I kept of him. So I kept the picture I had, from the breakfast in the fall, with the collar loose on his neck, and I stayed in Raleigh. It was selfish. I knew it while I was doing it. I sit with families who do the same math, and I have never once judged them for it.</w:t>
       </w:r>
     </w:p>
@@ -14944,9 +14175,6 @@
         <w:pStyle w:val="BodyText"/>
       </w:pPr>
       <w:r>
-        <w:rPr>
-          <w:highlight w:val="yellow"/>
-        </w:rPr>
         <w:t xml:space="preserve">Christmas morning I was up at five. I did not turn the phone over. I made coffee and stood at the window. The neighbors across the street had put a bicycle with a bow on it in the driveway sometime in the night. I looked at the phone at six. Nothing from Chris since the church. The texting had stopped, and the silence had a shape.</w:t>
       </w:r>
     </w:p>
@@ -14955,45 +14183,24 @@
         <w:pStyle w:val="BodyText"/>
       </w:pPr>
       <w:r>
-        <w:rPr>
-          <w:highlight w:val="yellow"/>
-        </w:rPr>
         <w:t xml:space="preserve">Mager called at his usual time. We prayed the way we always do, a few plain sentences, thank you and help. I told him about the drip. He didn’t say anything about God. He said,</w:t>
       </w:r>
       <w:r>
-        <w:rPr>
-          <w:highlight w:val="yellow"/>
-        </w:rPr>
-        <w:t xml:space="preserve"> </w:t>
-      </w:r>
-      <w:r>
-        <w:rPr>
-          <w:highlight w:val="yellow"/>
-        </w:rPr>
-        <w:t xml:space="preserve">“</w:t>
-      </w:r>
-      <w:r>
-        <w:rPr>
-          <w:highlight w:val="yellow"/>
-        </w:rPr>
+        <w:t xml:space="preserve"> </w:t>
+      </w:r>
+      <w:r>
+        <w:t xml:space="preserve">“</w:t>
+      </w:r>
+      <w:r>
         <w:t xml:space="preserve">Then you already know, brother.</w:t>
       </w:r>
       <w:r>
-        <w:rPr>
-          <w:highlight w:val="yellow"/>
-        </w:rPr>
-        <w:t xml:space="preserve">”</w:t>
-      </w:r>
-      <w:r>
-        <w:rPr>
-          <w:highlight w:val="yellow"/>
-        </w:rPr>
-        <w:t xml:space="preserve"> </w:t>
-      </w:r>
-      <w:r>
-        <w:rPr>
-          <w:highlight w:val="yellow"/>
-        </w:rPr>
+        <w:t xml:space="preserve">”</w:t>
+      </w:r>
+      <w:r>
+        <w:t xml:space="preserve"> </w:t>
+      </w:r>
+      <w:r>
         <w:t xml:space="preserve">I said I did.</w:t>
       </w:r>
     </w:p>
@@ -15002,81 +14209,42 @@
         <w:pStyle w:val="BodyText"/>
       </w:pPr>
       <w:r>
-        <w:rPr>
-          <w:highlight w:val="yellow"/>
-        </w:rPr>
         <w:t xml:space="preserve">The call came at twenty to nine. Chris.</w:t>
       </w:r>
       <w:r>
-        <w:rPr>
-          <w:highlight w:val="yellow"/>
-        </w:rPr>
-        <w:t xml:space="preserve"> </w:t>
-      </w:r>
-      <w:r>
-        <w:rPr>
-          <w:highlight w:val="yellow"/>
-        </w:rPr>
-        <w:t xml:space="preserve">“</w:t>
-      </w:r>
-      <w:r>
-        <w:rPr>
-          <w:highlight w:val="yellow"/>
-        </w:rPr>
+        <w:t xml:space="preserve"> </w:t>
+      </w:r>
+      <w:r>
+        <w:t xml:space="preserve">“</w:t>
+      </w:r>
+      <w:r>
         <w:t xml:space="preserve">Rob.</w:t>
       </w:r>
       <w:r>
-        <w:rPr>
-          <w:highlight w:val="yellow"/>
-        </w:rPr>
-        <w:t xml:space="preserve">”</w:t>
-      </w:r>
-      <w:r>
-        <w:rPr>
-          <w:highlight w:val="yellow"/>
-        </w:rPr>
-        <w:t xml:space="preserve"> </w:t>
-      </w:r>
-      <w:r>
-        <w:rPr>
-          <w:highlight w:val="yellow"/>
-        </w:rPr>
+        <w:t xml:space="preserve">”</w:t>
+      </w:r>
+      <w:r>
+        <w:t xml:space="preserve"> </w:t>
+      </w:r>
+      <w:r>
         <w:t xml:space="preserve">Then a breath.</w:t>
       </w:r>
       <w:r>
-        <w:rPr>
-          <w:highlight w:val="yellow"/>
-        </w:rPr>
-        <w:t xml:space="preserve"> </w:t>
-      </w:r>
-      <w:r>
-        <w:rPr>
-          <w:highlight w:val="yellow"/>
-        </w:rPr>
-        <w:t xml:space="preserve">“</w:t>
-      </w:r>
-      <w:r>
-        <w:rPr>
-          <w:highlight w:val="yellow"/>
-        </w:rPr>
+        <w:t xml:space="preserve"> </w:t>
+      </w:r>
+      <w:r>
+        <w:t xml:space="preserve">“</w:t>
+      </w:r>
+      <w:r>
         <w:t xml:space="preserve">He’s gone. About a half hour ago. Donna was with him.</w:t>
       </w:r>
       <w:r>
-        <w:rPr>
-          <w:highlight w:val="yellow"/>
-        </w:rPr>
-        <w:t xml:space="preserve">”</w:t>
-      </w:r>
-      <w:r>
-        <w:rPr>
-          <w:highlight w:val="yellow"/>
-        </w:rPr>
-        <w:t xml:space="preserve"> </w:t>
-      </w:r>
-      <w:r>
-        <w:rPr>
-          <w:highlight w:val="yellow"/>
-        </w:rPr>
+        <w:t xml:space="preserve">”</w:t>
+      </w:r>
+      <w:r>
+        <w:t xml:space="preserve"> </w:t>
+      </w:r>
+      <w:r>
         <w:t xml:space="preserve">I asked if it was peaceful. I don’t know why that was my first question. It’s the question families ask me. He said yes. He said Dad had not woken up since the night before. I said okay. I said I’d call him back.</w:t>
       </w:r>
     </w:p>
@@ -15085,81 +14253,42 @@
         <w:pStyle w:val="BodyText"/>
       </w:pPr>
       <w:r>
-        <w:rPr>
-          <w:highlight w:val="yellow"/>
-        </w:rPr>
         <w:t xml:space="preserve">I went and told my mother. She was in the good chair with her tea. I said,</w:t>
       </w:r>
       <w:r>
-        <w:rPr>
-          <w:highlight w:val="yellow"/>
-        </w:rPr>
-        <w:t xml:space="preserve"> </w:t>
-      </w:r>
-      <w:r>
-        <w:rPr>
-          <w:highlight w:val="yellow"/>
-        </w:rPr>
-        <w:t xml:space="preserve">“</w:t>
-      </w:r>
-      <w:r>
-        <w:rPr>
-          <w:highlight w:val="yellow"/>
-        </w:rPr>
+        <w:t xml:space="preserve"> </w:t>
+      </w:r>
+      <w:r>
+        <w:t xml:space="preserve">“</w:t>
+      </w:r>
+      <w:r>
         <w:t xml:space="preserve">Mom, Dad died.</w:t>
       </w:r>
       <w:r>
-        <w:rPr>
-          <w:highlight w:val="yellow"/>
-        </w:rPr>
-        <w:t xml:space="preserve">”</w:t>
-      </w:r>
-      <w:r>
-        <w:rPr>
-          <w:highlight w:val="yellow"/>
-        </w:rPr>
-        <w:t xml:space="preserve"> </w:t>
-      </w:r>
-      <w:r>
-        <w:rPr>
-          <w:highlight w:val="yellow"/>
-        </w:rPr>
+        <w:t xml:space="preserve">”</w:t>
+      </w:r>
+      <w:r>
+        <w:t xml:space="preserve"> </w:t>
+      </w:r>
+      <w:r>
         <w:t xml:space="preserve">She looked at me for a long time and then she said,</w:t>
       </w:r>
       <w:r>
-        <w:rPr>
-          <w:highlight w:val="yellow"/>
-        </w:rPr>
-        <w:t xml:space="preserve"> </w:t>
-      </w:r>
-      <w:r>
-        <w:rPr>
-          <w:highlight w:val="yellow"/>
-        </w:rPr>
-        <w:t xml:space="preserve">“</w:t>
-      </w:r>
-      <w:r>
-        <w:rPr>
-          <w:highlight w:val="yellow"/>
-        </w:rPr>
+        <w:t xml:space="preserve"> </w:t>
+      </w:r>
+      <w:r>
+        <w:t xml:space="preserve">“</w:t>
+      </w:r>
+      <w:r>
         <w:t xml:space="preserve">Oh, Louie.</w:t>
       </w:r>
       <w:r>
-        <w:rPr>
-          <w:highlight w:val="yellow"/>
-        </w:rPr>
-        <w:t xml:space="preserve">”</w:t>
-      </w:r>
-      <w:r>
-        <w:rPr>
-          <w:highlight w:val="yellow"/>
-        </w:rPr>
-        <w:t xml:space="preserve"> </w:t>
-      </w:r>
-      <w:r>
-        <w:rPr>
-          <w:highlight w:val="yellow"/>
-        </w:rPr>
+        <w:t xml:space="preserve">”</w:t>
+      </w:r>
+      <w:r>
+        <w:t xml:space="preserve"> </w:t>
+      </w:r>
+      <w:r>
         <w:t xml:space="preserve">Just that. She had known him forty years, married him, left him, and toasted him at my wedding, and what she had left for him was his name. Hope had come in behind me and put a hand on my back and left it there.</w:t>
       </w:r>
     </w:p>
@@ -15168,9 +14297,6 @@
         <w:pStyle w:val="BodyText"/>
       </w:pPr>
       <w:r>
-        <w:rPr>
-          <w:highlight w:val="yellow"/>
-        </w:rPr>
         <w:t xml:space="preserve">Then my mother got up, which costs her something now, and went to the stove and started eggs, Hope’s hand under her elbow the whole time. Nobody ate them. In our family that’s what you do. You cook it.</w:t>
       </w:r>
     </w:p>
@@ -15179,9 +14305,6 @@
         <w:pStyle w:val="BodyText"/>
       </w:pPr>
       <w:r>
-        <w:rPr>
-          <w:highlight w:val="yellow"/>
-        </w:rPr>
         <w:t xml:space="preserve">I went out to the driveway. The bicycle with the bow was still across the street. A kid came out in pajamas and got on it and rode it to the corner and back, and I stood there with the phone in my hand and watched him do it four times.</w:t>
       </w:r>
     </w:p>
@@ -15190,22 +14313,6 @@
         <w:pStyle w:val="BodyText"/>
       </w:pPr>
       <w:r>
-        <w:rPr>
-          <w:iCs/>
-          <w:i/>
-          <w:highlight w:val="yellow"/>
-        </w:rPr>
-        <w:t xml:space="preserve">[END PLACEHOLDER.]</w:t>
-      </w:r>
-    </w:p>
-    <w:p>
-      <w:pPr>
-        <w:pStyle w:val="BodyText"/>
-      </w:pPr>
-      <w:r>
-        <w:rPr>
-          <w:highlight w:val="yellow"/>
-        </w:rPr>
         <w:t xml:space="preserve">Nobody said the word hospice about my father, not Donna, who is a nurse, not Chris, not me, who says it for a living. It went that fast, and that is true, and it is also the sentence I hear from families every week, and I have never once believed it was the whole reason.</w:t>
       </w:r>
     </w:p>
@@ -15460,81 +14567,42 @@
         <w:pStyle w:val="BodyText"/>
       </w:pPr>
       <w:r>
-        <w:rPr>
-          <w:highlight w:val="yellow"/>
-        </w:rPr>
         <w:t xml:space="preserve">Lisa called me that January, no reason, the way she does. Somewhere in it she said,</w:t>
       </w:r>
       <w:r>
-        <w:rPr>
-          <w:highlight w:val="yellow"/>
-        </w:rPr>
-        <w:t xml:space="preserve"> </w:t>
-      </w:r>
-      <w:r>
-        <w:rPr>
-          <w:highlight w:val="yellow"/>
-        </w:rPr>
-        <w:t xml:space="preserve">“</w:t>
-      </w:r>
-      <w:r>
-        <w:rPr>
-          <w:highlight w:val="yellow"/>
-        </w:rPr>
+        <w:t xml:space="preserve"> </w:t>
+      </w:r>
+      <w:r>
+        <w:t xml:space="preserve">“</w:t>
+      </w:r>
+      <w:r>
         <w:t xml:space="preserve">You know you got the good one, right?</w:t>
       </w:r>
       <w:r>
-        <w:rPr>
-          <w:highlight w:val="yellow"/>
-        </w:rPr>
-        <w:t xml:space="preserve">”</w:t>
-      </w:r>
-      <w:r>
-        <w:rPr>
-          <w:highlight w:val="yellow"/>
-        </w:rPr>
-        <w:t xml:space="preserve"> </w:t>
-      </w:r>
-      <w:r>
-        <w:rPr>
-          <w:highlight w:val="yellow"/>
-        </w:rPr>
+        <w:t xml:space="preserve">”</w:t>
+      </w:r>
+      <w:r>
+        <w:t xml:space="preserve"> </w:t>
+      </w:r>
+      <w:r>
         <w:t xml:space="preserve">I said I knew.</w:t>
       </w:r>
       <w:r>
-        <w:rPr>
-          <w:highlight w:val="yellow"/>
-        </w:rPr>
-        <w:t xml:space="preserve"> </w:t>
-      </w:r>
-      <w:r>
-        <w:rPr>
-          <w:highlight w:val="yellow"/>
-        </w:rPr>
-        <w:t xml:space="preserve">“</w:t>
-      </w:r>
-      <w:r>
-        <w:rPr>
-          <w:highlight w:val="yellow"/>
-        </w:rPr>
+        <w:t xml:space="preserve"> </w:t>
+      </w:r>
+      <w:r>
+        <w:t xml:space="preserve">“</w:t>
+      </w:r>
+      <w:r>
         <w:t xml:space="preserve">We got the one who had to work. You got the one who got to stay.</w:t>
       </w:r>
       <w:r>
-        <w:rPr>
-          <w:highlight w:val="yellow"/>
-        </w:rPr>
-        <w:t xml:space="preserve">”</w:t>
-      </w:r>
-      <w:r>
-        <w:rPr>
-          <w:highlight w:val="yellow"/>
-        </w:rPr>
-        <w:t xml:space="preserve"> </w:t>
-      </w:r>
-      <w:r>
-        <w:rPr>
-          <w:highlight w:val="yellow"/>
-        </w:rPr>
+        <w:t xml:space="preserve">”</w:t>
+      </w:r>
+      <w:r>
+        <w:t xml:space="preserve"> </w:t>
+      </w:r>
+      <w:r>
         <w:t xml:space="preserve">She said it plain, no edge on it, the way you say a thing you’ve had thirty years to get used to, and I’ve thought about that sentence more than anything anybody said at the funeral.</w:t>
       </w:r>
     </w:p>
@@ -15868,22 +14936,7 @@
         <w:pStyle w:val="BodyText"/>
       </w:pPr>
       <w:r>
-        <w:t xml:space="preserve">And some rooms stay with me whole. There was a couple I’ll call Ed and Eva. Ed sold medical equipment. Eva was a respiratory therapist. Between the two of them, healthcare was not a foreign language. They knew the words, the systems, what illness looked like from the professional side. And Ed was twelve years sober, a man who had already done the hardest thing most people can imagine, one day at a time, for over a decade. Recovery had taught him how to live. It had not taught him how to let go. I sat with them near the end. He understood medicine, but medicine did not tell him how to say goodbye. She had spent her working life at other people’s bedsides, and it did not make her less human in her own. Ed loved Eva. That was never in question. Love just needed help becoming a plan: who speaks when she cannot, what comfort means now, what matters most today. The room did not feel good at the end. It wasn’t supposed to.</w:t>
-      </w:r>
-      <w:r>
-        <w:t xml:space="preserve"> </w:t>
-      </w:r>
-      <w:r>
-        <w:rPr>
-          <w:highlight w:val="yellow"/>
-        </w:rPr>
-        <w:t xml:space="preserve">What I remember is Ed at the kitchen table with her medication list, the one she had written herself in a therapist’s block capitals, going down it with a pen the way he’d once gone down a sales sheet, crossing off what she didn’t need anymore. He got to the bottom of the page and there was nothing left on it. He sat there with the pen. Then he went back into the bedroom and sat down and took her hand, and that was the plan.</w:t>
-      </w:r>
-      <w:r>
-        <w:t xml:space="preserve"> </w:t>
-      </w:r>
-      <w:r>
-        <w:t xml:space="preserve">Ed stayed in it, and the two of them got through it together.</w:t>
+        <w:t xml:space="preserve">And some rooms stay with me whole. There was a couple I’ll call Ed and Eva. Ed sold medical equipment. Eva was a respiratory therapist. Between the two of them, healthcare was not a foreign language. They knew the words, the systems, what illness looked like from the professional side. And Ed was twelve years sober, a man who had already done the hardest thing most people can imagine, one day at a time, for over a decade. Recovery had taught him how to live. It had not taught him how to let go. I sat with them near the end. He understood medicine, but medicine did not tell him how to say goodbye. She had spent her working life at other people’s bedsides, and it did not make her less human in her own. Ed loved Eva. That was never in question. Love just needed help becoming a plan: who speaks when she cannot, what comfort means now, what matters most today. The room did not feel good at the end. It wasn’t supposed to. What I remember is Ed at the kitchen table with her medication list, the one she had written herself in a therapist’s block capitals, going down it with a pen the way he’d once gone down a sales sheet, crossing off what she didn’t need anymore. He got to the bottom of the page and there was nothing left on it. He sat there with the pen. Then he went back into the bedroom and sat down and took her hand, and that was the plan. Ed stayed in it, and the two of them got through it together.</w:t>
       </w:r>
     </w:p>
     <w:p>

</xml_diff>

<commit_message>
Chapter headings: blank line before every chapter title so the converter renders a real heading (running heads and chapter pages were broken)
Co-Authored-By: Claude Fable 5.1 <noreply@anthropic.com>
Claude-Session: https://claude.ai/code/session_013TTacQAr67Pe2VUwTPop1A
</commit_message>
<xml_diff>
--- a/The_Cardinals_Promise.docx
+++ b/The_Cardinals_Promise.docx
@@ -1270,7 +1270,7 @@
       </w:r>
     </w:p>
     <w:bookmarkEnd w:id="22"/>
-    <w:bookmarkStart w:id="24" w:name="the-escape"/>
+    <w:bookmarkStart w:id="29" w:name="the-escape"/>
     <w:p>
       <w:pPr>
         <w:pStyle w:val="Heading1"/>
@@ -1294,15 +1294,12 @@
         </w:rPr>
         <w:t xml:space="preserve">CHAPTER 1</w:t>
       </w:r>
-      <w:r>
-        <w:t xml:space="preserve"> </w:t>
-      </w:r>
-      <w:r>
-        <w:t xml:space="preserve">##</w:t>
-      </w:r>
-      <w:r>
-        <w:t xml:space="preserve"> </w:t>
-      </w:r>
+    </w:p>
+    <w:bookmarkStart w:id="23" w:name="mexico-city-the-escape"/>
+    <w:p>
+      <w:pPr>
+        <w:pStyle w:val="Heading2"/>
+      </w:pPr>
       <w:r>
         <w:rPr>
           <w:bCs/>
@@ -1313,7 +1310,7 @@
     </w:p>
     <w:p>
       <w:pPr>
-        <w:pStyle w:val="BodyText"/>
+        <w:pStyle w:val="FirstParagraph"/>
       </w:pPr>
       <w:r>
         <w:rPr>
@@ -2028,15 +2025,13 @@
         </w:rPr>
         <w:t xml:space="preserve">CHAPTER 2</w:t>
       </w:r>
-      <w:r>
-        <w:t xml:space="preserve"> </w:t>
-      </w:r>
-      <w:r>
-        <w:t xml:space="preserve">##</w:t>
-      </w:r>
-      <w:r>
-        <w:t xml:space="preserve"> </w:t>
-      </w:r>
+    </w:p>
+    <w:bookmarkEnd w:id="23"/>
+    <w:bookmarkStart w:id="24" w:name="new-jersey-survival"/>
+    <w:p>
+      <w:pPr>
+        <w:pStyle w:val="Heading2"/>
+      </w:pPr>
       <w:r>
         <w:rPr>
           <w:bCs/>
@@ -2047,7 +2042,7 @@
     </w:p>
     <w:p>
       <w:pPr>
-        <w:pStyle w:val="BodyText"/>
+        <w:pStyle w:val="FirstParagraph"/>
       </w:pPr>
       <w:r>
         <w:rPr>
@@ -2530,15 +2525,13 @@
         </w:rPr>
         <w:t xml:space="preserve">CHAPTER 3</w:t>
       </w:r>
-      <w:r>
-        <w:t xml:space="preserve"> </w:t>
-      </w:r>
-      <w:r>
-        <w:t xml:space="preserve">##</w:t>
-      </w:r>
-      <w:r>
-        <w:t xml:space="preserve"> </w:t>
-      </w:r>
+    </w:p>
+    <w:bookmarkEnd w:id="24"/>
+    <w:bookmarkStart w:id="25" w:name="the-man-who-didnt-have-to"/>
+    <w:p>
+      <w:pPr>
+        <w:pStyle w:val="Heading2"/>
+      </w:pPr>
       <w:r>
         <w:rPr>
           <w:bCs/>
@@ -2549,7 +2542,7 @@
     </w:p>
     <w:p>
       <w:pPr>
-        <w:pStyle w:val="BodyText"/>
+        <w:pStyle w:val="FirstParagraph"/>
       </w:pPr>
       <w:r>
         <w:rPr>
@@ -3038,15 +3031,13 @@
         </w:rPr>
         <w:t xml:space="preserve">CHAPTER 4</w:t>
       </w:r>
-      <w:r>
-        <w:t xml:space="preserve"> </w:t>
-      </w:r>
-      <w:r>
-        <w:t xml:space="preserve">##</w:t>
-      </w:r>
-      <w:r>
-        <w:t xml:space="preserve"> </w:t>
-      </w:r>
+    </w:p>
+    <w:bookmarkEnd w:id="25"/>
+    <w:bookmarkStart w:id="27" w:name="chosen"/>
+    <w:p>
+      <w:pPr>
+        <w:pStyle w:val="Heading2"/>
+      </w:pPr>
       <w:r>
         <w:rPr>
           <w:bCs/>
@@ -3057,7 +3048,7 @@
     </w:p>
     <w:p>
       <w:pPr>
-        <w:pStyle w:val="BodyText"/>
+        <w:pStyle w:val="FirstParagraph"/>
       </w:pPr>
       <w:r>
         <w:rPr>
@@ -3269,7 +3260,7 @@
         <w:t xml:space="preserve">We lived on Woodridge Street, and Domino’s was our pizza. Back then they ran the promise: thirty minutes or it’s free. What they didn’t account for was that Woodridge had both a Woodridge Street and a Woodridge Avenue, and the driver went to the Avenue every single time. He’d turn up at our door late and apologizing, and he’d hand us the pizza and our money back. Free Domino’s, over and over, because a guy couldn’t tell a street from an avenue. Chris and I were sure we’d beaten the system.</w:t>
       </w:r>
     </w:p>
-    <w:bookmarkStart w:id="23" w:name="claudio-and-rob"/>
+    <w:bookmarkStart w:id="26" w:name="claudio-and-rob"/>
     <w:p>
       <w:pPr>
         <w:pStyle w:val="Heading3"/>
@@ -3557,15 +3548,14 @@
         </w:rPr>
         <w:t xml:space="preserve">CHAPTER 5</w:t>
       </w:r>
-      <w:r>
-        <w:t xml:space="preserve"> </w:t>
-      </w:r>
-      <w:r>
-        <w:t xml:space="preserve">##</w:t>
-      </w:r>
-      <w:r>
-        <w:t xml:space="preserve"> </w:t>
-      </w:r>
+    </w:p>
+    <w:bookmarkEnd w:id="26"/>
+    <w:bookmarkEnd w:id="27"/>
+    <w:bookmarkStart w:id="28" w:name="the-man-who-raised-me"/>
+    <w:p>
+      <w:pPr>
+        <w:pStyle w:val="Heading2"/>
+      </w:pPr>
       <w:r>
         <w:rPr>
           <w:bCs/>
@@ -3576,7 +3566,7 @@
     </w:p>
     <w:p>
       <w:pPr>
-        <w:pStyle w:val="BodyText"/>
+        <w:pStyle w:val="FirstParagraph"/>
       </w:pPr>
       <w:r>
         <w:rPr>
@@ -3796,9 +3786,9 @@
         <w:t xml:space="preserve">PART TWO</w:t>
       </w:r>
     </w:p>
-    <w:bookmarkEnd w:id="23"/>
-    <w:bookmarkEnd w:id="24"/>
-    <w:bookmarkStart w:id="34" w:name="the-mat"/>
+    <w:bookmarkEnd w:id="28"/>
+    <w:bookmarkEnd w:id="29"/>
+    <w:bookmarkStart w:id="45" w:name="the-mat"/>
     <w:p>
       <w:pPr>
         <w:pStyle w:val="Heading1"/>
@@ -3834,15 +3824,12 @@
         </w:rPr>
         <w:t xml:space="preserve">CHAPTER 6</w:t>
       </w:r>
-      <w:r>
-        <w:t xml:space="preserve"> </w:t>
-      </w:r>
-      <w:r>
-        <w:t xml:space="preserve">##</w:t>
-      </w:r>
-      <w:r>
-        <w:t xml:space="preserve"> </w:t>
-      </w:r>
+    </w:p>
+    <w:bookmarkStart w:id="32" w:name="the-wrestler"/>
+    <w:p>
+      <w:pPr>
+        <w:pStyle w:val="Heading2"/>
+      </w:pPr>
       <w:r>
         <w:rPr>
           <w:bCs/>
@@ -3853,7 +3840,7 @@
     </w:p>
     <w:p>
       <w:pPr>
-        <w:pStyle w:val="BodyText"/>
+        <w:pStyle w:val="FirstParagraph"/>
       </w:pPr>
       <w:r>
         <w:rPr>
@@ -4135,7 +4122,7 @@
         <w:t xml:space="preserve">The victories came later. Somewhere along the way I had learned that success was how I gained acceptance. If I kept winning, people would value me. If I stopped, I feared they might not.</w:t>
       </w:r>
     </w:p>
-    <w:bookmarkStart w:id="25" w:name="cooperstown"/>
+    <w:bookmarkStart w:id="30" w:name="cooperstown"/>
     <w:p>
       <w:pPr>
         <w:pStyle w:val="Heading3"/>
@@ -4306,8 +4293,8 @@
         <w:t xml:space="preserve">We got back in the car a little before five, and I was asleep before long. When I woke up we were home. Seven hours of driving for a building full of gloves and a ball Babe Ruth once touched. He never said why.</w:t>
       </w:r>
     </w:p>
-    <w:bookmarkEnd w:id="25"/>
-    <w:bookmarkStart w:id="26" w:name="dave-meyer"/>
+    <w:bookmarkEnd w:id="30"/>
+    <w:bookmarkStart w:id="31" w:name="dave-meyer"/>
     <w:p>
       <w:pPr>
         <w:pStyle w:val="Heading3"/>
@@ -4436,15 +4423,14 @@
         </w:rPr>
         <w:t xml:space="preserve">CHAPTER 7</w:t>
       </w:r>
-      <w:r>
-        <w:t xml:space="preserve"> </w:t>
-      </w:r>
-      <w:r>
-        <w:t xml:space="preserve">##</w:t>
-      </w:r>
-      <w:r>
-        <w:t xml:space="preserve"> </w:t>
-      </w:r>
+    </w:p>
+    <w:bookmarkEnd w:id="31"/>
+    <w:bookmarkEnd w:id="32"/>
+    <w:bookmarkStart w:id="39" w:name="what-the-mat-left"/>
+    <w:p>
+      <w:pPr>
+        <w:pStyle w:val="Heading2"/>
+      </w:pPr>
       <w:r>
         <w:rPr>
           <w:bCs/>
@@ -4455,7 +4441,7 @@
     </w:p>
     <w:p>
       <w:pPr>
-        <w:pStyle w:val="BodyText"/>
+        <w:pStyle w:val="FirstParagraph"/>
       </w:pPr>
       <w:r>
         <w:rPr>
@@ -4501,8 +4487,7 @@
         <w:t xml:space="preserve">Ramsey, New Jersey, 1993</w:t>
       </w:r>
     </w:p>
-    <w:bookmarkEnd w:id="26"/>
-    <w:bookmarkStart w:id="27" w:name="sophomore-year-the-turn"/>
+    <w:bookmarkStart w:id="33" w:name="sophomore-year-the-turn"/>
     <w:p>
       <w:pPr>
         <w:pStyle w:val="Heading3"/>
@@ -4539,8 +4524,8 @@
         <w:t xml:space="preserve">I couldn’t take any of it in. The gap between who everyone suddenly said I was and who I knew myself to be was too wide to cross.</w:t>
       </w:r>
     </w:p>
-    <w:bookmarkEnd w:id="27"/>
-    <w:bookmarkStart w:id="28" w:name="junior-year"/>
+    <w:bookmarkEnd w:id="33"/>
+    <w:bookmarkStart w:id="34" w:name="junior-year"/>
     <w:p>
       <w:pPr>
         <w:pStyle w:val="Heading3"/>
@@ -4611,8 +4596,8 @@
         <w:t xml:space="preserve">He knew what it had taken to get there. I nodded.</w:t>
       </w:r>
     </w:p>
-    <w:bookmarkEnd w:id="28"/>
-    <w:bookmarkStart w:id="29" w:name="charlie"/>
+    <w:bookmarkEnd w:id="34"/>
+    <w:bookmarkStart w:id="35" w:name="charlie"/>
     <w:p>
       <w:pPr>
         <w:pStyle w:val="Heading3"/>
@@ -4649,8 +4634,8 @@
         <w:t xml:space="preserve">What stays with me now: my dad was the one who went in. He walked into a room where someone he loved was losing, knowing it might not be enough. He went anyway.</w:t>
       </w:r>
     </w:p>
-    <w:bookmarkEnd w:id="29"/>
-    <w:bookmarkStart w:id="30" w:name="senior-year-county-champion"/>
+    <w:bookmarkEnd w:id="35"/>
+    <w:bookmarkStart w:id="36" w:name="senior-year-county-champion"/>
     <w:p>
       <w:pPr>
         <w:pStyle w:val="Heading3"/>
@@ -4721,8 +4706,8 @@
         <w:t xml:space="preserve">The hazel-eyed baby my mother carried out of Mexico is silver-haired now, a father himself, the light skin and the easy grin still intact. He’s complicated. Smart. Polished and strategic. And still, the first thing anyone says about him is that he’s kind. He’s my best friend. We took different paths and processed the same childhood differently, but there’s nobody I’d rather have call me on Christmas morning, nobody I’d rather have beside me at a graveside. Lou built us both, differently, and never compared us. He showed up for Chris’s records and my county title with the same pride.</w:t>
       </w:r>
     </w:p>
-    <w:bookmarkEnd w:id="30"/>
-    <w:bookmarkStart w:id="31" w:name="the-lesson-and-the-exception"/>
+    <w:bookmarkEnd w:id="36"/>
+    <w:bookmarkStart w:id="37" w:name="the-lesson-and-the-exception"/>
     <w:p>
       <w:pPr>
         <w:pStyle w:val="Heading3"/>
@@ -4795,8 +4780,8 @@
         <w:t xml:space="preserve">No resentment. Just a fact. I didn’t know what to say. I still don’t.</w:t>
       </w:r>
     </w:p>
-    <w:bookmarkEnd w:id="31"/>
-    <w:bookmarkStart w:id="32" w:name="the-marks"/>
+    <w:bookmarkEnd w:id="37"/>
+    <w:bookmarkStart w:id="38" w:name="the-marks"/>
     <w:p>
       <w:pPr>
         <w:pStyle w:val="Heading3"/>
@@ -4828,15 +4813,14 @@
         </w:rPr>
         <w:t xml:space="preserve">CHAPTER 8</w:t>
       </w:r>
-      <w:r>
-        <w:t xml:space="preserve"> </w:t>
-      </w:r>
-      <w:r>
-        <w:t xml:space="preserve">##</w:t>
-      </w:r>
-      <w:r>
-        <w:t xml:space="preserve"> </w:t>
-      </w:r>
+    </w:p>
+    <w:bookmarkEnd w:id="38"/>
+    <w:bookmarkEnd w:id="39"/>
+    <w:bookmarkStart w:id="40" w:name="the-suit"/>
+    <w:p>
+      <w:pPr>
+        <w:pStyle w:val="Heading2"/>
+      </w:pPr>
       <w:r>
         <w:rPr>
           <w:bCs/>
@@ -4847,7 +4831,7 @@
     </w:p>
     <w:p>
       <w:pPr>
-        <w:pStyle w:val="BodyText"/>
+        <w:pStyle w:val="FirstParagraph"/>
       </w:pPr>
       <w:r>
         <w:rPr>
@@ -4984,15 +4968,13 @@
         </w:rPr>
         <w:t xml:space="preserve">CHAPTER 9</w:t>
       </w:r>
-      <w:r>
-        <w:t xml:space="preserve"> </w:t>
-      </w:r>
-      <w:r>
-        <w:t xml:space="preserve">##</w:t>
-      </w:r>
-      <w:r>
-        <w:t xml:space="preserve"> </w:t>
-      </w:r>
+    </w:p>
+    <w:bookmarkEnd w:id="40"/>
+    <w:bookmarkStart w:id="42" w:name="theyll-teach-you"/>
+    <w:p>
+      <w:pPr>
+        <w:pStyle w:val="Heading2"/>
+      </w:pPr>
       <w:r>
         <w:rPr>
           <w:bCs/>
@@ -5003,7 +4985,7 @@
     </w:p>
     <w:p>
       <w:pPr>
-        <w:pStyle w:val="BodyText"/>
+        <w:pStyle w:val="FirstParagraph"/>
       </w:pPr>
       <w:r>
         <w:rPr>
@@ -5267,8 +5249,7 @@
         <w:t xml:space="preserve">My dad didn’t live that life. He lived next to it. Close enough to know the rules, close enough to know when to say something and when to keep his mouth shut. As a kid I just thought my dad knew a lot of interesting people. He did. Some of them were more interesting than a seven-year-old needed to know about.</w:t>
       </w:r>
     </w:p>
-    <w:bookmarkEnd w:id="32"/>
-    <w:bookmarkStart w:id="33" w:name="the-most-interesting-man-in-the-world"/>
+    <w:bookmarkStart w:id="41" w:name="the-most-interesting-man-in-the-world"/>
     <w:p>
       <w:pPr>
         <w:pStyle w:val="Heading3"/>
@@ -5392,15 +5373,14 @@
         </w:rPr>
         <w:t xml:space="preserve">CHAPTER 10</w:t>
       </w:r>
-      <w:r>
-        <w:t xml:space="preserve"> </w:t>
-      </w:r>
-      <w:r>
-        <w:t xml:space="preserve">##</w:t>
-      </w:r>
-      <w:r>
-        <w:t xml:space="preserve"> </w:t>
-      </w:r>
+    </w:p>
+    <w:bookmarkEnd w:id="41"/>
+    <w:bookmarkEnd w:id="42"/>
+    <w:bookmarkStart w:id="43" w:name="oxford"/>
+    <w:p>
+      <w:pPr>
+        <w:pStyle w:val="Heading2"/>
+      </w:pPr>
       <w:r>
         <w:rPr>
           <w:bCs/>
@@ -5411,7 +5391,7 @@
     </w:p>
     <w:p>
       <w:pPr>
-        <w:pStyle w:val="BodyText"/>
+        <w:pStyle w:val="FirstParagraph"/>
       </w:pPr>
       <w:r>
         <w:rPr>
@@ -5757,15 +5737,13 @@
         </w:rPr>
         <w:t xml:space="preserve">CHAPTER 11</w:t>
       </w:r>
-      <w:r>
-        <w:t xml:space="preserve"> </w:t>
-      </w:r>
-      <w:r>
-        <w:t xml:space="preserve">##</w:t>
-      </w:r>
-      <w:r>
-        <w:t xml:space="preserve"> </w:t>
-      </w:r>
+    </w:p>
+    <w:bookmarkEnd w:id="43"/>
+    <w:bookmarkStart w:id="44" w:name="mtv"/>
+    <w:p>
+      <w:pPr>
+        <w:pStyle w:val="Heading2"/>
+      </w:pPr>
       <w:r>
         <w:rPr>
           <w:bCs/>
@@ -5776,7 +5754,7 @@
     </w:p>
     <w:p>
       <w:pPr>
-        <w:pStyle w:val="BodyText"/>
+        <w:pStyle w:val="FirstParagraph"/>
       </w:pPr>
       <w:r>
         <w:rPr>
@@ -5936,9 +5914,9 @@
         <w:t xml:space="preserve">PART THREE</w:t>
       </w:r>
     </w:p>
-    <w:bookmarkEnd w:id="33"/>
-    <w:bookmarkEnd w:id="34"/>
-    <w:bookmarkStart w:id="35" w:name="the-fall"/>
+    <w:bookmarkEnd w:id="44"/>
+    <w:bookmarkEnd w:id="45"/>
+    <w:bookmarkStart w:id="51" w:name="the-fall"/>
     <w:p>
       <w:pPr>
         <w:pStyle w:val="Heading1"/>
@@ -5974,15 +5952,12 @@
         </w:rPr>
         <w:t xml:space="preserve">CHAPTER 12</w:t>
       </w:r>
-      <w:r>
-        <w:t xml:space="preserve"> </w:t>
-      </w:r>
-      <w:r>
-        <w:t xml:space="preserve">##</w:t>
-      </w:r>
-      <w:r>
-        <w:t xml:space="preserve"> </w:t>
-      </w:r>
+    </w:p>
+    <w:bookmarkStart w:id="46" w:name="the-performance-trap"/>
+    <w:p>
+      <w:pPr>
+        <w:pStyle w:val="Heading2"/>
+      </w:pPr>
       <w:r>
         <w:rPr>
           <w:bCs/>
@@ -5993,7 +5968,7 @@
     </w:p>
     <w:p>
       <w:pPr>
-        <w:pStyle w:val="BodyText"/>
+        <w:pStyle w:val="FirstParagraph"/>
       </w:pPr>
       <w:r>
         <w:rPr>
@@ -6544,15 +6519,13 @@
         </w:rPr>
         <w:t xml:space="preserve">CHAPTER 13</w:t>
       </w:r>
-      <w:r>
-        <w:t xml:space="preserve"> </w:t>
-      </w:r>
-      <w:r>
-        <w:t xml:space="preserve">##</w:t>
-      </w:r>
-      <w:r>
-        <w:t xml:space="preserve"> </w:t>
-      </w:r>
+    </w:p>
+    <w:bookmarkEnd w:id="46"/>
+    <w:bookmarkStart w:id="47" w:name="my-brothers-keeper"/>
+    <w:p>
+      <w:pPr>
+        <w:pStyle w:val="Heading2"/>
+      </w:pPr>
       <w:r>
         <w:rPr>
           <w:bCs/>
@@ -6563,7 +6536,7 @@
     </w:p>
     <w:p>
       <w:pPr>
-        <w:pStyle w:val="BodyText"/>
+        <w:pStyle w:val="FirstParagraph"/>
       </w:pPr>
       <w:r>
         <w:rPr>
@@ -6794,15 +6767,13 @@
         </w:rPr>
         <w:t xml:space="preserve">CHAPTER 14</w:t>
       </w:r>
-      <w:r>
-        <w:t xml:space="preserve"> </w:t>
-      </w:r>
-      <w:r>
-        <w:t xml:space="preserve">##</w:t>
-      </w:r>
-      <w:r>
-        <w:t xml:space="preserve"> </w:t>
-      </w:r>
+    </w:p>
+    <w:bookmarkEnd w:id="47"/>
+    <w:bookmarkStart w:id="48" w:name="checking-boxes"/>
+    <w:p>
+      <w:pPr>
+        <w:pStyle w:val="Heading2"/>
+      </w:pPr>
       <w:r>
         <w:rPr>
           <w:bCs/>
@@ -6813,7 +6784,7 @@
     </w:p>
     <w:p>
       <w:pPr>
-        <w:pStyle w:val="BodyText"/>
+        <w:pStyle w:val="FirstParagraph"/>
       </w:pPr>
       <w:r>
         <w:rPr>
@@ -7096,15 +7067,13 @@
         </w:rPr>
         <w:t xml:space="preserve">CHAPTER 15</w:t>
       </w:r>
-      <w:r>
-        <w:t xml:space="preserve"> </w:t>
-      </w:r>
-      <w:r>
-        <w:t xml:space="preserve">##</w:t>
-      </w:r>
-      <w:r>
-        <w:t xml:space="preserve"> </w:t>
-      </w:r>
+    </w:p>
+    <w:bookmarkEnd w:id="48"/>
+    <w:bookmarkStart w:id="49" w:name="west-palm-beach"/>
+    <w:p>
+      <w:pPr>
+        <w:pStyle w:val="Heading2"/>
+      </w:pPr>
       <w:r>
         <w:rPr>
           <w:bCs/>
@@ -7115,7 +7084,7 @@
     </w:p>
     <w:p>
       <w:pPr>
-        <w:pStyle w:val="BodyText"/>
+        <w:pStyle w:val="FirstParagraph"/>
       </w:pPr>
       <w:r>
         <w:rPr>
@@ -7442,15 +7411,13 @@
         </w:rPr>
         <w:t xml:space="preserve">CHAPTER 16</w:t>
       </w:r>
-      <w:r>
-        <w:t xml:space="preserve"> </w:t>
-      </w:r>
-      <w:r>
-        <w:t xml:space="preserve">##</w:t>
-      </w:r>
-      <w:r>
-        <w:t xml:space="preserve"> </w:t>
-      </w:r>
+    </w:p>
+    <w:bookmarkEnd w:id="49"/>
+    <w:bookmarkStart w:id="50" w:name="new-orleans"/>
+    <w:p>
+      <w:pPr>
+        <w:pStyle w:val="Heading2"/>
+      </w:pPr>
       <w:r>
         <w:rPr>
           <w:bCs/>
@@ -7461,7 +7428,7 @@
     </w:p>
     <w:p>
       <w:pPr>
-        <w:pStyle w:val="BodyText"/>
+        <w:pStyle w:val="FirstParagraph"/>
       </w:pPr>
       <w:r>
         <w:rPr>
@@ -7787,8 +7754,9 @@
         <w:t xml:space="preserve">I never saw those pills again. I never asked what he did with them.</w:t>
       </w:r>
     </w:p>
-    <w:bookmarkEnd w:id="35"/>
-    <w:bookmarkStart w:id="36" w:name="the-drives-i"/>
+    <w:bookmarkEnd w:id="50"/>
+    <w:bookmarkEnd w:id="51"/>
+    <w:bookmarkStart w:id="52" w:name="the-drives-i"/>
     <w:p>
       <w:pPr>
         <w:pStyle w:val="Heading1"/>
@@ -7821,8 +7789,8 @@
         <w:t xml:space="preserve">PART FOUR</w:t>
       </w:r>
     </w:p>
-    <w:bookmarkEnd w:id="36"/>
-    <w:bookmarkStart w:id="37" w:name="getting-square"/>
+    <w:bookmarkEnd w:id="52"/>
+    <w:bookmarkStart w:id="61" w:name="getting-square"/>
     <w:p>
       <w:pPr>
         <w:pStyle w:val="Heading1"/>
@@ -7858,15 +7826,12 @@
         </w:rPr>
         <w:t xml:space="preserve">CHAPTER 17</w:t>
       </w:r>
-      <w:r>
-        <w:t xml:space="preserve"> </w:t>
-      </w:r>
-      <w:r>
-        <w:t xml:space="preserve">##</w:t>
-      </w:r>
-      <w:r>
-        <w:t xml:space="preserve"> </w:t>
-      </w:r>
+    </w:p>
+    <w:bookmarkStart w:id="53" w:name="chumuckla"/>
+    <w:p>
+      <w:pPr>
+        <w:pStyle w:val="Heading2"/>
+      </w:pPr>
       <w:r>
         <w:rPr>
           <w:bCs/>
@@ -7877,7 +7842,7 @@
     </w:p>
     <w:p>
       <w:pPr>
-        <w:pStyle w:val="BodyText"/>
+        <w:pStyle w:val="FirstParagraph"/>
       </w:pPr>
       <w:r>
         <w:rPr>
@@ -8108,15 +8073,13 @@
         </w:rPr>
         <w:t xml:space="preserve">CHAPTER 18</w:t>
       </w:r>
-      <w:r>
-        <w:t xml:space="preserve"> </w:t>
-      </w:r>
-      <w:r>
-        <w:t xml:space="preserve">##</w:t>
-      </w:r>
-      <w:r>
-        <w:t xml:space="preserve"> </w:t>
-      </w:r>
+    </w:p>
+    <w:bookmarkEnd w:id="53"/>
+    <w:bookmarkStart w:id="54" w:name="the-quiet-years"/>
+    <w:p>
+      <w:pPr>
+        <w:pStyle w:val="Heading2"/>
+      </w:pPr>
       <w:r>
         <w:rPr>
           <w:bCs/>
@@ -8127,7 +8090,7 @@
     </w:p>
     <w:p>
       <w:pPr>
-        <w:pStyle w:val="BodyText"/>
+        <w:pStyle w:val="FirstParagraph"/>
       </w:pPr>
       <w:r>
         <w:rPr>
@@ -8356,15 +8319,13 @@
         </w:rPr>
         <w:t xml:space="preserve">CHAPTER 19</w:t>
       </w:r>
-      <w:r>
-        <w:t xml:space="preserve"> </w:t>
-      </w:r>
-      <w:r>
-        <w:t xml:space="preserve">##</w:t>
-      </w:r>
-      <w:r>
-        <w:t xml:space="preserve"> </w:t>
-      </w:r>
+    </w:p>
+    <w:bookmarkEnd w:id="54"/>
+    <w:bookmarkStart w:id="55" w:name="X9877b2e3be3cf881ebdefc3d52440e0d3c18046"/>
+    <w:p>
+      <w:pPr>
+        <w:pStyle w:val="Heading2"/>
+      </w:pPr>
       <w:r>
         <w:rPr>
           <w:bCs/>
@@ -8375,7 +8336,7 @@
     </w:p>
     <w:p>
       <w:pPr>
-        <w:pStyle w:val="BodyText"/>
+        <w:pStyle w:val="FirstParagraph"/>
       </w:pPr>
       <w:r>
         <w:rPr>
@@ -8626,15 +8587,13 @@
         </w:rPr>
         <w:t xml:space="preserve">CHAPTER 20</w:t>
       </w:r>
-      <w:r>
-        <w:t xml:space="preserve"> </w:t>
-      </w:r>
-      <w:r>
-        <w:t xml:space="preserve">##</w:t>
-      </w:r>
-      <w:r>
-        <w:t xml:space="preserve"> </w:t>
-      </w:r>
+    </w:p>
+    <w:bookmarkEnd w:id="55"/>
+    <w:bookmarkStart w:id="56" w:name="the-line"/>
+    <w:p>
+      <w:pPr>
+        <w:pStyle w:val="Heading2"/>
+      </w:pPr>
       <w:r>
         <w:rPr>
           <w:bCs/>
@@ -8645,7 +8604,7 @@
     </w:p>
     <w:p>
       <w:pPr>
-        <w:pStyle w:val="BodyText"/>
+        <w:pStyle w:val="FirstParagraph"/>
       </w:pPr>
       <w:r>
         <w:rPr>
@@ -8814,15 +8773,13 @@
         </w:rPr>
         <w:t xml:space="preserve">CHAPTER 21</w:t>
       </w:r>
-      <w:r>
-        <w:t xml:space="preserve"> </w:t>
-      </w:r>
-      <w:r>
-        <w:t xml:space="preserve">##</w:t>
-      </w:r>
-      <w:r>
-        <w:t xml:space="preserve"> </w:t>
-      </w:r>
+    </w:p>
+    <w:bookmarkEnd w:id="56"/>
+    <w:bookmarkStart w:id="57" w:name="they-gave-me-a-chance"/>
+    <w:p>
+      <w:pPr>
+        <w:pStyle w:val="Heading2"/>
+      </w:pPr>
       <w:r>
         <w:rPr>
           <w:bCs/>
@@ -8833,7 +8790,7 @@
     </w:p>
     <w:p>
       <w:pPr>
-        <w:pStyle w:val="BodyText"/>
+        <w:pStyle w:val="FirstParagraph"/>
       </w:pPr>
       <w:r>
         <w:rPr>
@@ -9586,15 +9543,13 @@
         </w:rPr>
         <w:t xml:space="preserve">CHAPTER 22</w:t>
       </w:r>
-      <w:r>
-        <w:t xml:space="preserve"> </w:t>
-      </w:r>
-      <w:r>
-        <w:t xml:space="preserve">##</w:t>
-      </w:r>
-      <w:r>
-        <w:t xml:space="preserve"> </w:t>
-      </w:r>
+    </w:p>
+    <w:bookmarkEnd w:id="57"/>
+    <w:bookmarkStart w:id="58" w:name="making-amends"/>
+    <w:p>
+      <w:pPr>
+        <w:pStyle w:val="Heading2"/>
+      </w:pPr>
       <w:r>
         <w:rPr>
           <w:bCs/>
@@ -9605,7 +9560,7 @@
     </w:p>
     <w:p>
       <w:pPr>
-        <w:pStyle w:val="BodyText"/>
+        <w:pStyle w:val="FirstParagraph"/>
       </w:pPr>
       <w:r>
         <w:rPr>
@@ -9898,15 +9853,13 @@
         </w:rPr>
         <w:t xml:space="preserve">CHAPTER 23</w:t>
       </w:r>
-      <w:r>
-        <w:t xml:space="preserve"> </w:t>
-      </w:r>
-      <w:r>
-        <w:t xml:space="preserve">##</w:t>
-      </w:r>
-      <w:r>
-        <w:t xml:space="preserve"> </w:t>
-      </w:r>
+    </w:p>
+    <w:bookmarkEnd w:id="58"/>
+    <w:bookmarkStart w:id="59" w:name="the-salmon-palace"/>
+    <w:p>
+      <w:pPr>
+        <w:pStyle w:val="Heading2"/>
+      </w:pPr>
       <w:r>
         <w:rPr>
           <w:bCs/>
@@ -9917,7 +9870,7 @@
     </w:p>
     <w:p>
       <w:pPr>
-        <w:pStyle w:val="BodyText"/>
+        <w:pStyle w:val="FirstParagraph"/>
       </w:pPr>
       <w:r>
         <w:rPr>
@@ -10188,15 +10141,13 @@
         </w:rPr>
         <w:t xml:space="preserve">CHAPTER 24</w:t>
       </w:r>
-      <w:r>
-        <w:t xml:space="preserve"> </w:t>
-      </w:r>
-      <w:r>
-        <w:t xml:space="preserve">##</w:t>
-      </w:r>
-      <w:r>
-        <w:t xml:space="preserve"> </w:t>
-      </w:r>
+    </w:p>
+    <w:bookmarkEnd w:id="59"/>
+    <w:bookmarkStart w:id="60" w:name="horacio"/>
+    <w:p>
+      <w:pPr>
+        <w:pStyle w:val="Heading2"/>
+      </w:pPr>
       <w:r>
         <w:rPr>
           <w:bCs/>
@@ -10207,7 +10158,7 @@
     </w:p>
     <w:p>
       <w:pPr>
-        <w:pStyle w:val="BodyText"/>
+        <w:pStyle w:val="FirstParagraph"/>
       </w:pPr>
       <w:r>
         <w:rPr>
@@ -10449,8 +10400,9 @@
         <w:t xml:space="preserve">It took me a long time to understand that all of it, the Wednesday calls at seven from a borrowed line, the birthday calls, even the friend requests to people he had never met, was the love. I understood it. I still couldn’t answer it. It hasn’t stopped him from trying. There was never anyone else to try for. Chris and me. That’s what he has. Do I have closure? I don’t know. It’s complicated, and I’ve stopped needing it not to be. What’s simple is this: I honor Lou. One father kept calling. The other one kept coming.</w:t>
       </w:r>
     </w:p>
-    <w:bookmarkEnd w:id="37"/>
-    <w:bookmarkStart w:id="38" w:name="the-drives-ii"/>
+    <w:bookmarkEnd w:id="60"/>
+    <w:bookmarkEnd w:id="61"/>
+    <w:bookmarkStart w:id="62" w:name="the-drives-ii"/>
     <w:p>
       <w:pPr>
         <w:pStyle w:val="Heading1"/>
@@ -10483,8 +10435,8 @@
         <w:t xml:space="preserve">PART FIVE</w:t>
       </w:r>
     </w:p>
-    <w:bookmarkEnd w:id="38"/>
-    <w:bookmarkStart w:id="46" w:name="hope"/>
+    <w:bookmarkEnd w:id="62"/>
+    <w:bookmarkStart w:id="74" w:name="hope"/>
     <w:p>
       <w:pPr>
         <w:pStyle w:val="Heading1"/>
@@ -10520,15 +10472,12 @@
         </w:rPr>
         <w:t xml:space="preserve">CHAPTER 25</w:t>
       </w:r>
-      <w:r>
-        <w:t xml:space="preserve"> </w:t>
-      </w:r>
-      <w:r>
-        <w:t xml:space="preserve">##</w:t>
-      </w:r>
-      <w:r>
-        <w:t xml:space="preserve"> </w:t>
-      </w:r>
+    </w:p>
+    <w:bookmarkStart w:id="63" w:name="sobriety-meets-hospice"/>
+    <w:p>
+      <w:pPr>
+        <w:pStyle w:val="Heading2"/>
+      </w:pPr>
       <w:r>
         <w:rPr>
           <w:bCs/>
@@ -10539,7 +10488,7 @@
     </w:p>
     <w:p>
       <w:pPr>
-        <w:pStyle w:val="BodyText"/>
+        <w:pStyle w:val="FirstParagraph"/>
       </w:pPr>
       <w:r>
         <w:rPr>
@@ -10960,15 +10909,13 @@
         </w:rPr>
         <w:t xml:space="preserve">CHAPTER 26</w:t>
       </w:r>
-      <w:r>
-        <w:t xml:space="preserve"> </w:t>
-      </w:r>
-      <w:r>
-        <w:t xml:space="preserve">##</w:t>
-      </w:r>
-      <w:r>
-        <w:t xml:space="preserve"> </w:t>
-      </w:r>
+    </w:p>
+    <w:bookmarkEnd w:id="63"/>
+    <w:bookmarkStart w:id="68" w:name="hope-for-rob"/>
+    <w:p>
+      <w:pPr>
+        <w:pStyle w:val="Heading2"/>
+      </w:pPr>
       <w:r>
         <w:rPr>
           <w:bCs/>
@@ -10979,7 +10926,7 @@
     </w:p>
     <w:p>
       <w:pPr>
-        <w:pStyle w:val="BodyText"/>
+        <w:pStyle w:val="FirstParagraph"/>
       </w:pPr>
       <w:r>
         <w:rPr>
@@ -11277,7 +11224,7 @@
         <w:t xml:space="preserve">People say those words. I could feel that she meant them, all the way down. My father spent a lifetime proving that sentence without ever needing to say it. Hearing it said to me, and believing it, was the moment I knew I would marry her.</w:t>
       </w:r>
     </w:p>
-    <w:bookmarkStart w:id="39" w:name="are-you-saved"/>
+    <w:bookmarkStart w:id="64" w:name="are-you-saved"/>
     <w:p>
       <w:pPr>
         <w:pStyle w:val="Heading3"/>
@@ -11532,8 +11479,8 @@
         <w:t xml:space="preserve">Outside my own father, Jeff is one of two men who have shown me what faith looks like when it’s lived instead of just spoken. The other is Dave Meyer, my friend since middle school. Different men, same spine. I’ve needed them both as proof that the thing I reached for in a muddy field in Chumuckla holds up across a whole life.</w:t>
       </w:r>
     </w:p>
-    <w:bookmarkEnd w:id="39"/>
-    <w:bookmarkStart w:id="40" w:name="blessings"/>
+    <w:bookmarkEnd w:id="64"/>
+    <w:bookmarkStart w:id="65" w:name="blessings"/>
     <w:p>
       <w:pPr>
         <w:pStyle w:val="Heading3"/>
@@ -11670,8 +11617,8 @@
         <w:t xml:space="preserve">”</w:t>
       </w:r>
     </w:p>
-    <w:bookmarkEnd w:id="40"/>
-    <w:bookmarkStart w:id="41" w:name="the-proposal"/>
+    <w:bookmarkEnd w:id="65"/>
+    <w:bookmarkStart w:id="66" w:name="the-proposal"/>
     <w:p>
       <w:pPr>
         <w:pStyle w:val="Heading3"/>
@@ -11728,8 +11675,8 @@
         <w:t xml:space="preserve">So I got on a knee, awkwardly, and asked her to marry me. Hope said yes, and the nerves went out of me all at once. I could finally enjoy the rest of my meal. Right after, we got a Chihuahua together, a little one named Nola. She’s eight now. That dog’s been with us through everything.</w:t>
       </w:r>
     </w:p>
-    <w:bookmarkEnd w:id="41"/>
-    <w:bookmarkStart w:id="42" w:name="the-wedding"/>
+    <w:bookmarkEnd w:id="66"/>
+    <w:bookmarkStart w:id="67" w:name="the-wedding"/>
     <w:p>
       <w:pPr>
         <w:pStyle w:val="Heading3"/>
@@ -11861,15 +11808,14 @@
         </w:rPr>
         <w:t xml:space="preserve">CHAPTER 27</w:t>
       </w:r>
-      <w:r>
-        <w:t xml:space="preserve"> </w:t>
-      </w:r>
-      <w:r>
-        <w:t xml:space="preserve">##</w:t>
-      </w:r>
-      <w:r>
-        <w:t xml:space="preserve"> </w:t>
-      </w:r>
+    </w:p>
+    <w:bookmarkEnd w:id="67"/>
+    <w:bookmarkEnd w:id="68"/>
+    <w:bookmarkStart w:id="72" w:name="what-we-built"/>
+    <w:p>
+      <w:pPr>
+        <w:pStyle w:val="Heading2"/>
+      </w:pPr>
       <w:r>
         <w:rPr>
           <w:bCs/>
@@ -11880,7 +11826,7 @@
     </w:p>
     <w:p>
       <w:pPr>
-        <w:pStyle w:val="BodyText"/>
+        <w:pStyle w:val="FirstParagraph"/>
       </w:pPr>
       <w:r>
         <w:rPr>
@@ -12122,8 +12068,7 @@
         <w:t xml:space="preserve">It came out with a little heat, and the heat wasn’t aimed at us — with Lou it rarely was. A man who tipped twenty dollars on principle was never going to love a budget.</w:t>
       </w:r>
     </w:p>
-    <w:bookmarkEnd w:id="42"/>
-    <w:bookmarkStart w:id="43" w:name="who-she-is"/>
+    <w:bookmarkStart w:id="69" w:name="who-she-is"/>
     <w:p>
       <w:pPr>
         <w:pStyle w:val="Heading3"/>
@@ -12424,8 +12369,8 @@
         <w:t xml:space="preserve">The first three years we laughed all the time, the real kind that takes her all the way over and pulls the whole room in with her. Then the heavy years came, the ones the last part of this book is about, and the laughing got rare without either of us deciding it should. It’s coming back, a little more each month. We are safe with each other, and because we’re safe we are sometimes harder on each other than we should be. That’s the cost of letting your guard all the way down with the one person you’re sure won’t leave.</w:t>
       </w:r>
     </w:p>
-    <w:bookmarkEnd w:id="43"/>
-    <w:bookmarkStart w:id="44" w:name="the-hundred-thousand"/>
+    <w:bookmarkEnd w:id="69"/>
+    <w:bookmarkStart w:id="70" w:name="the-hundred-thousand"/>
     <w:p>
       <w:pPr>
         <w:pStyle w:val="Heading3"/>
@@ -12446,8 +12391,8 @@
         <w:t xml:space="preserve">In a short time we worked like a team. We paid off over a hundred thousand dollars in student loans and built a life with margin in it instead of debt, a home, a little security I’d never had back when I looked successful. We moved to Raleigh. We never had children, and we never planned to. What we built was the two of us, and a life with room in it for other people. These days that includes Hope’s mother. Rhonda lives under our roof now, which is not a sentence anyone says lightly, and getting to know her and love her has been one of the quiet gifts of this stretch. She hasn’t had the easiest life. What I didn’t see coming was watching Hope and her mom grow close, slowly, over years, until Hope started calling Rhonda her best friend.</w:t>
       </w:r>
     </w:p>
-    <w:bookmarkEnd w:id="44"/>
-    <w:bookmarkStart w:id="45" w:name="the-pictures-never-tell-the-whole-story"/>
+    <w:bookmarkEnd w:id="70"/>
+    <w:bookmarkStart w:id="71" w:name="the-pictures-never-tell-the-whole-story"/>
     <w:p>
       <w:pPr>
         <w:pStyle w:val="Heading3"/>
@@ -12577,15 +12522,14 @@
         </w:rPr>
         <w:t xml:space="preserve">CHAPTER 28</w:t>
       </w:r>
-      <w:r>
-        <w:t xml:space="preserve"> </w:t>
-      </w:r>
-      <w:r>
-        <w:t xml:space="preserve">##</w:t>
-      </w:r>
-      <w:r>
-        <w:t xml:space="preserve"> </w:t>
-      </w:r>
+    </w:p>
+    <w:bookmarkEnd w:id="71"/>
+    <w:bookmarkEnd w:id="72"/>
+    <w:bookmarkStart w:id="73" w:name="wonderwoman"/>
+    <w:p>
+      <w:pPr>
+        <w:pStyle w:val="Heading2"/>
+      </w:pPr>
       <w:r>
         <w:rPr>
           <w:bCs/>
@@ -12596,7 +12540,7 @@
     </w:p>
     <w:p>
       <w:pPr>
-        <w:pStyle w:val="BodyText"/>
+        <w:pStyle w:val="FirstParagraph"/>
       </w:pPr>
       <w:r>
         <w:rPr>
@@ -12848,9 +12792,9 @@
         <w:t xml:space="preserve">PART SIX</w:t>
       </w:r>
     </w:p>
-    <w:bookmarkEnd w:id="45"/>
-    <w:bookmarkEnd w:id="46"/>
-    <w:bookmarkStart w:id="53" w:name="the-last-chapter"/>
+    <w:bookmarkEnd w:id="73"/>
+    <w:bookmarkEnd w:id="74"/>
+    <w:bookmarkStart w:id="82" w:name="the-last-chapter"/>
     <w:p>
       <w:pPr>
         <w:pStyle w:val="Heading1"/>
@@ -12886,15 +12830,12 @@
         </w:rPr>
         <w:t xml:space="preserve">CHAPTER 29</w:t>
       </w:r>
-      <w:r>
-        <w:t xml:space="preserve"> </w:t>
-      </w:r>
-      <w:r>
-        <w:t xml:space="preserve">##</w:t>
-      </w:r>
-      <w:r>
-        <w:t xml:space="preserve"> </w:t>
-      </w:r>
+    </w:p>
+    <w:bookmarkStart w:id="81" w:name="the-detour"/>
+    <w:p>
+      <w:pPr>
+        <w:pStyle w:val="Heading2"/>
+      </w:pPr>
       <w:r>
         <w:rPr>
           <w:bCs/>
@@ -12905,7 +12846,7 @@
     </w:p>
     <w:p>
       <w:pPr>
-        <w:pStyle w:val="BodyText"/>
+        <w:pStyle w:val="FirstParagraph"/>
       </w:pPr>
       <w:r>
         <w:rPr>
@@ -13025,7 +12966,7 @@
         <w:t xml:space="preserve">So I interviewed, and I got the job. It was hard to leave. Ten years. Brenda Jahn, my manager there, had been amazing. But I saw it as a chance to learn. When I started at Novo Nordisk I didn’t know the difference between type 1 and type 2 diabetes. Through the training and the home study I got good at it.</w:t>
       </w:r>
     </w:p>
-    <w:bookmarkStart w:id="47" w:name="diabetes-dave"/>
+    <w:bookmarkStart w:id="75" w:name="diabetes-dave"/>
     <w:p>
       <w:pPr>
         <w:pStyle w:val="Heading3"/>
@@ -13086,8 +13027,8 @@
         <w:t xml:space="preserve">I didn’t know then what Christmas would take from me two years later, or what would land on my driver’s side mirror two weeks after that. But when it came, I would recognize it. Dave had taught me the language.</w:t>
       </w:r>
     </w:p>
-    <w:bookmarkEnd w:id="47"/>
-    <w:bookmarkStart w:id="48" w:name="the-right-place"/>
+    <w:bookmarkEnd w:id="75"/>
+    <w:bookmarkStart w:id="76" w:name="the-right-place"/>
     <w:p>
       <w:pPr>
         <w:pStyle w:val="Heading3"/>
@@ -13250,8 +13191,8 @@
         <w:t xml:space="preserve">which meant the evening was over, and he walked me to the door, which he did every time, and stood in it while I backed out, which he did every time. I drove home. I can’t tell you a single thing that was said that mattered, and there were two hundred more like it.</w:t>
       </w:r>
     </w:p>
-    <w:bookmarkEnd w:id="48"/>
-    <w:bookmarkStart w:id="49" w:name="dont-go-dying-on-me"/>
+    <w:bookmarkEnd w:id="76"/>
+    <w:bookmarkStart w:id="77" w:name="dont-go-dying-on-me"/>
     <w:p>
       <w:pPr>
         <w:pStyle w:val="Heading3"/>
@@ -13362,8 +13303,8 @@
         <w:t xml:space="preserve">Lisa and I talked. We knew he had to do something. Chris was the one who got through to him, researched, found a surgeon in Birmingham using connections from a previous job, got him an appointment. The surgeon looked at him and said, stage 4, your age, no surgeon is going to operate on you. We were distraught. Surgery had worked the first time; we thought it was the answer again. Immunotherapy came up, usually not as hard on the body as chemo or radiation, we were told. Lou agreed to try. He was choosing to try, for us, not for himself.</w:t>
       </w:r>
     </w:p>
-    <w:bookmarkEnd w:id="49"/>
-    <w:bookmarkStart w:id="50" w:name="the-treatment"/>
+    <w:bookmarkEnd w:id="77"/>
+    <w:bookmarkStart w:id="78" w:name="the-treatment"/>
     <w:p>
       <w:pPr>
         <w:pStyle w:val="Heading3"/>
@@ -13384,8 +13325,8 @@
         <w:t xml:space="preserve">The immunotherapy started in summer 2024. At first, impossibly, it worked. The tumor in his lung nearly dissolved. The oncologist used the word encouraging. Then the side effects came, rashes all over his body. Lou never complained. His heart rate and blood pressure started going off and he ended up in the hospital. I was there when they put the pacemaker in. He was upbeat about it, ready to keep fighting. A pacemaker at eighty-three and he came out looking for the next round. He did a second round of immunotherapy, then a third, trying to clear the lymph nodes. The third round was what finally took a toll. He got weak. By mid-2025 the phone calls had changed, and he stopped asking about my work, not because he didn’t care but because asking took focus that was going to the basic maintenance of existing. And in July 2025, a year and a half into the fight, he was there when Chris and Nisha’s daughter, Priya, was born. He held her.</w:t>
       </w:r>
     </w:p>
-    <w:bookmarkEnd w:id="50"/>
-    <w:bookmarkStart w:id="51" w:name="he-wouldnt-say-pain"/>
+    <w:bookmarkEnd w:id="78"/>
+    <w:bookmarkStart w:id="79" w:name="he-wouldnt-say-pain"/>
     <w:p>
       <w:pPr>
         <w:pStyle w:val="Heading3"/>
@@ -13518,8 +13459,8 @@
         <w:t xml:space="preserve">Hope had been a pharmacist for eight years. Raleigh made sense: jobs, community, a church that felt like ours. Hope never wavered. She sees clearly, asks hard questions, and believes God has a plan for us to be of service.</w:t>
       </w:r>
     </w:p>
-    <w:bookmarkEnd w:id="51"/>
-    <w:bookmarkStart w:id="52" w:name="the-in-between"/>
+    <w:bookmarkEnd w:id="79"/>
+    <w:bookmarkStart w:id="80" w:name="the-in-between"/>
     <w:p>
       <w:pPr>
         <w:pStyle w:val="Heading3"/>
@@ -13564,9 +13505,10 @@
         <w:t xml:space="preserve">Hospice brought me back to the rooms I’d been thinking about since the home health years. It pulled me out of that in-between place.</w:t>
       </w:r>
     </w:p>
-    <w:bookmarkEnd w:id="52"/>
-    <w:bookmarkEnd w:id="53"/>
-    <w:bookmarkStart w:id="57" w:name="the-drives-iii"/>
+    <w:bookmarkEnd w:id="80"/>
+    <w:bookmarkEnd w:id="81"/>
+    <w:bookmarkEnd w:id="82"/>
+    <w:bookmarkStart w:id="88" w:name="the-drives-iii"/>
     <w:p>
       <w:pPr>
         <w:pStyle w:val="Heading1"/>
@@ -13602,15 +13544,12 @@
         </w:rPr>
         <w:t xml:space="preserve">CHAPTER 30</w:t>
       </w:r>
-      <w:r>
-        <w:t xml:space="preserve"> </w:t>
-      </w:r>
-      <w:r>
-        <w:t xml:space="preserve">##</w:t>
-      </w:r>
-      <w:r>
-        <w:t xml:space="preserve"> </w:t>
-      </w:r>
+    </w:p>
+    <w:bookmarkStart w:id="84" w:name="five-weeks"/>
+    <w:p>
+      <w:pPr>
+        <w:pStyle w:val="Heading2"/>
+      </w:pPr>
       <w:r>
         <w:rPr>
           <w:bCs/>
@@ -13621,7 +13560,7 @@
     </w:p>
     <w:p>
       <w:pPr>
-        <w:pStyle w:val="BodyText"/>
+        <w:pStyle w:val="FirstParagraph"/>
       </w:pPr>
       <w:r>
         <w:rPr>
@@ -13755,7 +13694,7 @@
         <w:t xml:space="preserve">When the hospice job came, it felt like a door had finally opened. Five weeks after I started, my father started to die.</w:t>
       </w:r>
     </w:p>
-    <w:bookmarkStart w:id="54" w:name="strangers-rooms"/>
+    <w:bookmarkStart w:id="83" w:name="strangers-rooms"/>
     <w:p>
       <w:pPr>
         <w:pStyle w:val="Heading3"/>
@@ -13903,15 +13842,14 @@
         </w:rPr>
         <w:t xml:space="preserve">CHAPTER 31</w:t>
       </w:r>
-      <w:r>
-        <w:t xml:space="preserve"> </w:t>
-      </w:r>
-      <w:r>
-        <w:t xml:space="preserve">##</w:t>
-      </w:r>
-      <w:r>
-        <w:t xml:space="preserve"> </w:t>
-      </w:r>
+    </w:p>
+    <w:bookmarkEnd w:id="83"/>
+    <w:bookmarkEnd w:id="84"/>
+    <w:bookmarkStart w:id="87" w:name="the-days-after"/>
+    <w:p>
+      <w:pPr>
+        <w:pStyle w:val="Heading2"/>
+      </w:pPr>
       <w:r>
         <w:rPr>
           <w:bCs/>
@@ -13922,7 +13860,7 @@
     </w:p>
     <w:p>
       <w:pPr>
-        <w:pStyle w:val="BodyText"/>
+        <w:pStyle w:val="FirstParagraph"/>
       </w:pPr>
       <w:r>
         <w:rPr>
@@ -14460,8 +14398,7 @@
         <w:t xml:space="preserve">We drove home the way we had come, still talking about him — the truck that said Jersey in a Florida parking lot, all of it. The grief rode with us. It rides with me still. I’ve stopped wishing it away. It’s the weight of having been loved like that, and I’d rather carry it than have nothing to carry.</w:t>
       </w:r>
     </w:p>
-    <w:bookmarkEnd w:id="54"/>
-    <w:bookmarkStart w:id="55" w:name="the-conversation-i-never-had"/>
+    <w:bookmarkStart w:id="85" w:name="the-conversation-i-never-had"/>
     <w:p>
       <w:pPr>
         <w:pStyle w:val="Heading3"/>
@@ -14524,8 +14461,8 @@
         <w:t xml:space="preserve">I sit with families for a living and hand them the questions I never handed him. Ask now, I tell them. This is the right day. I believe every word of it, and I also know what it is to stand outside a door a man has decided to keep shut, and to love him enough to leave it that way. I spent my life being saved by my father. At the end, I had to learn that loving him didn’t mean saving him back.</w:t>
       </w:r>
     </w:p>
-    <w:bookmarkEnd w:id="55"/>
-    <w:bookmarkStart w:id="56" w:name="who-stays.-who-goes."/>
+    <w:bookmarkEnd w:id="85"/>
+    <w:bookmarkStart w:id="86" w:name="who-stays.-who-goes."/>
     <w:p>
       <w:pPr>
         <w:pStyle w:val="Heading3"/>
@@ -14614,9 +14551,10 @@
         <w:t xml:space="preserve">In January we went through his things. His gray suit was hanging on the right side of the closet, between two work shirts. Always be the best-dressed person in the room. I pulled it off the rack and held it up, and I couldn’t put it back. I took it home in a garment bag with no plan. It hangs in my closet now, next to mine. It isn’t my size and it isn’t my style and I will never wear it. But some mornings I open the closet door and it’s there, and I know what it is, and I know who wore it, and I leave it alone. I tell families sometimes, when they’re clearing out a closet of their own: keep one thing. You’ll know which one. It will tell you.</w:t>
       </w:r>
     </w:p>
-    <w:bookmarkEnd w:id="56"/>
-    <w:bookmarkEnd w:id="57"/>
-    <w:bookmarkStart w:id="60" w:name="the-drives-iv"/>
+    <w:bookmarkEnd w:id="86"/>
+    <w:bookmarkEnd w:id="87"/>
+    <w:bookmarkEnd w:id="88"/>
+    <w:bookmarkStart w:id="94" w:name="the-drives-iv"/>
     <w:p>
       <w:pPr>
         <w:pStyle w:val="Heading1"/>
@@ -14652,15 +14590,12 @@
         </w:rPr>
         <w:t xml:space="preserve">CHAPTER 32</w:t>
       </w:r>
-      <w:r>
-        <w:t xml:space="preserve"> </w:t>
-      </w:r>
-      <w:r>
-        <w:t xml:space="preserve">##</w:t>
-      </w:r>
-      <w:r>
-        <w:t xml:space="preserve"> </w:t>
-      </w:r>
+    </w:p>
+    <w:bookmarkStart w:id="89" w:name="the-first-honest-mile"/>
+    <w:p>
+      <w:pPr>
+        <w:pStyle w:val="Heading2"/>
+      </w:pPr>
       <w:r>
         <w:rPr>
           <w:bCs/>
@@ -14671,7 +14606,7 @@
     </w:p>
     <w:p>
       <w:pPr>
-        <w:pStyle w:val="BodyText"/>
+        <w:pStyle w:val="FirstParagraph"/>
       </w:pPr>
       <w:r>
         <w:rPr>
@@ -14794,15 +14729,13 @@
         </w:rPr>
         <w:t xml:space="preserve">CHAPTER 33</w:t>
       </w:r>
-      <w:r>
-        <w:t xml:space="preserve"> </w:t>
-      </w:r>
-      <w:r>
-        <w:t xml:space="preserve">##</w:t>
-      </w:r>
-      <w:r>
-        <w:t xml:space="preserve"> </w:t>
-      </w:r>
+    </w:p>
+    <w:bookmarkEnd w:id="89"/>
+    <w:bookmarkStart w:id="90" w:name="what-grief-taught-the-job"/>
+    <w:p>
+      <w:pPr>
+        <w:pStyle w:val="Heading2"/>
+      </w:pPr>
       <w:r>
         <w:rPr>
           <w:bCs/>
@@ -14813,7 +14746,7 @@
     </w:p>
     <w:p>
       <w:pPr>
-        <w:pStyle w:val="BodyText"/>
+        <w:pStyle w:val="FirstParagraph"/>
       </w:pPr>
       <w:r>
         <w:rPr>
@@ -14958,15 +14891,13 @@
         </w:rPr>
         <w:t xml:space="preserve">CHAPTER 34</w:t>
       </w:r>
-      <w:r>
-        <w:t xml:space="preserve"> </w:t>
-      </w:r>
-      <w:r>
-        <w:t xml:space="preserve">##</w:t>
-      </w:r>
-      <w:r>
-        <w:t xml:space="preserve"> </w:t>
-      </w:r>
+    </w:p>
+    <w:bookmarkEnd w:id="90"/>
+    <w:bookmarkStart w:id="93" w:name="the-table"/>
+    <w:p>
+      <w:pPr>
+        <w:pStyle w:val="Heading2"/>
+      </w:pPr>
       <w:r>
         <w:rPr>
           <w:bCs/>
@@ -14977,7 +14908,7 @@
     </w:p>
     <w:p>
       <w:pPr>
-        <w:pStyle w:val="BodyText"/>
+        <w:pStyle w:val="FirstParagraph"/>
       </w:pPr>
       <w:r>
         <w:rPr>
@@ -15055,7 +14986,7 @@
         <w:t xml:space="preserve">Two people at a round table, one of them grieving and the other choosing to stay in the room for it. We hugged. I gave her a kiss on the cheek. From that day on I’ve looked forward to the days I get to see Linda. For the person, not the place. The other staff joke about it, oh, you always come in and kiss Linda on the cheek. They don’t know the background, don’t know what was shared at that table the Wednesday after we buried my father. That’s fine. Not every connection needs an audience. As a rep, I’m the one who’s supposed to bring the chocolate and the goodies. When I go see Linda, I’m the one who feels taken care of. She gives me cookies. She checks in. The relationship runs backwards from the job description.</w:t>
       </w:r>
     </w:p>
-    <w:bookmarkStart w:id="58" w:name="lisas-table"/>
+    <w:bookmarkStart w:id="91" w:name="lisas-table"/>
     <w:p>
       <w:pPr>
         <w:pStyle w:val="Heading3"/>
@@ -15132,8 +15063,8 @@
         <w:t xml:space="preserve">I think about a night long ago when she cooked meatloaf for two boys who didn’t make it easy. She’s still standing at the counter. Still opening the door. The last time I was there for Thanksgiving, my father was still alive. I stood in her kitchen a minute before we sat down. I didn’t say anything. I just watched. We sat down. Someone said grace. The food was passed. And for a few hours everything had a center. Lisa made sure of that.</w:t>
       </w:r>
     </w:p>
-    <w:bookmarkEnd w:id="58"/>
-    <w:bookmarkStart w:id="59" w:name="the-floor"/>
+    <w:bookmarkEnd w:id="91"/>
+    <w:bookmarkStart w:id="92" w:name="the-floor"/>
     <w:p>
       <w:pPr>
         <w:pStyle w:val="Heading3"/>
@@ -15154,9 +15085,10 @@
         <w:t xml:space="preserve">Almost every morning for fifteen years, my phone has rung early and it’s Mager, or I’ve called him first, and we pray. A few plain sentences to start the day pointed the right way. Nothing eloquent. Two sober men on a phone line, saying thank you, asking for help, hanging up, going to work. People ask me where God was in all of it, and the honest answer is that He was never the one who left. I was. I still can’t explain God on paper, and I’ve stopped trying. What I can tell you is that every time I hit the bottom of myself, something I had not put there was holding the floor. Today my faith doesn’t look like certainty. It looks like that morning call. Walking into a dying stranger’s room with nothing useful in my hands and trusting that presence is its own kind of prayer. I stopped needing the theology airtight. I just needed to stay in the room, and to let myself be shown up for. That, as much as anything, is what got me here.</w:t>
       </w:r>
     </w:p>
-    <w:bookmarkEnd w:id="59"/>
-    <w:bookmarkEnd w:id="60"/>
-    <w:bookmarkStart w:id="61" w:name="epilogue-the-cardinals-promise"/>
+    <w:bookmarkEnd w:id="92"/>
+    <w:bookmarkEnd w:id="93"/>
+    <w:bookmarkEnd w:id="94"/>
+    <w:bookmarkStart w:id="95" w:name="epilogue-the-cardinals-promise"/>
     <w:p>
       <w:pPr>
         <w:pStyle w:val="Heading1"/>
@@ -15321,8 +15253,8 @@
         <w:t xml:space="preserve">It has never landed on my car again.</w:t>
       </w:r>
     </w:p>
-    <w:bookmarkEnd w:id="61"/>
-    <w:bookmarkStart w:id="62" w:name="the-rooms"/>
+    <w:bookmarkEnd w:id="95"/>
+    <w:bookmarkStart w:id="96" w:name="the-rooms"/>
     <w:p>
       <w:pPr>
         <w:pStyle w:val="Heading1"/>
@@ -15435,8 +15367,8 @@
         <w:t xml:space="preserve">Rest easy, Cardascia. We’ll keep the seat warm and the coffee bad.</w:t>
       </w:r>
     </w:p>
-    <w:bookmarkEnd w:id="62"/>
-    <w:bookmarkStart w:id="63" w:name="authors-note"/>
+    <w:bookmarkEnd w:id="96"/>
+    <w:bookmarkStart w:id="97" w:name="authors-note"/>
     <w:p>
       <w:pPr>
         <w:pStyle w:val="Heading1"/>
@@ -15473,8 +15405,8 @@
         <w:t xml:space="preserve">This is a true story, told from memory. Dialogue has been reconstructed as faithfully as memory allows; it keeps the substance of what was said, if not always the exact words. Some names and identifying details have been changed to protect privacy, above all those of the patients and families I served in home health and hospice, whose hardest days deserve protection, not exposure. Where the sober men and women of the rooms appear by their real names, it is with their permission; others have been renamed. A few of the rooms I describe from my work are composites of many rooms, for the same reason. Some events have been changed, and a few scenes, the ones I could not bring myself to remember whole, have been reconstructed from what I know to be true of the people in them. Where I did that, I did it to tell the truth of what happened, not to improve on it. My mother, who is all over this book, checked more of these memories than anyone. Whatever I still got wrong is mine.</w:t>
       </w:r>
     </w:p>
-    <w:bookmarkEnd w:id="63"/>
-    <w:bookmarkStart w:id="64" w:name="acknowledgments"/>
+    <w:bookmarkEnd w:id="97"/>
+    <w:bookmarkStart w:id="98" w:name="acknowledgments"/>
     <w:p>
       <w:pPr>
         <w:pStyle w:val="Heading1"/>
@@ -15601,8 +15533,8 @@
         <w:t xml:space="preserve">And Dad. I kept the promise.</w:t>
       </w:r>
     </w:p>
-    <w:bookmarkEnd w:id="64"/>
-    <w:bookmarkStart w:id="65" w:name="a-note-to-the-one-who-loves-an-addict"/>
+    <w:bookmarkEnd w:id="98"/>
+    <w:bookmarkStart w:id="99" w:name="a-note-to-the-one-who-loves-an-addict"/>
     <w:p>
       <w:pPr>
         <w:pStyle w:val="Heading1"/>
@@ -15663,8 +15595,8 @@
         <w:t xml:space="preserve">What you can do is stay. Not fix, not control, not cure. Stay. Set the boundary that keeps you whole, leave the door open a crack, and be there in the ways that don’t cost you your own life. If you are not safe, the boundary is distance — my mother saved two boys by leaving.</w:t>
       </w:r>
     </w:p>
-    <w:bookmarkEnd w:id="65"/>
-    <w:bookmarkStart w:id="66" w:name="lous-way"/>
+    <w:bookmarkEnd w:id="99"/>
+    <w:bookmarkStart w:id="100" w:name="lous-way"/>
     <w:p>
       <w:pPr>
         <w:pStyle w:val="Heading1"/>
@@ -15749,8 +15681,8 @@
         <w:t xml:space="preserve">He stayed.</w:t>
       </w:r>
     </w:p>
-    <w:bookmarkEnd w:id="66"/>
-    <w:bookmarkStart w:id="67" w:name="a-readers-guide"/>
+    <w:bookmarkEnd w:id="100"/>
+    <w:bookmarkStart w:id="101" w:name="a-readers-guide"/>
     <w:p>
       <w:pPr>
         <w:pStyle w:val="Heading1"/>
@@ -16086,8 +16018,8 @@
         <w:t xml:space="preserve">Who would you call — and when?</w:t>
       </w:r>
     </w:p>
-    <w:bookmarkEnd w:id="67"/>
-    <w:bookmarkStart w:id="72" w:name="resources"/>
+    <w:bookmarkEnd w:id="101"/>
+    <w:bookmarkStart w:id="106" w:name="resources"/>
     <w:p>
       <w:pPr>
         <w:pStyle w:val="Heading1"/>
@@ -16116,7 +16048,7 @@
         <w:t xml:space="preserve">988 Suicide &amp; Crisis Lifeline. Call or text 988. Twenty-four hours a day, free and confidential. For anyone reading this in a dark place — the addiction pages, the grief pages, any of it.</w:t>
       </w:r>
     </w:p>
-    <w:bookmarkStart w:id="68" w:name="Xce803ff55fdb1e3bbbead8a1b74abb7090248b3"/>
+    <w:bookmarkStart w:id="102" w:name="Xce803ff55fdb1e3bbbead8a1b74abb7090248b3"/>
     <w:p>
       <w:pPr>
         <w:pStyle w:val="Heading3"/>
@@ -16153,8 +16085,8 @@
         <w:t xml:space="preserve">Al-Anon Family Groups. al-anon.org. For the families and friends of alcoholics. If you love someone who drinks, this one is for you, whether or not they ever get help themselves.</w:t>
       </w:r>
     </w:p>
-    <w:bookmarkEnd w:id="68"/>
-    <w:bookmarkStart w:id="69" w:name="X8df9206620c0de36db74bea783091dd4c0ba532"/>
+    <w:bookmarkEnd w:id="102"/>
+    <w:bookmarkStart w:id="103" w:name="X8df9206620c0de36db74bea783091dd4c0ba532"/>
     <w:p>
       <w:pPr>
         <w:pStyle w:val="Heading3"/>
@@ -16207,8 +16139,8 @@
         <w:t xml:space="preserve">Medicare Care Compare. medicare.gov/care-compare. Compare hospice providers in your area, including quality measures and family feedback.</w:t>
       </w:r>
     </w:p>
-    <w:bookmarkEnd w:id="69"/>
-    <w:bookmarkStart w:id="70" w:name="further-reading"/>
+    <w:bookmarkEnd w:id="103"/>
+    <w:bookmarkStart w:id="104" w:name="further-reading"/>
     <w:p>
       <w:pPr>
         <w:pStyle w:val="Heading3"/>
@@ -16263,8 +16195,8 @@
         <w:t xml:space="preserve">.</w:t>
       </w:r>
     </w:p>
-    <w:bookmarkEnd w:id="70"/>
-    <w:bookmarkStart w:id="71" w:name="a-note-on-these-resources"/>
+    <w:bookmarkEnd w:id="104"/>
+    <w:bookmarkStart w:id="105" w:name="a-note-on-these-resources"/>
     <w:p>
       <w:pPr>
         <w:pStyle w:val="Heading3"/>
@@ -16285,9 +16217,9 @@
         <w:t xml:space="preserve">The phone numbers and web addresses were current when this book went to press. Organizations change. If a number stops working, search the name. None of this is medical or legal advice. It is a place to begin. One caution: stopping alcohol suddenly after heavy, steady drinking can be medically dangerous. Withdrawal can bring seizures. Let a doctor or a detox program supervise it.</w:t>
       </w:r>
     </w:p>
-    <w:bookmarkEnd w:id="71"/>
-    <w:bookmarkEnd w:id="72"/>
-    <w:bookmarkStart w:id="73" w:name="about-the-author"/>
+    <w:bookmarkEnd w:id="105"/>
+    <w:bookmarkEnd w:id="106"/>
+    <w:bookmarkStart w:id="107" w:name="about-the-author"/>
     <w:p>
       <w:pPr>
         <w:pStyle w:val="Heading1"/>
@@ -16324,7 +16256,7 @@
         <w:t xml:space="preserve">is his first book.</w:t>
       </w:r>
     </w:p>
-    <w:bookmarkEnd w:id="73"/>
+    <w:bookmarkEnd w:id="107"/>
     <w:sectPr>
       <w:footerReference w:type="default" r:id="rIdFtr1"/>
       <w:pgSz w:w="12240" w:h="15840"/>

</xml_diff>